<commit_message>
Actualiza doc procesamiento de datos hoja 1PM
</commit_message>
<xml_diff>
--- a/Documentacion/Procesamiento de Datos.docx
+++ b/Documentacion/Procesamiento de Datos.docx
@@ -100,6 +100,13 @@
           <w:rFonts w:ascii="Arial" w:hAnsi="Arial" w:cs="Arial"/>
           <w:lang w:val="es-CO"/>
         </w:rPr>
+        <w:t>1</w:t>
+      </w:r>
+      <w:r>
+        <w:rPr>
+          <w:rFonts w:ascii="Arial" w:hAnsi="Arial" w:cs="Arial"/>
+          <w:lang w:val="es-CO"/>
+        </w:rPr>
         <w:t>8 de marzo de 2025</w:t>
       </w:r>
     </w:p>
@@ -172,126 +179,37 @@
           <w:rFonts w:ascii="Arial" w:hAnsi="Arial" w:cs="Arial"/>
           <w:lang w:val="es-CO"/>
         </w:rPr>
-        <w:t>Almacenamiento de datos extraídos: .</w:t>
-      </w:r>
-      <w:proofErr w:type="spellStart"/>
-      <w:r>
-        <w:rPr>
-          <w:rFonts w:ascii="Arial" w:hAnsi="Arial" w:cs="Arial"/>
-          <w:lang w:val="es-CO"/>
-        </w:rPr>
-        <w:t>csv</w:t>
-      </w:r>
-      <w:proofErr w:type="spellEnd"/>
-    </w:p>
-    <w:p>
-      <w:pPr>
-        <w:rPr>
-          <w:rFonts w:ascii="Arial" w:hAnsi="Arial" w:cs="Arial"/>
-          <w:lang w:val="es-CO"/>
-        </w:rPr>
-      </w:pPr>
-      <w:r>
-        <w:rPr>
-          <w:rFonts w:ascii="Arial" w:hAnsi="Arial" w:cs="Arial"/>
-          <w:lang w:val="es-CO"/>
-        </w:rPr>
-        <w:t xml:space="preserve">Las fuentes de datos vienen en hojas de </w:t>
-      </w:r>
-      <w:proofErr w:type="spellStart"/>
-      <w:r>
-        <w:rPr>
-          <w:rFonts w:ascii="Arial" w:hAnsi="Arial" w:cs="Arial"/>
-          <w:lang w:val="es-CO"/>
-        </w:rPr>
-        <w:t>excel</w:t>
-      </w:r>
-      <w:proofErr w:type="spellEnd"/>
-      <w:r>
-        <w:rPr>
-          <w:rFonts w:ascii="Arial" w:hAnsi="Arial" w:cs="Arial"/>
-          <w:lang w:val="es-CO"/>
-        </w:rPr>
-        <w:t xml:space="preserve"> desde el origen, aunque el proyecto es muy específico sobre el municipio de Viterbo, Caldas y podrían extraerse manualmente a otra hoja de </w:t>
-      </w:r>
-      <w:proofErr w:type="spellStart"/>
-      <w:r>
-        <w:rPr>
-          <w:rFonts w:ascii="Arial" w:hAnsi="Arial" w:cs="Arial"/>
-          <w:lang w:val="es-CO"/>
-        </w:rPr>
-        <w:t>excel</w:t>
-      </w:r>
-      <w:proofErr w:type="spellEnd"/>
-      <w:r>
-        <w:rPr>
-          <w:rFonts w:ascii="Arial" w:hAnsi="Arial" w:cs="Arial"/>
-          <w:lang w:val="es-CO"/>
-        </w:rPr>
-        <w:t xml:space="preserve"> y trabajar sobre ellos, se puede construir un flujo de extracción de datos escalable utilizando Python, lo anterior para poder aplicarlo a todo el </w:t>
-      </w:r>
-      <w:proofErr w:type="spellStart"/>
-      <w:r>
-        <w:rPr>
-          <w:rFonts w:ascii="Arial" w:hAnsi="Arial" w:cs="Arial"/>
-          <w:lang w:val="es-CO"/>
-        </w:rPr>
-        <w:t>dataset</w:t>
-      </w:r>
-      <w:proofErr w:type="spellEnd"/>
-      <w:r>
-        <w:rPr>
-          <w:rFonts w:ascii="Arial" w:hAnsi="Arial" w:cs="Arial"/>
-          <w:lang w:val="es-CO"/>
-        </w:rPr>
-        <w:t xml:space="preserve"> en un futuro.</w:t>
-      </w:r>
-    </w:p>
-    <w:p>
-      <w:pPr>
-        <w:rPr>
-          <w:rFonts w:ascii="Arial" w:hAnsi="Arial" w:cs="Arial"/>
-          <w:lang w:val="es-CO"/>
-        </w:rPr>
-      </w:pPr>
-      <w:r>
-        <w:rPr>
-          <w:rFonts w:ascii="Arial" w:hAnsi="Arial" w:cs="Arial"/>
-          <w:lang w:val="es-CO"/>
-        </w:rPr>
-        <w:t>Los datos procesados se almacenarán en documentos .</w:t>
-      </w:r>
-      <w:proofErr w:type="spellStart"/>
-      <w:r>
-        <w:rPr>
-          <w:rFonts w:ascii="Arial" w:hAnsi="Arial" w:cs="Arial"/>
-          <w:lang w:val="es-CO"/>
-        </w:rPr>
-        <w:t>csv</w:t>
-      </w:r>
-      <w:proofErr w:type="spellEnd"/>
-      <w:r>
-        <w:rPr>
-          <w:rFonts w:ascii="Arial" w:hAnsi="Arial" w:cs="Arial"/>
-          <w:lang w:val="es-CO"/>
-        </w:rPr>
-        <w:t xml:space="preserve"> como </w:t>
-      </w:r>
-      <w:proofErr w:type="spellStart"/>
-      <w:r>
-        <w:rPr>
-          <w:rFonts w:ascii="Arial" w:hAnsi="Arial" w:cs="Arial"/>
-          <w:lang w:val="es-CO"/>
-        </w:rPr>
-        <w:t>datasets</w:t>
-      </w:r>
-      <w:proofErr w:type="spellEnd"/>
-      <w:r>
-        <w:rPr>
-          <w:rFonts w:ascii="Arial" w:hAnsi="Arial" w:cs="Arial"/>
-          <w:lang w:val="es-CO"/>
-        </w:rPr>
-        <w:t xml:space="preserve"> definitivos.</w:t>
+        <w:t>Almacenamiento de datos extraídos: .csv</w:t>
+      </w:r>
+    </w:p>
+    <w:p>
+      <w:pPr>
+        <w:rPr>
+          <w:rFonts w:ascii="Arial" w:hAnsi="Arial" w:cs="Arial"/>
+          <w:lang w:val="es-CO"/>
+        </w:rPr>
+      </w:pPr>
+      <w:r>
+        <w:rPr>
+          <w:rFonts w:ascii="Arial" w:hAnsi="Arial" w:cs="Arial"/>
+          <w:lang w:val="es-CO"/>
+        </w:rPr>
+        <w:t>Las fuentes de datos vienen en hojas de excel desde el origen, aunque el proyecto es muy específico sobre el municipio de Viterbo, Caldas y podrían extraerse manualmente a otra hoja de excel y trabajar sobre ellos, se puede construir un flujo de extracción de datos escalable utilizando Python, lo anterior para poder aplicarlo a todo el dataset en un futuro.</w:t>
+      </w:r>
+    </w:p>
+    <w:p>
+      <w:pPr>
+        <w:rPr>
+          <w:rFonts w:ascii="Arial" w:hAnsi="Arial" w:cs="Arial"/>
+          <w:lang w:val="es-CO"/>
+        </w:rPr>
+      </w:pPr>
+      <w:r>
+        <w:rPr>
+          <w:rFonts w:ascii="Arial" w:hAnsi="Arial" w:cs="Arial"/>
+          <w:lang w:val="es-CO"/>
+        </w:rPr>
+        <w:t>Los datos procesados se almacenarán en documentos .csv como datasets definitivos.</w:t>
       </w:r>
     </w:p>
     <w:p>
@@ -331,7 +249,7 @@
                     <pic:cNvPicPr/>
                   </pic:nvPicPr>
                   <pic:blipFill>
-                    <a:blip r:embed="rId4">
+                    <a:blip r:embed="rId5">
                       <a:extLst>
                         <a:ext uri="{28A0092B-C50C-407E-A947-70E740481C1C}">
                           <a14:useLocalDpi xmlns:a14="http://schemas.microsoft.com/office/drawing/2010/main" val="0"/>
@@ -366,6 +284,888 @@
         </w:rPr>
       </w:pPr>
     </w:p>
+    <w:p>
+      <w:pPr>
+        <w:rPr>
+          <w:rFonts w:ascii="Arial" w:hAnsi="Arial" w:cs="Arial"/>
+          <w:lang w:val="es-CO"/>
+        </w:rPr>
+      </w:pPr>
+    </w:p>
+    <w:p>
+      <w:pPr>
+        <w:rPr>
+          <w:rFonts w:ascii="Arial" w:hAnsi="Arial" w:cs="Arial"/>
+          <w:lang w:val="es-CO"/>
+        </w:rPr>
+      </w:pPr>
+    </w:p>
+    <w:p>
+      <w:pPr>
+        <w:rPr>
+          <w:rFonts w:ascii="Arial" w:hAnsi="Arial" w:cs="Arial"/>
+          <w:lang w:val="es-CO"/>
+        </w:rPr>
+      </w:pPr>
+    </w:p>
+    <w:p>
+      <w:pPr>
+        <w:rPr>
+          <w:rFonts w:ascii="Arial" w:hAnsi="Arial" w:cs="Arial"/>
+          <w:lang w:val="es-CO"/>
+        </w:rPr>
+      </w:pPr>
+    </w:p>
+    <w:p>
+      <w:pPr>
+        <w:rPr>
+          <w:rFonts w:ascii="Arial" w:hAnsi="Arial" w:cs="Arial"/>
+          <w:lang w:val="es-CO"/>
+        </w:rPr>
+      </w:pPr>
+    </w:p>
+    <w:p>
+      <w:pPr>
+        <w:rPr>
+          <w:rFonts w:ascii="Arial" w:hAnsi="Arial" w:cs="Arial"/>
+          <w:b/>
+          <w:bCs/>
+          <w:lang w:val="es-CO"/>
+        </w:rPr>
+      </w:pPr>
+      <w:r>
+        <w:rPr>
+          <w:rFonts w:ascii="Arial" w:hAnsi="Arial" w:cs="Arial"/>
+          <w:b/>
+          <w:bCs/>
+          <w:lang w:val="es-CO"/>
+        </w:rPr>
+        <w:lastRenderedPageBreak/>
+        <w:t>Limpieza de datos</w:t>
+      </w:r>
+    </w:p>
+    <w:p>
+      <w:pPr>
+        <w:rPr>
+          <w:rFonts w:ascii="Arial" w:hAnsi="Arial" w:cs="Arial"/>
+          <w:b/>
+          <w:bCs/>
+          <w:lang w:val="es-CO"/>
+        </w:rPr>
+      </w:pPr>
+      <w:r>
+        <w:rPr>
+          <w:rFonts w:ascii="Arial" w:hAnsi="Arial" w:cs="Arial"/>
+          <w:b/>
+          <w:bCs/>
+          <w:lang w:val="es-CO"/>
+        </w:rPr>
+        <w:t>1PM</w:t>
+      </w:r>
+    </w:p>
+    <w:p>
+      <w:pPr>
+        <w:rPr>
+          <w:rFonts w:ascii="Arial" w:hAnsi="Arial" w:cs="Arial"/>
+          <w:lang w:val="es-CO"/>
+        </w:rPr>
+      </w:pPr>
+      <w:r>
+        <w:rPr>
+          <w:rFonts w:ascii="Arial" w:hAnsi="Arial" w:cs="Arial"/>
+          <w:lang w:val="es-CO"/>
+        </w:rPr>
+        <w:t>Se empieza por extraer solo la parte correspondiente a los datos del archivo excel, para lo cual se ignoran las primeras 9 filas de la hoja</w:t>
+      </w:r>
+    </w:p>
+    <w:p>
+      <w:pPr>
+        <w:jc w:val="center"/>
+        <w:rPr>
+          <w:rFonts w:ascii="Arial" w:hAnsi="Arial" w:cs="Arial"/>
+          <w:lang w:val="es-CO"/>
+        </w:rPr>
+      </w:pPr>
+      <w:r>
+        <w:rPr>
+          <w:rFonts w:ascii="Arial" w:hAnsi="Arial" w:cs="Arial"/>
+          <w:noProof/>
+          <w:lang w:val="es-CO"/>
+        </w:rPr>
+        <w:drawing>
+          <wp:inline distT="0" distB="0" distL="0" distR="0" wp14:anchorId="116A6274" wp14:editId="038AC442">
+            <wp:extent cx="5481713" cy="2428875"/>
+            <wp:effectExtent l="0" t="0" r="5080" b="0"/>
+            <wp:docPr id="921427154" name="Imagen 1" descr="Tabla&#10;&#10;El contenido generado por IA puede ser incorrecto."/>
+            <wp:cNvGraphicFramePr>
+              <a:graphicFrameLocks xmlns:a="http://schemas.openxmlformats.org/drawingml/2006/main" noChangeAspect="1"/>
+            </wp:cNvGraphicFramePr>
+            <a:graphic xmlns:a="http://schemas.openxmlformats.org/drawingml/2006/main">
+              <a:graphicData uri="http://schemas.openxmlformats.org/drawingml/2006/picture">
+                <pic:pic xmlns:pic="http://schemas.openxmlformats.org/drawingml/2006/picture">
+                  <pic:nvPicPr>
+                    <pic:cNvPr id="921427154" name="Imagen 1" descr="Tabla&#10;&#10;El contenido generado por IA puede ser incorrecto."/>
+                    <pic:cNvPicPr/>
+                  </pic:nvPicPr>
+                  <pic:blipFill>
+                    <a:blip r:embed="rId6">
+                      <a:extLst>
+                        <a:ext uri="{28A0092B-C50C-407E-A947-70E740481C1C}">
+                          <a14:useLocalDpi xmlns:a14="http://schemas.microsoft.com/office/drawing/2010/main" val="0"/>
+                        </a:ext>
+                      </a:extLst>
+                    </a:blip>
+                    <a:stretch>
+                      <a:fillRect/>
+                    </a:stretch>
+                  </pic:blipFill>
+                  <pic:spPr>
+                    <a:xfrm>
+                      <a:off x="0" y="0"/>
+                      <a:ext cx="5499953" cy="2436957"/>
+                    </a:xfrm>
+                    <a:prstGeom prst="rect">
+                      <a:avLst/>
+                    </a:prstGeom>
+                  </pic:spPr>
+                </pic:pic>
+              </a:graphicData>
+            </a:graphic>
+          </wp:inline>
+        </w:drawing>
+      </w:r>
+    </w:p>
+    <w:p>
+      <w:pPr>
+        <w:rPr>
+          <w:rFonts w:ascii="Arial" w:hAnsi="Arial" w:cs="Arial"/>
+          <w:lang w:val="es-CO"/>
+        </w:rPr>
+      </w:pPr>
+    </w:p>
+    <w:p>
+      <w:pPr>
+        <w:rPr>
+          <w:rFonts w:ascii="Arial" w:hAnsi="Arial" w:cs="Arial"/>
+          <w:lang w:val="es-CO"/>
+        </w:rPr>
+      </w:pPr>
+      <w:r>
+        <w:rPr>
+          <w:rFonts w:ascii="Arial" w:hAnsi="Arial" w:cs="Arial"/>
+          <w:lang w:val="es-CO"/>
+        </w:rPr>
+        <w:t>Actualización de headers</w:t>
+      </w:r>
+    </w:p>
+    <w:p>
+      <w:pPr>
+        <w:rPr>
+          <w:rFonts w:ascii="Arial" w:hAnsi="Arial" w:cs="Arial"/>
+          <w:lang w:val="es-CO"/>
+        </w:rPr>
+      </w:pPr>
+      <w:r>
+        <w:rPr>
+          <w:rFonts w:ascii="Arial" w:hAnsi="Arial" w:cs="Arial"/>
+          <w:lang w:val="es-CO"/>
+        </w:rPr>
+        <w:t>Al extraer los datos desde el archivo .xlsx, se verifica el dataframe generado por Pandas, empezando por los nombres de las columnas y se observan las siguientes incidencias:</w:t>
+      </w:r>
+    </w:p>
+    <w:p>
+      <w:pPr>
+        <w:pStyle w:val="Prrafodelista"/>
+        <w:numPr>
+          <w:ilvl w:val="0"/>
+          <w:numId w:val="1"/>
+        </w:numPr>
+        <w:rPr>
+          <w:rFonts w:ascii="Arial" w:hAnsi="Arial" w:cs="Arial"/>
+          <w:lang w:val="es-CO"/>
+        </w:rPr>
+      </w:pPr>
+      <w:r>
+        <w:rPr>
+          <w:rFonts w:ascii="Arial" w:hAnsi="Arial" w:cs="Arial"/>
+          <w:lang w:val="es-CO"/>
+        </w:rPr>
+        <w:t>Headers sin nombres descriptivos: headers con nombres por defecto de Pandas tipo ‘Unnamed: X’.</w:t>
+      </w:r>
+    </w:p>
+    <w:p>
+      <w:pPr>
+        <w:pStyle w:val="Prrafodelista"/>
+        <w:numPr>
+          <w:ilvl w:val="0"/>
+          <w:numId w:val="1"/>
+        </w:numPr>
+        <w:rPr>
+          <w:rFonts w:ascii="Arial" w:hAnsi="Arial" w:cs="Arial"/>
+          <w:lang w:val="es-CO"/>
+        </w:rPr>
+      </w:pPr>
+      <w:r>
+        <w:rPr>
+          <w:rFonts w:ascii="Arial" w:hAnsi="Arial" w:cs="Arial"/>
+          <w:lang w:val="es-CO"/>
+        </w:rPr>
+        <w:t>Headers en jerarquías inferiores debido a la agrupación de datos: ‘Hombre’ y ‘Mujer’ se encuentran en la primera fila de datos debido al diseño del .xlsx donde se busca describir la agrupación por Sexo de los datos.</w:t>
+      </w:r>
+    </w:p>
+    <w:p>
+      <w:pPr>
+        <w:pStyle w:val="Prrafodelista"/>
+        <w:numPr>
+          <w:ilvl w:val="0"/>
+          <w:numId w:val="1"/>
+        </w:numPr>
+        <w:rPr>
+          <w:rFonts w:ascii="Arial" w:hAnsi="Arial" w:cs="Arial"/>
+          <w:lang w:val="es-CO"/>
+        </w:rPr>
+      </w:pPr>
+      <w:r>
+        <w:rPr>
+          <w:rFonts w:ascii="Arial" w:hAnsi="Arial" w:cs="Arial"/>
+          <w:lang w:val="es-CO"/>
+        </w:rPr>
+        <w:t>Tildes: Se tienen headers con tildes como ‘Índice de masculinidad’ e ‘Índice de feminidad’, las tildes es mejor evitarlas para evitar errores de charset de las herramientas utilizadas.</w:t>
+      </w:r>
+    </w:p>
+    <w:p>
+      <w:pPr>
+        <w:rPr>
+          <w:rFonts w:ascii="Arial" w:hAnsi="Arial" w:cs="Arial"/>
+          <w:lang w:val="es-CO"/>
+        </w:rPr>
+      </w:pPr>
+      <w:r>
+        <w:rPr>
+          <w:rFonts w:ascii="Arial" w:hAnsi="Arial" w:cs="Arial"/>
+          <w:noProof/>
+          <w:lang w:val="es-CO"/>
+        </w:rPr>
+        <w:drawing>
+          <wp:inline distT="0" distB="0" distL="0" distR="0" wp14:anchorId="46531409" wp14:editId="6282CAD0">
+            <wp:extent cx="5612130" cy="699135"/>
+            <wp:effectExtent l="0" t="0" r="7620" b="5715"/>
+            <wp:docPr id="27449443" name="Imagen 2" descr="Pantalla de un video juego&#10;&#10;El contenido generado por IA puede ser incorrecto."/>
+            <wp:cNvGraphicFramePr>
+              <a:graphicFrameLocks xmlns:a="http://schemas.openxmlformats.org/drawingml/2006/main" noChangeAspect="1"/>
+            </wp:cNvGraphicFramePr>
+            <a:graphic xmlns:a="http://schemas.openxmlformats.org/drawingml/2006/main">
+              <a:graphicData uri="http://schemas.openxmlformats.org/drawingml/2006/picture">
+                <pic:pic xmlns:pic="http://schemas.openxmlformats.org/drawingml/2006/picture">
+                  <pic:nvPicPr>
+                    <pic:cNvPr id="27449443" name="Imagen 2" descr="Pantalla de un video juego&#10;&#10;El contenido generado por IA puede ser incorrecto."/>
+                    <pic:cNvPicPr/>
+                  </pic:nvPicPr>
+                  <pic:blipFill>
+                    <a:blip r:embed="rId7" cstate="print">
+                      <a:extLst>
+                        <a:ext uri="{28A0092B-C50C-407E-A947-70E740481C1C}">
+                          <a14:useLocalDpi xmlns:a14="http://schemas.microsoft.com/office/drawing/2010/main" val="0"/>
+                        </a:ext>
+                      </a:extLst>
+                    </a:blip>
+                    <a:stretch>
+                      <a:fillRect/>
+                    </a:stretch>
+                  </pic:blipFill>
+                  <pic:spPr>
+                    <a:xfrm>
+                      <a:off x="0" y="0"/>
+                      <a:ext cx="5612130" cy="699135"/>
+                    </a:xfrm>
+                    <a:prstGeom prst="rect">
+                      <a:avLst/>
+                    </a:prstGeom>
+                  </pic:spPr>
+                </pic:pic>
+              </a:graphicData>
+            </a:graphic>
+          </wp:inline>
+        </w:drawing>
+      </w:r>
+    </w:p>
+    <w:p>
+      <w:pPr>
+        <w:rPr>
+          <w:rFonts w:ascii="Arial" w:hAnsi="Arial" w:cs="Arial"/>
+          <w:lang w:val="es-CO"/>
+        </w:rPr>
+      </w:pPr>
+    </w:p>
+    <w:p>
+      <w:pPr>
+        <w:rPr>
+          <w:rFonts w:ascii="Arial" w:hAnsi="Arial" w:cs="Arial"/>
+          <w:lang w:val="es-CO"/>
+        </w:rPr>
+      </w:pPr>
+      <w:r>
+        <w:rPr>
+          <w:rFonts w:ascii="Arial" w:hAnsi="Arial" w:cs="Arial"/>
+          <w:lang w:val="es-CO"/>
+        </w:rPr>
+        <w:t>Se realizan las siguientes conversiones a los nombres de columnas:</w:t>
+      </w:r>
+    </w:p>
+    <w:p>
+      <w:pPr>
+        <w:pStyle w:val="Prrafodelista"/>
+        <w:numPr>
+          <w:ilvl w:val="0"/>
+          <w:numId w:val="2"/>
+        </w:numPr>
+        <w:rPr>
+          <w:rFonts w:ascii="Arial" w:hAnsi="Arial" w:cs="Arial"/>
+          <w:lang w:val="es-CO"/>
+        </w:rPr>
+      </w:pPr>
+      <w:r>
+        <w:rPr>
+          <w:rFonts w:ascii="Arial" w:hAnsi="Arial" w:cs="Arial"/>
+          <w:lang w:val="es-CO"/>
+        </w:rPr>
+        <w:lastRenderedPageBreak/>
+        <w:t>Unnamed: 2: Area</w:t>
+      </w:r>
+    </w:p>
+    <w:p>
+      <w:pPr>
+        <w:pStyle w:val="Prrafodelista"/>
+        <w:numPr>
+          <w:ilvl w:val="0"/>
+          <w:numId w:val="2"/>
+        </w:numPr>
+        <w:rPr>
+          <w:rFonts w:ascii="Arial" w:hAnsi="Arial" w:cs="Arial"/>
+          <w:lang w:val="es-CO"/>
+        </w:rPr>
+      </w:pPr>
+      <w:r>
+        <w:rPr>
+          <w:rFonts w:ascii="Arial" w:hAnsi="Arial" w:cs="Arial"/>
+          <w:lang w:val="es-CO"/>
+        </w:rPr>
+        <w:t>Unnamed: 3: Grupo de edad</w:t>
+      </w:r>
+    </w:p>
+    <w:p>
+      <w:pPr>
+        <w:pStyle w:val="Prrafodelista"/>
+        <w:numPr>
+          <w:ilvl w:val="0"/>
+          <w:numId w:val="2"/>
+        </w:numPr>
+        <w:rPr>
+          <w:rFonts w:ascii="Arial" w:hAnsi="Arial" w:cs="Arial"/>
+          <w:lang w:val="es-CO"/>
+        </w:rPr>
+      </w:pPr>
+      <w:r>
+        <w:rPr>
+          <w:rFonts w:ascii="Arial" w:hAnsi="Arial" w:cs="Arial"/>
+          <w:lang w:val="es-CO"/>
+        </w:rPr>
+        <w:t>Sexo: Hombre</w:t>
+      </w:r>
+    </w:p>
+    <w:p>
+      <w:pPr>
+        <w:pStyle w:val="Prrafodelista"/>
+        <w:numPr>
+          <w:ilvl w:val="0"/>
+          <w:numId w:val="2"/>
+        </w:numPr>
+        <w:rPr>
+          <w:rFonts w:ascii="Arial" w:hAnsi="Arial" w:cs="Arial"/>
+          <w:lang w:val="es-CO"/>
+        </w:rPr>
+      </w:pPr>
+      <w:r>
+        <w:rPr>
+          <w:rFonts w:ascii="Arial" w:hAnsi="Arial" w:cs="Arial"/>
+          <w:lang w:val="es-CO"/>
+        </w:rPr>
+        <w:t>Unnamed 6: Mujer</w:t>
+      </w:r>
+    </w:p>
+    <w:p>
+      <w:pPr>
+        <w:pStyle w:val="Prrafodelista"/>
+        <w:numPr>
+          <w:ilvl w:val="0"/>
+          <w:numId w:val="2"/>
+        </w:numPr>
+        <w:rPr>
+          <w:rFonts w:ascii="Arial" w:hAnsi="Arial" w:cs="Arial"/>
+          <w:lang w:val="es-CO"/>
+        </w:rPr>
+      </w:pPr>
+      <w:r>
+        <w:rPr>
+          <w:rFonts w:ascii="Arial" w:hAnsi="Arial" w:cs="Arial"/>
+          <w:lang w:val="es-CO"/>
+        </w:rPr>
+        <w:t>Índice de masculinidad: Indice de masculinidad</w:t>
+      </w:r>
+    </w:p>
+    <w:p>
+      <w:pPr>
+        <w:pStyle w:val="Prrafodelista"/>
+        <w:numPr>
+          <w:ilvl w:val="0"/>
+          <w:numId w:val="2"/>
+        </w:numPr>
+        <w:rPr>
+          <w:rFonts w:ascii="Arial" w:hAnsi="Arial" w:cs="Arial"/>
+          <w:lang w:val="es-CO"/>
+        </w:rPr>
+      </w:pPr>
+      <w:r>
+        <w:rPr>
+          <w:rFonts w:ascii="Arial" w:hAnsi="Arial" w:cs="Arial"/>
+          <w:lang w:val="es-CO"/>
+        </w:rPr>
+        <w:t>Índice de feminidad: Indice de feminidad</w:t>
+      </w:r>
+    </w:p>
+    <w:p>
+      <w:pPr>
+        <w:rPr>
+          <w:rFonts w:ascii="Arial" w:hAnsi="Arial" w:cs="Arial"/>
+          <w:lang w:val="es-CO"/>
+        </w:rPr>
+      </w:pPr>
+      <w:r>
+        <w:rPr>
+          <w:rFonts w:ascii="Arial" w:hAnsi="Arial" w:cs="Arial"/>
+          <w:noProof/>
+          <w:lang w:val="es-CO"/>
+        </w:rPr>
+        <w:drawing>
+          <wp:inline distT="0" distB="0" distL="0" distR="0" wp14:anchorId="2BE32146" wp14:editId="436333DC">
+            <wp:extent cx="5612130" cy="211455"/>
+            <wp:effectExtent l="0" t="0" r="7620" b="0"/>
+            <wp:docPr id="1757167292" name="Imagen 3"/>
+            <wp:cNvGraphicFramePr>
+              <a:graphicFrameLocks xmlns:a="http://schemas.openxmlformats.org/drawingml/2006/main" noChangeAspect="1"/>
+            </wp:cNvGraphicFramePr>
+            <a:graphic xmlns:a="http://schemas.openxmlformats.org/drawingml/2006/main">
+              <a:graphicData uri="http://schemas.openxmlformats.org/drawingml/2006/picture">
+                <pic:pic xmlns:pic="http://schemas.openxmlformats.org/drawingml/2006/picture">
+                  <pic:nvPicPr>
+                    <pic:cNvPr id="1757167292" name="Imagen 1757167292"/>
+                    <pic:cNvPicPr/>
+                  </pic:nvPicPr>
+                  <pic:blipFill>
+                    <a:blip r:embed="rId8">
+                      <a:extLst>
+                        <a:ext uri="{28A0092B-C50C-407E-A947-70E740481C1C}">
+                          <a14:useLocalDpi xmlns:a14="http://schemas.microsoft.com/office/drawing/2010/main" val="0"/>
+                        </a:ext>
+                      </a:extLst>
+                    </a:blip>
+                    <a:stretch>
+                      <a:fillRect/>
+                    </a:stretch>
+                  </pic:blipFill>
+                  <pic:spPr>
+                    <a:xfrm>
+                      <a:off x="0" y="0"/>
+                      <a:ext cx="5612130" cy="211455"/>
+                    </a:xfrm>
+                    <a:prstGeom prst="rect">
+                      <a:avLst/>
+                    </a:prstGeom>
+                  </pic:spPr>
+                </pic:pic>
+              </a:graphicData>
+            </a:graphic>
+          </wp:inline>
+        </w:drawing>
+      </w:r>
+      <w:r>
+        <w:rPr>
+          <w:rFonts w:ascii="Arial" w:hAnsi="Arial" w:cs="Arial"/>
+          <w:lang w:val="es-CO"/>
+        </w:rPr>
+        <w:t xml:space="preserve"> </w:t>
+      </w:r>
+    </w:p>
+    <w:p>
+      <w:pPr>
+        <w:rPr>
+          <w:rFonts w:ascii="Arial" w:hAnsi="Arial" w:cs="Arial"/>
+          <w:lang w:val="es-CO"/>
+        </w:rPr>
+      </w:pPr>
+    </w:p>
+    <w:p>
+      <w:pPr>
+        <w:rPr>
+          <w:rFonts w:ascii="Arial" w:hAnsi="Arial" w:cs="Arial"/>
+          <w:lang w:val="es-CO"/>
+        </w:rPr>
+      </w:pPr>
+      <w:r>
+        <w:rPr>
+          <w:rFonts w:ascii="Arial" w:hAnsi="Arial" w:cs="Arial"/>
+          <w:lang w:val="es-CO"/>
+        </w:rPr>
+        <w:t>Eliminación de columnas</w:t>
+      </w:r>
+    </w:p>
+    <w:p>
+      <w:pPr>
+        <w:rPr>
+          <w:rFonts w:ascii="Arial" w:hAnsi="Arial" w:cs="Arial"/>
+          <w:lang w:val="es-CO"/>
+        </w:rPr>
+      </w:pPr>
+      <w:r>
+        <w:rPr>
+          <w:rFonts w:ascii="Arial" w:hAnsi="Arial" w:cs="Arial"/>
+          <w:lang w:val="es-CO"/>
+        </w:rPr>
+        <w:t>Se evidencian dos columnas sin datos o con datos irrelevantes para el dataset que pueden ser eliminadas:</w:t>
+      </w:r>
+    </w:p>
+    <w:p>
+      <w:pPr>
+        <w:pStyle w:val="Prrafodelista"/>
+        <w:numPr>
+          <w:ilvl w:val="0"/>
+          <w:numId w:val="3"/>
+        </w:numPr>
+        <w:rPr>
+          <w:rFonts w:ascii="Arial" w:hAnsi="Arial" w:cs="Arial"/>
+          <w:lang w:val="es-CO"/>
+        </w:rPr>
+      </w:pPr>
+      <w:r>
+        <w:rPr>
+          <w:rFonts w:ascii="Arial" w:hAnsi="Arial" w:cs="Arial"/>
+          <w:lang w:val="es-CO"/>
+        </w:rPr>
+        <w:t>Grupos de edad, municipio y áreas (Total, Cabecera y Centros poblados y Rural disperso)</w:t>
+      </w:r>
+      <w:r>
+        <w:rPr>
+          <w:rFonts w:ascii="Arial" w:hAnsi="Arial" w:cs="Arial"/>
+          <w:lang w:val="es-CO"/>
+        </w:rPr>
+        <w:t>: No contiene datos</w:t>
+      </w:r>
+    </w:p>
+    <w:p>
+      <w:pPr>
+        <w:pStyle w:val="Prrafodelista"/>
+        <w:numPr>
+          <w:ilvl w:val="0"/>
+          <w:numId w:val="3"/>
+        </w:numPr>
+        <w:rPr>
+          <w:rFonts w:ascii="Arial" w:hAnsi="Arial" w:cs="Arial"/>
+          <w:lang w:val="es-CO"/>
+        </w:rPr>
+      </w:pPr>
+      <w:r>
+        <w:rPr>
+          <w:rFonts w:ascii="Arial" w:hAnsi="Arial" w:cs="Arial"/>
+          <w:lang w:val="es-CO"/>
+        </w:rPr>
+        <w:t>Unnamed: 1: Contiene el municipio, para este caso particular es irrelevante porque solo se tratarán datos del municipio de Viterbo, Caldas, pero se tendrá en cuenta para un futuro proyecto que involucre múltiples municipios al mismo tiempo.</w:t>
+      </w:r>
+    </w:p>
+    <w:p>
+      <w:pPr>
+        <w:rPr>
+          <w:rFonts w:ascii="Arial" w:hAnsi="Arial" w:cs="Arial"/>
+          <w:lang w:val="es-CO"/>
+        </w:rPr>
+      </w:pPr>
+      <w:r>
+        <w:rPr>
+          <w:rFonts w:ascii="Arial" w:hAnsi="Arial" w:cs="Arial"/>
+          <w:noProof/>
+          <w:lang w:val="es-CO"/>
+        </w:rPr>
+        <w:drawing>
+          <wp:inline distT="0" distB="0" distL="0" distR="0" wp14:anchorId="155D791D" wp14:editId="210F0EDA">
+            <wp:extent cx="5612130" cy="3110230"/>
+            <wp:effectExtent l="0" t="0" r="7620" b="0"/>
+            <wp:docPr id="1734914119" name="Imagen 5" descr="Imagen que contiene Patrón de fondo&#10;&#10;El contenido generado por IA puede ser incorrecto."/>
+            <wp:cNvGraphicFramePr>
+              <a:graphicFrameLocks xmlns:a="http://schemas.openxmlformats.org/drawingml/2006/main" noChangeAspect="1"/>
+            </wp:cNvGraphicFramePr>
+            <a:graphic xmlns:a="http://schemas.openxmlformats.org/drawingml/2006/main">
+              <a:graphicData uri="http://schemas.openxmlformats.org/drawingml/2006/picture">
+                <pic:pic xmlns:pic="http://schemas.openxmlformats.org/drawingml/2006/picture">
+                  <pic:nvPicPr>
+                    <pic:cNvPr id="1734914119" name="Imagen 5" descr="Imagen que contiene Patrón de fondo&#10;&#10;El contenido generado por IA puede ser incorrecto."/>
+                    <pic:cNvPicPr/>
+                  </pic:nvPicPr>
+                  <pic:blipFill>
+                    <a:blip r:embed="rId9">
+                      <a:extLst>
+                        <a:ext uri="{28A0092B-C50C-407E-A947-70E740481C1C}">
+                          <a14:useLocalDpi xmlns:a14="http://schemas.microsoft.com/office/drawing/2010/main" val="0"/>
+                        </a:ext>
+                      </a:extLst>
+                    </a:blip>
+                    <a:stretch>
+                      <a:fillRect/>
+                    </a:stretch>
+                  </pic:blipFill>
+                  <pic:spPr>
+                    <a:xfrm>
+                      <a:off x="0" y="0"/>
+                      <a:ext cx="5612130" cy="3110230"/>
+                    </a:xfrm>
+                    <a:prstGeom prst="rect">
+                      <a:avLst/>
+                    </a:prstGeom>
+                  </pic:spPr>
+                </pic:pic>
+              </a:graphicData>
+            </a:graphic>
+          </wp:inline>
+        </w:drawing>
+      </w:r>
+    </w:p>
+    <w:p>
+      <w:pPr>
+        <w:rPr>
+          <w:rFonts w:ascii="Arial" w:hAnsi="Arial" w:cs="Arial"/>
+          <w:lang w:val="es-CO"/>
+        </w:rPr>
+      </w:pPr>
+    </w:p>
+    <w:p>
+      <w:pPr>
+        <w:rPr>
+          <w:rFonts w:ascii="Arial" w:hAnsi="Arial" w:cs="Arial"/>
+          <w:lang w:val="es-CO"/>
+        </w:rPr>
+      </w:pPr>
+    </w:p>
+    <w:p>
+      <w:pPr>
+        <w:rPr>
+          <w:rFonts w:ascii="Arial" w:hAnsi="Arial" w:cs="Arial"/>
+          <w:lang w:val="es-CO"/>
+        </w:rPr>
+      </w:pPr>
+    </w:p>
+    <w:p>
+      <w:pPr>
+        <w:rPr>
+          <w:rFonts w:ascii="Arial" w:hAnsi="Arial" w:cs="Arial"/>
+          <w:lang w:val="es-CO"/>
+        </w:rPr>
+      </w:pPr>
+      <w:r>
+        <w:rPr>
+          <w:rFonts w:ascii="Arial" w:hAnsi="Arial" w:cs="Arial"/>
+          <w:lang w:val="es-CO"/>
+        </w:rPr>
+        <w:lastRenderedPageBreak/>
+        <w:t>Filtrado de datos que no son de Viterbo, Caldas</w:t>
+      </w:r>
+    </w:p>
+    <w:p>
+      <w:pPr>
+        <w:rPr>
+          <w:rFonts w:ascii="Arial" w:hAnsi="Arial" w:cs="Arial"/>
+          <w:lang w:val="es-CO"/>
+        </w:rPr>
+      </w:pPr>
+      <w:r>
+        <w:rPr>
+          <w:rFonts w:ascii="Arial" w:hAnsi="Arial" w:cs="Arial"/>
+          <w:lang w:val="es-CO"/>
+        </w:rPr>
+        <w:t>Se cuenta con el rango de los datos correspondientes a Viterbo, Caldas, por ello, se utiliza un filtrado por rango de filas, teniendo en cuenta que se removieron 9 filas al extraer los datos del .xlsx</w:t>
+      </w:r>
+    </w:p>
+    <w:p>
+      <w:pPr>
+        <w:rPr>
+          <w:rFonts w:ascii="Arial" w:hAnsi="Arial" w:cs="Arial"/>
+          <w:lang w:val="es-CO"/>
+        </w:rPr>
+      </w:pPr>
+    </w:p>
+    <w:p>
+      <w:pPr>
+        <w:rPr>
+          <w:rFonts w:ascii="Arial" w:hAnsi="Arial" w:cs="Arial"/>
+          <w:lang w:val="es-CO"/>
+        </w:rPr>
+      </w:pPr>
+      <w:r>
+        <w:rPr>
+          <w:rFonts w:ascii="Arial" w:hAnsi="Arial" w:cs="Arial"/>
+          <w:lang w:val="es-CO"/>
+        </w:rPr>
+        <w:t>Tratamiento de valores Nulos, en blanco o NaN</w:t>
+      </w:r>
+    </w:p>
+    <w:p>
+      <w:pPr>
+        <w:rPr>
+          <w:rFonts w:ascii="Arial" w:hAnsi="Arial" w:cs="Arial"/>
+          <w:lang w:val="es-CO"/>
+        </w:rPr>
+      </w:pPr>
+      <w:r>
+        <w:rPr>
+          <w:rFonts w:ascii="Arial" w:hAnsi="Arial" w:cs="Arial"/>
+          <w:lang w:val="es-CO"/>
+        </w:rPr>
+        <w:t>La única columna con valores NaN es la columna ‘Area’, la cual indica el área de recolección de datos en el municipio, Totales, cabecera municipal, centros poblados, zonas rurales dispersas, la presencia de valores NaN se debe a la agrupación realizada en el diseño del .xlsx, el enfoque para resolver esta inconsistencia será propagar el primer valor válido hasta el siguiente valor válido y repetir hasta reemplazar todos los valores NaN.</w:t>
+      </w:r>
+    </w:p>
+    <w:p>
+      <w:pPr>
+        <w:rPr>
+          <w:rFonts w:ascii="Arial" w:hAnsi="Arial" w:cs="Arial"/>
+          <w:lang w:val="es-CO"/>
+        </w:rPr>
+      </w:pPr>
+      <w:r>
+        <w:rPr>
+          <w:rFonts w:ascii="Arial" w:hAnsi="Arial" w:cs="Arial"/>
+          <w:noProof/>
+          <w:lang w:val="es-CO"/>
+        </w:rPr>
+        <w:drawing>
+          <wp:inline distT="0" distB="0" distL="0" distR="0" wp14:anchorId="42726EA6" wp14:editId="33EEA7B7">
+            <wp:extent cx="5612130" cy="4702175"/>
+            <wp:effectExtent l="0" t="0" r="7620" b="3175"/>
+            <wp:docPr id="1868159942" name="Imagen 6"/>
+            <wp:cNvGraphicFramePr>
+              <a:graphicFrameLocks xmlns:a="http://schemas.openxmlformats.org/drawingml/2006/main" noChangeAspect="1"/>
+            </wp:cNvGraphicFramePr>
+            <a:graphic xmlns:a="http://schemas.openxmlformats.org/drawingml/2006/main">
+              <a:graphicData uri="http://schemas.openxmlformats.org/drawingml/2006/picture">
+                <pic:pic xmlns:pic="http://schemas.openxmlformats.org/drawingml/2006/picture">
+                  <pic:nvPicPr>
+                    <pic:cNvPr id="1868159942" name="Imagen 1868159942"/>
+                    <pic:cNvPicPr/>
+                  </pic:nvPicPr>
+                  <pic:blipFill>
+                    <a:blip r:embed="rId10">
+                      <a:extLst>
+                        <a:ext uri="{28A0092B-C50C-407E-A947-70E740481C1C}">
+                          <a14:useLocalDpi xmlns:a14="http://schemas.microsoft.com/office/drawing/2010/main" val="0"/>
+                        </a:ext>
+                      </a:extLst>
+                    </a:blip>
+                    <a:stretch>
+                      <a:fillRect/>
+                    </a:stretch>
+                  </pic:blipFill>
+                  <pic:spPr>
+                    <a:xfrm>
+                      <a:off x="0" y="0"/>
+                      <a:ext cx="5612130" cy="4702175"/>
+                    </a:xfrm>
+                    <a:prstGeom prst="rect">
+                      <a:avLst/>
+                    </a:prstGeom>
+                  </pic:spPr>
+                </pic:pic>
+              </a:graphicData>
+            </a:graphic>
+          </wp:inline>
+        </w:drawing>
+      </w:r>
+    </w:p>
+    <w:p>
+      <w:pPr>
+        <w:rPr>
+          <w:rFonts w:ascii="Arial" w:hAnsi="Arial" w:cs="Arial"/>
+          <w:lang w:val="es-CO"/>
+        </w:rPr>
+      </w:pPr>
+      <w:r>
+        <w:rPr>
+          <w:rFonts w:ascii="Arial" w:hAnsi="Arial" w:cs="Arial"/>
+          <w:noProof/>
+          <w:lang w:val="es-CO"/>
+        </w:rPr>
+        <w:lastRenderedPageBreak/>
+        <w:drawing>
+          <wp:inline distT="0" distB="0" distL="0" distR="0" wp14:anchorId="350B5F2D" wp14:editId="08071430">
+            <wp:extent cx="5612130" cy="4881880"/>
+            <wp:effectExtent l="0" t="0" r="7620" b="0"/>
+            <wp:docPr id="1002359237" name="Imagen 7" descr="Texto&#10;&#10;El contenido generado por IA puede ser incorrecto."/>
+            <wp:cNvGraphicFramePr>
+              <a:graphicFrameLocks xmlns:a="http://schemas.openxmlformats.org/drawingml/2006/main" noChangeAspect="1"/>
+            </wp:cNvGraphicFramePr>
+            <a:graphic xmlns:a="http://schemas.openxmlformats.org/drawingml/2006/main">
+              <a:graphicData uri="http://schemas.openxmlformats.org/drawingml/2006/picture">
+                <pic:pic xmlns:pic="http://schemas.openxmlformats.org/drawingml/2006/picture">
+                  <pic:nvPicPr>
+                    <pic:cNvPr id="1002359237" name="Imagen 7" descr="Texto&#10;&#10;El contenido generado por IA puede ser incorrecto."/>
+                    <pic:cNvPicPr/>
+                  </pic:nvPicPr>
+                  <pic:blipFill>
+                    <a:blip r:embed="rId11">
+                      <a:extLst>
+                        <a:ext uri="{28A0092B-C50C-407E-A947-70E740481C1C}">
+                          <a14:useLocalDpi xmlns:a14="http://schemas.microsoft.com/office/drawing/2010/main" val="0"/>
+                        </a:ext>
+                      </a:extLst>
+                    </a:blip>
+                    <a:stretch>
+                      <a:fillRect/>
+                    </a:stretch>
+                  </pic:blipFill>
+                  <pic:spPr>
+                    <a:xfrm>
+                      <a:off x="0" y="0"/>
+                      <a:ext cx="5612130" cy="4881880"/>
+                    </a:xfrm>
+                    <a:prstGeom prst="rect">
+                      <a:avLst/>
+                    </a:prstGeom>
+                  </pic:spPr>
+                </pic:pic>
+              </a:graphicData>
+            </a:graphic>
+          </wp:inline>
+        </w:drawing>
+      </w:r>
+    </w:p>
+    <w:p>
+      <w:pPr>
+        <w:rPr>
+          <w:rFonts w:ascii="Arial" w:hAnsi="Arial" w:cs="Arial"/>
+          <w:lang w:val="es-CO"/>
+        </w:rPr>
+      </w:pPr>
+    </w:p>
+    <w:p>
+      <w:pPr>
+        <w:rPr>
+          <w:rFonts w:ascii="Arial" w:hAnsi="Arial" w:cs="Arial"/>
+          <w:lang w:val="es-CO"/>
+        </w:rPr>
+      </w:pPr>
+      <w:r>
+        <w:rPr>
+          <w:rFonts w:ascii="Arial" w:hAnsi="Arial" w:cs="Arial"/>
+          <w:lang w:val="es-CO"/>
+        </w:rPr>
+        <w:t>Por último se cambian las tildes dentro de los datos, reemplazando vocales con tilde por vocales sin tilde.</w:t>
+      </w:r>
+    </w:p>
     <w:sectPr>
       <w:pgSz w:w="12240" w:h="15840"/>
       <w:pgMar w:top="1417" w:right="1701" w:bottom="1417" w:left="1701" w:header="720" w:footer="720" w:gutter="0"/>
@@ -374,6 +1174,359 @@
     </w:sectPr>
   </w:body>
 </w:document>
+</file>
+
+<file path=word/numbering.xml><?xml version="1.0" encoding="utf-8"?>
+<w:numbering xmlns:wpc="http://schemas.microsoft.com/office/word/2010/wordprocessingCanvas" xmlns:cx="http://schemas.microsoft.com/office/drawing/2014/chartex" xmlns:cx1="http://schemas.microsoft.com/office/drawing/2015/9/8/chartex" xmlns:cx2="http://schemas.microsoft.com/office/drawing/2015/10/21/chartex" xmlns:cx3="http://schemas.microsoft.com/office/drawing/2016/5/9/chartex" xmlns:cx4="http://schemas.microsoft.com/office/drawing/2016/5/10/chartex" xmlns:cx5="http://schemas.microsoft.com/office/drawing/2016/5/11/chartex" xmlns:cx6="http://schemas.microsoft.com/office/drawing/2016/5/12/chartex" xmlns:cx7="http://schemas.microsoft.com/office/drawing/2016/5/13/chartex" xmlns:cx8="http://schemas.microsoft.com/office/drawing/2016/5/14/chartex" xmlns:mc="http://schemas.openxmlformats.org/markup-compatibility/2006" xmlns:aink="http://schemas.microsoft.com/office/drawing/2016/ink" xmlns:am3d="http://schemas.microsoft.com/office/drawing/2017/model3d" xmlns:o="urn:schemas-microsoft-com:office:office" xmlns:oel="http://schemas.microsoft.com/office/2019/extlst" xmlns:r="http://schemas.openxmlformats.org/officeDocument/2006/relationships" xmlns:m="http://schemas.openxmlformats.org/officeDocument/2006/math" xmlns:v="urn:schemas-microsoft-com:vml" xmlns:wp14="http://schemas.microsoft.com/office/word/2010/wordprocessingDrawing" xmlns:wp="http://schemas.openxmlformats.org/drawingml/2006/wordprocessingDrawing" xmlns:w10="urn:schemas-microsoft-com:office:word" xmlns:w="http://schemas.openxmlformats.org/wordprocessingml/2006/main" xmlns:w14="http://schemas.microsoft.com/office/word/2010/wordml" xmlns:w15="http://schemas.microsoft.com/office/word/2012/wordml" xmlns:w16cex="http://schemas.microsoft.com/office/word/2018/wordml/cex" xmlns:w16cid="http://schemas.microsoft.com/office/word/2016/wordml/cid" xmlns:w16="http://schemas.microsoft.com/office/word/2018/wordml" xmlns:w16du="http://schemas.microsoft.com/office/word/2023/wordml/word16du" xmlns:w16sdtdh="http://schemas.microsoft.com/office/word/2020/wordml/sdtdatahash" xmlns:w16sdtfl="http://schemas.microsoft.com/office/word/2024/wordml/sdtformatlock" xmlns:w16se="http://schemas.microsoft.com/office/word/2015/wordml/symex" xmlns:wpg="http://schemas.microsoft.com/office/word/2010/wordprocessingGroup" xmlns:wpi="http://schemas.microsoft.com/office/word/2010/wordprocessingInk" xmlns:wne="http://schemas.microsoft.com/office/word/2006/wordml" xmlns:wps="http://schemas.microsoft.com/office/word/2010/wordprocessingShape" mc:Ignorable="w14 w15 w16se w16cid w16 w16cex w16sdtdh w16sdtfl w16du wp14">
+  <w:abstractNum w:abstractNumId="0" w15:restartNumberingAfterBreak="0">
+    <w:nsid w:val="1BC752DC"/>
+    <w:multiLevelType w:val="hybridMultilevel"/>
+    <w:tmpl w:val="1A1CF23E"/>
+    <w:lvl w:ilvl="0" w:tplc="04090001">
+      <w:start w:val="1"/>
+      <w:numFmt w:val="bullet"/>
+      <w:lvlText w:val=""/>
+      <w:lvlJc w:val="left"/>
+      <w:pPr>
+        <w:ind w:left="720" w:hanging="360"/>
+      </w:pPr>
+      <w:rPr>
+        <w:rFonts w:ascii="Symbol" w:hAnsi="Symbol" w:hint="default"/>
+      </w:rPr>
+    </w:lvl>
+    <w:lvl w:ilvl="1" w:tplc="04090003" w:tentative="1">
+      <w:start w:val="1"/>
+      <w:numFmt w:val="bullet"/>
+      <w:lvlText w:val="o"/>
+      <w:lvlJc w:val="left"/>
+      <w:pPr>
+        <w:ind w:left="1440" w:hanging="360"/>
+      </w:pPr>
+      <w:rPr>
+        <w:rFonts w:ascii="Courier New" w:hAnsi="Courier New" w:cs="Courier New" w:hint="default"/>
+      </w:rPr>
+    </w:lvl>
+    <w:lvl w:ilvl="2" w:tplc="04090005" w:tentative="1">
+      <w:start w:val="1"/>
+      <w:numFmt w:val="bullet"/>
+      <w:lvlText w:val=""/>
+      <w:lvlJc w:val="left"/>
+      <w:pPr>
+        <w:ind w:left="2160" w:hanging="360"/>
+      </w:pPr>
+      <w:rPr>
+        <w:rFonts w:ascii="Wingdings" w:hAnsi="Wingdings" w:hint="default"/>
+      </w:rPr>
+    </w:lvl>
+    <w:lvl w:ilvl="3" w:tplc="04090001" w:tentative="1">
+      <w:start w:val="1"/>
+      <w:numFmt w:val="bullet"/>
+      <w:lvlText w:val=""/>
+      <w:lvlJc w:val="left"/>
+      <w:pPr>
+        <w:ind w:left="2880" w:hanging="360"/>
+      </w:pPr>
+      <w:rPr>
+        <w:rFonts w:ascii="Symbol" w:hAnsi="Symbol" w:hint="default"/>
+      </w:rPr>
+    </w:lvl>
+    <w:lvl w:ilvl="4" w:tplc="04090003" w:tentative="1">
+      <w:start w:val="1"/>
+      <w:numFmt w:val="bullet"/>
+      <w:lvlText w:val="o"/>
+      <w:lvlJc w:val="left"/>
+      <w:pPr>
+        <w:ind w:left="3600" w:hanging="360"/>
+      </w:pPr>
+      <w:rPr>
+        <w:rFonts w:ascii="Courier New" w:hAnsi="Courier New" w:cs="Courier New" w:hint="default"/>
+      </w:rPr>
+    </w:lvl>
+    <w:lvl w:ilvl="5" w:tplc="04090005" w:tentative="1">
+      <w:start w:val="1"/>
+      <w:numFmt w:val="bullet"/>
+      <w:lvlText w:val=""/>
+      <w:lvlJc w:val="left"/>
+      <w:pPr>
+        <w:ind w:left="4320" w:hanging="360"/>
+      </w:pPr>
+      <w:rPr>
+        <w:rFonts w:ascii="Wingdings" w:hAnsi="Wingdings" w:hint="default"/>
+      </w:rPr>
+    </w:lvl>
+    <w:lvl w:ilvl="6" w:tplc="04090001" w:tentative="1">
+      <w:start w:val="1"/>
+      <w:numFmt w:val="bullet"/>
+      <w:lvlText w:val=""/>
+      <w:lvlJc w:val="left"/>
+      <w:pPr>
+        <w:ind w:left="5040" w:hanging="360"/>
+      </w:pPr>
+      <w:rPr>
+        <w:rFonts w:ascii="Symbol" w:hAnsi="Symbol" w:hint="default"/>
+      </w:rPr>
+    </w:lvl>
+    <w:lvl w:ilvl="7" w:tplc="04090003" w:tentative="1">
+      <w:start w:val="1"/>
+      <w:numFmt w:val="bullet"/>
+      <w:lvlText w:val="o"/>
+      <w:lvlJc w:val="left"/>
+      <w:pPr>
+        <w:ind w:left="5760" w:hanging="360"/>
+      </w:pPr>
+      <w:rPr>
+        <w:rFonts w:ascii="Courier New" w:hAnsi="Courier New" w:cs="Courier New" w:hint="default"/>
+      </w:rPr>
+    </w:lvl>
+    <w:lvl w:ilvl="8" w:tplc="04090005" w:tentative="1">
+      <w:start w:val="1"/>
+      <w:numFmt w:val="bullet"/>
+      <w:lvlText w:val=""/>
+      <w:lvlJc w:val="left"/>
+      <w:pPr>
+        <w:ind w:left="6480" w:hanging="360"/>
+      </w:pPr>
+      <w:rPr>
+        <w:rFonts w:ascii="Wingdings" w:hAnsi="Wingdings" w:hint="default"/>
+      </w:rPr>
+    </w:lvl>
+  </w:abstractNum>
+  <w:abstractNum w:abstractNumId="1" w15:restartNumberingAfterBreak="0">
+    <w:nsid w:val="1C1A5140"/>
+    <w:multiLevelType w:val="hybridMultilevel"/>
+    <w:tmpl w:val="A0D21C22"/>
+    <w:lvl w:ilvl="0" w:tplc="04090001">
+      <w:start w:val="1"/>
+      <w:numFmt w:val="bullet"/>
+      <w:lvlText w:val=""/>
+      <w:lvlJc w:val="left"/>
+      <w:pPr>
+        <w:ind w:left="720" w:hanging="360"/>
+      </w:pPr>
+      <w:rPr>
+        <w:rFonts w:ascii="Symbol" w:hAnsi="Symbol" w:hint="default"/>
+      </w:rPr>
+    </w:lvl>
+    <w:lvl w:ilvl="1" w:tplc="04090003" w:tentative="1">
+      <w:start w:val="1"/>
+      <w:numFmt w:val="bullet"/>
+      <w:lvlText w:val="o"/>
+      <w:lvlJc w:val="left"/>
+      <w:pPr>
+        <w:ind w:left="1440" w:hanging="360"/>
+      </w:pPr>
+      <w:rPr>
+        <w:rFonts w:ascii="Courier New" w:hAnsi="Courier New" w:cs="Courier New" w:hint="default"/>
+      </w:rPr>
+    </w:lvl>
+    <w:lvl w:ilvl="2" w:tplc="04090005" w:tentative="1">
+      <w:start w:val="1"/>
+      <w:numFmt w:val="bullet"/>
+      <w:lvlText w:val=""/>
+      <w:lvlJc w:val="left"/>
+      <w:pPr>
+        <w:ind w:left="2160" w:hanging="360"/>
+      </w:pPr>
+      <w:rPr>
+        <w:rFonts w:ascii="Wingdings" w:hAnsi="Wingdings" w:hint="default"/>
+      </w:rPr>
+    </w:lvl>
+    <w:lvl w:ilvl="3" w:tplc="04090001" w:tentative="1">
+      <w:start w:val="1"/>
+      <w:numFmt w:val="bullet"/>
+      <w:lvlText w:val=""/>
+      <w:lvlJc w:val="left"/>
+      <w:pPr>
+        <w:ind w:left="2880" w:hanging="360"/>
+      </w:pPr>
+      <w:rPr>
+        <w:rFonts w:ascii="Symbol" w:hAnsi="Symbol" w:hint="default"/>
+      </w:rPr>
+    </w:lvl>
+    <w:lvl w:ilvl="4" w:tplc="04090003" w:tentative="1">
+      <w:start w:val="1"/>
+      <w:numFmt w:val="bullet"/>
+      <w:lvlText w:val="o"/>
+      <w:lvlJc w:val="left"/>
+      <w:pPr>
+        <w:ind w:left="3600" w:hanging="360"/>
+      </w:pPr>
+      <w:rPr>
+        <w:rFonts w:ascii="Courier New" w:hAnsi="Courier New" w:cs="Courier New" w:hint="default"/>
+      </w:rPr>
+    </w:lvl>
+    <w:lvl w:ilvl="5" w:tplc="04090005" w:tentative="1">
+      <w:start w:val="1"/>
+      <w:numFmt w:val="bullet"/>
+      <w:lvlText w:val=""/>
+      <w:lvlJc w:val="left"/>
+      <w:pPr>
+        <w:ind w:left="4320" w:hanging="360"/>
+      </w:pPr>
+      <w:rPr>
+        <w:rFonts w:ascii="Wingdings" w:hAnsi="Wingdings" w:hint="default"/>
+      </w:rPr>
+    </w:lvl>
+    <w:lvl w:ilvl="6" w:tplc="04090001" w:tentative="1">
+      <w:start w:val="1"/>
+      <w:numFmt w:val="bullet"/>
+      <w:lvlText w:val=""/>
+      <w:lvlJc w:val="left"/>
+      <w:pPr>
+        <w:ind w:left="5040" w:hanging="360"/>
+      </w:pPr>
+      <w:rPr>
+        <w:rFonts w:ascii="Symbol" w:hAnsi="Symbol" w:hint="default"/>
+      </w:rPr>
+    </w:lvl>
+    <w:lvl w:ilvl="7" w:tplc="04090003" w:tentative="1">
+      <w:start w:val="1"/>
+      <w:numFmt w:val="bullet"/>
+      <w:lvlText w:val="o"/>
+      <w:lvlJc w:val="left"/>
+      <w:pPr>
+        <w:ind w:left="5760" w:hanging="360"/>
+      </w:pPr>
+      <w:rPr>
+        <w:rFonts w:ascii="Courier New" w:hAnsi="Courier New" w:cs="Courier New" w:hint="default"/>
+      </w:rPr>
+    </w:lvl>
+    <w:lvl w:ilvl="8" w:tplc="04090005" w:tentative="1">
+      <w:start w:val="1"/>
+      <w:numFmt w:val="bullet"/>
+      <w:lvlText w:val=""/>
+      <w:lvlJc w:val="left"/>
+      <w:pPr>
+        <w:ind w:left="6480" w:hanging="360"/>
+      </w:pPr>
+      <w:rPr>
+        <w:rFonts w:ascii="Wingdings" w:hAnsi="Wingdings" w:hint="default"/>
+      </w:rPr>
+    </w:lvl>
+  </w:abstractNum>
+  <w:abstractNum w:abstractNumId="2" w15:restartNumberingAfterBreak="0">
+    <w:nsid w:val="48F2220C"/>
+    <w:multiLevelType w:val="hybridMultilevel"/>
+    <w:tmpl w:val="C6A41878"/>
+    <w:lvl w:ilvl="0" w:tplc="04090001">
+      <w:start w:val="1"/>
+      <w:numFmt w:val="bullet"/>
+      <w:lvlText w:val=""/>
+      <w:lvlJc w:val="left"/>
+      <w:pPr>
+        <w:ind w:left="720" w:hanging="360"/>
+      </w:pPr>
+      <w:rPr>
+        <w:rFonts w:ascii="Symbol" w:hAnsi="Symbol" w:hint="default"/>
+      </w:rPr>
+    </w:lvl>
+    <w:lvl w:ilvl="1" w:tplc="04090003" w:tentative="1">
+      <w:start w:val="1"/>
+      <w:numFmt w:val="bullet"/>
+      <w:lvlText w:val="o"/>
+      <w:lvlJc w:val="left"/>
+      <w:pPr>
+        <w:ind w:left="1440" w:hanging="360"/>
+      </w:pPr>
+      <w:rPr>
+        <w:rFonts w:ascii="Courier New" w:hAnsi="Courier New" w:cs="Courier New" w:hint="default"/>
+      </w:rPr>
+    </w:lvl>
+    <w:lvl w:ilvl="2" w:tplc="04090005" w:tentative="1">
+      <w:start w:val="1"/>
+      <w:numFmt w:val="bullet"/>
+      <w:lvlText w:val=""/>
+      <w:lvlJc w:val="left"/>
+      <w:pPr>
+        <w:ind w:left="2160" w:hanging="360"/>
+      </w:pPr>
+      <w:rPr>
+        <w:rFonts w:ascii="Wingdings" w:hAnsi="Wingdings" w:hint="default"/>
+      </w:rPr>
+    </w:lvl>
+    <w:lvl w:ilvl="3" w:tplc="04090001" w:tentative="1">
+      <w:start w:val="1"/>
+      <w:numFmt w:val="bullet"/>
+      <w:lvlText w:val=""/>
+      <w:lvlJc w:val="left"/>
+      <w:pPr>
+        <w:ind w:left="2880" w:hanging="360"/>
+      </w:pPr>
+      <w:rPr>
+        <w:rFonts w:ascii="Symbol" w:hAnsi="Symbol" w:hint="default"/>
+      </w:rPr>
+    </w:lvl>
+    <w:lvl w:ilvl="4" w:tplc="04090003" w:tentative="1">
+      <w:start w:val="1"/>
+      <w:numFmt w:val="bullet"/>
+      <w:lvlText w:val="o"/>
+      <w:lvlJc w:val="left"/>
+      <w:pPr>
+        <w:ind w:left="3600" w:hanging="360"/>
+      </w:pPr>
+      <w:rPr>
+        <w:rFonts w:ascii="Courier New" w:hAnsi="Courier New" w:cs="Courier New" w:hint="default"/>
+      </w:rPr>
+    </w:lvl>
+    <w:lvl w:ilvl="5" w:tplc="04090005" w:tentative="1">
+      <w:start w:val="1"/>
+      <w:numFmt w:val="bullet"/>
+      <w:lvlText w:val=""/>
+      <w:lvlJc w:val="left"/>
+      <w:pPr>
+        <w:ind w:left="4320" w:hanging="360"/>
+      </w:pPr>
+      <w:rPr>
+        <w:rFonts w:ascii="Wingdings" w:hAnsi="Wingdings" w:hint="default"/>
+      </w:rPr>
+    </w:lvl>
+    <w:lvl w:ilvl="6" w:tplc="04090001" w:tentative="1">
+      <w:start w:val="1"/>
+      <w:numFmt w:val="bullet"/>
+      <w:lvlText w:val=""/>
+      <w:lvlJc w:val="left"/>
+      <w:pPr>
+        <w:ind w:left="5040" w:hanging="360"/>
+      </w:pPr>
+      <w:rPr>
+        <w:rFonts w:ascii="Symbol" w:hAnsi="Symbol" w:hint="default"/>
+      </w:rPr>
+    </w:lvl>
+    <w:lvl w:ilvl="7" w:tplc="04090003" w:tentative="1">
+      <w:start w:val="1"/>
+      <w:numFmt w:val="bullet"/>
+      <w:lvlText w:val="o"/>
+      <w:lvlJc w:val="left"/>
+      <w:pPr>
+        <w:ind w:left="5760" w:hanging="360"/>
+      </w:pPr>
+      <w:rPr>
+        <w:rFonts w:ascii="Courier New" w:hAnsi="Courier New" w:cs="Courier New" w:hint="default"/>
+      </w:rPr>
+    </w:lvl>
+    <w:lvl w:ilvl="8" w:tplc="04090005" w:tentative="1">
+      <w:start w:val="1"/>
+      <w:numFmt w:val="bullet"/>
+      <w:lvlText w:val=""/>
+      <w:lvlJc w:val="left"/>
+      <w:pPr>
+        <w:ind w:left="6480" w:hanging="360"/>
+      </w:pPr>
+      <w:rPr>
+        <w:rFonts w:ascii="Wingdings" w:hAnsi="Wingdings" w:hint="default"/>
+      </w:rPr>
+    </w:lvl>
+  </w:abstractNum>
+  <w:num w:numId="1" w16cid:durableId="1020425147">
+    <w:abstractNumId w:val="0"/>
+  </w:num>
+  <w:num w:numId="2" w16cid:durableId="1516194011">
+    <w:abstractNumId w:val="2"/>
+  </w:num>
+  <w:num w:numId="3" w16cid:durableId="1124155957">
+    <w:abstractNumId w:val="1"/>
+  </w:num>
+</w:numbering>
 </file>
 
 <file path=word/styles.xml><?xml version="1.0" encoding="utf-8"?>
@@ -979,7 +2132,6 @@
   <w:style w:type="character" w:default="1" w:styleId="Fuentedeprrafopredeter">
     <w:name w:val="Default Paragraph Font"/>
     <w:uiPriority w:val="1"/>
-    <w:semiHidden/>
     <w:unhideWhenUsed/>
   </w:style>
   <w:style w:type="table" w:default="1" w:styleId="Tablanormal">

</xml_diff>

<commit_message>
Actualiza remoción de resumenes en hoja 1PM y procesamiento de hoja 3PM
</commit_message>
<xml_diff>
--- a/Documentacion/Procesamiento de Datos.docx
+++ b/Documentacion/Procesamiento de Datos.docx
@@ -1,6 +1,6 @@
 
 <file path=word/document.xml><?xml version="1.0" encoding="utf-8"?>
-<w:document xmlns:wpc="http://schemas.microsoft.com/office/word/2010/wordprocessingCanvas" xmlns:cx="http://schemas.microsoft.com/office/drawing/2014/chartex" xmlns:cx1="http://schemas.microsoft.com/office/drawing/2015/9/8/chartex" xmlns:cx2="http://schemas.microsoft.com/office/drawing/2015/10/21/chartex" xmlns:cx3="http://schemas.microsoft.com/office/drawing/2016/5/9/chartex" xmlns:cx4="http://schemas.microsoft.com/office/drawing/2016/5/10/chartex" xmlns:cx5="http://schemas.microsoft.com/office/drawing/2016/5/11/chartex" xmlns:cx6="http://schemas.microsoft.com/office/drawing/2016/5/12/chartex" xmlns:cx7="http://schemas.microsoft.com/office/drawing/2016/5/13/chartex" xmlns:cx8="http://schemas.microsoft.com/office/drawing/2016/5/14/chartex" xmlns:mc="http://schemas.openxmlformats.org/markup-compatibility/2006" xmlns:aink="http://schemas.microsoft.com/office/drawing/2016/ink" xmlns:am3d="http://schemas.microsoft.com/office/drawing/2017/model3d" xmlns:o="urn:schemas-microsoft-com:office:office" xmlns:oel="http://schemas.microsoft.com/office/2019/extlst" xmlns:r="http://schemas.openxmlformats.org/officeDocument/2006/relationships" xmlns:m="http://schemas.openxmlformats.org/officeDocument/2006/math" xmlns:v="urn:schemas-microsoft-com:vml" xmlns:wp14="http://schemas.microsoft.com/office/word/2010/wordprocessingDrawing" xmlns:wp="http://schemas.openxmlformats.org/drawingml/2006/wordprocessingDrawing" xmlns:w10="urn:schemas-microsoft-com:office:word" xmlns:w="http://schemas.openxmlformats.org/wordprocessingml/2006/main" xmlns:w14="http://schemas.microsoft.com/office/word/2010/wordml" xmlns:w15="http://schemas.microsoft.com/office/word/2012/wordml" xmlns:w16cex="http://schemas.microsoft.com/office/word/2018/wordml/cex" xmlns:w16cid="http://schemas.microsoft.com/office/word/2016/wordml/cid" xmlns:w16="http://schemas.microsoft.com/office/word/2018/wordml" xmlns:w16du="http://schemas.microsoft.com/office/word/2023/wordml/word16du" xmlns:w16sdtdh="http://schemas.microsoft.com/office/word/2020/wordml/sdtdatahash" xmlns:w16sdtfl="http://schemas.microsoft.com/office/word/2024/wordml/sdtformatlock" xmlns:w16se="http://schemas.microsoft.com/office/word/2015/wordml/symex" xmlns:wpg="http://schemas.microsoft.com/office/word/2010/wordprocessingGroup" xmlns:wpi="http://schemas.microsoft.com/office/word/2010/wordprocessingInk" xmlns:wne="http://schemas.microsoft.com/office/word/2006/wordml" xmlns:wps="http://schemas.microsoft.com/office/word/2010/wordprocessingShape" mc:Ignorable="w14 w15 w16se w16cid w16 w16cex w16sdtdh w16sdtfl w16du wp14">
+<w:document xmlns:wpc="http://schemas.microsoft.com/office/word/2010/wordprocessingCanvas" xmlns:cx="http://schemas.microsoft.com/office/drawing/2014/chartex" xmlns:cx1="http://schemas.microsoft.com/office/drawing/2015/9/8/chartex" xmlns:cx2="http://schemas.microsoft.com/office/drawing/2015/10/21/chartex" xmlns:cx3="http://schemas.microsoft.com/office/drawing/2016/5/9/chartex" xmlns:cx4="http://schemas.microsoft.com/office/drawing/2016/5/10/chartex" xmlns:cx5="http://schemas.microsoft.com/office/drawing/2016/5/11/chartex" xmlns:cx6="http://schemas.microsoft.com/office/drawing/2016/5/12/chartex" xmlns:cx7="http://schemas.microsoft.com/office/drawing/2016/5/13/chartex" xmlns:cx8="http://schemas.microsoft.com/office/drawing/2016/5/14/chartex" xmlns:mc="http://schemas.openxmlformats.org/markup-compatibility/2006" xmlns:aink="http://schemas.microsoft.com/office/drawing/2016/ink" xmlns:am3d="http://schemas.microsoft.com/office/drawing/2017/model3d" xmlns:o="urn:schemas-microsoft-com:office:office" xmlns:r="http://schemas.openxmlformats.org/officeDocument/2006/relationships" xmlns:m="http://schemas.openxmlformats.org/officeDocument/2006/math" xmlns:v="urn:schemas-microsoft-com:vml" xmlns:wp14="http://schemas.microsoft.com/office/word/2010/wordprocessingDrawing" xmlns:wp="http://schemas.openxmlformats.org/drawingml/2006/wordprocessingDrawing" xmlns:w10="urn:schemas-microsoft-com:office:word" xmlns:w="http://schemas.openxmlformats.org/wordprocessingml/2006/main" xmlns:w14="http://schemas.microsoft.com/office/word/2010/wordml" xmlns:w15="http://schemas.microsoft.com/office/word/2012/wordml" xmlns:w16cex="http://schemas.microsoft.com/office/word/2018/wordml/cex" xmlns:w16cid="http://schemas.microsoft.com/office/word/2016/wordml/cid" xmlns:w16="http://schemas.microsoft.com/office/word/2018/wordml" xmlns:w16sdtdh="http://schemas.microsoft.com/office/word/2020/wordml/sdtdatahash" xmlns:w16se="http://schemas.microsoft.com/office/word/2015/wordml/symex" xmlns:wpg="http://schemas.microsoft.com/office/word/2010/wordprocessingGroup" xmlns:wpi="http://schemas.microsoft.com/office/word/2010/wordprocessingInk" xmlns:wne="http://schemas.microsoft.com/office/word/2006/wordml" xmlns:wps="http://schemas.microsoft.com/office/word/2010/wordprocessingShape" mc:Ignorable="w14 w15 w16se w16cid w16 w16cex w16sdtdh wp14">
   <w:body>
     <w:p>
       <w:pPr>
@@ -100,14 +100,14 @@
           <w:rFonts w:ascii="Arial" w:hAnsi="Arial" w:cs="Arial"/>
           <w:lang w:val="es-CO"/>
         </w:rPr>
-        <w:t>1</w:t>
-      </w:r>
-      <w:r>
-        <w:rPr>
-          <w:rFonts w:ascii="Arial" w:hAnsi="Arial" w:cs="Arial"/>
-          <w:lang w:val="es-CO"/>
-        </w:rPr>
-        <w:t>8 de marzo de 2025</w:t>
+        <w:t>30</w:t>
+      </w:r>
+      <w:r>
+        <w:rPr>
+          <w:rFonts w:ascii="Arial" w:hAnsi="Arial" w:cs="Arial"/>
+          <w:lang w:val="es-CO"/>
+        </w:rPr>
+        <w:t xml:space="preserve"> de marzo de 2025</w:t>
       </w:r>
     </w:p>
     <w:p>
@@ -179,37 +179,126 @@
           <w:rFonts w:ascii="Arial" w:hAnsi="Arial" w:cs="Arial"/>
           <w:lang w:val="es-CO"/>
         </w:rPr>
-        <w:t>Almacenamiento de datos extraídos: .csv</w:t>
-      </w:r>
-    </w:p>
-    <w:p>
-      <w:pPr>
-        <w:rPr>
-          <w:rFonts w:ascii="Arial" w:hAnsi="Arial" w:cs="Arial"/>
-          <w:lang w:val="es-CO"/>
-        </w:rPr>
-      </w:pPr>
-      <w:r>
-        <w:rPr>
-          <w:rFonts w:ascii="Arial" w:hAnsi="Arial" w:cs="Arial"/>
-          <w:lang w:val="es-CO"/>
-        </w:rPr>
-        <w:t>Las fuentes de datos vienen en hojas de excel desde el origen, aunque el proyecto es muy específico sobre el municipio de Viterbo, Caldas y podrían extraerse manualmente a otra hoja de excel y trabajar sobre ellos, se puede construir un flujo de extracción de datos escalable utilizando Python, lo anterior para poder aplicarlo a todo el dataset en un futuro.</w:t>
-      </w:r>
-    </w:p>
-    <w:p>
-      <w:pPr>
-        <w:rPr>
-          <w:rFonts w:ascii="Arial" w:hAnsi="Arial" w:cs="Arial"/>
-          <w:lang w:val="es-CO"/>
-        </w:rPr>
-      </w:pPr>
-      <w:r>
-        <w:rPr>
-          <w:rFonts w:ascii="Arial" w:hAnsi="Arial" w:cs="Arial"/>
-          <w:lang w:val="es-CO"/>
-        </w:rPr>
-        <w:t>Los datos procesados se almacenarán en documentos .csv como datasets definitivos.</w:t>
+        <w:t>Almacenamiento de datos extraídos: .</w:t>
+      </w:r>
+      <w:proofErr w:type="spellStart"/>
+      <w:r>
+        <w:rPr>
+          <w:rFonts w:ascii="Arial" w:hAnsi="Arial" w:cs="Arial"/>
+          <w:lang w:val="es-CO"/>
+        </w:rPr>
+        <w:t>csv</w:t>
+      </w:r>
+      <w:proofErr w:type="spellEnd"/>
+    </w:p>
+    <w:p>
+      <w:pPr>
+        <w:rPr>
+          <w:rFonts w:ascii="Arial" w:hAnsi="Arial" w:cs="Arial"/>
+          <w:lang w:val="es-CO"/>
+        </w:rPr>
+      </w:pPr>
+      <w:r>
+        <w:rPr>
+          <w:rFonts w:ascii="Arial" w:hAnsi="Arial" w:cs="Arial"/>
+          <w:lang w:val="es-CO"/>
+        </w:rPr>
+        <w:t xml:space="preserve">Las fuentes de datos vienen en hojas de </w:t>
+      </w:r>
+      <w:proofErr w:type="spellStart"/>
+      <w:r>
+        <w:rPr>
+          <w:rFonts w:ascii="Arial" w:hAnsi="Arial" w:cs="Arial"/>
+          <w:lang w:val="es-CO"/>
+        </w:rPr>
+        <w:t>excel</w:t>
+      </w:r>
+      <w:proofErr w:type="spellEnd"/>
+      <w:r>
+        <w:rPr>
+          <w:rFonts w:ascii="Arial" w:hAnsi="Arial" w:cs="Arial"/>
+          <w:lang w:val="es-CO"/>
+        </w:rPr>
+        <w:t xml:space="preserve"> desde el origen, aunque el proyecto es muy específico sobre el municipio de Viterbo, Caldas y podrían extraerse manualmente a otra hoja de </w:t>
+      </w:r>
+      <w:proofErr w:type="spellStart"/>
+      <w:r>
+        <w:rPr>
+          <w:rFonts w:ascii="Arial" w:hAnsi="Arial" w:cs="Arial"/>
+          <w:lang w:val="es-CO"/>
+        </w:rPr>
+        <w:t>excel</w:t>
+      </w:r>
+      <w:proofErr w:type="spellEnd"/>
+      <w:r>
+        <w:rPr>
+          <w:rFonts w:ascii="Arial" w:hAnsi="Arial" w:cs="Arial"/>
+          <w:lang w:val="es-CO"/>
+        </w:rPr>
+        <w:t xml:space="preserve"> y trabajar sobre ellos, se puede construir un flujo de extracción de datos escalable utilizando Python, lo anterior para poder aplicarlo a todo el </w:t>
+      </w:r>
+      <w:proofErr w:type="spellStart"/>
+      <w:r>
+        <w:rPr>
+          <w:rFonts w:ascii="Arial" w:hAnsi="Arial" w:cs="Arial"/>
+          <w:lang w:val="es-CO"/>
+        </w:rPr>
+        <w:t>dataset</w:t>
+      </w:r>
+      <w:proofErr w:type="spellEnd"/>
+      <w:r>
+        <w:rPr>
+          <w:rFonts w:ascii="Arial" w:hAnsi="Arial" w:cs="Arial"/>
+          <w:lang w:val="es-CO"/>
+        </w:rPr>
+        <w:t xml:space="preserve"> en un futuro.</w:t>
+      </w:r>
+    </w:p>
+    <w:p>
+      <w:pPr>
+        <w:rPr>
+          <w:rFonts w:ascii="Arial" w:hAnsi="Arial" w:cs="Arial"/>
+          <w:lang w:val="es-CO"/>
+        </w:rPr>
+      </w:pPr>
+      <w:r>
+        <w:rPr>
+          <w:rFonts w:ascii="Arial" w:hAnsi="Arial" w:cs="Arial"/>
+          <w:lang w:val="es-CO"/>
+        </w:rPr>
+        <w:t>Los datos procesados se almacenarán en documentos .</w:t>
+      </w:r>
+      <w:proofErr w:type="spellStart"/>
+      <w:r>
+        <w:rPr>
+          <w:rFonts w:ascii="Arial" w:hAnsi="Arial" w:cs="Arial"/>
+          <w:lang w:val="es-CO"/>
+        </w:rPr>
+        <w:t>csv</w:t>
+      </w:r>
+      <w:proofErr w:type="spellEnd"/>
+      <w:r>
+        <w:rPr>
+          <w:rFonts w:ascii="Arial" w:hAnsi="Arial" w:cs="Arial"/>
+          <w:lang w:val="es-CO"/>
+        </w:rPr>
+        <w:t xml:space="preserve"> como </w:t>
+      </w:r>
+      <w:proofErr w:type="spellStart"/>
+      <w:r>
+        <w:rPr>
+          <w:rFonts w:ascii="Arial" w:hAnsi="Arial" w:cs="Arial"/>
+          <w:lang w:val="es-CO"/>
+        </w:rPr>
+        <w:t>datasets</w:t>
+      </w:r>
+      <w:proofErr w:type="spellEnd"/>
+      <w:r>
+        <w:rPr>
+          <w:rFonts w:ascii="Arial" w:hAnsi="Arial" w:cs="Arial"/>
+          <w:lang w:val="es-CO"/>
+        </w:rPr>
+        <w:t xml:space="preserve"> definitivos.</w:t>
       </w:r>
     </w:p>
     <w:p>
@@ -375,7 +464,23 @@
           <w:rFonts w:ascii="Arial" w:hAnsi="Arial" w:cs="Arial"/>
           <w:lang w:val="es-CO"/>
         </w:rPr>
-        <w:t>Se empieza por extraer solo la parte correspondiente a los datos del archivo excel, para lo cual se ignoran las primeras 9 filas de la hoja</w:t>
+        <w:t xml:space="preserve">Se empieza por extraer solo la parte correspondiente a los datos del archivo </w:t>
+      </w:r>
+      <w:proofErr w:type="spellStart"/>
+      <w:r>
+        <w:rPr>
+          <w:rFonts w:ascii="Arial" w:hAnsi="Arial" w:cs="Arial"/>
+          <w:lang w:val="es-CO"/>
+        </w:rPr>
+        <w:t>excel</w:t>
+      </w:r>
+      <w:proofErr w:type="spellEnd"/>
+      <w:r>
+        <w:rPr>
+          <w:rFonts w:ascii="Arial" w:hAnsi="Arial" w:cs="Arial"/>
+          <w:lang w:val="es-CO"/>
+        </w:rPr>
+        <w:t>, para lo cual se ignoran las primeras 9 filas de la hoja</w:t>
       </w:r>
     </w:p>
     <w:p>
@@ -455,22 +560,47 @@
           <w:rFonts w:ascii="Arial" w:hAnsi="Arial" w:cs="Arial"/>
           <w:lang w:val="es-CO"/>
         </w:rPr>
-        <w:t>Actualización de headers</w:t>
-      </w:r>
-    </w:p>
-    <w:p>
-      <w:pPr>
-        <w:rPr>
-          <w:rFonts w:ascii="Arial" w:hAnsi="Arial" w:cs="Arial"/>
-          <w:lang w:val="es-CO"/>
-        </w:rPr>
-      </w:pPr>
-      <w:r>
-        <w:rPr>
-          <w:rFonts w:ascii="Arial" w:hAnsi="Arial" w:cs="Arial"/>
-          <w:lang w:val="es-CO"/>
-        </w:rPr>
-        <w:t>Al extraer los datos desde el archivo .xlsx, se verifica el dataframe generado por Pandas, empezando por los nombres de las columnas y se observan las siguientes incidencias:</w:t>
+        <w:t xml:space="preserve">Actualización de </w:t>
+      </w:r>
+      <w:proofErr w:type="spellStart"/>
+      <w:r>
+        <w:rPr>
+          <w:rFonts w:ascii="Arial" w:hAnsi="Arial" w:cs="Arial"/>
+          <w:lang w:val="es-CO"/>
+        </w:rPr>
+        <w:t>headers</w:t>
+      </w:r>
+      <w:proofErr w:type="spellEnd"/>
+    </w:p>
+    <w:p>
+      <w:pPr>
+        <w:rPr>
+          <w:rFonts w:ascii="Arial" w:hAnsi="Arial" w:cs="Arial"/>
+          <w:lang w:val="es-CO"/>
+        </w:rPr>
+      </w:pPr>
+      <w:r>
+        <w:rPr>
+          <w:rFonts w:ascii="Arial" w:hAnsi="Arial" w:cs="Arial"/>
+          <w:lang w:val="es-CO"/>
+        </w:rPr>
+        <w:t xml:space="preserve">Al extraer los datos desde el archivo .xlsx, se verifica el </w:t>
+      </w:r>
+      <w:proofErr w:type="spellStart"/>
+      <w:r>
+        <w:rPr>
+          <w:rFonts w:ascii="Arial" w:hAnsi="Arial" w:cs="Arial"/>
+          <w:lang w:val="es-CO"/>
+        </w:rPr>
+        <w:t>dataframe</w:t>
+      </w:r>
+      <w:proofErr w:type="spellEnd"/>
+      <w:r>
+        <w:rPr>
+          <w:rFonts w:ascii="Arial" w:hAnsi="Arial" w:cs="Arial"/>
+          <w:lang w:val="es-CO"/>
+        </w:rPr>
+        <w:t xml:space="preserve"> generado por Pandas, empezando por los nombres de las columnas y se observan las siguientes incidencias:</w:t>
       </w:r>
     </w:p>
     <w:p>
@@ -485,12 +615,53 @@
           <w:lang w:val="es-CO"/>
         </w:rPr>
       </w:pPr>
-      <w:r>
-        <w:rPr>
-          <w:rFonts w:ascii="Arial" w:hAnsi="Arial" w:cs="Arial"/>
-          <w:lang w:val="es-CO"/>
-        </w:rPr>
-        <w:t>Headers sin nombres descriptivos: headers con nombres por defecto de Pandas tipo ‘Unnamed: X’.</w:t>
+      <w:proofErr w:type="spellStart"/>
+      <w:r>
+        <w:rPr>
+          <w:rFonts w:ascii="Arial" w:hAnsi="Arial" w:cs="Arial"/>
+          <w:lang w:val="es-CO"/>
+        </w:rPr>
+        <w:t>Headers</w:t>
+      </w:r>
+      <w:proofErr w:type="spellEnd"/>
+      <w:r>
+        <w:rPr>
+          <w:rFonts w:ascii="Arial" w:hAnsi="Arial" w:cs="Arial"/>
+          <w:lang w:val="es-CO"/>
+        </w:rPr>
+        <w:t xml:space="preserve"> sin nombres descriptivos: </w:t>
+      </w:r>
+      <w:proofErr w:type="spellStart"/>
+      <w:r>
+        <w:rPr>
+          <w:rFonts w:ascii="Arial" w:hAnsi="Arial" w:cs="Arial"/>
+          <w:lang w:val="es-CO"/>
+        </w:rPr>
+        <w:t>headers</w:t>
+      </w:r>
+      <w:proofErr w:type="spellEnd"/>
+      <w:r>
+        <w:rPr>
+          <w:rFonts w:ascii="Arial" w:hAnsi="Arial" w:cs="Arial"/>
+          <w:lang w:val="es-CO"/>
+        </w:rPr>
+        <w:t xml:space="preserve"> con nombres por defecto de Pandas tipo ‘</w:t>
+      </w:r>
+      <w:proofErr w:type="spellStart"/>
+      <w:r>
+        <w:rPr>
+          <w:rFonts w:ascii="Arial" w:hAnsi="Arial" w:cs="Arial"/>
+          <w:lang w:val="es-CO"/>
+        </w:rPr>
+        <w:t>Unnamed</w:t>
+      </w:r>
+      <w:proofErr w:type="spellEnd"/>
+      <w:r>
+        <w:rPr>
+          <w:rFonts w:ascii="Arial" w:hAnsi="Arial" w:cs="Arial"/>
+          <w:lang w:val="es-CO"/>
+        </w:rPr>
+        <w:t>: X’.</w:t>
       </w:r>
     </w:p>
     <w:p>
@@ -505,12 +676,21 @@
           <w:lang w:val="es-CO"/>
         </w:rPr>
       </w:pPr>
-      <w:r>
-        <w:rPr>
-          <w:rFonts w:ascii="Arial" w:hAnsi="Arial" w:cs="Arial"/>
-          <w:lang w:val="es-CO"/>
-        </w:rPr>
-        <w:t>Headers en jerarquías inferiores debido a la agrupación de datos: ‘Hombre’ y ‘Mujer’ se encuentran en la primera fila de datos debido al diseño del .xlsx donde se busca describir la agrupación por Sexo de los datos.</w:t>
+      <w:proofErr w:type="spellStart"/>
+      <w:r>
+        <w:rPr>
+          <w:rFonts w:ascii="Arial" w:hAnsi="Arial" w:cs="Arial"/>
+          <w:lang w:val="es-CO"/>
+        </w:rPr>
+        <w:t>Headers</w:t>
+      </w:r>
+      <w:proofErr w:type="spellEnd"/>
+      <w:r>
+        <w:rPr>
+          <w:rFonts w:ascii="Arial" w:hAnsi="Arial" w:cs="Arial"/>
+          <w:lang w:val="es-CO"/>
+        </w:rPr>
+        <w:t xml:space="preserve"> en jerarquías inferiores debido a la agrupación de datos: ‘Hombre’ y ‘Mujer’ se encuentran en la primera fila de datos debido al diseño del .xlsx donde se busca describir la agrupación por Sexo de los datos.</w:t>
       </w:r>
     </w:p>
     <w:p>
@@ -530,7 +710,39 @@
           <w:rFonts w:ascii="Arial" w:hAnsi="Arial" w:cs="Arial"/>
           <w:lang w:val="es-CO"/>
         </w:rPr>
-        <w:t>Tildes: Se tienen headers con tildes como ‘Índice de masculinidad’ e ‘Índice de feminidad’, las tildes es mejor evitarlas para evitar errores de charset de las herramientas utilizadas.</w:t>
+        <w:t xml:space="preserve">Tildes: Se tienen </w:t>
+      </w:r>
+      <w:proofErr w:type="spellStart"/>
+      <w:r>
+        <w:rPr>
+          <w:rFonts w:ascii="Arial" w:hAnsi="Arial" w:cs="Arial"/>
+          <w:lang w:val="es-CO"/>
+        </w:rPr>
+        <w:t>headers</w:t>
+      </w:r>
+      <w:proofErr w:type="spellEnd"/>
+      <w:r>
+        <w:rPr>
+          <w:rFonts w:ascii="Arial" w:hAnsi="Arial" w:cs="Arial"/>
+          <w:lang w:val="es-CO"/>
+        </w:rPr>
+        <w:t xml:space="preserve"> con tildes como ‘Índice de masculinidad’ e ‘Índice de feminidad’, las tildes es mejor evitarlas para evitar errores de </w:t>
+      </w:r>
+      <w:proofErr w:type="spellStart"/>
+      <w:r>
+        <w:rPr>
+          <w:rFonts w:ascii="Arial" w:hAnsi="Arial" w:cs="Arial"/>
+          <w:lang w:val="es-CO"/>
+        </w:rPr>
+        <w:t>charset</w:t>
+      </w:r>
+      <w:proofErr w:type="spellEnd"/>
+      <w:r>
+        <w:rPr>
+          <w:rFonts w:ascii="Arial" w:hAnsi="Arial" w:cs="Arial"/>
+          <w:lang w:val="es-CO"/>
+        </w:rPr>
+        <w:t xml:space="preserve"> de las herramientas utilizadas.</w:t>
       </w:r>
     </w:p>
     <w:p>
@@ -624,14 +836,32 @@
           <w:lang w:val="es-CO"/>
         </w:rPr>
       </w:pPr>
+      <w:proofErr w:type="spellStart"/>
       <w:r>
         <w:rPr>
           <w:rFonts w:ascii="Arial" w:hAnsi="Arial" w:cs="Arial"/>
           <w:lang w:val="es-CO"/>
         </w:rPr>
         <w:lastRenderedPageBreak/>
-        <w:t>Unnamed: 2: Area</w:t>
-      </w:r>
+        <w:t>Unnamed</w:t>
+      </w:r>
+      <w:proofErr w:type="spellEnd"/>
+      <w:r>
+        <w:rPr>
+          <w:rFonts w:ascii="Arial" w:hAnsi="Arial" w:cs="Arial"/>
+          <w:lang w:val="es-CO"/>
+        </w:rPr>
+        <w:t xml:space="preserve">: 2: </w:t>
+      </w:r>
+      <w:proofErr w:type="spellStart"/>
+      <w:r>
+        <w:rPr>
+          <w:rFonts w:ascii="Arial" w:hAnsi="Arial" w:cs="Arial"/>
+          <w:lang w:val="es-CO"/>
+        </w:rPr>
+        <w:t>Area</w:t>
+      </w:r>
+      <w:proofErr w:type="spellEnd"/>
     </w:p>
     <w:p>
       <w:pPr>
@@ -645,12 +875,21 @@
           <w:lang w:val="es-CO"/>
         </w:rPr>
       </w:pPr>
-      <w:r>
-        <w:rPr>
-          <w:rFonts w:ascii="Arial" w:hAnsi="Arial" w:cs="Arial"/>
-          <w:lang w:val="es-CO"/>
-        </w:rPr>
-        <w:t>Unnamed: 3: Grupo de edad</w:t>
+      <w:proofErr w:type="spellStart"/>
+      <w:r>
+        <w:rPr>
+          <w:rFonts w:ascii="Arial" w:hAnsi="Arial" w:cs="Arial"/>
+          <w:lang w:val="es-CO"/>
+        </w:rPr>
+        <w:t>Unnamed</w:t>
+      </w:r>
+      <w:proofErr w:type="spellEnd"/>
+      <w:r>
+        <w:rPr>
+          <w:rFonts w:ascii="Arial" w:hAnsi="Arial" w:cs="Arial"/>
+          <w:lang w:val="es-CO"/>
+        </w:rPr>
+        <w:t>: 3: Grupo de edad</w:t>
       </w:r>
     </w:p>
     <w:p>
@@ -685,12 +924,21 @@
           <w:lang w:val="es-CO"/>
         </w:rPr>
       </w:pPr>
-      <w:r>
-        <w:rPr>
-          <w:rFonts w:ascii="Arial" w:hAnsi="Arial" w:cs="Arial"/>
-          <w:lang w:val="es-CO"/>
-        </w:rPr>
-        <w:t>Unnamed 6: Mujer</w:t>
+      <w:proofErr w:type="spellStart"/>
+      <w:r>
+        <w:rPr>
+          <w:rFonts w:ascii="Arial" w:hAnsi="Arial" w:cs="Arial"/>
+          <w:lang w:val="es-CO"/>
+        </w:rPr>
+        <w:t>Unnamed</w:t>
+      </w:r>
+      <w:proofErr w:type="spellEnd"/>
+      <w:r>
+        <w:rPr>
+          <w:rFonts w:ascii="Arial" w:hAnsi="Arial" w:cs="Arial"/>
+          <w:lang w:val="es-CO"/>
+        </w:rPr>
+        <w:t xml:space="preserve"> 6: Mujer</w:t>
       </w:r>
     </w:p>
     <w:p>
@@ -710,7 +958,23 @@
           <w:rFonts w:ascii="Arial" w:hAnsi="Arial" w:cs="Arial"/>
           <w:lang w:val="es-CO"/>
         </w:rPr>
-        <w:t>Índice de masculinidad: Indice de masculinidad</w:t>
+        <w:t xml:space="preserve">Índice de masculinidad: </w:t>
+      </w:r>
+      <w:proofErr w:type="spellStart"/>
+      <w:r>
+        <w:rPr>
+          <w:rFonts w:ascii="Arial" w:hAnsi="Arial" w:cs="Arial"/>
+          <w:lang w:val="es-CO"/>
+        </w:rPr>
+        <w:t>Indice</w:t>
+      </w:r>
+      <w:proofErr w:type="spellEnd"/>
+      <w:r>
+        <w:rPr>
+          <w:rFonts w:ascii="Arial" w:hAnsi="Arial" w:cs="Arial"/>
+          <w:lang w:val="es-CO"/>
+        </w:rPr>
+        <w:t xml:space="preserve"> de masculinidad</w:t>
       </w:r>
     </w:p>
     <w:p>
@@ -730,7 +994,23 @@
           <w:rFonts w:ascii="Arial" w:hAnsi="Arial" w:cs="Arial"/>
           <w:lang w:val="es-CO"/>
         </w:rPr>
-        <w:t>Índice de feminidad: Indice de feminidad</w:t>
+        <w:t xml:space="preserve">Índice de feminidad: </w:t>
+      </w:r>
+      <w:proofErr w:type="spellStart"/>
+      <w:r>
+        <w:rPr>
+          <w:rFonts w:ascii="Arial" w:hAnsi="Arial" w:cs="Arial"/>
+          <w:lang w:val="es-CO"/>
+        </w:rPr>
+        <w:t>Indice</w:t>
+      </w:r>
+      <w:proofErr w:type="spellEnd"/>
+      <w:r>
+        <w:rPr>
+          <w:rFonts w:ascii="Arial" w:hAnsi="Arial" w:cs="Arial"/>
+          <w:lang w:val="es-CO"/>
+        </w:rPr>
+        <w:t xml:space="preserve"> de feminidad</w:t>
       </w:r>
     </w:p>
     <w:p>
@@ -831,7 +1111,23 @@
           <w:rFonts w:ascii="Arial" w:hAnsi="Arial" w:cs="Arial"/>
           <w:lang w:val="es-CO"/>
         </w:rPr>
-        <w:t>Se evidencian dos columnas sin datos o con datos irrelevantes para el dataset que pueden ser eliminadas:</w:t>
+        <w:t xml:space="preserve">Se evidencian dos columnas sin datos o con datos irrelevantes para el </w:t>
+      </w:r>
+      <w:proofErr w:type="spellStart"/>
+      <w:r>
+        <w:rPr>
+          <w:rFonts w:ascii="Arial" w:hAnsi="Arial" w:cs="Arial"/>
+          <w:lang w:val="es-CO"/>
+        </w:rPr>
+        <w:t>dataset</w:t>
+      </w:r>
+      <w:proofErr w:type="spellEnd"/>
+      <w:r>
+        <w:rPr>
+          <w:rFonts w:ascii="Arial" w:hAnsi="Arial" w:cs="Arial"/>
+          <w:lang w:val="es-CO"/>
+        </w:rPr>
+        <w:t xml:space="preserve"> que pueden ser eliminadas:</w:t>
       </w:r>
     </w:p>
     <w:p>
@@ -873,12 +1169,21 @@
           <w:lang w:val="es-CO"/>
         </w:rPr>
       </w:pPr>
-      <w:r>
-        <w:rPr>
-          <w:rFonts w:ascii="Arial" w:hAnsi="Arial" w:cs="Arial"/>
-          <w:lang w:val="es-CO"/>
-        </w:rPr>
-        <w:t>Unnamed: 1: Contiene el municipio, para este caso particular es irrelevante porque solo se tratarán datos del municipio de Viterbo, Caldas, pero se tendrá en cuenta para un futuro proyecto que involucre múltiples municipios al mismo tiempo.</w:t>
+      <w:proofErr w:type="spellStart"/>
+      <w:r>
+        <w:rPr>
+          <w:rFonts w:ascii="Arial" w:hAnsi="Arial" w:cs="Arial"/>
+          <w:lang w:val="es-CO"/>
+        </w:rPr>
+        <w:t>Unnamed</w:t>
+      </w:r>
+      <w:proofErr w:type="spellEnd"/>
+      <w:r>
+        <w:rPr>
+          <w:rFonts w:ascii="Arial" w:hAnsi="Arial" w:cs="Arial"/>
+          <w:lang w:val="es-CO"/>
+        </w:rPr>
+        <w:t>: 1: Contiene el municipio, para este caso particular es irrelevante porque solo se tratarán datos del municipio de Viterbo, Caldas, pero se tendrá en cuenta para un futuro proyecto que involucre múltiples municipios al mismo tiempo.</w:t>
       </w:r>
     </w:p>
     <w:p>
@@ -1012,22 +1317,95 @@
           <w:rFonts w:ascii="Arial" w:hAnsi="Arial" w:cs="Arial"/>
           <w:lang w:val="es-CO"/>
         </w:rPr>
-        <w:t>Tratamiento de valores Nulos, en blanco o NaN</w:t>
-      </w:r>
-    </w:p>
-    <w:p>
-      <w:pPr>
-        <w:rPr>
-          <w:rFonts w:ascii="Arial" w:hAnsi="Arial" w:cs="Arial"/>
-          <w:lang w:val="es-CO"/>
-        </w:rPr>
-      </w:pPr>
-      <w:r>
-        <w:rPr>
-          <w:rFonts w:ascii="Arial" w:hAnsi="Arial" w:cs="Arial"/>
-          <w:lang w:val="es-CO"/>
-        </w:rPr>
-        <w:t>La única columna con valores NaN es la columna ‘Area’, la cual indica el área de recolección de datos en el municipio, Totales, cabecera municipal, centros poblados, zonas rurales dispersas, la presencia de valores NaN se debe a la agrupación realizada en el diseño del .xlsx, el enfoque para resolver esta inconsistencia será propagar el primer valor válido hasta el siguiente valor válido y repetir hasta reemplazar todos los valores NaN.</w:t>
+        <w:t xml:space="preserve">Tratamiento de valores Nulos, en blanco o </w:t>
+      </w:r>
+      <w:proofErr w:type="spellStart"/>
+      <w:r>
+        <w:rPr>
+          <w:rFonts w:ascii="Arial" w:hAnsi="Arial" w:cs="Arial"/>
+          <w:lang w:val="es-CO"/>
+        </w:rPr>
+        <w:t>NaN</w:t>
+      </w:r>
+      <w:proofErr w:type="spellEnd"/>
+    </w:p>
+    <w:p>
+      <w:pPr>
+        <w:rPr>
+          <w:rFonts w:ascii="Arial" w:hAnsi="Arial" w:cs="Arial"/>
+          <w:lang w:val="es-CO"/>
+        </w:rPr>
+      </w:pPr>
+      <w:r>
+        <w:rPr>
+          <w:rFonts w:ascii="Arial" w:hAnsi="Arial" w:cs="Arial"/>
+          <w:lang w:val="es-CO"/>
+        </w:rPr>
+        <w:t xml:space="preserve">La única columna con valores </w:t>
+      </w:r>
+      <w:proofErr w:type="spellStart"/>
+      <w:r>
+        <w:rPr>
+          <w:rFonts w:ascii="Arial" w:hAnsi="Arial" w:cs="Arial"/>
+          <w:lang w:val="es-CO"/>
+        </w:rPr>
+        <w:t>NaN</w:t>
+      </w:r>
+      <w:proofErr w:type="spellEnd"/>
+      <w:r>
+        <w:rPr>
+          <w:rFonts w:ascii="Arial" w:hAnsi="Arial" w:cs="Arial"/>
+          <w:lang w:val="es-CO"/>
+        </w:rPr>
+        <w:t xml:space="preserve"> es la columna ‘</w:t>
+      </w:r>
+      <w:proofErr w:type="spellStart"/>
+      <w:r>
+        <w:rPr>
+          <w:rFonts w:ascii="Arial" w:hAnsi="Arial" w:cs="Arial"/>
+          <w:lang w:val="es-CO"/>
+        </w:rPr>
+        <w:t>Area</w:t>
+      </w:r>
+      <w:proofErr w:type="spellEnd"/>
+      <w:r>
+        <w:rPr>
+          <w:rFonts w:ascii="Arial" w:hAnsi="Arial" w:cs="Arial"/>
+          <w:lang w:val="es-CO"/>
+        </w:rPr>
+        <w:t xml:space="preserve">’, la cual indica el área de recolección de datos en el municipio, Totales, cabecera municipal, centros poblados, zonas rurales dispersas, la presencia de valores </w:t>
+      </w:r>
+      <w:proofErr w:type="spellStart"/>
+      <w:r>
+        <w:rPr>
+          <w:rFonts w:ascii="Arial" w:hAnsi="Arial" w:cs="Arial"/>
+          <w:lang w:val="es-CO"/>
+        </w:rPr>
+        <w:t>NaN</w:t>
+      </w:r>
+      <w:proofErr w:type="spellEnd"/>
+      <w:r>
+        <w:rPr>
+          <w:rFonts w:ascii="Arial" w:hAnsi="Arial" w:cs="Arial"/>
+          <w:lang w:val="es-CO"/>
+        </w:rPr>
+        <w:t xml:space="preserve"> se debe a la agrupación realizada en el diseño del .xlsx, el enfoque para resolver esta inconsistencia será propagar el primer valor válido hasta el siguiente valor válido y repetir hasta reemplazar todos los valores </w:t>
+      </w:r>
+      <w:proofErr w:type="spellStart"/>
+      <w:r>
+        <w:rPr>
+          <w:rFonts w:ascii="Arial" w:hAnsi="Arial" w:cs="Arial"/>
+          <w:lang w:val="es-CO"/>
+        </w:rPr>
+        <w:t>NaN</w:t>
+      </w:r>
+      <w:proofErr w:type="spellEnd"/>
+      <w:r>
+        <w:rPr>
+          <w:rFonts w:ascii="Arial" w:hAnsi="Arial" w:cs="Arial"/>
+          <w:lang w:val="es-CO"/>
+        </w:rPr>
+        <w:t>.</w:t>
       </w:r>
     </w:p>
     <w:p>
@@ -1163,8 +1541,1044 @@
           <w:rFonts w:ascii="Arial" w:hAnsi="Arial" w:cs="Arial"/>
           <w:lang w:val="es-CO"/>
         </w:rPr>
-        <w:t>Por último se cambian las tildes dentro de los datos, reemplazando vocales con tilde por vocales sin tilde.</w:t>
-      </w:r>
+        <w:t>S</w:t>
+      </w:r>
+      <w:r>
+        <w:rPr>
+          <w:rFonts w:ascii="Arial" w:hAnsi="Arial" w:cs="Arial"/>
+          <w:lang w:val="es-CO"/>
+        </w:rPr>
+        <w:t>e cambian las tildes dentro de los datos, reemplazando vocales con tilde por vocales sin tilde.</w:t>
+      </w:r>
+    </w:p>
+    <w:p>
+      <w:pPr>
+        <w:rPr>
+          <w:rFonts w:ascii="Arial" w:hAnsi="Arial" w:cs="Arial"/>
+          <w:lang w:val="es-CO"/>
+        </w:rPr>
+      </w:pPr>
+      <w:r>
+        <w:rPr>
+          <w:rFonts w:ascii="Arial" w:hAnsi="Arial" w:cs="Arial"/>
+          <w:lang w:val="es-CO"/>
+        </w:rPr>
+        <w:t>A continuación, se eliminan las columnas y filas que contienen resúmenes de datos.</w:t>
+      </w:r>
+    </w:p>
+    <w:p>
+      <w:pPr>
+        <w:rPr>
+          <w:rFonts w:ascii="Arial" w:hAnsi="Arial" w:cs="Arial"/>
+          <w:lang w:val="es-CO"/>
+        </w:rPr>
+      </w:pPr>
+      <w:r>
+        <w:rPr>
+          <w:rFonts w:ascii="Arial" w:hAnsi="Arial" w:cs="Arial"/>
+          <w:noProof/>
+          <w:lang w:val="es-CO"/>
+        </w:rPr>
+        <w:lastRenderedPageBreak/>
+        <w:drawing>
+          <wp:inline distT="0" distB="0" distL="0" distR="0" wp14:anchorId="3A6DAD28" wp14:editId="78AF24C6">
+            <wp:extent cx="5612130" cy="4692650"/>
+            <wp:effectExtent l="0" t="0" r="7620" b="0"/>
+            <wp:docPr id="1" name="Imagen 1"/>
+            <wp:cNvGraphicFramePr>
+              <a:graphicFrameLocks xmlns:a="http://schemas.openxmlformats.org/drawingml/2006/main" noChangeAspect="1"/>
+            </wp:cNvGraphicFramePr>
+            <a:graphic xmlns:a="http://schemas.openxmlformats.org/drawingml/2006/main">
+              <a:graphicData uri="http://schemas.openxmlformats.org/drawingml/2006/picture">
+                <pic:pic xmlns:pic="http://schemas.openxmlformats.org/drawingml/2006/picture">
+                  <pic:nvPicPr>
+                    <pic:cNvPr id="1" name="Imagen 1"/>
+                    <pic:cNvPicPr/>
+                  </pic:nvPicPr>
+                  <pic:blipFill>
+                    <a:blip r:embed="rId12">
+                      <a:extLst>
+                        <a:ext uri="{28A0092B-C50C-407E-A947-70E740481C1C}">
+                          <a14:useLocalDpi xmlns:a14="http://schemas.microsoft.com/office/drawing/2010/main" val="0"/>
+                        </a:ext>
+                      </a:extLst>
+                    </a:blip>
+                    <a:stretch>
+                      <a:fillRect/>
+                    </a:stretch>
+                  </pic:blipFill>
+                  <pic:spPr>
+                    <a:xfrm>
+                      <a:off x="0" y="0"/>
+                      <a:ext cx="5612130" cy="4692650"/>
+                    </a:xfrm>
+                    <a:prstGeom prst="rect">
+                      <a:avLst/>
+                    </a:prstGeom>
+                  </pic:spPr>
+                </pic:pic>
+              </a:graphicData>
+            </a:graphic>
+          </wp:inline>
+        </w:drawing>
+      </w:r>
+    </w:p>
+    <w:p>
+      <w:pPr>
+        <w:rPr>
+          <w:rFonts w:ascii="Arial" w:hAnsi="Arial" w:cs="Arial"/>
+          <w:lang w:val="es-CO"/>
+        </w:rPr>
+      </w:pPr>
+      <w:r>
+        <w:rPr>
+          <w:rFonts w:ascii="Arial" w:hAnsi="Arial" w:cs="Arial"/>
+          <w:noProof/>
+          <w:lang w:val="es-CO"/>
+        </w:rPr>
+        <w:lastRenderedPageBreak/>
+        <w:drawing>
+          <wp:inline distT="0" distB="0" distL="0" distR="0" wp14:anchorId="29CCBB8E" wp14:editId="20AB46BF">
+            <wp:extent cx="5612130" cy="4509135"/>
+            <wp:effectExtent l="0" t="0" r="7620" b="5715"/>
+            <wp:docPr id="2" name="Imagen 2"/>
+            <wp:cNvGraphicFramePr>
+              <a:graphicFrameLocks xmlns:a="http://schemas.openxmlformats.org/drawingml/2006/main" noChangeAspect="1"/>
+            </wp:cNvGraphicFramePr>
+            <a:graphic xmlns:a="http://schemas.openxmlformats.org/drawingml/2006/main">
+              <a:graphicData uri="http://schemas.openxmlformats.org/drawingml/2006/picture">
+                <pic:pic xmlns:pic="http://schemas.openxmlformats.org/drawingml/2006/picture">
+                  <pic:nvPicPr>
+                    <pic:cNvPr id="2" name="Imagen 2"/>
+                    <pic:cNvPicPr/>
+                  </pic:nvPicPr>
+                  <pic:blipFill>
+                    <a:blip r:embed="rId13">
+                      <a:extLst>
+                        <a:ext uri="{28A0092B-C50C-407E-A947-70E740481C1C}">
+                          <a14:useLocalDpi xmlns:a14="http://schemas.microsoft.com/office/drawing/2010/main" val="0"/>
+                        </a:ext>
+                      </a:extLst>
+                    </a:blip>
+                    <a:stretch>
+                      <a:fillRect/>
+                    </a:stretch>
+                  </pic:blipFill>
+                  <pic:spPr>
+                    <a:xfrm>
+                      <a:off x="0" y="0"/>
+                      <a:ext cx="5612130" cy="4509135"/>
+                    </a:xfrm>
+                    <a:prstGeom prst="rect">
+                      <a:avLst/>
+                    </a:prstGeom>
+                  </pic:spPr>
+                </pic:pic>
+              </a:graphicData>
+            </a:graphic>
+          </wp:inline>
+        </w:drawing>
+      </w:r>
+    </w:p>
+    <w:p>
+      <w:pPr>
+        <w:rPr>
+          <w:rFonts w:ascii="Arial" w:hAnsi="Arial" w:cs="Arial"/>
+          <w:lang w:val="es-CO"/>
+        </w:rPr>
+      </w:pPr>
+    </w:p>
+    <w:p>
+      <w:pPr>
+        <w:rPr>
+          <w:rFonts w:ascii="Arial" w:hAnsi="Arial" w:cs="Arial"/>
+          <w:lang w:val="es-CO"/>
+        </w:rPr>
+      </w:pPr>
+    </w:p>
+    <w:p>
+      <w:pPr>
+        <w:rPr>
+          <w:rFonts w:ascii="Arial" w:hAnsi="Arial" w:cs="Arial"/>
+          <w:b/>
+          <w:bCs/>
+          <w:lang w:val="es-CO"/>
+        </w:rPr>
+      </w:pPr>
+      <w:r>
+        <w:rPr>
+          <w:rFonts w:ascii="Arial" w:hAnsi="Arial" w:cs="Arial"/>
+          <w:b/>
+          <w:bCs/>
+          <w:lang w:val="es-CO"/>
+        </w:rPr>
+        <w:t>3PM</w:t>
+      </w:r>
+    </w:p>
+    <w:p>
+      <w:pPr>
+        <w:rPr>
+          <w:rFonts w:ascii="Arial" w:hAnsi="Arial" w:cs="Arial"/>
+          <w:lang w:val="es-CO"/>
+        </w:rPr>
+      </w:pPr>
+      <w:r>
+        <w:rPr>
+          <w:rFonts w:ascii="Arial" w:hAnsi="Arial" w:cs="Arial"/>
+          <w:lang w:val="es-CO"/>
+        </w:rPr>
+        <w:t xml:space="preserve">Se empieza por extraer solo la parte correspondiente a los datos del archivo </w:t>
+      </w:r>
+      <w:proofErr w:type="spellStart"/>
+      <w:r>
+        <w:rPr>
+          <w:rFonts w:ascii="Arial" w:hAnsi="Arial" w:cs="Arial"/>
+          <w:lang w:val="es-CO"/>
+        </w:rPr>
+        <w:t>excel</w:t>
+      </w:r>
+      <w:proofErr w:type="spellEnd"/>
+      <w:r>
+        <w:rPr>
+          <w:rFonts w:ascii="Arial" w:hAnsi="Arial" w:cs="Arial"/>
+          <w:lang w:val="es-CO"/>
+        </w:rPr>
+        <w:t>, para lo cual se ignoran las primeras 9 filas de la hoja</w:t>
+      </w:r>
+    </w:p>
+    <w:p>
+      <w:pPr>
+        <w:rPr>
+          <w:rFonts w:ascii="Arial" w:hAnsi="Arial" w:cs="Arial"/>
+          <w:b/>
+          <w:bCs/>
+          <w:lang w:val="es-CO"/>
+        </w:rPr>
+      </w:pPr>
+      <w:r>
+        <w:rPr>
+          <w:rFonts w:ascii="Arial" w:hAnsi="Arial" w:cs="Arial"/>
+          <w:b/>
+          <w:bCs/>
+          <w:noProof/>
+          <w:lang w:val="es-CO"/>
+        </w:rPr>
+        <w:drawing>
+          <wp:inline distT="0" distB="0" distL="0" distR="0" wp14:anchorId="0FDFEE8F" wp14:editId="5107BD3A">
+            <wp:extent cx="5612130" cy="1850390"/>
+            <wp:effectExtent l="0" t="0" r="7620" b="0"/>
+            <wp:docPr id="3" name="Imagen 3"/>
+            <wp:cNvGraphicFramePr>
+              <a:graphicFrameLocks xmlns:a="http://schemas.openxmlformats.org/drawingml/2006/main" noChangeAspect="1"/>
+            </wp:cNvGraphicFramePr>
+            <a:graphic xmlns:a="http://schemas.openxmlformats.org/drawingml/2006/main">
+              <a:graphicData uri="http://schemas.openxmlformats.org/drawingml/2006/picture">
+                <pic:pic xmlns:pic="http://schemas.openxmlformats.org/drawingml/2006/picture">
+                  <pic:nvPicPr>
+                    <pic:cNvPr id="3" name="Imagen 3"/>
+                    <pic:cNvPicPr/>
+                  </pic:nvPicPr>
+                  <pic:blipFill>
+                    <a:blip r:embed="rId14" cstate="print">
+                      <a:extLst>
+                        <a:ext uri="{28A0092B-C50C-407E-A947-70E740481C1C}">
+                          <a14:useLocalDpi xmlns:a14="http://schemas.microsoft.com/office/drawing/2010/main" val="0"/>
+                        </a:ext>
+                      </a:extLst>
+                    </a:blip>
+                    <a:stretch>
+                      <a:fillRect/>
+                    </a:stretch>
+                  </pic:blipFill>
+                  <pic:spPr>
+                    <a:xfrm>
+                      <a:off x="0" y="0"/>
+                      <a:ext cx="5612130" cy="1850390"/>
+                    </a:xfrm>
+                    <a:prstGeom prst="rect">
+                      <a:avLst/>
+                    </a:prstGeom>
+                  </pic:spPr>
+                </pic:pic>
+              </a:graphicData>
+            </a:graphic>
+          </wp:inline>
+        </w:drawing>
+      </w:r>
+    </w:p>
+    <w:p>
+      <w:pPr>
+        <w:rPr>
+          <w:rFonts w:ascii="Arial" w:hAnsi="Arial" w:cs="Arial"/>
+          <w:b/>
+          <w:bCs/>
+          <w:lang w:val="es-CO"/>
+        </w:rPr>
+      </w:pPr>
+    </w:p>
+    <w:p>
+      <w:pPr>
+        <w:rPr>
+          <w:rFonts w:ascii="Arial" w:hAnsi="Arial" w:cs="Arial"/>
+          <w:lang w:val="es-CO"/>
+        </w:rPr>
+      </w:pPr>
+      <w:r>
+        <w:rPr>
+          <w:rFonts w:ascii="Arial" w:hAnsi="Arial" w:cs="Arial"/>
+          <w:lang w:val="es-CO"/>
+        </w:rPr>
+        <w:lastRenderedPageBreak/>
+        <w:t>Filtrado de datos que no son de Viterbo, Caldas</w:t>
+      </w:r>
+    </w:p>
+    <w:p>
+      <w:pPr>
+        <w:rPr>
+          <w:rFonts w:ascii="Arial" w:hAnsi="Arial" w:cs="Arial"/>
+          <w:lang w:val="es-CO"/>
+        </w:rPr>
+      </w:pPr>
+      <w:r>
+        <w:rPr>
+          <w:rFonts w:ascii="Arial" w:hAnsi="Arial" w:cs="Arial"/>
+          <w:lang w:val="es-CO"/>
+        </w:rPr>
+        <w:t>Para esta hoja se decide propagar el valor del identificador del municipio, ‘17877_Viterbo’, y seleccionar solo los registros que lo contengan.</w:t>
+      </w:r>
+    </w:p>
+    <w:p>
+      <w:pPr>
+        <w:rPr>
+          <w:rFonts w:ascii="Arial" w:hAnsi="Arial" w:cs="Arial"/>
+          <w:lang w:val="es-CO"/>
+        </w:rPr>
+      </w:pPr>
+      <w:r>
+        <w:rPr>
+          <w:rFonts w:ascii="Arial" w:hAnsi="Arial" w:cs="Arial"/>
+          <w:noProof/>
+          <w:lang w:val="es-CO"/>
+        </w:rPr>
+        <w:drawing>
+          <wp:inline distT="0" distB="0" distL="0" distR="0" wp14:anchorId="745FB230" wp14:editId="65311FD7">
+            <wp:extent cx="5612130" cy="1327785"/>
+            <wp:effectExtent l="0" t="0" r="7620" b="5715"/>
+            <wp:docPr id="4" name="Imagen 4"/>
+            <wp:cNvGraphicFramePr>
+              <a:graphicFrameLocks xmlns:a="http://schemas.openxmlformats.org/drawingml/2006/main" noChangeAspect="1"/>
+            </wp:cNvGraphicFramePr>
+            <a:graphic xmlns:a="http://schemas.openxmlformats.org/drawingml/2006/main">
+              <a:graphicData uri="http://schemas.openxmlformats.org/drawingml/2006/picture">
+                <pic:pic xmlns:pic="http://schemas.openxmlformats.org/drawingml/2006/picture">
+                  <pic:nvPicPr>
+                    <pic:cNvPr id="4" name="Imagen 4"/>
+                    <pic:cNvPicPr/>
+                  </pic:nvPicPr>
+                  <pic:blipFill>
+                    <a:blip r:embed="rId15" cstate="print">
+                      <a:extLst>
+                        <a:ext uri="{28A0092B-C50C-407E-A947-70E740481C1C}">
+                          <a14:useLocalDpi xmlns:a14="http://schemas.microsoft.com/office/drawing/2010/main" val="0"/>
+                        </a:ext>
+                      </a:extLst>
+                    </a:blip>
+                    <a:stretch>
+                      <a:fillRect/>
+                    </a:stretch>
+                  </pic:blipFill>
+                  <pic:spPr>
+                    <a:xfrm>
+                      <a:off x="0" y="0"/>
+                      <a:ext cx="5612130" cy="1327785"/>
+                    </a:xfrm>
+                    <a:prstGeom prst="rect">
+                      <a:avLst/>
+                    </a:prstGeom>
+                  </pic:spPr>
+                </pic:pic>
+              </a:graphicData>
+            </a:graphic>
+          </wp:inline>
+        </w:drawing>
+      </w:r>
+    </w:p>
+    <w:p>
+      <w:pPr>
+        <w:rPr>
+          <w:rFonts w:ascii="Arial" w:hAnsi="Arial" w:cs="Arial"/>
+          <w:lang w:val="es-CO"/>
+        </w:rPr>
+      </w:pPr>
+    </w:p>
+    <w:p>
+      <w:pPr>
+        <w:rPr>
+          <w:rFonts w:ascii="Arial" w:hAnsi="Arial" w:cs="Arial"/>
+          <w:lang w:val="es-CO"/>
+        </w:rPr>
+      </w:pPr>
+      <w:r>
+        <w:rPr>
+          <w:rFonts w:ascii="Arial" w:hAnsi="Arial" w:cs="Arial"/>
+          <w:lang w:val="es-CO"/>
+        </w:rPr>
+        <w:t>Se elimina la primera columna, y que no tiene datos relevantes para el municipio.</w:t>
+      </w:r>
+    </w:p>
+    <w:p>
+      <w:pPr>
+        <w:rPr>
+          <w:rFonts w:ascii="Arial" w:hAnsi="Arial" w:cs="Arial"/>
+          <w:lang w:val="es-CO"/>
+        </w:rPr>
+      </w:pPr>
+      <w:r>
+        <w:rPr>
+          <w:rFonts w:ascii="Arial" w:hAnsi="Arial" w:cs="Arial"/>
+          <w:noProof/>
+          <w:lang w:val="es-CO"/>
+        </w:rPr>
+        <w:drawing>
+          <wp:inline distT="0" distB="0" distL="0" distR="0" wp14:anchorId="3A0F4428" wp14:editId="2D7A07FB">
+            <wp:extent cx="5612130" cy="1235710"/>
+            <wp:effectExtent l="0" t="0" r="7620" b="2540"/>
+            <wp:docPr id="5" name="Imagen 5"/>
+            <wp:cNvGraphicFramePr>
+              <a:graphicFrameLocks xmlns:a="http://schemas.openxmlformats.org/drawingml/2006/main" noChangeAspect="1"/>
+            </wp:cNvGraphicFramePr>
+            <a:graphic xmlns:a="http://schemas.openxmlformats.org/drawingml/2006/main">
+              <a:graphicData uri="http://schemas.openxmlformats.org/drawingml/2006/picture">
+                <pic:pic xmlns:pic="http://schemas.openxmlformats.org/drawingml/2006/picture">
+                  <pic:nvPicPr>
+                    <pic:cNvPr id="5" name="Imagen 5"/>
+                    <pic:cNvPicPr/>
+                  </pic:nvPicPr>
+                  <pic:blipFill>
+                    <a:blip r:embed="rId16" cstate="print">
+                      <a:extLst>
+                        <a:ext uri="{28A0092B-C50C-407E-A947-70E740481C1C}">
+                          <a14:useLocalDpi xmlns:a14="http://schemas.microsoft.com/office/drawing/2010/main" val="0"/>
+                        </a:ext>
+                      </a:extLst>
+                    </a:blip>
+                    <a:stretch>
+                      <a:fillRect/>
+                    </a:stretch>
+                  </pic:blipFill>
+                  <pic:spPr>
+                    <a:xfrm>
+                      <a:off x="0" y="0"/>
+                      <a:ext cx="5612130" cy="1235710"/>
+                    </a:xfrm>
+                    <a:prstGeom prst="rect">
+                      <a:avLst/>
+                    </a:prstGeom>
+                  </pic:spPr>
+                </pic:pic>
+              </a:graphicData>
+            </a:graphic>
+          </wp:inline>
+        </w:drawing>
+      </w:r>
+    </w:p>
+    <w:p>
+      <w:pPr>
+        <w:rPr>
+          <w:rFonts w:ascii="Arial" w:hAnsi="Arial" w:cs="Arial"/>
+          <w:lang w:val="es-CO"/>
+        </w:rPr>
+      </w:pPr>
+    </w:p>
+    <w:p>
+      <w:pPr>
+        <w:rPr>
+          <w:rFonts w:ascii="Arial" w:hAnsi="Arial" w:cs="Arial"/>
+          <w:lang w:val="es-CO"/>
+        </w:rPr>
+      </w:pPr>
+      <w:r>
+        <w:rPr>
+          <w:rFonts w:ascii="Arial" w:hAnsi="Arial" w:cs="Arial"/>
+          <w:lang w:val="es-CO"/>
+        </w:rPr>
+        <w:t xml:space="preserve">Actualización de </w:t>
+      </w:r>
+      <w:proofErr w:type="spellStart"/>
+      <w:r>
+        <w:rPr>
+          <w:rFonts w:ascii="Arial" w:hAnsi="Arial" w:cs="Arial"/>
+          <w:lang w:val="es-CO"/>
+        </w:rPr>
+        <w:t>headers</w:t>
+      </w:r>
+      <w:proofErr w:type="spellEnd"/>
+    </w:p>
+    <w:p>
+      <w:pPr>
+        <w:rPr>
+          <w:rFonts w:ascii="Arial" w:hAnsi="Arial" w:cs="Arial"/>
+          <w:lang w:val="es-CO"/>
+        </w:rPr>
+      </w:pPr>
+      <w:r>
+        <w:rPr>
+          <w:rFonts w:ascii="Arial" w:hAnsi="Arial" w:cs="Arial"/>
+          <w:lang w:val="es-CO"/>
+        </w:rPr>
+        <w:t xml:space="preserve">Al extraer los datos desde el archivo .xlsx, se verifica el </w:t>
+      </w:r>
+      <w:proofErr w:type="spellStart"/>
+      <w:r>
+        <w:rPr>
+          <w:rFonts w:ascii="Arial" w:hAnsi="Arial" w:cs="Arial"/>
+          <w:lang w:val="es-CO"/>
+        </w:rPr>
+        <w:t>dataframe</w:t>
+      </w:r>
+      <w:proofErr w:type="spellEnd"/>
+      <w:r>
+        <w:rPr>
+          <w:rFonts w:ascii="Arial" w:hAnsi="Arial" w:cs="Arial"/>
+          <w:lang w:val="es-CO"/>
+        </w:rPr>
+        <w:t xml:space="preserve"> generado por Pandas, empezando por los nombres de las columnas y se observan las siguientes incidencias:</w:t>
+      </w:r>
+    </w:p>
+    <w:p>
+      <w:pPr>
+        <w:pStyle w:val="Prrafodelista"/>
+        <w:numPr>
+          <w:ilvl w:val="0"/>
+          <w:numId w:val="1"/>
+        </w:numPr>
+        <w:rPr>
+          <w:rFonts w:ascii="Arial" w:hAnsi="Arial" w:cs="Arial"/>
+          <w:lang w:val="es-CO"/>
+        </w:rPr>
+      </w:pPr>
+      <w:proofErr w:type="spellStart"/>
+      <w:r>
+        <w:rPr>
+          <w:rFonts w:ascii="Arial" w:hAnsi="Arial" w:cs="Arial"/>
+          <w:lang w:val="es-CO"/>
+        </w:rPr>
+        <w:t>Headers</w:t>
+      </w:r>
+      <w:proofErr w:type="spellEnd"/>
+      <w:r>
+        <w:rPr>
+          <w:rFonts w:ascii="Arial" w:hAnsi="Arial" w:cs="Arial"/>
+          <w:lang w:val="es-CO"/>
+        </w:rPr>
+        <w:t xml:space="preserve"> sin nombres descriptivos: </w:t>
+      </w:r>
+      <w:proofErr w:type="spellStart"/>
+      <w:r>
+        <w:rPr>
+          <w:rFonts w:ascii="Arial" w:hAnsi="Arial" w:cs="Arial"/>
+          <w:lang w:val="es-CO"/>
+        </w:rPr>
+        <w:t>headers</w:t>
+      </w:r>
+      <w:proofErr w:type="spellEnd"/>
+      <w:r>
+        <w:rPr>
+          <w:rFonts w:ascii="Arial" w:hAnsi="Arial" w:cs="Arial"/>
+          <w:lang w:val="es-CO"/>
+        </w:rPr>
+        <w:t xml:space="preserve"> con nombres por defecto de Pandas tipo ‘</w:t>
+      </w:r>
+      <w:proofErr w:type="spellStart"/>
+      <w:r>
+        <w:rPr>
+          <w:rFonts w:ascii="Arial" w:hAnsi="Arial" w:cs="Arial"/>
+          <w:lang w:val="es-CO"/>
+        </w:rPr>
+        <w:t>Unnamed</w:t>
+      </w:r>
+      <w:proofErr w:type="spellEnd"/>
+      <w:r>
+        <w:rPr>
+          <w:rFonts w:ascii="Arial" w:hAnsi="Arial" w:cs="Arial"/>
+          <w:lang w:val="es-CO"/>
+        </w:rPr>
+        <w:t>: X’.</w:t>
+      </w:r>
+    </w:p>
+    <w:p>
+      <w:pPr>
+        <w:pStyle w:val="Prrafodelista"/>
+        <w:numPr>
+          <w:ilvl w:val="0"/>
+          <w:numId w:val="1"/>
+        </w:numPr>
+        <w:rPr>
+          <w:rFonts w:ascii="Arial" w:hAnsi="Arial" w:cs="Arial"/>
+          <w:lang w:val="es-CO"/>
+        </w:rPr>
+      </w:pPr>
+      <w:proofErr w:type="spellStart"/>
+      <w:r>
+        <w:rPr>
+          <w:rFonts w:ascii="Arial" w:hAnsi="Arial" w:cs="Arial"/>
+          <w:lang w:val="es-CO"/>
+        </w:rPr>
+        <w:t>Headers</w:t>
+      </w:r>
+      <w:proofErr w:type="spellEnd"/>
+      <w:r>
+        <w:rPr>
+          <w:rFonts w:ascii="Arial" w:hAnsi="Arial" w:cs="Arial"/>
+          <w:lang w:val="es-CO"/>
+        </w:rPr>
+        <w:t xml:space="preserve"> en jerarquías inferiores debido a la agrupación de datos: ‘Hombre’ y ‘Mujer’ se encuentran en la primera fila de datos debido al diseño del .xlsx donde se busca describir la agrupación por Sexo de los datos.</w:t>
+      </w:r>
+    </w:p>
+    <w:p>
+      <w:pPr>
+        <w:rPr>
+          <w:rFonts w:ascii="Arial" w:hAnsi="Arial" w:cs="Arial"/>
+          <w:lang w:val="es-CO"/>
+        </w:rPr>
+      </w:pPr>
+      <w:r>
+        <w:rPr>
+          <w:rFonts w:ascii="Arial" w:hAnsi="Arial" w:cs="Arial"/>
+          <w:lang w:val="es-CO"/>
+        </w:rPr>
+        <w:t xml:space="preserve">Debido a la agrupación de datos en las columnas, se divide el </w:t>
+      </w:r>
+      <w:proofErr w:type="spellStart"/>
+      <w:r>
+        <w:rPr>
+          <w:rFonts w:ascii="Arial" w:hAnsi="Arial" w:cs="Arial"/>
+          <w:lang w:val="es-CO"/>
+        </w:rPr>
+        <w:t>dataframe</w:t>
+      </w:r>
+      <w:proofErr w:type="spellEnd"/>
+      <w:r>
+        <w:rPr>
+          <w:rFonts w:ascii="Arial" w:hAnsi="Arial" w:cs="Arial"/>
+          <w:lang w:val="es-CO"/>
+        </w:rPr>
+        <w:t xml:space="preserve"> en 3 partes, correspondientes a las áreas, ignorando el total para remover resúmenes de datos en el </w:t>
+      </w:r>
+      <w:proofErr w:type="spellStart"/>
+      <w:r>
+        <w:rPr>
+          <w:rFonts w:ascii="Arial" w:hAnsi="Arial" w:cs="Arial"/>
+          <w:lang w:val="es-CO"/>
+        </w:rPr>
+        <w:t>dataset</w:t>
+      </w:r>
+      <w:proofErr w:type="spellEnd"/>
+      <w:r>
+        <w:rPr>
+          <w:rFonts w:ascii="Arial" w:hAnsi="Arial" w:cs="Arial"/>
+          <w:lang w:val="es-CO"/>
+        </w:rPr>
+        <w:t xml:space="preserve"> final. Luego de dividirlos, se reemplazan los nombres de las columnas de la siguiente manera:</w:t>
+      </w:r>
+    </w:p>
+    <w:p>
+      <w:pPr>
+        <w:pStyle w:val="Prrafodelista"/>
+        <w:numPr>
+          <w:ilvl w:val="0"/>
+          <w:numId w:val="4"/>
+        </w:numPr>
+        <w:rPr>
+          <w:rFonts w:ascii="Arial" w:hAnsi="Arial" w:cs="Arial"/>
+          <w:lang w:val="es-CO"/>
+        </w:rPr>
+      </w:pPr>
+      <w:proofErr w:type="spellStart"/>
+      <w:r>
+        <w:rPr>
+          <w:rFonts w:ascii="Arial" w:hAnsi="Arial" w:cs="Arial"/>
+          <w:lang w:val="es-CO"/>
+        </w:rPr>
+        <w:t>Unnamed</w:t>
+      </w:r>
+      <w:proofErr w:type="spellEnd"/>
+      <w:r>
+        <w:rPr>
+          <w:rFonts w:ascii="Arial" w:hAnsi="Arial" w:cs="Arial"/>
+          <w:lang w:val="es-CO"/>
+        </w:rPr>
+        <w:t>: 3: Edad</w:t>
+      </w:r>
+    </w:p>
+    <w:p>
+      <w:pPr>
+        <w:pStyle w:val="Prrafodelista"/>
+        <w:numPr>
+          <w:ilvl w:val="0"/>
+          <w:numId w:val="4"/>
+        </w:numPr>
+        <w:rPr>
+          <w:rFonts w:ascii="Arial" w:hAnsi="Arial" w:cs="Arial"/>
+          <w:lang w:val="es-CO"/>
+        </w:rPr>
+      </w:pPr>
+      <w:proofErr w:type="spellStart"/>
+      <w:r>
+        <w:rPr>
+          <w:rFonts w:ascii="Arial" w:hAnsi="Arial" w:cs="Arial"/>
+          <w:lang w:val="es-CO"/>
+        </w:rPr>
+        <w:t>Unnamed</w:t>
+      </w:r>
+      <w:proofErr w:type="spellEnd"/>
+      <w:r>
+        <w:rPr>
+          <w:rFonts w:ascii="Arial" w:hAnsi="Arial" w:cs="Arial"/>
+          <w:lang w:val="es-CO"/>
+        </w:rPr>
+        <w:t>: 8: Hombre</w:t>
+      </w:r>
+    </w:p>
+    <w:p>
+      <w:pPr>
+        <w:pStyle w:val="Prrafodelista"/>
+        <w:numPr>
+          <w:ilvl w:val="0"/>
+          <w:numId w:val="4"/>
+        </w:numPr>
+        <w:rPr>
+          <w:rFonts w:ascii="Arial" w:hAnsi="Arial" w:cs="Arial"/>
+          <w:lang w:val="es-CO"/>
+        </w:rPr>
+      </w:pPr>
+      <w:proofErr w:type="spellStart"/>
+      <w:r>
+        <w:rPr>
+          <w:rFonts w:ascii="Arial" w:hAnsi="Arial" w:cs="Arial"/>
+          <w:lang w:val="es-CO"/>
+        </w:rPr>
+        <w:t>Unnamed</w:t>
+      </w:r>
+      <w:proofErr w:type="spellEnd"/>
+      <w:r>
+        <w:rPr>
+          <w:rFonts w:ascii="Arial" w:hAnsi="Arial" w:cs="Arial"/>
+          <w:lang w:val="es-CO"/>
+        </w:rPr>
+        <w:t>: 9: Mujer</w:t>
+      </w:r>
+    </w:p>
+    <w:p>
+      <w:pPr>
+        <w:pStyle w:val="Prrafodelista"/>
+        <w:numPr>
+          <w:ilvl w:val="0"/>
+          <w:numId w:val="4"/>
+        </w:numPr>
+        <w:rPr>
+          <w:rFonts w:ascii="Arial" w:hAnsi="Arial" w:cs="Arial"/>
+          <w:lang w:val="es-CO"/>
+        </w:rPr>
+      </w:pPr>
+      <w:proofErr w:type="spellStart"/>
+      <w:r>
+        <w:rPr>
+          <w:rFonts w:ascii="Arial" w:hAnsi="Arial" w:cs="Arial"/>
+          <w:lang w:val="es-CO"/>
+        </w:rPr>
+        <w:lastRenderedPageBreak/>
+        <w:t>Unnamed</w:t>
+      </w:r>
+      <w:proofErr w:type="spellEnd"/>
+      <w:r>
+        <w:rPr>
+          <w:rFonts w:ascii="Arial" w:hAnsi="Arial" w:cs="Arial"/>
+          <w:lang w:val="es-CO"/>
+        </w:rPr>
+        <w:t>: 11: Hombre</w:t>
+      </w:r>
+    </w:p>
+    <w:p>
+      <w:pPr>
+        <w:pStyle w:val="Prrafodelista"/>
+        <w:numPr>
+          <w:ilvl w:val="0"/>
+          <w:numId w:val="4"/>
+        </w:numPr>
+        <w:rPr>
+          <w:rFonts w:ascii="Arial" w:hAnsi="Arial" w:cs="Arial"/>
+          <w:lang w:val="es-CO"/>
+        </w:rPr>
+      </w:pPr>
+      <w:proofErr w:type="spellStart"/>
+      <w:r>
+        <w:rPr>
+          <w:rFonts w:ascii="Arial" w:hAnsi="Arial" w:cs="Arial"/>
+          <w:lang w:val="es-CO"/>
+        </w:rPr>
+        <w:t>Unnamed</w:t>
+      </w:r>
+      <w:proofErr w:type="spellEnd"/>
+      <w:r>
+        <w:rPr>
+          <w:rFonts w:ascii="Arial" w:hAnsi="Arial" w:cs="Arial"/>
+          <w:lang w:val="es-CO"/>
+        </w:rPr>
+        <w:t>: 12: Mujer</w:t>
+      </w:r>
+    </w:p>
+    <w:p>
+      <w:pPr>
+        <w:pStyle w:val="Prrafodelista"/>
+        <w:numPr>
+          <w:ilvl w:val="0"/>
+          <w:numId w:val="4"/>
+        </w:numPr>
+        <w:rPr>
+          <w:rFonts w:ascii="Arial" w:hAnsi="Arial" w:cs="Arial"/>
+          <w:lang w:val="es-CO"/>
+        </w:rPr>
+      </w:pPr>
+      <w:proofErr w:type="spellStart"/>
+      <w:r>
+        <w:rPr>
+          <w:rFonts w:ascii="Arial" w:hAnsi="Arial" w:cs="Arial"/>
+          <w:lang w:val="es-CO"/>
+        </w:rPr>
+        <w:t>Unnamed</w:t>
+      </w:r>
+      <w:proofErr w:type="spellEnd"/>
+      <w:r>
+        <w:rPr>
+          <w:rFonts w:ascii="Arial" w:hAnsi="Arial" w:cs="Arial"/>
+          <w:lang w:val="es-CO"/>
+        </w:rPr>
+        <w:t>: 14: Hombre</w:t>
+      </w:r>
+    </w:p>
+    <w:p>
+      <w:pPr>
+        <w:pStyle w:val="Prrafodelista"/>
+        <w:numPr>
+          <w:ilvl w:val="0"/>
+          <w:numId w:val="4"/>
+        </w:numPr>
+        <w:rPr>
+          <w:rFonts w:ascii="Arial" w:hAnsi="Arial" w:cs="Arial"/>
+          <w:lang w:val="es-CO"/>
+        </w:rPr>
+      </w:pPr>
+      <w:proofErr w:type="spellStart"/>
+      <w:r>
+        <w:rPr>
+          <w:rFonts w:ascii="Arial" w:hAnsi="Arial" w:cs="Arial"/>
+          <w:lang w:val="es-CO"/>
+        </w:rPr>
+        <w:t>Unnamed</w:t>
+      </w:r>
+      <w:proofErr w:type="spellEnd"/>
+      <w:r>
+        <w:rPr>
+          <w:rFonts w:ascii="Arial" w:hAnsi="Arial" w:cs="Arial"/>
+          <w:lang w:val="es-CO"/>
+        </w:rPr>
+        <w:t>: 15: Mujer</w:t>
+      </w:r>
+    </w:p>
+    <w:p>
+      <w:pPr>
+        <w:rPr>
+          <w:rFonts w:ascii="Arial" w:hAnsi="Arial" w:cs="Arial"/>
+          <w:lang w:val="es-CO"/>
+        </w:rPr>
+      </w:pPr>
+      <w:r>
+        <w:rPr>
+          <w:rFonts w:ascii="Arial" w:hAnsi="Arial" w:cs="Arial"/>
+          <w:lang w:val="es-CO"/>
+        </w:rPr>
+        <w:t>Para identificar el área, se crea una nueva columna ‘</w:t>
+      </w:r>
+      <w:proofErr w:type="spellStart"/>
+      <w:r>
+        <w:rPr>
+          <w:rFonts w:ascii="Arial" w:hAnsi="Arial" w:cs="Arial"/>
+          <w:lang w:val="es-CO"/>
+        </w:rPr>
+        <w:t>Area</w:t>
+      </w:r>
+      <w:proofErr w:type="spellEnd"/>
+      <w:r>
+        <w:rPr>
+          <w:rFonts w:ascii="Arial" w:hAnsi="Arial" w:cs="Arial"/>
+          <w:lang w:val="es-CO"/>
+        </w:rPr>
+        <w:t xml:space="preserve">’ indicando el área de análisis (cabecera, centro poblado, rural disperso), en cada subconjunto, y se unen los subconjuntos como un solo </w:t>
+      </w:r>
+      <w:proofErr w:type="spellStart"/>
+      <w:r>
+        <w:rPr>
+          <w:rFonts w:ascii="Arial" w:hAnsi="Arial" w:cs="Arial"/>
+          <w:lang w:val="es-CO"/>
+        </w:rPr>
+        <w:t>dataframe</w:t>
+      </w:r>
+      <w:proofErr w:type="spellEnd"/>
+      <w:r>
+        <w:rPr>
+          <w:rFonts w:ascii="Arial" w:hAnsi="Arial" w:cs="Arial"/>
+          <w:lang w:val="es-CO"/>
+        </w:rPr>
+        <w:t>.</w:t>
+      </w:r>
+    </w:p>
+    <w:p>
+      <w:pPr>
+        <w:jc w:val="center"/>
+        <w:rPr>
+          <w:rFonts w:ascii="Arial" w:hAnsi="Arial" w:cs="Arial"/>
+          <w:lang w:val="es-CO"/>
+        </w:rPr>
+      </w:pPr>
+      <w:r>
+        <w:rPr>
+          <w:rFonts w:ascii="Arial" w:hAnsi="Arial" w:cs="Arial"/>
+          <w:noProof/>
+          <w:lang w:val="es-CO"/>
+        </w:rPr>
+        <w:drawing>
+          <wp:inline distT="0" distB="0" distL="0" distR="0" wp14:anchorId="6054ADB4" wp14:editId="4E7048B9">
+            <wp:extent cx="3658111" cy="3153215"/>
+            <wp:effectExtent l="0" t="0" r="0" b="9525"/>
+            <wp:docPr id="6" name="Imagen 6"/>
+            <wp:cNvGraphicFramePr>
+              <a:graphicFrameLocks xmlns:a="http://schemas.openxmlformats.org/drawingml/2006/main" noChangeAspect="1"/>
+            </wp:cNvGraphicFramePr>
+            <a:graphic xmlns:a="http://schemas.openxmlformats.org/drawingml/2006/main">
+              <a:graphicData uri="http://schemas.openxmlformats.org/drawingml/2006/picture">
+                <pic:pic xmlns:pic="http://schemas.openxmlformats.org/drawingml/2006/picture">
+                  <pic:nvPicPr>
+                    <pic:cNvPr id="6" name="Imagen 6"/>
+                    <pic:cNvPicPr/>
+                  </pic:nvPicPr>
+                  <pic:blipFill>
+                    <a:blip r:embed="rId17">
+                      <a:extLst>
+                        <a:ext uri="{28A0092B-C50C-407E-A947-70E740481C1C}">
+                          <a14:useLocalDpi xmlns:a14="http://schemas.microsoft.com/office/drawing/2010/main" val="0"/>
+                        </a:ext>
+                      </a:extLst>
+                    </a:blip>
+                    <a:stretch>
+                      <a:fillRect/>
+                    </a:stretch>
+                  </pic:blipFill>
+                  <pic:spPr>
+                    <a:xfrm>
+                      <a:off x="0" y="0"/>
+                      <a:ext cx="3658111" cy="3153215"/>
+                    </a:xfrm>
+                    <a:prstGeom prst="rect">
+                      <a:avLst/>
+                    </a:prstGeom>
+                  </pic:spPr>
+                </pic:pic>
+              </a:graphicData>
+            </a:graphic>
+          </wp:inline>
+        </w:drawing>
+      </w:r>
+    </w:p>
+    <w:p>
+      <w:pPr>
+        <w:jc w:val="center"/>
+        <w:rPr>
+          <w:rFonts w:ascii="Arial" w:hAnsi="Arial" w:cs="Arial"/>
+          <w:lang w:val="es-CO"/>
+        </w:rPr>
+      </w:pPr>
+    </w:p>
+    <w:p>
+      <w:pPr>
+        <w:rPr>
+          <w:rFonts w:ascii="Arial" w:hAnsi="Arial" w:cs="Arial"/>
+          <w:lang w:val="es-CO"/>
+        </w:rPr>
+      </w:pPr>
+      <w:r>
+        <w:rPr>
+          <w:rFonts w:ascii="Arial" w:hAnsi="Arial" w:cs="Arial"/>
+          <w:lang w:val="es-CO"/>
+        </w:rPr>
+        <w:t>Finalmente, se eliminan las filas que contienen resúmenes de datos.</w:t>
+      </w:r>
+    </w:p>
+    <w:p>
+      <w:pPr>
+        <w:jc w:val="center"/>
+        <w:rPr>
+          <w:rFonts w:ascii="Arial" w:hAnsi="Arial" w:cs="Arial"/>
+          <w:lang w:val="es-CO"/>
+        </w:rPr>
+      </w:pPr>
+      <w:r>
+        <w:rPr>
+          <w:rFonts w:ascii="Arial" w:hAnsi="Arial" w:cs="Arial"/>
+          <w:noProof/>
+          <w:lang w:val="es-CO"/>
+        </w:rPr>
+        <w:lastRenderedPageBreak/>
+        <w:drawing>
+          <wp:inline distT="0" distB="0" distL="0" distR="0" wp14:anchorId="4352F8AD" wp14:editId="5D797608">
+            <wp:extent cx="2972215" cy="3105583"/>
+            <wp:effectExtent l="0" t="0" r="0" b="0"/>
+            <wp:docPr id="7" name="Imagen 7"/>
+            <wp:cNvGraphicFramePr>
+              <a:graphicFrameLocks xmlns:a="http://schemas.openxmlformats.org/drawingml/2006/main" noChangeAspect="1"/>
+            </wp:cNvGraphicFramePr>
+            <a:graphic xmlns:a="http://schemas.openxmlformats.org/drawingml/2006/main">
+              <a:graphicData uri="http://schemas.openxmlformats.org/drawingml/2006/picture">
+                <pic:pic xmlns:pic="http://schemas.openxmlformats.org/drawingml/2006/picture">
+                  <pic:nvPicPr>
+                    <pic:cNvPr id="7" name="Imagen 7"/>
+                    <pic:cNvPicPr/>
+                  </pic:nvPicPr>
+                  <pic:blipFill>
+                    <a:blip r:embed="rId18">
+                      <a:extLst>
+                        <a:ext uri="{28A0092B-C50C-407E-A947-70E740481C1C}">
+                          <a14:useLocalDpi xmlns:a14="http://schemas.microsoft.com/office/drawing/2010/main" val="0"/>
+                        </a:ext>
+                      </a:extLst>
+                    </a:blip>
+                    <a:stretch>
+                      <a:fillRect/>
+                    </a:stretch>
+                  </pic:blipFill>
+                  <pic:spPr>
+                    <a:xfrm>
+                      <a:off x="0" y="0"/>
+                      <a:ext cx="2972215" cy="3105583"/>
+                    </a:xfrm>
+                    <a:prstGeom prst="rect">
+                      <a:avLst/>
+                    </a:prstGeom>
+                  </pic:spPr>
+                </pic:pic>
+              </a:graphicData>
+            </a:graphic>
+          </wp:inline>
+        </w:drawing>
+      </w:r>
+    </w:p>
+    <w:p>
+      <w:pPr>
+        <w:rPr>
+          <w:rFonts w:ascii="Arial" w:hAnsi="Arial" w:cs="Arial"/>
+          <w:lang w:val="es-CO"/>
+        </w:rPr>
+      </w:pPr>
     </w:p>
     <w:sectPr>
       <w:pgSz w:w="12240" w:h="15840"/>
@@ -1177,7 +2591,7 @@
 </file>
 
 <file path=word/numbering.xml><?xml version="1.0" encoding="utf-8"?>
-<w:numbering xmlns:wpc="http://schemas.microsoft.com/office/word/2010/wordprocessingCanvas" xmlns:cx="http://schemas.microsoft.com/office/drawing/2014/chartex" xmlns:cx1="http://schemas.microsoft.com/office/drawing/2015/9/8/chartex" xmlns:cx2="http://schemas.microsoft.com/office/drawing/2015/10/21/chartex" xmlns:cx3="http://schemas.microsoft.com/office/drawing/2016/5/9/chartex" xmlns:cx4="http://schemas.microsoft.com/office/drawing/2016/5/10/chartex" xmlns:cx5="http://schemas.microsoft.com/office/drawing/2016/5/11/chartex" xmlns:cx6="http://schemas.microsoft.com/office/drawing/2016/5/12/chartex" xmlns:cx7="http://schemas.microsoft.com/office/drawing/2016/5/13/chartex" xmlns:cx8="http://schemas.microsoft.com/office/drawing/2016/5/14/chartex" xmlns:mc="http://schemas.openxmlformats.org/markup-compatibility/2006" xmlns:aink="http://schemas.microsoft.com/office/drawing/2016/ink" xmlns:am3d="http://schemas.microsoft.com/office/drawing/2017/model3d" xmlns:o="urn:schemas-microsoft-com:office:office" xmlns:oel="http://schemas.microsoft.com/office/2019/extlst" xmlns:r="http://schemas.openxmlformats.org/officeDocument/2006/relationships" xmlns:m="http://schemas.openxmlformats.org/officeDocument/2006/math" xmlns:v="urn:schemas-microsoft-com:vml" xmlns:wp14="http://schemas.microsoft.com/office/word/2010/wordprocessingDrawing" xmlns:wp="http://schemas.openxmlformats.org/drawingml/2006/wordprocessingDrawing" xmlns:w10="urn:schemas-microsoft-com:office:word" xmlns:w="http://schemas.openxmlformats.org/wordprocessingml/2006/main" xmlns:w14="http://schemas.microsoft.com/office/word/2010/wordml" xmlns:w15="http://schemas.microsoft.com/office/word/2012/wordml" xmlns:w16cex="http://schemas.microsoft.com/office/word/2018/wordml/cex" xmlns:w16cid="http://schemas.microsoft.com/office/word/2016/wordml/cid" xmlns:w16="http://schemas.microsoft.com/office/word/2018/wordml" xmlns:w16du="http://schemas.microsoft.com/office/word/2023/wordml/word16du" xmlns:w16sdtdh="http://schemas.microsoft.com/office/word/2020/wordml/sdtdatahash" xmlns:w16sdtfl="http://schemas.microsoft.com/office/word/2024/wordml/sdtformatlock" xmlns:w16se="http://schemas.microsoft.com/office/word/2015/wordml/symex" xmlns:wpg="http://schemas.microsoft.com/office/word/2010/wordprocessingGroup" xmlns:wpi="http://schemas.microsoft.com/office/word/2010/wordprocessingInk" xmlns:wne="http://schemas.microsoft.com/office/word/2006/wordml" xmlns:wps="http://schemas.microsoft.com/office/word/2010/wordprocessingShape" mc:Ignorable="w14 w15 w16se w16cid w16 w16cex w16sdtdh w16sdtfl w16du wp14">
+<w:numbering xmlns:wpc="http://schemas.microsoft.com/office/word/2010/wordprocessingCanvas" xmlns:cx="http://schemas.microsoft.com/office/drawing/2014/chartex" xmlns:cx1="http://schemas.microsoft.com/office/drawing/2015/9/8/chartex" xmlns:cx2="http://schemas.microsoft.com/office/drawing/2015/10/21/chartex" xmlns:cx3="http://schemas.microsoft.com/office/drawing/2016/5/9/chartex" xmlns:cx4="http://schemas.microsoft.com/office/drawing/2016/5/10/chartex" xmlns:cx5="http://schemas.microsoft.com/office/drawing/2016/5/11/chartex" xmlns:cx6="http://schemas.microsoft.com/office/drawing/2016/5/12/chartex" xmlns:cx7="http://schemas.microsoft.com/office/drawing/2016/5/13/chartex" xmlns:cx8="http://schemas.microsoft.com/office/drawing/2016/5/14/chartex" xmlns:mc="http://schemas.openxmlformats.org/markup-compatibility/2006" xmlns:aink="http://schemas.microsoft.com/office/drawing/2016/ink" xmlns:am3d="http://schemas.microsoft.com/office/drawing/2017/model3d" xmlns:o="urn:schemas-microsoft-com:office:office" xmlns:r="http://schemas.openxmlformats.org/officeDocument/2006/relationships" xmlns:m="http://schemas.openxmlformats.org/officeDocument/2006/math" xmlns:v="urn:schemas-microsoft-com:vml" xmlns:wp14="http://schemas.microsoft.com/office/word/2010/wordprocessingDrawing" xmlns:wp="http://schemas.openxmlformats.org/drawingml/2006/wordprocessingDrawing" xmlns:w10="urn:schemas-microsoft-com:office:word" xmlns:w="http://schemas.openxmlformats.org/wordprocessingml/2006/main" xmlns:w14="http://schemas.microsoft.com/office/word/2010/wordml" xmlns:w15="http://schemas.microsoft.com/office/word/2012/wordml" xmlns:w16cex="http://schemas.microsoft.com/office/word/2018/wordml/cex" xmlns:w16cid="http://schemas.microsoft.com/office/word/2016/wordml/cid" xmlns:w16="http://schemas.microsoft.com/office/word/2018/wordml" xmlns:w16sdtdh="http://schemas.microsoft.com/office/word/2020/wordml/sdtdatahash" xmlns:w16se="http://schemas.microsoft.com/office/word/2015/wordml/symex" xmlns:wpg="http://schemas.microsoft.com/office/word/2010/wordprocessingGroup" xmlns:wpi="http://schemas.microsoft.com/office/word/2010/wordprocessingInk" xmlns:wne="http://schemas.microsoft.com/office/word/2006/wordml" xmlns:wps="http://schemas.microsoft.com/office/word/2010/wordprocessingShape" mc:Ignorable="w14 w15 w16se w16cid w16 w16cex w16sdtdh wp14">
   <w:abstractNum w:abstractNumId="0" w15:restartNumberingAfterBreak="0">
     <w:nsid w:val="1BC752DC"/>
     <w:multiLevelType w:val="hybridMultilevel"/>
@@ -1517,20 +2931,136 @@
       </w:rPr>
     </w:lvl>
   </w:abstractNum>
-  <w:num w:numId="1" w16cid:durableId="1020425147">
+  <w:abstractNum w:abstractNumId="3" w15:restartNumberingAfterBreak="0">
+    <w:nsid w:val="496738FF"/>
+    <w:multiLevelType w:val="hybridMultilevel"/>
+    <w:tmpl w:val="BCB87994"/>
+    <w:lvl w:ilvl="0" w:tplc="240A0001">
+      <w:start w:val="1"/>
+      <w:numFmt w:val="bullet"/>
+      <w:lvlText w:val=""/>
+      <w:lvlJc w:val="left"/>
+      <w:pPr>
+        <w:ind w:left="720" w:hanging="360"/>
+      </w:pPr>
+      <w:rPr>
+        <w:rFonts w:ascii="Symbol" w:hAnsi="Symbol" w:hint="default"/>
+      </w:rPr>
+    </w:lvl>
+    <w:lvl w:ilvl="1" w:tplc="240A0003" w:tentative="1">
+      <w:start w:val="1"/>
+      <w:numFmt w:val="bullet"/>
+      <w:lvlText w:val="o"/>
+      <w:lvlJc w:val="left"/>
+      <w:pPr>
+        <w:ind w:left="1440" w:hanging="360"/>
+      </w:pPr>
+      <w:rPr>
+        <w:rFonts w:ascii="Courier New" w:hAnsi="Courier New" w:cs="Courier New" w:hint="default"/>
+      </w:rPr>
+    </w:lvl>
+    <w:lvl w:ilvl="2" w:tplc="240A0005" w:tentative="1">
+      <w:start w:val="1"/>
+      <w:numFmt w:val="bullet"/>
+      <w:lvlText w:val=""/>
+      <w:lvlJc w:val="left"/>
+      <w:pPr>
+        <w:ind w:left="2160" w:hanging="360"/>
+      </w:pPr>
+      <w:rPr>
+        <w:rFonts w:ascii="Wingdings" w:hAnsi="Wingdings" w:hint="default"/>
+      </w:rPr>
+    </w:lvl>
+    <w:lvl w:ilvl="3" w:tplc="240A0001" w:tentative="1">
+      <w:start w:val="1"/>
+      <w:numFmt w:val="bullet"/>
+      <w:lvlText w:val=""/>
+      <w:lvlJc w:val="left"/>
+      <w:pPr>
+        <w:ind w:left="2880" w:hanging="360"/>
+      </w:pPr>
+      <w:rPr>
+        <w:rFonts w:ascii="Symbol" w:hAnsi="Symbol" w:hint="default"/>
+      </w:rPr>
+    </w:lvl>
+    <w:lvl w:ilvl="4" w:tplc="240A0003" w:tentative="1">
+      <w:start w:val="1"/>
+      <w:numFmt w:val="bullet"/>
+      <w:lvlText w:val="o"/>
+      <w:lvlJc w:val="left"/>
+      <w:pPr>
+        <w:ind w:left="3600" w:hanging="360"/>
+      </w:pPr>
+      <w:rPr>
+        <w:rFonts w:ascii="Courier New" w:hAnsi="Courier New" w:cs="Courier New" w:hint="default"/>
+      </w:rPr>
+    </w:lvl>
+    <w:lvl w:ilvl="5" w:tplc="240A0005" w:tentative="1">
+      <w:start w:val="1"/>
+      <w:numFmt w:val="bullet"/>
+      <w:lvlText w:val=""/>
+      <w:lvlJc w:val="left"/>
+      <w:pPr>
+        <w:ind w:left="4320" w:hanging="360"/>
+      </w:pPr>
+      <w:rPr>
+        <w:rFonts w:ascii="Wingdings" w:hAnsi="Wingdings" w:hint="default"/>
+      </w:rPr>
+    </w:lvl>
+    <w:lvl w:ilvl="6" w:tplc="240A0001" w:tentative="1">
+      <w:start w:val="1"/>
+      <w:numFmt w:val="bullet"/>
+      <w:lvlText w:val=""/>
+      <w:lvlJc w:val="left"/>
+      <w:pPr>
+        <w:ind w:left="5040" w:hanging="360"/>
+      </w:pPr>
+      <w:rPr>
+        <w:rFonts w:ascii="Symbol" w:hAnsi="Symbol" w:hint="default"/>
+      </w:rPr>
+    </w:lvl>
+    <w:lvl w:ilvl="7" w:tplc="240A0003" w:tentative="1">
+      <w:start w:val="1"/>
+      <w:numFmt w:val="bullet"/>
+      <w:lvlText w:val="o"/>
+      <w:lvlJc w:val="left"/>
+      <w:pPr>
+        <w:ind w:left="5760" w:hanging="360"/>
+      </w:pPr>
+      <w:rPr>
+        <w:rFonts w:ascii="Courier New" w:hAnsi="Courier New" w:cs="Courier New" w:hint="default"/>
+      </w:rPr>
+    </w:lvl>
+    <w:lvl w:ilvl="8" w:tplc="240A0005" w:tentative="1">
+      <w:start w:val="1"/>
+      <w:numFmt w:val="bullet"/>
+      <w:lvlText w:val=""/>
+      <w:lvlJc w:val="left"/>
+      <w:pPr>
+        <w:ind w:left="6480" w:hanging="360"/>
+      </w:pPr>
+      <w:rPr>
+        <w:rFonts w:ascii="Wingdings" w:hAnsi="Wingdings" w:hint="default"/>
+      </w:rPr>
+    </w:lvl>
+  </w:abstractNum>
+  <w:num w:numId="1">
     <w:abstractNumId w:val="0"/>
   </w:num>
-  <w:num w:numId="2" w16cid:durableId="1516194011">
+  <w:num w:numId="2">
     <w:abstractNumId w:val="2"/>
   </w:num>
-  <w:num w:numId="3" w16cid:durableId="1124155957">
+  <w:num w:numId="3">
     <w:abstractNumId w:val="1"/>
+  </w:num>
+  <w:num w:numId="4">
+    <w:abstractNumId w:val="3"/>
   </w:num>
 </w:numbering>
 </file>
 
 <file path=word/styles.xml><?xml version="1.0" encoding="utf-8"?>
-<w:styles xmlns:mc="http://schemas.openxmlformats.org/markup-compatibility/2006" xmlns:r="http://schemas.openxmlformats.org/officeDocument/2006/relationships" xmlns:w="http://schemas.openxmlformats.org/wordprocessingml/2006/main" xmlns:w14="http://schemas.microsoft.com/office/word/2010/wordml" xmlns:w15="http://schemas.microsoft.com/office/word/2012/wordml" xmlns:w16cex="http://schemas.microsoft.com/office/word/2018/wordml/cex" xmlns:w16cid="http://schemas.microsoft.com/office/word/2016/wordml/cid" xmlns:w16="http://schemas.microsoft.com/office/word/2018/wordml" xmlns:w16du="http://schemas.microsoft.com/office/word/2023/wordml/word16du" xmlns:w16sdtdh="http://schemas.microsoft.com/office/word/2020/wordml/sdtdatahash" xmlns:w16sdtfl="http://schemas.microsoft.com/office/word/2024/wordml/sdtformatlock" xmlns:w16se="http://schemas.microsoft.com/office/word/2015/wordml/symex" mc:Ignorable="w14 w15 w16se w16cid w16 w16cex w16sdtdh w16sdtfl w16du">
+<w:styles xmlns:mc="http://schemas.openxmlformats.org/markup-compatibility/2006" xmlns:r="http://schemas.openxmlformats.org/officeDocument/2006/relationships" xmlns:w="http://schemas.openxmlformats.org/wordprocessingml/2006/main" xmlns:w14="http://schemas.microsoft.com/office/word/2010/wordml" xmlns:w15="http://schemas.microsoft.com/office/word/2012/wordml" xmlns:w16cex="http://schemas.microsoft.com/office/word/2018/wordml/cex" xmlns:w16cid="http://schemas.microsoft.com/office/word/2016/wordml/cid" xmlns:w16="http://schemas.microsoft.com/office/word/2018/wordml" xmlns:w16sdtdh="http://schemas.microsoft.com/office/word/2020/wordml/sdtdatahash" xmlns:w16se="http://schemas.microsoft.com/office/word/2015/wordml/symex" mc:Ignorable="w14 w15 w16se w16cid w16 w16cex w16sdtdh">
   <w:docDefaults>
     <w:rPrDefault>
       <w:rPr>
@@ -2132,6 +3662,7 @@
   <w:style w:type="character" w:default="1" w:styleId="Fuentedeprrafopredeter">
     <w:name w:val="Default Paragraph Font"/>
     <w:uiPriority w:val="1"/>
+    <w:semiHidden/>
     <w:unhideWhenUsed/>
   </w:style>
   <w:style w:type="table" w:default="1" w:styleId="Tablanormal">

</xml_diff>

<commit_message>
Actualiza procesamiento de datos con procesamiento de hoja 4PM
</commit_message>
<xml_diff>
--- a/Documentacion/Procesamiento de Datos.docx
+++ b/Documentacion/Procesamiento de Datos.docx
@@ -100,7 +100,14 @@
           <w:rFonts w:ascii="Arial" w:hAnsi="Arial" w:cs="Arial"/>
           <w:lang w:val="es-CO"/>
         </w:rPr>
-        <w:t>30</w:t>
+        <w:t>3</w:t>
+      </w:r>
+      <w:r>
+        <w:rPr>
+          <w:rFonts w:ascii="Arial" w:hAnsi="Arial" w:cs="Arial"/>
+          <w:lang w:val="es-CO"/>
+        </w:rPr>
+        <w:t>1</w:t>
       </w:r>
       <w:r>
         <w:rPr>
@@ -2580,6 +2587,1099 @@
         </w:rPr>
       </w:pPr>
     </w:p>
+    <w:p>
+      <w:pPr>
+        <w:rPr>
+          <w:rFonts w:ascii="Arial" w:hAnsi="Arial" w:cs="Arial"/>
+          <w:lang w:val="es-CO"/>
+        </w:rPr>
+      </w:pPr>
+    </w:p>
+    <w:p>
+      <w:pPr>
+        <w:rPr>
+          <w:rFonts w:ascii="Arial" w:hAnsi="Arial" w:cs="Arial"/>
+          <w:b/>
+          <w:bCs/>
+          <w:lang w:val="es-CO"/>
+        </w:rPr>
+      </w:pPr>
+      <w:r>
+        <w:rPr>
+          <w:rFonts w:ascii="Arial" w:hAnsi="Arial" w:cs="Arial"/>
+          <w:b/>
+          <w:bCs/>
+          <w:lang w:val="es-CO"/>
+        </w:rPr>
+        <w:t>4PM</w:t>
+      </w:r>
+    </w:p>
+    <w:p>
+      <w:pPr>
+        <w:rPr>
+          <w:rFonts w:ascii="Arial" w:hAnsi="Arial" w:cs="Arial"/>
+          <w:lang w:val="es-CO"/>
+        </w:rPr>
+      </w:pPr>
+      <w:r>
+        <w:rPr>
+          <w:rFonts w:ascii="Arial" w:hAnsi="Arial" w:cs="Arial"/>
+          <w:lang w:val="es-CO"/>
+        </w:rPr>
+        <w:t xml:space="preserve">Se empieza por extraer solo la parte correspondiente a los datos del archivo </w:t>
+      </w:r>
+      <w:proofErr w:type="spellStart"/>
+      <w:r>
+        <w:rPr>
+          <w:rFonts w:ascii="Arial" w:hAnsi="Arial" w:cs="Arial"/>
+          <w:lang w:val="es-CO"/>
+        </w:rPr>
+        <w:t>excel</w:t>
+      </w:r>
+      <w:proofErr w:type="spellEnd"/>
+      <w:r>
+        <w:rPr>
+          <w:rFonts w:ascii="Arial" w:hAnsi="Arial" w:cs="Arial"/>
+          <w:lang w:val="es-CO"/>
+        </w:rPr>
+        <w:t>, para lo cual se ignoran las primeras 9 filas de la hoja</w:t>
+      </w:r>
+      <w:r>
+        <w:rPr>
+          <w:rFonts w:ascii="Arial" w:hAnsi="Arial" w:cs="Arial"/>
+          <w:lang w:val="es-CO"/>
+        </w:rPr>
+        <w:t>.</w:t>
+      </w:r>
+    </w:p>
+    <w:p>
+      <w:pPr>
+        <w:rPr>
+          <w:rFonts w:ascii="Arial" w:hAnsi="Arial" w:cs="Arial"/>
+          <w:lang w:val="es-CO"/>
+        </w:rPr>
+      </w:pPr>
+      <w:r>
+        <w:rPr>
+          <w:rFonts w:ascii="Arial" w:hAnsi="Arial" w:cs="Arial"/>
+          <w:noProof/>
+          <w:lang w:val="es-CO"/>
+        </w:rPr>
+        <w:drawing>
+          <wp:inline distT="0" distB="0" distL="0" distR="0" wp14:anchorId="4BA12CB2" wp14:editId="7393D787">
+            <wp:extent cx="5612130" cy="1562100"/>
+            <wp:effectExtent l="0" t="0" r="7620" b="0"/>
+            <wp:docPr id="8" name="Imagen 8"/>
+            <wp:cNvGraphicFramePr>
+              <a:graphicFrameLocks xmlns:a="http://schemas.openxmlformats.org/drawingml/2006/main" noChangeAspect="1"/>
+            </wp:cNvGraphicFramePr>
+            <a:graphic xmlns:a="http://schemas.openxmlformats.org/drawingml/2006/main">
+              <a:graphicData uri="http://schemas.openxmlformats.org/drawingml/2006/picture">
+                <pic:pic xmlns:pic="http://schemas.openxmlformats.org/drawingml/2006/picture">
+                  <pic:nvPicPr>
+                    <pic:cNvPr id="8" name="Imagen 8"/>
+                    <pic:cNvPicPr/>
+                  </pic:nvPicPr>
+                  <pic:blipFill>
+                    <a:blip r:embed="rId19" cstate="print">
+                      <a:extLst>
+                        <a:ext uri="{28A0092B-C50C-407E-A947-70E740481C1C}">
+                          <a14:useLocalDpi xmlns:a14="http://schemas.microsoft.com/office/drawing/2010/main" val="0"/>
+                        </a:ext>
+                      </a:extLst>
+                    </a:blip>
+                    <a:stretch>
+                      <a:fillRect/>
+                    </a:stretch>
+                  </pic:blipFill>
+                  <pic:spPr>
+                    <a:xfrm>
+                      <a:off x="0" y="0"/>
+                      <a:ext cx="5612130" cy="1562100"/>
+                    </a:xfrm>
+                    <a:prstGeom prst="rect">
+                      <a:avLst/>
+                    </a:prstGeom>
+                  </pic:spPr>
+                </pic:pic>
+              </a:graphicData>
+            </a:graphic>
+          </wp:inline>
+        </w:drawing>
+      </w:r>
+    </w:p>
+    <w:p>
+      <w:pPr>
+        <w:rPr>
+          <w:rFonts w:ascii="Arial" w:hAnsi="Arial" w:cs="Arial"/>
+          <w:lang w:val="es-CO"/>
+        </w:rPr>
+      </w:pPr>
+    </w:p>
+    <w:p>
+      <w:pPr>
+        <w:rPr>
+          <w:rFonts w:ascii="Arial" w:hAnsi="Arial" w:cs="Arial"/>
+          <w:lang w:val="es-CO"/>
+        </w:rPr>
+      </w:pPr>
+      <w:r>
+        <w:rPr>
+          <w:rFonts w:ascii="Arial" w:hAnsi="Arial" w:cs="Arial"/>
+          <w:lang w:val="es-CO"/>
+        </w:rPr>
+        <w:t xml:space="preserve">Actualización de </w:t>
+      </w:r>
+      <w:proofErr w:type="spellStart"/>
+      <w:r>
+        <w:rPr>
+          <w:rFonts w:ascii="Arial" w:hAnsi="Arial" w:cs="Arial"/>
+          <w:lang w:val="es-CO"/>
+        </w:rPr>
+        <w:t>headers</w:t>
+      </w:r>
+      <w:proofErr w:type="spellEnd"/>
+    </w:p>
+    <w:p>
+      <w:pPr>
+        <w:rPr>
+          <w:rFonts w:ascii="Arial" w:hAnsi="Arial" w:cs="Arial"/>
+          <w:lang w:val="es-CO"/>
+        </w:rPr>
+      </w:pPr>
+      <w:r>
+        <w:rPr>
+          <w:rFonts w:ascii="Arial" w:hAnsi="Arial" w:cs="Arial"/>
+          <w:lang w:val="es-CO"/>
+        </w:rPr>
+        <w:t xml:space="preserve">Al extraer los datos desde el archivo .xlsx, se verifica el </w:t>
+      </w:r>
+      <w:proofErr w:type="spellStart"/>
+      <w:r>
+        <w:rPr>
+          <w:rFonts w:ascii="Arial" w:hAnsi="Arial" w:cs="Arial"/>
+          <w:lang w:val="es-CO"/>
+        </w:rPr>
+        <w:t>dataframe</w:t>
+      </w:r>
+      <w:proofErr w:type="spellEnd"/>
+      <w:r>
+        <w:rPr>
+          <w:rFonts w:ascii="Arial" w:hAnsi="Arial" w:cs="Arial"/>
+          <w:lang w:val="es-CO"/>
+        </w:rPr>
+        <w:t xml:space="preserve"> generado por Pandas, empezando por los nombres de las columnas y se observan las siguientes incidencias:</w:t>
+      </w:r>
+    </w:p>
+    <w:p>
+      <w:pPr>
+        <w:pStyle w:val="Prrafodelista"/>
+        <w:numPr>
+          <w:ilvl w:val="0"/>
+          <w:numId w:val="5"/>
+        </w:numPr>
+        <w:rPr>
+          <w:rFonts w:ascii="Arial" w:hAnsi="Arial" w:cs="Arial"/>
+          <w:lang w:val="es-CO"/>
+        </w:rPr>
+      </w:pPr>
+      <w:proofErr w:type="spellStart"/>
+      <w:r>
+        <w:rPr>
+          <w:rFonts w:ascii="Arial" w:hAnsi="Arial" w:cs="Arial"/>
+          <w:lang w:val="es-CO"/>
+        </w:rPr>
+        <w:t>Headers</w:t>
+      </w:r>
+      <w:proofErr w:type="spellEnd"/>
+      <w:r>
+        <w:rPr>
+          <w:rFonts w:ascii="Arial" w:hAnsi="Arial" w:cs="Arial"/>
+          <w:lang w:val="es-CO"/>
+        </w:rPr>
+        <w:t xml:space="preserve"> sin nombres descriptivos: </w:t>
+      </w:r>
+      <w:proofErr w:type="spellStart"/>
+      <w:r>
+        <w:rPr>
+          <w:rFonts w:ascii="Arial" w:hAnsi="Arial" w:cs="Arial"/>
+          <w:lang w:val="es-CO"/>
+        </w:rPr>
+        <w:t>headers</w:t>
+      </w:r>
+      <w:proofErr w:type="spellEnd"/>
+      <w:r>
+        <w:rPr>
+          <w:rFonts w:ascii="Arial" w:hAnsi="Arial" w:cs="Arial"/>
+          <w:lang w:val="es-CO"/>
+        </w:rPr>
+        <w:t xml:space="preserve"> con nombres por defecto de Pandas tipo ‘</w:t>
+      </w:r>
+      <w:proofErr w:type="spellStart"/>
+      <w:r>
+        <w:rPr>
+          <w:rFonts w:ascii="Arial" w:hAnsi="Arial" w:cs="Arial"/>
+          <w:lang w:val="es-CO"/>
+        </w:rPr>
+        <w:t>Unnamed</w:t>
+      </w:r>
+      <w:proofErr w:type="spellEnd"/>
+      <w:r>
+        <w:rPr>
+          <w:rFonts w:ascii="Arial" w:hAnsi="Arial" w:cs="Arial"/>
+          <w:lang w:val="es-CO"/>
+        </w:rPr>
+        <w:t>: X’.</w:t>
+      </w:r>
+    </w:p>
+    <w:p>
+      <w:pPr>
+        <w:pStyle w:val="Prrafodelista"/>
+        <w:numPr>
+          <w:ilvl w:val="0"/>
+          <w:numId w:val="5"/>
+        </w:numPr>
+        <w:rPr>
+          <w:rFonts w:ascii="Arial" w:hAnsi="Arial" w:cs="Arial"/>
+          <w:lang w:val="es-CO"/>
+        </w:rPr>
+      </w:pPr>
+      <w:proofErr w:type="spellStart"/>
+      <w:r>
+        <w:rPr>
+          <w:rFonts w:ascii="Arial" w:hAnsi="Arial" w:cs="Arial"/>
+          <w:lang w:val="es-CO"/>
+        </w:rPr>
+        <w:lastRenderedPageBreak/>
+        <w:t>Headers</w:t>
+      </w:r>
+      <w:proofErr w:type="spellEnd"/>
+      <w:r>
+        <w:rPr>
+          <w:rFonts w:ascii="Arial" w:hAnsi="Arial" w:cs="Arial"/>
+          <w:lang w:val="es-CO"/>
+        </w:rPr>
+        <w:t xml:space="preserve"> en jerarquías inferiores debido a la agrupación de datos: </w:t>
+      </w:r>
+      <w:r>
+        <w:rPr>
+          <w:rFonts w:ascii="Arial" w:hAnsi="Arial" w:cs="Arial"/>
+          <w:lang w:val="es-CO"/>
+        </w:rPr>
+        <w:t xml:space="preserve">Todos los </w:t>
+      </w:r>
+      <w:proofErr w:type="spellStart"/>
+      <w:r>
+        <w:rPr>
+          <w:rFonts w:ascii="Arial" w:hAnsi="Arial" w:cs="Arial"/>
+          <w:lang w:val="es-CO"/>
+        </w:rPr>
+        <w:t>headers</w:t>
+      </w:r>
+      <w:proofErr w:type="spellEnd"/>
+      <w:r>
+        <w:rPr>
+          <w:rFonts w:ascii="Arial" w:hAnsi="Arial" w:cs="Arial"/>
+          <w:lang w:val="es-CO"/>
+        </w:rPr>
+        <w:t xml:space="preserve"> se encuentran en la primera fila de los datos</w:t>
+      </w:r>
+      <w:r>
+        <w:rPr>
+          <w:rFonts w:ascii="Arial" w:hAnsi="Arial" w:cs="Arial"/>
+          <w:lang w:val="es-CO"/>
+        </w:rPr>
+        <w:t xml:space="preserve"> debido al diseño del .xlsx donde se busca describir la agrupación por</w:t>
+      </w:r>
+      <w:r>
+        <w:rPr>
+          <w:rFonts w:ascii="Arial" w:hAnsi="Arial" w:cs="Arial"/>
+          <w:lang w:val="es-CO"/>
+        </w:rPr>
+        <w:t xml:space="preserve"> Relación o parentesco con el jefe(a) del hogar.</w:t>
+      </w:r>
+    </w:p>
+    <w:p>
+      <w:pPr>
+        <w:rPr>
+          <w:rFonts w:ascii="Arial" w:hAnsi="Arial" w:cs="Arial"/>
+          <w:lang w:val="es-CO"/>
+        </w:rPr>
+      </w:pPr>
+      <w:r>
+        <w:rPr>
+          <w:rFonts w:ascii="Arial" w:hAnsi="Arial" w:cs="Arial"/>
+          <w:lang w:val="es-CO"/>
+        </w:rPr>
+        <w:t xml:space="preserve">Para solucionar esto, se reemplazan los </w:t>
+      </w:r>
+      <w:proofErr w:type="spellStart"/>
+      <w:r>
+        <w:rPr>
+          <w:rFonts w:ascii="Arial" w:hAnsi="Arial" w:cs="Arial"/>
+          <w:lang w:val="es-CO"/>
+        </w:rPr>
+        <w:t>headers</w:t>
+      </w:r>
+      <w:proofErr w:type="spellEnd"/>
+      <w:r>
+        <w:rPr>
+          <w:rFonts w:ascii="Arial" w:hAnsi="Arial" w:cs="Arial"/>
+          <w:lang w:val="es-CO"/>
+        </w:rPr>
+        <w:t xml:space="preserve"> actuales desde ‘Relación o parentesco con el </w:t>
+      </w:r>
+      <w:proofErr w:type="spellStart"/>
+      <w:r>
+        <w:rPr>
+          <w:rFonts w:ascii="Arial" w:hAnsi="Arial" w:cs="Arial"/>
+          <w:lang w:val="es-CO"/>
+        </w:rPr>
+        <w:t>jef</w:t>
+      </w:r>
+      <w:proofErr w:type="spellEnd"/>
+      <w:r>
+        <w:rPr>
+          <w:rFonts w:ascii="Arial" w:hAnsi="Arial" w:cs="Arial"/>
+          <w:lang w:val="es-CO"/>
+        </w:rPr>
+        <w:t>(a) del hogar’ hasta el último, por los valores correspondientes en la primera fila de datos.</w:t>
+      </w:r>
+    </w:p>
+    <w:p>
+      <w:pPr>
+        <w:rPr>
+          <w:rFonts w:ascii="Arial" w:hAnsi="Arial" w:cs="Arial"/>
+          <w:lang w:val="es-CO"/>
+        </w:rPr>
+      </w:pPr>
+      <w:r>
+        <w:rPr>
+          <w:rFonts w:ascii="Arial" w:hAnsi="Arial" w:cs="Arial"/>
+          <w:noProof/>
+          <w:lang w:val="es-CO"/>
+        </w:rPr>
+        <w:drawing>
+          <wp:inline distT="0" distB="0" distL="0" distR="0" wp14:anchorId="2D96B197" wp14:editId="54289EA6">
+            <wp:extent cx="5612130" cy="1085215"/>
+            <wp:effectExtent l="0" t="0" r="7620" b="635"/>
+            <wp:docPr id="9" name="Imagen 9"/>
+            <wp:cNvGraphicFramePr>
+              <a:graphicFrameLocks xmlns:a="http://schemas.openxmlformats.org/drawingml/2006/main" noChangeAspect="1"/>
+            </wp:cNvGraphicFramePr>
+            <a:graphic xmlns:a="http://schemas.openxmlformats.org/drawingml/2006/main">
+              <a:graphicData uri="http://schemas.openxmlformats.org/drawingml/2006/picture">
+                <pic:pic xmlns:pic="http://schemas.openxmlformats.org/drawingml/2006/picture">
+                  <pic:nvPicPr>
+                    <pic:cNvPr id="9" name="Imagen 9"/>
+                    <pic:cNvPicPr/>
+                  </pic:nvPicPr>
+                  <pic:blipFill>
+                    <a:blip r:embed="rId20" cstate="print">
+                      <a:extLst>
+                        <a:ext uri="{28A0092B-C50C-407E-A947-70E740481C1C}">
+                          <a14:useLocalDpi xmlns:a14="http://schemas.microsoft.com/office/drawing/2010/main" val="0"/>
+                        </a:ext>
+                      </a:extLst>
+                    </a:blip>
+                    <a:stretch>
+                      <a:fillRect/>
+                    </a:stretch>
+                  </pic:blipFill>
+                  <pic:spPr>
+                    <a:xfrm>
+                      <a:off x="0" y="0"/>
+                      <a:ext cx="5612130" cy="1085215"/>
+                    </a:xfrm>
+                    <a:prstGeom prst="rect">
+                      <a:avLst/>
+                    </a:prstGeom>
+                  </pic:spPr>
+                </pic:pic>
+              </a:graphicData>
+            </a:graphic>
+          </wp:inline>
+        </w:drawing>
+      </w:r>
+    </w:p>
+    <w:p>
+      <w:pPr>
+        <w:rPr>
+          <w:rFonts w:ascii="Arial" w:hAnsi="Arial" w:cs="Arial"/>
+          <w:lang w:val="es-CO"/>
+        </w:rPr>
+      </w:pPr>
+      <w:r>
+        <w:rPr>
+          <w:rFonts w:ascii="Arial" w:hAnsi="Arial" w:cs="Arial"/>
+          <w:noProof/>
+          <w:lang w:val="es-CO"/>
+        </w:rPr>
+        <w:drawing>
+          <wp:inline distT="0" distB="0" distL="0" distR="0" wp14:anchorId="0CFEF7D4" wp14:editId="036AB78E">
+            <wp:extent cx="5612130" cy="687705"/>
+            <wp:effectExtent l="0" t="0" r="7620" b="0"/>
+            <wp:docPr id="10" name="Imagen 10"/>
+            <wp:cNvGraphicFramePr>
+              <a:graphicFrameLocks xmlns:a="http://schemas.openxmlformats.org/drawingml/2006/main" noChangeAspect="1"/>
+            </wp:cNvGraphicFramePr>
+            <a:graphic xmlns:a="http://schemas.openxmlformats.org/drawingml/2006/main">
+              <a:graphicData uri="http://schemas.openxmlformats.org/drawingml/2006/picture">
+                <pic:pic xmlns:pic="http://schemas.openxmlformats.org/drawingml/2006/picture">
+                  <pic:nvPicPr>
+                    <pic:cNvPr id="10" name="Imagen 10"/>
+                    <pic:cNvPicPr/>
+                  </pic:nvPicPr>
+                  <pic:blipFill>
+                    <a:blip r:embed="rId21" cstate="print">
+                      <a:extLst>
+                        <a:ext uri="{28A0092B-C50C-407E-A947-70E740481C1C}">
+                          <a14:useLocalDpi xmlns:a14="http://schemas.microsoft.com/office/drawing/2010/main" val="0"/>
+                        </a:ext>
+                      </a:extLst>
+                    </a:blip>
+                    <a:stretch>
+                      <a:fillRect/>
+                    </a:stretch>
+                  </pic:blipFill>
+                  <pic:spPr>
+                    <a:xfrm>
+                      <a:off x="0" y="0"/>
+                      <a:ext cx="5612130" cy="687705"/>
+                    </a:xfrm>
+                    <a:prstGeom prst="rect">
+                      <a:avLst/>
+                    </a:prstGeom>
+                  </pic:spPr>
+                </pic:pic>
+              </a:graphicData>
+            </a:graphic>
+          </wp:inline>
+        </w:drawing>
+      </w:r>
+    </w:p>
+    <w:p>
+      <w:pPr>
+        <w:rPr>
+          <w:rFonts w:ascii="Arial" w:hAnsi="Arial" w:cs="Arial"/>
+          <w:lang w:val="es-CO"/>
+        </w:rPr>
+      </w:pPr>
+    </w:p>
+    <w:p>
+      <w:pPr>
+        <w:rPr>
+          <w:rFonts w:ascii="Arial" w:hAnsi="Arial" w:cs="Arial"/>
+          <w:lang w:val="es-CO"/>
+        </w:rPr>
+      </w:pPr>
+      <w:r>
+        <w:rPr>
+          <w:rFonts w:ascii="Arial" w:hAnsi="Arial" w:cs="Arial"/>
+          <w:lang w:val="es-CO"/>
+        </w:rPr>
+        <w:t>Se cambian las columnas restantes que no tienen nombres descriptivos de la siguiente manera:</w:t>
+      </w:r>
+    </w:p>
+    <w:p>
+      <w:pPr>
+        <w:pStyle w:val="Prrafodelista"/>
+        <w:numPr>
+          <w:ilvl w:val="0"/>
+          <w:numId w:val="6"/>
+        </w:numPr>
+        <w:rPr>
+          <w:rFonts w:ascii="Arial" w:hAnsi="Arial" w:cs="Arial"/>
+          <w:lang w:val="es-CO"/>
+        </w:rPr>
+      </w:pPr>
+      <w:proofErr w:type="spellStart"/>
+      <w:r>
+        <w:rPr>
+          <w:rFonts w:ascii="Arial" w:hAnsi="Arial" w:cs="Arial"/>
+          <w:lang w:val="es-CO"/>
+        </w:rPr>
+        <w:t>Unnamed</w:t>
+      </w:r>
+      <w:proofErr w:type="spellEnd"/>
+      <w:r>
+        <w:rPr>
+          <w:rFonts w:ascii="Arial" w:hAnsi="Arial" w:cs="Arial"/>
+          <w:lang w:val="es-CO"/>
+        </w:rPr>
+        <w:t>: 1: Municipio</w:t>
+      </w:r>
+    </w:p>
+    <w:p>
+      <w:pPr>
+        <w:pStyle w:val="Prrafodelista"/>
+        <w:numPr>
+          <w:ilvl w:val="0"/>
+          <w:numId w:val="6"/>
+        </w:numPr>
+        <w:rPr>
+          <w:rFonts w:ascii="Arial" w:hAnsi="Arial" w:cs="Arial"/>
+          <w:lang w:val="es-CO"/>
+        </w:rPr>
+      </w:pPr>
+      <w:proofErr w:type="spellStart"/>
+      <w:r>
+        <w:rPr>
+          <w:rFonts w:ascii="Arial" w:hAnsi="Arial" w:cs="Arial"/>
+          <w:lang w:val="es-CO"/>
+        </w:rPr>
+        <w:t>Unnamed</w:t>
+      </w:r>
+      <w:proofErr w:type="spellEnd"/>
+      <w:r>
+        <w:rPr>
+          <w:rFonts w:ascii="Arial" w:hAnsi="Arial" w:cs="Arial"/>
+          <w:lang w:val="es-CO"/>
+        </w:rPr>
+        <w:t xml:space="preserve">: 2: </w:t>
+      </w:r>
+      <w:proofErr w:type="spellStart"/>
+      <w:r>
+        <w:rPr>
+          <w:rFonts w:ascii="Arial" w:hAnsi="Arial" w:cs="Arial"/>
+          <w:lang w:val="es-CO"/>
+        </w:rPr>
+        <w:t>Area</w:t>
+      </w:r>
+      <w:proofErr w:type="spellEnd"/>
+    </w:p>
+    <w:p>
+      <w:pPr>
+        <w:pStyle w:val="Prrafodelista"/>
+        <w:numPr>
+          <w:ilvl w:val="0"/>
+          <w:numId w:val="6"/>
+        </w:numPr>
+        <w:rPr>
+          <w:rFonts w:ascii="Arial" w:hAnsi="Arial" w:cs="Arial"/>
+          <w:lang w:val="es-CO"/>
+        </w:rPr>
+      </w:pPr>
+      <w:proofErr w:type="spellStart"/>
+      <w:r>
+        <w:rPr>
+          <w:rFonts w:ascii="Arial" w:hAnsi="Arial" w:cs="Arial"/>
+          <w:lang w:val="es-CO"/>
+        </w:rPr>
+        <w:t>Unnamed</w:t>
+      </w:r>
+      <w:proofErr w:type="spellEnd"/>
+      <w:r>
+        <w:rPr>
+          <w:rFonts w:ascii="Arial" w:hAnsi="Arial" w:cs="Arial"/>
+          <w:lang w:val="es-CO"/>
+        </w:rPr>
+        <w:t>: 3: Sexo</w:t>
+      </w:r>
+    </w:p>
+    <w:p>
+      <w:pPr>
+        <w:rPr>
+          <w:rFonts w:ascii="Arial" w:hAnsi="Arial" w:cs="Arial"/>
+          <w:lang w:val="es-CO"/>
+        </w:rPr>
+      </w:pPr>
+    </w:p>
+    <w:p>
+      <w:pPr>
+        <w:rPr>
+          <w:rFonts w:ascii="Arial" w:hAnsi="Arial" w:cs="Arial"/>
+          <w:lang w:val="es-CO"/>
+        </w:rPr>
+      </w:pPr>
+      <w:r>
+        <w:rPr>
+          <w:rFonts w:ascii="Arial" w:hAnsi="Arial" w:cs="Arial"/>
+          <w:lang w:val="es-CO"/>
+        </w:rPr>
+        <w:t>Filtrado de datos que no son de Viterbo, Caldas</w:t>
+      </w:r>
+    </w:p>
+    <w:p>
+      <w:pPr>
+        <w:rPr>
+          <w:rFonts w:ascii="Arial" w:hAnsi="Arial" w:cs="Arial"/>
+          <w:lang w:val="es-CO"/>
+        </w:rPr>
+      </w:pPr>
+      <w:r>
+        <w:rPr>
+          <w:rFonts w:ascii="Arial" w:hAnsi="Arial" w:cs="Arial"/>
+          <w:lang w:val="es-CO"/>
+        </w:rPr>
+        <w:t>Para esta hoja se decide propagar el valor del identificador del municipio, ‘17877_Viterbo’, y seleccionar solo los registros que lo contengan.</w:t>
+      </w:r>
+    </w:p>
+    <w:p>
+      <w:pPr>
+        <w:rPr>
+          <w:rFonts w:ascii="Arial" w:hAnsi="Arial" w:cs="Arial"/>
+          <w:lang w:val="es-CO"/>
+        </w:rPr>
+      </w:pPr>
+      <w:r>
+        <w:rPr>
+          <w:rFonts w:ascii="Arial" w:hAnsi="Arial" w:cs="Arial"/>
+          <w:noProof/>
+          <w:lang w:val="es-CO"/>
+        </w:rPr>
+        <w:lastRenderedPageBreak/>
+        <w:drawing>
+          <wp:inline distT="0" distB="0" distL="0" distR="0" wp14:anchorId="385687B3" wp14:editId="0179B457">
+            <wp:extent cx="5612130" cy="2134235"/>
+            <wp:effectExtent l="0" t="0" r="7620" b="0"/>
+            <wp:docPr id="11" name="Imagen 11"/>
+            <wp:cNvGraphicFramePr>
+              <a:graphicFrameLocks xmlns:a="http://schemas.openxmlformats.org/drawingml/2006/main" noChangeAspect="1"/>
+            </wp:cNvGraphicFramePr>
+            <a:graphic xmlns:a="http://schemas.openxmlformats.org/drawingml/2006/main">
+              <a:graphicData uri="http://schemas.openxmlformats.org/drawingml/2006/picture">
+                <pic:pic xmlns:pic="http://schemas.openxmlformats.org/drawingml/2006/picture">
+                  <pic:nvPicPr>
+                    <pic:cNvPr id="11" name="Imagen 11"/>
+                    <pic:cNvPicPr/>
+                  </pic:nvPicPr>
+                  <pic:blipFill>
+                    <a:blip r:embed="rId22">
+                      <a:extLst>
+                        <a:ext uri="{28A0092B-C50C-407E-A947-70E740481C1C}">
+                          <a14:useLocalDpi xmlns:a14="http://schemas.microsoft.com/office/drawing/2010/main" val="0"/>
+                        </a:ext>
+                      </a:extLst>
+                    </a:blip>
+                    <a:stretch>
+                      <a:fillRect/>
+                    </a:stretch>
+                  </pic:blipFill>
+                  <pic:spPr>
+                    <a:xfrm>
+                      <a:off x="0" y="0"/>
+                      <a:ext cx="5612130" cy="2134235"/>
+                    </a:xfrm>
+                    <a:prstGeom prst="rect">
+                      <a:avLst/>
+                    </a:prstGeom>
+                  </pic:spPr>
+                </pic:pic>
+              </a:graphicData>
+            </a:graphic>
+          </wp:inline>
+        </w:drawing>
+      </w:r>
+    </w:p>
+    <w:p>
+      <w:pPr>
+        <w:rPr>
+          <w:rFonts w:ascii="Arial" w:hAnsi="Arial" w:cs="Arial"/>
+          <w:lang w:val="es-CO"/>
+        </w:rPr>
+      </w:pPr>
+    </w:p>
+    <w:p>
+      <w:pPr>
+        <w:rPr>
+          <w:rFonts w:ascii="Arial" w:hAnsi="Arial" w:cs="Arial"/>
+          <w:lang w:val="es-CO"/>
+        </w:rPr>
+      </w:pPr>
+      <w:r>
+        <w:rPr>
+          <w:rFonts w:ascii="Arial" w:hAnsi="Arial" w:cs="Arial"/>
+          <w:lang w:val="es-CO"/>
+        </w:rPr>
+        <w:t xml:space="preserve">Eliminación de columnas sin información relevante o con información redundante en el </w:t>
+      </w:r>
+      <w:proofErr w:type="spellStart"/>
+      <w:r>
+        <w:rPr>
+          <w:rFonts w:ascii="Arial" w:hAnsi="Arial" w:cs="Arial"/>
+          <w:lang w:val="es-CO"/>
+        </w:rPr>
+        <w:t>dataframe</w:t>
+      </w:r>
+      <w:proofErr w:type="spellEnd"/>
+      <w:r>
+        <w:rPr>
+          <w:rFonts w:ascii="Arial" w:hAnsi="Arial" w:cs="Arial"/>
+          <w:lang w:val="es-CO"/>
+        </w:rPr>
+        <w:t>.</w:t>
+      </w:r>
+    </w:p>
+    <w:p>
+      <w:pPr>
+        <w:rPr>
+          <w:rFonts w:ascii="Arial" w:hAnsi="Arial" w:cs="Arial"/>
+          <w:lang w:val="es-CO"/>
+        </w:rPr>
+      </w:pPr>
+      <w:r>
+        <w:rPr>
+          <w:rFonts w:ascii="Arial" w:hAnsi="Arial" w:cs="Arial"/>
+          <w:lang w:val="es-CO"/>
+        </w:rPr>
+        <w:t>Se eliminan las columnas ‘</w:t>
+      </w:r>
+      <w:r>
+        <w:rPr>
+          <w:rFonts w:ascii="Arial" w:hAnsi="Arial" w:cs="Arial"/>
+          <w:lang w:val="es-CO"/>
+        </w:rPr>
+        <w:t xml:space="preserve">Municipio, área (Total, Cabecera y Centros poblados y Rural disperso) y sexo', 'Municipio', </w:t>
+      </w:r>
+      <w:r>
+        <w:rPr>
+          <w:rFonts w:ascii="Arial" w:hAnsi="Arial" w:cs="Arial"/>
+          <w:lang w:val="es-CO"/>
+        </w:rPr>
+        <w:t xml:space="preserve">y </w:t>
+      </w:r>
+      <w:r>
+        <w:rPr>
+          <w:rFonts w:ascii="Arial" w:hAnsi="Arial" w:cs="Arial"/>
+          <w:lang w:val="es-CO"/>
+        </w:rPr>
+        <w:t>'Total'</w:t>
+      </w:r>
+      <w:r>
+        <w:rPr>
+          <w:rFonts w:ascii="Arial" w:hAnsi="Arial" w:cs="Arial"/>
+          <w:lang w:val="es-CO"/>
+        </w:rPr>
+        <w:t>.</w:t>
+      </w:r>
+    </w:p>
+    <w:p>
+      <w:pPr>
+        <w:rPr>
+          <w:rFonts w:ascii="Arial" w:hAnsi="Arial" w:cs="Arial"/>
+          <w:lang w:val="es-CO"/>
+        </w:rPr>
+      </w:pPr>
+      <w:r>
+        <w:rPr>
+          <w:rFonts w:ascii="Arial" w:hAnsi="Arial" w:cs="Arial"/>
+          <w:noProof/>
+          <w:lang w:val="es-CO"/>
+        </w:rPr>
+        <w:drawing>
+          <wp:inline distT="0" distB="0" distL="0" distR="0" wp14:anchorId="10CA5C8E" wp14:editId="187ED40A">
+            <wp:extent cx="5612130" cy="1308735"/>
+            <wp:effectExtent l="0" t="0" r="7620" b="5715"/>
+            <wp:docPr id="12" name="Imagen 12"/>
+            <wp:cNvGraphicFramePr>
+              <a:graphicFrameLocks xmlns:a="http://schemas.openxmlformats.org/drawingml/2006/main" noChangeAspect="1"/>
+            </wp:cNvGraphicFramePr>
+            <a:graphic xmlns:a="http://schemas.openxmlformats.org/drawingml/2006/main">
+              <a:graphicData uri="http://schemas.openxmlformats.org/drawingml/2006/picture">
+                <pic:pic xmlns:pic="http://schemas.openxmlformats.org/drawingml/2006/picture">
+                  <pic:nvPicPr>
+                    <pic:cNvPr id="12" name="Imagen 12"/>
+                    <pic:cNvPicPr/>
+                  </pic:nvPicPr>
+                  <pic:blipFill>
+                    <a:blip r:embed="rId23" cstate="print">
+                      <a:extLst>
+                        <a:ext uri="{28A0092B-C50C-407E-A947-70E740481C1C}">
+                          <a14:useLocalDpi xmlns:a14="http://schemas.microsoft.com/office/drawing/2010/main" val="0"/>
+                        </a:ext>
+                      </a:extLst>
+                    </a:blip>
+                    <a:stretch>
+                      <a:fillRect/>
+                    </a:stretch>
+                  </pic:blipFill>
+                  <pic:spPr>
+                    <a:xfrm>
+                      <a:off x="0" y="0"/>
+                      <a:ext cx="5612130" cy="1308735"/>
+                    </a:xfrm>
+                    <a:prstGeom prst="rect">
+                      <a:avLst/>
+                    </a:prstGeom>
+                  </pic:spPr>
+                </pic:pic>
+              </a:graphicData>
+            </a:graphic>
+          </wp:inline>
+        </w:drawing>
+      </w:r>
+    </w:p>
+    <w:p>
+      <w:pPr>
+        <w:rPr>
+          <w:rFonts w:ascii="Arial" w:hAnsi="Arial" w:cs="Arial"/>
+          <w:lang w:val="es-CO"/>
+        </w:rPr>
+      </w:pPr>
+    </w:p>
+    <w:p>
+      <w:pPr>
+        <w:rPr>
+          <w:rFonts w:ascii="Arial" w:hAnsi="Arial" w:cs="Arial"/>
+          <w:lang w:val="es-CO"/>
+        </w:rPr>
+      </w:pPr>
+      <w:r>
+        <w:rPr>
+          <w:rFonts w:ascii="Arial" w:hAnsi="Arial" w:cs="Arial"/>
+          <w:lang w:val="es-CO"/>
+        </w:rPr>
+        <w:t>Se modifican nombres de columnas que contienen caracteres especiales como tildes y ñ.</w:t>
+      </w:r>
+    </w:p>
+    <w:p>
+      <w:pPr>
+        <w:rPr>
+          <w:rFonts w:ascii="Arial" w:hAnsi="Arial" w:cs="Arial"/>
+          <w:lang w:val="es-CO"/>
+        </w:rPr>
+      </w:pPr>
+      <w:r>
+        <w:rPr>
+          <w:rFonts w:ascii="Arial" w:hAnsi="Arial" w:cs="Arial"/>
+          <w:noProof/>
+          <w:lang w:val="es-CO"/>
+        </w:rPr>
+        <w:drawing>
+          <wp:inline distT="0" distB="0" distL="0" distR="0" wp14:anchorId="60DCEA68" wp14:editId="513BAC89">
+            <wp:extent cx="5612130" cy="228600"/>
+            <wp:effectExtent l="0" t="0" r="7620" b="0"/>
+            <wp:docPr id="13" name="Imagen 13"/>
+            <wp:cNvGraphicFramePr>
+              <a:graphicFrameLocks xmlns:a="http://schemas.openxmlformats.org/drawingml/2006/main" noChangeAspect="1"/>
+            </wp:cNvGraphicFramePr>
+            <a:graphic xmlns:a="http://schemas.openxmlformats.org/drawingml/2006/main">
+              <a:graphicData uri="http://schemas.openxmlformats.org/drawingml/2006/picture">
+                <pic:pic xmlns:pic="http://schemas.openxmlformats.org/drawingml/2006/picture">
+                  <pic:nvPicPr>
+                    <pic:cNvPr id="13" name="Imagen 13"/>
+                    <pic:cNvPicPr/>
+                  </pic:nvPicPr>
+                  <pic:blipFill>
+                    <a:blip r:embed="rId24" cstate="print">
+                      <a:extLst>
+                        <a:ext uri="{28A0092B-C50C-407E-A947-70E740481C1C}">
+                          <a14:useLocalDpi xmlns:a14="http://schemas.microsoft.com/office/drawing/2010/main" val="0"/>
+                        </a:ext>
+                      </a:extLst>
+                    </a:blip>
+                    <a:stretch>
+                      <a:fillRect/>
+                    </a:stretch>
+                  </pic:blipFill>
+                  <pic:spPr>
+                    <a:xfrm>
+                      <a:off x="0" y="0"/>
+                      <a:ext cx="5612130" cy="228600"/>
+                    </a:xfrm>
+                    <a:prstGeom prst="rect">
+                      <a:avLst/>
+                    </a:prstGeom>
+                  </pic:spPr>
+                </pic:pic>
+              </a:graphicData>
+            </a:graphic>
+          </wp:inline>
+        </w:drawing>
+      </w:r>
+    </w:p>
+    <w:p>
+      <w:pPr>
+        <w:rPr>
+          <w:rFonts w:ascii="Arial" w:hAnsi="Arial" w:cs="Arial"/>
+          <w:lang w:val="es-CO"/>
+        </w:rPr>
+      </w:pPr>
+    </w:p>
+    <w:p>
+      <w:pPr>
+        <w:rPr>
+          <w:rFonts w:ascii="Arial" w:hAnsi="Arial" w:cs="Arial"/>
+          <w:lang w:val="es-CO"/>
+        </w:rPr>
+      </w:pPr>
+      <w:r>
+        <w:rPr>
+          <w:rFonts w:ascii="Arial" w:hAnsi="Arial" w:cs="Arial"/>
+          <w:lang w:val="es-CO"/>
+        </w:rPr>
+        <w:t>Se propaga el valor de la columna ‘</w:t>
+      </w:r>
+      <w:proofErr w:type="spellStart"/>
+      <w:r>
+        <w:rPr>
+          <w:rFonts w:ascii="Arial" w:hAnsi="Arial" w:cs="Arial"/>
+          <w:lang w:val="es-CO"/>
+        </w:rPr>
+        <w:t>Area</w:t>
+      </w:r>
+      <w:proofErr w:type="spellEnd"/>
+      <w:r>
+        <w:rPr>
+          <w:rFonts w:ascii="Arial" w:hAnsi="Arial" w:cs="Arial"/>
+          <w:lang w:val="es-CO"/>
+        </w:rPr>
+        <w:t xml:space="preserve">’ para reemplazar los valores </w:t>
+      </w:r>
+      <w:proofErr w:type="spellStart"/>
+      <w:r>
+        <w:rPr>
+          <w:rFonts w:ascii="Arial" w:hAnsi="Arial" w:cs="Arial"/>
+          <w:lang w:val="es-CO"/>
+        </w:rPr>
+        <w:t>NaN</w:t>
+      </w:r>
+      <w:proofErr w:type="spellEnd"/>
+      <w:r>
+        <w:rPr>
+          <w:rFonts w:ascii="Arial" w:hAnsi="Arial" w:cs="Arial"/>
+          <w:lang w:val="es-CO"/>
+        </w:rPr>
+        <w:t>.</w:t>
+      </w:r>
+    </w:p>
+    <w:p>
+      <w:pPr>
+        <w:rPr>
+          <w:rFonts w:ascii="Arial" w:hAnsi="Arial" w:cs="Arial"/>
+          <w:lang w:val="es-CO"/>
+        </w:rPr>
+      </w:pPr>
+      <w:r>
+        <w:rPr>
+          <w:rFonts w:ascii="Arial" w:hAnsi="Arial" w:cs="Arial"/>
+          <w:noProof/>
+          <w:lang w:val="es-CO"/>
+        </w:rPr>
+        <w:lastRenderedPageBreak/>
+        <w:drawing>
+          <wp:inline distT="0" distB="0" distL="0" distR="0" wp14:anchorId="443D0230" wp14:editId="0487E751">
+            <wp:extent cx="5471009" cy="3431295"/>
+            <wp:effectExtent l="0" t="0" r="0" b="0"/>
+            <wp:docPr id="14" name="Imagen 14"/>
+            <wp:cNvGraphicFramePr>
+              <a:graphicFrameLocks xmlns:a="http://schemas.openxmlformats.org/drawingml/2006/main" noChangeAspect="1"/>
+            </wp:cNvGraphicFramePr>
+            <a:graphic xmlns:a="http://schemas.openxmlformats.org/drawingml/2006/main">
+              <a:graphicData uri="http://schemas.openxmlformats.org/drawingml/2006/picture">
+                <pic:pic xmlns:pic="http://schemas.openxmlformats.org/drawingml/2006/picture">
+                  <pic:nvPicPr>
+                    <pic:cNvPr id="14" name="Imagen 14"/>
+                    <pic:cNvPicPr/>
+                  </pic:nvPicPr>
+                  <pic:blipFill>
+                    <a:blip r:embed="rId25">
+                      <a:extLst>
+                        <a:ext uri="{28A0092B-C50C-407E-A947-70E740481C1C}">
+                          <a14:useLocalDpi xmlns:a14="http://schemas.microsoft.com/office/drawing/2010/main" val="0"/>
+                        </a:ext>
+                      </a:extLst>
+                    </a:blip>
+                    <a:stretch>
+                      <a:fillRect/>
+                    </a:stretch>
+                  </pic:blipFill>
+                  <pic:spPr>
+                    <a:xfrm>
+                      <a:off x="0" y="0"/>
+                      <a:ext cx="5471009" cy="3431295"/>
+                    </a:xfrm>
+                    <a:prstGeom prst="rect">
+                      <a:avLst/>
+                    </a:prstGeom>
+                  </pic:spPr>
+                </pic:pic>
+              </a:graphicData>
+            </a:graphic>
+          </wp:inline>
+        </w:drawing>
+      </w:r>
+    </w:p>
+    <w:p>
+      <w:pPr>
+        <w:rPr>
+          <w:rFonts w:ascii="Arial" w:hAnsi="Arial" w:cs="Arial"/>
+          <w:lang w:val="es-CO"/>
+        </w:rPr>
+      </w:pPr>
+    </w:p>
+    <w:p>
+      <w:pPr>
+        <w:rPr>
+          <w:rFonts w:ascii="Arial" w:hAnsi="Arial" w:cs="Arial"/>
+          <w:lang w:val="es-CO"/>
+        </w:rPr>
+      </w:pPr>
+      <w:r>
+        <w:rPr>
+          <w:rFonts w:ascii="Arial" w:hAnsi="Arial" w:cs="Arial"/>
+          <w:lang w:val="es-CO"/>
+        </w:rPr>
+        <w:t>Se filtran las filas que contienen resúmenes de datos (Totales)</w:t>
+      </w:r>
+    </w:p>
+    <w:p>
+      <w:pPr>
+        <w:rPr>
+          <w:rFonts w:ascii="Arial" w:hAnsi="Arial" w:cs="Arial"/>
+          <w:lang w:val="es-CO"/>
+        </w:rPr>
+      </w:pPr>
+      <w:r>
+        <w:rPr>
+          <w:rFonts w:ascii="Arial" w:hAnsi="Arial" w:cs="Arial"/>
+          <w:noProof/>
+          <w:lang w:val="es-CO"/>
+        </w:rPr>
+        <w:drawing>
+          <wp:inline distT="0" distB="0" distL="0" distR="0" wp14:anchorId="2D335463" wp14:editId="2E42D8B0">
+            <wp:extent cx="5612130" cy="1169670"/>
+            <wp:effectExtent l="0" t="0" r="7620" b="0"/>
+            <wp:docPr id="15" name="Imagen 15"/>
+            <wp:cNvGraphicFramePr>
+              <a:graphicFrameLocks xmlns:a="http://schemas.openxmlformats.org/drawingml/2006/main" noChangeAspect="1"/>
+            </wp:cNvGraphicFramePr>
+            <a:graphic xmlns:a="http://schemas.openxmlformats.org/drawingml/2006/main">
+              <a:graphicData uri="http://schemas.openxmlformats.org/drawingml/2006/picture">
+                <pic:pic xmlns:pic="http://schemas.openxmlformats.org/drawingml/2006/picture">
+                  <pic:nvPicPr>
+                    <pic:cNvPr id="15" name="Imagen 15"/>
+                    <pic:cNvPicPr/>
+                  </pic:nvPicPr>
+                  <pic:blipFill>
+                    <a:blip r:embed="rId26">
+                      <a:extLst>
+                        <a:ext uri="{28A0092B-C50C-407E-A947-70E740481C1C}">
+                          <a14:useLocalDpi xmlns:a14="http://schemas.microsoft.com/office/drawing/2010/main" val="0"/>
+                        </a:ext>
+                      </a:extLst>
+                    </a:blip>
+                    <a:stretch>
+                      <a:fillRect/>
+                    </a:stretch>
+                  </pic:blipFill>
+                  <pic:spPr>
+                    <a:xfrm>
+                      <a:off x="0" y="0"/>
+                      <a:ext cx="5612130" cy="1169670"/>
+                    </a:xfrm>
+                    <a:prstGeom prst="rect">
+                      <a:avLst/>
+                    </a:prstGeom>
+                  </pic:spPr>
+                </pic:pic>
+              </a:graphicData>
+            </a:graphic>
+          </wp:inline>
+        </w:drawing>
+      </w:r>
+    </w:p>
     <w:sectPr>
       <w:pgSz w:w="12240" w:h="15840"/>
       <w:pgMar w:top="1417" w:right="1701" w:bottom="1417" w:left="1701" w:header="720" w:footer="720" w:gutter="0"/>
@@ -2593,6 +3693,119 @@
 <file path=word/numbering.xml><?xml version="1.0" encoding="utf-8"?>
 <w:numbering xmlns:wpc="http://schemas.microsoft.com/office/word/2010/wordprocessingCanvas" xmlns:cx="http://schemas.microsoft.com/office/drawing/2014/chartex" xmlns:cx1="http://schemas.microsoft.com/office/drawing/2015/9/8/chartex" xmlns:cx2="http://schemas.microsoft.com/office/drawing/2015/10/21/chartex" xmlns:cx3="http://schemas.microsoft.com/office/drawing/2016/5/9/chartex" xmlns:cx4="http://schemas.microsoft.com/office/drawing/2016/5/10/chartex" xmlns:cx5="http://schemas.microsoft.com/office/drawing/2016/5/11/chartex" xmlns:cx6="http://schemas.microsoft.com/office/drawing/2016/5/12/chartex" xmlns:cx7="http://schemas.microsoft.com/office/drawing/2016/5/13/chartex" xmlns:cx8="http://schemas.microsoft.com/office/drawing/2016/5/14/chartex" xmlns:mc="http://schemas.openxmlformats.org/markup-compatibility/2006" xmlns:aink="http://schemas.microsoft.com/office/drawing/2016/ink" xmlns:am3d="http://schemas.microsoft.com/office/drawing/2017/model3d" xmlns:o="urn:schemas-microsoft-com:office:office" xmlns:r="http://schemas.openxmlformats.org/officeDocument/2006/relationships" xmlns:m="http://schemas.openxmlformats.org/officeDocument/2006/math" xmlns:v="urn:schemas-microsoft-com:vml" xmlns:wp14="http://schemas.microsoft.com/office/word/2010/wordprocessingDrawing" xmlns:wp="http://schemas.openxmlformats.org/drawingml/2006/wordprocessingDrawing" xmlns:w10="urn:schemas-microsoft-com:office:word" xmlns:w="http://schemas.openxmlformats.org/wordprocessingml/2006/main" xmlns:w14="http://schemas.microsoft.com/office/word/2010/wordml" xmlns:w15="http://schemas.microsoft.com/office/word/2012/wordml" xmlns:w16cex="http://schemas.microsoft.com/office/word/2018/wordml/cex" xmlns:w16cid="http://schemas.microsoft.com/office/word/2016/wordml/cid" xmlns:w16="http://schemas.microsoft.com/office/word/2018/wordml" xmlns:w16sdtdh="http://schemas.microsoft.com/office/word/2020/wordml/sdtdatahash" xmlns:w16se="http://schemas.microsoft.com/office/word/2015/wordml/symex" xmlns:wpg="http://schemas.microsoft.com/office/word/2010/wordprocessingGroup" xmlns:wpi="http://schemas.microsoft.com/office/word/2010/wordprocessingInk" xmlns:wne="http://schemas.microsoft.com/office/word/2006/wordml" xmlns:wps="http://schemas.microsoft.com/office/word/2010/wordprocessingShape" mc:Ignorable="w14 w15 w16se w16cid w16 w16cex w16sdtdh wp14">
   <w:abstractNum w:abstractNumId="0" w15:restartNumberingAfterBreak="0">
+    <w:nsid w:val="00160576"/>
+    <w:multiLevelType w:val="hybridMultilevel"/>
+    <w:tmpl w:val="512EA832"/>
+    <w:lvl w:ilvl="0" w:tplc="240A0001">
+      <w:start w:val="1"/>
+      <w:numFmt w:val="bullet"/>
+      <w:lvlText w:val=""/>
+      <w:lvlJc w:val="left"/>
+      <w:pPr>
+        <w:ind w:left="720" w:hanging="360"/>
+      </w:pPr>
+      <w:rPr>
+        <w:rFonts w:ascii="Symbol" w:hAnsi="Symbol" w:hint="default"/>
+      </w:rPr>
+    </w:lvl>
+    <w:lvl w:ilvl="1" w:tplc="240A0003" w:tentative="1">
+      <w:start w:val="1"/>
+      <w:numFmt w:val="bullet"/>
+      <w:lvlText w:val="o"/>
+      <w:lvlJc w:val="left"/>
+      <w:pPr>
+        <w:ind w:left="1440" w:hanging="360"/>
+      </w:pPr>
+      <w:rPr>
+        <w:rFonts w:ascii="Courier New" w:hAnsi="Courier New" w:cs="Courier New" w:hint="default"/>
+      </w:rPr>
+    </w:lvl>
+    <w:lvl w:ilvl="2" w:tplc="240A0005" w:tentative="1">
+      <w:start w:val="1"/>
+      <w:numFmt w:val="bullet"/>
+      <w:lvlText w:val=""/>
+      <w:lvlJc w:val="left"/>
+      <w:pPr>
+        <w:ind w:left="2160" w:hanging="360"/>
+      </w:pPr>
+      <w:rPr>
+        <w:rFonts w:ascii="Wingdings" w:hAnsi="Wingdings" w:hint="default"/>
+      </w:rPr>
+    </w:lvl>
+    <w:lvl w:ilvl="3" w:tplc="240A0001" w:tentative="1">
+      <w:start w:val="1"/>
+      <w:numFmt w:val="bullet"/>
+      <w:lvlText w:val=""/>
+      <w:lvlJc w:val="left"/>
+      <w:pPr>
+        <w:ind w:left="2880" w:hanging="360"/>
+      </w:pPr>
+      <w:rPr>
+        <w:rFonts w:ascii="Symbol" w:hAnsi="Symbol" w:hint="default"/>
+      </w:rPr>
+    </w:lvl>
+    <w:lvl w:ilvl="4" w:tplc="240A0003" w:tentative="1">
+      <w:start w:val="1"/>
+      <w:numFmt w:val="bullet"/>
+      <w:lvlText w:val="o"/>
+      <w:lvlJc w:val="left"/>
+      <w:pPr>
+        <w:ind w:left="3600" w:hanging="360"/>
+      </w:pPr>
+      <w:rPr>
+        <w:rFonts w:ascii="Courier New" w:hAnsi="Courier New" w:cs="Courier New" w:hint="default"/>
+      </w:rPr>
+    </w:lvl>
+    <w:lvl w:ilvl="5" w:tplc="240A0005" w:tentative="1">
+      <w:start w:val="1"/>
+      <w:numFmt w:val="bullet"/>
+      <w:lvlText w:val=""/>
+      <w:lvlJc w:val="left"/>
+      <w:pPr>
+        <w:ind w:left="4320" w:hanging="360"/>
+      </w:pPr>
+      <w:rPr>
+        <w:rFonts w:ascii="Wingdings" w:hAnsi="Wingdings" w:hint="default"/>
+      </w:rPr>
+    </w:lvl>
+    <w:lvl w:ilvl="6" w:tplc="240A0001" w:tentative="1">
+      <w:start w:val="1"/>
+      <w:numFmt w:val="bullet"/>
+      <w:lvlText w:val=""/>
+      <w:lvlJc w:val="left"/>
+      <w:pPr>
+        <w:ind w:left="5040" w:hanging="360"/>
+      </w:pPr>
+      <w:rPr>
+        <w:rFonts w:ascii="Symbol" w:hAnsi="Symbol" w:hint="default"/>
+      </w:rPr>
+    </w:lvl>
+    <w:lvl w:ilvl="7" w:tplc="240A0003" w:tentative="1">
+      <w:start w:val="1"/>
+      <w:numFmt w:val="bullet"/>
+      <w:lvlText w:val="o"/>
+      <w:lvlJc w:val="left"/>
+      <w:pPr>
+        <w:ind w:left="5760" w:hanging="360"/>
+      </w:pPr>
+      <w:rPr>
+        <w:rFonts w:ascii="Courier New" w:hAnsi="Courier New" w:cs="Courier New" w:hint="default"/>
+      </w:rPr>
+    </w:lvl>
+    <w:lvl w:ilvl="8" w:tplc="240A0005" w:tentative="1">
+      <w:start w:val="1"/>
+      <w:numFmt w:val="bullet"/>
+      <w:lvlText w:val=""/>
+      <w:lvlJc w:val="left"/>
+      <w:pPr>
+        <w:ind w:left="6480" w:hanging="360"/>
+      </w:pPr>
+      <w:rPr>
+        <w:rFonts w:ascii="Wingdings" w:hAnsi="Wingdings" w:hint="default"/>
+      </w:rPr>
+    </w:lvl>
+  </w:abstractNum>
+  <w:abstractNum w:abstractNumId="1" w15:restartNumberingAfterBreak="0">
     <w:nsid w:val="1BC752DC"/>
     <w:multiLevelType w:val="hybridMultilevel"/>
     <w:tmpl w:val="1A1CF23E"/>
@@ -2705,7 +3918,7 @@
       </w:rPr>
     </w:lvl>
   </w:abstractNum>
-  <w:abstractNum w:abstractNumId="1" w15:restartNumberingAfterBreak="0">
+  <w:abstractNum w:abstractNumId="2" w15:restartNumberingAfterBreak="0">
     <w:nsid w:val="1C1A5140"/>
     <w:multiLevelType w:val="hybridMultilevel"/>
     <w:tmpl w:val="A0D21C22"/>
@@ -2818,7 +4031,120 @@
       </w:rPr>
     </w:lvl>
   </w:abstractNum>
-  <w:abstractNum w:abstractNumId="2" w15:restartNumberingAfterBreak="0">
+  <w:abstractNum w:abstractNumId="3" w15:restartNumberingAfterBreak="0">
+    <w:nsid w:val="351A5970"/>
+    <w:multiLevelType w:val="hybridMultilevel"/>
+    <w:tmpl w:val="D1901D24"/>
+    <w:lvl w:ilvl="0" w:tplc="240A0001">
+      <w:start w:val="1"/>
+      <w:numFmt w:val="bullet"/>
+      <w:lvlText w:val=""/>
+      <w:lvlJc w:val="left"/>
+      <w:pPr>
+        <w:ind w:left="720" w:hanging="360"/>
+      </w:pPr>
+      <w:rPr>
+        <w:rFonts w:ascii="Symbol" w:hAnsi="Symbol" w:hint="default"/>
+      </w:rPr>
+    </w:lvl>
+    <w:lvl w:ilvl="1" w:tplc="240A0003" w:tentative="1">
+      <w:start w:val="1"/>
+      <w:numFmt w:val="bullet"/>
+      <w:lvlText w:val="o"/>
+      <w:lvlJc w:val="left"/>
+      <w:pPr>
+        <w:ind w:left="1440" w:hanging="360"/>
+      </w:pPr>
+      <w:rPr>
+        <w:rFonts w:ascii="Courier New" w:hAnsi="Courier New" w:cs="Courier New" w:hint="default"/>
+      </w:rPr>
+    </w:lvl>
+    <w:lvl w:ilvl="2" w:tplc="240A0005" w:tentative="1">
+      <w:start w:val="1"/>
+      <w:numFmt w:val="bullet"/>
+      <w:lvlText w:val=""/>
+      <w:lvlJc w:val="left"/>
+      <w:pPr>
+        <w:ind w:left="2160" w:hanging="360"/>
+      </w:pPr>
+      <w:rPr>
+        <w:rFonts w:ascii="Wingdings" w:hAnsi="Wingdings" w:hint="default"/>
+      </w:rPr>
+    </w:lvl>
+    <w:lvl w:ilvl="3" w:tplc="240A0001" w:tentative="1">
+      <w:start w:val="1"/>
+      <w:numFmt w:val="bullet"/>
+      <w:lvlText w:val=""/>
+      <w:lvlJc w:val="left"/>
+      <w:pPr>
+        <w:ind w:left="2880" w:hanging="360"/>
+      </w:pPr>
+      <w:rPr>
+        <w:rFonts w:ascii="Symbol" w:hAnsi="Symbol" w:hint="default"/>
+      </w:rPr>
+    </w:lvl>
+    <w:lvl w:ilvl="4" w:tplc="240A0003" w:tentative="1">
+      <w:start w:val="1"/>
+      <w:numFmt w:val="bullet"/>
+      <w:lvlText w:val="o"/>
+      <w:lvlJc w:val="left"/>
+      <w:pPr>
+        <w:ind w:left="3600" w:hanging="360"/>
+      </w:pPr>
+      <w:rPr>
+        <w:rFonts w:ascii="Courier New" w:hAnsi="Courier New" w:cs="Courier New" w:hint="default"/>
+      </w:rPr>
+    </w:lvl>
+    <w:lvl w:ilvl="5" w:tplc="240A0005" w:tentative="1">
+      <w:start w:val="1"/>
+      <w:numFmt w:val="bullet"/>
+      <w:lvlText w:val=""/>
+      <w:lvlJc w:val="left"/>
+      <w:pPr>
+        <w:ind w:left="4320" w:hanging="360"/>
+      </w:pPr>
+      <w:rPr>
+        <w:rFonts w:ascii="Wingdings" w:hAnsi="Wingdings" w:hint="default"/>
+      </w:rPr>
+    </w:lvl>
+    <w:lvl w:ilvl="6" w:tplc="240A0001" w:tentative="1">
+      <w:start w:val="1"/>
+      <w:numFmt w:val="bullet"/>
+      <w:lvlText w:val=""/>
+      <w:lvlJc w:val="left"/>
+      <w:pPr>
+        <w:ind w:left="5040" w:hanging="360"/>
+      </w:pPr>
+      <w:rPr>
+        <w:rFonts w:ascii="Symbol" w:hAnsi="Symbol" w:hint="default"/>
+      </w:rPr>
+    </w:lvl>
+    <w:lvl w:ilvl="7" w:tplc="240A0003" w:tentative="1">
+      <w:start w:val="1"/>
+      <w:numFmt w:val="bullet"/>
+      <w:lvlText w:val="o"/>
+      <w:lvlJc w:val="left"/>
+      <w:pPr>
+        <w:ind w:left="5760" w:hanging="360"/>
+      </w:pPr>
+      <w:rPr>
+        <w:rFonts w:ascii="Courier New" w:hAnsi="Courier New" w:cs="Courier New" w:hint="default"/>
+      </w:rPr>
+    </w:lvl>
+    <w:lvl w:ilvl="8" w:tplc="240A0005" w:tentative="1">
+      <w:start w:val="1"/>
+      <w:numFmt w:val="bullet"/>
+      <w:lvlText w:val=""/>
+      <w:lvlJc w:val="left"/>
+      <w:pPr>
+        <w:ind w:left="6480" w:hanging="360"/>
+      </w:pPr>
+      <w:rPr>
+        <w:rFonts w:ascii="Wingdings" w:hAnsi="Wingdings" w:hint="default"/>
+      </w:rPr>
+    </w:lvl>
+  </w:abstractNum>
+  <w:abstractNum w:abstractNumId="4" w15:restartNumberingAfterBreak="0">
     <w:nsid w:val="48F2220C"/>
     <w:multiLevelType w:val="hybridMultilevel"/>
     <w:tmpl w:val="C6A41878"/>
@@ -2931,7 +4257,7 @@
       </w:rPr>
     </w:lvl>
   </w:abstractNum>
-  <w:abstractNum w:abstractNumId="3" w15:restartNumberingAfterBreak="0">
+  <w:abstractNum w:abstractNumId="5" w15:restartNumberingAfterBreak="0">
     <w:nsid w:val="496738FF"/>
     <w:multiLevelType w:val="hybridMultilevel"/>
     <w:tmpl w:val="BCB87994"/>
@@ -3045,15 +4371,21 @@
     </w:lvl>
   </w:abstractNum>
   <w:num w:numId="1">
+    <w:abstractNumId w:val="1"/>
+  </w:num>
+  <w:num w:numId="2">
+    <w:abstractNumId w:val="4"/>
+  </w:num>
+  <w:num w:numId="3">
+    <w:abstractNumId w:val="2"/>
+  </w:num>
+  <w:num w:numId="4">
+    <w:abstractNumId w:val="5"/>
+  </w:num>
+  <w:num w:numId="5">
     <w:abstractNumId w:val="0"/>
   </w:num>
-  <w:num w:numId="2">
-    <w:abstractNumId w:val="2"/>
-  </w:num>
-  <w:num w:numId="3">
-    <w:abstractNumId w:val="1"/>
-  </w:num>
-  <w:num w:numId="4">
+  <w:num w:numId="6">
     <w:abstractNumId w:val="3"/>
   </w:num>
 </w:numbering>

</xml_diff>

<commit_message>
Actualiza doc procesamiento de datos con procesamiento de la hoja 5.1PM
</commit_message>
<xml_diff>
--- a/Documentacion/Procesamiento de Datos.docx
+++ b/Documentacion/Procesamiento de Datos.docx
@@ -100,13 +100,6 @@
           <w:rFonts w:ascii="Arial" w:hAnsi="Arial" w:cs="Arial"/>
           <w:lang w:val="es-CO"/>
         </w:rPr>
-        <w:t>3</w:t>
-      </w:r>
-      <w:r>
-        <w:rPr>
-          <w:rFonts w:ascii="Arial" w:hAnsi="Arial" w:cs="Arial"/>
-          <w:lang w:val="es-CO"/>
-        </w:rPr>
         <w:t>1</w:t>
       </w:r>
       <w:r>
@@ -114,7 +107,21 @@
           <w:rFonts w:ascii="Arial" w:hAnsi="Arial" w:cs="Arial"/>
           <w:lang w:val="es-CO"/>
         </w:rPr>
-        <w:t xml:space="preserve"> de marzo de 2025</w:t>
+        <w:t xml:space="preserve"> de </w:t>
+      </w:r>
+      <w:r>
+        <w:rPr>
+          <w:rFonts w:ascii="Arial" w:hAnsi="Arial" w:cs="Arial"/>
+          <w:lang w:val="es-CO"/>
+        </w:rPr>
+        <w:t>abril</w:t>
+      </w:r>
+      <w:r>
+        <w:rPr>
+          <w:rFonts w:ascii="Arial" w:hAnsi="Arial" w:cs="Arial"/>
+          <w:lang w:val="es-CO"/>
+        </w:rPr>
+        <w:t xml:space="preserve"> de 2025</w:t>
       </w:r>
     </w:p>
     <w:p>
@@ -186,126 +193,37 @@
           <w:rFonts w:ascii="Arial" w:hAnsi="Arial" w:cs="Arial"/>
           <w:lang w:val="es-CO"/>
         </w:rPr>
-        <w:t>Almacenamiento de datos extraídos: .</w:t>
-      </w:r>
-      <w:proofErr w:type="spellStart"/>
-      <w:r>
-        <w:rPr>
-          <w:rFonts w:ascii="Arial" w:hAnsi="Arial" w:cs="Arial"/>
-          <w:lang w:val="es-CO"/>
-        </w:rPr>
-        <w:t>csv</w:t>
-      </w:r>
-      <w:proofErr w:type="spellEnd"/>
-    </w:p>
-    <w:p>
-      <w:pPr>
-        <w:rPr>
-          <w:rFonts w:ascii="Arial" w:hAnsi="Arial" w:cs="Arial"/>
-          <w:lang w:val="es-CO"/>
-        </w:rPr>
-      </w:pPr>
-      <w:r>
-        <w:rPr>
-          <w:rFonts w:ascii="Arial" w:hAnsi="Arial" w:cs="Arial"/>
-          <w:lang w:val="es-CO"/>
-        </w:rPr>
-        <w:t xml:space="preserve">Las fuentes de datos vienen en hojas de </w:t>
-      </w:r>
-      <w:proofErr w:type="spellStart"/>
-      <w:r>
-        <w:rPr>
-          <w:rFonts w:ascii="Arial" w:hAnsi="Arial" w:cs="Arial"/>
-          <w:lang w:val="es-CO"/>
-        </w:rPr>
-        <w:t>excel</w:t>
-      </w:r>
-      <w:proofErr w:type="spellEnd"/>
-      <w:r>
-        <w:rPr>
-          <w:rFonts w:ascii="Arial" w:hAnsi="Arial" w:cs="Arial"/>
-          <w:lang w:val="es-CO"/>
-        </w:rPr>
-        <w:t xml:space="preserve"> desde el origen, aunque el proyecto es muy específico sobre el municipio de Viterbo, Caldas y podrían extraerse manualmente a otra hoja de </w:t>
-      </w:r>
-      <w:proofErr w:type="spellStart"/>
-      <w:r>
-        <w:rPr>
-          <w:rFonts w:ascii="Arial" w:hAnsi="Arial" w:cs="Arial"/>
-          <w:lang w:val="es-CO"/>
-        </w:rPr>
-        <w:t>excel</w:t>
-      </w:r>
-      <w:proofErr w:type="spellEnd"/>
-      <w:r>
-        <w:rPr>
-          <w:rFonts w:ascii="Arial" w:hAnsi="Arial" w:cs="Arial"/>
-          <w:lang w:val="es-CO"/>
-        </w:rPr>
-        <w:t xml:space="preserve"> y trabajar sobre ellos, se puede construir un flujo de extracción de datos escalable utilizando Python, lo anterior para poder aplicarlo a todo el </w:t>
-      </w:r>
-      <w:proofErr w:type="spellStart"/>
-      <w:r>
-        <w:rPr>
-          <w:rFonts w:ascii="Arial" w:hAnsi="Arial" w:cs="Arial"/>
-          <w:lang w:val="es-CO"/>
-        </w:rPr>
-        <w:t>dataset</w:t>
-      </w:r>
-      <w:proofErr w:type="spellEnd"/>
-      <w:r>
-        <w:rPr>
-          <w:rFonts w:ascii="Arial" w:hAnsi="Arial" w:cs="Arial"/>
-          <w:lang w:val="es-CO"/>
-        </w:rPr>
-        <w:t xml:space="preserve"> en un futuro.</w:t>
-      </w:r>
-    </w:p>
-    <w:p>
-      <w:pPr>
-        <w:rPr>
-          <w:rFonts w:ascii="Arial" w:hAnsi="Arial" w:cs="Arial"/>
-          <w:lang w:val="es-CO"/>
-        </w:rPr>
-      </w:pPr>
-      <w:r>
-        <w:rPr>
-          <w:rFonts w:ascii="Arial" w:hAnsi="Arial" w:cs="Arial"/>
-          <w:lang w:val="es-CO"/>
-        </w:rPr>
-        <w:t>Los datos procesados se almacenarán en documentos .</w:t>
-      </w:r>
-      <w:proofErr w:type="spellStart"/>
-      <w:r>
-        <w:rPr>
-          <w:rFonts w:ascii="Arial" w:hAnsi="Arial" w:cs="Arial"/>
-          <w:lang w:val="es-CO"/>
-        </w:rPr>
-        <w:t>csv</w:t>
-      </w:r>
-      <w:proofErr w:type="spellEnd"/>
-      <w:r>
-        <w:rPr>
-          <w:rFonts w:ascii="Arial" w:hAnsi="Arial" w:cs="Arial"/>
-          <w:lang w:val="es-CO"/>
-        </w:rPr>
-        <w:t xml:space="preserve"> como </w:t>
-      </w:r>
-      <w:proofErr w:type="spellStart"/>
-      <w:r>
-        <w:rPr>
-          <w:rFonts w:ascii="Arial" w:hAnsi="Arial" w:cs="Arial"/>
-          <w:lang w:val="es-CO"/>
-        </w:rPr>
-        <w:t>datasets</w:t>
-      </w:r>
-      <w:proofErr w:type="spellEnd"/>
-      <w:r>
-        <w:rPr>
-          <w:rFonts w:ascii="Arial" w:hAnsi="Arial" w:cs="Arial"/>
-          <w:lang w:val="es-CO"/>
-        </w:rPr>
-        <w:t xml:space="preserve"> definitivos.</w:t>
+        <w:t>Almacenamiento de datos extraídos: .csv</w:t>
+      </w:r>
+    </w:p>
+    <w:p>
+      <w:pPr>
+        <w:rPr>
+          <w:rFonts w:ascii="Arial" w:hAnsi="Arial" w:cs="Arial"/>
+          <w:lang w:val="es-CO"/>
+        </w:rPr>
+      </w:pPr>
+      <w:r>
+        <w:rPr>
+          <w:rFonts w:ascii="Arial" w:hAnsi="Arial" w:cs="Arial"/>
+          <w:lang w:val="es-CO"/>
+        </w:rPr>
+        <w:t>Las fuentes de datos vienen en hojas de excel desde el origen, aunque el proyecto es muy específico sobre el municipio de Viterbo, Caldas y podrían extraerse manualmente a otra hoja de excel y trabajar sobre ellos, se puede construir un flujo de extracción de datos escalable utilizando Python, lo anterior para poder aplicarlo a todo el dataset en un futuro.</w:t>
+      </w:r>
+    </w:p>
+    <w:p>
+      <w:pPr>
+        <w:rPr>
+          <w:rFonts w:ascii="Arial" w:hAnsi="Arial" w:cs="Arial"/>
+          <w:lang w:val="es-CO"/>
+        </w:rPr>
+      </w:pPr>
+      <w:r>
+        <w:rPr>
+          <w:rFonts w:ascii="Arial" w:hAnsi="Arial" w:cs="Arial"/>
+          <w:lang w:val="es-CO"/>
+        </w:rPr>
+        <w:t>Los datos procesados se almacenarán en documentos .csv como datasets definitivos.</w:t>
       </w:r>
     </w:p>
     <w:p>
@@ -471,23 +389,7 @@
           <w:rFonts w:ascii="Arial" w:hAnsi="Arial" w:cs="Arial"/>
           <w:lang w:val="es-CO"/>
         </w:rPr>
-        <w:t xml:space="preserve">Se empieza por extraer solo la parte correspondiente a los datos del archivo </w:t>
-      </w:r>
-      <w:proofErr w:type="spellStart"/>
-      <w:r>
-        <w:rPr>
-          <w:rFonts w:ascii="Arial" w:hAnsi="Arial" w:cs="Arial"/>
-          <w:lang w:val="es-CO"/>
-        </w:rPr>
-        <w:t>excel</w:t>
-      </w:r>
-      <w:proofErr w:type="spellEnd"/>
-      <w:r>
-        <w:rPr>
-          <w:rFonts w:ascii="Arial" w:hAnsi="Arial" w:cs="Arial"/>
-          <w:lang w:val="es-CO"/>
-        </w:rPr>
-        <w:t>, para lo cual se ignoran las primeras 9 filas de la hoja</w:t>
+        <w:t>Se empieza por extraer solo la parte correspondiente a los datos del archivo excel, para lo cual se ignoran las primeras 9 filas de la hoja</w:t>
       </w:r>
     </w:p>
     <w:p>
@@ -567,47 +469,22 @@
           <w:rFonts w:ascii="Arial" w:hAnsi="Arial" w:cs="Arial"/>
           <w:lang w:val="es-CO"/>
         </w:rPr>
-        <w:t xml:space="preserve">Actualización de </w:t>
-      </w:r>
-      <w:proofErr w:type="spellStart"/>
-      <w:r>
-        <w:rPr>
-          <w:rFonts w:ascii="Arial" w:hAnsi="Arial" w:cs="Arial"/>
-          <w:lang w:val="es-CO"/>
-        </w:rPr>
-        <w:t>headers</w:t>
-      </w:r>
-      <w:proofErr w:type="spellEnd"/>
-    </w:p>
-    <w:p>
-      <w:pPr>
-        <w:rPr>
-          <w:rFonts w:ascii="Arial" w:hAnsi="Arial" w:cs="Arial"/>
-          <w:lang w:val="es-CO"/>
-        </w:rPr>
-      </w:pPr>
-      <w:r>
-        <w:rPr>
-          <w:rFonts w:ascii="Arial" w:hAnsi="Arial" w:cs="Arial"/>
-          <w:lang w:val="es-CO"/>
-        </w:rPr>
-        <w:t xml:space="preserve">Al extraer los datos desde el archivo .xlsx, se verifica el </w:t>
-      </w:r>
-      <w:proofErr w:type="spellStart"/>
-      <w:r>
-        <w:rPr>
-          <w:rFonts w:ascii="Arial" w:hAnsi="Arial" w:cs="Arial"/>
-          <w:lang w:val="es-CO"/>
-        </w:rPr>
-        <w:t>dataframe</w:t>
-      </w:r>
-      <w:proofErr w:type="spellEnd"/>
-      <w:r>
-        <w:rPr>
-          <w:rFonts w:ascii="Arial" w:hAnsi="Arial" w:cs="Arial"/>
-          <w:lang w:val="es-CO"/>
-        </w:rPr>
-        <w:t xml:space="preserve"> generado por Pandas, empezando por los nombres de las columnas y se observan las siguientes incidencias:</w:t>
+        <w:t>Actualización de headers</w:t>
+      </w:r>
+    </w:p>
+    <w:p>
+      <w:pPr>
+        <w:rPr>
+          <w:rFonts w:ascii="Arial" w:hAnsi="Arial" w:cs="Arial"/>
+          <w:lang w:val="es-CO"/>
+        </w:rPr>
+      </w:pPr>
+      <w:r>
+        <w:rPr>
+          <w:rFonts w:ascii="Arial" w:hAnsi="Arial" w:cs="Arial"/>
+          <w:lang w:val="es-CO"/>
+        </w:rPr>
+        <w:t>Al extraer los datos desde el archivo .xlsx, se verifica el dataframe generado por Pandas, empezando por los nombres de las columnas y se observan las siguientes incidencias:</w:t>
       </w:r>
     </w:p>
     <w:p>
@@ -622,53 +499,12 @@
           <w:lang w:val="es-CO"/>
         </w:rPr>
       </w:pPr>
-      <w:proofErr w:type="spellStart"/>
-      <w:r>
-        <w:rPr>
-          <w:rFonts w:ascii="Arial" w:hAnsi="Arial" w:cs="Arial"/>
-          <w:lang w:val="es-CO"/>
-        </w:rPr>
-        <w:t>Headers</w:t>
-      </w:r>
-      <w:proofErr w:type="spellEnd"/>
-      <w:r>
-        <w:rPr>
-          <w:rFonts w:ascii="Arial" w:hAnsi="Arial" w:cs="Arial"/>
-          <w:lang w:val="es-CO"/>
-        </w:rPr>
-        <w:t xml:space="preserve"> sin nombres descriptivos: </w:t>
-      </w:r>
-      <w:proofErr w:type="spellStart"/>
-      <w:r>
-        <w:rPr>
-          <w:rFonts w:ascii="Arial" w:hAnsi="Arial" w:cs="Arial"/>
-          <w:lang w:val="es-CO"/>
-        </w:rPr>
-        <w:t>headers</w:t>
-      </w:r>
-      <w:proofErr w:type="spellEnd"/>
-      <w:r>
-        <w:rPr>
-          <w:rFonts w:ascii="Arial" w:hAnsi="Arial" w:cs="Arial"/>
-          <w:lang w:val="es-CO"/>
-        </w:rPr>
-        <w:t xml:space="preserve"> con nombres por defecto de Pandas tipo ‘</w:t>
-      </w:r>
-      <w:proofErr w:type="spellStart"/>
-      <w:r>
-        <w:rPr>
-          <w:rFonts w:ascii="Arial" w:hAnsi="Arial" w:cs="Arial"/>
-          <w:lang w:val="es-CO"/>
-        </w:rPr>
-        <w:t>Unnamed</w:t>
-      </w:r>
-      <w:proofErr w:type="spellEnd"/>
-      <w:r>
-        <w:rPr>
-          <w:rFonts w:ascii="Arial" w:hAnsi="Arial" w:cs="Arial"/>
-          <w:lang w:val="es-CO"/>
-        </w:rPr>
-        <w:t>: X’.</w:t>
+      <w:r>
+        <w:rPr>
+          <w:rFonts w:ascii="Arial" w:hAnsi="Arial" w:cs="Arial"/>
+          <w:lang w:val="es-CO"/>
+        </w:rPr>
+        <w:t>Headers sin nombres descriptivos: headers con nombres por defecto de Pandas tipo ‘Unnamed: X’.</w:t>
       </w:r>
     </w:p>
     <w:p>
@@ -683,21 +519,12 @@
           <w:lang w:val="es-CO"/>
         </w:rPr>
       </w:pPr>
-      <w:proofErr w:type="spellStart"/>
-      <w:r>
-        <w:rPr>
-          <w:rFonts w:ascii="Arial" w:hAnsi="Arial" w:cs="Arial"/>
-          <w:lang w:val="es-CO"/>
-        </w:rPr>
-        <w:t>Headers</w:t>
-      </w:r>
-      <w:proofErr w:type="spellEnd"/>
-      <w:r>
-        <w:rPr>
-          <w:rFonts w:ascii="Arial" w:hAnsi="Arial" w:cs="Arial"/>
-          <w:lang w:val="es-CO"/>
-        </w:rPr>
-        <w:t xml:space="preserve"> en jerarquías inferiores debido a la agrupación de datos: ‘Hombre’ y ‘Mujer’ se encuentran en la primera fila de datos debido al diseño del .xlsx donde se busca describir la agrupación por Sexo de los datos.</w:t>
+      <w:r>
+        <w:rPr>
+          <w:rFonts w:ascii="Arial" w:hAnsi="Arial" w:cs="Arial"/>
+          <w:lang w:val="es-CO"/>
+        </w:rPr>
+        <w:t>Headers en jerarquías inferiores debido a la agrupación de datos: ‘Hombre’ y ‘Mujer’ se encuentran en la primera fila de datos debido al diseño del .xlsx donde se busca describir la agrupación por Sexo de los datos.</w:t>
       </w:r>
     </w:p>
     <w:p>
@@ -717,39 +544,7 @@
           <w:rFonts w:ascii="Arial" w:hAnsi="Arial" w:cs="Arial"/>
           <w:lang w:val="es-CO"/>
         </w:rPr>
-        <w:t xml:space="preserve">Tildes: Se tienen </w:t>
-      </w:r>
-      <w:proofErr w:type="spellStart"/>
-      <w:r>
-        <w:rPr>
-          <w:rFonts w:ascii="Arial" w:hAnsi="Arial" w:cs="Arial"/>
-          <w:lang w:val="es-CO"/>
-        </w:rPr>
-        <w:t>headers</w:t>
-      </w:r>
-      <w:proofErr w:type="spellEnd"/>
-      <w:r>
-        <w:rPr>
-          <w:rFonts w:ascii="Arial" w:hAnsi="Arial" w:cs="Arial"/>
-          <w:lang w:val="es-CO"/>
-        </w:rPr>
-        <w:t xml:space="preserve"> con tildes como ‘Índice de masculinidad’ e ‘Índice de feminidad’, las tildes es mejor evitarlas para evitar errores de </w:t>
-      </w:r>
-      <w:proofErr w:type="spellStart"/>
-      <w:r>
-        <w:rPr>
-          <w:rFonts w:ascii="Arial" w:hAnsi="Arial" w:cs="Arial"/>
-          <w:lang w:val="es-CO"/>
-        </w:rPr>
-        <w:t>charset</w:t>
-      </w:r>
-      <w:proofErr w:type="spellEnd"/>
-      <w:r>
-        <w:rPr>
-          <w:rFonts w:ascii="Arial" w:hAnsi="Arial" w:cs="Arial"/>
-          <w:lang w:val="es-CO"/>
-        </w:rPr>
-        <w:t xml:space="preserve"> de las herramientas utilizadas.</w:t>
+        <w:t>Tildes: Se tienen headers con tildes como ‘Índice de masculinidad’ e ‘Índice de feminidad’, las tildes es mejor evitarlas para evitar errores de charset de las herramientas utilizadas.</w:t>
       </w:r>
     </w:p>
     <w:p>
@@ -843,32 +638,14 @@
           <w:lang w:val="es-CO"/>
         </w:rPr>
       </w:pPr>
-      <w:proofErr w:type="spellStart"/>
       <w:r>
         <w:rPr>
           <w:rFonts w:ascii="Arial" w:hAnsi="Arial" w:cs="Arial"/>
           <w:lang w:val="es-CO"/>
         </w:rPr>
         <w:lastRenderedPageBreak/>
-        <w:t>Unnamed</w:t>
-      </w:r>
-      <w:proofErr w:type="spellEnd"/>
-      <w:r>
-        <w:rPr>
-          <w:rFonts w:ascii="Arial" w:hAnsi="Arial" w:cs="Arial"/>
-          <w:lang w:val="es-CO"/>
-        </w:rPr>
-        <w:t xml:space="preserve">: 2: </w:t>
-      </w:r>
-      <w:proofErr w:type="spellStart"/>
-      <w:r>
-        <w:rPr>
-          <w:rFonts w:ascii="Arial" w:hAnsi="Arial" w:cs="Arial"/>
-          <w:lang w:val="es-CO"/>
-        </w:rPr>
-        <w:t>Area</w:t>
-      </w:r>
-      <w:proofErr w:type="spellEnd"/>
+        <w:t>Unnamed: 2: Area</w:t>
+      </w:r>
     </w:p>
     <w:p>
       <w:pPr>
@@ -882,21 +659,12 @@
           <w:lang w:val="es-CO"/>
         </w:rPr>
       </w:pPr>
-      <w:proofErr w:type="spellStart"/>
-      <w:r>
-        <w:rPr>
-          <w:rFonts w:ascii="Arial" w:hAnsi="Arial" w:cs="Arial"/>
-          <w:lang w:val="es-CO"/>
-        </w:rPr>
-        <w:t>Unnamed</w:t>
-      </w:r>
-      <w:proofErr w:type="spellEnd"/>
-      <w:r>
-        <w:rPr>
-          <w:rFonts w:ascii="Arial" w:hAnsi="Arial" w:cs="Arial"/>
-          <w:lang w:val="es-CO"/>
-        </w:rPr>
-        <w:t>: 3: Grupo de edad</w:t>
+      <w:r>
+        <w:rPr>
+          <w:rFonts w:ascii="Arial" w:hAnsi="Arial" w:cs="Arial"/>
+          <w:lang w:val="es-CO"/>
+        </w:rPr>
+        <w:t>Unnamed: 3: Grupo de edad</w:t>
       </w:r>
     </w:p>
     <w:p>
@@ -931,21 +699,12 @@
           <w:lang w:val="es-CO"/>
         </w:rPr>
       </w:pPr>
-      <w:proofErr w:type="spellStart"/>
-      <w:r>
-        <w:rPr>
-          <w:rFonts w:ascii="Arial" w:hAnsi="Arial" w:cs="Arial"/>
-          <w:lang w:val="es-CO"/>
-        </w:rPr>
-        <w:t>Unnamed</w:t>
-      </w:r>
-      <w:proofErr w:type="spellEnd"/>
-      <w:r>
-        <w:rPr>
-          <w:rFonts w:ascii="Arial" w:hAnsi="Arial" w:cs="Arial"/>
-          <w:lang w:val="es-CO"/>
-        </w:rPr>
-        <w:t xml:space="preserve"> 6: Mujer</w:t>
+      <w:r>
+        <w:rPr>
+          <w:rFonts w:ascii="Arial" w:hAnsi="Arial" w:cs="Arial"/>
+          <w:lang w:val="es-CO"/>
+        </w:rPr>
+        <w:t>Unnamed 6: Mujer</w:t>
       </w:r>
     </w:p>
     <w:p>
@@ -965,23 +724,7 @@
           <w:rFonts w:ascii="Arial" w:hAnsi="Arial" w:cs="Arial"/>
           <w:lang w:val="es-CO"/>
         </w:rPr>
-        <w:t xml:space="preserve">Índice de masculinidad: </w:t>
-      </w:r>
-      <w:proofErr w:type="spellStart"/>
-      <w:r>
-        <w:rPr>
-          <w:rFonts w:ascii="Arial" w:hAnsi="Arial" w:cs="Arial"/>
-          <w:lang w:val="es-CO"/>
-        </w:rPr>
-        <w:t>Indice</w:t>
-      </w:r>
-      <w:proofErr w:type="spellEnd"/>
-      <w:r>
-        <w:rPr>
-          <w:rFonts w:ascii="Arial" w:hAnsi="Arial" w:cs="Arial"/>
-          <w:lang w:val="es-CO"/>
-        </w:rPr>
-        <w:t xml:space="preserve"> de masculinidad</w:t>
+        <w:t>Índice de masculinidad: Indice de masculinidad</w:t>
       </w:r>
     </w:p>
     <w:p>
@@ -1001,23 +744,7 @@
           <w:rFonts w:ascii="Arial" w:hAnsi="Arial" w:cs="Arial"/>
           <w:lang w:val="es-CO"/>
         </w:rPr>
-        <w:t xml:space="preserve">Índice de feminidad: </w:t>
-      </w:r>
-      <w:proofErr w:type="spellStart"/>
-      <w:r>
-        <w:rPr>
-          <w:rFonts w:ascii="Arial" w:hAnsi="Arial" w:cs="Arial"/>
-          <w:lang w:val="es-CO"/>
-        </w:rPr>
-        <w:t>Indice</w:t>
-      </w:r>
-      <w:proofErr w:type="spellEnd"/>
-      <w:r>
-        <w:rPr>
-          <w:rFonts w:ascii="Arial" w:hAnsi="Arial" w:cs="Arial"/>
-          <w:lang w:val="es-CO"/>
-        </w:rPr>
-        <w:t xml:space="preserve"> de feminidad</w:t>
+        <w:t>Índice de feminidad: Indice de feminidad</w:t>
       </w:r>
     </w:p>
     <w:p>
@@ -1118,23 +845,7 @@
           <w:rFonts w:ascii="Arial" w:hAnsi="Arial" w:cs="Arial"/>
           <w:lang w:val="es-CO"/>
         </w:rPr>
-        <w:t xml:space="preserve">Se evidencian dos columnas sin datos o con datos irrelevantes para el </w:t>
-      </w:r>
-      <w:proofErr w:type="spellStart"/>
-      <w:r>
-        <w:rPr>
-          <w:rFonts w:ascii="Arial" w:hAnsi="Arial" w:cs="Arial"/>
-          <w:lang w:val="es-CO"/>
-        </w:rPr>
-        <w:t>dataset</w:t>
-      </w:r>
-      <w:proofErr w:type="spellEnd"/>
-      <w:r>
-        <w:rPr>
-          <w:rFonts w:ascii="Arial" w:hAnsi="Arial" w:cs="Arial"/>
-          <w:lang w:val="es-CO"/>
-        </w:rPr>
-        <w:t xml:space="preserve"> que pueden ser eliminadas:</w:t>
+        <w:t>Se evidencian dos columnas sin datos o con datos irrelevantes para el dataset que pueden ser eliminadas:</w:t>
       </w:r>
     </w:p>
     <w:p>
@@ -1176,21 +887,12 @@
           <w:lang w:val="es-CO"/>
         </w:rPr>
       </w:pPr>
-      <w:proofErr w:type="spellStart"/>
-      <w:r>
-        <w:rPr>
-          <w:rFonts w:ascii="Arial" w:hAnsi="Arial" w:cs="Arial"/>
-          <w:lang w:val="es-CO"/>
-        </w:rPr>
-        <w:t>Unnamed</w:t>
-      </w:r>
-      <w:proofErr w:type="spellEnd"/>
-      <w:r>
-        <w:rPr>
-          <w:rFonts w:ascii="Arial" w:hAnsi="Arial" w:cs="Arial"/>
-          <w:lang w:val="es-CO"/>
-        </w:rPr>
-        <w:t>: 1: Contiene el municipio, para este caso particular es irrelevante porque solo se tratarán datos del municipio de Viterbo, Caldas, pero se tendrá en cuenta para un futuro proyecto que involucre múltiples municipios al mismo tiempo.</w:t>
+      <w:r>
+        <w:rPr>
+          <w:rFonts w:ascii="Arial" w:hAnsi="Arial" w:cs="Arial"/>
+          <w:lang w:val="es-CO"/>
+        </w:rPr>
+        <w:t>Unnamed: 1: Contiene el municipio, para este caso particular es irrelevante porque solo se tratarán datos del municipio de Viterbo, Caldas, pero se tendrá en cuenta para un futuro proyecto que involucre múltiples municipios al mismo tiempo.</w:t>
       </w:r>
     </w:p>
     <w:p>
@@ -1324,95 +1026,22 @@
           <w:rFonts w:ascii="Arial" w:hAnsi="Arial" w:cs="Arial"/>
           <w:lang w:val="es-CO"/>
         </w:rPr>
-        <w:t xml:space="preserve">Tratamiento de valores Nulos, en blanco o </w:t>
-      </w:r>
-      <w:proofErr w:type="spellStart"/>
-      <w:r>
-        <w:rPr>
-          <w:rFonts w:ascii="Arial" w:hAnsi="Arial" w:cs="Arial"/>
-          <w:lang w:val="es-CO"/>
-        </w:rPr>
-        <w:t>NaN</w:t>
-      </w:r>
-      <w:proofErr w:type="spellEnd"/>
-    </w:p>
-    <w:p>
-      <w:pPr>
-        <w:rPr>
-          <w:rFonts w:ascii="Arial" w:hAnsi="Arial" w:cs="Arial"/>
-          <w:lang w:val="es-CO"/>
-        </w:rPr>
-      </w:pPr>
-      <w:r>
-        <w:rPr>
-          <w:rFonts w:ascii="Arial" w:hAnsi="Arial" w:cs="Arial"/>
-          <w:lang w:val="es-CO"/>
-        </w:rPr>
-        <w:t xml:space="preserve">La única columna con valores </w:t>
-      </w:r>
-      <w:proofErr w:type="spellStart"/>
-      <w:r>
-        <w:rPr>
-          <w:rFonts w:ascii="Arial" w:hAnsi="Arial" w:cs="Arial"/>
-          <w:lang w:val="es-CO"/>
-        </w:rPr>
-        <w:t>NaN</w:t>
-      </w:r>
-      <w:proofErr w:type="spellEnd"/>
-      <w:r>
-        <w:rPr>
-          <w:rFonts w:ascii="Arial" w:hAnsi="Arial" w:cs="Arial"/>
-          <w:lang w:val="es-CO"/>
-        </w:rPr>
-        <w:t xml:space="preserve"> es la columna ‘</w:t>
-      </w:r>
-      <w:proofErr w:type="spellStart"/>
-      <w:r>
-        <w:rPr>
-          <w:rFonts w:ascii="Arial" w:hAnsi="Arial" w:cs="Arial"/>
-          <w:lang w:val="es-CO"/>
-        </w:rPr>
-        <w:t>Area</w:t>
-      </w:r>
-      <w:proofErr w:type="spellEnd"/>
-      <w:r>
-        <w:rPr>
-          <w:rFonts w:ascii="Arial" w:hAnsi="Arial" w:cs="Arial"/>
-          <w:lang w:val="es-CO"/>
-        </w:rPr>
-        <w:t xml:space="preserve">’, la cual indica el área de recolección de datos en el municipio, Totales, cabecera municipal, centros poblados, zonas rurales dispersas, la presencia de valores </w:t>
-      </w:r>
-      <w:proofErr w:type="spellStart"/>
-      <w:r>
-        <w:rPr>
-          <w:rFonts w:ascii="Arial" w:hAnsi="Arial" w:cs="Arial"/>
-          <w:lang w:val="es-CO"/>
-        </w:rPr>
-        <w:t>NaN</w:t>
-      </w:r>
-      <w:proofErr w:type="spellEnd"/>
-      <w:r>
-        <w:rPr>
-          <w:rFonts w:ascii="Arial" w:hAnsi="Arial" w:cs="Arial"/>
-          <w:lang w:val="es-CO"/>
-        </w:rPr>
-        <w:t xml:space="preserve"> se debe a la agrupación realizada en el diseño del .xlsx, el enfoque para resolver esta inconsistencia será propagar el primer valor válido hasta el siguiente valor válido y repetir hasta reemplazar todos los valores </w:t>
-      </w:r>
-      <w:proofErr w:type="spellStart"/>
-      <w:r>
-        <w:rPr>
-          <w:rFonts w:ascii="Arial" w:hAnsi="Arial" w:cs="Arial"/>
-          <w:lang w:val="es-CO"/>
-        </w:rPr>
-        <w:t>NaN</w:t>
-      </w:r>
-      <w:proofErr w:type="spellEnd"/>
-      <w:r>
-        <w:rPr>
-          <w:rFonts w:ascii="Arial" w:hAnsi="Arial" w:cs="Arial"/>
-          <w:lang w:val="es-CO"/>
-        </w:rPr>
-        <w:t>.</w:t>
+        <w:t>Tratamiento de valores Nulos, en blanco o NaN</w:t>
+      </w:r>
+    </w:p>
+    <w:p>
+      <w:pPr>
+        <w:rPr>
+          <w:rFonts w:ascii="Arial" w:hAnsi="Arial" w:cs="Arial"/>
+          <w:lang w:val="es-CO"/>
+        </w:rPr>
+      </w:pPr>
+      <w:r>
+        <w:rPr>
+          <w:rFonts w:ascii="Arial" w:hAnsi="Arial" w:cs="Arial"/>
+          <w:lang w:val="es-CO"/>
+        </w:rPr>
+        <w:t>La única columna con valores NaN es la columna ‘Area’, la cual indica el área de recolección de datos en el municipio, Totales, cabecera municipal, centros poblados, zonas rurales dispersas, la presencia de valores NaN se debe a la agrupación realizada en el diseño del .xlsx, el enfoque para resolver esta inconsistencia será propagar el primer valor válido hasta el siguiente valor válido y repetir hasta reemplazar todos los valores NaN.</w:t>
       </w:r>
     </w:p>
     <w:p>
@@ -1734,23 +1363,7 @@
           <w:rFonts w:ascii="Arial" w:hAnsi="Arial" w:cs="Arial"/>
           <w:lang w:val="es-CO"/>
         </w:rPr>
-        <w:t xml:space="preserve">Se empieza por extraer solo la parte correspondiente a los datos del archivo </w:t>
-      </w:r>
-      <w:proofErr w:type="spellStart"/>
-      <w:r>
-        <w:rPr>
-          <w:rFonts w:ascii="Arial" w:hAnsi="Arial" w:cs="Arial"/>
-          <w:lang w:val="es-CO"/>
-        </w:rPr>
-        <w:t>excel</w:t>
-      </w:r>
-      <w:proofErr w:type="spellEnd"/>
-      <w:r>
-        <w:rPr>
-          <w:rFonts w:ascii="Arial" w:hAnsi="Arial" w:cs="Arial"/>
-          <w:lang w:val="es-CO"/>
-        </w:rPr>
-        <w:t>, para lo cual se ignoran las primeras 9 filas de la hoja</w:t>
+        <w:t>Se empieza por extraer solo la parte correspondiente a los datos del archivo excel, para lo cual se ignoran las primeras 9 filas de la hoja</w:t>
       </w:r>
     </w:p>
     <w:p>
@@ -2009,47 +1622,22 @@
           <w:rFonts w:ascii="Arial" w:hAnsi="Arial" w:cs="Arial"/>
           <w:lang w:val="es-CO"/>
         </w:rPr>
-        <w:t xml:space="preserve">Actualización de </w:t>
-      </w:r>
-      <w:proofErr w:type="spellStart"/>
-      <w:r>
-        <w:rPr>
-          <w:rFonts w:ascii="Arial" w:hAnsi="Arial" w:cs="Arial"/>
-          <w:lang w:val="es-CO"/>
-        </w:rPr>
-        <w:t>headers</w:t>
-      </w:r>
-      <w:proofErr w:type="spellEnd"/>
-    </w:p>
-    <w:p>
-      <w:pPr>
-        <w:rPr>
-          <w:rFonts w:ascii="Arial" w:hAnsi="Arial" w:cs="Arial"/>
-          <w:lang w:val="es-CO"/>
-        </w:rPr>
-      </w:pPr>
-      <w:r>
-        <w:rPr>
-          <w:rFonts w:ascii="Arial" w:hAnsi="Arial" w:cs="Arial"/>
-          <w:lang w:val="es-CO"/>
-        </w:rPr>
-        <w:t xml:space="preserve">Al extraer los datos desde el archivo .xlsx, se verifica el </w:t>
-      </w:r>
-      <w:proofErr w:type="spellStart"/>
-      <w:r>
-        <w:rPr>
-          <w:rFonts w:ascii="Arial" w:hAnsi="Arial" w:cs="Arial"/>
-          <w:lang w:val="es-CO"/>
-        </w:rPr>
-        <w:t>dataframe</w:t>
-      </w:r>
-      <w:proofErr w:type="spellEnd"/>
-      <w:r>
-        <w:rPr>
-          <w:rFonts w:ascii="Arial" w:hAnsi="Arial" w:cs="Arial"/>
-          <w:lang w:val="es-CO"/>
-        </w:rPr>
-        <w:t xml:space="preserve"> generado por Pandas, empezando por los nombres de las columnas y se observan las siguientes incidencias:</w:t>
+        <w:t>Actualización de headers</w:t>
+      </w:r>
+    </w:p>
+    <w:p>
+      <w:pPr>
+        <w:rPr>
+          <w:rFonts w:ascii="Arial" w:hAnsi="Arial" w:cs="Arial"/>
+          <w:lang w:val="es-CO"/>
+        </w:rPr>
+      </w:pPr>
+      <w:r>
+        <w:rPr>
+          <w:rFonts w:ascii="Arial" w:hAnsi="Arial" w:cs="Arial"/>
+          <w:lang w:val="es-CO"/>
+        </w:rPr>
+        <w:t>Al extraer los datos desde el archivo .xlsx, se verifica el dataframe generado por Pandas, empezando por los nombres de las columnas y se observan las siguientes incidencias:</w:t>
       </w:r>
     </w:p>
     <w:p>
@@ -2064,53 +1652,12 @@
           <w:lang w:val="es-CO"/>
         </w:rPr>
       </w:pPr>
-      <w:proofErr w:type="spellStart"/>
-      <w:r>
-        <w:rPr>
-          <w:rFonts w:ascii="Arial" w:hAnsi="Arial" w:cs="Arial"/>
-          <w:lang w:val="es-CO"/>
-        </w:rPr>
-        <w:t>Headers</w:t>
-      </w:r>
-      <w:proofErr w:type="spellEnd"/>
-      <w:r>
-        <w:rPr>
-          <w:rFonts w:ascii="Arial" w:hAnsi="Arial" w:cs="Arial"/>
-          <w:lang w:val="es-CO"/>
-        </w:rPr>
-        <w:t xml:space="preserve"> sin nombres descriptivos: </w:t>
-      </w:r>
-      <w:proofErr w:type="spellStart"/>
-      <w:r>
-        <w:rPr>
-          <w:rFonts w:ascii="Arial" w:hAnsi="Arial" w:cs="Arial"/>
-          <w:lang w:val="es-CO"/>
-        </w:rPr>
-        <w:t>headers</w:t>
-      </w:r>
-      <w:proofErr w:type="spellEnd"/>
-      <w:r>
-        <w:rPr>
-          <w:rFonts w:ascii="Arial" w:hAnsi="Arial" w:cs="Arial"/>
-          <w:lang w:val="es-CO"/>
-        </w:rPr>
-        <w:t xml:space="preserve"> con nombres por defecto de Pandas tipo ‘</w:t>
-      </w:r>
-      <w:proofErr w:type="spellStart"/>
-      <w:r>
-        <w:rPr>
-          <w:rFonts w:ascii="Arial" w:hAnsi="Arial" w:cs="Arial"/>
-          <w:lang w:val="es-CO"/>
-        </w:rPr>
-        <w:t>Unnamed</w:t>
-      </w:r>
-      <w:proofErr w:type="spellEnd"/>
-      <w:r>
-        <w:rPr>
-          <w:rFonts w:ascii="Arial" w:hAnsi="Arial" w:cs="Arial"/>
-          <w:lang w:val="es-CO"/>
-        </w:rPr>
-        <w:t>: X’.</w:t>
+      <w:r>
+        <w:rPr>
+          <w:rFonts w:ascii="Arial" w:hAnsi="Arial" w:cs="Arial"/>
+          <w:lang w:val="es-CO"/>
+        </w:rPr>
+        <w:t>Headers sin nombres descriptivos: headers con nombres por defecto de Pandas tipo ‘Unnamed: X’.</w:t>
       </w:r>
     </w:p>
     <w:p>
@@ -2125,68 +1672,27 @@
           <w:lang w:val="es-CO"/>
         </w:rPr>
       </w:pPr>
-      <w:proofErr w:type="spellStart"/>
-      <w:r>
-        <w:rPr>
-          <w:rFonts w:ascii="Arial" w:hAnsi="Arial" w:cs="Arial"/>
-          <w:lang w:val="es-CO"/>
-        </w:rPr>
-        <w:t>Headers</w:t>
-      </w:r>
-      <w:proofErr w:type="spellEnd"/>
-      <w:r>
-        <w:rPr>
-          <w:rFonts w:ascii="Arial" w:hAnsi="Arial" w:cs="Arial"/>
-          <w:lang w:val="es-CO"/>
-        </w:rPr>
-        <w:t xml:space="preserve"> en jerarquías inferiores debido a la agrupación de datos: ‘Hombre’ y ‘Mujer’ se encuentran en la primera fila de datos debido al diseño del .xlsx donde se busca describir la agrupación por Sexo de los datos.</w:t>
-      </w:r>
-    </w:p>
-    <w:p>
-      <w:pPr>
-        <w:rPr>
-          <w:rFonts w:ascii="Arial" w:hAnsi="Arial" w:cs="Arial"/>
-          <w:lang w:val="es-CO"/>
-        </w:rPr>
-      </w:pPr>
-      <w:r>
-        <w:rPr>
-          <w:rFonts w:ascii="Arial" w:hAnsi="Arial" w:cs="Arial"/>
-          <w:lang w:val="es-CO"/>
-        </w:rPr>
-        <w:t xml:space="preserve">Debido a la agrupación de datos en las columnas, se divide el </w:t>
-      </w:r>
-      <w:proofErr w:type="spellStart"/>
-      <w:r>
-        <w:rPr>
-          <w:rFonts w:ascii="Arial" w:hAnsi="Arial" w:cs="Arial"/>
-          <w:lang w:val="es-CO"/>
-        </w:rPr>
-        <w:t>dataframe</w:t>
-      </w:r>
-      <w:proofErr w:type="spellEnd"/>
-      <w:r>
-        <w:rPr>
-          <w:rFonts w:ascii="Arial" w:hAnsi="Arial" w:cs="Arial"/>
-          <w:lang w:val="es-CO"/>
-        </w:rPr>
-        <w:t xml:space="preserve"> en 3 partes, correspondientes a las áreas, ignorando el total para remover resúmenes de datos en el </w:t>
-      </w:r>
-      <w:proofErr w:type="spellStart"/>
-      <w:r>
-        <w:rPr>
-          <w:rFonts w:ascii="Arial" w:hAnsi="Arial" w:cs="Arial"/>
-          <w:lang w:val="es-CO"/>
-        </w:rPr>
-        <w:t>dataset</w:t>
-      </w:r>
-      <w:proofErr w:type="spellEnd"/>
-      <w:r>
-        <w:rPr>
-          <w:rFonts w:ascii="Arial" w:hAnsi="Arial" w:cs="Arial"/>
-          <w:lang w:val="es-CO"/>
-        </w:rPr>
-        <w:t xml:space="preserve"> final. Luego de dividirlos, se reemplazan los nombres de las columnas de la siguiente manera:</w:t>
+      <w:r>
+        <w:rPr>
+          <w:rFonts w:ascii="Arial" w:hAnsi="Arial" w:cs="Arial"/>
+          <w:lang w:val="es-CO"/>
+        </w:rPr>
+        <w:t>Headers en jerarquías inferiores debido a la agrupación de datos: ‘Hombre’ y ‘Mujer’ se encuentran en la primera fila de datos debido al diseño del .xlsx donde se busca describir la agrupación por Sexo de los datos.</w:t>
+      </w:r>
+    </w:p>
+    <w:p>
+      <w:pPr>
+        <w:rPr>
+          <w:rFonts w:ascii="Arial" w:hAnsi="Arial" w:cs="Arial"/>
+          <w:lang w:val="es-CO"/>
+        </w:rPr>
+      </w:pPr>
+      <w:r>
+        <w:rPr>
+          <w:rFonts w:ascii="Arial" w:hAnsi="Arial" w:cs="Arial"/>
+          <w:lang w:val="es-CO"/>
+        </w:rPr>
+        <w:t>Debido a la agrupación de datos en las columnas, se divide el dataframe en 3 partes, correspondientes a las áreas, ignorando el total para remover resúmenes de datos en el dataset final. Luego de dividirlos, se reemplazan los nombres de las columnas de la siguiente manera:</w:t>
       </w:r>
     </w:p>
     <w:p>
@@ -2201,21 +1707,12 @@
           <w:lang w:val="es-CO"/>
         </w:rPr>
       </w:pPr>
-      <w:proofErr w:type="spellStart"/>
-      <w:r>
-        <w:rPr>
-          <w:rFonts w:ascii="Arial" w:hAnsi="Arial" w:cs="Arial"/>
-          <w:lang w:val="es-CO"/>
-        </w:rPr>
-        <w:t>Unnamed</w:t>
-      </w:r>
-      <w:proofErr w:type="spellEnd"/>
-      <w:r>
-        <w:rPr>
-          <w:rFonts w:ascii="Arial" w:hAnsi="Arial" w:cs="Arial"/>
-          <w:lang w:val="es-CO"/>
-        </w:rPr>
-        <w:t>: 3: Edad</w:t>
+      <w:r>
+        <w:rPr>
+          <w:rFonts w:ascii="Arial" w:hAnsi="Arial" w:cs="Arial"/>
+          <w:lang w:val="es-CO"/>
+        </w:rPr>
+        <w:t>Unnamed: 3: Edad</w:t>
       </w:r>
     </w:p>
     <w:p>
@@ -2230,21 +1727,12 @@
           <w:lang w:val="es-CO"/>
         </w:rPr>
       </w:pPr>
-      <w:proofErr w:type="spellStart"/>
-      <w:r>
-        <w:rPr>
-          <w:rFonts w:ascii="Arial" w:hAnsi="Arial" w:cs="Arial"/>
-          <w:lang w:val="es-CO"/>
-        </w:rPr>
-        <w:t>Unnamed</w:t>
-      </w:r>
-      <w:proofErr w:type="spellEnd"/>
-      <w:r>
-        <w:rPr>
-          <w:rFonts w:ascii="Arial" w:hAnsi="Arial" w:cs="Arial"/>
-          <w:lang w:val="es-CO"/>
-        </w:rPr>
-        <w:t>: 8: Hombre</w:t>
+      <w:r>
+        <w:rPr>
+          <w:rFonts w:ascii="Arial" w:hAnsi="Arial" w:cs="Arial"/>
+          <w:lang w:val="es-CO"/>
+        </w:rPr>
+        <w:t>Unnamed: 8: Hombre</w:t>
       </w:r>
     </w:p>
     <w:p>
@@ -2259,21 +1747,12 @@
           <w:lang w:val="es-CO"/>
         </w:rPr>
       </w:pPr>
-      <w:proofErr w:type="spellStart"/>
-      <w:r>
-        <w:rPr>
-          <w:rFonts w:ascii="Arial" w:hAnsi="Arial" w:cs="Arial"/>
-          <w:lang w:val="es-CO"/>
-        </w:rPr>
-        <w:t>Unnamed</w:t>
-      </w:r>
-      <w:proofErr w:type="spellEnd"/>
-      <w:r>
-        <w:rPr>
-          <w:rFonts w:ascii="Arial" w:hAnsi="Arial" w:cs="Arial"/>
-          <w:lang w:val="es-CO"/>
-        </w:rPr>
-        <w:t>: 9: Mujer</w:t>
+      <w:r>
+        <w:rPr>
+          <w:rFonts w:ascii="Arial" w:hAnsi="Arial" w:cs="Arial"/>
+          <w:lang w:val="es-CO"/>
+        </w:rPr>
+        <w:t>Unnamed: 9: Mujer</w:t>
       </w:r>
     </w:p>
     <w:p>
@@ -2288,22 +1767,13 @@
           <w:lang w:val="es-CO"/>
         </w:rPr>
       </w:pPr>
-      <w:proofErr w:type="spellStart"/>
       <w:r>
         <w:rPr>
           <w:rFonts w:ascii="Arial" w:hAnsi="Arial" w:cs="Arial"/>
           <w:lang w:val="es-CO"/>
         </w:rPr>
         <w:lastRenderedPageBreak/>
-        <w:t>Unnamed</w:t>
-      </w:r>
-      <w:proofErr w:type="spellEnd"/>
-      <w:r>
-        <w:rPr>
-          <w:rFonts w:ascii="Arial" w:hAnsi="Arial" w:cs="Arial"/>
-          <w:lang w:val="es-CO"/>
-        </w:rPr>
-        <w:t>: 11: Hombre</w:t>
+        <w:t>Unnamed: 11: Hombre</w:t>
       </w:r>
     </w:p>
     <w:p>
@@ -2318,21 +1788,12 @@
           <w:lang w:val="es-CO"/>
         </w:rPr>
       </w:pPr>
-      <w:proofErr w:type="spellStart"/>
-      <w:r>
-        <w:rPr>
-          <w:rFonts w:ascii="Arial" w:hAnsi="Arial" w:cs="Arial"/>
-          <w:lang w:val="es-CO"/>
-        </w:rPr>
-        <w:t>Unnamed</w:t>
-      </w:r>
-      <w:proofErr w:type="spellEnd"/>
-      <w:r>
-        <w:rPr>
-          <w:rFonts w:ascii="Arial" w:hAnsi="Arial" w:cs="Arial"/>
-          <w:lang w:val="es-CO"/>
-        </w:rPr>
-        <w:t>: 12: Mujer</w:t>
+      <w:r>
+        <w:rPr>
+          <w:rFonts w:ascii="Arial" w:hAnsi="Arial" w:cs="Arial"/>
+          <w:lang w:val="es-CO"/>
+        </w:rPr>
+        <w:t>Unnamed: 12: Mujer</w:t>
       </w:r>
     </w:p>
     <w:p>
@@ -2347,21 +1808,12 @@
           <w:lang w:val="es-CO"/>
         </w:rPr>
       </w:pPr>
-      <w:proofErr w:type="spellStart"/>
-      <w:r>
-        <w:rPr>
-          <w:rFonts w:ascii="Arial" w:hAnsi="Arial" w:cs="Arial"/>
-          <w:lang w:val="es-CO"/>
-        </w:rPr>
-        <w:t>Unnamed</w:t>
-      </w:r>
-      <w:proofErr w:type="spellEnd"/>
-      <w:r>
-        <w:rPr>
-          <w:rFonts w:ascii="Arial" w:hAnsi="Arial" w:cs="Arial"/>
-          <w:lang w:val="es-CO"/>
-        </w:rPr>
-        <w:t>: 14: Hombre</w:t>
+      <w:r>
+        <w:rPr>
+          <w:rFonts w:ascii="Arial" w:hAnsi="Arial" w:cs="Arial"/>
+          <w:lang w:val="es-CO"/>
+        </w:rPr>
+        <w:t>Unnamed: 14: Hombre</w:t>
       </w:r>
     </w:p>
     <w:p>
@@ -2376,62 +1828,28 @@
           <w:lang w:val="es-CO"/>
         </w:rPr>
       </w:pPr>
-      <w:proofErr w:type="spellStart"/>
-      <w:r>
-        <w:rPr>
-          <w:rFonts w:ascii="Arial" w:hAnsi="Arial" w:cs="Arial"/>
-          <w:lang w:val="es-CO"/>
-        </w:rPr>
-        <w:t>Unnamed</w:t>
-      </w:r>
-      <w:proofErr w:type="spellEnd"/>
-      <w:r>
-        <w:rPr>
-          <w:rFonts w:ascii="Arial" w:hAnsi="Arial" w:cs="Arial"/>
-          <w:lang w:val="es-CO"/>
-        </w:rPr>
-        <w:t>: 15: Mujer</w:t>
-      </w:r>
-    </w:p>
-    <w:p>
-      <w:pPr>
-        <w:rPr>
-          <w:rFonts w:ascii="Arial" w:hAnsi="Arial" w:cs="Arial"/>
-          <w:lang w:val="es-CO"/>
-        </w:rPr>
-      </w:pPr>
-      <w:r>
-        <w:rPr>
-          <w:rFonts w:ascii="Arial" w:hAnsi="Arial" w:cs="Arial"/>
-          <w:lang w:val="es-CO"/>
-        </w:rPr>
-        <w:t>Para identificar el área, se crea una nueva columna ‘</w:t>
-      </w:r>
-      <w:proofErr w:type="spellStart"/>
-      <w:r>
-        <w:rPr>
-          <w:rFonts w:ascii="Arial" w:hAnsi="Arial" w:cs="Arial"/>
-          <w:lang w:val="es-CO"/>
-        </w:rPr>
-        <w:t>Area</w:t>
-      </w:r>
-      <w:proofErr w:type="spellEnd"/>
-      <w:r>
-        <w:rPr>
-          <w:rFonts w:ascii="Arial" w:hAnsi="Arial" w:cs="Arial"/>
-          <w:lang w:val="es-CO"/>
-        </w:rPr>
-        <w:t xml:space="preserve">’ indicando el área de análisis (cabecera, centro poblado, rural disperso), en cada subconjunto, y se unen los subconjuntos como un solo </w:t>
-      </w:r>
-      <w:proofErr w:type="spellStart"/>
-      <w:r>
-        <w:rPr>
-          <w:rFonts w:ascii="Arial" w:hAnsi="Arial" w:cs="Arial"/>
-          <w:lang w:val="es-CO"/>
-        </w:rPr>
-        <w:t>dataframe</w:t>
-      </w:r>
-      <w:proofErr w:type="spellEnd"/>
+      <w:r>
+        <w:rPr>
+          <w:rFonts w:ascii="Arial" w:hAnsi="Arial" w:cs="Arial"/>
+          <w:lang w:val="es-CO"/>
+        </w:rPr>
+        <w:t>Unnamed: 15: Mujer</w:t>
+      </w:r>
+    </w:p>
+    <w:p>
+      <w:pPr>
+        <w:rPr>
+          <w:rFonts w:ascii="Arial" w:hAnsi="Arial" w:cs="Arial"/>
+          <w:lang w:val="es-CO"/>
+        </w:rPr>
+      </w:pPr>
+      <w:r>
+        <w:rPr>
+          <w:rFonts w:ascii="Arial" w:hAnsi="Arial" w:cs="Arial"/>
+          <w:lang w:val="es-CO"/>
+        </w:rPr>
+        <w:t>Para identificar el área, se crea una nueva columna ‘Area’ indicando el área de análisis (cabecera, centro poblado, rural disperso), en cada subconjunto, y se unen los subconjuntos como un solo dataframe</w:t>
+      </w:r>
       <w:r>
         <w:rPr>
           <w:rFonts w:ascii="Arial" w:hAnsi="Arial" w:cs="Arial"/>
@@ -2626,23 +2044,7 @@
           <w:rFonts w:ascii="Arial" w:hAnsi="Arial" w:cs="Arial"/>
           <w:lang w:val="es-CO"/>
         </w:rPr>
-        <w:t xml:space="preserve">Se empieza por extraer solo la parte correspondiente a los datos del archivo </w:t>
-      </w:r>
-      <w:proofErr w:type="spellStart"/>
-      <w:r>
-        <w:rPr>
-          <w:rFonts w:ascii="Arial" w:hAnsi="Arial" w:cs="Arial"/>
-          <w:lang w:val="es-CO"/>
-        </w:rPr>
-        <w:t>excel</w:t>
-      </w:r>
-      <w:proofErr w:type="spellEnd"/>
-      <w:r>
-        <w:rPr>
-          <w:rFonts w:ascii="Arial" w:hAnsi="Arial" w:cs="Arial"/>
-          <w:lang w:val="es-CO"/>
-        </w:rPr>
-        <w:t>, para lo cual se ignoran las primeras 9 filas de la hoja</w:t>
+        <w:t>Se empieza por extraer solo la parte correspondiente a los datos del archivo excel, para lo cual se ignoran las primeras 9 filas de la hoja</w:t>
       </w:r>
       <w:r>
         <w:rPr>
@@ -2728,47 +2130,22 @@
           <w:rFonts w:ascii="Arial" w:hAnsi="Arial" w:cs="Arial"/>
           <w:lang w:val="es-CO"/>
         </w:rPr>
-        <w:t xml:space="preserve">Actualización de </w:t>
-      </w:r>
-      <w:proofErr w:type="spellStart"/>
-      <w:r>
-        <w:rPr>
-          <w:rFonts w:ascii="Arial" w:hAnsi="Arial" w:cs="Arial"/>
-          <w:lang w:val="es-CO"/>
-        </w:rPr>
-        <w:t>headers</w:t>
-      </w:r>
-      <w:proofErr w:type="spellEnd"/>
-    </w:p>
-    <w:p>
-      <w:pPr>
-        <w:rPr>
-          <w:rFonts w:ascii="Arial" w:hAnsi="Arial" w:cs="Arial"/>
-          <w:lang w:val="es-CO"/>
-        </w:rPr>
-      </w:pPr>
-      <w:r>
-        <w:rPr>
-          <w:rFonts w:ascii="Arial" w:hAnsi="Arial" w:cs="Arial"/>
-          <w:lang w:val="es-CO"/>
-        </w:rPr>
-        <w:t xml:space="preserve">Al extraer los datos desde el archivo .xlsx, se verifica el </w:t>
-      </w:r>
-      <w:proofErr w:type="spellStart"/>
-      <w:r>
-        <w:rPr>
-          <w:rFonts w:ascii="Arial" w:hAnsi="Arial" w:cs="Arial"/>
-          <w:lang w:val="es-CO"/>
-        </w:rPr>
-        <w:t>dataframe</w:t>
-      </w:r>
-      <w:proofErr w:type="spellEnd"/>
-      <w:r>
-        <w:rPr>
-          <w:rFonts w:ascii="Arial" w:hAnsi="Arial" w:cs="Arial"/>
-          <w:lang w:val="es-CO"/>
-        </w:rPr>
-        <w:t xml:space="preserve"> generado por Pandas, empezando por los nombres de las columnas y se observan las siguientes incidencias:</w:t>
+        <w:t>Actualización de headers</w:t>
+      </w:r>
+    </w:p>
+    <w:p>
+      <w:pPr>
+        <w:rPr>
+          <w:rFonts w:ascii="Arial" w:hAnsi="Arial" w:cs="Arial"/>
+          <w:lang w:val="es-CO"/>
+        </w:rPr>
+      </w:pPr>
+      <w:r>
+        <w:rPr>
+          <w:rFonts w:ascii="Arial" w:hAnsi="Arial" w:cs="Arial"/>
+          <w:lang w:val="es-CO"/>
+        </w:rPr>
+        <w:t>Al extraer los datos desde el archivo .xlsx, se verifica el dataframe generado por Pandas, empezando por los nombres de las columnas y se observan las siguientes incidencias:</w:t>
       </w:r>
     </w:p>
     <w:p>
@@ -2783,53 +2160,12 @@
           <w:lang w:val="es-CO"/>
         </w:rPr>
       </w:pPr>
-      <w:proofErr w:type="spellStart"/>
-      <w:r>
-        <w:rPr>
-          <w:rFonts w:ascii="Arial" w:hAnsi="Arial" w:cs="Arial"/>
-          <w:lang w:val="es-CO"/>
-        </w:rPr>
-        <w:t>Headers</w:t>
-      </w:r>
-      <w:proofErr w:type="spellEnd"/>
-      <w:r>
-        <w:rPr>
-          <w:rFonts w:ascii="Arial" w:hAnsi="Arial" w:cs="Arial"/>
-          <w:lang w:val="es-CO"/>
-        </w:rPr>
-        <w:t xml:space="preserve"> sin nombres descriptivos: </w:t>
-      </w:r>
-      <w:proofErr w:type="spellStart"/>
-      <w:r>
-        <w:rPr>
-          <w:rFonts w:ascii="Arial" w:hAnsi="Arial" w:cs="Arial"/>
-          <w:lang w:val="es-CO"/>
-        </w:rPr>
-        <w:t>headers</w:t>
-      </w:r>
-      <w:proofErr w:type="spellEnd"/>
-      <w:r>
-        <w:rPr>
-          <w:rFonts w:ascii="Arial" w:hAnsi="Arial" w:cs="Arial"/>
-          <w:lang w:val="es-CO"/>
-        </w:rPr>
-        <w:t xml:space="preserve"> con nombres por defecto de Pandas tipo ‘</w:t>
-      </w:r>
-      <w:proofErr w:type="spellStart"/>
-      <w:r>
-        <w:rPr>
-          <w:rFonts w:ascii="Arial" w:hAnsi="Arial" w:cs="Arial"/>
-          <w:lang w:val="es-CO"/>
-        </w:rPr>
-        <w:t>Unnamed</w:t>
-      </w:r>
-      <w:proofErr w:type="spellEnd"/>
-      <w:r>
-        <w:rPr>
-          <w:rFonts w:ascii="Arial" w:hAnsi="Arial" w:cs="Arial"/>
-          <w:lang w:val="es-CO"/>
-        </w:rPr>
-        <w:t>: X’.</w:t>
+      <w:r>
+        <w:rPr>
+          <w:rFonts w:ascii="Arial" w:hAnsi="Arial" w:cs="Arial"/>
+          <w:lang w:val="es-CO"/>
+        </w:rPr>
+        <w:t>Headers sin nombres descriptivos: headers con nombres por defecto de Pandas tipo ‘Unnamed: X’.</w:t>
       </w:r>
     </w:p>
     <w:p>
@@ -2844,106 +2180,28 @@
           <w:lang w:val="es-CO"/>
         </w:rPr>
       </w:pPr>
-      <w:proofErr w:type="spellStart"/>
       <w:r>
         <w:rPr>
           <w:rFonts w:ascii="Arial" w:hAnsi="Arial" w:cs="Arial"/>
           <w:lang w:val="es-CO"/>
         </w:rPr>
         <w:lastRenderedPageBreak/>
-        <w:t>Headers</w:t>
-      </w:r>
-      <w:proofErr w:type="spellEnd"/>
-      <w:r>
-        <w:rPr>
-          <w:rFonts w:ascii="Arial" w:hAnsi="Arial" w:cs="Arial"/>
-          <w:lang w:val="es-CO"/>
-        </w:rPr>
-        <w:t xml:space="preserve"> en jerarquías inferiores debido a la agrupación de datos: </w:t>
-      </w:r>
-      <w:r>
-        <w:rPr>
-          <w:rFonts w:ascii="Arial" w:hAnsi="Arial" w:cs="Arial"/>
-          <w:lang w:val="es-CO"/>
-        </w:rPr>
-        <w:t xml:space="preserve">Todos los </w:t>
-      </w:r>
-      <w:proofErr w:type="spellStart"/>
-      <w:r>
-        <w:rPr>
-          <w:rFonts w:ascii="Arial" w:hAnsi="Arial" w:cs="Arial"/>
-          <w:lang w:val="es-CO"/>
-        </w:rPr>
-        <w:t>headers</w:t>
-      </w:r>
-      <w:proofErr w:type="spellEnd"/>
-      <w:r>
-        <w:rPr>
-          <w:rFonts w:ascii="Arial" w:hAnsi="Arial" w:cs="Arial"/>
-          <w:lang w:val="es-CO"/>
-        </w:rPr>
-        <w:t xml:space="preserve"> se encuentran en la primera fila de los datos</w:t>
-      </w:r>
-      <w:r>
-        <w:rPr>
-          <w:rFonts w:ascii="Arial" w:hAnsi="Arial" w:cs="Arial"/>
-          <w:lang w:val="es-CO"/>
-        </w:rPr>
-        <w:t xml:space="preserve"> debido al diseño del .xlsx donde se busca describir la agrupación por</w:t>
-      </w:r>
-      <w:r>
-        <w:rPr>
-          <w:rFonts w:ascii="Arial" w:hAnsi="Arial" w:cs="Arial"/>
-          <w:lang w:val="es-CO"/>
-        </w:rPr>
-        <w:t xml:space="preserve"> Relación o parentesco con el jefe(a) del hogar.</w:t>
-      </w:r>
-    </w:p>
-    <w:p>
-      <w:pPr>
-        <w:rPr>
-          <w:rFonts w:ascii="Arial" w:hAnsi="Arial" w:cs="Arial"/>
-          <w:lang w:val="es-CO"/>
-        </w:rPr>
-      </w:pPr>
-      <w:r>
-        <w:rPr>
-          <w:rFonts w:ascii="Arial" w:hAnsi="Arial" w:cs="Arial"/>
-          <w:lang w:val="es-CO"/>
-        </w:rPr>
-        <w:t xml:space="preserve">Para solucionar esto, se reemplazan los </w:t>
-      </w:r>
-      <w:proofErr w:type="spellStart"/>
-      <w:r>
-        <w:rPr>
-          <w:rFonts w:ascii="Arial" w:hAnsi="Arial" w:cs="Arial"/>
-          <w:lang w:val="es-CO"/>
-        </w:rPr>
-        <w:t>headers</w:t>
-      </w:r>
-      <w:proofErr w:type="spellEnd"/>
-      <w:r>
-        <w:rPr>
-          <w:rFonts w:ascii="Arial" w:hAnsi="Arial" w:cs="Arial"/>
-          <w:lang w:val="es-CO"/>
-        </w:rPr>
-        <w:t xml:space="preserve"> actuales desde ‘Relación o parentesco con el </w:t>
-      </w:r>
-      <w:proofErr w:type="spellStart"/>
-      <w:r>
-        <w:rPr>
-          <w:rFonts w:ascii="Arial" w:hAnsi="Arial" w:cs="Arial"/>
-          <w:lang w:val="es-CO"/>
-        </w:rPr>
-        <w:t>jef</w:t>
-      </w:r>
-      <w:proofErr w:type="spellEnd"/>
-      <w:r>
-        <w:rPr>
-          <w:rFonts w:ascii="Arial" w:hAnsi="Arial" w:cs="Arial"/>
-          <w:lang w:val="es-CO"/>
-        </w:rPr>
-        <w:t>(a) del hogar’ hasta el último, por los valores correspondientes en la primera fila de datos.</w:t>
+        <w:t>Headers en jerarquías inferiores debido a la agrupación de datos: Todos los headers se encuentran en la primera fila de los datos debido al diseño del .xlsx donde se busca describir la agrupación por Relación o parentesco con el jefe(a) del hogar.</w:t>
+      </w:r>
+    </w:p>
+    <w:p>
+      <w:pPr>
+        <w:rPr>
+          <w:rFonts w:ascii="Arial" w:hAnsi="Arial" w:cs="Arial"/>
+          <w:lang w:val="es-CO"/>
+        </w:rPr>
+      </w:pPr>
+      <w:r>
+        <w:rPr>
+          <w:rFonts w:ascii="Arial" w:hAnsi="Arial" w:cs="Arial"/>
+          <w:lang w:val="es-CO"/>
+        </w:rPr>
+        <w:t>Para solucionar esto, se reemplazan los headers actuales desde ‘Relación o parentesco con el jef(a) del hogar’ hasta el último, por los valores correspondientes en la primera fila de datos.</w:t>
       </w:r>
     </w:p>
     <w:p>
@@ -3093,21 +2351,12 @@
           <w:lang w:val="es-CO"/>
         </w:rPr>
       </w:pPr>
-      <w:proofErr w:type="spellStart"/>
-      <w:r>
-        <w:rPr>
-          <w:rFonts w:ascii="Arial" w:hAnsi="Arial" w:cs="Arial"/>
-          <w:lang w:val="es-CO"/>
-        </w:rPr>
-        <w:t>Unnamed</w:t>
-      </w:r>
-      <w:proofErr w:type="spellEnd"/>
-      <w:r>
-        <w:rPr>
-          <w:rFonts w:ascii="Arial" w:hAnsi="Arial" w:cs="Arial"/>
-          <w:lang w:val="es-CO"/>
-        </w:rPr>
-        <w:t>: 1: Municipio</w:t>
+      <w:r>
+        <w:rPr>
+          <w:rFonts w:ascii="Arial" w:hAnsi="Arial" w:cs="Arial"/>
+          <w:lang w:val="es-CO"/>
+        </w:rPr>
+        <w:t>Unnamed: 1: Municipio</w:t>
       </w:r>
     </w:p>
     <w:p>
@@ -3122,31 +2371,13 @@
           <w:lang w:val="es-CO"/>
         </w:rPr>
       </w:pPr>
-      <w:proofErr w:type="spellStart"/>
-      <w:r>
-        <w:rPr>
-          <w:rFonts w:ascii="Arial" w:hAnsi="Arial" w:cs="Arial"/>
-          <w:lang w:val="es-CO"/>
-        </w:rPr>
-        <w:t>Unnamed</w:t>
-      </w:r>
-      <w:proofErr w:type="spellEnd"/>
-      <w:r>
-        <w:rPr>
-          <w:rFonts w:ascii="Arial" w:hAnsi="Arial" w:cs="Arial"/>
-          <w:lang w:val="es-CO"/>
-        </w:rPr>
-        <w:t xml:space="preserve">: 2: </w:t>
-      </w:r>
-      <w:proofErr w:type="spellStart"/>
-      <w:r>
-        <w:rPr>
-          <w:rFonts w:ascii="Arial" w:hAnsi="Arial" w:cs="Arial"/>
-          <w:lang w:val="es-CO"/>
-        </w:rPr>
-        <w:t>Area</w:t>
-      </w:r>
-      <w:proofErr w:type="spellEnd"/>
+      <w:r>
+        <w:rPr>
+          <w:rFonts w:ascii="Arial" w:hAnsi="Arial" w:cs="Arial"/>
+          <w:lang w:val="es-CO"/>
+        </w:rPr>
+        <w:t>Unnamed: 2: Area</w:t>
+      </w:r>
     </w:p>
     <w:p>
       <w:pPr>
@@ -3160,21 +2391,12 @@
           <w:lang w:val="es-CO"/>
         </w:rPr>
       </w:pPr>
-      <w:proofErr w:type="spellStart"/>
-      <w:r>
-        <w:rPr>
-          <w:rFonts w:ascii="Arial" w:hAnsi="Arial" w:cs="Arial"/>
-          <w:lang w:val="es-CO"/>
-        </w:rPr>
-        <w:t>Unnamed</w:t>
-      </w:r>
-      <w:proofErr w:type="spellEnd"/>
-      <w:r>
-        <w:rPr>
-          <w:rFonts w:ascii="Arial" w:hAnsi="Arial" w:cs="Arial"/>
-          <w:lang w:val="es-CO"/>
-        </w:rPr>
-        <w:t>: 3: Sexo</w:t>
+      <w:r>
+        <w:rPr>
+          <w:rFonts w:ascii="Arial" w:hAnsi="Arial" w:cs="Arial"/>
+          <w:lang w:val="es-CO"/>
+        </w:rPr>
+        <w:t>Unnamed: 3: Sexo</w:t>
       </w:r>
     </w:p>
     <w:p>
@@ -3214,6 +2436,14 @@
         </w:rPr>
         <w:t>Para esta hoja se decide propagar el valor del identificador del municipio, ‘17877_Viterbo’, y seleccionar solo los registros que lo contengan.</w:t>
       </w:r>
+    </w:p>
+    <w:p>
+      <w:pPr>
+        <w:rPr>
+          <w:rFonts w:ascii="Arial" w:hAnsi="Arial" w:cs="Arial"/>
+          <w:lang w:val="es-CO"/>
+        </w:rPr>
+      </w:pPr>
     </w:p>
     <w:p>
       <w:pPr>
@@ -3292,23 +2522,7 @@
           <w:rFonts w:ascii="Arial" w:hAnsi="Arial" w:cs="Arial"/>
           <w:lang w:val="es-CO"/>
         </w:rPr>
-        <w:t xml:space="preserve">Eliminación de columnas sin información relevante o con información redundante en el </w:t>
-      </w:r>
-      <w:proofErr w:type="spellStart"/>
-      <w:r>
-        <w:rPr>
-          <w:rFonts w:ascii="Arial" w:hAnsi="Arial" w:cs="Arial"/>
-          <w:lang w:val="es-CO"/>
-        </w:rPr>
-        <w:t>dataframe</w:t>
-      </w:r>
-      <w:proofErr w:type="spellEnd"/>
-      <w:r>
-        <w:rPr>
-          <w:rFonts w:ascii="Arial" w:hAnsi="Arial" w:cs="Arial"/>
-          <w:lang w:val="es-CO"/>
-        </w:rPr>
-        <w:t>.</w:t>
+        <w:t>Eliminación de columnas sin información relevante o con información redundante en el dataframe.</w:t>
       </w:r>
     </w:p>
     <w:p>
@@ -3509,39 +2723,7 @@
           <w:rFonts w:ascii="Arial" w:hAnsi="Arial" w:cs="Arial"/>
           <w:lang w:val="es-CO"/>
         </w:rPr>
-        <w:t>Se propaga el valor de la columna ‘</w:t>
-      </w:r>
-      <w:proofErr w:type="spellStart"/>
-      <w:r>
-        <w:rPr>
-          <w:rFonts w:ascii="Arial" w:hAnsi="Arial" w:cs="Arial"/>
-          <w:lang w:val="es-CO"/>
-        </w:rPr>
-        <w:t>Area</w:t>
-      </w:r>
-      <w:proofErr w:type="spellEnd"/>
-      <w:r>
-        <w:rPr>
-          <w:rFonts w:ascii="Arial" w:hAnsi="Arial" w:cs="Arial"/>
-          <w:lang w:val="es-CO"/>
-        </w:rPr>
-        <w:t xml:space="preserve">’ para reemplazar los valores </w:t>
-      </w:r>
-      <w:proofErr w:type="spellStart"/>
-      <w:r>
-        <w:rPr>
-          <w:rFonts w:ascii="Arial" w:hAnsi="Arial" w:cs="Arial"/>
-          <w:lang w:val="es-CO"/>
-        </w:rPr>
-        <w:t>NaN</w:t>
-      </w:r>
-      <w:proofErr w:type="spellEnd"/>
-      <w:r>
-        <w:rPr>
-          <w:rFonts w:ascii="Arial" w:hAnsi="Arial" w:cs="Arial"/>
-          <w:lang w:val="es-CO"/>
-        </w:rPr>
-        <w:t>.</w:t>
+        <w:t>Se propaga el valor de la columna ‘Area’ para reemplazar los valores NaN.</w:t>
       </w:r>
     </w:p>
     <w:p>
@@ -3679,6 +2861,931 @@
           </wp:inline>
         </w:drawing>
       </w:r>
+    </w:p>
+    <w:p>
+      <w:pPr>
+        <w:rPr>
+          <w:rFonts w:ascii="Arial" w:hAnsi="Arial" w:cs="Arial"/>
+          <w:lang w:val="es-CO"/>
+        </w:rPr>
+      </w:pPr>
+    </w:p>
+    <w:p>
+      <w:pPr>
+        <w:rPr>
+          <w:rFonts w:ascii="Arial" w:hAnsi="Arial" w:cs="Arial"/>
+          <w:lang w:val="es-CO"/>
+        </w:rPr>
+      </w:pPr>
+    </w:p>
+    <w:p>
+      <w:pPr>
+        <w:rPr>
+          <w:rFonts w:ascii="Arial" w:hAnsi="Arial" w:cs="Arial"/>
+          <w:b/>
+          <w:bCs/>
+          <w:lang w:val="es-CO"/>
+        </w:rPr>
+      </w:pPr>
+      <w:r>
+        <w:rPr>
+          <w:rFonts w:ascii="Arial" w:hAnsi="Arial" w:cs="Arial"/>
+          <w:b/>
+          <w:bCs/>
+          <w:lang w:val="es-CO"/>
+        </w:rPr>
+        <w:t>5.1PM</w:t>
+      </w:r>
+    </w:p>
+    <w:p>
+      <w:pPr>
+        <w:rPr>
+          <w:rFonts w:ascii="Arial" w:hAnsi="Arial" w:cs="Arial"/>
+          <w:lang w:val="es-CO"/>
+        </w:rPr>
+      </w:pPr>
+      <w:r>
+        <w:rPr>
+          <w:rFonts w:ascii="Arial" w:hAnsi="Arial" w:cs="Arial"/>
+          <w:lang w:val="es-CO"/>
+        </w:rPr>
+        <w:t>Se empieza por extraer solo la parte correspondiente a los datos del archivo excel, para lo cual se ignoran las primeras 9 filas de la hoja.</w:t>
+      </w:r>
+    </w:p>
+    <w:p>
+      <w:pPr>
+        <w:rPr>
+          <w:rFonts w:ascii="Arial" w:hAnsi="Arial" w:cs="Arial"/>
+          <w:b/>
+          <w:bCs/>
+          <w:lang w:val="es-CO"/>
+        </w:rPr>
+      </w:pPr>
+      <w:r>
+        <w:rPr>
+          <w:rFonts w:ascii="Arial" w:hAnsi="Arial" w:cs="Arial"/>
+          <w:b/>
+          <w:bCs/>
+          <w:noProof/>
+          <w:lang w:val="es-CO"/>
+        </w:rPr>
+        <w:lastRenderedPageBreak/>
+        <w:drawing>
+          <wp:inline distT="0" distB="0" distL="0" distR="0" wp14:anchorId="7F75C8AE" wp14:editId="65F3E0FE">
+            <wp:extent cx="5612130" cy="1868170"/>
+            <wp:effectExtent l="0" t="0" r="7620" b="0"/>
+            <wp:docPr id="16" name="Imagen 16"/>
+            <wp:cNvGraphicFramePr>
+              <a:graphicFrameLocks xmlns:a="http://schemas.openxmlformats.org/drawingml/2006/main" noChangeAspect="1"/>
+            </wp:cNvGraphicFramePr>
+            <a:graphic xmlns:a="http://schemas.openxmlformats.org/drawingml/2006/main">
+              <a:graphicData uri="http://schemas.openxmlformats.org/drawingml/2006/picture">
+                <pic:pic xmlns:pic="http://schemas.openxmlformats.org/drawingml/2006/picture">
+                  <pic:nvPicPr>
+                    <pic:cNvPr id="16" name="Imagen 16"/>
+                    <pic:cNvPicPr/>
+                  </pic:nvPicPr>
+                  <pic:blipFill>
+                    <a:blip r:embed="rId27" cstate="print">
+                      <a:extLst>
+                        <a:ext uri="{28A0092B-C50C-407E-A947-70E740481C1C}">
+                          <a14:useLocalDpi xmlns:a14="http://schemas.microsoft.com/office/drawing/2010/main" val="0"/>
+                        </a:ext>
+                      </a:extLst>
+                    </a:blip>
+                    <a:stretch>
+                      <a:fillRect/>
+                    </a:stretch>
+                  </pic:blipFill>
+                  <pic:spPr>
+                    <a:xfrm>
+                      <a:off x="0" y="0"/>
+                      <a:ext cx="5612130" cy="1868170"/>
+                    </a:xfrm>
+                    <a:prstGeom prst="rect">
+                      <a:avLst/>
+                    </a:prstGeom>
+                  </pic:spPr>
+                </pic:pic>
+              </a:graphicData>
+            </a:graphic>
+          </wp:inline>
+        </w:drawing>
+      </w:r>
+    </w:p>
+    <w:p>
+      <w:pPr>
+        <w:rPr>
+          <w:rFonts w:ascii="Arial" w:hAnsi="Arial" w:cs="Arial"/>
+          <w:b/>
+          <w:bCs/>
+          <w:lang w:val="es-CO"/>
+        </w:rPr>
+      </w:pPr>
+    </w:p>
+    <w:p>
+      <w:pPr>
+        <w:rPr>
+          <w:rFonts w:ascii="Arial" w:hAnsi="Arial" w:cs="Arial"/>
+          <w:lang w:val="es-CO"/>
+        </w:rPr>
+      </w:pPr>
+      <w:r>
+        <w:rPr>
+          <w:rFonts w:ascii="Arial" w:hAnsi="Arial" w:cs="Arial"/>
+          <w:lang w:val="es-CO"/>
+        </w:rPr>
+        <w:t>Actualización de headers</w:t>
+      </w:r>
+    </w:p>
+    <w:p>
+      <w:pPr>
+        <w:rPr>
+          <w:rFonts w:ascii="Arial" w:hAnsi="Arial" w:cs="Arial"/>
+          <w:lang w:val="es-CO"/>
+        </w:rPr>
+      </w:pPr>
+      <w:r>
+        <w:rPr>
+          <w:rFonts w:ascii="Arial" w:hAnsi="Arial" w:cs="Arial"/>
+          <w:lang w:val="es-CO"/>
+        </w:rPr>
+        <w:t>Al extraer los datos desde el archivo .xlsx, se verifica el dataframe generado por Pandas, empezando por los nombres de las columnas y se observan las siguientes incidencias:</w:t>
+      </w:r>
+    </w:p>
+    <w:p>
+      <w:pPr>
+        <w:pStyle w:val="Prrafodelista"/>
+        <w:numPr>
+          <w:ilvl w:val="0"/>
+          <w:numId w:val="5"/>
+        </w:numPr>
+        <w:rPr>
+          <w:rFonts w:ascii="Arial" w:hAnsi="Arial" w:cs="Arial"/>
+          <w:lang w:val="es-CO"/>
+        </w:rPr>
+      </w:pPr>
+      <w:r>
+        <w:rPr>
+          <w:rFonts w:ascii="Arial" w:hAnsi="Arial" w:cs="Arial"/>
+          <w:lang w:val="es-CO"/>
+        </w:rPr>
+        <w:t>Headers sin nombres descriptivos: headers con nombres por defecto de Pandas tipo ‘Unnamed: X’.</w:t>
+      </w:r>
+    </w:p>
+    <w:p>
+      <w:pPr>
+        <w:pStyle w:val="Prrafodelista"/>
+        <w:numPr>
+          <w:ilvl w:val="0"/>
+          <w:numId w:val="5"/>
+        </w:numPr>
+        <w:rPr>
+          <w:rFonts w:ascii="Arial" w:hAnsi="Arial" w:cs="Arial"/>
+          <w:lang w:val="es-CO"/>
+        </w:rPr>
+      </w:pPr>
+      <w:r>
+        <w:rPr>
+          <w:rFonts w:ascii="Arial" w:hAnsi="Arial" w:cs="Arial"/>
+          <w:lang w:val="es-CO"/>
+        </w:rPr>
+        <w:t>Headers en jerarquías inferiores debido a la agrupación de datos: Todos los headers se encuentran en la primera fila de los datos debido al diseño del .xlsx donde se busca describir la agrupación por Relación o parentesco con el jefe(a) del hogar.</w:t>
+      </w:r>
+    </w:p>
+    <w:p>
+      <w:pPr>
+        <w:rPr>
+          <w:rFonts w:ascii="Arial" w:hAnsi="Arial" w:cs="Arial"/>
+          <w:lang w:val="es-CO"/>
+        </w:rPr>
+      </w:pPr>
+      <w:r>
+        <w:rPr>
+          <w:rFonts w:ascii="Arial" w:hAnsi="Arial" w:cs="Arial"/>
+          <w:lang w:val="es-CO"/>
+        </w:rPr>
+        <w:t>Para solucionar esto, se reemplazan los headers actuales desde ‘Relación o parentesco con el jef(a) del hogar’ hasta el último, por los valores correspondientes en la primera fila de datos.</w:t>
+      </w:r>
+    </w:p>
+    <w:p>
+      <w:pPr>
+        <w:rPr>
+          <w:rFonts w:ascii="Arial" w:hAnsi="Arial" w:cs="Arial"/>
+          <w:lang w:val="es-CO"/>
+        </w:rPr>
+      </w:pPr>
+      <w:r>
+        <w:rPr>
+          <w:rFonts w:ascii="Arial" w:hAnsi="Arial" w:cs="Arial"/>
+          <w:noProof/>
+          <w:lang w:val="es-CO"/>
+        </w:rPr>
+        <w:drawing>
+          <wp:inline distT="0" distB="0" distL="0" distR="0" wp14:anchorId="2DB57473" wp14:editId="43BD4129">
+            <wp:extent cx="5612130" cy="1811020"/>
+            <wp:effectExtent l="0" t="0" r="7620" b="0"/>
+            <wp:docPr id="17" name="Imagen 17"/>
+            <wp:cNvGraphicFramePr>
+              <a:graphicFrameLocks xmlns:a="http://schemas.openxmlformats.org/drawingml/2006/main" noChangeAspect="1"/>
+            </wp:cNvGraphicFramePr>
+            <a:graphic xmlns:a="http://schemas.openxmlformats.org/drawingml/2006/main">
+              <a:graphicData uri="http://schemas.openxmlformats.org/drawingml/2006/picture">
+                <pic:pic xmlns:pic="http://schemas.openxmlformats.org/drawingml/2006/picture">
+                  <pic:nvPicPr>
+                    <pic:cNvPr id="17" name="Imagen 17"/>
+                    <pic:cNvPicPr/>
+                  </pic:nvPicPr>
+                  <pic:blipFill>
+                    <a:blip r:embed="rId28">
+                      <a:extLst>
+                        <a:ext uri="{28A0092B-C50C-407E-A947-70E740481C1C}">
+                          <a14:useLocalDpi xmlns:a14="http://schemas.microsoft.com/office/drawing/2010/main" val="0"/>
+                        </a:ext>
+                      </a:extLst>
+                    </a:blip>
+                    <a:stretch>
+                      <a:fillRect/>
+                    </a:stretch>
+                  </pic:blipFill>
+                  <pic:spPr>
+                    <a:xfrm>
+                      <a:off x="0" y="0"/>
+                      <a:ext cx="5612130" cy="1811020"/>
+                    </a:xfrm>
+                    <a:prstGeom prst="rect">
+                      <a:avLst/>
+                    </a:prstGeom>
+                  </pic:spPr>
+                </pic:pic>
+              </a:graphicData>
+            </a:graphic>
+          </wp:inline>
+        </w:drawing>
+      </w:r>
+    </w:p>
+    <w:p>
+      <w:pPr>
+        <w:rPr>
+          <w:rFonts w:ascii="Arial" w:hAnsi="Arial" w:cs="Arial"/>
+          <w:lang w:val="es-CO"/>
+        </w:rPr>
+      </w:pPr>
+      <w:r>
+        <w:rPr>
+          <w:rFonts w:ascii="Arial" w:hAnsi="Arial" w:cs="Arial"/>
+          <w:noProof/>
+          <w:lang w:val="es-CO"/>
+        </w:rPr>
+        <w:drawing>
+          <wp:inline distT="0" distB="0" distL="0" distR="0" wp14:anchorId="3FDF01AD" wp14:editId="79D6F2E7">
+            <wp:extent cx="5612130" cy="900430"/>
+            <wp:effectExtent l="0" t="0" r="7620" b="0"/>
+            <wp:docPr id="18" name="Imagen 18"/>
+            <wp:cNvGraphicFramePr>
+              <a:graphicFrameLocks xmlns:a="http://schemas.openxmlformats.org/drawingml/2006/main" noChangeAspect="1"/>
+            </wp:cNvGraphicFramePr>
+            <a:graphic xmlns:a="http://schemas.openxmlformats.org/drawingml/2006/main">
+              <a:graphicData uri="http://schemas.openxmlformats.org/drawingml/2006/picture">
+                <pic:pic xmlns:pic="http://schemas.openxmlformats.org/drawingml/2006/picture">
+                  <pic:nvPicPr>
+                    <pic:cNvPr id="18" name="Imagen 18"/>
+                    <pic:cNvPicPr/>
+                  </pic:nvPicPr>
+                  <pic:blipFill>
+                    <a:blip r:embed="rId29">
+                      <a:extLst>
+                        <a:ext uri="{28A0092B-C50C-407E-A947-70E740481C1C}">
+                          <a14:useLocalDpi xmlns:a14="http://schemas.microsoft.com/office/drawing/2010/main" val="0"/>
+                        </a:ext>
+                      </a:extLst>
+                    </a:blip>
+                    <a:stretch>
+                      <a:fillRect/>
+                    </a:stretch>
+                  </pic:blipFill>
+                  <pic:spPr>
+                    <a:xfrm>
+                      <a:off x="0" y="0"/>
+                      <a:ext cx="5612130" cy="900430"/>
+                    </a:xfrm>
+                    <a:prstGeom prst="rect">
+                      <a:avLst/>
+                    </a:prstGeom>
+                  </pic:spPr>
+                </pic:pic>
+              </a:graphicData>
+            </a:graphic>
+          </wp:inline>
+        </w:drawing>
+      </w:r>
+    </w:p>
+    <w:p>
+      <w:pPr>
+        <w:rPr>
+          <w:rFonts w:ascii="Arial" w:hAnsi="Arial" w:cs="Arial"/>
+          <w:lang w:val="es-CO"/>
+        </w:rPr>
+      </w:pPr>
+      <w:r>
+        <w:rPr>
+          <w:rFonts w:ascii="Arial" w:hAnsi="Arial" w:cs="Arial"/>
+          <w:lang w:val="es-CO"/>
+        </w:rPr>
+        <w:lastRenderedPageBreak/>
+        <w:t>Se cambian las columnas restantes que no tienen nombres descriptivos de la siguiente manera:</w:t>
+      </w:r>
+    </w:p>
+    <w:p>
+      <w:pPr>
+        <w:pStyle w:val="Prrafodelista"/>
+        <w:numPr>
+          <w:ilvl w:val="0"/>
+          <w:numId w:val="6"/>
+        </w:numPr>
+        <w:rPr>
+          <w:rFonts w:ascii="Arial" w:hAnsi="Arial" w:cs="Arial"/>
+          <w:lang w:val="es-CO"/>
+        </w:rPr>
+      </w:pPr>
+      <w:r>
+        <w:rPr>
+          <w:rFonts w:ascii="Arial" w:hAnsi="Arial" w:cs="Arial"/>
+          <w:lang w:val="es-CO"/>
+        </w:rPr>
+        <w:t>Unnamed: 1: Municipio</w:t>
+      </w:r>
+    </w:p>
+    <w:p>
+      <w:pPr>
+        <w:pStyle w:val="Prrafodelista"/>
+        <w:numPr>
+          <w:ilvl w:val="0"/>
+          <w:numId w:val="6"/>
+        </w:numPr>
+        <w:rPr>
+          <w:rFonts w:ascii="Arial" w:hAnsi="Arial" w:cs="Arial"/>
+          <w:lang w:val="es-CO"/>
+        </w:rPr>
+      </w:pPr>
+      <w:r>
+        <w:rPr>
+          <w:rFonts w:ascii="Arial" w:hAnsi="Arial" w:cs="Arial"/>
+          <w:lang w:val="es-CO"/>
+        </w:rPr>
+        <w:t>Unnamed: 2: Area</w:t>
+      </w:r>
+    </w:p>
+    <w:p>
+      <w:pPr>
+        <w:pStyle w:val="Prrafodelista"/>
+        <w:numPr>
+          <w:ilvl w:val="0"/>
+          <w:numId w:val="6"/>
+        </w:numPr>
+        <w:rPr>
+          <w:rFonts w:ascii="Arial" w:hAnsi="Arial" w:cs="Arial"/>
+          <w:lang w:val="es-CO"/>
+        </w:rPr>
+      </w:pPr>
+      <w:r>
+        <w:rPr>
+          <w:rFonts w:ascii="Arial" w:hAnsi="Arial" w:cs="Arial"/>
+          <w:lang w:val="es-CO"/>
+        </w:rPr>
+        <w:t xml:space="preserve">Unnamed: 3: </w:t>
+      </w:r>
+      <w:r>
+        <w:rPr>
+          <w:rFonts w:ascii="Arial" w:hAnsi="Arial" w:cs="Arial"/>
+          <w:lang w:val="es-CO"/>
+        </w:rPr>
+        <w:t>Grupo de edad</w:t>
+      </w:r>
+    </w:p>
+    <w:p>
+      <w:pPr>
+        <w:rPr>
+          <w:rFonts w:ascii="Arial" w:hAnsi="Arial" w:cs="Arial"/>
+          <w:lang w:val="es-CO"/>
+        </w:rPr>
+      </w:pPr>
+    </w:p>
+    <w:p>
+      <w:pPr>
+        <w:rPr>
+          <w:rFonts w:ascii="Arial" w:hAnsi="Arial" w:cs="Arial"/>
+          <w:lang w:val="es-CO"/>
+        </w:rPr>
+      </w:pPr>
+      <w:r>
+        <w:rPr>
+          <w:rFonts w:ascii="Arial" w:hAnsi="Arial" w:cs="Arial"/>
+          <w:lang w:val="es-CO"/>
+        </w:rPr>
+        <w:t>Filtrado de datos que no son de Viterbo, Caldas</w:t>
+      </w:r>
+    </w:p>
+    <w:p>
+      <w:pPr>
+        <w:rPr>
+          <w:rFonts w:ascii="Arial" w:hAnsi="Arial" w:cs="Arial"/>
+          <w:lang w:val="es-CO"/>
+        </w:rPr>
+      </w:pPr>
+      <w:r>
+        <w:rPr>
+          <w:rFonts w:ascii="Arial" w:hAnsi="Arial" w:cs="Arial"/>
+          <w:lang w:val="es-CO"/>
+        </w:rPr>
+        <w:t>Para esta hoja se decide propagar el valor del identificador del municipio, ‘17877_Viterbo’, y seleccionar solo los registros que lo contengan.</w:t>
+      </w:r>
+    </w:p>
+    <w:p>
+      <w:pPr>
+        <w:rPr>
+          <w:rFonts w:ascii="Arial" w:hAnsi="Arial" w:cs="Arial"/>
+          <w:lang w:val="es-CO"/>
+        </w:rPr>
+      </w:pPr>
+      <w:r>
+        <w:rPr>
+          <w:rFonts w:ascii="Arial" w:hAnsi="Arial" w:cs="Arial"/>
+          <w:noProof/>
+          <w:lang w:val="es-CO"/>
+        </w:rPr>
+        <w:drawing>
+          <wp:inline distT="0" distB="0" distL="0" distR="0" wp14:anchorId="6EEA1988" wp14:editId="33666506">
+            <wp:extent cx="5612130" cy="2984500"/>
+            <wp:effectExtent l="0" t="0" r="7620" b="6350"/>
+            <wp:docPr id="19" name="Imagen 19"/>
+            <wp:cNvGraphicFramePr>
+              <a:graphicFrameLocks xmlns:a="http://schemas.openxmlformats.org/drawingml/2006/main" noChangeAspect="1"/>
+            </wp:cNvGraphicFramePr>
+            <a:graphic xmlns:a="http://schemas.openxmlformats.org/drawingml/2006/main">
+              <a:graphicData uri="http://schemas.openxmlformats.org/drawingml/2006/picture">
+                <pic:pic xmlns:pic="http://schemas.openxmlformats.org/drawingml/2006/picture">
+                  <pic:nvPicPr>
+                    <pic:cNvPr id="19" name="Imagen 19"/>
+                    <pic:cNvPicPr/>
+                  </pic:nvPicPr>
+                  <pic:blipFill>
+                    <a:blip r:embed="rId30">
+                      <a:extLst>
+                        <a:ext uri="{28A0092B-C50C-407E-A947-70E740481C1C}">
+                          <a14:useLocalDpi xmlns:a14="http://schemas.microsoft.com/office/drawing/2010/main" val="0"/>
+                        </a:ext>
+                      </a:extLst>
+                    </a:blip>
+                    <a:stretch>
+                      <a:fillRect/>
+                    </a:stretch>
+                  </pic:blipFill>
+                  <pic:spPr>
+                    <a:xfrm>
+                      <a:off x="0" y="0"/>
+                      <a:ext cx="5612130" cy="2984500"/>
+                    </a:xfrm>
+                    <a:prstGeom prst="rect">
+                      <a:avLst/>
+                    </a:prstGeom>
+                  </pic:spPr>
+                </pic:pic>
+              </a:graphicData>
+            </a:graphic>
+          </wp:inline>
+        </w:drawing>
+      </w:r>
+    </w:p>
+    <w:p>
+      <w:pPr>
+        <w:rPr>
+          <w:rFonts w:ascii="Arial" w:hAnsi="Arial" w:cs="Arial"/>
+          <w:lang w:val="es-CO"/>
+        </w:rPr>
+      </w:pPr>
+    </w:p>
+    <w:p>
+      <w:pPr>
+        <w:rPr>
+          <w:rFonts w:ascii="Arial" w:hAnsi="Arial" w:cs="Arial"/>
+          <w:lang w:val="es-CO"/>
+        </w:rPr>
+      </w:pPr>
+      <w:r>
+        <w:rPr>
+          <w:rFonts w:ascii="Arial" w:hAnsi="Arial" w:cs="Arial"/>
+          <w:lang w:val="es-CO"/>
+        </w:rPr>
+        <w:t>Eliminación de columnas sin información relevante o con información redundante en el dataframe.</w:t>
+      </w:r>
+    </w:p>
+    <w:p>
+      <w:pPr>
+        <w:rPr>
+          <w:rFonts w:ascii="Arial" w:hAnsi="Arial" w:cs="Arial"/>
+          <w:lang w:val="es-CO"/>
+        </w:rPr>
+      </w:pPr>
+      <w:r>
+        <w:rPr>
+          <w:rFonts w:ascii="Arial" w:hAnsi="Arial" w:cs="Arial"/>
+          <w:lang w:val="es-CO"/>
+        </w:rPr>
+        <w:t>Se eliminan las columnas ‘</w:t>
+      </w:r>
+      <w:r>
+        <w:rPr>
+          <w:rFonts w:ascii="Arial" w:hAnsi="Arial" w:cs="Arial"/>
+          <w:lang w:val="es-CO"/>
+        </w:rPr>
+        <w:t>Grupos de edad y áreas (Total, Cabecera y Centros poblados y Rural disperso) y</w:t>
+      </w:r>
+      <w:r>
+        <w:rPr>
+          <w:rFonts w:ascii="Arial" w:hAnsi="Arial" w:cs="Arial"/>
+          <w:lang w:val="es-CO"/>
+        </w:rPr>
+        <w:t xml:space="preserve"> </w:t>
+      </w:r>
+      <w:r>
+        <w:rPr>
+          <w:rFonts w:ascii="Arial" w:hAnsi="Arial" w:cs="Arial"/>
+          <w:lang w:val="es-CO"/>
+        </w:rPr>
+        <w:t xml:space="preserve">', 'Municipio', </w:t>
+      </w:r>
+      <w:r>
+        <w:rPr>
+          <w:rFonts w:ascii="Arial" w:hAnsi="Arial" w:cs="Arial"/>
+          <w:lang w:val="es-CO"/>
+        </w:rPr>
+        <w:t xml:space="preserve">y </w:t>
+      </w:r>
+      <w:r>
+        <w:rPr>
+          <w:rFonts w:ascii="Arial" w:hAnsi="Arial" w:cs="Arial"/>
+          <w:lang w:val="es-CO"/>
+        </w:rPr>
+        <w:t>'Total'</w:t>
+      </w:r>
+      <w:r>
+        <w:rPr>
+          <w:rFonts w:ascii="Arial" w:hAnsi="Arial" w:cs="Arial"/>
+          <w:lang w:val="es-CO"/>
+        </w:rPr>
+        <w:t>.</w:t>
+      </w:r>
+    </w:p>
+    <w:p>
+      <w:pPr>
+        <w:rPr>
+          <w:rFonts w:ascii="Arial" w:hAnsi="Arial" w:cs="Arial"/>
+          <w:lang w:val="es-CO"/>
+        </w:rPr>
+      </w:pPr>
+      <w:r>
+        <w:rPr>
+          <w:rFonts w:ascii="Arial" w:hAnsi="Arial" w:cs="Arial"/>
+          <w:noProof/>
+          <w:lang w:val="es-CO"/>
+        </w:rPr>
+        <w:lastRenderedPageBreak/>
+        <w:drawing>
+          <wp:inline distT="0" distB="0" distL="0" distR="0" wp14:anchorId="5B83EF1C" wp14:editId="234C6A59">
+            <wp:extent cx="5612130" cy="1975485"/>
+            <wp:effectExtent l="0" t="0" r="7620" b="5715"/>
+            <wp:docPr id="20" name="Imagen 20"/>
+            <wp:cNvGraphicFramePr>
+              <a:graphicFrameLocks xmlns:a="http://schemas.openxmlformats.org/drawingml/2006/main" noChangeAspect="1"/>
+            </wp:cNvGraphicFramePr>
+            <a:graphic xmlns:a="http://schemas.openxmlformats.org/drawingml/2006/main">
+              <a:graphicData uri="http://schemas.openxmlformats.org/drawingml/2006/picture">
+                <pic:pic xmlns:pic="http://schemas.openxmlformats.org/drawingml/2006/picture">
+                  <pic:nvPicPr>
+                    <pic:cNvPr id="20" name="Imagen 20"/>
+                    <pic:cNvPicPr/>
+                  </pic:nvPicPr>
+                  <pic:blipFill>
+                    <a:blip r:embed="rId31" cstate="print">
+                      <a:extLst>
+                        <a:ext uri="{28A0092B-C50C-407E-A947-70E740481C1C}">
+                          <a14:useLocalDpi xmlns:a14="http://schemas.microsoft.com/office/drawing/2010/main" val="0"/>
+                        </a:ext>
+                      </a:extLst>
+                    </a:blip>
+                    <a:stretch>
+                      <a:fillRect/>
+                    </a:stretch>
+                  </pic:blipFill>
+                  <pic:spPr>
+                    <a:xfrm>
+                      <a:off x="0" y="0"/>
+                      <a:ext cx="5612130" cy="1975485"/>
+                    </a:xfrm>
+                    <a:prstGeom prst="rect">
+                      <a:avLst/>
+                    </a:prstGeom>
+                  </pic:spPr>
+                </pic:pic>
+              </a:graphicData>
+            </a:graphic>
+          </wp:inline>
+        </w:drawing>
+      </w:r>
+    </w:p>
+    <w:p>
+      <w:pPr>
+        <w:rPr>
+          <w:rFonts w:ascii="Arial" w:hAnsi="Arial" w:cs="Arial"/>
+          <w:lang w:val="es-CO"/>
+        </w:rPr>
+      </w:pPr>
+    </w:p>
+    <w:p>
+      <w:pPr>
+        <w:rPr>
+          <w:rFonts w:ascii="Arial" w:hAnsi="Arial" w:cs="Arial"/>
+          <w:lang w:val="es-CO"/>
+        </w:rPr>
+      </w:pPr>
+      <w:r>
+        <w:rPr>
+          <w:rFonts w:ascii="Arial" w:hAnsi="Arial" w:cs="Arial"/>
+          <w:lang w:val="es-CO"/>
+        </w:rPr>
+        <w:t>Se modifican nombres de columnas que contienen caracteres especiales como tildes y ñ.</w:t>
+      </w:r>
+    </w:p>
+    <w:p>
+      <w:pPr>
+        <w:rPr>
+          <w:rFonts w:ascii="Arial" w:hAnsi="Arial" w:cs="Arial"/>
+          <w:lang w:val="es-CO"/>
+        </w:rPr>
+      </w:pPr>
+      <w:r>
+        <w:rPr>
+          <w:rFonts w:ascii="Arial" w:hAnsi="Arial" w:cs="Arial"/>
+          <w:noProof/>
+          <w:lang w:val="es-CO"/>
+        </w:rPr>
+        <w:drawing>
+          <wp:inline distT="0" distB="0" distL="0" distR="0" wp14:anchorId="0B7DD4BB" wp14:editId="3723D384">
+            <wp:extent cx="5612130" cy="304165"/>
+            <wp:effectExtent l="0" t="0" r="7620" b="635"/>
+            <wp:docPr id="21" name="Imagen 21"/>
+            <wp:cNvGraphicFramePr>
+              <a:graphicFrameLocks xmlns:a="http://schemas.openxmlformats.org/drawingml/2006/main" noChangeAspect="1"/>
+            </wp:cNvGraphicFramePr>
+            <a:graphic xmlns:a="http://schemas.openxmlformats.org/drawingml/2006/main">
+              <a:graphicData uri="http://schemas.openxmlformats.org/drawingml/2006/picture">
+                <pic:pic xmlns:pic="http://schemas.openxmlformats.org/drawingml/2006/picture">
+                  <pic:nvPicPr>
+                    <pic:cNvPr id="21" name="Imagen 21"/>
+                    <pic:cNvPicPr/>
+                  </pic:nvPicPr>
+                  <pic:blipFill>
+                    <a:blip r:embed="rId32" cstate="print">
+                      <a:extLst>
+                        <a:ext uri="{28A0092B-C50C-407E-A947-70E740481C1C}">
+                          <a14:useLocalDpi xmlns:a14="http://schemas.microsoft.com/office/drawing/2010/main" val="0"/>
+                        </a:ext>
+                      </a:extLst>
+                    </a:blip>
+                    <a:stretch>
+                      <a:fillRect/>
+                    </a:stretch>
+                  </pic:blipFill>
+                  <pic:spPr>
+                    <a:xfrm>
+                      <a:off x="0" y="0"/>
+                      <a:ext cx="5612130" cy="304165"/>
+                    </a:xfrm>
+                    <a:prstGeom prst="rect">
+                      <a:avLst/>
+                    </a:prstGeom>
+                  </pic:spPr>
+                </pic:pic>
+              </a:graphicData>
+            </a:graphic>
+          </wp:inline>
+        </w:drawing>
+      </w:r>
+    </w:p>
+    <w:p>
+      <w:pPr>
+        <w:rPr>
+          <w:rFonts w:ascii="Arial" w:hAnsi="Arial" w:cs="Arial"/>
+          <w:lang w:val="es-CO"/>
+        </w:rPr>
+      </w:pPr>
+    </w:p>
+    <w:p>
+      <w:pPr>
+        <w:rPr>
+          <w:rFonts w:ascii="Arial" w:hAnsi="Arial" w:cs="Arial"/>
+          <w:lang w:val="es-CO"/>
+        </w:rPr>
+      </w:pPr>
+      <w:r>
+        <w:rPr>
+          <w:rFonts w:ascii="Arial" w:hAnsi="Arial" w:cs="Arial"/>
+          <w:lang w:val="es-CO"/>
+        </w:rPr>
+        <w:t>Se propaga el valor de la columna ‘Area’ para reemplazar los valores NaN.</w:t>
+      </w:r>
+    </w:p>
+    <w:p>
+      <w:pPr>
+        <w:rPr>
+          <w:rFonts w:ascii="Arial" w:hAnsi="Arial" w:cs="Arial"/>
+          <w:lang w:val="es-CO"/>
+        </w:rPr>
+      </w:pPr>
+      <w:r>
+        <w:rPr>
+          <w:rFonts w:ascii="Arial" w:hAnsi="Arial" w:cs="Arial"/>
+          <w:noProof/>
+          <w:lang w:val="es-CO"/>
+        </w:rPr>
+        <w:drawing>
+          <wp:inline distT="0" distB="0" distL="0" distR="0" wp14:anchorId="6CD18602" wp14:editId="367BED8B">
+            <wp:extent cx="5612130" cy="2159000"/>
+            <wp:effectExtent l="0" t="0" r="7620" b="0"/>
+            <wp:docPr id="22" name="Imagen 22"/>
+            <wp:cNvGraphicFramePr>
+              <a:graphicFrameLocks xmlns:a="http://schemas.openxmlformats.org/drawingml/2006/main" noChangeAspect="1"/>
+            </wp:cNvGraphicFramePr>
+            <a:graphic xmlns:a="http://schemas.openxmlformats.org/drawingml/2006/main">
+              <a:graphicData uri="http://schemas.openxmlformats.org/drawingml/2006/picture">
+                <pic:pic xmlns:pic="http://schemas.openxmlformats.org/drawingml/2006/picture">
+                  <pic:nvPicPr>
+                    <pic:cNvPr id="22" name="Imagen 22"/>
+                    <pic:cNvPicPr/>
+                  </pic:nvPicPr>
+                  <pic:blipFill>
+                    <a:blip r:embed="rId33">
+                      <a:extLst>
+                        <a:ext uri="{28A0092B-C50C-407E-A947-70E740481C1C}">
+                          <a14:useLocalDpi xmlns:a14="http://schemas.microsoft.com/office/drawing/2010/main" val="0"/>
+                        </a:ext>
+                      </a:extLst>
+                    </a:blip>
+                    <a:stretch>
+                      <a:fillRect/>
+                    </a:stretch>
+                  </pic:blipFill>
+                  <pic:spPr>
+                    <a:xfrm>
+                      <a:off x="0" y="0"/>
+                      <a:ext cx="5612130" cy="2159000"/>
+                    </a:xfrm>
+                    <a:prstGeom prst="rect">
+                      <a:avLst/>
+                    </a:prstGeom>
+                  </pic:spPr>
+                </pic:pic>
+              </a:graphicData>
+            </a:graphic>
+          </wp:inline>
+        </w:drawing>
+      </w:r>
+    </w:p>
+    <w:p>
+      <w:pPr>
+        <w:rPr>
+          <w:rFonts w:ascii="Arial" w:hAnsi="Arial" w:cs="Arial"/>
+          <w:lang w:val="es-CO"/>
+        </w:rPr>
+      </w:pPr>
+    </w:p>
+    <w:p>
+      <w:pPr>
+        <w:rPr>
+          <w:rFonts w:ascii="Arial" w:hAnsi="Arial" w:cs="Arial"/>
+          <w:lang w:val="es-CO"/>
+        </w:rPr>
+      </w:pPr>
+      <w:r>
+        <w:rPr>
+          <w:rFonts w:ascii="Arial" w:hAnsi="Arial" w:cs="Arial"/>
+          <w:lang w:val="es-CO"/>
+        </w:rPr>
+        <w:t>Se filtran las filas que contienen resúmenes de datos (Totales)</w:t>
+      </w:r>
+      <w:r>
+        <w:rPr>
+          <w:rFonts w:ascii="Arial" w:hAnsi="Arial" w:cs="Arial"/>
+          <w:lang w:val="es-CO"/>
+        </w:rPr>
+        <w:t>.</w:t>
+      </w:r>
+    </w:p>
+    <w:p>
+      <w:pPr>
+        <w:rPr>
+          <w:rFonts w:ascii="Arial" w:hAnsi="Arial" w:cs="Arial"/>
+          <w:lang w:val="es-CO"/>
+        </w:rPr>
+      </w:pPr>
+      <w:r>
+        <w:rPr>
+          <w:rFonts w:ascii="Arial" w:hAnsi="Arial" w:cs="Arial"/>
+          <w:noProof/>
+          <w:lang w:val="es-CO"/>
+        </w:rPr>
+        <w:lastRenderedPageBreak/>
+        <w:drawing>
+          <wp:inline distT="0" distB="0" distL="0" distR="0" wp14:anchorId="59C0BB4E" wp14:editId="2D1680AB">
+            <wp:extent cx="5612130" cy="2546985"/>
+            <wp:effectExtent l="0" t="0" r="7620" b="5715"/>
+            <wp:docPr id="23" name="Imagen 23"/>
+            <wp:cNvGraphicFramePr>
+              <a:graphicFrameLocks xmlns:a="http://schemas.openxmlformats.org/drawingml/2006/main" noChangeAspect="1"/>
+            </wp:cNvGraphicFramePr>
+            <a:graphic xmlns:a="http://schemas.openxmlformats.org/drawingml/2006/main">
+              <a:graphicData uri="http://schemas.openxmlformats.org/drawingml/2006/picture">
+                <pic:pic xmlns:pic="http://schemas.openxmlformats.org/drawingml/2006/picture">
+                  <pic:nvPicPr>
+                    <pic:cNvPr id="23" name="Imagen 23"/>
+                    <pic:cNvPicPr/>
+                  </pic:nvPicPr>
+                  <pic:blipFill>
+                    <a:blip r:embed="rId34">
+                      <a:extLst>
+                        <a:ext uri="{28A0092B-C50C-407E-A947-70E740481C1C}">
+                          <a14:useLocalDpi xmlns:a14="http://schemas.microsoft.com/office/drawing/2010/main" val="0"/>
+                        </a:ext>
+                      </a:extLst>
+                    </a:blip>
+                    <a:stretch>
+                      <a:fillRect/>
+                    </a:stretch>
+                  </pic:blipFill>
+                  <pic:spPr>
+                    <a:xfrm>
+                      <a:off x="0" y="0"/>
+                      <a:ext cx="5612130" cy="2546985"/>
+                    </a:xfrm>
+                    <a:prstGeom prst="rect">
+                      <a:avLst/>
+                    </a:prstGeom>
+                  </pic:spPr>
+                </pic:pic>
+              </a:graphicData>
+            </a:graphic>
+          </wp:inline>
+        </w:drawing>
+      </w:r>
+    </w:p>
+    <w:p>
+      <w:pPr>
+        <w:rPr>
+          <w:rFonts w:ascii="Arial" w:hAnsi="Arial" w:cs="Arial"/>
+          <w:lang w:val="es-CO"/>
+        </w:rPr>
+      </w:pPr>
+    </w:p>
+    <w:p>
+      <w:pPr>
+        <w:rPr>
+          <w:rFonts w:ascii="Arial" w:hAnsi="Arial" w:cs="Arial"/>
+          <w:lang w:val="es-CO"/>
+        </w:rPr>
+      </w:pPr>
+      <w:r>
+        <w:rPr>
+          <w:rFonts w:ascii="Arial" w:hAnsi="Arial" w:cs="Arial"/>
+          <w:lang w:val="es-CO"/>
+        </w:rPr>
+        <w:t>Finalmente, s</w:t>
+      </w:r>
+      <w:r>
+        <w:rPr>
+          <w:rFonts w:ascii="Arial" w:hAnsi="Arial" w:cs="Arial"/>
+          <w:lang w:val="es-CO"/>
+        </w:rPr>
+        <w:t>e cambian las tildes dentro de los datos, reemplazando vocales con tilde por vocales sin tilde.</w:t>
+      </w:r>
+    </w:p>
+    <w:p>
+      <w:pPr>
+        <w:rPr>
+          <w:rFonts w:ascii="Arial" w:hAnsi="Arial" w:cs="Arial"/>
+          <w:lang w:val="es-CO"/>
+        </w:rPr>
+      </w:pPr>
+    </w:p>
+    <w:p>
+      <w:pPr>
+        <w:rPr>
+          <w:rFonts w:ascii="Arial" w:hAnsi="Arial" w:cs="Arial"/>
+          <w:b/>
+          <w:bCs/>
+          <w:lang w:val="es-CO"/>
+        </w:rPr>
+      </w:pPr>
     </w:p>
     <w:sectPr>
       <w:pgSz w:w="12240" w:h="15840"/>

</xml_diff>

<commit_message>
Actualiza doc de procesamiento de datos con el procesamiento de la hoja 5.2PM
</commit_message>
<xml_diff>
--- a/Documentacion/Procesamiento de Datos.docx
+++ b/Documentacion/Procesamiento de Datos.docx
@@ -100,7 +100,7 @@
           <w:rFonts w:ascii="Arial" w:hAnsi="Arial" w:cs="Arial"/>
           <w:lang w:val="es-CO"/>
         </w:rPr>
-        <w:t>1</w:t>
+        <w:t>2</w:t>
       </w:r>
       <w:r>
         <w:rPr>
@@ -193,37 +193,126 @@
           <w:rFonts w:ascii="Arial" w:hAnsi="Arial" w:cs="Arial"/>
           <w:lang w:val="es-CO"/>
         </w:rPr>
-        <w:t>Almacenamiento de datos extraídos: .csv</w:t>
-      </w:r>
-    </w:p>
-    <w:p>
-      <w:pPr>
-        <w:rPr>
-          <w:rFonts w:ascii="Arial" w:hAnsi="Arial" w:cs="Arial"/>
-          <w:lang w:val="es-CO"/>
-        </w:rPr>
-      </w:pPr>
-      <w:r>
-        <w:rPr>
-          <w:rFonts w:ascii="Arial" w:hAnsi="Arial" w:cs="Arial"/>
-          <w:lang w:val="es-CO"/>
-        </w:rPr>
-        <w:t>Las fuentes de datos vienen en hojas de excel desde el origen, aunque el proyecto es muy específico sobre el municipio de Viterbo, Caldas y podrían extraerse manualmente a otra hoja de excel y trabajar sobre ellos, se puede construir un flujo de extracción de datos escalable utilizando Python, lo anterior para poder aplicarlo a todo el dataset en un futuro.</w:t>
-      </w:r>
-    </w:p>
-    <w:p>
-      <w:pPr>
-        <w:rPr>
-          <w:rFonts w:ascii="Arial" w:hAnsi="Arial" w:cs="Arial"/>
-          <w:lang w:val="es-CO"/>
-        </w:rPr>
-      </w:pPr>
-      <w:r>
-        <w:rPr>
-          <w:rFonts w:ascii="Arial" w:hAnsi="Arial" w:cs="Arial"/>
-          <w:lang w:val="es-CO"/>
-        </w:rPr>
-        <w:t>Los datos procesados se almacenarán en documentos .csv como datasets definitivos.</w:t>
+        <w:t>Almacenamiento de datos extraídos: .</w:t>
+      </w:r>
+      <w:proofErr w:type="spellStart"/>
+      <w:r>
+        <w:rPr>
+          <w:rFonts w:ascii="Arial" w:hAnsi="Arial" w:cs="Arial"/>
+          <w:lang w:val="es-CO"/>
+        </w:rPr>
+        <w:t>csv</w:t>
+      </w:r>
+      <w:proofErr w:type="spellEnd"/>
+    </w:p>
+    <w:p>
+      <w:pPr>
+        <w:rPr>
+          <w:rFonts w:ascii="Arial" w:hAnsi="Arial" w:cs="Arial"/>
+          <w:lang w:val="es-CO"/>
+        </w:rPr>
+      </w:pPr>
+      <w:r>
+        <w:rPr>
+          <w:rFonts w:ascii="Arial" w:hAnsi="Arial" w:cs="Arial"/>
+          <w:lang w:val="es-CO"/>
+        </w:rPr>
+        <w:t xml:space="preserve">Las fuentes de datos vienen en hojas de </w:t>
+      </w:r>
+      <w:proofErr w:type="spellStart"/>
+      <w:r>
+        <w:rPr>
+          <w:rFonts w:ascii="Arial" w:hAnsi="Arial" w:cs="Arial"/>
+          <w:lang w:val="es-CO"/>
+        </w:rPr>
+        <w:t>excel</w:t>
+      </w:r>
+      <w:proofErr w:type="spellEnd"/>
+      <w:r>
+        <w:rPr>
+          <w:rFonts w:ascii="Arial" w:hAnsi="Arial" w:cs="Arial"/>
+          <w:lang w:val="es-CO"/>
+        </w:rPr>
+        <w:t xml:space="preserve"> desde el origen, aunque el proyecto es muy específico sobre el municipio de Viterbo, Caldas y podrían extraerse manualmente a otra hoja de </w:t>
+      </w:r>
+      <w:proofErr w:type="spellStart"/>
+      <w:r>
+        <w:rPr>
+          <w:rFonts w:ascii="Arial" w:hAnsi="Arial" w:cs="Arial"/>
+          <w:lang w:val="es-CO"/>
+        </w:rPr>
+        <w:t>excel</w:t>
+      </w:r>
+      <w:proofErr w:type="spellEnd"/>
+      <w:r>
+        <w:rPr>
+          <w:rFonts w:ascii="Arial" w:hAnsi="Arial" w:cs="Arial"/>
+          <w:lang w:val="es-CO"/>
+        </w:rPr>
+        <w:t xml:space="preserve"> y trabajar sobre ellos, se puede construir un flujo de extracción de datos escalable utilizando Python, lo anterior para poder aplicarlo a todo el </w:t>
+      </w:r>
+      <w:proofErr w:type="spellStart"/>
+      <w:r>
+        <w:rPr>
+          <w:rFonts w:ascii="Arial" w:hAnsi="Arial" w:cs="Arial"/>
+          <w:lang w:val="es-CO"/>
+        </w:rPr>
+        <w:t>dataset</w:t>
+      </w:r>
+      <w:proofErr w:type="spellEnd"/>
+      <w:r>
+        <w:rPr>
+          <w:rFonts w:ascii="Arial" w:hAnsi="Arial" w:cs="Arial"/>
+          <w:lang w:val="es-CO"/>
+        </w:rPr>
+        <w:t xml:space="preserve"> en un futuro.</w:t>
+      </w:r>
+    </w:p>
+    <w:p>
+      <w:pPr>
+        <w:rPr>
+          <w:rFonts w:ascii="Arial" w:hAnsi="Arial" w:cs="Arial"/>
+          <w:lang w:val="es-CO"/>
+        </w:rPr>
+      </w:pPr>
+      <w:r>
+        <w:rPr>
+          <w:rFonts w:ascii="Arial" w:hAnsi="Arial" w:cs="Arial"/>
+          <w:lang w:val="es-CO"/>
+        </w:rPr>
+        <w:t>Los datos procesados se almacenarán en documentos .</w:t>
+      </w:r>
+      <w:proofErr w:type="spellStart"/>
+      <w:r>
+        <w:rPr>
+          <w:rFonts w:ascii="Arial" w:hAnsi="Arial" w:cs="Arial"/>
+          <w:lang w:val="es-CO"/>
+        </w:rPr>
+        <w:t>csv</w:t>
+      </w:r>
+      <w:proofErr w:type="spellEnd"/>
+      <w:r>
+        <w:rPr>
+          <w:rFonts w:ascii="Arial" w:hAnsi="Arial" w:cs="Arial"/>
+          <w:lang w:val="es-CO"/>
+        </w:rPr>
+        <w:t xml:space="preserve"> como </w:t>
+      </w:r>
+      <w:proofErr w:type="spellStart"/>
+      <w:r>
+        <w:rPr>
+          <w:rFonts w:ascii="Arial" w:hAnsi="Arial" w:cs="Arial"/>
+          <w:lang w:val="es-CO"/>
+        </w:rPr>
+        <w:t>datasets</w:t>
+      </w:r>
+      <w:proofErr w:type="spellEnd"/>
+      <w:r>
+        <w:rPr>
+          <w:rFonts w:ascii="Arial" w:hAnsi="Arial" w:cs="Arial"/>
+          <w:lang w:val="es-CO"/>
+        </w:rPr>
+        <w:t xml:space="preserve"> definitivos.</w:t>
       </w:r>
     </w:p>
     <w:p>
@@ -389,7 +478,23 @@
           <w:rFonts w:ascii="Arial" w:hAnsi="Arial" w:cs="Arial"/>
           <w:lang w:val="es-CO"/>
         </w:rPr>
-        <w:t>Se empieza por extraer solo la parte correspondiente a los datos del archivo excel, para lo cual se ignoran las primeras 9 filas de la hoja</w:t>
+        <w:t xml:space="preserve">Se empieza por extraer solo la parte correspondiente a los datos del archivo </w:t>
+      </w:r>
+      <w:proofErr w:type="spellStart"/>
+      <w:r>
+        <w:rPr>
+          <w:rFonts w:ascii="Arial" w:hAnsi="Arial" w:cs="Arial"/>
+          <w:lang w:val="es-CO"/>
+        </w:rPr>
+        <w:t>excel</w:t>
+      </w:r>
+      <w:proofErr w:type="spellEnd"/>
+      <w:r>
+        <w:rPr>
+          <w:rFonts w:ascii="Arial" w:hAnsi="Arial" w:cs="Arial"/>
+          <w:lang w:val="es-CO"/>
+        </w:rPr>
+        <w:t>, para lo cual se ignoran las primeras 9 filas de la hoja</w:t>
       </w:r>
     </w:p>
     <w:p>
@@ -469,22 +574,47 @@
           <w:rFonts w:ascii="Arial" w:hAnsi="Arial" w:cs="Arial"/>
           <w:lang w:val="es-CO"/>
         </w:rPr>
-        <w:t>Actualización de headers</w:t>
-      </w:r>
-    </w:p>
-    <w:p>
-      <w:pPr>
-        <w:rPr>
-          <w:rFonts w:ascii="Arial" w:hAnsi="Arial" w:cs="Arial"/>
-          <w:lang w:val="es-CO"/>
-        </w:rPr>
-      </w:pPr>
-      <w:r>
-        <w:rPr>
-          <w:rFonts w:ascii="Arial" w:hAnsi="Arial" w:cs="Arial"/>
-          <w:lang w:val="es-CO"/>
-        </w:rPr>
-        <w:t>Al extraer los datos desde el archivo .xlsx, se verifica el dataframe generado por Pandas, empezando por los nombres de las columnas y se observan las siguientes incidencias:</w:t>
+        <w:t xml:space="preserve">Actualización de </w:t>
+      </w:r>
+      <w:proofErr w:type="spellStart"/>
+      <w:r>
+        <w:rPr>
+          <w:rFonts w:ascii="Arial" w:hAnsi="Arial" w:cs="Arial"/>
+          <w:lang w:val="es-CO"/>
+        </w:rPr>
+        <w:t>headers</w:t>
+      </w:r>
+      <w:proofErr w:type="spellEnd"/>
+    </w:p>
+    <w:p>
+      <w:pPr>
+        <w:rPr>
+          <w:rFonts w:ascii="Arial" w:hAnsi="Arial" w:cs="Arial"/>
+          <w:lang w:val="es-CO"/>
+        </w:rPr>
+      </w:pPr>
+      <w:r>
+        <w:rPr>
+          <w:rFonts w:ascii="Arial" w:hAnsi="Arial" w:cs="Arial"/>
+          <w:lang w:val="es-CO"/>
+        </w:rPr>
+        <w:t xml:space="preserve">Al extraer los datos desde el archivo .xlsx, se verifica el </w:t>
+      </w:r>
+      <w:proofErr w:type="spellStart"/>
+      <w:r>
+        <w:rPr>
+          <w:rFonts w:ascii="Arial" w:hAnsi="Arial" w:cs="Arial"/>
+          <w:lang w:val="es-CO"/>
+        </w:rPr>
+        <w:t>dataframe</w:t>
+      </w:r>
+      <w:proofErr w:type="spellEnd"/>
+      <w:r>
+        <w:rPr>
+          <w:rFonts w:ascii="Arial" w:hAnsi="Arial" w:cs="Arial"/>
+          <w:lang w:val="es-CO"/>
+        </w:rPr>
+        <w:t xml:space="preserve"> generado por Pandas, empezando por los nombres de las columnas y se observan las siguientes incidencias:</w:t>
       </w:r>
     </w:p>
     <w:p>
@@ -499,12 +629,53 @@
           <w:lang w:val="es-CO"/>
         </w:rPr>
       </w:pPr>
-      <w:r>
-        <w:rPr>
-          <w:rFonts w:ascii="Arial" w:hAnsi="Arial" w:cs="Arial"/>
-          <w:lang w:val="es-CO"/>
-        </w:rPr>
-        <w:t>Headers sin nombres descriptivos: headers con nombres por defecto de Pandas tipo ‘Unnamed: X’.</w:t>
+      <w:proofErr w:type="spellStart"/>
+      <w:r>
+        <w:rPr>
+          <w:rFonts w:ascii="Arial" w:hAnsi="Arial" w:cs="Arial"/>
+          <w:lang w:val="es-CO"/>
+        </w:rPr>
+        <w:t>Headers</w:t>
+      </w:r>
+      <w:proofErr w:type="spellEnd"/>
+      <w:r>
+        <w:rPr>
+          <w:rFonts w:ascii="Arial" w:hAnsi="Arial" w:cs="Arial"/>
+          <w:lang w:val="es-CO"/>
+        </w:rPr>
+        <w:t xml:space="preserve"> sin nombres descriptivos: </w:t>
+      </w:r>
+      <w:proofErr w:type="spellStart"/>
+      <w:r>
+        <w:rPr>
+          <w:rFonts w:ascii="Arial" w:hAnsi="Arial" w:cs="Arial"/>
+          <w:lang w:val="es-CO"/>
+        </w:rPr>
+        <w:t>headers</w:t>
+      </w:r>
+      <w:proofErr w:type="spellEnd"/>
+      <w:r>
+        <w:rPr>
+          <w:rFonts w:ascii="Arial" w:hAnsi="Arial" w:cs="Arial"/>
+          <w:lang w:val="es-CO"/>
+        </w:rPr>
+        <w:t xml:space="preserve"> con nombres por defecto de Pandas tipo ‘</w:t>
+      </w:r>
+      <w:proofErr w:type="spellStart"/>
+      <w:r>
+        <w:rPr>
+          <w:rFonts w:ascii="Arial" w:hAnsi="Arial" w:cs="Arial"/>
+          <w:lang w:val="es-CO"/>
+        </w:rPr>
+        <w:t>Unnamed</w:t>
+      </w:r>
+      <w:proofErr w:type="spellEnd"/>
+      <w:r>
+        <w:rPr>
+          <w:rFonts w:ascii="Arial" w:hAnsi="Arial" w:cs="Arial"/>
+          <w:lang w:val="es-CO"/>
+        </w:rPr>
+        <w:t>: X’.</w:t>
       </w:r>
     </w:p>
     <w:p>
@@ -519,12 +690,21 @@
           <w:lang w:val="es-CO"/>
         </w:rPr>
       </w:pPr>
-      <w:r>
-        <w:rPr>
-          <w:rFonts w:ascii="Arial" w:hAnsi="Arial" w:cs="Arial"/>
-          <w:lang w:val="es-CO"/>
-        </w:rPr>
-        <w:t>Headers en jerarquías inferiores debido a la agrupación de datos: ‘Hombre’ y ‘Mujer’ se encuentran en la primera fila de datos debido al diseño del .xlsx donde se busca describir la agrupación por Sexo de los datos.</w:t>
+      <w:proofErr w:type="spellStart"/>
+      <w:r>
+        <w:rPr>
+          <w:rFonts w:ascii="Arial" w:hAnsi="Arial" w:cs="Arial"/>
+          <w:lang w:val="es-CO"/>
+        </w:rPr>
+        <w:t>Headers</w:t>
+      </w:r>
+      <w:proofErr w:type="spellEnd"/>
+      <w:r>
+        <w:rPr>
+          <w:rFonts w:ascii="Arial" w:hAnsi="Arial" w:cs="Arial"/>
+          <w:lang w:val="es-CO"/>
+        </w:rPr>
+        <w:t xml:space="preserve"> en jerarquías inferiores debido a la agrupación de datos: ‘Hombre’ y ‘Mujer’ se encuentran en la primera fila de datos debido al diseño del .xlsx donde se busca describir la agrupación por Sexo de los datos.</w:t>
       </w:r>
     </w:p>
     <w:p>
@@ -544,7 +724,39 @@
           <w:rFonts w:ascii="Arial" w:hAnsi="Arial" w:cs="Arial"/>
           <w:lang w:val="es-CO"/>
         </w:rPr>
-        <w:t>Tildes: Se tienen headers con tildes como ‘Índice de masculinidad’ e ‘Índice de feminidad’, las tildes es mejor evitarlas para evitar errores de charset de las herramientas utilizadas.</w:t>
+        <w:t xml:space="preserve">Tildes: Se tienen </w:t>
+      </w:r>
+      <w:proofErr w:type="spellStart"/>
+      <w:r>
+        <w:rPr>
+          <w:rFonts w:ascii="Arial" w:hAnsi="Arial" w:cs="Arial"/>
+          <w:lang w:val="es-CO"/>
+        </w:rPr>
+        <w:t>headers</w:t>
+      </w:r>
+      <w:proofErr w:type="spellEnd"/>
+      <w:r>
+        <w:rPr>
+          <w:rFonts w:ascii="Arial" w:hAnsi="Arial" w:cs="Arial"/>
+          <w:lang w:val="es-CO"/>
+        </w:rPr>
+        <w:t xml:space="preserve"> con tildes como ‘Índice de masculinidad’ e ‘Índice de feminidad’, las tildes es mejor evitarlas para evitar errores de </w:t>
+      </w:r>
+      <w:proofErr w:type="spellStart"/>
+      <w:r>
+        <w:rPr>
+          <w:rFonts w:ascii="Arial" w:hAnsi="Arial" w:cs="Arial"/>
+          <w:lang w:val="es-CO"/>
+        </w:rPr>
+        <w:t>charset</w:t>
+      </w:r>
+      <w:proofErr w:type="spellEnd"/>
+      <w:r>
+        <w:rPr>
+          <w:rFonts w:ascii="Arial" w:hAnsi="Arial" w:cs="Arial"/>
+          <w:lang w:val="es-CO"/>
+        </w:rPr>
+        <w:t xml:space="preserve"> de las herramientas utilizadas.</w:t>
       </w:r>
     </w:p>
     <w:p>
@@ -638,14 +850,32 @@
           <w:lang w:val="es-CO"/>
         </w:rPr>
       </w:pPr>
+      <w:proofErr w:type="spellStart"/>
       <w:r>
         <w:rPr>
           <w:rFonts w:ascii="Arial" w:hAnsi="Arial" w:cs="Arial"/>
           <w:lang w:val="es-CO"/>
         </w:rPr>
         <w:lastRenderedPageBreak/>
-        <w:t>Unnamed: 2: Area</w:t>
-      </w:r>
+        <w:t>Unnamed</w:t>
+      </w:r>
+      <w:proofErr w:type="spellEnd"/>
+      <w:r>
+        <w:rPr>
+          <w:rFonts w:ascii="Arial" w:hAnsi="Arial" w:cs="Arial"/>
+          <w:lang w:val="es-CO"/>
+        </w:rPr>
+        <w:t xml:space="preserve">: 2: </w:t>
+      </w:r>
+      <w:proofErr w:type="spellStart"/>
+      <w:r>
+        <w:rPr>
+          <w:rFonts w:ascii="Arial" w:hAnsi="Arial" w:cs="Arial"/>
+          <w:lang w:val="es-CO"/>
+        </w:rPr>
+        <w:t>Area</w:t>
+      </w:r>
+      <w:proofErr w:type="spellEnd"/>
     </w:p>
     <w:p>
       <w:pPr>
@@ -659,12 +889,21 @@
           <w:lang w:val="es-CO"/>
         </w:rPr>
       </w:pPr>
-      <w:r>
-        <w:rPr>
-          <w:rFonts w:ascii="Arial" w:hAnsi="Arial" w:cs="Arial"/>
-          <w:lang w:val="es-CO"/>
-        </w:rPr>
-        <w:t>Unnamed: 3: Grupo de edad</w:t>
+      <w:proofErr w:type="spellStart"/>
+      <w:r>
+        <w:rPr>
+          <w:rFonts w:ascii="Arial" w:hAnsi="Arial" w:cs="Arial"/>
+          <w:lang w:val="es-CO"/>
+        </w:rPr>
+        <w:t>Unnamed</w:t>
+      </w:r>
+      <w:proofErr w:type="spellEnd"/>
+      <w:r>
+        <w:rPr>
+          <w:rFonts w:ascii="Arial" w:hAnsi="Arial" w:cs="Arial"/>
+          <w:lang w:val="es-CO"/>
+        </w:rPr>
+        <w:t>: 3: Grupo de edad</w:t>
       </w:r>
     </w:p>
     <w:p>
@@ -699,12 +938,21 @@
           <w:lang w:val="es-CO"/>
         </w:rPr>
       </w:pPr>
-      <w:r>
-        <w:rPr>
-          <w:rFonts w:ascii="Arial" w:hAnsi="Arial" w:cs="Arial"/>
-          <w:lang w:val="es-CO"/>
-        </w:rPr>
-        <w:t>Unnamed 6: Mujer</w:t>
+      <w:proofErr w:type="spellStart"/>
+      <w:r>
+        <w:rPr>
+          <w:rFonts w:ascii="Arial" w:hAnsi="Arial" w:cs="Arial"/>
+          <w:lang w:val="es-CO"/>
+        </w:rPr>
+        <w:t>Unnamed</w:t>
+      </w:r>
+      <w:proofErr w:type="spellEnd"/>
+      <w:r>
+        <w:rPr>
+          <w:rFonts w:ascii="Arial" w:hAnsi="Arial" w:cs="Arial"/>
+          <w:lang w:val="es-CO"/>
+        </w:rPr>
+        <w:t xml:space="preserve"> 6: Mujer</w:t>
       </w:r>
     </w:p>
     <w:p>
@@ -724,7 +972,23 @@
           <w:rFonts w:ascii="Arial" w:hAnsi="Arial" w:cs="Arial"/>
           <w:lang w:val="es-CO"/>
         </w:rPr>
-        <w:t>Índice de masculinidad: Indice de masculinidad</w:t>
+        <w:t xml:space="preserve">Índice de masculinidad: </w:t>
+      </w:r>
+      <w:proofErr w:type="spellStart"/>
+      <w:r>
+        <w:rPr>
+          <w:rFonts w:ascii="Arial" w:hAnsi="Arial" w:cs="Arial"/>
+          <w:lang w:val="es-CO"/>
+        </w:rPr>
+        <w:t>Indice</w:t>
+      </w:r>
+      <w:proofErr w:type="spellEnd"/>
+      <w:r>
+        <w:rPr>
+          <w:rFonts w:ascii="Arial" w:hAnsi="Arial" w:cs="Arial"/>
+          <w:lang w:val="es-CO"/>
+        </w:rPr>
+        <w:t xml:space="preserve"> de masculinidad</w:t>
       </w:r>
     </w:p>
     <w:p>
@@ -744,7 +1008,23 @@
           <w:rFonts w:ascii="Arial" w:hAnsi="Arial" w:cs="Arial"/>
           <w:lang w:val="es-CO"/>
         </w:rPr>
-        <w:t>Índice de feminidad: Indice de feminidad</w:t>
+        <w:t xml:space="preserve">Índice de feminidad: </w:t>
+      </w:r>
+      <w:proofErr w:type="spellStart"/>
+      <w:r>
+        <w:rPr>
+          <w:rFonts w:ascii="Arial" w:hAnsi="Arial" w:cs="Arial"/>
+          <w:lang w:val="es-CO"/>
+        </w:rPr>
+        <w:t>Indice</w:t>
+      </w:r>
+      <w:proofErr w:type="spellEnd"/>
+      <w:r>
+        <w:rPr>
+          <w:rFonts w:ascii="Arial" w:hAnsi="Arial" w:cs="Arial"/>
+          <w:lang w:val="es-CO"/>
+        </w:rPr>
+        <w:t xml:space="preserve"> de feminidad</w:t>
       </w:r>
     </w:p>
     <w:p>
@@ -845,7 +1125,23 @@
           <w:rFonts w:ascii="Arial" w:hAnsi="Arial" w:cs="Arial"/>
           <w:lang w:val="es-CO"/>
         </w:rPr>
-        <w:t>Se evidencian dos columnas sin datos o con datos irrelevantes para el dataset que pueden ser eliminadas:</w:t>
+        <w:t xml:space="preserve">Se evidencian dos columnas sin datos o con datos irrelevantes para el </w:t>
+      </w:r>
+      <w:proofErr w:type="spellStart"/>
+      <w:r>
+        <w:rPr>
+          <w:rFonts w:ascii="Arial" w:hAnsi="Arial" w:cs="Arial"/>
+          <w:lang w:val="es-CO"/>
+        </w:rPr>
+        <w:t>dataset</w:t>
+      </w:r>
+      <w:proofErr w:type="spellEnd"/>
+      <w:r>
+        <w:rPr>
+          <w:rFonts w:ascii="Arial" w:hAnsi="Arial" w:cs="Arial"/>
+          <w:lang w:val="es-CO"/>
+        </w:rPr>
+        <w:t xml:space="preserve"> que pueden ser eliminadas:</w:t>
       </w:r>
     </w:p>
     <w:p>
@@ -887,12 +1183,21 @@
           <w:lang w:val="es-CO"/>
         </w:rPr>
       </w:pPr>
-      <w:r>
-        <w:rPr>
-          <w:rFonts w:ascii="Arial" w:hAnsi="Arial" w:cs="Arial"/>
-          <w:lang w:val="es-CO"/>
-        </w:rPr>
-        <w:t>Unnamed: 1: Contiene el municipio, para este caso particular es irrelevante porque solo se tratarán datos del municipio de Viterbo, Caldas, pero se tendrá en cuenta para un futuro proyecto que involucre múltiples municipios al mismo tiempo.</w:t>
+      <w:proofErr w:type="spellStart"/>
+      <w:r>
+        <w:rPr>
+          <w:rFonts w:ascii="Arial" w:hAnsi="Arial" w:cs="Arial"/>
+          <w:lang w:val="es-CO"/>
+        </w:rPr>
+        <w:t>Unnamed</w:t>
+      </w:r>
+      <w:proofErr w:type="spellEnd"/>
+      <w:r>
+        <w:rPr>
+          <w:rFonts w:ascii="Arial" w:hAnsi="Arial" w:cs="Arial"/>
+          <w:lang w:val="es-CO"/>
+        </w:rPr>
+        <w:t>: 1: Contiene el municipio, para este caso particular es irrelevante porque solo se tratarán datos del municipio de Viterbo, Caldas, pero se tendrá en cuenta para un futuro proyecto que involucre múltiples municipios al mismo tiempo.</w:t>
       </w:r>
     </w:p>
     <w:p>
@@ -1026,22 +1331,95 @@
           <w:rFonts w:ascii="Arial" w:hAnsi="Arial" w:cs="Arial"/>
           <w:lang w:val="es-CO"/>
         </w:rPr>
-        <w:t>Tratamiento de valores Nulos, en blanco o NaN</w:t>
-      </w:r>
-    </w:p>
-    <w:p>
-      <w:pPr>
-        <w:rPr>
-          <w:rFonts w:ascii="Arial" w:hAnsi="Arial" w:cs="Arial"/>
-          <w:lang w:val="es-CO"/>
-        </w:rPr>
-      </w:pPr>
-      <w:r>
-        <w:rPr>
-          <w:rFonts w:ascii="Arial" w:hAnsi="Arial" w:cs="Arial"/>
-          <w:lang w:val="es-CO"/>
-        </w:rPr>
-        <w:t>La única columna con valores NaN es la columna ‘Area’, la cual indica el área de recolección de datos en el municipio, Totales, cabecera municipal, centros poblados, zonas rurales dispersas, la presencia de valores NaN se debe a la agrupación realizada en el diseño del .xlsx, el enfoque para resolver esta inconsistencia será propagar el primer valor válido hasta el siguiente valor válido y repetir hasta reemplazar todos los valores NaN.</w:t>
+        <w:t xml:space="preserve">Tratamiento de valores Nulos, en blanco o </w:t>
+      </w:r>
+      <w:proofErr w:type="spellStart"/>
+      <w:r>
+        <w:rPr>
+          <w:rFonts w:ascii="Arial" w:hAnsi="Arial" w:cs="Arial"/>
+          <w:lang w:val="es-CO"/>
+        </w:rPr>
+        <w:t>NaN</w:t>
+      </w:r>
+      <w:proofErr w:type="spellEnd"/>
+    </w:p>
+    <w:p>
+      <w:pPr>
+        <w:rPr>
+          <w:rFonts w:ascii="Arial" w:hAnsi="Arial" w:cs="Arial"/>
+          <w:lang w:val="es-CO"/>
+        </w:rPr>
+      </w:pPr>
+      <w:r>
+        <w:rPr>
+          <w:rFonts w:ascii="Arial" w:hAnsi="Arial" w:cs="Arial"/>
+          <w:lang w:val="es-CO"/>
+        </w:rPr>
+        <w:t xml:space="preserve">La única columna con valores </w:t>
+      </w:r>
+      <w:proofErr w:type="spellStart"/>
+      <w:r>
+        <w:rPr>
+          <w:rFonts w:ascii="Arial" w:hAnsi="Arial" w:cs="Arial"/>
+          <w:lang w:val="es-CO"/>
+        </w:rPr>
+        <w:t>NaN</w:t>
+      </w:r>
+      <w:proofErr w:type="spellEnd"/>
+      <w:r>
+        <w:rPr>
+          <w:rFonts w:ascii="Arial" w:hAnsi="Arial" w:cs="Arial"/>
+          <w:lang w:val="es-CO"/>
+        </w:rPr>
+        <w:t xml:space="preserve"> es la columna ‘</w:t>
+      </w:r>
+      <w:proofErr w:type="spellStart"/>
+      <w:r>
+        <w:rPr>
+          <w:rFonts w:ascii="Arial" w:hAnsi="Arial" w:cs="Arial"/>
+          <w:lang w:val="es-CO"/>
+        </w:rPr>
+        <w:t>Area</w:t>
+      </w:r>
+      <w:proofErr w:type="spellEnd"/>
+      <w:r>
+        <w:rPr>
+          <w:rFonts w:ascii="Arial" w:hAnsi="Arial" w:cs="Arial"/>
+          <w:lang w:val="es-CO"/>
+        </w:rPr>
+        <w:t xml:space="preserve">’, la cual indica el área de recolección de datos en el municipio, Totales, cabecera municipal, centros poblados, zonas rurales dispersas, la presencia de valores </w:t>
+      </w:r>
+      <w:proofErr w:type="spellStart"/>
+      <w:r>
+        <w:rPr>
+          <w:rFonts w:ascii="Arial" w:hAnsi="Arial" w:cs="Arial"/>
+          <w:lang w:val="es-CO"/>
+        </w:rPr>
+        <w:t>NaN</w:t>
+      </w:r>
+      <w:proofErr w:type="spellEnd"/>
+      <w:r>
+        <w:rPr>
+          <w:rFonts w:ascii="Arial" w:hAnsi="Arial" w:cs="Arial"/>
+          <w:lang w:val="es-CO"/>
+        </w:rPr>
+        <w:t xml:space="preserve"> se debe a la agrupación realizada en el diseño del .xlsx, el enfoque para resolver esta inconsistencia será propagar el primer valor válido hasta el siguiente valor válido y repetir hasta reemplazar todos los valores </w:t>
+      </w:r>
+      <w:proofErr w:type="spellStart"/>
+      <w:r>
+        <w:rPr>
+          <w:rFonts w:ascii="Arial" w:hAnsi="Arial" w:cs="Arial"/>
+          <w:lang w:val="es-CO"/>
+        </w:rPr>
+        <w:t>NaN</w:t>
+      </w:r>
+      <w:proofErr w:type="spellEnd"/>
+      <w:r>
+        <w:rPr>
+          <w:rFonts w:ascii="Arial" w:hAnsi="Arial" w:cs="Arial"/>
+          <w:lang w:val="es-CO"/>
+        </w:rPr>
+        <w:t>.</w:t>
       </w:r>
     </w:p>
     <w:p>
@@ -1363,7 +1741,23 @@
           <w:rFonts w:ascii="Arial" w:hAnsi="Arial" w:cs="Arial"/>
           <w:lang w:val="es-CO"/>
         </w:rPr>
-        <w:t>Se empieza por extraer solo la parte correspondiente a los datos del archivo excel, para lo cual se ignoran las primeras 9 filas de la hoja</w:t>
+        <w:t xml:space="preserve">Se empieza por extraer solo la parte correspondiente a los datos del archivo </w:t>
+      </w:r>
+      <w:proofErr w:type="spellStart"/>
+      <w:r>
+        <w:rPr>
+          <w:rFonts w:ascii="Arial" w:hAnsi="Arial" w:cs="Arial"/>
+          <w:lang w:val="es-CO"/>
+        </w:rPr>
+        <w:t>excel</w:t>
+      </w:r>
+      <w:proofErr w:type="spellEnd"/>
+      <w:r>
+        <w:rPr>
+          <w:rFonts w:ascii="Arial" w:hAnsi="Arial" w:cs="Arial"/>
+          <w:lang w:val="es-CO"/>
+        </w:rPr>
+        <w:t>, para lo cual se ignoran las primeras 9 filas de la hoja</w:t>
       </w:r>
     </w:p>
     <w:p>
@@ -1622,22 +2016,47 @@
           <w:rFonts w:ascii="Arial" w:hAnsi="Arial" w:cs="Arial"/>
           <w:lang w:val="es-CO"/>
         </w:rPr>
-        <w:t>Actualización de headers</w:t>
-      </w:r>
-    </w:p>
-    <w:p>
-      <w:pPr>
-        <w:rPr>
-          <w:rFonts w:ascii="Arial" w:hAnsi="Arial" w:cs="Arial"/>
-          <w:lang w:val="es-CO"/>
-        </w:rPr>
-      </w:pPr>
-      <w:r>
-        <w:rPr>
-          <w:rFonts w:ascii="Arial" w:hAnsi="Arial" w:cs="Arial"/>
-          <w:lang w:val="es-CO"/>
-        </w:rPr>
-        <w:t>Al extraer los datos desde el archivo .xlsx, se verifica el dataframe generado por Pandas, empezando por los nombres de las columnas y se observan las siguientes incidencias:</w:t>
+        <w:t xml:space="preserve">Actualización de </w:t>
+      </w:r>
+      <w:proofErr w:type="spellStart"/>
+      <w:r>
+        <w:rPr>
+          <w:rFonts w:ascii="Arial" w:hAnsi="Arial" w:cs="Arial"/>
+          <w:lang w:val="es-CO"/>
+        </w:rPr>
+        <w:t>headers</w:t>
+      </w:r>
+      <w:proofErr w:type="spellEnd"/>
+    </w:p>
+    <w:p>
+      <w:pPr>
+        <w:rPr>
+          <w:rFonts w:ascii="Arial" w:hAnsi="Arial" w:cs="Arial"/>
+          <w:lang w:val="es-CO"/>
+        </w:rPr>
+      </w:pPr>
+      <w:r>
+        <w:rPr>
+          <w:rFonts w:ascii="Arial" w:hAnsi="Arial" w:cs="Arial"/>
+          <w:lang w:val="es-CO"/>
+        </w:rPr>
+        <w:t xml:space="preserve">Al extraer los datos desde el archivo .xlsx, se verifica el </w:t>
+      </w:r>
+      <w:proofErr w:type="spellStart"/>
+      <w:r>
+        <w:rPr>
+          <w:rFonts w:ascii="Arial" w:hAnsi="Arial" w:cs="Arial"/>
+          <w:lang w:val="es-CO"/>
+        </w:rPr>
+        <w:t>dataframe</w:t>
+      </w:r>
+      <w:proofErr w:type="spellEnd"/>
+      <w:r>
+        <w:rPr>
+          <w:rFonts w:ascii="Arial" w:hAnsi="Arial" w:cs="Arial"/>
+          <w:lang w:val="es-CO"/>
+        </w:rPr>
+        <w:t xml:space="preserve"> generado por Pandas, empezando por los nombres de las columnas y se observan las siguientes incidencias:</w:t>
       </w:r>
     </w:p>
     <w:p>
@@ -1652,12 +2071,53 @@
           <w:lang w:val="es-CO"/>
         </w:rPr>
       </w:pPr>
-      <w:r>
-        <w:rPr>
-          <w:rFonts w:ascii="Arial" w:hAnsi="Arial" w:cs="Arial"/>
-          <w:lang w:val="es-CO"/>
-        </w:rPr>
-        <w:t>Headers sin nombres descriptivos: headers con nombres por defecto de Pandas tipo ‘Unnamed: X’.</w:t>
+      <w:proofErr w:type="spellStart"/>
+      <w:r>
+        <w:rPr>
+          <w:rFonts w:ascii="Arial" w:hAnsi="Arial" w:cs="Arial"/>
+          <w:lang w:val="es-CO"/>
+        </w:rPr>
+        <w:t>Headers</w:t>
+      </w:r>
+      <w:proofErr w:type="spellEnd"/>
+      <w:r>
+        <w:rPr>
+          <w:rFonts w:ascii="Arial" w:hAnsi="Arial" w:cs="Arial"/>
+          <w:lang w:val="es-CO"/>
+        </w:rPr>
+        <w:t xml:space="preserve"> sin nombres descriptivos: </w:t>
+      </w:r>
+      <w:proofErr w:type="spellStart"/>
+      <w:r>
+        <w:rPr>
+          <w:rFonts w:ascii="Arial" w:hAnsi="Arial" w:cs="Arial"/>
+          <w:lang w:val="es-CO"/>
+        </w:rPr>
+        <w:t>headers</w:t>
+      </w:r>
+      <w:proofErr w:type="spellEnd"/>
+      <w:r>
+        <w:rPr>
+          <w:rFonts w:ascii="Arial" w:hAnsi="Arial" w:cs="Arial"/>
+          <w:lang w:val="es-CO"/>
+        </w:rPr>
+        <w:t xml:space="preserve"> con nombres por defecto de Pandas tipo ‘</w:t>
+      </w:r>
+      <w:proofErr w:type="spellStart"/>
+      <w:r>
+        <w:rPr>
+          <w:rFonts w:ascii="Arial" w:hAnsi="Arial" w:cs="Arial"/>
+          <w:lang w:val="es-CO"/>
+        </w:rPr>
+        <w:t>Unnamed</w:t>
+      </w:r>
+      <w:proofErr w:type="spellEnd"/>
+      <w:r>
+        <w:rPr>
+          <w:rFonts w:ascii="Arial" w:hAnsi="Arial" w:cs="Arial"/>
+          <w:lang w:val="es-CO"/>
+        </w:rPr>
+        <w:t>: X’.</w:t>
       </w:r>
     </w:p>
     <w:p>
@@ -1672,27 +2132,68 @@
           <w:lang w:val="es-CO"/>
         </w:rPr>
       </w:pPr>
-      <w:r>
-        <w:rPr>
-          <w:rFonts w:ascii="Arial" w:hAnsi="Arial" w:cs="Arial"/>
-          <w:lang w:val="es-CO"/>
-        </w:rPr>
-        <w:t>Headers en jerarquías inferiores debido a la agrupación de datos: ‘Hombre’ y ‘Mujer’ se encuentran en la primera fila de datos debido al diseño del .xlsx donde se busca describir la agrupación por Sexo de los datos.</w:t>
-      </w:r>
-    </w:p>
-    <w:p>
-      <w:pPr>
-        <w:rPr>
-          <w:rFonts w:ascii="Arial" w:hAnsi="Arial" w:cs="Arial"/>
-          <w:lang w:val="es-CO"/>
-        </w:rPr>
-      </w:pPr>
-      <w:r>
-        <w:rPr>
-          <w:rFonts w:ascii="Arial" w:hAnsi="Arial" w:cs="Arial"/>
-          <w:lang w:val="es-CO"/>
-        </w:rPr>
-        <w:t>Debido a la agrupación de datos en las columnas, se divide el dataframe en 3 partes, correspondientes a las áreas, ignorando el total para remover resúmenes de datos en el dataset final. Luego de dividirlos, se reemplazan los nombres de las columnas de la siguiente manera:</w:t>
+      <w:proofErr w:type="spellStart"/>
+      <w:r>
+        <w:rPr>
+          <w:rFonts w:ascii="Arial" w:hAnsi="Arial" w:cs="Arial"/>
+          <w:lang w:val="es-CO"/>
+        </w:rPr>
+        <w:t>Headers</w:t>
+      </w:r>
+      <w:proofErr w:type="spellEnd"/>
+      <w:r>
+        <w:rPr>
+          <w:rFonts w:ascii="Arial" w:hAnsi="Arial" w:cs="Arial"/>
+          <w:lang w:val="es-CO"/>
+        </w:rPr>
+        <w:t xml:space="preserve"> en jerarquías inferiores debido a la agrupación de datos: ‘Hombre’ y ‘Mujer’ se encuentran en la primera fila de datos debido al diseño del .xlsx donde se busca describir la agrupación por Sexo de los datos.</w:t>
+      </w:r>
+    </w:p>
+    <w:p>
+      <w:pPr>
+        <w:rPr>
+          <w:rFonts w:ascii="Arial" w:hAnsi="Arial" w:cs="Arial"/>
+          <w:lang w:val="es-CO"/>
+        </w:rPr>
+      </w:pPr>
+      <w:r>
+        <w:rPr>
+          <w:rFonts w:ascii="Arial" w:hAnsi="Arial" w:cs="Arial"/>
+          <w:lang w:val="es-CO"/>
+        </w:rPr>
+        <w:t xml:space="preserve">Debido a la agrupación de datos en las columnas, se divide el </w:t>
+      </w:r>
+      <w:proofErr w:type="spellStart"/>
+      <w:r>
+        <w:rPr>
+          <w:rFonts w:ascii="Arial" w:hAnsi="Arial" w:cs="Arial"/>
+          <w:lang w:val="es-CO"/>
+        </w:rPr>
+        <w:t>dataframe</w:t>
+      </w:r>
+      <w:proofErr w:type="spellEnd"/>
+      <w:r>
+        <w:rPr>
+          <w:rFonts w:ascii="Arial" w:hAnsi="Arial" w:cs="Arial"/>
+          <w:lang w:val="es-CO"/>
+        </w:rPr>
+        <w:t xml:space="preserve"> en 3 partes, correspondientes a las áreas, ignorando el total para remover resúmenes de datos en el </w:t>
+      </w:r>
+      <w:proofErr w:type="spellStart"/>
+      <w:r>
+        <w:rPr>
+          <w:rFonts w:ascii="Arial" w:hAnsi="Arial" w:cs="Arial"/>
+          <w:lang w:val="es-CO"/>
+        </w:rPr>
+        <w:t>dataset</w:t>
+      </w:r>
+      <w:proofErr w:type="spellEnd"/>
+      <w:r>
+        <w:rPr>
+          <w:rFonts w:ascii="Arial" w:hAnsi="Arial" w:cs="Arial"/>
+          <w:lang w:val="es-CO"/>
+        </w:rPr>
+        <w:t xml:space="preserve"> final. Luego de dividirlos, se reemplazan los nombres de las columnas de la siguiente manera:</w:t>
       </w:r>
     </w:p>
     <w:p>
@@ -1707,12 +2208,21 @@
           <w:lang w:val="es-CO"/>
         </w:rPr>
       </w:pPr>
-      <w:r>
-        <w:rPr>
-          <w:rFonts w:ascii="Arial" w:hAnsi="Arial" w:cs="Arial"/>
-          <w:lang w:val="es-CO"/>
-        </w:rPr>
-        <w:t>Unnamed: 3: Edad</w:t>
+      <w:proofErr w:type="spellStart"/>
+      <w:r>
+        <w:rPr>
+          <w:rFonts w:ascii="Arial" w:hAnsi="Arial" w:cs="Arial"/>
+          <w:lang w:val="es-CO"/>
+        </w:rPr>
+        <w:t>Unnamed</w:t>
+      </w:r>
+      <w:proofErr w:type="spellEnd"/>
+      <w:r>
+        <w:rPr>
+          <w:rFonts w:ascii="Arial" w:hAnsi="Arial" w:cs="Arial"/>
+          <w:lang w:val="es-CO"/>
+        </w:rPr>
+        <w:t>: 3: Edad</w:t>
       </w:r>
     </w:p>
     <w:p>
@@ -1727,12 +2237,21 @@
           <w:lang w:val="es-CO"/>
         </w:rPr>
       </w:pPr>
-      <w:r>
-        <w:rPr>
-          <w:rFonts w:ascii="Arial" w:hAnsi="Arial" w:cs="Arial"/>
-          <w:lang w:val="es-CO"/>
-        </w:rPr>
-        <w:t>Unnamed: 8: Hombre</w:t>
+      <w:proofErr w:type="spellStart"/>
+      <w:r>
+        <w:rPr>
+          <w:rFonts w:ascii="Arial" w:hAnsi="Arial" w:cs="Arial"/>
+          <w:lang w:val="es-CO"/>
+        </w:rPr>
+        <w:t>Unnamed</w:t>
+      </w:r>
+      <w:proofErr w:type="spellEnd"/>
+      <w:r>
+        <w:rPr>
+          <w:rFonts w:ascii="Arial" w:hAnsi="Arial" w:cs="Arial"/>
+          <w:lang w:val="es-CO"/>
+        </w:rPr>
+        <w:t>: 8: Hombre</w:t>
       </w:r>
     </w:p>
     <w:p>
@@ -1747,12 +2266,21 @@
           <w:lang w:val="es-CO"/>
         </w:rPr>
       </w:pPr>
-      <w:r>
-        <w:rPr>
-          <w:rFonts w:ascii="Arial" w:hAnsi="Arial" w:cs="Arial"/>
-          <w:lang w:val="es-CO"/>
-        </w:rPr>
-        <w:t>Unnamed: 9: Mujer</w:t>
+      <w:proofErr w:type="spellStart"/>
+      <w:r>
+        <w:rPr>
+          <w:rFonts w:ascii="Arial" w:hAnsi="Arial" w:cs="Arial"/>
+          <w:lang w:val="es-CO"/>
+        </w:rPr>
+        <w:t>Unnamed</w:t>
+      </w:r>
+      <w:proofErr w:type="spellEnd"/>
+      <w:r>
+        <w:rPr>
+          <w:rFonts w:ascii="Arial" w:hAnsi="Arial" w:cs="Arial"/>
+          <w:lang w:val="es-CO"/>
+        </w:rPr>
+        <w:t>: 9: Mujer</w:t>
       </w:r>
     </w:p>
     <w:p>
@@ -1767,13 +2295,22 @@
           <w:lang w:val="es-CO"/>
         </w:rPr>
       </w:pPr>
+      <w:proofErr w:type="spellStart"/>
       <w:r>
         <w:rPr>
           <w:rFonts w:ascii="Arial" w:hAnsi="Arial" w:cs="Arial"/>
           <w:lang w:val="es-CO"/>
         </w:rPr>
         <w:lastRenderedPageBreak/>
-        <w:t>Unnamed: 11: Hombre</w:t>
+        <w:t>Unnamed</w:t>
+      </w:r>
+      <w:proofErr w:type="spellEnd"/>
+      <w:r>
+        <w:rPr>
+          <w:rFonts w:ascii="Arial" w:hAnsi="Arial" w:cs="Arial"/>
+          <w:lang w:val="es-CO"/>
+        </w:rPr>
+        <w:t>: 11: Hombre</w:t>
       </w:r>
     </w:p>
     <w:p>
@@ -1788,12 +2325,21 @@
           <w:lang w:val="es-CO"/>
         </w:rPr>
       </w:pPr>
-      <w:r>
-        <w:rPr>
-          <w:rFonts w:ascii="Arial" w:hAnsi="Arial" w:cs="Arial"/>
-          <w:lang w:val="es-CO"/>
-        </w:rPr>
-        <w:t>Unnamed: 12: Mujer</w:t>
+      <w:proofErr w:type="spellStart"/>
+      <w:r>
+        <w:rPr>
+          <w:rFonts w:ascii="Arial" w:hAnsi="Arial" w:cs="Arial"/>
+          <w:lang w:val="es-CO"/>
+        </w:rPr>
+        <w:t>Unnamed</w:t>
+      </w:r>
+      <w:proofErr w:type="spellEnd"/>
+      <w:r>
+        <w:rPr>
+          <w:rFonts w:ascii="Arial" w:hAnsi="Arial" w:cs="Arial"/>
+          <w:lang w:val="es-CO"/>
+        </w:rPr>
+        <w:t>: 12: Mujer</w:t>
       </w:r>
     </w:p>
     <w:p>
@@ -1808,12 +2354,21 @@
           <w:lang w:val="es-CO"/>
         </w:rPr>
       </w:pPr>
-      <w:r>
-        <w:rPr>
-          <w:rFonts w:ascii="Arial" w:hAnsi="Arial" w:cs="Arial"/>
-          <w:lang w:val="es-CO"/>
-        </w:rPr>
-        <w:t>Unnamed: 14: Hombre</w:t>
+      <w:proofErr w:type="spellStart"/>
+      <w:r>
+        <w:rPr>
+          <w:rFonts w:ascii="Arial" w:hAnsi="Arial" w:cs="Arial"/>
+          <w:lang w:val="es-CO"/>
+        </w:rPr>
+        <w:t>Unnamed</w:t>
+      </w:r>
+      <w:proofErr w:type="spellEnd"/>
+      <w:r>
+        <w:rPr>
+          <w:rFonts w:ascii="Arial" w:hAnsi="Arial" w:cs="Arial"/>
+          <w:lang w:val="es-CO"/>
+        </w:rPr>
+        <w:t>: 14: Hombre</w:t>
       </w:r>
     </w:p>
     <w:p>
@@ -1828,28 +2383,62 @@
           <w:lang w:val="es-CO"/>
         </w:rPr>
       </w:pPr>
-      <w:r>
-        <w:rPr>
-          <w:rFonts w:ascii="Arial" w:hAnsi="Arial" w:cs="Arial"/>
-          <w:lang w:val="es-CO"/>
-        </w:rPr>
-        <w:t>Unnamed: 15: Mujer</w:t>
-      </w:r>
-    </w:p>
-    <w:p>
-      <w:pPr>
-        <w:rPr>
-          <w:rFonts w:ascii="Arial" w:hAnsi="Arial" w:cs="Arial"/>
-          <w:lang w:val="es-CO"/>
-        </w:rPr>
-      </w:pPr>
-      <w:r>
-        <w:rPr>
-          <w:rFonts w:ascii="Arial" w:hAnsi="Arial" w:cs="Arial"/>
-          <w:lang w:val="es-CO"/>
-        </w:rPr>
-        <w:t>Para identificar el área, se crea una nueva columna ‘Area’ indicando el área de análisis (cabecera, centro poblado, rural disperso), en cada subconjunto, y se unen los subconjuntos como un solo dataframe</w:t>
-      </w:r>
+      <w:proofErr w:type="spellStart"/>
+      <w:r>
+        <w:rPr>
+          <w:rFonts w:ascii="Arial" w:hAnsi="Arial" w:cs="Arial"/>
+          <w:lang w:val="es-CO"/>
+        </w:rPr>
+        <w:t>Unnamed</w:t>
+      </w:r>
+      <w:proofErr w:type="spellEnd"/>
+      <w:r>
+        <w:rPr>
+          <w:rFonts w:ascii="Arial" w:hAnsi="Arial" w:cs="Arial"/>
+          <w:lang w:val="es-CO"/>
+        </w:rPr>
+        <w:t>: 15: Mujer</w:t>
+      </w:r>
+    </w:p>
+    <w:p>
+      <w:pPr>
+        <w:rPr>
+          <w:rFonts w:ascii="Arial" w:hAnsi="Arial" w:cs="Arial"/>
+          <w:lang w:val="es-CO"/>
+        </w:rPr>
+      </w:pPr>
+      <w:r>
+        <w:rPr>
+          <w:rFonts w:ascii="Arial" w:hAnsi="Arial" w:cs="Arial"/>
+          <w:lang w:val="es-CO"/>
+        </w:rPr>
+        <w:t>Para identificar el área, se crea una nueva columna ‘</w:t>
+      </w:r>
+      <w:proofErr w:type="spellStart"/>
+      <w:r>
+        <w:rPr>
+          <w:rFonts w:ascii="Arial" w:hAnsi="Arial" w:cs="Arial"/>
+          <w:lang w:val="es-CO"/>
+        </w:rPr>
+        <w:t>Area</w:t>
+      </w:r>
+      <w:proofErr w:type="spellEnd"/>
+      <w:r>
+        <w:rPr>
+          <w:rFonts w:ascii="Arial" w:hAnsi="Arial" w:cs="Arial"/>
+          <w:lang w:val="es-CO"/>
+        </w:rPr>
+        <w:t xml:space="preserve">’ indicando el área de análisis (cabecera, centro poblado, rural disperso), en cada subconjunto, y se unen los subconjuntos como un solo </w:t>
+      </w:r>
+      <w:proofErr w:type="spellStart"/>
+      <w:r>
+        <w:rPr>
+          <w:rFonts w:ascii="Arial" w:hAnsi="Arial" w:cs="Arial"/>
+          <w:lang w:val="es-CO"/>
+        </w:rPr>
+        <w:t>dataframe</w:t>
+      </w:r>
+      <w:proofErr w:type="spellEnd"/>
       <w:r>
         <w:rPr>
           <w:rFonts w:ascii="Arial" w:hAnsi="Arial" w:cs="Arial"/>
@@ -2044,7 +2633,23 @@
           <w:rFonts w:ascii="Arial" w:hAnsi="Arial" w:cs="Arial"/>
           <w:lang w:val="es-CO"/>
         </w:rPr>
-        <w:t>Se empieza por extraer solo la parte correspondiente a los datos del archivo excel, para lo cual se ignoran las primeras 9 filas de la hoja</w:t>
+        <w:t xml:space="preserve">Se empieza por extraer solo la parte correspondiente a los datos del archivo </w:t>
+      </w:r>
+      <w:proofErr w:type="spellStart"/>
+      <w:r>
+        <w:rPr>
+          <w:rFonts w:ascii="Arial" w:hAnsi="Arial" w:cs="Arial"/>
+          <w:lang w:val="es-CO"/>
+        </w:rPr>
+        <w:t>excel</w:t>
+      </w:r>
+      <w:proofErr w:type="spellEnd"/>
+      <w:r>
+        <w:rPr>
+          <w:rFonts w:ascii="Arial" w:hAnsi="Arial" w:cs="Arial"/>
+          <w:lang w:val="es-CO"/>
+        </w:rPr>
+        <w:t>, para lo cual se ignoran las primeras 9 filas de la hoja</w:t>
       </w:r>
       <w:r>
         <w:rPr>
@@ -2130,22 +2735,47 @@
           <w:rFonts w:ascii="Arial" w:hAnsi="Arial" w:cs="Arial"/>
           <w:lang w:val="es-CO"/>
         </w:rPr>
-        <w:t>Actualización de headers</w:t>
-      </w:r>
-    </w:p>
-    <w:p>
-      <w:pPr>
-        <w:rPr>
-          <w:rFonts w:ascii="Arial" w:hAnsi="Arial" w:cs="Arial"/>
-          <w:lang w:val="es-CO"/>
-        </w:rPr>
-      </w:pPr>
-      <w:r>
-        <w:rPr>
-          <w:rFonts w:ascii="Arial" w:hAnsi="Arial" w:cs="Arial"/>
-          <w:lang w:val="es-CO"/>
-        </w:rPr>
-        <w:t>Al extraer los datos desde el archivo .xlsx, se verifica el dataframe generado por Pandas, empezando por los nombres de las columnas y se observan las siguientes incidencias:</w:t>
+        <w:t xml:space="preserve">Actualización de </w:t>
+      </w:r>
+      <w:proofErr w:type="spellStart"/>
+      <w:r>
+        <w:rPr>
+          <w:rFonts w:ascii="Arial" w:hAnsi="Arial" w:cs="Arial"/>
+          <w:lang w:val="es-CO"/>
+        </w:rPr>
+        <w:t>headers</w:t>
+      </w:r>
+      <w:proofErr w:type="spellEnd"/>
+    </w:p>
+    <w:p>
+      <w:pPr>
+        <w:rPr>
+          <w:rFonts w:ascii="Arial" w:hAnsi="Arial" w:cs="Arial"/>
+          <w:lang w:val="es-CO"/>
+        </w:rPr>
+      </w:pPr>
+      <w:r>
+        <w:rPr>
+          <w:rFonts w:ascii="Arial" w:hAnsi="Arial" w:cs="Arial"/>
+          <w:lang w:val="es-CO"/>
+        </w:rPr>
+        <w:t xml:space="preserve">Al extraer los datos desde el archivo .xlsx, se verifica el </w:t>
+      </w:r>
+      <w:proofErr w:type="spellStart"/>
+      <w:r>
+        <w:rPr>
+          <w:rFonts w:ascii="Arial" w:hAnsi="Arial" w:cs="Arial"/>
+          <w:lang w:val="es-CO"/>
+        </w:rPr>
+        <w:t>dataframe</w:t>
+      </w:r>
+      <w:proofErr w:type="spellEnd"/>
+      <w:r>
+        <w:rPr>
+          <w:rFonts w:ascii="Arial" w:hAnsi="Arial" w:cs="Arial"/>
+          <w:lang w:val="es-CO"/>
+        </w:rPr>
+        <w:t xml:space="preserve"> generado por Pandas, empezando por los nombres de las columnas y se observan las siguientes incidencias:</w:t>
       </w:r>
     </w:p>
     <w:p>
@@ -2160,12 +2790,53 @@
           <w:lang w:val="es-CO"/>
         </w:rPr>
       </w:pPr>
-      <w:r>
-        <w:rPr>
-          <w:rFonts w:ascii="Arial" w:hAnsi="Arial" w:cs="Arial"/>
-          <w:lang w:val="es-CO"/>
-        </w:rPr>
-        <w:t>Headers sin nombres descriptivos: headers con nombres por defecto de Pandas tipo ‘Unnamed: X’.</w:t>
+      <w:proofErr w:type="spellStart"/>
+      <w:r>
+        <w:rPr>
+          <w:rFonts w:ascii="Arial" w:hAnsi="Arial" w:cs="Arial"/>
+          <w:lang w:val="es-CO"/>
+        </w:rPr>
+        <w:t>Headers</w:t>
+      </w:r>
+      <w:proofErr w:type="spellEnd"/>
+      <w:r>
+        <w:rPr>
+          <w:rFonts w:ascii="Arial" w:hAnsi="Arial" w:cs="Arial"/>
+          <w:lang w:val="es-CO"/>
+        </w:rPr>
+        <w:t xml:space="preserve"> sin nombres descriptivos: </w:t>
+      </w:r>
+      <w:proofErr w:type="spellStart"/>
+      <w:r>
+        <w:rPr>
+          <w:rFonts w:ascii="Arial" w:hAnsi="Arial" w:cs="Arial"/>
+          <w:lang w:val="es-CO"/>
+        </w:rPr>
+        <w:t>headers</w:t>
+      </w:r>
+      <w:proofErr w:type="spellEnd"/>
+      <w:r>
+        <w:rPr>
+          <w:rFonts w:ascii="Arial" w:hAnsi="Arial" w:cs="Arial"/>
+          <w:lang w:val="es-CO"/>
+        </w:rPr>
+        <w:t xml:space="preserve"> con nombres por defecto de Pandas tipo ‘</w:t>
+      </w:r>
+      <w:proofErr w:type="spellStart"/>
+      <w:r>
+        <w:rPr>
+          <w:rFonts w:ascii="Arial" w:hAnsi="Arial" w:cs="Arial"/>
+          <w:lang w:val="es-CO"/>
+        </w:rPr>
+        <w:t>Unnamed</w:t>
+      </w:r>
+      <w:proofErr w:type="spellEnd"/>
+      <w:r>
+        <w:rPr>
+          <w:rFonts w:ascii="Arial" w:hAnsi="Arial" w:cs="Arial"/>
+          <w:lang w:val="es-CO"/>
+        </w:rPr>
+        <w:t>: X’.</w:t>
       </w:r>
     </w:p>
     <w:p>
@@ -2180,28 +2851,85 @@
           <w:lang w:val="es-CO"/>
         </w:rPr>
       </w:pPr>
+      <w:proofErr w:type="spellStart"/>
       <w:r>
         <w:rPr>
           <w:rFonts w:ascii="Arial" w:hAnsi="Arial" w:cs="Arial"/>
           <w:lang w:val="es-CO"/>
         </w:rPr>
         <w:lastRenderedPageBreak/>
-        <w:t>Headers en jerarquías inferiores debido a la agrupación de datos: Todos los headers se encuentran en la primera fila de los datos debido al diseño del .xlsx donde se busca describir la agrupación por Relación o parentesco con el jefe(a) del hogar.</w:t>
-      </w:r>
-    </w:p>
-    <w:p>
-      <w:pPr>
-        <w:rPr>
-          <w:rFonts w:ascii="Arial" w:hAnsi="Arial" w:cs="Arial"/>
-          <w:lang w:val="es-CO"/>
-        </w:rPr>
-      </w:pPr>
-      <w:r>
-        <w:rPr>
-          <w:rFonts w:ascii="Arial" w:hAnsi="Arial" w:cs="Arial"/>
-          <w:lang w:val="es-CO"/>
-        </w:rPr>
-        <w:t>Para solucionar esto, se reemplazan los headers actuales desde ‘Relación o parentesco con el jef(a) del hogar’ hasta el último, por los valores correspondientes en la primera fila de datos.</w:t>
+        <w:t>Headers</w:t>
+      </w:r>
+      <w:proofErr w:type="spellEnd"/>
+      <w:r>
+        <w:rPr>
+          <w:rFonts w:ascii="Arial" w:hAnsi="Arial" w:cs="Arial"/>
+          <w:lang w:val="es-CO"/>
+        </w:rPr>
+        <w:t xml:space="preserve"> en jerarquías inferiores debido a la agrupación de datos: Todos los </w:t>
+      </w:r>
+      <w:proofErr w:type="spellStart"/>
+      <w:r>
+        <w:rPr>
+          <w:rFonts w:ascii="Arial" w:hAnsi="Arial" w:cs="Arial"/>
+          <w:lang w:val="es-CO"/>
+        </w:rPr>
+        <w:t>headers</w:t>
+      </w:r>
+      <w:proofErr w:type="spellEnd"/>
+      <w:r>
+        <w:rPr>
+          <w:rFonts w:ascii="Arial" w:hAnsi="Arial" w:cs="Arial"/>
+          <w:lang w:val="es-CO"/>
+        </w:rPr>
+        <w:t xml:space="preserve"> se encuentran en la primera fila de los datos debido al diseño del .xlsx donde se busca describir la agrupación por Relación o parentesco con el jefe(a) del hogar.</w:t>
+      </w:r>
+    </w:p>
+    <w:p>
+      <w:pPr>
+        <w:rPr>
+          <w:rFonts w:ascii="Arial" w:hAnsi="Arial" w:cs="Arial"/>
+          <w:lang w:val="es-CO"/>
+        </w:rPr>
+      </w:pPr>
+      <w:r>
+        <w:rPr>
+          <w:rFonts w:ascii="Arial" w:hAnsi="Arial" w:cs="Arial"/>
+          <w:lang w:val="es-CO"/>
+        </w:rPr>
+        <w:t xml:space="preserve">Para solucionar esto, se reemplazan los </w:t>
+      </w:r>
+      <w:proofErr w:type="spellStart"/>
+      <w:r>
+        <w:rPr>
+          <w:rFonts w:ascii="Arial" w:hAnsi="Arial" w:cs="Arial"/>
+          <w:lang w:val="es-CO"/>
+        </w:rPr>
+        <w:t>headers</w:t>
+      </w:r>
+      <w:proofErr w:type="spellEnd"/>
+      <w:r>
+        <w:rPr>
+          <w:rFonts w:ascii="Arial" w:hAnsi="Arial" w:cs="Arial"/>
+          <w:lang w:val="es-CO"/>
+        </w:rPr>
+        <w:t xml:space="preserve"> actuales desde ‘Relación o parentesco con el </w:t>
+      </w:r>
+      <w:proofErr w:type="spellStart"/>
+      <w:r>
+        <w:rPr>
+          <w:rFonts w:ascii="Arial" w:hAnsi="Arial" w:cs="Arial"/>
+          <w:lang w:val="es-CO"/>
+        </w:rPr>
+        <w:t>jef</w:t>
+      </w:r>
+      <w:proofErr w:type="spellEnd"/>
+      <w:r>
+        <w:rPr>
+          <w:rFonts w:ascii="Arial" w:hAnsi="Arial" w:cs="Arial"/>
+          <w:lang w:val="es-CO"/>
+        </w:rPr>
+        <w:t>(a) del hogar’ hasta el último, por los valores correspondientes en la primera fila de datos.</w:t>
       </w:r>
     </w:p>
     <w:p>
@@ -2351,12 +3079,21 @@
           <w:lang w:val="es-CO"/>
         </w:rPr>
       </w:pPr>
-      <w:r>
-        <w:rPr>
-          <w:rFonts w:ascii="Arial" w:hAnsi="Arial" w:cs="Arial"/>
-          <w:lang w:val="es-CO"/>
-        </w:rPr>
-        <w:t>Unnamed: 1: Municipio</w:t>
+      <w:proofErr w:type="spellStart"/>
+      <w:r>
+        <w:rPr>
+          <w:rFonts w:ascii="Arial" w:hAnsi="Arial" w:cs="Arial"/>
+          <w:lang w:val="es-CO"/>
+        </w:rPr>
+        <w:t>Unnamed</w:t>
+      </w:r>
+      <w:proofErr w:type="spellEnd"/>
+      <w:r>
+        <w:rPr>
+          <w:rFonts w:ascii="Arial" w:hAnsi="Arial" w:cs="Arial"/>
+          <w:lang w:val="es-CO"/>
+        </w:rPr>
+        <w:t>: 1: Municipio</w:t>
       </w:r>
     </w:p>
     <w:p>
@@ -2371,13 +3108,31 @@
           <w:lang w:val="es-CO"/>
         </w:rPr>
       </w:pPr>
-      <w:r>
-        <w:rPr>
-          <w:rFonts w:ascii="Arial" w:hAnsi="Arial" w:cs="Arial"/>
-          <w:lang w:val="es-CO"/>
-        </w:rPr>
-        <w:t>Unnamed: 2: Area</w:t>
-      </w:r>
+      <w:proofErr w:type="spellStart"/>
+      <w:r>
+        <w:rPr>
+          <w:rFonts w:ascii="Arial" w:hAnsi="Arial" w:cs="Arial"/>
+          <w:lang w:val="es-CO"/>
+        </w:rPr>
+        <w:t>Unnamed</w:t>
+      </w:r>
+      <w:proofErr w:type="spellEnd"/>
+      <w:r>
+        <w:rPr>
+          <w:rFonts w:ascii="Arial" w:hAnsi="Arial" w:cs="Arial"/>
+          <w:lang w:val="es-CO"/>
+        </w:rPr>
+        <w:t xml:space="preserve">: 2: </w:t>
+      </w:r>
+      <w:proofErr w:type="spellStart"/>
+      <w:r>
+        <w:rPr>
+          <w:rFonts w:ascii="Arial" w:hAnsi="Arial" w:cs="Arial"/>
+          <w:lang w:val="es-CO"/>
+        </w:rPr>
+        <w:t>Area</w:t>
+      </w:r>
+      <w:proofErr w:type="spellEnd"/>
     </w:p>
     <w:p>
       <w:pPr>
@@ -2391,12 +3146,21 @@
           <w:lang w:val="es-CO"/>
         </w:rPr>
       </w:pPr>
-      <w:r>
-        <w:rPr>
-          <w:rFonts w:ascii="Arial" w:hAnsi="Arial" w:cs="Arial"/>
-          <w:lang w:val="es-CO"/>
-        </w:rPr>
-        <w:t>Unnamed: 3: Sexo</w:t>
+      <w:proofErr w:type="spellStart"/>
+      <w:r>
+        <w:rPr>
+          <w:rFonts w:ascii="Arial" w:hAnsi="Arial" w:cs="Arial"/>
+          <w:lang w:val="es-CO"/>
+        </w:rPr>
+        <w:t>Unnamed</w:t>
+      </w:r>
+      <w:proofErr w:type="spellEnd"/>
+      <w:r>
+        <w:rPr>
+          <w:rFonts w:ascii="Arial" w:hAnsi="Arial" w:cs="Arial"/>
+          <w:lang w:val="es-CO"/>
+        </w:rPr>
+        <w:t>: 3: Sexo</w:t>
       </w:r>
     </w:p>
     <w:p>
@@ -2522,7 +3286,23 @@
           <w:rFonts w:ascii="Arial" w:hAnsi="Arial" w:cs="Arial"/>
           <w:lang w:val="es-CO"/>
         </w:rPr>
-        <w:t>Eliminación de columnas sin información relevante o con información redundante en el dataframe.</w:t>
+        <w:t xml:space="preserve">Eliminación de columnas sin información relevante o con información redundante en el </w:t>
+      </w:r>
+      <w:proofErr w:type="spellStart"/>
+      <w:r>
+        <w:rPr>
+          <w:rFonts w:ascii="Arial" w:hAnsi="Arial" w:cs="Arial"/>
+          <w:lang w:val="es-CO"/>
+        </w:rPr>
+        <w:t>dataframe</w:t>
+      </w:r>
+      <w:proofErr w:type="spellEnd"/>
+      <w:r>
+        <w:rPr>
+          <w:rFonts w:ascii="Arial" w:hAnsi="Arial" w:cs="Arial"/>
+          <w:lang w:val="es-CO"/>
+        </w:rPr>
+        <w:t>.</w:t>
       </w:r>
     </w:p>
     <w:p>
@@ -2723,7 +3503,39 @@
           <w:rFonts w:ascii="Arial" w:hAnsi="Arial" w:cs="Arial"/>
           <w:lang w:val="es-CO"/>
         </w:rPr>
-        <w:t>Se propaga el valor de la columna ‘Area’ para reemplazar los valores NaN.</w:t>
+        <w:t>Se propaga el valor de la columna ‘</w:t>
+      </w:r>
+      <w:proofErr w:type="spellStart"/>
+      <w:r>
+        <w:rPr>
+          <w:rFonts w:ascii="Arial" w:hAnsi="Arial" w:cs="Arial"/>
+          <w:lang w:val="es-CO"/>
+        </w:rPr>
+        <w:t>Area</w:t>
+      </w:r>
+      <w:proofErr w:type="spellEnd"/>
+      <w:r>
+        <w:rPr>
+          <w:rFonts w:ascii="Arial" w:hAnsi="Arial" w:cs="Arial"/>
+          <w:lang w:val="es-CO"/>
+        </w:rPr>
+        <w:t xml:space="preserve">’ para reemplazar los valores </w:t>
+      </w:r>
+      <w:proofErr w:type="spellStart"/>
+      <w:r>
+        <w:rPr>
+          <w:rFonts w:ascii="Arial" w:hAnsi="Arial" w:cs="Arial"/>
+          <w:lang w:val="es-CO"/>
+        </w:rPr>
+        <w:t>NaN</w:t>
+      </w:r>
+      <w:proofErr w:type="spellEnd"/>
+      <w:r>
+        <w:rPr>
+          <w:rFonts w:ascii="Arial" w:hAnsi="Arial" w:cs="Arial"/>
+          <w:lang w:val="es-CO"/>
+        </w:rPr>
+        <w:t>.</w:t>
       </w:r>
     </w:p>
     <w:p>
@@ -2909,7 +3721,23 @@
           <w:rFonts w:ascii="Arial" w:hAnsi="Arial" w:cs="Arial"/>
           <w:lang w:val="es-CO"/>
         </w:rPr>
-        <w:t>Se empieza por extraer solo la parte correspondiente a los datos del archivo excel, para lo cual se ignoran las primeras 9 filas de la hoja.</w:t>
+        <w:t xml:space="preserve">Se empieza por extraer solo la parte correspondiente a los datos del archivo </w:t>
+      </w:r>
+      <w:proofErr w:type="spellStart"/>
+      <w:r>
+        <w:rPr>
+          <w:rFonts w:ascii="Arial" w:hAnsi="Arial" w:cs="Arial"/>
+          <w:lang w:val="es-CO"/>
+        </w:rPr>
+        <w:t>excel</w:t>
+      </w:r>
+      <w:proofErr w:type="spellEnd"/>
+      <w:r>
+        <w:rPr>
+          <w:rFonts w:ascii="Arial" w:hAnsi="Arial" w:cs="Arial"/>
+          <w:lang w:val="es-CO"/>
+        </w:rPr>
+        <w:t>, para lo cual se ignoran las primeras 9 filas de la hoja.</w:t>
       </w:r>
     </w:p>
     <w:p>
@@ -2995,22 +3823,47 @@
           <w:rFonts w:ascii="Arial" w:hAnsi="Arial" w:cs="Arial"/>
           <w:lang w:val="es-CO"/>
         </w:rPr>
-        <w:t>Actualización de headers</w:t>
-      </w:r>
-    </w:p>
-    <w:p>
-      <w:pPr>
-        <w:rPr>
-          <w:rFonts w:ascii="Arial" w:hAnsi="Arial" w:cs="Arial"/>
-          <w:lang w:val="es-CO"/>
-        </w:rPr>
-      </w:pPr>
-      <w:r>
-        <w:rPr>
-          <w:rFonts w:ascii="Arial" w:hAnsi="Arial" w:cs="Arial"/>
-          <w:lang w:val="es-CO"/>
-        </w:rPr>
-        <w:t>Al extraer los datos desde el archivo .xlsx, se verifica el dataframe generado por Pandas, empezando por los nombres de las columnas y se observan las siguientes incidencias:</w:t>
+        <w:t xml:space="preserve">Actualización de </w:t>
+      </w:r>
+      <w:proofErr w:type="spellStart"/>
+      <w:r>
+        <w:rPr>
+          <w:rFonts w:ascii="Arial" w:hAnsi="Arial" w:cs="Arial"/>
+          <w:lang w:val="es-CO"/>
+        </w:rPr>
+        <w:t>headers</w:t>
+      </w:r>
+      <w:proofErr w:type="spellEnd"/>
+    </w:p>
+    <w:p>
+      <w:pPr>
+        <w:rPr>
+          <w:rFonts w:ascii="Arial" w:hAnsi="Arial" w:cs="Arial"/>
+          <w:lang w:val="es-CO"/>
+        </w:rPr>
+      </w:pPr>
+      <w:r>
+        <w:rPr>
+          <w:rFonts w:ascii="Arial" w:hAnsi="Arial" w:cs="Arial"/>
+          <w:lang w:val="es-CO"/>
+        </w:rPr>
+        <w:t xml:space="preserve">Al extraer los datos desde el archivo .xlsx, se verifica el </w:t>
+      </w:r>
+      <w:proofErr w:type="spellStart"/>
+      <w:r>
+        <w:rPr>
+          <w:rFonts w:ascii="Arial" w:hAnsi="Arial" w:cs="Arial"/>
+          <w:lang w:val="es-CO"/>
+        </w:rPr>
+        <w:t>dataframe</w:t>
+      </w:r>
+      <w:proofErr w:type="spellEnd"/>
+      <w:r>
+        <w:rPr>
+          <w:rFonts w:ascii="Arial" w:hAnsi="Arial" w:cs="Arial"/>
+          <w:lang w:val="es-CO"/>
+        </w:rPr>
+        <w:t xml:space="preserve"> generado por Pandas, empezando por los nombres de las columnas y se observan las siguientes incidencias:</w:t>
       </w:r>
     </w:p>
     <w:p>
@@ -3025,12 +3878,53 @@
           <w:lang w:val="es-CO"/>
         </w:rPr>
       </w:pPr>
-      <w:r>
-        <w:rPr>
-          <w:rFonts w:ascii="Arial" w:hAnsi="Arial" w:cs="Arial"/>
-          <w:lang w:val="es-CO"/>
-        </w:rPr>
-        <w:t>Headers sin nombres descriptivos: headers con nombres por defecto de Pandas tipo ‘Unnamed: X’.</w:t>
+      <w:proofErr w:type="spellStart"/>
+      <w:r>
+        <w:rPr>
+          <w:rFonts w:ascii="Arial" w:hAnsi="Arial" w:cs="Arial"/>
+          <w:lang w:val="es-CO"/>
+        </w:rPr>
+        <w:t>Headers</w:t>
+      </w:r>
+      <w:proofErr w:type="spellEnd"/>
+      <w:r>
+        <w:rPr>
+          <w:rFonts w:ascii="Arial" w:hAnsi="Arial" w:cs="Arial"/>
+          <w:lang w:val="es-CO"/>
+        </w:rPr>
+        <w:t xml:space="preserve"> sin nombres descriptivos: </w:t>
+      </w:r>
+      <w:proofErr w:type="spellStart"/>
+      <w:r>
+        <w:rPr>
+          <w:rFonts w:ascii="Arial" w:hAnsi="Arial" w:cs="Arial"/>
+          <w:lang w:val="es-CO"/>
+        </w:rPr>
+        <w:t>headers</w:t>
+      </w:r>
+      <w:proofErr w:type="spellEnd"/>
+      <w:r>
+        <w:rPr>
+          <w:rFonts w:ascii="Arial" w:hAnsi="Arial" w:cs="Arial"/>
+          <w:lang w:val="es-CO"/>
+        </w:rPr>
+        <w:t xml:space="preserve"> con nombres por defecto de Pandas tipo ‘</w:t>
+      </w:r>
+      <w:proofErr w:type="spellStart"/>
+      <w:r>
+        <w:rPr>
+          <w:rFonts w:ascii="Arial" w:hAnsi="Arial" w:cs="Arial"/>
+          <w:lang w:val="es-CO"/>
+        </w:rPr>
+        <w:t>Unnamed</w:t>
+      </w:r>
+      <w:proofErr w:type="spellEnd"/>
+      <w:r>
+        <w:rPr>
+          <w:rFonts w:ascii="Arial" w:hAnsi="Arial" w:cs="Arial"/>
+          <w:lang w:val="es-CO"/>
+        </w:rPr>
+        <w:t>: X’.</w:t>
       </w:r>
     </w:p>
     <w:p>
@@ -3045,27 +3939,84 @@
           <w:lang w:val="es-CO"/>
         </w:rPr>
       </w:pPr>
-      <w:r>
-        <w:rPr>
-          <w:rFonts w:ascii="Arial" w:hAnsi="Arial" w:cs="Arial"/>
-          <w:lang w:val="es-CO"/>
-        </w:rPr>
-        <w:t>Headers en jerarquías inferiores debido a la agrupación de datos: Todos los headers se encuentran en la primera fila de los datos debido al diseño del .xlsx donde se busca describir la agrupación por Relación o parentesco con el jefe(a) del hogar.</w:t>
-      </w:r>
-    </w:p>
-    <w:p>
-      <w:pPr>
-        <w:rPr>
-          <w:rFonts w:ascii="Arial" w:hAnsi="Arial" w:cs="Arial"/>
-          <w:lang w:val="es-CO"/>
-        </w:rPr>
-      </w:pPr>
-      <w:r>
-        <w:rPr>
-          <w:rFonts w:ascii="Arial" w:hAnsi="Arial" w:cs="Arial"/>
-          <w:lang w:val="es-CO"/>
-        </w:rPr>
-        <w:t>Para solucionar esto, se reemplazan los headers actuales desde ‘Relación o parentesco con el jef(a) del hogar’ hasta el último, por los valores correspondientes en la primera fila de datos.</w:t>
+      <w:proofErr w:type="spellStart"/>
+      <w:r>
+        <w:rPr>
+          <w:rFonts w:ascii="Arial" w:hAnsi="Arial" w:cs="Arial"/>
+          <w:lang w:val="es-CO"/>
+        </w:rPr>
+        <w:t>Headers</w:t>
+      </w:r>
+      <w:proofErr w:type="spellEnd"/>
+      <w:r>
+        <w:rPr>
+          <w:rFonts w:ascii="Arial" w:hAnsi="Arial" w:cs="Arial"/>
+          <w:lang w:val="es-CO"/>
+        </w:rPr>
+        <w:t xml:space="preserve"> en jerarquías inferiores debido a la agrupación de datos: Todos los </w:t>
+      </w:r>
+      <w:proofErr w:type="spellStart"/>
+      <w:r>
+        <w:rPr>
+          <w:rFonts w:ascii="Arial" w:hAnsi="Arial" w:cs="Arial"/>
+          <w:lang w:val="es-CO"/>
+        </w:rPr>
+        <w:t>headers</w:t>
+      </w:r>
+      <w:proofErr w:type="spellEnd"/>
+      <w:r>
+        <w:rPr>
+          <w:rFonts w:ascii="Arial" w:hAnsi="Arial" w:cs="Arial"/>
+          <w:lang w:val="es-CO"/>
+        </w:rPr>
+        <w:t xml:space="preserve"> se encuentran en la primera fila de los datos debido al diseño del .xlsx donde se busca describir la agrupación por Relación o parentesco con el jefe(a) del hogar.</w:t>
+      </w:r>
+    </w:p>
+    <w:p>
+      <w:pPr>
+        <w:rPr>
+          <w:rFonts w:ascii="Arial" w:hAnsi="Arial" w:cs="Arial"/>
+          <w:lang w:val="es-CO"/>
+        </w:rPr>
+      </w:pPr>
+      <w:r>
+        <w:rPr>
+          <w:rFonts w:ascii="Arial" w:hAnsi="Arial" w:cs="Arial"/>
+          <w:lang w:val="es-CO"/>
+        </w:rPr>
+        <w:t xml:space="preserve">Para solucionar esto, se reemplazan los </w:t>
+      </w:r>
+      <w:proofErr w:type="spellStart"/>
+      <w:r>
+        <w:rPr>
+          <w:rFonts w:ascii="Arial" w:hAnsi="Arial" w:cs="Arial"/>
+          <w:lang w:val="es-CO"/>
+        </w:rPr>
+        <w:t>headers</w:t>
+      </w:r>
+      <w:proofErr w:type="spellEnd"/>
+      <w:r>
+        <w:rPr>
+          <w:rFonts w:ascii="Arial" w:hAnsi="Arial" w:cs="Arial"/>
+          <w:lang w:val="es-CO"/>
+        </w:rPr>
+        <w:t xml:space="preserve"> actuales desde ‘Relación o parentesco con el </w:t>
+      </w:r>
+      <w:proofErr w:type="spellStart"/>
+      <w:r>
+        <w:rPr>
+          <w:rFonts w:ascii="Arial" w:hAnsi="Arial" w:cs="Arial"/>
+          <w:lang w:val="es-CO"/>
+        </w:rPr>
+        <w:t>jef</w:t>
+      </w:r>
+      <w:proofErr w:type="spellEnd"/>
+      <w:r>
+        <w:rPr>
+          <w:rFonts w:ascii="Arial" w:hAnsi="Arial" w:cs="Arial"/>
+          <w:lang w:val="es-CO"/>
+        </w:rPr>
+        <w:t>(a) del hogar’ hasta el último, por los valores correspondientes en la primera fila de datos.</w:t>
       </w:r>
     </w:p>
     <w:p>
@@ -3208,12 +4159,21 @@
           <w:lang w:val="es-CO"/>
         </w:rPr>
       </w:pPr>
-      <w:r>
-        <w:rPr>
-          <w:rFonts w:ascii="Arial" w:hAnsi="Arial" w:cs="Arial"/>
-          <w:lang w:val="es-CO"/>
-        </w:rPr>
-        <w:t>Unnamed: 1: Municipio</w:t>
+      <w:proofErr w:type="spellStart"/>
+      <w:r>
+        <w:rPr>
+          <w:rFonts w:ascii="Arial" w:hAnsi="Arial" w:cs="Arial"/>
+          <w:lang w:val="es-CO"/>
+        </w:rPr>
+        <w:t>Unnamed</w:t>
+      </w:r>
+      <w:proofErr w:type="spellEnd"/>
+      <w:r>
+        <w:rPr>
+          <w:rFonts w:ascii="Arial" w:hAnsi="Arial" w:cs="Arial"/>
+          <w:lang w:val="es-CO"/>
+        </w:rPr>
+        <w:t>: 1: Municipio</w:t>
       </w:r>
     </w:p>
     <w:p>
@@ -3228,13 +4188,31 @@
           <w:lang w:val="es-CO"/>
         </w:rPr>
       </w:pPr>
-      <w:r>
-        <w:rPr>
-          <w:rFonts w:ascii="Arial" w:hAnsi="Arial" w:cs="Arial"/>
-          <w:lang w:val="es-CO"/>
-        </w:rPr>
-        <w:t>Unnamed: 2: Area</w:t>
-      </w:r>
+      <w:proofErr w:type="spellStart"/>
+      <w:r>
+        <w:rPr>
+          <w:rFonts w:ascii="Arial" w:hAnsi="Arial" w:cs="Arial"/>
+          <w:lang w:val="es-CO"/>
+        </w:rPr>
+        <w:t>Unnamed</w:t>
+      </w:r>
+      <w:proofErr w:type="spellEnd"/>
+      <w:r>
+        <w:rPr>
+          <w:rFonts w:ascii="Arial" w:hAnsi="Arial" w:cs="Arial"/>
+          <w:lang w:val="es-CO"/>
+        </w:rPr>
+        <w:t xml:space="preserve">: 2: </w:t>
+      </w:r>
+      <w:proofErr w:type="spellStart"/>
+      <w:r>
+        <w:rPr>
+          <w:rFonts w:ascii="Arial" w:hAnsi="Arial" w:cs="Arial"/>
+          <w:lang w:val="es-CO"/>
+        </w:rPr>
+        <w:t>Area</w:t>
+      </w:r>
+      <w:proofErr w:type="spellEnd"/>
     </w:p>
     <w:p>
       <w:pPr>
@@ -3248,19 +4226,21 @@
           <w:lang w:val="es-CO"/>
         </w:rPr>
       </w:pPr>
-      <w:r>
-        <w:rPr>
-          <w:rFonts w:ascii="Arial" w:hAnsi="Arial" w:cs="Arial"/>
-          <w:lang w:val="es-CO"/>
-        </w:rPr>
-        <w:t xml:space="preserve">Unnamed: 3: </w:t>
-      </w:r>
-      <w:r>
-        <w:rPr>
-          <w:rFonts w:ascii="Arial" w:hAnsi="Arial" w:cs="Arial"/>
-          <w:lang w:val="es-CO"/>
-        </w:rPr>
-        <w:t>Grupo de edad</w:t>
+      <w:proofErr w:type="spellStart"/>
+      <w:r>
+        <w:rPr>
+          <w:rFonts w:ascii="Arial" w:hAnsi="Arial" w:cs="Arial"/>
+          <w:lang w:val="es-CO"/>
+        </w:rPr>
+        <w:t>Unnamed</w:t>
+      </w:r>
+      <w:proofErr w:type="spellEnd"/>
+      <w:r>
+        <w:rPr>
+          <w:rFonts w:ascii="Arial" w:hAnsi="Arial" w:cs="Arial"/>
+          <w:lang w:val="es-CO"/>
+        </w:rPr>
+        <w:t>: 3: Grupo de edad</w:t>
       </w:r>
     </w:p>
     <w:p>
@@ -3377,7 +4357,23 @@
           <w:rFonts w:ascii="Arial" w:hAnsi="Arial" w:cs="Arial"/>
           <w:lang w:val="es-CO"/>
         </w:rPr>
-        <w:t>Eliminación de columnas sin información relevante o con información redundante en el dataframe.</w:t>
+        <w:t xml:space="preserve">Eliminación de columnas sin información relevante o con información redundante en el </w:t>
+      </w:r>
+      <w:proofErr w:type="spellStart"/>
+      <w:r>
+        <w:rPr>
+          <w:rFonts w:ascii="Arial" w:hAnsi="Arial" w:cs="Arial"/>
+          <w:lang w:val="es-CO"/>
+        </w:rPr>
+        <w:t>dataframe</w:t>
+      </w:r>
+      <w:proofErr w:type="spellEnd"/>
+      <w:r>
+        <w:rPr>
+          <w:rFonts w:ascii="Arial" w:hAnsi="Arial" w:cs="Arial"/>
+          <w:lang w:val="es-CO"/>
+        </w:rPr>
+        <w:t>.</w:t>
       </w:r>
     </w:p>
     <w:p>
@@ -3593,7 +4589,39 @@
           <w:rFonts w:ascii="Arial" w:hAnsi="Arial" w:cs="Arial"/>
           <w:lang w:val="es-CO"/>
         </w:rPr>
-        <w:t>Se propaga el valor de la columna ‘Area’ para reemplazar los valores NaN.</w:t>
+        <w:t>Se propaga el valor de la columna ‘</w:t>
+      </w:r>
+      <w:proofErr w:type="spellStart"/>
+      <w:r>
+        <w:rPr>
+          <w:rFonts w:ascii="Arial" w:hAnsi="Arial" w:cs="Arial"/>
+          <w:lang w:val="es-CO"/>
+        </w:rPr>
+        <w:t>Area</w:t>
+      </w:r>
+      <w:proofErr w:type="spellEnd"/>
+      <w:r>
+        <w:rPr>
+          <w:rFonts w:ascii="Arial" w:hAnsi="Arial" w:cs="Arial"/>
+          <w:lang w:val="es-CO"/>
+        </w:rPr>
+        <w:t xml:space="preserve">’ para reemplazar los valores </w:t>
+      </w:r>
+      <w:proofErr w:type="spellStart"/>
+      <w:r>
+        <w:rPr>
+          <w:rFonts w:ascii="Arial" w:hAnsi="Arial" w:cs="Arial"/>
+          <w:lang w:val="es-CO"/>
+        </w:rPr>
+        <w:t>NaN</w:t>
+      </w:r>
+      <w:proofErr w:type="spellEnd"/>
+      <w:r>
+        <w:rPr>
+          <w:rFonts w:ascii="Arial" w:hAnsi="Arial" w:cs="Arial"/>
+          <w:lang w:val="es-CO"/>
+        </w:rPr>
+        <w:t>.</w:t>
       </w:r>
     </w:p>
     <w:p>
@@ -3672,14 +4700,7 @@
           <w:rFonts w:ascii="Arial" w:hAnsi="Arial" w:cs="Arial"/>
           <w:lang w:val="es-CO"/>
         </w:rPr>
-        <w:t>Se filtran las filas que contienen resúmenes de datos (Totales)</w:t>
-      </w:r>
-      <w:r>
-        <w:rPr>
-          <w:rFonts w:ascii="Arial" w:hAnsi="Arial" w:cs="Arial"/>
-          <w:lang w:val="es-CO"/>
-        </w:rPr>
-        <w:t>.</w:t>
+        <w:t>Se filtran las filas que contienen resúmenes de datos (Totales).</w:t>
       </w:r>
     </w:p>
     <w:p>
@@ -3759,15 +4780,16 @@
           <w:rFonts w:ascii="Arial" w:hAnsi="Arial" w:cs="Arial"/>
           <w:lang w:val="es-CO"/>
         </w:rPr>
-        <w:t>Finalmente, s</w:t>
-      </w:r>
-      <w:r>
-        <w:rPr>
-          <w:rFonts w:ascii="Arial" w:hAnsi="Arial" w:cs="Arial"/>
-          <w:lang w:val="es-CO"/>
-        </w:rPr>
-        <w:t>e cambian las tildes dentro de los datos, reemplazando vocales con tilde por vocales sin tilde.</w:t>
-      </w:r>
+        <w:t>Finalmente, se cambian las tildes dentro de los datos, reemplazando vocales con tilde por vocales sin tilde.</w:t>
+      </w:r>
+    </w:p>
+    <w:p>
+      <w:pPr>
+        <w:rPr>
+          <w:rFonts w:ascii="Arial" w:hAnsi="Arial" w:cs="Arial"/>
+          <w:lang w:val="es-CO"/>
+        </w:rPr>
+      </w:pPr>
     </w:p>
     <w:p>
       <w:pPr>
@@ -3783,6 +4805,1173 @@
           <w:rFonts w:ascii="Arial" w:hAnsi="Arial" w:cs="Arial"/>
           <w:b/>
           <w:bCs/>
+          <w:lang w:val="es-CO"/>
+        </w:rPr>
+      </w:pPr>
+      <w:r>
+        <w:rPr>
+          <w:rFonts w:ascii="Arial" w:hAnsi="Arial" w:cs="Arial"/>
+          <w:b/>
+          <w:bCs/>
+          <w:lang w:val="es-CO"/>
+        </w:rPr>
+        <w:t>5.2PM</w:t>
+      </w:r>
+    </w:p>
+    <w:p>
+      <w:pPr>
+        <w:rPr>
+          <w:rFonts w:ascii="Arial" w:hAnsi="Arial" w:cs="Arial"/>
+          <w:lang w:val="es-CO"/>
+        </w:rPr>
+      </w:pPr>
+      <w:r>
+        <w:rPr>
+          <w:rFonts w:ascii="Arial" w:hAnsi="Arial" w:cs="Arial"/>
+          <w:lang w:val="es-CO"/>
+        </w:rPr>
+        <w:t xml:space="preserve">Se empieza por extraer solo la parte correspondiente a los datos del archivo </w:t>
+      </w:r>
+      <w:proofErr w:type="spellStart"/>
+      <w:r>
+        <w:rPr>
+          <w:rFonts w:ascii="Arial" w:hAnsi="Arial" w:cs="Arial"/>
+          <w:lang w:val="es-CO"/>
+        </w:rPr>
+        <w:t>excel</w:t>
+      </w:r>
+      <w:proofErr w:type="spellEnd"/>
+      <w:r>
+        <w:rPr>
+          <w:rFonts w:ascii="Arial" w:hAnsi="Arial" w:cs="Arial"/>
+          <w:lang w:val="es-CO"/>
+        </w:rPr>
+        <w:t>, para lo cual se ignoran las primeras 9 filas de la hoja.</w:t>
+      </w:r>
+    </w:p>
+    <w:p>
+      <w:pPr>
+        <w:rPr>
+          <w:rFonts w:ascii="Arial" w:hAnsi="Arial" w:cs="Arial"/>
+          <w:b/>
+          <w:bCs/>
+          <w:lang w:val="es-CO"/>
+        </w:rPr>
+      </w:pPr>
+      <w:r>
+        <w:rPr>
+          <w:rFonts w:ascii="Arial" w:hAnsi="Arial" w:cs="Arial"/>
+          <w:b/>
+          <w:bCs/>
+          <w:noProof/>
+          <w:lang w:val="es-CO"/>
+        </w:rPr>
+        <w:drawing>
+          <wp:inline distT="0" distB="0" distL="0" distR="0" wp14:anchorId="7A38612B" wp14:editId="731F9048">
+            <wp:extent cx="5612130" cy="2453640"/>
+            <wp:effectExtent l="0" t="0" r="7620" b="3810"/>
+            <wp:docPr id="24" name="Imagen 24"/>
+            <wp:cNvGraphicFramePr>
+              <a:graphicFrameLocks xmlns:a="http://schemas.openxmlformats.org/drawingml/2006/main" noChangeAspect="1"/>
+            </wp:cNvGraphicFramePr>
+            <a:graphic xmlns:a="http://schemas.openxmlformats.org/drawingml/2006/main">
+              <a:graphicData uri="http://schemas.openxmlformats.org/drawingml/2006/picture">
+                <pic:pic xmlns:pic="http://schemas.openxmlformats.org/drawingml/2006/picture">
+                  <pic:nvPicPr>
+                    <pic:cNvPr id="24" name="Imagen 24"/>
+                    <pic:cNvPicPr/>
+                  </pic:nvPicPr>
+                  <pic:blipFill>
+                    <a:blip r:embed="rId35" cstate="print">
+                      <a:extLst>
+                        <a:ext uri="{28A0092B-C50C-407E-A947-70E740481C1C}">
+                          <a14:useLocalDpi xmlns:a14="http://schemas.microsoft.com/office/drawing/2010/main" val="0"/>
+                        </a:ext>
+                      </a:extLst>
+                    </a:blip>
+                    <a:stretch>
+                      <a:fillRect/>
+                    </a:stretch>
+                  </pic:blipFill>
+                  <pic:spPr>
+                    <a:xfrm>
+                      <a:off x="0" y="0"/>
+                      <a:ext cx="5612130" cy="2453640"/>
+                    </a:xfrm>
+                    <a:prstGeom prst="rect">
+                      <a:avLst/>
+                    </a:prstGeom>
+                  </pic:spPr>
+                </pic:pic>
+              </a:graphicData>
+            </a:graphic>
+          </wp:inline>
+        </w:drawing>
+      </w:r>
+    </w:p>
+    <w:p>
+      <w:pPr>
+        <w:rPr>
+          <w:rFonts w:ascii="Arial" w:hAnsi="Arial" w:cs="Arial"/>
+          <w:b/>
+          <w:bCs/>
+          <w:lang w:val="es-CO"/>
+        </w:rPr>
+      </w:pPr>
+    </w:p>
+    <w:p>
+      <w:pPr>
+        <w:rPr>
+          <w:rFonts w:ascii="Arial" w:hAnsi="Arial" w:cs="Arial"/>
+          <w:lang w:val="es-CO"/>
+        </w:rPr>
+      </w:pPr>
+      <w:r>
+        <w:rPr>
+          <w:rFonts w:ascii="Arial" w:hAnsi="Arial" w:cs="Arial"/>
+          <w:lang w:val="es-CO"/>
+        </w:rPr>
+        <w:t xml:space="preserve">Actualización de </w:t>
+      </w:r>
+      <w:proofErr w:type="spellStart"/>
+      <w:r>
+        <w:rPr>
+          <w:rFonts w:ascii="Arial" w:hAnsi="Arial" w:cs="Arial"/>
+          <w:lang w:val="es-CO"/>
+        </w:rPr>
+        <w:t>headers</w:t>
+      </w:r>
+      <w:proofErr w:type="spellEnd"/>
+    </w:p>
+    <w:p>
+      <w:pPr>
+        <w:rPr>
+          <w:rFonts w:ascii="Arial" w:hAnsi="Arial" w:cs="Arial"/>
+          <w:lang w:val="es-CO"/>
+        </w:rPr>
+      </w:pPr>
+      <w:r>
+        <w:rPr>
+          <w:rFonts w:ascii="Arial" w:hAnsi="Arial" w:cs="Arial"/>
+          <w:lang w:val="es-CO"/>
+        </w:rPr>
+        <w:lastRenderedPageBreak/>
+        <w:t xml:space="preserve">Al extraer los datos desde el archivo .xlsx, se verifica el </w:t>
+      </w:r>
+      <w:proofErr w:type="spellStart"/>
+      <w:r>
+        <w:rPr>
+          <w:rFonts w:ascii="Arial" w:hAnsi="Arial" w:cs="Arial"/>
+          <w:lang w:val="es-CO"/>
+        </w:rPr>
+        <w:t>dataframe</w:t>
+      </w:r>
+      <w:proofErr w:type="spellEnd"/>
+      <w:r>
+        <w:rPr>
+          <w:rFonts w:ascii="Arial" w:hAnsi="Arial" w:cs="Arial"/>
+          <w:lang w:val="es-CO"/>
+        </w:rPr>
+        <w:t xml:space="preserve"> generado por Pandas, empezando por los nombres de las columnas y se observan las siguientes incidencias:</w:t>
+      </w:r>
+    </w:p>
+    <w:p>
+      <w:pPr>
+        <w:pStyle w:val="Prrafodelista"/>
+        <w:numPr>
+          <w:ilvl w:val="0"/>
+          <w:numId w:val="5"/>
+        </w:numPr>
+        <w:rPr>
+          <w:rFonts w:ascii="Arial" w:hAnsi="Arial" w:cs="Arial"/>
+          <w:lang w:val="es-CO"/>
+        </w:rPr>
+      </w:pPr>
+      <w:proofErr w:type="spellStart"/>
+      <w:r>
+        <w:rPr>
+          <w:rFonts w:ascii="Arial" w:hAnsi="Arial" w:cs="Arial"/>
+          <w:lang w:val="es-CO"/>
+        </w:rPr>
+        <w:t>Headers</w:t>
+      </w:r>
+      <w:proofErr w:type="spellEnd"/>
+      <w:r>
+        <w:rPr>
+          <w:rFonts w:ascii="Arial" w:hAnsi="Arial" w:cs="Arial"/>
+          <w:lang w:val="es-CO"/>
+        </w:rPr>
+        <w:t xml:space="preserve"> sin nombres descriptivos: </w:t>
+      </w:r>
+      <w:proofErr w:type="spellStart"/>
+      <w:r>
+        <w:rPr>
+          <w:rFonts w:ascii="Arial" w:hAnsi="Arial" w:cs="Arial"/>
+          <w:lang w:val="es-CO"/>
+        </w:rPr>
+        <w:t>headers</w:t>
+      </w:r>
+      <w:proofErr w:type="spellEnd"/>
+      <w:r>
+        <w:rPr>
+          <w:rFonts w:ascii="Arial" w:hAnsi="Arial" w:cs="Arial"/>
+          <w:lang w:val="es-CO"/>
+        </w:rPr>
+        <w:t xml:space="preserve"> con nombres por defecto de Pandas tipo ‘</w:t>
+      </w:r>
+      <w:proofErr w:type="spellStart"/>
+      <w:r>
+        <w:rPr>
+          <w:rFonts w:ascii="Arial" w:hAnsi="Arial" w:cs="Arial"/>
+          <w:lang w:val="es-CO"/>
+        </w:rPr>
+        <w:t>Unnamed</w:t>
+      </w:r>
+      <w:proofErr w:type="spellEnd"/>
+      <w:r>
+        <w:rPr>
+          <w:rFonts w:ascii="Arial" w:hAnsi="Arial" w:cs="Arial"/>
+          <w:lang w:val="es-CO"/>
+        </w:rPr>
+        <w:t>: X’.</w:t>
+      </w:r>
+    </w:p>
+    <w:p>
+      <w:pPr>
+        <w:pStyle w:val="Prrafodelista"/>
+        <w:numPr>
+          <w:ilvl w:val="0"/>
+          <w:numId w:val="5"/>
+        </w:numPr>
+        <w:rPr>
+          <w:rFonts w:ascii="Arial" w:hAnsi="Arial" w:cs="Arial"/>
+          <w:lang w:val="es-CO"/>
+        </w:rPr>
+      </w:pPr>
+      <w:proofErr w:type="spellStart"/>
+      <w:r>
+        <w:rPr>
+          <w:rFonts w:ascii="Arial" w:hAnsi="Arial" w:cs="Arial"/>
+          <w:lang w:val="es-CO"/>
+        </w:rPr>
+        <w:t>Headers</w:t>
+      </w:r>
+      <w:proofErr w:type="spellEnd"/>
+      <w:r>
+        <w:rPr>
+          <w:rFonts w:ascii="Arial" w:hAnsi="Arial" w:cs="Arial"/>
+          <w:lang w:val="es-CO"/>
+        </w:rPr>
+        <w:t xml:space="preserve"> en jerarquías inferiores debido a la agrupación de datos: Todos los </w:t>
+      </w:r>
+      <w:proofErr w:type="spellStart"/>
+      <w:r>
+        <w:rPr>
+          <w:rFonts w:ascii="Arial" w:hAnsi="Arial" w:cs="Arial"/>
+          <w:lang w:val="es-CO"/>
+        </w:rPr>
+        <w:t>headers</w:t>
+      </w:r>
+      <w:proofErr w:type="spellEnd"/>
+      <w:r>
+        <w:rPr>
+          <w:rFonts w:ascii="Arial" w:hAnsi="Arial" w:cs="Arial"/>
+          <w:lang w:val="es-CO"/>
+        </w:rPr>
+        <w:t xml:space="preserve"> se encuentran en la primera fila de los datos debido al diseño del .xlsx donde se busca describir la agrupación por Relación o parentesco con el jefe(a) del hogar.</w:t>
+      </w:r>
+    </w:p>
+    <w:p>
+      <w:pPr>
+        <w:rPr>
+          <w:rFonts w:ascii="Arial" w:hAnsi="Arial" w:cs="Arial"/>
+          <w:lang w:val="es-CO"/>
+        </w:rPr>
+      </w:pPr>
+      <w:r>
+        <w:rPr>
+          <w:rFonts w:ascii="Arial" w:hAnsi="Arial" w:cs="Arial"/>
+          <w:lang w:val="es-CO"/>
+        </w:rPr>
+        <w:t xml:space="preserve">Para solucionar esto, se reemplazan los </w:t>
+      </w:r>
+      <w:proofErr w:type="spellStart"/>
+      <w:r>
+        <w:rPr>
+          <w:rFonts w:ascii="Arial" w:hAnsi="Arial" w:cs="Arial"/>
+          <w:lang w:val="es-CO"/>
+        </w:rPr>
+        <w:t>headers</w:t>
+      </w:r>
+      <w:proofErr w:type="spellEnd"/>
+      <w:r>
+        <w:rPr>
+          <w:rFonts w:ascii="Arial" w:hAnsi="Arial" w:cs="Arial"/>
+          <w:lang w:val="es-CO"/>
+        </w:rPr>
+        <w:t xml:space="preserve"> actuales desde ‘Relación o parentesco con el </w:t>
+      </w:r>
+      <w:proofErr w:type="spellStart"/>
+      <w:r>
+        <w:rPr>
+          <w:rFonts w:ascii="Arial" w:hAnsi="Arial" w:cs="Arial"/>
+          <w:lang w:val="es-CO"/>
+        </w:rPr>
+        <w:t>jef</w:t>
+      </w:r>
+      <w:proofErr w:type="spellEnd"/>
+      <w:r>
+        <w:rPr>
+          <w:rFonts w:ascii="Arial" w:hAnsi="Arial" w:cs="Arial"/>
+          <w:lang w:val="es-CO"/>
+        </w:rPr>
+        <w:t>(a) del hogar’ hasta el último, por los valores correspondientes en la primera fila de datos.</w:t>
+      </w:r>
+    </w:p>
+    <w:p>
+      <w:pPr>
+        <w:rPr>
+          <w:rFonts w:ascii="Arial" w:hAnsi="Arial" w:cs="Arial"/>
+          <w:b/>
+          <w:bCs/>
+          <w:lang w:val="es-CO"/>
+        </w:rPr>
+      </w:pPr>
+      <w:r>
+        <w:rPr>
+          <w:rFonts w:ascii="Arial" w:hAnsi="Arial" w:cs="Arial"/>
+          <w:b/>
+          <w:bCs/>
+          <w:noProof/>
+          <w:lang w:val="es-CO"/>
+        </w:rPr>
+        <w:drawing>
+          <wp:inline distT="0" distB="0" distL="0" distR="0" wp14:anchorId="272F9B1E" wp14:editId="68568B65">
+            <wp:extent cx="5612130" cy="2117090"/>
+            <wp:effectExtent l="0" t="0" r="7620" b="0"/>
+            <wp:docPr id="25" name="Imagen 25"/>
+            <wp:cNvGraphicFramePr>
+              <a:graphicFrameLocks xmlns:a="http://schemas.openxmlformats.org/drawingml/2006/main" noChangeAspect="1"/>
+            </wp:cNvGraphicFramePr>
+            <a:graphic xmlns:a="http://schemas.openxmlformats.org/drawingml/2006/main">
+              <a:graphicData uri="http://schemas.openxmlformats.org/drawingml/2006/picture">
+                <pic:pic xmlns:pic="http://schemas.openxmlformats.org/drawingml/2006/picture">
+                  <pic:nvPicPr>
+                    <pic:cNvPr id="25" name="Imagen 25"/>
+                    <pic:cNvPicPr/>
+                  </pic:nvPicPr>
+                  <pic:blipFill>
+                    <a:blip r:embed="rId36">
+                      <a:extLst>
+                        <a:ext uri="{28A0092B-C50C-407E-A947-70E740481C1C}">
+                          <a14:useLocalDpi xmlns:a14="http://schemas.microsoft.com/office/drawing/2010/main" val="0"/>
+                        </a:ext>
+                      </a:extLst>
+                    </a:blip>
+                    <a:stretch>
+                      <a:fillRect/>
+                    </a:stretch>
+                  </pic:blipFill>
+                  <pic:spPr>
+                    <a:xfrm>
+                      <a:off x="0" y="0"/>
+                      <a:ext cx="5612130" cy="2117090"/>
+                    </a:xfrm>
+                    <a:prstGeom prst="rect">
+                      <a:avLst/>
+                    </a:prstGeom>
+                  </pic:spPr>
+                </pic:pic>
+              </a:graphicData>
+            </a:graphic>
+          </wp:inline>
+        </w:drawing>
+      </w:r>
+    </w:p>
+    <w:p>
+      <w:pPr>
+        <w:rPr>
+          <w:rFonts w:ascii="Arial" w:hAnsi="Arial" w:cs="Arial"/>
+          <w:b/>
+          <w:bCs/>
+          <w:lang w:val="es-CO"/>
+        </w:rPr>
+      </w:pPr>
+      <w:r>
+        <w:rPr>
+          <w:rFonts w:ascii="Arial" w:hAnsi="Arial" w:cs="Arial"/>
+          <w:b/>
+          <w:bCs/>
+          <w:noProof/>
+          <w:lang w:val="es-CO"/>
+        </w:rPr>
+        <w:drawing>
+          <wp:inline distT="0" distB="0" distL="0" distR="0" wp14:anchorId="4EE5F7D1" wp14:editId="0BDDB693">
+            <wp:extent cx="5612130" cy="1156970"/>
+            <wp:effectExtent l="0" t="0" r="7620" b="5080"/>
+            <wp:docPr id="26" name="Imagen 26"/>
+            <wp:cNvGraphicFramePr>
+              <a:graphicFrameLocks xmlns:a="http://schemas.openxmlformats.org/drawingml/2006/main" noChangeAspect="1"/>
+            </wp:cNvGraphicFramePr>
+            <a:graphic xmlns:a="http://schemas.openxmlformats.org/drawingml/2006/main">
+              <a:graphicData uri="http://schemas.openxmlformats.org/drawingml/2006/picture">
+                <pic:pic xmlns:pic="http://schemas.openxmlformats.org/drawingml/2006/picture">
+                  <pic:nvPicPr>
+                    <pic:cNvPr id="26" name="Imagen 26"/>
+                    <pic:cNvPicPr/>
+                  </pic:nvPicPr>
+                  <pic:blipFill>
+                    <a:blip r:embed="rId37">
+                      <a:extLst>
+                        <a:ext uri="{28A0092B-C50C-407E-A947-70E740481C1C}">
+                          <a14:useLocalDpi xmlns:a14="http://schemas.microsoft.com/office/drawing/2010/main" val="0"/>
+                        </a:ext>
+                      </a:extLst>
+                    </a:blip>
+                    <a:stretch>
+                      <a:fillRect/>
+                    </a:stretch>
+                  </pic:blipFill>
+                  <pic:spPr>
+                    <a:xfrm>
+                      <a:off x="0" y="0"/>
+                      <a:ext cx="5612130" cy="1156970"/>
+                    </a:xfrm>
+                    <a:prstGeom prst="rect">
+                      <a:avLst/>
+                    </a:prstGeom>
+                  </pic:spPr>
+                </pic:pic>
+              </a:graphicData>
+            </a:graphic>
+          </wp:inline>
+        </w:drawing>
+      </w:r>
+    </w:p>
+    <w:p>
+      <w:pPr>
+        <w:rPr>
+          <w:rFonts w:ascii="Arial" w:hAnsi="Arial" w:cs="Arial"/>
+          <w:b/>
+          <w:bCs/>
+          <w:lang w:val="es-CO"/>
+        </w:rPr>
+      </w:pPr>
+    </w:p>
+    <w:p>
+      <w:pPr>
+        <w:rPr>
+          <w:rFonts w:ascii="Arial" w:hAnsi="Arial" w:cs="Arial"/>
+          <w:lang w:val="es-CO"/>
+        </w:rPr>
+      </w:pPr>
+      <w:r>
+        <w:rPr>
+          <w:rFonts w:ascii="Arial" w:hAnsi="Arial" w:cs="Arial"/>
+          <w:lang w:val="es-CO"/>
+        </w:rPr>
+        <w:t>Se cambian las columnas restantes que no tienen nombres descriptivos de la siguiente manera:</w:t>
+      </w:r>
+    </w:p>
+    <w:p>
+      <w:pPr>
+        <w:pStyle w:val="Prrafodelista"/>
+        <w:numPr>
+          <w:ilvl w:val="0"/>
+          <w:numId w:val="6"/>
+        </w:numPr>
+        <w:rPr>
+          <w:rFonts w:ascii="Arial" w:hAnsi="Arial" w:cs="Arial"/>
+          <w:lang w:val="es-CO"/>
+        </w:rPr>
+      </w:pPr>
+      <w:proofErr w:type="spellStart"/>
+      <w:r>
+        <w:rPr>
+          <w:rFonts w:ascii="Arial" w:hAnsi="Arial" w:cs="Arial"/>
+          <w:lang w:val="es-CO"/>
+        </w:rPr>
+        <w:t>Unnamed</w:t>
+      </w:r>
+      <w:proofErr w:type="spellEnd"/>
+      <w:r>
+        <w:rPr>
+          <w:rFonts w:ascii="Arial" w:hAnsi="Arial" w:cs="Arial"/>
+          <w:lang w:val="es-CO"/>
+        </w:rPr>
+        <w:t>: 1: Municipio</w:t>
+      </w:r>
+    </w:p>
+    <w:p>
+      <w:pPr>
+        <w:pStyle w:val="Prrafodelista"/>
+        <w:numPr>
+          <w:ilvl w:val="0"/>
+          <w:numId w:val="6"/>
+        </w:numPr>
+        <w:rPr>
+          <w:rFonts w:ascii="Arial" w:hAnsi="Arial" w:cs="Arial"/>
+          <w:lang w:val="es-CO"/>
+        </w:rPr>
+      </w:pPr>
+      <w:proofErr w:type="spellStart"/>
+      <w:r>
+        <w:rPr>
+          <w:rFonts w:ascii="Arial" w:hAnsi="Arial" w:cs="Arial"/>
+          <w:lang w:val="es-CO"/>
+        </w:rPr>
+        <w:t>Unnamed</w:t>
+      </w:r>
+      <w:proofErr w:type="spellEnd"/>
+      <w:r>
+        <w:rPr>
+          <w:rFonts w:ascii="Arial" w:hAnsi="Arial" w:cs="Arial"/>
+          <w:lang w:val="es-CO"/>
+        </w:rPr>
+        <w:t xml:space="preserve">: 2: </w:t>
+      </w:r>
+      <w:r>
+        <w:rPr>
+          <w:rFonts w:ascii="Arial" w:hAnsi="Arial" w:cs="Arial"/>
+          <w:lang w:val="es-CO"/>
+        </w:rPr>
+        <w:t>Sexo</w:t>
+      </w:r>
+    </w:p>
+    <w:p>
+      <w:pPr>
+        <w:pStyle w:val="Prrafodelista"/>
+        <w:numPr>
+          <w:ilvl w:val="0"/>
+          <w:numId w:val="6"/>
+        </w:numPr>
+        <w:rPr>
+          <w:rFonts w:ascii="Arial" w:hAnsi="Arial" w:cs="Arial"/>
+          <w:lang w:val="es-CO"/>
+        </w:rPr>
+      </w:pPr>
+      <w:proofErr w:type="spellStart"/>
+      <w:r>
+        <w:rPr>
+          <w:rFonts w:ascii="Arial" w:hAnsi="Arial" w:cs="Arial"/>
+          <w:lang w:val="es-CO"/>
+        </w:rPr>
+        <w:t>Unnamed</w:t>
+      </w:r>
+      <w:proofErr w:type="spellEnd"/>
+      <w:r>
+        <w:rPr>
+          <w:rFonts w:ascii="Arial" w:hAnsi="Arial" w:cs="Arial"/>
+          <w:lang w:val="es-CO"/>
+        </w:rPr>
+        <w:t xml:space="preserve">: 3: </w:t>
+      </w:r>
+      <w:proofErr w:type="spellStart"/>
+      <w:r>
+        <w:rPr>
+          <w:rFonts w:ascii="Arial" w:hAnsi="Arial" w:cs="Arial"/>
+          <w:lang w:val="es-CO"/>
+        </w:rPr>
+        <w:t>Area</w:t>
+      </w:r>
+      <w:proofErr w:type="spellEnd"/>
+    </w:p>
+    <w:p>
+      <w:pPr>
+        <w:pStyle w:val="Prrafodelista"/>
+        <w:numPr>
+          <w:ilvl w:val="0"/>
+          <w:numId w:val="6"/>
+        </w:numPr>
+        <w:rPr>
+          <w:rFonts w:ascii="Arial" w:hAnsi="Arial" w:cs="Arial"/>
+          <w:lang w:val="es-CO"/>
+        </w:rPr>
+      </w:pPr>
+      <w:proofErr w:type="spellStart"/>
+      <w:r>
+        <w:rPr>
+          <w:rFonts w:ascii="Arial" w:hAnsi="Arial" w:cs="Arial"/>
+          <w:lang w:val="es-CO"/>
+        </w:rPr>
+        <w:t>Unnamed</w:t>
+      </w:r>
+      <w:proofErr w:type="spellEnd"/>
+      <w:r>
+        <w:rPr>
+          <w:rFonts w:ascii="Arial" w:hAnsi="Arial" w:cs="Arial"/>
+          <w:lang w:val="es-CO"/>
+        </w:rPr>
+        <w:t>: 4: Grupo de edad</w:t>
+      </w:r>
+    </w:p>
+    <w:p>
+      <w:pPr>
+        <w:rPr>
+          <w:rFonts w:ascii="Arial" w:hAnsi="Arial" w:cs="Arial"/>
+          <w:lang w:val="es-CO"/>
+        </w:rPr>
+      </w:pPr>
+    </w:p>
+    <w:p>
+      <w:pPr>
+        <w:rPr>
+          <w:rFonts w:ascii="Arial" w:hAnsi="Arial" w:cs="Arial"/>
+          <w:lang w:val="es-CO"/>
+        </w:rPr>
+      </w:pPr>
+      <w:r>
+        <w:rPr>
+          <w:rFonts w:ascii="Arial" w:hAnsi="Arial" w:cs="Arial"/>
+          <w:lang w:val="es-CO"/>
+        </w:rPr>
+        <w:lastRenderedPageBreak/>
+        <w:t>Filtrado de datos que no son de Viterbo, Caldas</w:t>
+      </w:r>
+    </w:p>
+    <w:p>
+      <w:pPr>
+        <w:rPr>
+          <w:rFonts w:ascii="Arial" w:hAnsi="Arial" w:cs="Arial"/>
+          <w:lang w:val="es-CO"/>
+        </w:rPr>
+      </w:pPr>
+      <w:r>
+        <w:rPr>
+          <w:rFonts w:ascii="Arial" w:hAnsi="Arial" w:cs="Arial"/>
+          <w:lang w:val="es-CO"/>
+        </w:rPr>
+        <w:t>Para esta hoja se decide propagar el valor del identificador del municipio, ‘17877_Viterbo’, y seleccionar solo los registros que lo contengan.</w:t>
+      </w:r>
+    </w:p>
+    <w:p>
+      <w:pPr>
+        <w:rPr>
+          <w:rFonts w:ascii="Arial" w:hAnsi="Arial" w:cs="Arial"/>
+          <w:lang w:val="es-CO"/>
+        </w:rPr>
+      </w:pPr>
+      <w:r>
+        <w:rPr>
+          <w:rFonts w:ascii="Arial" w:hAnsi="Arial" w:cs="Arial"/>
+          <w:noProof/>
+          <w:lang w:val="es-CO"/>
+        </w:rPr>
+        <w:drawing>
+          <wp:inline distT="0" distB="0" distL="0" distR="0" wp14:anchorId="6006F13B" wp14:editId="4169FEAD">
+            <wp:extent cx="5612130" cy="4157980"/>
+            <wp:effectExtent l="0" t="0" r="7620" b="0"/>
+            <wp:docPr id="27" name="Imagen 27"/>
+            <wp:cNvGraphicFramePr>
+              <a:graphicFrameLocks xmlns:a="http://schemas.openxmlformats.org/drawingml/2006/main" noChangeAspect="1"/>
+            </wp:cNvGraphicFramePr>
+            <a:graphic xmlns:a="http://schemas.openxmlformats.org/drawingml/2006/main">
+              <a:graphicData uri="http://schemas.openxmlformats.org/drawingml/2006/picture">
+                <pic:pic xmlns:pic="http://schemas.openxmlformats.org/drawingml/2006/picture">
+                  <pic:nvPicPr>
+                    <pic:cNvPr id="27" name="Imagen 27"/>
+                    <pic:cNvPicPr/>
+                  </pic:nvPicPr>
+                  <pic:blipFill>
+                    <a:blip r:embed="rId38">
+                      <a:extLst>
+                        <a:ext uri="{28A0092B-C50C-407E-A947-70E740481C1C}">
+                          <a14:useLocalDpi xmlns:a14="http://schemas.microsoft.com/office/drawing/2010/main" val="0"/>
+                        </a:ext>
+                      </a:extLst>
+                    </a:blip>
+                    <a:stretch>
+                      <a:fillRect/>
+                    </a:stretch>
+                  </pic:blipFill>
+                  <pic:spPr>
+                    <a:xfrm>
+                      <a:off x="0" y="0"/>
+                      <a:ext cx="5612130" cy="4157980"/>
+                    </a:xfrm>
+                    <a:prstGeom prst="rect">
+                      <a:avLst/>
+                    </a:prstGeom>
+                  </pic:spPr>
+                </pic:pic>
+              </a:graphicData>
+            </a:graphic>
+          </wp:inline>
+        </w:drawing>
+      </w:r>
+    </w:p>
+    <w:p>
+      <w:pPr>
+        <w:rPr>
+          <w:rFonts w:ascii="Arial" w:hAnsi="Arial" w:cs="Arial"/>
+          <w:lang w:val="es-CO"/>
+        </w:rPr>
+      </w:pPr>
+    </w:p>
+    <w:p>
+      <w:pPr>
+        <w:rPr>
+          <w:rFonts w:ascii="Arial" w:hAnsi="Arial" w:cs="Arial"/>
+          <w:lang w:val="es-CO"/>
+        </w:rPr>
+      </w:pPr>
+      <w:r>
+        <w:rPr>
+          <w:rFonts w:ascii="Arial" w:hAnsi="Arial" w:cs="Arial"/>
+          <w:lang w:val="es-CO"/>
+        </w:rPr>
+        <w:t xml:space="preserve">Eliminación de columnas sin información relevante o con información redundante en el </w:t>
+      </w:r>
+      <w:proofErr w:type="spellStart"/>
+      <w:r>
+        <w:rPr>
+          <w:rFonts w:ascii="Arial" w:hAnsi="Arial" w:cs="Arial"/>
+          <w:lang w:val="es-CO"/>
+        </w:rPr>
+        <w:t>dataframe</w:t>
+      </w:r>
+      <w:proofErr w:type="spellEnd"/>
+      <w:r>
+        <w:rPr>
+          <w:rFonts w:ascii="Arial" w:hAnsi="Arial" w:cs="Arial"/>
+          <w:lang w:val="es-CO"/>
+        </w:rPr>
+        <w:t>.</w:t>
+      </w:r>
+    </w:p>
+    <w:p>
+      <w:pPr>
+        <w:rPr>
+          <w:rFonts w:ascii="Arial" w:hAnsi="Arial" w:cs="Arial"/>
+          <w:lang w:val="es-CO"/>
+        </w:rPr>
+      </w:pPr>
+      <w:r>
+        <w:rPr>
+          <w:rFonts w:ascii="Arial" w:hAnsi="Arial" w:cs="Arial"/>
+          <w:lang w:val="es-CO"/>
+        </w:rPr>
+        <w:t>Se eliminan las columnas ‘</w:t>
+      </w:r>
+      <w:r>
+        <w:rPr>
+          <w:rFonts w:ascii="Arial" w:hAnsi="Arial" w:cs="Arial"/>
+          <w:lang w:val="es-CO"/>
+        </w:rPr>
+        <w:t>sexo, grupos de edad y áreas (Total, Cabecera y Centros poblados y Rural disperso), sexo y grupos de edad</w:t>
+      </w:r>
+      <w:r>
+        <w:rPr>
+          <w:rFonts w:ascii="Arial" w:hAnsi="Arial" w:cs="Arial"/>
+          <w:lang w:val="es-CO"/>
+        </w:rPr>
+        <w:t xml:space="preserve">', 'Municipio', </w:t>
+      </w:r>
+      <w:r>
+        <w:rPr>
+          <w:rFonts w:ascii="Arial" w:hAnsi="Arial" w:cs="Arial"/>
+          <w:lang w:val="es-CO"/>
+        </w:rPr>
+        <w:t xml:space="preserve">y </w:t>
+      </w:r>
+      <w:r>
+        <w:rPr>
+          <w:rFonts w:ascii="Arial" w:hAnsi="Arial" w:cs="Arial"/>
+          <w:lang w:val="es-CO"/>
+        </w:rPr>
+        <w:t>'Total'</w:t>
+      </w:r>
+      <w:r>
+        <w:rPr>
+          <w:rFonts w:ascii="Arial" w:hAnsi="Arial" w:cs="Arial"/>
+          <w:lang w:val="es-CO"/>
+        </w:rPr>
+        <w:t>.</w:t>
+      </w:r>
+    </w:p>
+    <w:p>
+      <w:pPr>
+        <w:rPr>
+          <w:rFonts w:ascii="Arial" w:hAnsi="Arial" w:cs="Arial"/>
+          <w:lang w:val="es-CO"/>
+        </w:rPr>
+      </w:pPr>
+      <w:r>
+        <w:rPr>
+          <w:rFonts w:ascii="Arial" w:hAnsi="Arial" w:cs="Arial"/>
+          <w:noProof/>
+          <w:lang w:val="es-CO"/>
+        </w:rPr>
+        <w:lastRenderedPageBreak/>
+        <w:drawing>
+          <wp:inline distT="0" distB="0" distL="0" distR="0" wp14:anchorId="12498829" wp14:editId="1C13D0FF">
+            <wp:extent cx="5612130" cy="2836545"/>
+            <wp:effectExtent l="0" t="0" r="7620" b="1905"/>
+            <wp:docPr id="28" name="Imagen 28"/>
+            <wp:cNvGraphicFramePr>
+              <a:graphicFrameLocks xmlns:a="http://schemas.openxmlformats.org/drawingml/2006/main" noChangeAspect="1"/>
+            </wp:cNvGraphicFramePr>
+            <a:graphic xmlns:a="http://schemas.openxmlformats.org/drawingml/2006/main">
+              <a:graphicData uri="http://schemas.openxmlformats.org/drawingml/2006/picture">
+                <pic:pic xmlns:pic="http://schemas.openxmlformats.org/drawingml/2006/picture">
+                  <pic:nvPicPr>
+                    <pic:cNvPr id="28" name="Imagen 28"/>
+                    <pic:cNvPicPr/>
+                  </pic:nvPicPr>
+                  <pic:blipFill>
+                    <a:blip r:embed="rId39">
+                      <a:extLst>
+                        <a:ext uri="{28A0092B-C50C-407E-A947-70E740481C1C}">
+                          <a14:useLocalDpi xmlns:a14="http://schemas.microsoft.com/office/drawing/2010/main" val="0"/>
+                        </a:ext>
+                      </a:extLst>
+                    </a:blip>
+                    <a:stretch>
+                      <a:fillRect/>
+                    </a:stretch>
+                  </pic:blipFill>
+                  <pic:spPr>
+                    <a:xfrm>
+                      <a:off x="0" y="0"/>
+                      <a:ext cx="5612130" cy="2836545"/>
+                    </a:xfrm>
+                    <a:prstGeom prst="rect">
+                      <a:avLst/>
+                    </a:prstGeom>
+                  </pic:spPr>
+                </pic:pic>
+              </a:graphicData>
+            </a:graphic>
+          </wp:inline>
+        </w:drawing>
+      </w:r>
+    </w:p>
+    <w:p>
+      <w:pPr>
+        <w:rPr>
+          <w:rFonts w:ascii="Arial" w:hAnsi="Arial" w:cs="Arial"/>
+          <w:lang w:val="es-CO"/>
+        </w:rPr>
+      </w:pPr>
+    </w:p>
+    <w:p>
+      <w:pPr>
+        <w:rPr>
+          <w:rFonts w:ascii="Arial" w:hAnsi="Arial" w:cs="Arial"/>
+          <w:lang w:val="es-CO"/>
+        </w:rPr>
+      </w:pPr>
+      <w:r>
+        <w:rPr>
+          <w:rFonts w:ascii="Arial" w:hAnsi="Arial" w:cs="Arial"/>
+          <w:lang w:val="es-CO"/>
+        </w:rPr>
+        <w:t>Se modifican nombres de columnas que contienen caracteres especiales como tildes y ñ.</w:t>
+      </w:r>
+    </w:p>
+    <w:p>
+      <w:pPr>
+        <w:rPr>
+          <w:rFonts w:ascii="Arial" w:hAnsi="Arial" w:cs="Arial"/>
+          <w:lang w:val="es-CO"/>
+        </w:rPr>
+      </w:pPr>
+      <w:r>
+        <w:rPr>
+          <w:rFonts w:ascii="Arial" w:hAnsi="Arial" w:cs="Arial"/>
+          <w:noProof/>
+          <w:lang w:val="es-CO"/>
+        </w:rPr>
+        <w:drawing>
+          <wp:inline distT="0" distB="0" distL="0" distR="0" wp14:anchorId="23E97858" wp14:editId="74F49136">
+            <wp:extent cx="5612130" cy="296545"/>
+            <wp:effectExtent l="0" t="0" r="7620" b="8255"/>
+            <wp:docPr id="29" name="Imagen 29"/>
+            <wp:cNvGraphicFramePr>
+              <a:graphicFrameLocks xmlns:a="http://schemas.openxmlformats.org/drawingml/2006/main" noChangeAspect="1"/>
+            </wp:cNvGraphicFramePr>
+            <a:graphic xmlns:a="http://schemas.openxmlformats.org/drawingml/2006/main">
+              <a:graphicData uri="http://schemas.openxmlformats.org/drawingml/2006/picture">
+                <pic:pic xmlns:pic="http://schemas.openxmlformats.org/drawingml/2006/picture">
+                  <pic:nvPicPr>
+                    <pic:cNvPr id="29" name="Imagen 29"/>
+                    <pic:cNvPicPr/>
+                  </pic:nvPicPr>
+                  <pic:blipFill>
+                    <a:blip r:embed="rId40" cstate="print">
+                      <a:extLst>
+                        <a:ext uri="{28A0092B-C50C-407E-A947-70E740481C1C}">
+                          <a14:useLocalDpi xmlns:a14="http://schemas.microsoft.com/office/drawing/2010/main" val="0"/>
+                        </a:ext>
+                      </a:extLst>
+                    </a:blip>
+                    <a:stretch>
+                      <a:fillRect/>
+                    </a:stretch>
+                  </pic:blipFill>
+                  <pic:spPr>
+                    <a:xfrm>
+                      <a:off x="0" y="0"/>
+                      <a:ext cx="5612130" cy="296545"/>
+                    </a:xfrm>
+                    <a:prstGeom prst="rect">
+                      <a:avLst/>
+                    </a:prstGeom>
+                  </pic:spPr>
+                </pic:pic>
+              </a:graphicData>
+            </a:graphic>
+          </wp:inline>
+        </w:drawing>
+      </w:r>
+    </w:p>
+    <w:p>
+      <w:pPr>
+        <w:rPr>
+          <w:rFonts w:ascii="Arial" w:hAnsi="Arial" w:cs="Arial"/>
+          <w:lang w:val="es-CO"/>
+        </w:rPr>
+      </w:pPr>
+    </w:p>
+    <w:p>
+      <w:pPr>
+        <w:rPr>
+          <w:rFonts w:ascii="Arial" w:hAnsi="Arial" w:cs="Arial"/>
+          <w:lang w:val="es-CO"/>
+        </w:rPr>
+      </w:pPr>
+      <w:r>
+        <w:rPr>
+          <w:rFonts w:ascii="Arial" w:hAnsi="Arial" w:cs="Arial"/>
+          <w:lang w:val="es-CO"/>
+        </w:rPr>
+        <w:t>Se propaga</w:t>
+      </w:r>
+      <w:r>
+        <w:rPr>
+          <w:rFonts w:ascii="Arial" w:hAnsi="Arial" w:cs="Arial"/>
+          <w:lang w:val="es-CO"/>
+        </w:rPr>
+        <w:t>n los valores de las columnas</w:t>
+      </w:r>
+      <w:r>
+        <w:rPr>
+          <w:rFonts w:ascii="Arial" w:hAnsi="Arial" w:cs="Arial"/>
+          <w:lang w:val="es-CO"/>
+        </w:rPr>
+        <w:t xml:space="preserve"> </w:t>
+      </w:r>
+      <w:r>
+        <w:rPr>
+          <w:rFonts w:ascii="Arial" w:hAnsi="Arial" w:cs="Arial"/>
+          <w:lang w:val="es-CO"/>
+        </w:rPr>
+        <w:t xml:space="preserve">‘Sexo’ y </w:t>
+      </w:r>
+      <w:r>
+        <w:rPr>
+          <w:rFonts w:ascii="Arial" w:hAnsi="Arial" w:cs="Arial"/>
+          <w:lang w:val="es-CO"/>
+        </w:rPr>
+        <w:t>‘</w:t>
+      </w:r>
+      <w:proofErr w:type="spellStart"/>
+      <w:r>
+        <w:rPr>
+          <w:rFonts w:ascii="Arial" w:hAnsi="Arial" w:cs="Arial"/>
+          <w:lang w:val="es-CO"/>
+        </w:rPr>
+        <w:t>Area</w:t>
+      </w:r>
+      <w:proofErr w:type="spellEnd"/>
+      <w:r>
+        <w:rPr>
+          <w:rFonts w:ascii="Arial" w:hAnsi="Arial" w:cs="Arial"/>
+          <w:lang w:val="es-CO"/>
+        </w:rPr>
+        <w:t xml:space="preserve">’ para reemplazar los valores </w:t>
+      </w:r>
+      <w:proofErr w:type="spellStart"/>
+      <w:r>
+        <w:rPr>
+          <w:rFonts w:ascii="Arial" w:hAnsi="Arial" w:cs="Arial"/>
+          <w:lang w:val="es-CO"/>
+        </w:rPr>
+        <w:t>NaN</w:t>
+      </w:r>
+      <w:proofErr w:type="spellEnd"/>
+      <w:r>
+        <w:rPr>
+          <w:rFonts w:ascii="Arial" w:hAnsi="Arial" w:cs="Arial"/>
+          <w:lang w:val="es-CO"/>
+        </w:rPr>
+        <w:t>.</w:t>
+      </w:r>
+    </w:p>
+    <w:p>
+      <w:pPr>
+        <w:rPr>
+          <w:rFonts w:ascii="Arial" w:hAnsi="Arial" w:cs="Arial"/>
+          <w:lang w:val="es-CO"/>
+        </w:rPr>
+      </w:pPr>
+      <w:r>
+        <w:rPr>
+          <w:rFonts w:ascii="Arial" w:hAnsi="Arial" w:cs="Arial"/>
+          <w:noProof/>
+          <w:lang w:val="es-CO"/>
+        </w:rPr>
+        <w:lastRenderedPageBreak/>
+        <w:drawing>
+          <wp:inline distT="0" distB="0" distL="0" distR="0" wp14:anchorId="2FECC2F2" wp14:editId="28C916D1">
+            <wp:extent cx="5612130" cy="4128770"/>
+            <wp:effectExtent l="0" t="0" r="7620" b="5080"/>
+            <wp:docPr id="30" name="Imagen 30"/>
+            <wp:cNvGraphicFramePr>
+              <a:graphicFrameLocks xmlns:a="http://schemas.openxmlformats.org/drawingml/2006/main" noChangeAspect="1"/>
+            </wp:cNvGraphicFramePr>
+            <a:graphic xmlns:a="http://schemas.openxmlformats.org/drawingml/2006/main">
+              <a:graphicData uri="http://schemas.openxmlformats.org/drawingml/2006/picture">
+                <pic:pic xmlns:pic="http://schemas.openxmlformats.org/drawingml/2006/picture">
+                  <pic:nvPicPr>
+                    <pic:cNvPr id="30" name="Imagen 30"/>
+                    <pic:cNvPicPr/>
+                  </pic:nvPicPr>
+                  <pic:blipFill>
+                    <a:blip r:embed="rId41">
+                      <a:extLst>
+                        <a:ext uri="{28A0092B-C50C-407E-A947-70E740481C1C}">
+                          <a14:useLocalDpi xmlns:a14="http://schemas.microsoft.com/office/drawing/2010/main" val="0"/>
+                        </a:ext>
+                      </a:extLst>
+                    </a:blip>
+                    <a:stretch>
+                      <a:fillRect/>
+                    </a:stretch>
+                  </pic:blipFill>
+                  <pic:spPr>
+                    <a:xfrm>
+                      <a:off x="0" y="0"/>
+                      <a:ext cx="5612130" cy="4128770"/>
+                    </a:xfrm>
+                    <a:prstGeom prst="rect">
+                      <a:avLst/>
+                    </a:prstGeom>
+                  </pic:spPr>
+                </pic:pic>
+              </a:graphicData>
+            </a:graphic>
+          </wp:inline>
+        </w:drawing>
+      </w:r>
+    </w:p>
+    <w:p>
+      <w:pPr>
+        <w:rPr>
+          <w:rFonts w:ascii="Arial" w:hAnsi="Arial" w:cs="Arial"/>
+          <w:lang w:val="es-CO"/>
+        </w:rPr>
+      </w:pPr>
+    </w:p>
+    <w:p>
+      <w:pPr>
+        <w:rPr>
+          <w:rFonts w:ascii="Arial" w:hAnsi="Arial" w:cs="Arial"/>
+          <w:lang w:val="es-CO"/>
+        </w:rPr>
+      </w:pPr>
+      <w:r>
+        <w:rPr>
+          <w:rFonts w:ascii="Arial" w:hAnsi="Arial" w:cs="Arial"/>
+          <w:lang w:val="es-CO"/>
+        </w:rPr>
+        <w:t>Se filtran las filas que contienen resúmenes de datos (Totales).</w:t>
+      </w:r>
+    </w:p>
+    <w:p>
+      <w:pPr>
+        <w:rPr>
+          <w:rFonts w:ascii="Arial" w:hAnsi="Arial" w:cs="Arial"/>
+          <w:lang w:val="es-CO"/>
+        </w:rPr>
+      </w:pPr>
+      <w:r>
+        <w:rPr>
+          <w:rFonts w:ascii="Arial" w:hAnsi="Arial" w:cs="Arial"/>
+          <w:noProof/>
+          <w:lang w:val="es-CO"/>
+        </w:rPr>
+        <w:lastRenderedPageBreak/>
+        <w:drawing>
+          <wp:inline distT="0" distB="0" distL="0" distR="0" wp14:anchorId="7A07F4AC" wp14:editId="469578A5">
+            <wp:extent cx="5612130" cy="4157980"/>
+            <wp:effectExtent l="0" t="0" r="7620" b="0"/>
+            <wp:docPr id="31" name="Imagen 31"/>
+            <wp:cNvGraphicFramePr>
+              <a:graphicFrameLocks xmlns:a="http://schemas.openxmlformats.org/drawingml/2006/main" noChangeAspect="1"/>
+            </wp:cNvGraphicFramePr>
+            <a:graphic xmlns:a="http://schemas.openxmlformats.org/drawingml/2006/main">
+              <a:graphicData uri="http://schemas.openxmlformats.org/drawingml/2006/picture">
+                <pic:pic xmlns:pic="http://schemas.openxmlformats.org/drawingml/2006/picture">
+                  <pic:nvPicPr>
+                    <pic:cNvPr id="31" name="Imagen 31"/>
+                    <pic:cNvPicPr/>
+                  </pic:nvPicPr>
+                  <pic:blipFill>
+                    <a:blip r:embed="rId42">
+                      <a:extLst>
+                        <a:ext uri="{28A0092B-C50C-407E-A947-70E740481C1C}">
+                          <a14:useLocalDpi xmlns:a14="http://schemas.microsoft.com/office/drawing/2010/main" val="0"/>
+                        </a:ext>
+                      </a:extLst>
+                    </a:blip>
+                    <a:stretch>
+                      <a:fillRect/>
+                    </a:stretch>
+                  </pic:blipFill>
+                  <pic:spPr>
+                    <a:xfrm>
+                      <a:off x="0" y="0"/>
+                      <a:ext cx="5612130" cy="4157980"/>
+                    </a:xfrm>
+                    <a:prstGeom prst="rect">
+                      <a:avLst/>
+                    </a:prstGeom>
+                  </pic:spPr>
+                </pic:pic>
+              </a:graphicData>
+            </a:graphic>
+          </wp:inline>
+        </w:drawing>
+      </w:r>
+    </w:p>
+    <w:p>
+      <w:pPr>
+        <w:rPr>
+          <w:rFonts w:ascii="Arial" w:hAnsi="Arial" w:cs="Arial"/>
+          <w:lang w:val="es-CO"/>
+        </w:rPr>
+      </w:pPr>
+    </w:p>
+    <w:p>
+      <w:pPr>
+        <w:rPr>
+          <w:rFonts w:ascii="Arial" w:hAnsi="Arial" w:cs="Arial"/>
+          <w:lang w:val="es-CO"/>
+        </w:rPr>
+      </w:pPr>
+      <w:r>
+        <w:rPr>
+          <w:rFonts w:ascii="Arial" w:hAnsi="Arial" w:cs="Arial"/>
+          <w:lang w:val="es-CO"/>
+        </w:rPr>
+        <w:t>Finalmente, se cambian las tildes dentro de los datos, reemplazando vocales con tilde por vocales sin tilde.</w:t>
+      </w:r>
+    </w:p>
+    <w:p>
+      <w:pPr>
+        <w:rPr>
+          <w:rFonts w:ascii="Arial" w:hAnsi="Arial" w:cs="Arial"/>
           <w:lang w:val="es-CO"/>
         </w:rPr>
       </w:pPr>

</xml_diff>

<commit_message>
Actualiza doc de procesamiento de datos con procesamiento de la hoja 12PM
</commit_message>
<xml_diff>
--- a/Documentacion/Procesamiento de Datos.docx
+++ b/Documentacion/Procesamiento de Datos.docx
@@ -101,6 +101,13 @@
           <w:lang w:val="es-CO"/>
         </w:rPr>
         <w:t>2</w:t>
+      </w:r>
+      <w:r>
+        <w:rPr>
+          <w:rFonts w:ascii="Arial" w:hAnsi="Arial" w:cs="Arial"/>
+          <w:lang w:val="es-CO"/>
+        </w:rPr>
+        <w:t>1</w:t>
       </w:r>
       <w:r>
         <w:rPr>
@@ -5328,14 +5335,7 @@
           <w:rFonts w:ascii="Arial" w:hAnsi="Arial" w:cs="Arial"/>
           <w:lang w:val="es-CO"/>
         </w:rPr>
-        <w:t xml:space="preserve">: 2: </w:t>
-      </w:r>
-      <w:r>
-        <w:rPr>
-          <w:rFonts w:ascii="Arial" w:hAnsi="Arial" w:cs="Arial"/>
-          <w:lang w:val="es-CO"/>
-        </w:rPr>
-        <w:t>Sexo</w:t>
+        <w:t>: 2: Sexo</w:t>
       </w:r>
     </w:p>
     <w:p>
@@ -5745,35 +5745,7 @@
           <w:rFonts w:ascii="Arial" w:hAnsi="Arial" w:cs="Arial"/>
           <w:lang w:val="es-CO"/>
         </w:rPr>
-        <w:t>Se propaga</w:t>
-      </w:r>
-      <w:r>
-        <w:rPr>
-          <w:rFonts w:ascii="Arial" w:hAnsi="Arial" w:cs="Arial"/>
-          <w:lang w:val="es-CO"/>
-        </w:rPr>
-        <w:t>n los valores de las columnas</w:t>
-      </w:r>
-      <w:r>
-        <w:rPr>
-          <w:rFonts w:ascii="Arial" w:hAnsi="Arial" w:cs="Arial"/>
-          <w:lang w:val="es-CO"/>
-        </w:rPr>
-        <w:t xml:space="preserve"> </w:t>
-      </w:r>
-      <w:r>
-        <w:rPr>
-          <w:rFonts w:ascii="Arial" w:hAnsi="Arial" w:cs="Arial"/>
-          <w:lang w:val="es-CO"/>
-        </w:rPr>
-        <w:t xml:space="preserve">‘Sexo’ y </w:t>
-      </w:r>
-      <w:r>
-        <w:rPr>
-          <w:rFonts w:ascii="Arial" w:hAnsi="Arial" w:cs="Arial"/>
-          <w:lang w:val="es-CO"/>
-        </w:rPr>
-        <w:t>‘</w:t>
+        <w:t>Se propagan los valores de las columnas ‘Sexo’ y ‘</w:t>
       </w:r>
       <w:proofErr w:type="spellStart"/>
       <w:r>
@@ -5976,6 +5948,1049 @@
         </w:rPr>
       </w:pPr>
     </w:p>
+    <w:p>
+      <w:pPr>
+        <w:rPr>
+          <w:rFonts w:ascii="Arial" w:hAnsi="Arial" w:cs="Arial"/>
+          <w:lang w:val="es-CO"/>
+        </w:rPr>
+      </w:pPr>
+    </w:p>
+    <w:p>
+      <w:pPr>
+        <w:rPr>
+          <w:rFonts w:ascii="Arial" w:hAnsi="Arial" w:cs="Arial"/>
+          <w:b/>
+          <w:bCs/>
+          <w:lang w:val="es-CO"/>
+        </w:rPr>
+      </w:pPr>
+      <w:r>
+        <w:rPr>
+          <w:rFonts w:ascii="Arial" w:hAnsi="Arial" w:cs="Arial"/>
+          <w:b/>
+          <w:bCs/>
+          <w:lang w:val="es-CO"/>
+        </w:rPr>
+        <w:t>12PM</w:t>
+      </w:r>
+    </w:p>
+    <w:p>
+      <w:pPr>
+        <w:rPr>
+          <w:rFonts w:ascii="Arial" w:hAnsi="Arial" w:cs="Arial"/>
+          <w:lang w:val="es-CO"/>
+        </w:rPr>
+      </w:pPr>
+      <w:r>
+        <w:rPr>
+          <w:rFonts w:ascii="Arial" w:hAnsi="Arial" w:cs="Arial"/>
+          <w:lang w:val="es-CO"/>
+        </w:rPr>
+        <w:t xml:space="preserve">Se empieza por extraer solo la parte correspondiente a los datos del archivo </w:t>
+      </w:r>
+      <w:proofErr w:type="spellStart"/>
+      <w:r>
+        <w:rPr>
+          <w:rFonts w:ascii="Arial" w:hAnsi="Arial" w:cs="Arial"/>
+          <w:lang w:val="es-CO"/>
+        </w:rPr>
+        <w:t>excel</w:t>
+      </w:r>
+      <w:proofErr w:type="spellEnd"/>
+      <w:r>
+        <w:rPr>
+          <w:rFonts w:ascii="Arial" w:hAnsi="Arial" w:cs="Arial"/>
+          <w:lang w:val="es-CO"/>
+        </w:rPr>
+        <w:t>, para lo cual se ignoran las primeras 9 filas de la hoja.</w:t>
+      </w:r>
+    </w:p>
+    <w:p>
+      <w:pPr>
+        <w:rPr>
+          <w:rFonts w:ascii="Arial" w:hAnsi="Arial" w:cs="Arial"/>
+          <w:lang w:val="es-CO"/>
+        </w:rPr>
+      </w:pPr>
+      <w:r>
+        <w:rPr>
+          <w:rFonts w:ascii="Arial" w:hAnsi="Arial" w:cs="Arial"/>
+          <w:noProof/>
+          <w:lang w:val="es-CO"/>
+        </w:rPr>
+        <w:lastRenderedPageBreak/>
+        <w:drawing>
+          <wp:inline distT="0" distB="0" distL="0" distR="0" wp14:anchorId="616C58C5" wp14:editId="798C2D75">
+            <wp:extent cx="5612130" cy="2644140"/>
+            <wp:effectExtent l="0" t="0" r="7620" b="3810"/>
+            <wp:docPr id="32" name="Imagen 32"/>
+            <wp:cNvGraphicFramePr>
+              <a:graphicFrameLocks xmlns:a="http://schemas.openxmlformats.org/drawingml/2006/main" noChangeAspect="1"/>
+            </wp:cNvGraphicFramePr>
+            <a:graphic xmlns:a="http://schemas.openxmlformats.org/drawingml/2006/main">
+              <a:graphicData uri="http://schemas.openxmlformats.org/drawingml/2006/picture">
+                <pic:pic xmlns:pic="http://schemas.openxmlformats.org/drawingml/2006/picture">
+                  <pic:nvPicPr>
+                    <pic:cNvPr id="32" name="Imagen 32"/>
+                    <pic:cNvPicPr/>
+                  </pic:nvPicPr>
+                  <pic:blipFill>
+                    <a:blip r:embed="rId43">
+                      <a:extLst>
+                        <a:ext uri="{28A0092B-C50C-407E-A947-70E740481C1C}">
+                          <a14:useLocalDpi xmlns:a14="http://schemas.microsoft.com/office/drawing/2010/main" val="0"/>
+                        </a:ext>
+                      </a:extLst>
+                    </a:blip>
+                    <a:stretch>
+                      <a:fillRect/>
+                    </a:stretch>
+                  </pic:blipFill>
+                  <pic:spPr>
+                    <a:xfrm>
+                      <a:off x="0" y="0"/>
+                      <a:ext cx="5612130" cy="2644140"/>
+                    </a:xfrm>
+                    <a:prstGeom prst="rect">
+                      <a:avLst/>
+                    </a:prstGeom>
+                  </pic:spPr>
+                </pic:pic>
+              </a:graphicData>
+            </a:graphic>
+          </wp:inline>
+        </w:drawing>
+      </w:r>
+    </w:p>
+    <w:p>
+      <w:pPr>
+        <w:rPr>
+          <w:rFonts w:ascii="Arial" w:hAnsi="Arial" w:cs="Arial"/>
+          <w:lang w:val="es-CO"/>
+        </w:rPr>
+      </w:pPr>
+    </w:p>
+    <w:p>
+      <w:pPr>
+        <w:rPr>
+          <w:rFonts w:ascii="Arial" w:hAnsi="Arial" w:cs="Arial"/>
+          <w:lang w:val="es-CO"/>
+        </w:rPr>
+      </w:pPr>
+      <w:r>
+        <w:rPr>
+          <w:rFonts w:ascii="Arial" w:hAnsi="Arial" w:cs="Arial"/>
+          <w:lang w:val="es-CO"/>
+        </w:rPr>
+        <w:t>Filtrado de datos que no son de Viterbo, Caldas</w:t>
+      </w:r>
+    </w:p>
+    <w:p>
+      <w:pPr>
+        <w:rPr>
+          <w:rFonts w:ascii="Arial" w:hAnsi="Arial" w:cs="Arial"/>
+          <w:lang w:val="es-CO"/>
+        </w:rPr>
+      </w:pPr>
+      <w:r>
+        <w:rPr>
+          <w:rFonts w:ascii="Arial" w:hAnsi="Arial" w:cs="Arial"/>
+          <w:lang w:val="es-CO"/>
+        </w:rPr>
+        <w:t>Para esta hoja se decide propagar el valor del identificador del municipio, ‘17877_Viterbo’, y seleccionar solo los registros que lo contengan.</w:t>
+      </w:r>
+    </w:p>
+    <w:p>
+      <w:pPr>
+        <w:rPr>
+          <w:rFonts w:ascii="Arial" w:hAnsi="Arial" w:cs="Arial"/>
+          <w:lang w:val="es-CO"/>
+        </w:rPr>
+      </w:pPr>
+      <w:r>
+        <w:rPr>
+          <w:rFonts w:ascii="Arial" w:hAnsi="Arial" w:cs="Arial"/>
+          <w:noProof/>
+          <w:lang w:val="es-CO"/>
+        </w:rPr>
+        <w:lastRenderedPageBreak/>
+        <w:drawing>
+          <wp:inline distT="0" distB="0" distL="0" distR="0" wp14:anchorId="754ED878" wp14:editId="7C64FE3E">
+            <wp:extent cx="5612130" cy="5017770"/>
+            <wp:effectExtent l="0" t="0" r="7620" b="0"/>
+            <wp:docPr id="33" name="Imagen 33"/>
+            <wp:cNvGraphicFramePr>
+              <a:graphicFrameLocks xmlns:a="http://schemas.openxmlformats.org/drawingml/2006/main" noChangeAspect="1"/>
+            </wp:cNvGraphicFramePr>
+            <a:graphic xmlns:a="http://schemas.openxmlformats.org/drawingml/2006/main">
+              <a:graphicData uri="http://schemas.openxmlformats.org/drawingml/2006/picture">
+                <pic:pic xmlns:pic="http://schemas.openxmlformats.org/drawingml/2006/picture">
+                  <pic:nvPicPr>
+                    <pic:cNvPr id="33" name="Imagen 33"/>
+                    <pic:cNvPicPr/>
+                  </pic:nvPicPr>
+                  <pic:blipFill>
+                    <a:blip r:embed="rId44">
+                      <a:extLst>
+                        <a:ext uri="{28A0092B-C50C-407E-A947-70E740481C1C}">
+                          <a14:useLocalDpi xmlns:a14="http://schemas.microsoft.com/office/drawing/2010/main" val="0"/>
+                        </a:ext>
+                      </a:extLst>
+                    </a:blip>
+                    <a:stretch>
+                      <a:fillRect/>
+                    </a:stretch>
+                  </pic:blipFill>
+                  <pic:spPr>
+                    <a:xfrm>
+                      <a:off x="0" y="0"/>
+                      <a:ext cx="5612130" cy="5017770"/>
+                    </a:xfrm>
+                    <a:prstGeom prst="rect">
+                      <a:avLst/>
+                    </a:prstGeom>
+                  </pic:spPr>
+                </pic:pic>
+              </a:graphicData>
+            </a:graphic>
+          </wp:inline>
+        </w:drawing>
+      </w:r>
+    </w:p>
+    <w:p>
+      <w:pPr>
+        <w:rPr>
+          <w:rFonts w:ascii="Arial" w:hAnsi="Arial" w:cs="Arial"/>
+          <w:lang w:val="es-CO"/>
+        </w:rPr>
+      </w:pPr>
+    </w:p>
+    <w:p>
+      <w:pPr>
+        <w:rPr>
+          <w:rFonts w:ascii="Arial" w:hAnsi="Arial" w:cs="Arial"/>
+          <w:lang w:val="es-CO"/>
+        </w:rPr>
+      </w:pPr>
+      <w:r>
+        <w:rPr>
+          <w:rFonts w:ascii="Arial" w:hAnsi="Arial" w:cs="Arial"/>
+          <w:lang w:val="es-CO"/>
+        </w:rPr>
+        <w:t xml:space="preserve">Actualización de </w:t>
+      </w:r>
+      <w:proofErr w:type="spellStart"/>
+      <w:r>
+        <w:rPr>
+          <w:rFonts w:ascii="Arial" w:hAnsi="Arial" w:cs="Arial"/>
+          <w:lang w:val="es-CO"/>
+        </w:rPr>
+        <w:t>headers</w:t>
+      </w:r>
+      <w:proofErr w:type="spellEnd"/>
+    </w:p>
+    <w:p>
+      <w:pPr>
+        <w:rPr>
+          <w:rFonts w:ascii="Arial" w:hAnsi="Arial" w:cs="Arial"/>
+          <w:lang w:val="es-CO"/>
+        </w:rPr>
+      </w:pPr>
+      <w:r>
+        <w:rPr>
+          <w:rFonts w:ascii="Arial" w:hAnsi="Arial" w:cs="Arial"/>
+          <w:lang w:val="es-CO"/>
+        </w:rPr>
+        <w:t xml:space="preserve">Al extraer los datos desde el archivo .xlsx, se verifica el </w:t>
+      </w:r>
+      <w:proofErr w:type="spellStart"/>
+      <w:r>
+        <w:rPr>
+          <w:rFonts w:ascii="Arial" w:hAnsi="Arial" w:cs="Arial"/>
+          <w:lang w:val="es-CO"/>
+        </w:rPr>
+        <w:t>dataframe</w:t>
+      </w:r>
+      <w:proofErr w:type="spellEnd"/>
+      <w:r>
+        <w:rPr>
+          <w:rFonts w:ascii="Arial" w:hAnsi="Arial" w:cs="Arial"/>
+          <w:lang w:val="es-CO"/>
+        </w:rPr>
+        <w:t xml:space="preserve"> generado por Pandas, empezando por los nombres de las columnas y se observan las siguientes incidencias:</w:t>
+      </w:r>
+    </w:p>
+    <w:p>
+      <w:pPr>
+        <w:pStyle w:val="Prrafodelista"/>
+        <w:numPr>
+          <w:ilvl w:val="0"/>
+          <w:numId w:val="1"/>
+        </w:numPr>
+        <w:rPr>
+          <w:rFonts w:ascii="Arial" w:hAnsi="Arial" w:cs="Arial"/>
+          <w:lang w:val="es-CO"/>
+        </w:rPr>
+      </w:pPr>
+      <w:proofErr w:type="spellStart"/>
+      <w:r>
+        <w:rPr>
+          <w:rFonts w:ascii="Arial" w:hAnsi="Arial" w:cs="Arial"/>
+          <w:lang w:val="es-CO"/>
+        </w:rPr>
+        <w:t>Headers</w:t>
+      </w:r>
+      <w:proofErr w:type="spellEnd"/>
+      <w:r>
+        <w:rPr>
+          <w:rFonts w:ascii="Arial" w:hAnsi="Arial" w:cs="Arial"/>
+          <w:lang w:val="es-CO"/>
+        </w:rPr>
+        <w:t xml:space="preserve"> sin nombres descriptivos: </w:t>
+      </w:r>
+      <w:proofErr w:type="spellStart"/>
+      <w:r>
+        <w:rPr>
+          <w:rFonts w:ascii="Arial" w:hAnsi="Arial" w:cs="Arial"/>
+          <w:lang w:val="es-CO"/>
+        </w:rPr>
+        <w:t>headers</w:t>
+      </w:r>
+      <w:proofErr w:type="spellEnd"/>
+      <w:r>
+        <w:rPr>
+          <w:rFonts w:ascii="Arial" w:hAnsi="Arial" w:cs="Arial"/>
+          <w:lang w:val="es-CO"/>
+        </w:rPr>
+        <w:t xml:space="preserve"> con nombres por defecto de Pandas tipo ‘</w:t>
+      </w:r>
+      <w:proofErr w:type="spellStart"/>
+      <w:r>
+        <w:rPr>
+          <w:rFonts w:ascii="Arial" w:hAnsi="Arial" w:cs="Arial"/>
+          <w:lang w:val="es-CO"/>
+        </w:rPr>
+        <w:t>Unnamed</w:t>
+      </w:r>
+      <w:proofErr w:type="spellEnd"/>
+      <w:r>
+        <w:rPr>
+          <w:rFonts w:ascii="Arial" w:hAnsi="Arial" w:cs="Arial"/>
+          <w:lang w:val="es-CO"/>
+        </w:rPr>
+        <w:t>: X’.</w:t>
+      </w:r>
+    </w:p>
+    <w:p>
+      <w:pPr>
+        <w:pStyle w:val="Prrafodelista"/>
+        <w:numPr>
+          <w:ilvl w:val="0"/>
+          <w:numId w:val="1"/>
+        </w:numPr>
+        <w:rPr>
+          <w:rFonts w:ascii="Arial" w:hAnsi="Arial" w:cs="Arial"/>
+          <w:lang w:val="es-CO"/>
+        </w:rPr>
+      </w:pPr>
+      <w:proofErr w:type="spellStart"/>
+      <w:r>
+        <w:rPr>
+          <w:rFonts w:ascii="Arial" w:hAnsi="Arial" w:cs="Arial"/>
+          <w:lang w:val="es-CO"/>
+        </w:rPr>
+        <w:t>Headers</w:t>
+      </w:r>
+      <w:proofErr w:type="spellEnd"/>
+      <w:r>
+        <w:rPr>
+          <w:rFonts w:ascii="Arial" w:hAnsi="Arial" w:cs="Arial"/>
+          <w:lang w:val="es-CO"/>
+        </w:rPr>
+        <w:t xml:space="preserve"> en jerarquías inferiores debido a la agrupación de datos: </w:t>
+      </w:r>
+      <w:r>
+        <w:rPr>
+          <w:rFonts w:ascii="Arial" w:hAnsi="Arial" w:cs="Arial"/>
+          <w:lang w:val="es-CO"/>
+        </w:rPr>
+        <w:t xml:space="preserve">Los </w:t>
+      </w:r>
+      <w:proofErr w:type="spellStart"/>
+      <w:r>
+        <w:rPr>
+          <w:rFonts w:ascii="Arial" w:hAnsi="Arial" w:cs="Arial"/>
+          <w:lang w:val="es-CO"/>
+        </w:rPr>
+        <w:t>headers</w:t>
+      </w:r>
+      <w:proofErr w:type="spellEnd"/>
+      <w:r>
+        <w:rPr>
+          <w:rFonts w:ascii="Arial" w:hAnsi="Arial" w:cs="Arial"/>
+          <w:lang w:val="es-CO"/>
+        </w:rPr>
+        <w:t xml:space="preserve"> se encuentran en la primera fila de datos debido al diseño del .xlsx donde se busca describir la agrupación por </w:t>
+      </w:r>
+      <w:r>
+        <w:rPr>
+          <w:rFonts w:ascii="Arial" w:hAnsi="Arial" w:cs="Arial"/>
+          <w:lang w:val="es-CO"/>
+        </w:rPr>
+        <w:t>Área en la que se tomaron los datos</w:t>
+      </w:r>
+      <w:r>
+        <w:rPr>
+          <w:rFonts w:ascii="Arial" w:hAnsi="Arial" w:cs="Arial"/>
+          <w:lang w:val="es-CO"/>
+        </w:rPr>
+        <w:t>.</w:t>
+      </w:r>
+    </w:p>
+    <w:p>
+      <w:pPr>
+        <w:rPr>
+          <w:rFonts w:ascii="Arial" w:hAnsi="Arial" w:cs="Arial"/>
+          <w:lang w:val="es-CO"/>
+        </w:rPr>
+      </w:pPr>
+      <w:r>
+        <w:rPr>
+          <w:rFonts w:ascii="Arial" w:hAnsi="Arial" w:cs="Arial"/>
+          <w:lang w:val="es-CO"/>
+        </w:rPr>
+        <w:t xml:space="preserve">Debido a la agrupación de datos en las columnas, se divide el </w:t>
+      </w:r>
+      <w:proofErr w:type="spellStart"/>
+      <w:r>
+        <w:rPr>
+          <w:rFonts w:ascii="Arial" w:hAnsi="Arial" w:cs="Arial"/>
+          <w:lang w:val="es-CO"/>
+        </w:rPr>
+        <w:t>dataframe</w:t>
+      </w:r>
+      <w:proofErr w:type="spellEnd"/>
+      <w:r>
+        <w:rPr>
+          <w:rFonts w:ascii="Arial" w:hAnsi="Arial" w:cs="Arial"/>
+          <w:lang w:val="es-CO"/>
+        </w:rPr>
+        <w:t xml:space="preserve"> en 3 partes, correspondientes a las áreas, ignorando el total para remover resúmenes </w:t>
+      </w:r>
+      <w:r>
+        <w:rPr>
+          <w:rFonts w:ascii="Arial" w:hAnsi="Arial" w:cs="Arial"/>
+          <w:lang w:val="es-CO"/>
+        </w:rPr>
+        <w:lastRenderedPageBreak/>
+        <w:t xml:space="preserve">de datos en el </w:t>
+      </w:r>
+      <w:proofErr w:type="spellStart"/>
+      <w:r>
+        <w:rPr>
+          <w:rFonts w:ascii="Arial" w:hAnsi="Arial" w:cs="Arial"/>
+          <w:lang w:val="es-CO"/>
+        </w:rPr>
+        <w:t>dataset</w:t>
+      </w:r>
+      <w:proofErr w:type="spellEnd"/>
+      <w:r>
+        <w:rPr>
+          <w:rFonts w:ascii="Arial" w:hAnsi="Arial" w:cs="Arial"/>
+          <w:lang w:val="es-CO"/>
+        </w:rPr>
+        <w:t xml:space="preserve"> final. </w:t>
+      </w:r>
+      <w:r>
+        <w:rPr>
+          <w:rFonts w:ascii="Arial" w:hAnsi="Arial" w:cs="Arial"/>
+          <w:lang w:val="es-CO"/>
+        </w:rPr>
+        <w:t>Cada subconjunto se concatena con la columna de Grupo de edad, y se asigna una columna ‘</w:t>
+      </w:r>
+      <w:proofErr w:type="spellStart"/>
+      <w:r>
+        <w:rPr>
+          <w:rFonts w:ascii="Arial" w:hAnsi="Arial" w:cs="Arial"/>
+          <w:lang w:val="es-CO"/>
+        </w:rPr>
+        <w:t>Area</w:t>
+      </w:r>
+      <w:proofErr w:type="spellEnd"/>
+      <w:r>
+        <w:rPr>
+          <w:rFonts w:ascii="Arial" w:hAnsi="Arial" w:cs="Arial"/>
+          <w:lang w:val="es-CO"/>
+        </w:rPr>
+        <w:t xml:space="preserve">’ que contiene el área donde fueron tomados los datos. Luego se reemplazan los nombres de las columnas que todavía tienen un nombre por defecto por los siguientes nombres en su orden correspondiente: </w:t>
+      </w:r>
+    </w:p>
+    <w:p>
+      <w:pPr>
+        <w:pStyle w:val="Prrafodelista"/>
+        <w:numPr>
+          <w:ilvl w:val="0"/>
+          <w:numId w:val="7"/>
+        </w:numPr>
+        <w:rPr>
+          <w:rFonts w:ascii="Arial" w:hAnsi="Arial" w:cs="Arial"/>
+          <w:lang w:val="es-CO"/>
+        </w:rPr>
+      </w:pPr>
+      <w:r>
+        <w:rPr>
+          <w:rFonts w:ascii="Arial" w:hAnsi="Arial" w:cs="Arial"/>
+          <w:lang w:val="es-CO"/>
+        </w:rPr>
+        <w:t>'Indígena',</w:t>
+      </w:r>
+    </w:p>
+    <w:p>
+      <w:pPr>
+        <w:pStyle w:val="Prrafodelista"/>
+        <w:numPr>
+          <w:ilvl w:val="0"/>
+          <w:numId w:val="7"/>
+        </w:numPr>
+        <w:rPr>
+          <w:rFonts w:ascii="Arial" w:hAnsi="Arial" w:cs="Arial"/>
+          <w:lang w:val="es-CO"/>
+        </w:rPr>
+      </w:pPr>
+      <w:r>
+        <w:rPr>
+          <w:rFonts w:ascii="Arial" w:hAnsi="Arial" w:cs="Arial"/>
+          <w:lang w:val="es-CO"/>
+        </w:rPr>
+        <w:t xml:space="preserve">'Gitano(a) o </w:t>
+      </w:r>
+      <w:proofErr w:type="spellStart"/>
+      <w:r>
+        <w:rPr>
+          <w:rFonts w:ascii="Arial" w:hAnsi="Arial" w:cs="Arial"/>
+          <w:lang w:val="es-CO"/>
+        </w:rPr>
+        <w:t>Rrom</w:t>
+      </w:r>
+      <w:proofErr w:type="spellEnd"/>
+      <w:r>
+        <w:rPr>
+          <w:rFonts w:ascii="Arial" w:hAnsi="Arial" w:cs="Arial"/>
+          <w:lang w:val="es-CO"/>
+        </w:rPr>
+        <w:t>',</w:t>
+      </w:r>
+    </w:p>
+    <w:p>
+      <w:pPr>
+        <w:pStyle w:val="Prrafodelista"/>
+        <w:numPr>
+          <w:ilvl w:val="0"/>
+          <w:numId w:val="7"/>
+        </w:numPr>
+        <w:rPr>
+          <w:rFonts w:ascii="Arial" w:hAnsi="Arial" w:cs="Arial"/>
+          <w:lang w:val="es-CO"/>
+        </w:rPr>
+      </w:pPr>
+      <w:r>
+        <w:rPr>
+          <w:rFonts w:ascii="Arial" w:hAnsi="Arial" w:cs="Arial"/>
+          <w:lang w:val="es-CO"/>
+        </w:rPr>
+        <w:t xml:space="preserve">'Raizal del </w:t>
+      </w:r>
+      <w:proofErr w:type="spellStart"/>
+      <w:r>
+        <w:rPr>
+          <w:rFonts w:ascii="Arial" w:hAnsi="Arial" w:cs="Arial"/>
+          <w:lang w:val="es-CO"/>
+        </w:rPr>
+        <w:t>Archipielago</w:t>
+      </w:r>
+      <w:proofErr w:type="spellEnd"/>
+      <w:r>
+        <w:rPr>
+          <w:rFonts w:ascii="Arial" w:hAnsi="Arial" w:cs="Arial"/>
+          <w:lang w:val="es-CO"/>
+        </w:rPr>
+        <w:t xml:space="preserve"> de San Andrés, Providencia y Santa Catalina',</w:t>
+      </w:r>
+    </w:p>
+    <w:p>
+      <w:pPr>
+        <w:pStyle w:val="Prrafodelista"/>
+        <w:numPr>
+          <w:ilvl w:val="0"/>
+          <w:numId w:val="7"/>
+        </w:numPr>
+        <w:rPr>
+          <w:rFonts w:ascii="Arial" w:hAnsi="Arial" w:cs="Arial"/>
+          <w:lang w:val="es-CO"/>
+        </w:rPr>
+      </w:pPr>
+      <w:r>
+        <w:rPr>
+          <w:rFonts w:ascii="Arial" w:hAnsi="Arial" w:cs="Arial"/>
+          <w:lang w:val="es-CO"/>
+        </w:rPr>
+        <w:t>'Palenquero(a) de San Basilio',</w:t>
+      </w:r>
+    </w:p>
+    <w:p>
+      <w:pPr>
+        <w:pStyle w:val="Prrafodelista"/>
+        <w:numPr>
+          <w:ilvl w:val="0"/>
+          <w:numId w:val="7"/>
+        </w:numPr>
+        <w:rPr>
+          <w:rFonts w:ascii="Arial" w:hAnsi="Arial" w:cs="Arial"/>
+          <w:lang w:val="es-CO"/>
+        </w:rPr>
+      </w:pPr>
+      <w:r>
+        <w:rPr>
+          <w:rFonts w:ascii="Arial" w:hAnsi="Arial" w:cs="Arial"/>
+          <w:lang w:val="es-CO"/>
+        </w:rPr>
+        <w:t>'Negro(a), Mulato(a), Afrodescendiente, Afrocolombiano(a)',</w:t>
+      </w:r>
+    </w:p>
+    <w:p>
+      <w:pPr>
+        <w:pStyle w:val="Prrafodelista"/>
+        <w:numPr>
+          <w:ilvl w:val="0"/>
+          <w:numId w:val="7"/>
+        </w:numPr>
+        <w:rPr>
+          <w:rFonts w:ascii="Arial" w:hAnsi="Arial" w:cs="Arial"/>
+          <w:lang w:val="es-CO"/>
+        </w:rPr>
+      </w:pPr>
+      <w:r>
+        <w:rPr>
+          <w:rFonts w:ascii="Arial" w:hAnsi="Arial" w:cs="Arial"/>
+          <w:lang w:val="es-CO"/>
+        </w:rPr>
+        <w:t>'Ningún grupo étnico',</w:t>
+      </w:r>
+    </w:p>
+    <w:p>
+      <w:pPr>
+        <w:pStyle w:val="Prrafodelista"/>
+        <w:numPr>
+          <w:ilvl w:val="0"/>
+          <w:numId w:val="7"/>
+        </w:numPr>
+        <w:rPr>
+          <w:rFonts w:ascii="Arial" w:hAnsi="Arial" w:cs="Arial"/>
+          <w:lang w:val="es-CO"/>
+        </w:rPr>
+      </w:pPr>
+      <w:r>
+        <w:rPr>
+          <w:rFonts w:ascii="Arial" w:hAnsi="Arial" w:cs="Arial"/>
+          <w:lang w:val="es-CO"/>
+        </w:rPr>
+        <w:t>'Sin información'</w:t>
+      </w:r>
+    </w:p>
+    <w:p>
+      <w:pPr>
+        <w:rPr>
+          <w:rFonts w:ascii="Arial" w:hAnsi="Arial" w:cs="Arial"/>
+          <w:lang w:val="es-CO"/>
+        </w:rPr>
+      </w:pPr>
+      <w:r>
+        <w:rPr>
+          <w:rFonts w:ascii="Arial" w:hAnsi="Arial" w:cs="Arial"/>
+          <w:lang w:val="es-CO"/>
+        </w:rPr>
+        <w:t xml:space="preserve">Después de las modificaciones en cada subconjunto, se consolidan los </w:t>
+      </w:r>
+      <w:proofErr w:type="spellStart"/>
+      <w:r>
+        <w:rPr>
+          <w:rFonts w:ascii="Arial" w:hAnsi="Arial" w:cs="Arial"/>
+          <w:lang w:val="es-CO"/>
+        </w:rPr>
+        <w:t>dataframes</w:t>
+      </w:r>
+      <w:proofErr w:type="spellEnd"/>
+      <w:r>
+        <w:rPr>
+          <w:rFonts w:ascii="Arial" w:hAnsi="Arial" w:cs="Arial"/>
+          <w:lang w:val="es-CO"/>
+        </w:rPr>
+        <w:t xml:space="preserve"> en un solo </w:t>
+      </w:r>
+      <w:proofErr w:type="spellStart"/>
+      <w:r>
+        <w:rPr>
+          <w:rFonts w:ascii="Arial" w:hAnsi="Arial" w:cs="Arial"/>
+          <w:lang w:val="es-CO"/>
+        </w:rPr>
+        <w:t>dataframe</w:t>
+      </w:r>
+      <w:proofErr w:type="spellEnd"/>
+      <w:r>
+        <w:rPr>
+          <w:rFonts w:ascii="Arial" w:hAnsi="Arial" w:cs="Arial"/>
+          <w:lang w:val="es-CO"/>
+        </w:rPr>
+        <w:t>.</w:t>
+      </w:r>
+    </w:p>
+    <w:p>
+      <w:pPr>
+        <w:rPr>
+          <w:rFonts w:ascii="Arial" w:hAnsi="Arial" w:cs="Arial"/>
+          <w:lang w:val="es-CO"/>
+        </w:rPr>
+      </w:pPr>
+      <w:r>
+        <w:rPr>
+          <w:rFonts w:ascii="Arial" w:hAnsi="Arial" w:cs="Arial"/>
+          <w:noProof/>
+          <w:lang w:val="es-CO"/>
+        </w:rPr>
+        <w:drawing>
+          <wp:inline distT="0" distB="0" distL="0" distR="0" wp14:anchorId="61BE0B23" wp14:editId="0BAB5958">
+            <wp:extent cx="5612130" cy="912495"/>
+            <wp:effectExtent l="0" t="0" r="7620" b="1905"/>
+            <wp:docPr id="34" name="Imagen 34"/>
+            <wp:cNvGraphicFramePr>
+              <a:graphicFrameLocks xmlns:a="http://schemas.openxmlformats.org/drawingml/2006/main" noChangeAspect="1"/>
+            </wp:cNvGraphicFramePr>
+            <a:graphic xmlns:a="http://schemas.openxmlformats.org/drawingml/2006/main">
+              <a:graphicData uri="http://schemas.openxmlformats.org/drawingml/2006/picture">
+                <pic:pic xmlns:pic="http://schemas.openxmlformats.org/drawingml/2006/picture">
+                  <pic:nvPicPr>
+                    <pic:cNvPr id="34" name="Imagen 34"/>
+                    <pic:cNvPicPr/>
+                  </pic:nvPicPr>
+                  <pic:blipFill>
+                    <a:blip r:embed="rId45">
+                      <a:extLst>
+                        <a:ext uri="{28A0092B-C50C-407E-A947-70E740481C1C}">
+                          <a14:useLocalDpi xmlns:a14="http://schemas.microsoft.com/office/drawing/2010/main" val="0"/>
+                        </a:ext>
+                      </a:extLst>
+                    </a:blip>
+                    <a:stretch>
+                      <a:fillRect/>
+                    </a:stretch>
+                  </pic:blipFill>
+                  <pic:spPr>
+                    <a:xfrm>
+                      <a:off x="0" y="0"/>
+                      <a:ext cx="5612130" cy="912495"/>
+                    </a:xfrm>
+                    <a:prstGeom prst="rect">
+                      <a:avLst/>
+                    </a:prstGeom>
+                  </pic:spPr>
+                </pic:pic>
+              </a:graphicData>
+            </a:graphic>
+          </wp:inline>
+        </w:drawing>
+      </w:r>
+    </w:p>
+    <w:p>
+      <w:pPr>
+        <w:rPr>
+          <w:rFonts w:ascii="Arial" w:hAnsi="Arial" w:cs="Arial"/>
+          <w:lang w:val="es-CO"/>
+        </w:rPr>
+      </w:pPr>
+      <w:r>
+        <w:rPr>
+          <w:rFonts w:ascii="Arial" w:hAnsi="Arial" w:cs="Arial"/>
+          <w:noProof/>
+          <w:lang w:val="es-CO"/>
+        </w:rPr>
+        <w:drawing>
+          <wp:inline distT="0" distB="0" distL="0" distR="0" wp14:anchorId="490AD41C" wp14:editId="13A51A0F">
+            <wp:extent cx="5612130" cy="920115"/>
+            <wp:effectExtent l="0" t="0" r="7620" b="0"/>
+            <wp:docPr id="35" name="Imagen 35"/>
+            <wp:cNvGraphicFramePr>
+              <a:graphicFrameLocks xmlns:a="http://schemas.openxmlformats.org/drawingml/2006/main" noChangeAspect="1"/>
+            </wp:cNvGraphicFramePr>
+            <a:graphic xmlns:a="http://schemas.openxmlformats.org/drawingml/2006/main">
+              <a:graphicData uri="http://schemas.openxmlformats.org/drawingml/2006/picture">
+                <pic:pic xmlns:pic="http://schemas.openxmlformats.org/drawingml/2006/picture">
+                  <pic:nvPicPr>
+                    <pic:cNvPr id="35" name="Imagen 35"/>
+                    <pic:cNvPicPr/>
+                  </pic:nvPicPr>
+                  <pic:blipFill>
+                    <a:blip r:embed="rId46">
+                      <a:extLst>
+                        <a:ext uri="{28A0092B-C50C-407E-A947-70E740481C1C}">
+                          <a14:useLocalDpi xmlns:a14="http://schemas.microsoft.com/office/drawing/2010/main" val="0"/>
+                        </a:ext>
+                      </a:extLst>
+                    </a:blip>
+                    <a:stretch>
+                      <a:fillRect/>
+                    </a:stretch>
+                  </pic:blipFill>
+                  <pic:spPr>
+                    <a:xfrm>
+                      <a:off x="0" y="0"/>
+                      <a:ext cx="5612130" cy="920115"/>
+                    </a:xfrm>
+                    <a:prstGeom prst="rect">
+                      <a:avLst/>
+                    </a:prstGeom>
+                  </pic:spPr>
+                </pic:pic>
+              </a:graphicData>
+            </a:graphic>
+          </wp:inline>
+        </w:drawing>
+      </w:r>
+    </w:p>
+    <w:p>
+      <w:pPr>
+        <w:rPr>
+          <w:rFonts w:ascii="Arial" w:hAnsi="Arial" w:cs="Arial"/>
+          <w:lang w:val="es-CO"/>
+        </w:rPr>
+      </w:pPr>
+      <w:r>
+        <w:rPr>
+          <w:rFonts w:ascii="Arial" w:hAnsi="Arial" w:cs="Arial"/>
+          <w:noProof/>
+          <w:lang w:val="es-CO"/>
+        </w:rPr>
+        <w:drawing>
+          <wp:inline distT="0" distB="0" distL="0" distR="0" wp14:anchorId="0ED0E3CE" wp14:editId="556CEBBF">
+            <wp:extent cx="5612130" cy="906145"/>
+            <wp:effectExtent l="0" t="0" r="7620" b="8255"/>
+            <wp:docPr id="36" name="Imagen 36"/>
+            <wp:cNvGraphicFramePr>
+              <a:graphicFrameLocks xmlns:a="http://schemas.openxmlformats.org/drawingml/2006/main" noChangeAspect="1"/>
+            </wp:cNvGraphicFramePr>
+            <a:graphic xmlns:a="http://schemas.openxmlformats.org/drawingml/2006/main">
+              <a:graphicData uri="http://schemas.openxmlformats.org/drawingml/2006/picture">
+                <pic:pic xmlns:pic="http://schemas.openxmlformats.org/drawingml/2006/picture">
+                  <pic:nvPicPr>
+                    <pic:cNvPr id="36" name="Imagen 36"/>
+                    <pic:cNvPicPr/>
+                  </pic:nvPicPr>
+                  <pic:blipFill>
+                    <a:blip r:embed="rId47">
+                      <a:extLst>
+                        <a:ext uri="{28A0092B-C50C-407E-A947-70E740481C1C}">
+                          <a14:useLocalDpi xmlns:a14="http://schemas.microsoft.com/office/drawing/2010/main" val="0"/>
+                        </a:ext>
+                      </a:extLst>
+                    </a:blip>
+                    <a:stretch>
+                      <a:fillRect/>
+                    </a:stretch>
+                  </pic:blipFill>
+                  <pic:spPr>
+                    <a:xfrm>
+                      <a:off x="0" y="0"/>
+                      <a:ext cx="5612130" cy="906145"/>
+                    </a:xfrm>
+                    <a:prstGeom prst="rect">
+                      <a:avLst/>
+                    </a:prstGeom>
+                  </pic:spPr>
+                </pic:pic>
+              </a:graphicData>
+            </a:graphic>
+          </wp:inline>
+        </w:drawing>
+      </w:r>
+    </w:p>
+    <w:p>
+      <w:pPr>
+        <w:rPr>
+          <w:rFonts w:ascii="Arial" w:hAnsi="Arial" w:cs="Arial"/>
+          <w:lang w:val="es-CO"/>
+        </w:rPr>
+      </w:pPr>
+    </w:p>
+    <w:p>
+      <w:pPr>
+        <w:rPr>
+          <w:rFonts w:ascii="Arial" w:hAnsi="Arial" w:cs="Arial"/>
+          <w:lang w:val="es-CO"/>
+        </w:rPr>
+      </w:pPr>
+      <w:r>
+        <w:rPr>
+          <w:rFonts w:ascii="Arial" w:hAnsi="Arial" w:cs="Arial"/>
+          <w:lang w:val="es-CO"/>
+        </w:rPr>
+        <w:t xml:space="preserve">Se renombran los </w:t>
+      </w:r>
+      <w:proofErr w:type="spellStart"/>
+      <w:r>
+        <w:rPr>
+          <w:rFonts w:ascii="Arial" w:hAnsi="Arial" w:cs="Arial"/>
+          <w:lang w:val="es-CO"/>
+        </w:rPr>
+        <w:t>headers</w:t>
+      </w:r>
+      <w:proofErr w:type="spellEnd"/>
+      <w:r>
+        <w:rPr>
+          <w:rFonts w:ascii="Arial" w:hAnsi="Arial" w:cs="Arial"/>
+          <w:lang w:val="es-CO"/>
+        </w:rPr>
+        <w:t xml:space="preserve"> que contienen tildes o ñ.</w:t>
+      </w:r>
+    </w:p>
+    <w:p>
+      <w:pPr>
+        <w:rPr>
+          <w:rFonts w:ascii="Arial" w:hAnsi="Arial" w:cs="Arial"/>
+          <w:lang w:val="es-CO"/>
+        </w:rPr>
+      </w:pPr>
+    </w:p>
+    <w:p>
+      <w:pPr>
+        <w:rPr>
+          <w:rFonts w:ascii="Arial" w:hAnsi="Arial" w:cs="Arial"/>
+          <w:lang w:val="es-CO"/>
+        </w:rPr>
+      </w:pPr>
+      <w:r>
+        <w:rPr>
+          <w:rFonts w:ascii="Arial" w:hAnsi="Arial" w:cs="Arial"/>
+          <w:lang w:val="es-CO"/>
+        </w:rPr>
+        <w:t>Se filtran las filas que contienen resúmenes de datos (Totales).</w:t>
+      </w:r>
+    </w:p>
+    <w:p>
+      <w:pPr>
+        <w:rPr>
+          <w:rFonts w:ascii="Arial" w:hAnsi="Arial" w:cs="Arial"/>
+          <w:lang w:val="es-CO"/>
+        </w:rPr>
+      </w:pPr>
+      <w:r>
+        <w:rPr>
+          <w:rFonts w:ascii="Arial" w:hAnsi="Arial" w:cs="Arial"/>
+          <w:noProof/>
+          <w:lang w:val="es-CO"/>
+        </w:rPr>
+        <w:lastRenderedPageBreak/>
+        <w:drawing>
+          <wp:inline distT="0" distB="0" distL="0" distR="0" wp14:anchorId="02B6EA6A" wp14:editId="680F1F65">
+            <wp:extent cx="5612130" cy="1207135"/>
+            <wp:effectExtent l="0" t="0" r="7620" b="0"/>
+            <wp:docPr id="37" name="Imagen 37"/>
+            <wp:cNvGraphicFramePr>
+              <a:graphicFrameLocks xmlns:a="http://schemas.openxmlformats.org/drawingml/2006/main" noChangeAspect="1"/>
+            </wp:cNvGraphicFramePr>
+            <a:graphic xmlns:a="http://schemas.openxmlformats.org/drawingml/2006/main">
+              <a:graphicData uri="http://schemas.openxmlformats.org/drawingml/2006/picture">
+                <pic:pic xmlns:pic="http://schemas.openxmlformats.org/drawingml/2006/picture">
+                  <pic:nvPicPr>
+                    <pic:cNvPr id="37" name="Imagen 37"/>
+                    <pic:cNvPicPr/>
+                  </pic:nvPicPr>
+                  <pic:blipFill>
+                    <a:blip r:embed="rId48">
+                      <a:extLst>
+                        <a:ext uri="{28A0092B-C50C-407E-A947-70E740481C1C}">
+                          <a14:useLocalDpi xmlns:a14="http://schemas.microsoft.com/office/drawing/2010/main" val="0"/>
+                        </a:ext>
+                      </a:extLst>
+                    </a:blip>
+                    <a:stretch>
+                      <a:fillRect/>
+                    </a:stretch>
+                  </pic:blipFill>
+                  <pic:spPr>
+                    <a:xfrm>
+                      <a:off x="0" y="0"/>
+                      <a:ext cx="5612130" cy="1207135"/>
+                    </a:xfrm>
+                    <a:prstGeom prst="rect">
+                      <a:avLst/>
+                    </a:prstGeom>
+                  </pic:spPr>
+                </pic:pic>
+              </a:graphicData>
+            </a:graphic>
+          </wp:inline>
+        </w:drawing>
+      </w:r>
+    </w:p>
+    <w:p>
+      <w:pPr>
+        <w:rPr>
+          <w:rFonts w:ascii="Arial" w:hAnsi="Arial" w:cs="Arial"/>
+          <w:lang w:val="es-CO"/>
+        </w:rPr>
+      </w:pPr>
+    </w:p>
+    <w:p>
+      <w:pPr>
+        <w:rPr>
+          <w:rFonts w:ascii="Arial" w:hAnsi="Arial" w:cs="Arial"/>
+          <w:lang w:val="es-CO"/>
+        </w:rPr>
+      </w:pPr>
+      <w:r>
+        <w:rPr>
+          <w:rFonts w:ascii="Arial" w:hAnsi="Arial" w:cs="Arial"/>
+          <w:lang w:val="es-CO"/>
+        </w:rPr>
+        <w:t xml:space="preserve">Finalmente, se cambian las tildes </w:t>
+      </w:r>
+      <w:r>
+        <w:rPr>
+          <w:rFonts w:ascii="Arial" w:hAnsi="Arial" w:cs="Arial"/>
+          <w:lang w:val="es-CO"/>
+        </w:rPr>
+        <w:t xml:space="preserve">y las ñ dentro de los datos, </w:t>
+      </w:r>
+      <w:r>
+        <w:rPr>
+          <w:rFonts w:ascii="Arial" w:hAnsi="Arial" w:cs="Arial"/>
+          <w:lang w:val="es-CO"/>
+        </w:rPr>
+        <w:t>reemplazando vocales con tilde por vocales sin tilde</w:t>
+      </w:r>
+      <w:r>
+        <w:rPr>
+          <w:rFonts w:ascii="Arial" w:hAnsi="Arial" w:cs="Arial"/>
+          <w:lang w:val="es-CO"/>
+        </w:rPr>
+        <w:t xml:space="preserve"> y la letra ñ por la letra n</w:t>
+      </w:r>
+      <w:r>
+        <w:rPr>
+          <w:rFonts w:ascii="Arial" w:hAnsi="Arial" w:cs="Arial"/>
+          <w:lang w:val="es-CO"/>
+        </w:rPr>
+        <w:t>.</w:t>
+      </w:r>
+    </w:p>
+    <w:p>
+      <w:pPr>
+        <w:rPr>
+          <w:rFonts w:ascii="Arial" w:hAnsi="Arial" w:cs="Arial"/>
+          <w:lang w:val="es-CO"/>
+        </w:rPr>
+      </w:pPr>
+    </w:p>
     <w:sectPr>
       <w:pgSz w:w="12240" w:h="15840"/>
       <w:pgMar w:top="1417" w:right="1701" w:bottom="1417" w:left="1701" w:header="720" w:footer="720" w:gutter="0"/>
@@ -6557,6 +7572,119 @@
     <w:nsid w:val="496738FF"/>
     <w:multiLevelType w:val="hybridMultilevel"/>
     <w:tmpl w:val="BCB87994"/>
+    <w:lvl w:ilvl="0" w:tplc="240A0001">
+      <w:start w:val="1"/>
+      <w:numFmt w:val="bullet"/>
+      <w:lvlText w:val=""/>
+      <w:lvlJc w:val="left"/>
+      <w:pPr>
+        <w:ind w:left="720" w:hanging="360"/>
+      </w:pPr>
+      <w:rPr>
+        <w:rFonts w:ascii="Symbol" w:hAnsi="Symbol" w:hint="default"/>
+      </w:rPr>
+    </w:lvl>
+    <w:lvl w:ilvl="1" w:tplc="240A0003" w:tentative="1">
+      <w:start w:val="1"/>
+      <w:numFmt w:val="bullet"/>
+      <w:lvlText w:val="o"/>
+      <w:lvlJc w:val="left"/>
+      <w:pPr>
+        <w:ind w:left="1440" w:hanging="360"/>
+      </w:pPr>
+      <w:rPr>
+        <w:rFonts w:ascii="Courier New" w:hAnsi="Courier New" w:cs="Courier New" w:hint="default"/>
+      </w:rPr>
+    </w:lvl>
+    <w:lvl w:ilvl="2" w:tplc="240A0005" w:tentative="1">
+      <w:start w:val="1"/>
+      <w:numFmt w:val="bullet"/>
+      <w:lvlText w:val=""/>
+      <w:lvlJc w:val="left"/>
+      <w:pPr>
+        <w:ind w:left="2160" w:hanging="360"/>
+      </w:pPr>
+      <w:rPr>
+        <w:rFonts w:ascii="Wingdings" w:hAnsi="Wingdings" w:hint="default"/>
+      </w:rPr>
+    </w:lvl>
+    <w:lvl w:ilvl="3" w:tplc="240A0001" w:tentative="1">
+      <w:start w:val="1"/>
+      <w:numFmt w:val="bullet"/>
+      <w:lvlText w:val=""/>
+      <w:lvlJc w:val="left"/>
+      <w:pPr>
+        <w:ind w:left="2880" w:hanging="360"/>
+      </w:pPr>
+      <w:rPr>
+        <w:rFonts w:ascii="Symbol" w:hAnsi="Symbol" w:hint="default"/>
+      </w:rPr>
+    </w:lvl>
+    <w:lvl w:ilvl="4" w:tplc="240A0003" w:tentative="1">
+      <w:start w:val="1"/>
+      <w:numFmt w:val="bullet"/>
+      <w:lvlText w:val="o"/>
+      <w:lvlJc w:val="left"/>
+      <w:pPr>
+        <w:ind w:left="3600" w:hanging="360"/>
+      </w:pPr>
+      <w:rPr>
+        <w:rFonts w:ascii="Courier New" w:hAnsi="Courier New" w:cs="Courier New" w:hint="default"/>
+      </w:rPr>
+    </w:lvl>
+    <w:lvl w:ilvl="5" w:tplc="240A0005" w:tentative="1">
+      <w:start w:val="1"/>
+      <w:numFmt w:val="bullet"/>
+      <w:lvlText w:val=""/>
+      <w:lvlJc w:val="left"/>
+      <w:pPr>
+        <w:ind w:left="4320" w:hanging="360"/>
+      </w:pPr>
+      <w:rPr>
+        <w:rFonts w:ascii="Wingdings" w:hAnsi="Wingdings" w:hint="default"/>
+      </w:rPr>
+    </w:lvl>
+    <w:lvl w:ilvl="6" w:tplc="240A0001" w:tentative="1">
+      <w:start w:val="1"/>
+      <w:numFmt w:val="bullet"/>
+      <w:lvlText w:val=""/>
+      <w:lvlJc w:val="left"/>
+      <w:pPr>
+        <w:ind w:left="5040" w:hanging="360"/>
+      </w:pPr>
+      <w:rPr>
+        <w:rFonts w:ascii="Symbol" w:hAnsi="Symbol" w:hint="default"/>
+      </w:rPr>
+    </w:lvl>
+    <w:lvl w:ilvl="7" w:tplc="240A0003" w:tentative="1">
+      <w:start w:val="1"/>
+      <w:numFmt w:val="bullet"/>
+      <w:lvlText w:val="o"/>
+      <w:lvlJc w:val="left"/>
+      <w:pPr>
+        <w:ind w:left="5760" w:hanging="360"/>
+      </w:pPr>
+      <w:rPr>
+        <w:rFonts w:ascii="Courier New" w:hAnsi="Courier New" w:cs="Courier New" w:hint="default"/>
+      </w:rPr>
+    </w:lvl>
+    <w:lvl w:ilvl="8" w:tplc="240A0005" w:tentative="1">
+      <w:start w:val="1"/>
+      <w:numFmt w:val="bullet"/>
+      <w:lvlText w:val=""/>
+      <w:lvlJc w:val="left"/>
+      <w:pPr>
+        <w:ind w:left="6480" w:hanging="360"/>
+      </w:pPr>
+      <w:rPr>
+        <w:rFonts w:ascii="Wingdings" w:hAnsi="Wingdings" w:hint="default"/>
+      </w:rPr>
+    </w:lvl>
+  </w:abstractNum>
+  <w:abstractNum w:abstractNumId="6" w15:restartNumberingAfterBreak="0">
+    <w:nsid w:val="74275815"/>
+    <w:multiLevelType w:val="hybridMultilevel"/>
+    <w:tmpl w:val="CB169C92"/>
     <w:lvl w:ilvl="0" w:tplc="240A0001">
       <w:start w:val="1"/>
       <w:numFmt w:val="bullet"/>
@@ -6683,6 +7811,9 @@
   </w:num>
   <w:num w:numId="6">
     <w:abstractNumId w:val="3"/>
+  </w:num>
+  <w:num w:numId="7">
+    <w:abstractNumId w:val="6"/>
   </w:num>
 </w:numbering>
 </file>

</xml_diff>

<commit_message>
Actualiza doc de procesamiento de datos con procesamiento de la hoja 13PM
</commit_message>
<xml_diff>
--- a/Documentacion/Procesamiento de Datos.docx
+++ b/Documentacion/Procesamiento de Datos.docx
@@ -107,7 +107,7 @@
           <w:rFonts w:ascii="Arial" w:hAnsi="Arial" w:cs="Arial"/>
           <w:lang w:val="es-CO"/>
         </w:rPr>
-        <w:t>1</w:t>
+        <w:t>2</w:t>
       </w:r>
       <w:r>
         <w:rPr>
@@ -200,126 +200,37 @@
           <w:rFonts w:ascii="Arial" w:hAnsi="Arial" w:cs="Arial"/>
           <w:lang w:val="es-CO"/>
         </w:rPr>
-        <w:t>Almacenamiento de datos extraídos: .</w:t>
-      </w:r>
-      <w:proofErr w:type="spellStart"/>
-      <w:r>
-        <w:rPr>
-          <w:rFonts w:ascii="Arial" w:hAnsi="Arial" w:cs="Arial"/>
-          <w:lang w:val="es-CO"/>
-        </w:rPr>
-        <w:t>csv</w:t>
-      </w:r>
-      <w:proofErr w:type="spellEnd"/>
-    </w:p>
-    <w:p>
-      <w:pPr>
-        <w:rPr>
-          <w:rFonts w:ascii="Arial" w:hAnsi="Arial" w:cs="Arial"/>
-          <w:lang w:val="es-CO"/>
-        </w:rPr>
-      </w:pPr>
-      <w:r>
-        <w:rPr>
-          <w:rFonts w:ascii="Arial" w:hAnsi="Arial" w:cs="Arial"/>
-          <w:lang w:val="es-CO"/>
-        </w:rPr>
-        <w:t xml:space="preserve">Las fuentes de datos vienen en hojas de </w:t>
-      </w:r>
-      <w:proofErr w:type="spellStart"/>
-      <w:r>
-        <w:rPr>
-          <w:rFonts w:ascii="Arial" w:hAnsi="Arial" w:cs="Arial"/>
-          <w:lang w:val="es-CO"/>
-        </w:rPr>
-        <w:t>excel</w:t>
-      </w:r>
-      <w:proofErr w:type="spellEnd"/>
-      <w:r>
-        <w:rPr>
-          <w:rFonts w:ascii="Arial" w:hAnsi="Arial" w:cs="Arial"/>
-          <w:lang w:val="es-CO"/>
-        </w:rPr>
-        <w:t xml:space="preserve"> desde el origen, aunque el proyecto es muy específico sobre el municipio de Viterbo, Caldas y podrían extraerse manualmente a otra hoja de </w:t>
-      </w:r>
-      <w:proofErr w:type="spellStart"/>
-      <w:r>
-        <w:rPr>
-          <w:rFonts w:ascii="Arial" w:hAnsi="Arial" w:cs="Arial"/>
-          <w:lang w:val="es-CO"/>
-        </w:rPr>
-        <w:t>excel</w:t>
-      </w:r>
-      <w:proofErr w:type="spellEnd"/>
-      <w:r>
-        <w:rPr>
-          <w:rFonts w:ascii="Arial" w:hAnsi="Arial" w:cs="Arial"/>
-          <w:lang w:val="es-CO"/>
-        </w:rPr>
-        <w:t xml:space="preserve"> y trabajar sobre ellos, se puede construir un flujo de extracción de datos escalable utilizando Python, lo anterior para poder aplicarlo a todo el </w:t>
-      </w:r>
-      <w:proofErr w:type="spellStart"/>
-      <w:r>
-        <w:rPr>
-          <w:rFonts w:ascii="Arial" w:hAnsi="Arial" w:cs="Arial"/>
-          <w:lang w:val="es-CO"/>
-        </w:rPr>
-        <w:t>dataset</w:t>
-      </w:r>
-      <w:proofErr w:type="spellEnd"/>
-      <w:r>
-        <w:rPr>
-          <w:rFonts w:ascii="Arial" w:hAnsi="Arial" w:cs="Arial"/>
-          <w:lang w:val="es-CO"/>
-        </w:rPr>
-        <w:t xml:space="preserve"> en un futuro.</w:t>
-      </w:r>
-    </w:p>
-    <w:p>
-      <w:pPr>
-        <w:rPr>
-          <w:rFonts w:ascii="Arial" w:hAnsi="Arial" w:cs="Arial"/>
-          <w:lang w:val="es-CO"/>
-        </w:rPr>
-      </w:pPr>
-      <w:r>
-        <w:rPr>
-          <w:rFonts w:ascii="Arial" w:hAnsi="Arial" w:cs="Arial"/>
-          <w:lang w:val="es-CO"/>
-        </w:rPr>
-        <w:t>Los datos procesados se almacenarán en documentos .</w:t>
-      </w:r>
-      <w:proofErr w:type="spellStart"/>
-      <w:r>
-        <w:rPr>
-          <w:rFonts w:ascii="Arial" w:hAnsi="Arial" w:cs="Arial"/>
-          <w:lang w:val="es-CO"/>
-        </w:rPr>
-        <w:t>csv</w:t>
-      </w:r>
-      <w:proofErr w:type="spellEnd"/>
-      <w:r>
-        <w:rPr>
-          <w:rFonts w:ascii="Arial" w:hAnsi="Arial" w:cs="Arial"/>
-          <w:lang w:val="es-CO"/>
-        </w:rPr>
-        <w:t xml:space="preserve"> como </w:t>
-      </w:r>
-      <w:proofErr w:type="spellStart"/>
-      <w:r>
-        <w:rPr>
-          <w:rFonts w:ascii="Arial" w:hAnsi="Arial" w:cs="Arial"/>
-          <w:lang w:val="es-CO"/>
-        </w:rPr>
-        <w:t>datasets</w:t>
-      </w:r>
-      <w:proofErr w:type="spellEnd"/>
-      <w:r>
-        <w:rPr>
-          <w:rFonts w:ascii="Arial" w:hAnsi="Arial" w:cs="Arial"/>
-          <w:lang w:val="es-CO"/>
-        </w:rPr>
-        <w:t xml:space="preserve"> definitivos.</w:t>
+        <w:t>Almacenamiento de datos extraídos: .csv</w:t>
+      </w:r>
+    </w:p>
+    <w:p>
+      <w:pPr>
+        <w:rPr>
+          <w:rFonts w:ascii="Arial" w:hAnsi="Arial" w:cs="Arial"/>
+          <w:lang w:val="es-CO"/>
+        </w:rPr>
+      </w:pPr>
+      <w:r>
+        <w:rPr>
+          <w:rFonts w:ascii="Arial" w:hAnsi="Arial" w:cs="Arial"/>
+          <w:lang w:val="es-CO"/>
+        </w:rPr>
+        <w:t>Las fuentes de datos vienen en hojas de excel desde el origen, aunque el proyecto es muy específico sobre el municipio de Viterbo, Caldas y podrían extraerse manualmente a otra hoja de excel y trabajar sobre ellos, se puede construir un flujo de extracción de datos escalable utilizando Python, lo anterior para poder aplicarlo a todo el dataset en un futuro.</w:t>
+      </w:r>
+    </w:p>
+    <w:p>
+      <w:pPr>
+        <w:rPr>
+          <w:rFonts w:ascii="Arial" w:hAnsi="Arial" w:cs="Arial"/>
+          <w:lang w:val="es-CO"/>
+        </w:rPr>
+      </w:pPr>
+      <w:r>
+        <w:rPr>
+          <w:rFonts w:ascii="Arial" w:hAnsi="Arial" w:cs="Arial"/>
+          <w:lang w:val="es-CO"/>
+        </w:rPr>
+        <w:t>Los datos procesados se almacenarán en documentos .csv como datasets definitivos.</w:t>
       </w:r>
     </w:p>
     <w:p>
@@ -485,23 +396,7 @@
           <w:rFonts w:ascii="Arial" w:hAnsi="Arial" w:cs="Arial"/>
           <w:lang w:val="es-CO"/>
         </w:rPr>
-        <w:t xml:space="preserve">Se empieza por extraer solo la parte correspondiente a los datos del archivo </w:t>
-      </w:r>
-      <w:proofErr w:type="spellStart"/>
-      <w:r>
-        <w:rPr>
-          <w:rFonts w:ascii="Arial" w:hAnsi="Arial" w:cs="Arial"/>
-          <w:lang w:val="es-CO"/>
-        </w:rPr>
-        <w:t>excel</w:t>
-      </w:r>
-      <w:proofErr w:type="spellEnd"/>
-      <w:r>
-        <w:rPr>
-          <w:rFonts w:ascii="Arial" w:hAnsi="Arial" w:cs="Arial"/>
-          <w:lang w:val="es-CO"/>
-        </w:rPr>
-        <w:t>, para lo cual se ignoran las primeras 9 filas de la hoja</w:t>
+        <w:t>Se empieza por extraer solo la parte correspondiente a los datos del archivo excel, para lo cual se ignoran las primeras 9 filas de la hoja</w:t>
       </w:r>
     </w:p>
     <w:p>
@@ -581,47 +476,22 @@
           <w:rFonts w:ascii="Arial" w:hAnsi="Arial" w:cs="Arial"/>
           <w:lang w:val="es-CO"/>
         </w:rPr>
-        <w:t xml:space="preserve">Actualización de </w:t>
-      </w:r>
-      <w:proofErr w:type="spellStart"/>
-      <w:r>
-        <w:rPr>
-          <w:rFonts w:ascii="Arial" w:hAnsi="Arial" w:cs="Arial"/>
-          <w:lang w:val="es-CO"/>
-        </w:rPr>
-        <w:t>headers</w:t>
-      </w:r>
-      <w:proofErr w:type="spellEnd"/>
-    </w:p>
-    <w:p>
-      <w:pPr>
-        <w:rPr>
-          <w:rFonts w:ascii="Arial" w:hAnsi="Arial" w:cs="Arial"/>
-          <w:lang w:val="es-CO"/>
-        </w:rPr>
-      </w:pPr>
-      <w:r>
-        <w:rPr>
-          <w:rFonts w:ascii="Arial" w:hAnsi="Arial" w:cs="Arial"/>
-          <w:lang w:val="es-CO"/>
-        </w:rPr>
-        <w:t xml:space="preserve">Al extraer los datos desde el archivo .xlsx, se verifica el </w:t>
-      </w:r>
-      <w:proofErr w:type="spellStart"/>
-      <w:r>
-        <w:rPr>
-          <w:rFonts w:ascii="Arial" w:hAnsi="Arial" w:cs="Arial"/>
-          <w:lang w:val="es-CO"/>
-        </w:rPr>
-        <w:t>dataframe</w:t>
-      </w:r>
-      <w:proofErr w:type="spellEnd"/>
-      <w:r>
-        <w:rPr>
-          <w:rFonts w:ascii="Arial" w:hAnsi="Arial" w:cs="Arial"/>
-          <w:lang w:val="es-CO"/>
-        </w:rPr>
-        <w:t xml:space="preserve"> generado por Pandas, empezando por los nombres de las columnas y se observan las siguientes incidencias:</w:t>
+        <w:t>Actualización de headers</w:t>
+      </w:r>
+    </w:p>
+    <w:p>
+      <w:pPr>
+        <w:rPr>
+          <w:rFonts w:ascii="Arial" w:hAnsi="Arial" w:cs="Arial"/>
+          <w:lang w:val="es-CO"/>
+        </w:rPr>
+      </w:pPr>
+      <w:r>
+        <w:rPr>
+          <w:rFonts w:ascii="Arial" w:hAnsi="Arial" w:cs="Arial"/>
+          <w:lang w:val="es-CO"/>
+        </w:rPr>
+        <w:t>Al extraer los datos desde el archivo .xlsx, se verifica el dataframe generado por Pandas, empezando por los nombres de las columnas y se observan las siguientes incidencias:</w:t>
       </w:r>
     </w:p>
     <w:p>
@@ -636,53 +506,12 @@
           <w:lang w:val="es-CO"/>
         </w:rPr>
       </w:pPr>
-      <w:proofErr w:type="spellStart"/>
-      <w:r>
-        <w:rPr>
-          <w:rFonts w:ascii="Arial" w:hAnsi="Arial" w:cs="Arial"/>
-          <w:lang w:val="es-CO"/>
-        </w:rPr>
-        <w:t>Headers</w:t>
-      </w:r>
-      <w:proofErr w:type="spellEnd"/>
-      <w:r>
-        <w:rPr>
-          <w:rFonts w:ascii="Arial" w:hAnsi="Arial" w:cs="Arial"/>
-          <w:lang w:val="es-CO"/>
-        </w:rPr>
-        <w:t xml:space="preserve"> sin nombres descriptivos: </w:t>
-      </w:r>
-      <w:proofErr w:type="spellStart"/>
-      <w:r>
-        <w:rPr>
-          <w:rFonts w:ascii="Arial" w:hAnsi="Arial" w:cs="Arial"/>
-          <w:lang w:val="es-CO"/>
-        </w:rPr>
-        <w:t>headers</w:t>
-      </w:r>
-      <w:proofErr w:type="spellEnd"/>
-      <w:r>
-        <w:rPr>
-          <w:rFonts w:ascii="Arial" w:hAnsi="Arial" w:cs="Arial"/>
-          <w:lang w:val="es-CO"/>
-        </w:rPr>
-        <w:t xml:space="preserve"> con nombres por defecto de Pandas tipo ‘</w:t>
-      </w:r>
-      <w:proofErr w:type="spellStart"/>
-      <w:r>
-        <w:rPr>
-          <w:rFonts w:ascii="Arial" w:hAnsi="Arial" w:cs="Arial"/>
-          <w:lang w:val="es-CO"/>
-        </w:rPr>
-        <w:t>Unnamed</w:t>
-      </w:r>
-      <w:proofErr w:type="spellEnd"/>
-      <w:r>
-        <w:rPr>
-          <w:rFonts w:ascii="Arial" w:hAnsi="Arial" w:cs="Arial"/>
-          <w:lang w:val="es-CO"/>
-        </w:rPr>
-        <w:t>: X’.</w:t>
+      <w:r>
+        <w:rPr>
+          <w:rFonts w:ascii="Arial" w:hAnsi="Arial" w:cs="Arial"/>
+          <w:lang w:val="es-CO"/>
+        </w:rPr>
+        <w:t>Headers sin nombres descriptivos: headers con nombres por defecto de Pandas tipo ‘Unnamed: X’.</w:t>
       </w:r>
     </w:p>
     <w:p>
@@ -697,21 +526,12 @@
           <w:lang w:val="es-CO"/>
         </w:rPr>
       </w:pPr>
-      <w:proofErr w:type="spellStart"/>
-      <w:r>
-        <w:rPr>
-          <w:rFonts w:ascii="Arial" w:hAnsi="Arial" w:cs="Arial"/>
-          <w:lang w:val="es-CO"/>
-        </w:rPr>
-        <w:t>Headers</w:t>
-      </w:r>
-      <w:proofErr w:type="spellEnd"/>
-      <w:r>
-        <w:rPr>
-          <w:rFonts w:ascii="Arial" w:hAnsi="Arial" w:cs="Arial"/>
-          <w:lang w:val="es-CO"/>
-        </w:rPr>
-        <w:t xml:space="preserve"> en jerarquías inferiores debido a la agrupación de datos: ‘Hombre’ y ‘Mujer’ se encuentran en la primera fila de datos debido al diseño del .xlsx donde se busca describir la agrupación por Sexo de los datos.</w:t>
+      <w:r>
+        <w:rPr>
+          <w:rFonts w:ascii="Arial" w:hAnsi="Arial" w:cs="Arial"/>
+          <w:lang w:val="es-CO"/>
+        </w:rPr>
+        <w:t>Headers en jerarquías inferiores debido a la agrupación de datos: ‘Hombre’ y ‘Mujer’ se encuentran en la primera fila de datos debido al diseño del .xlsx donde se busca describir la agrupación por Sexo de los datos.</w:t>
       </w:r>
     </w:p>
     <w:p>
@@ -731,39 +551,7 @@
           <w:rFonts w:ascii="Arial" w:hAnsi="Arial" w:cs="Arial"/>
           <w:lang w:val="es-CO"/>
         </w:rPr>
-        <w:t xml:space="preserve">Tildes: Se tienen </w:t>
-      </w:r>
-      <w:proofErr w:type="spellStart"/>
-      <w:r>
-        <w:rPr>
-          <w:rFonts w:ascii="Arial" w:hAnsi="Arial" w:cs="Arial"/>
-          <w:lang w:val="es-CO"/>
-        </w:rPr>
-        <w:t>headers</w:t>
-      </w:r>
-      <w:proofErr w:type="spellEnd"/>
-      <w:r>
-        <w:rPr>
-          <w:rFonts w:ascii="Arial" w:hAnsi="Arial" w:cs="Arial"/>
-          <w:lang w:val="es-CO"/>
-        </w:rPr>
-        <w:t xml:space="preserve"> con tildes como ‘Índice de masculinidad’ e ‘Índice de feminidad’, las tildes es mejor evitarlas para evitar errores de </w:t>
-      </w:r>
-      <w:proofErr w:type="spellStart"/>
-      <w:r>
-        <w:rPr>
-          <w:rFonts w:ascii="Arial" w:hAnsi="Arial" w:cs="Arial"/>
-          <w:lang w:val="es-CO"/>
-        </w:rPr>
-        <w:t>charset</w:t>
-      </w:r>
-      <w:proofErr w:type="spellEnd"/>
-      <w:r>
-        <w:rPr>
-          <w:rFonts w:ascii="Arial" w:hAnsi="Arial" w:cs="Arial"/>
-          <w:lang w:val="es-CO"/>
-        </w:rPr>
-        <w:t xml:space="preserve"> de las herramientas utilizadas.</w:t>
+        <w:t>Tildes: Se tienen headers con tildes como ‘Índice de masculinidad’ e ‘Índice de feminidad’, las tildes es mejor evitarlas para evitar errores de charset de las herramientas utilizadas.</w:t>
       </w:r>
     </w:p>
     <w:p>
@@ -857,32 +645,14 @@
           <w:lang w:val="es-CO"/>
         </w:rPr>
       </w:pPr>
-      <w:proofErr w:type="spellStart"/>
       <w:r>
         <w:rPr>
           <w:rFonts w:ascii="Arial" w:hAnsi="Arial" w:cs="Arial"/>
           <w:lang w:val="es-CO"/>
         </w:rPr>
         <w:lastRenderedPageBreak/>
-        <w:t>Unnamed</w:t>
-      </w:r>
-      <w:proofErr w:type="spellEnd"/>
-      <w:r>
-        <w:rPr>
-          <w:rFonts w:ascii="Arial" w:hAnsi="Arial" w:cs="Arial"/>
-          <w:lang w:val="es-CO"/>
-        </w:rPr>
-        <w:t xml:space="preserve">: 2: </w:t>
-      </w:r>
-      <w:proofErr w:type="spellStart"/>
-      <w:r>
-        <w:rPr>
-          <w:rFonts w:ascii="Arial" w:hAnsi="Arial" w:cs="Arial"/>
-          <w:lang w:val="es-CO"/>
-        </w:rPr>
-        <w:t>Area</w:t>
-      </w:r>
-      <w:proofErr w:type="spellEnd"/>
+        <w:t>Unnamed: 2: Area</w:t>
+      </w:r>
     </w:p>
     <w:p>
       <w:pPr>
@@ -896,21 +666,12 @@
           <w:lang w:val="es-CO"/>
         </w:rPr>
       </w:pPr>
-      <w:proofErr w:type="spellStart"/>
-      <w:r>
-        <w:rPr>
-          <w:rFonts w:ascii="Arial" w:hAnsi="Arial" w:cs="Arial"/>
-          <w:lang w:val="es-CO"/>
-        </w:rPr>
-        <w:t>Unnamed</w:t>
-      </w:r>
-      <w:proofErr w:type="spellEnd"/>
-      <w:r>
-        <w:rPr>
-          <w:rFonts w:ascii="Arial" w:hAnsi="Arial" w:cs="Arial"/>
-          <w:lang w:val="es-CO"/>
-        </w:rPr>
-        <w:t>: 3: Grupo de edad</w:t>
+      <w:r>
+        <w:rPr>
+          <w:rFonts w:ascii="Arial" w:hAnsi="Arial" w:cs="Arial"/>
+          <w:lang w:val="es-CO"/>
+        </w:rPr>
+        <w:t>Unnamed: 3: Grupo de edad</w:t>
       </w:r>
     </w:p>
     <w:p>
@@ -945,21 +706,12 @@
           <w:lang w:val="es-CO"/>
         </w:rPr>
       </w:pPr>
-      <w:proofErr w:type="spellStart"/>
-      <w:r>
-        <w:rPr>
-          <w:rFonts w:ascii="Arial" w:hAnsi="Arial" w:cs="Arial"/>
-          <w:lang w:val="es-CO"/>
-        </w:rPr>
-        <w:t>Unnamed</w:t>
-      </w:r>
-      <w:proofErr w:type="spellEnd"/>
-      <w:r>
-        <w:rPr>
-          <w:rFonts w:ascii="Arial" w:hAnsi="Arial" w:cs="Arial"/>
-          <w:lang w:val="es-CO"/>
-        </w:rPr>
-        <w:t xml:space="preserve"> 6: Mujer</w:t>
+      <w:r>
+        <w:rPr>
+          <w:rFonts w:ascii="Arial" w:hAnsi="Arial" w:cs="Arial"/>
+          <w:lang w:val="es-CO"/>
+        </w:rPr>
+        <w:t>Unnamed 6: Mujer</w:t>
       </w:r>
     </w:p>
     <w:p>
@@ -979,23 +731,7 @@
           <w:rFonts w:ascii="Arial" w:hAnsi="Arial" w:cs="Arial"/>
           <w:lang w:val="es-CO"/>
         </w:rPr>
-        <w:t xml:space="preserve">Índice de masculinidad: </w:t>
-      </w:r>
-      <w:proofErr w:type="spellStart"/>
-      <w:r>
-        <w:rPr>
-          <w:rFonts w:ascii="Arial" w:hAnsi="Arial" w:cs="Arial"/>
-          <w:lang w:val="es-CO"/>
-        </w:rPr>
-        <w:t>Indice</w:t>
-      </w:r>
-      <w:proofErr w:type="spellEnd"/>
-      <w:r>
-        <w:rPr>
-          <w:rFonts w:ascii="Arial" w:hAnsi="Arial" w:cs="Arial"/>
-          <w:lang w:val="es-CO"/>
-        </w:rPr>
-        <w:t xml:space="preserve"> de masculinidad</w:t>
+        <w:t>Índice de masculinidad: Indice de masculinidad</w:t>
       </w:r>
     </w:p>
     <w:p>
@@ -1015,23 +751,7 @@
           <w:rFonts w:ascii="Arial" w:hAnsi="Arial" w:cs="Arial"/>
           <w:lang w:val="es-CO"/>
         </w:rPr>
-        <w:t xml:space="preserve">Índice de feminidad: </w:t>
-      </w:r>
-      <w:proofErr w:type="spellStart"/>
-      <w:r>
-        <w:rPr>
-          <w:rFonts w:ascii="Arial" w:hAnsi="Arial" w:cs="Arial"/>
-          <w:lang w:val="es-CO"/>
-        </w:rPr>
-        <w:t>Indice</w:t>
-      </w:r>
-      <w:proofErr w:type="spellEnd"/>
-      <w:r>
-        <w:rPr>
-          <w:rFonts w:ascii="Arial" w:hAnsi="Arial" w:cs="Arial"/>
-          <w:lang w:val="es-CO"/>
-        </w:rPr>
-        <w:t xml:space="preserve"> de feminidad</w:t>
+        <w:t>Índice de feminidad: Indice de feminidad</w:t>
       </w:r>
     </w:p>
     <w:p>
@@ -1132,23 +852,7 @@
           <w:rFonts w:ascii="Arial" w:hAnsi="Arial" w:cs="Arial"/>
           <w:lang w:val="es-CO"/>
         </w:rPr>
-        <w:t xml:space="preserve">Se evidencian dos columnas sin datos o con datos irrelevantes para el </w:t>
-      </w:r>
-      <w:proofErr w:type="spellStart"/>
-      <w:r>
-        <w:rPr>
-          <w:rFonts w:ascii="Arial" w:hAnsi="Arial" w:cs="Arial"/>
-          <w:lang w:val="es-CO"/>
-        </w:rPr>
-        <w:t>dataset</w:t>
-      </w:r>
-      <w:proofErr w:type="spellEnd"/>
-      <w:r>
-        <w:rPr>
-          <w:rFonts w:ascii="Arial" w:hAnsi="Arial" w:cs="Arial"/>
-          <w:lang w:val="es-CO"/>
-        </w:rPr>
-        <w:t xml:space="preserve"> que pueden ser eliminadas:</w:t>
+        <w:t>Se evidencian dos columnas sin datos o con datos irrelevantes para el dataset que pueden ser eliminadas:</w:t>
       </w:r>
     </w:p>
     <w:p>
@@ -1190,21 +894,12 @@
           <w:lang w:val="es-CO"/>
         </w:rPr>
       </w:pPr>
-      <w:proofErr w:type="spellStart"/>
-      <w:r>
-        <w:rPr>
-          <w:rFonts w:ascii="Arial" w:hAnsi="Arial" w:cs="Arial"/>
-          <w:lang w:val="es-CO"/>
-        </w:rPr>
-        <w:t>Unnamed</w:t>
-      </w:r>
-      <w:proofErr w:type="spellEnd"/>
-      <w:r>
-        <w:rPr>
-          <w:rFonts w:ascii="Arial" w:hAnsi="Arial" w:cs="Arial"/>
-          <w:lang w:val="es-CO"/>
-        </w:rPr>
-        <w:t>: 1: Contiene el municipio, para este caso particular es irrelevante porque solo se tratarán datos del municipio de Viterbo, Caldas, pero se tendrá en cuenta para un futuro proyecto que involucre múltiples municipios al mismo tiempo.</w:t>
+      <w:r>
+        <w:rPr>
+          <w:rFonts w:ascii="Arial" w:hAnsi="Arial" w:cs="Arial"/>
+          <w:lang w:val="es-CO"/>
+        </w:rPr>
+        <w:t>Unnamed: 1: Contiene el municipio, para este caso particular es irrelevante porque solo se tratarán datos del municipio de Viterbo, Caldas, pero se tendrá en cuenta para un futuro proyecto que involucre múltiples municipios al mismo tiempo.</w:t>
       </w:r>
     </w:p>
     <w:p>
@@ -1338,95 +1033,22 @@
           <w:rFonts w:ascii="Arial" w:hAnsi="Arial" w:cs="Arial"/>
           <w:lang w:val="es-CO"/>
         </w:rPr>
-        <w:t xml:space="preserve">Tratamiento de valores Nulos, en blanco o </w:t>
-      </w:r>
-      <w:proofErr w:type="spellStart"/>
-      <w:r>
-        <w:rPr>
-          <w:rFonts w:ascii="Arial" w:hAnsi="Arial" w:cs="Arial"/>
-          <w:lang w:val="es-CO"/>
-        </w:rPr>
-        <w:t>NaN</w:t>
-      </w:r>
-      <w:proofErr w:type="spellEnd"/>
-    </w:p>
-    <w:p>
-      <w:pPr>
-        <w:rPr>
-          <w:rFonts w:ascii="Arial" w:hAnsi="Arial" w:cs="Arial"/>
-          <w:lang w:val="es-CO"/>
-        </w:rPr>
-      </w:pPr>
-      <w:r>
-        <w:rPr>
-          <w:rFonts w:ascii="Arial" w:hAnsi="Arial" w:cs="Arial"/>
-          <w:lang w:val="es-CO"/>
-        </w:rPr>
-        <w:t xml:space="preserve">La única columna con valores </w:t>
-      </w:r>
-      <w:proofErr w:type="spellStart"/>
-      <w:r>
-        <w:rPr>
-          <w:rFonts w:ascii="Arial" w:hAnsi="Arial" w:cs="Arial"/>
-          <w:lang w:val="es-CO"/>
-        </w:rPr>
-        <w:t>NaN</w:t>
-      </w:r>
-      <w:proofErr w:type="spellEnd"/>
-      <w:r>
-        <w:rPr>
-          <w:rFonts w:ascii="Arial" w:hAnsi="Arial" w:cs="Arial"/>
-          <w:lang w:val="es-CO"/>
-        </w:rPr>
-        <w:t xml:space="preserve"> es la columna ‘</w:t>
-      </w:r>
-      <w:proofErr w:type="spellStart"/>
-      <w:r>
-        <w:rPr>
-          <w:rFonts w:ascii="Arial" w:hAnsi="Arial" w:cs="Arial"/>
-          <w:lang w:val="es-CO"/>
-        </w:rPr>
-        <w:t>Area</w:t>
-      </w:r>
-      <w:proofErr w:type="spellEnd"/>
-      <w:r>
-        <w:rPr>
-          <w:rFonts w:ascii="Arial" w:hAnsi="Arial" w:cs="Arial"/>
-          <w:lang w:val="es-CO"/>
-        </w:rPr>
-        <w:t xml:space="preserve">’, la cual indica el área de recolección de datos en el municipio, Totales, cabecera municipal, centros poblados, zonas rurales dispersas, la presencia de valores </w:t>
-      </w:r>
-      <w:proofErr w:type="spellStart"/>
-      <w:r>
-        <w:rPr>
-          <w:rFonts w:ascii="Arial" w:hAnsi="Arial" w:cs="Arial"/>
-          <w:lang w:val="es-CO"/>
-        </w:rPr>
-        <w:t>NaN</w:t>
-      </w:r>
-      <w:proofErr w:type="spellEnd"/>
-      <w:r>
-        <w:rPr>
-          <w:rFonts w:ascii="Arial" w:hAnsi="Arial" w:cs="Arial"/>
-          <w:lang w:val="es-CO"/>
-        </w:rPr>
-        <w:t xml:space="preserve"> se debe a la agrupación realizada en el diseño del .xlsx, el enfoque para resolver esta inconsistencia será propagar el primer valor válido hasta el siguiente valor válido y repetir hasta reemplazar todos los valores </w:t>
-      </w:r>
-      <w:proofErr w:type="spellStart"/>
-      <w:r>
-        <w:rPr>
-          <w:rFonts w:ascii="Arial" w:hAnsi="Arial" w:cs="Arial"/>
-          <w:lang w:val="es-CO"/>
-        </w:rPr>
-        <w:t>NaN</w:t>
-      </w:r>
-      <w:proofErr w:type="spellEnd"/>
-      <w:r>
-        <w:rPr>
-          <w:rFonts w:ascii="Arial" w:hAnsi="Arial" w:cs="Arial"/>
-          <w:lang w:val="es-CO"/>
-        </w:rPr>
-        <w:t>.</w:t>
+        <w:t>Tratamiento de valores Nulos, en blanco o NaN</w:t>
+      </w:r>
+    </w:p>
+    <w:p>
+      <w:pPr>
+        <w:rPr>
+          <w:rFonts w:ascii="Arial" w:hAnsi="Arial" w:cs="Arial"/>
+          <w:lang w:val="es-CO"/>
+        </w:rPr>
+      </w:pPr>
+      <w:r>
+        <w:rPr>
+          <w:rFonts w:ascii="Arial" w:hAnsi="Arial" w:cs="Arial"/>
+          <w:lang w:val="es-CO"/>
+        </w:rPr>
+        <w:t>La única columna con valores NaN es la columna ‘Area’, la cual indica el área de recolección de datos en el municipio, Totales, cabecera municipal, centros poblados, zonas rurales dispersas, la presencia de valores NaN se debe a la agrupación realizada en el diseño del .xlsx, el enfoque para resolver esta inconsistencia será propagar el primer valor válido hasta el siguiente valor válido y repetir hasta reemplazar todos los valores NaN.</w:t>
       </w:r>
     </w:p>
     <w:p>
@@ -1748,23 +1370,7 @@
           <w:rFonts w:ascii="Arial" w:hAnsi="Arial" w:cs="Arial"/>
           <w:lang w:val="es-CO"/>
         </w:rPr>
-        <w:t xml:space="preserve">Se empieza por extraer solo la parte correspondiente a los datos del archivo </w:t>
-      </w:r>
-      <w:proofErr w:type="spellStart"/>
-      <w:r>
-        <w:rPr>
-          <w:rFonts w:ascii="Arial" w:hAnsi="Arial" w:cs="Arial"/>
-          <w:lang w:val="es-CO"/>
-        </w:rPr>
-        <w:t>excel</w:t>
-      </w:r>
-      <w:proofErr w:type="spellEnd"/>
-      <w:r>
-        <w:rPr>
-          <w:rFonts w:ascii="Arial" w:hAnsi="Arial" w:cs="Arial"/>
-          <w:lang w:val="es-CO"/>
-        </w:rPr>
-        <w:t>, para lo cual se ignoran las primeras 9 filas de la hoja</w:t>
+        <w:t>Se empieza por extraer solo la parte correspondiente a los datos del archivo excel, para lo cual se ignoran las primeras 9 filas de la hoja</w:t>
       </w:r>
     </w:p>
     <w:p>
@@ -2023,47 +1629,22 @@
           <w:rFonts w:ascii="Arial" w:hAnsi="Arial" w:cs="Arial"/>
           <w:lang w:val="es-CO"/>
         </w:rPr>
-        <w:t xml:space="preserve">Actualización de </w:t>
-      </w:r>
-      <w:proofErr w:type="spellStart"/>
-      <w:r>
-        <w:rPr>
-          <w:rFonts w:ascii="Arial" w:hAnsi="Arial" w:cs="Arial"/>
-          <w:lang w:val="es-CO"/>
-        </w:rPr>
-        <w:t>headers</w:t>
-      </w:r>
-      <w:proofErr w:type="spellEnd"/>
-    </w:p>
-    <w:p>
-      <w:pPr>
-        <w:rPr>
-          <w:rFonts w:ascii="Arial" w:hAnsi="Arial" w:cs="Arial"/>
-          <w:lang w:val="es-CO"/>
-        </w:rPr>
-      </w:pPr>
-      <w:r>
-        <w:rPr>
-          <w:rFonts w:ascii="Arial" w:hAnsi="Arial" w:cs="Arial"/>
-          <w:lang w:val="es-CO"/>
-        </w:rPr>
-        <w:t xml:space="preserve">Al extraer los datos desde el archivo .xlsx, se verifica el </w:t>
-      </w:r>
-      <w:proofErr w:type="spellStart"/>
-      <w:r>
-        <w:rPr>
-          <w:rFonts w:ascii="Arial" w:hAnsi="Arial" w:cs="Arial"/>
-          <w:lang w:val="es-CO"/>
-        </w:rPr>
-        <w:t>dataframe</w:t>
-      </w:r>
-      <w:proofErr w:type="spellEnd"/>
-      <w:r>
-        <w:rPr>
-          <w:rFonts w:ascii="Arial" w:hAnsi="Arial" w:cs="Arial"/>
-          <w:lang w:val="es-CO"/>
-        </w:rPr>
-        <w:t xml:space="preserve"> generado por Pandas, empezando por los nombres de las columnas y se observan las siguientes incidencias:</w:t>
+        <w:t>Actualización de headers</w:t>
+      </w:r>
+    </w:p>
+    <w:p>
+      <w:pPr>
+        <w:rPr>
+          <w:rFonts w:ascii="Arial" w:hAnsi="Arial" w:cs="Arial"/>
+          <w:lang w:val="es-CO"/>
+        </w:rPr>
+      </w:pPr>
+      <w:r>
+        <w:rPr>
+          <w:rFonts w:ascii="Arial" w:hAnsi="Arial" w:cs="Arial"/>
+          <w:lang w:val="es-CO"/>
+        </w:rPr>
+        <w:t>Al extraer los datos desde el archivo .xlsx, se verifica el dataframe generado por Pandas, empezando por los nombres de las columnas y se observan las siguientes incidencias:</w:t>
       </w:r>
     </w:p>
     <w:p>
@@ -2078,53 +1659,12 @@
           <w:lang w:val="es-CO"/>
         </w:rPr>
       </w:pPr>
-      <w:proofErr w:type="spellStart"/>
-      <w:r>
-        <w:rPr>
-          <w:rFonts w:ascii="Arial" w:hAnsi="Arial" w:cs="Arial"/>
-          <w:lang w:val="es-CO"/>
-        </w:rPr>
-        <w:t>Headers</w:t>
-      </w:r>
-      <w:proofErr w:type="spellEnd"/>
-      <w:r>
-        <w:rPr>
-          <w:rFonts w:ascii="Arial" w:hAnsi="Arial" w:cs="Arial"/>
-          <w:lang w:val="es-CO"/>
-        </w:rPr>
-        <w:t xml:space="preserve"> sin nombres descriptivos: </w:t>
-      </w:r>
-      <w:proofErr w:type="spellStart"/>
-      <w:r>
-        <w:rPr>
-          <w:rFonts w:ascii="Arial" w:hAnsi="Arial" w:cs="Arial"/>
-          <w:lang w:val="es-CO"/>
-        </w:rPr>
-        <w:t>headers</w:t>
-      </w:r>
-      <w:proofErr w:type="spellEnd"/>
-      <w:r>
-        <w:rPr>
-          <w:rFonts w:ascii="Arial" w:hAnsi="Arial" w:cs="Arial"/>
-          <w:lang w:val="es-CO"/>
-        </w:rPr>
-        <w:t xml:space="preserve"> con nombres por defecto de Pandas tipo ‘</w:t>
-      </w:r>
-      <w:proofErr w:type="spellStart"/>
-      <w:r>
-        <w:rPr>
-          <w:rFonts w:ascii="Arial" w:hAnsi="Arial" w:cs="Arial"/>
-          <w:lang w:val="es-CO"/>
-        </w:rPr>
-        <w:t>Unnamed</w:t>
-      </w:r>
-      <w:proofErr w:type="spellEnd"/>
-      <w:r>
-        <w:rPr>
-          <w:rFonts w:ascii="Arial" w:hAnsi="Arial" w:cs="Arial"/>
-          <w:lang w:val="es-CO"/>
-        </w:rPr>
-        <w:t>: X’.</w:t>
+      <w:r>
+        <w:rPr>
+          <w:rFonts w:ascii="Arial" w:hAnsi="Arial" w:cs="Arial"/>
+          <w:lang w:val="es-CO"/>
+        </w:rPr>
+        <w:t>Headers sin nombres descriptivos: headers con nombres por defecto de Pandas tipo ‘Unnamed: X’.</w:t>
       </w:r>
     </w:p>
     <w:p>
@@ -2139,68 +1679,27 @@
           <w:lang w:val="es-CO"/>
         </w:rPr>
       </w:pPr>
-      <w:proofErr w:type="spellStart"/>
-      <w:r>
-        <w:rPr>
-          <w:rFonts w:ascii="Arial" w:hAnsi="Arial" w:cs="Arial"/>
-          <w:lang w:val="es-CO"/>
-        </w:rPr>
-        <w:t>Headers</w:t>
-      </w:r>
-      <w:proofErr w:type="spellEnd"/>
-      <w:r>
-        <w:rPr>
-          <w:rFonts w:ascii="Arial" w:hAnsi="Arial" w:cs="Arial"/>
-          <w:lang w:val="es-CO"/>
-        </w:rPr>
-        <w:t xml:space="preserve"> en jerarquías inferiores debido a la agrupación de datos: ‘Hombre’ y ‘Mujer’ se encuentran en la primera fila de datos debido al diseño del .xlsx donde se busca describir la agrupación por Sexo de los datos.</w:t>
-      </w:r>
-    </w:p>
-    <w:p>
-      <w:pPr>
-        <w:rPr>
-          <w:rFonts w:ascii="Arial" w:hAnsi="Arial" w:cs="Arial"/>
-          <w:lang w:val="es-CO"/>
-        </w:rPr>
-      </w:pPr>
-      <w:r>
-        <w:rPr>
-          <w:rFonts w:ascii="Arial" w:hAnsi="Arial" w:cs="Arial"/>
-          <w:lang w:val="es-CO"/>
-        </w:rPr>
-        <w:t xml:space="preserve">Debido a la agrupación de datos en las columnas, se divide el </w:t>
-      </w:r>
-      <w:proofErr w:type="spellStart"/>
-      <w:r>
-        <w:rPr>
-          <w:rFonts w:ascii="Arial" w:hAnsi="Arial" w:cs="Arial"/>
-          <w:lang w:val="es-CO"/>
-        </w:rPr>
-        <w:t>dataframe</w:t>
-      </w:r>
-      <w:proofErr w:type="spellEnd"/>
-      <w:r>
-        <w:rPr>
-          <w:rFonts w:ascii="Arial" w:hAnsi="Arial" w:cs="Arial"/>
-          <w:lang w:val="es-CO"/>
-        </w:rPr>
-        <w:t xml:space="preserve"> en 3 partes, correspondientes a las áreas, ignorando el total para remover resúmenes de datos en el </w:t>
-      </w:r>
-      <w:proofErr w:type="spellStart"/>
-      <w:r>
-        <w:rPr>
-          <w:rFonts w:ascii="Arial" w:hAnsi="Arial" w:cs="Arial"/>
-          <w:lang w:val="es-CO"/>
-        </w:rPr>
-        <w:t>dataset</w:t>
-      </w:r>
-      <w:proofErr w:type="spellEnd"/>
-      <w:r>
-        <w:rPr>
-          <w:rFonts w:ascii="Arial" w:hAnsi="Arial" w:cs="Arial"/>
-          <w:lang w:val="es-CO"/>
-        </w:rPr>
-        <w:t xml:space="preserve"> final. Luego de dividirlos, se reemplazan los nombres de las columnas de la siguiente manera:</w:t>
+      <w:r>
+        <w:rPr>
+          <w:rFonts w:ascii="Arial" w:hAnsi="Arial" w:cs="Arial"/>
+          <w:lang w:val="es-CO"/>
+        </w:rPr>
+        <w:t>Headers en jerarquías inferiores debido a la agrupación de datos: ‘Hombre’ y ‘Mujer’ se encuentran en la primera fila de datos debido al diseño del .xlsx donde se busca describir la agrupación por Sexo de los datos.</w:t>
+      </w:r>
+    </w:p>
+    <w:p>
+      <w:pPr>
+        <w:rPr>
+          <w:rFonts w:ascii="Arial" w:hAnsi="Arial" w:cs="Arial"/>
+          <w:lang w:val="es-CO"/>
+        </w:rPr>
+      </w:pPr>
+      <w:r>
+        <w:rPr>
+          <w:rFonts w:ascii="Arial" w:hAnsi="Arial" w:cs="Arial"/>
+          <w:lang w:val="es-CO"/>
+        </w:rPr>
+        <w:t>Debido a la agrupación de datos en las columnas, se divide el dataframe en 3 partes, correspondientes a las áreas, ignorando el total para remover resúmenes de datos en el dataset final. Luego de dividirlos, se reemplazan los nombres de las columnas de la siguiente manera:</w:t>
       </w:r>
     </w:p>
     <w:p>
@@ -2215,21 +1714,12 @@
           <w:lang w:val="es-CO"/>
         </w:rPr>
       </w:pPr>
-      <w:proofErr w:type="spellStart"/>
-      <w:r>
-        <w:rPr>
-          <w:rFonts w:ascii="Arial" w:hAnsi="Arial" w:cs="Arial"/>
-          <w:lang w:val="es-CO"/>
-        </w:rPr>
-        <w:t>Unnamed</w:t>
-      </w:r>
-      <w:proofErr w:type="spellEnd"/>
-      <w:r>
-        <w:rPr>
-          <w:rFonts w:ascii="Arial" w:hAnsi="Arial" w:cs="Arial"/>
-          <w:lang w:val="es-CO"/>
-        </w:rPr>
-        <w:t>: 3: Edad</w:t>
+      <w:r>
+        <w:rPr>
+          <w:rFonts w:ascii="Arial" w:hAnsi="Arial" w:cs="Arial"/>
+          <w:lang w:val="es-CO"/>
+        </w:rPr>
+        <w:t>Unnamed: 3: Edad</w:t>
       </w:r>
     </w:p>
     <w:p>
@@ -2244,21 +1734,12 @@
           <w:lang w:val="es-CO"/>
         </w:rPr>
       </w:pPr>
-      <w:proofErr w:type="spellStart"/>
-      <w:r>
-        <w:rPr>
-          <w:rFonts w:ascii="Arial" w:hAnsi="Arial" w:cs="Arial"/>
-          <w:lang w:val="es-CO"/>
-        </w:rPr>
-        <w:t>Unnamed</w:t>
-      </w:r>
-      <w:proofErr w:type="spellEnd"/>
-      <w:r>
-        <w:rPr>
-          <w:rFonts w:ascii="Arial" w:hAnsi="Arial" w:cs="Arial"/>
-          <w:lang w:val="es-CO"/>
-        </w:rPr>
-        <w:t>: 8: Hombre</w:t>
+      <w:r>
+        <w:rPr>
+          <w:rFonts w:ascii="Arial" w:hAnsi="Arial" w:cs="Arial"/>
+          <w:lang w:val="es-CO"/>
+        </w:rPr>
+        <w:t>Unnamed: 8: Hombre</w:t>
       </w:r>
     </w:p>
     <w:p>
@@ -2273,21 +1754,12 @@
           <w:lang w:val="es-CO"/>
         </w:rPr>
       </w:pPr>
-      <w:proofErr w:type="spellStart"/>
-      <w:r>
-        <w:rPr>
-          <w:rFonts w:ascii="Arial" w:hAnsi="Arial" w:cs="Arial"/>
-          <w:lang w:val="es-CO"/>
-        </w:rPr>
-        <w:t>Unnamed</w:t>
-      </w:r>
-      <w:proofErr w:type="spellEnd"/>
-      <w:r>
-        <w:rPr>
-          <w:rFonts w:ascii="Arial" w:hAnsi="Arial" w:cs="Arial"/>
-          <w:lang w:val="es-CO"/>
-        </w:rPr>
-        <w:t>: 9: Mujer</w:t>
+      <w:r>
+        <w:rPr>
+          <w:rFonts w:ascii="Arial" w:hAnsi="Arial" w:cs="Arial"/>
+          <w:lang w:val="es-CO"/>
+        </w:rPr>
+        <w:t>Unnamed: 9: Mujer</w:t>
       </w:r>
     </w:p>
     <w:p>
@@ -2302,22 +1774,13 @@
           <w:lang w:val="es-CO"/>
         </w:rPr>
       </w:pPr>
-      <w:proofErr w:type="spellStart"/>
       <w:r>
         <w:rPr>
           <w:rFonts w:ascii="Arial" w:hAnsi="Arial" w:cs="Arial"/>
           <w:lang w:val="es-CO"/>
         </w:rPr>
         <w:lastRenderedPageBreak/>
-        <w:t>Unnamed</w:t>
-      </w:r>
-      <w:proofErr w:type="spellEnd"/>
-      <w:r>
-        <w:rPr>
-          <w:rFonts w:ascii="Arial" w:hAnsi="Arial" w:cs="Arial"/>
-          <w:lang w:val="es-CO"/>
-        </w:rPr>
-        <w:t>: 11: Hombre</w:t>
+        <w:t>Unnamed: 11: Hombre</w:t>
       </w:r>
     </w:p>
     <w:p>
@@ -2332,21 +1795,12 @@
           <w:lang w:val="es-CO"/>
         </w:rPr>
       </w:pPr>
-      <w:proofErr w:type="spellStart"/>
-      <w:r>
-        <w:rPr>
-          <w:rFonts w:ascii="Arial" w:hAnsi="Arial" w:cs="Arial"/>
-          <w:lang w:val="es-CO"/>
-        </w:rPr>
-        <w:t>Unnamed</w:t>
-      </w:r>
-      <w:proofErr w:type="spellEnd"/>
-      <w:r>
-        <w:rPr>
-          <w:rFonts w:ascii="Arial" w:hAnsi="Arial" w:cs="Arial"/>
-          <w:lang w:val="es-CO"/>
-        </w:rPr>
-        <w:t>: 12: Mujer</w:t>
+      <w:r>
+        <w:rPr>
+          <w:rFonts w:ascii="Arial" w:hAnsi="Arial" w:cs="Arial"/>
+          <w:lang w:val="es-CO"/>
+        </w:rPr>
+        <w:t>Unnamed: 12: Mujer</w:t>
       </w:r>
     </w:p>
     <w:p>
@@ -2361,21 +1815,12 @@
           <w:lang w:val="es-CO"/>
         </w:rPr>
       </w:pPr>
-      <w:proofErr w:type="spellStart"/>
-      <w:r>
-        <w:rPr>
-          <w:rFonts w:ascii="Arial" w:hAnsi="Arial" w:cs="Arial"/>
-          <w:lang w:val="es-CO"/>
-        </w:rPr>
-        <w:t>Unnamed</w:t>
-      </w:r>
-      <w:proofErr w:type="spellEnd"/>
-      <w:r>
-        <w:rPr>
-          <w:rFonts w:ascii="Arial" w:hAnsi="Arial" w:cs="Arial"/>
-          <w:lang w:val="es-CO"/>
-        </w:rPr>
-        <w:t>: 14: Hombre</w:t>
+      <w:r>
+        <w:rPr>
+          <w:rFonts w:ascii="Arial" w:hAnsi="Arial" w:cs="Arial"/>
+          <w:lang w:val="es-CO"/>
+        </w:rPr>
+        <w:t>Unnamed: 14: Hombre</w:t>
       </w:r>
     </w:p>
     <w:p>
@@ -2390,62 +1835,28 @@
           <w:lang w:val="es-CO"/>
         </w:rPr>
       </w:pPr>
-      <w:proofErr w:type="spellStart"/>
-      <w:r>
-        <w:rPr>
-          <w:rFonts w:ascii="Arial" w:hAnsi="Arial" w:cs="Arial"/>
-          <w:lang w:val="es-CO"/>
-        </w:rPr>
-        <w:t>Unnamed</w:t>
-      </w:r>
-      <w:proofErr w:type="spellEnd"/>
-      <w:r>
-        <w:rPr>
-          <w:rFonts w:ascii="Arial" w:hAnsi="Arial" w:cs="Arial"/>
-          <w:lang w:val="es-CO"/>
-        </w:rPr>
-        <w:t>: 15: Mujer</w:t>
-      </w:r>
-    </w:p>
-    <w:p>
-      <w:pPr>
-        <w:rPr>
-          <w:rFonts w:ascii="Arial" w:hAnsi="Arial" w:cs="Arial"/>
-          <w:lang w:val="es-CO"/>
-        </w:rPr>
-      </w:pPr>
-      <w:r>
-        <w:rPr>
-          <w:rFonts w:ascii="Arial" w:hAnsi="Arial" w:cs="Arial"/>
-          <w:lang w:val="es-CO"/>
-        </w:rPr>
-        <w:t>Para identificar el área, se crea una nueva columna ‘</w:t>
-      </w:r>
-      <w:proofErr w:type="spellStart"/>
-      <w:r>
-        <w:rPr>
-          <w:rFonts w:ascii="Arial" w:hAnsi="Arial" w:cs="Arial"/>
-          <w:lang w:val="es-CO"/>
-        </w:rPr>
-        <w:t>Area</w:t>
-      </w:r>
-      <w:proofErr w:type="spellEnd"/>
-      <w:r>
-        <w:rPr>
-          <w:rFonts w:ascii="Arial" w:hAnsi="Arial" w:cs="Arial"/>
-          <w:lang w:val="es-CO"/>
-        </w:rPr>
-        <w:t xml:space="preserve">’ indicando el área de análisis (cabecera, centro poblado, rural disperso), en cada subconjunto, y se unen los subconjuntos como un solo </w:t>
-      </w:r>
-      <w:proofErr w:type="spellStart"/>
-      <w:r>
-        <w:rPr>
-          <w:rFonts w:ascii="Arial" w:hAnsi="Arial" w:cs="Arial"/>
-          <w:lang w:val="es-CO"/>
-        </w:rPr>
-        <w:t>dataframe</w:t>
-      </w:r>
-      <w:proofErr w:type="spellEnd"/>
+      <w:r>
+        <w:rPr>
+          <w:rFonts w:ascii="Arial" w:hAnsi="Arial" w:cs="Arial"/>
+          <w:lang w:val="es-CO"/>
+        </w:rPr>
+        <w:t>Unnamed: 15: Mujer</w:t>
+      </w:r>
+    </w:p>
+    <w:p>
+      <w:pPr>
+        <w:rPr>
+          <w:rFonts w:ascii="Arial" w:hAnsi="Arial" w:cs="Arial"/>
+          <w:lang w:val="es-CO"/>
+        </w:rPr>
+      </w:pPr>
+      <w:r>
+        <w:rPr>
+          <w:rFonts w:ascii="Arial" w:hAnsi="Arial" w:cs="Arial"/>
+          <w:lang w:val="es-CO"/>
+        </w:rPr>
+        <w:t>Para identificar el área, se crea una nueva columna ‘Area’ indicando el área de análisis (cabecera, centro poblado, rural disperso), en cada subconjunto, y se unen los subconjuntos como un solo dataframe</w:t>
+      </w:r>
       <w:r>
         <w:rPr>
           <w:rFonts w:ascii="Arial" w:hAnsi="Arial" w:cs="Arial"/>
@@ -2640,23 +2051,7 @@
           <w:rFonts w:ascii="Arial" w:hAnsi="Arial" w:cs="Arial"/>
           <w:lang w:val="es-CO"/>
         </w:rPr>
-        <w:t xml:space="preserve">Se empieza por extraer solo la parte correspondiente a los datos del archivo </w:t>
-      </w:r>
-      <w:proofErr w:type="spellStart"/>
-      <w:r>
-        <w:rPr>
-          <w:rFonts w:ascii="Arial" w:hAnsi="Arial" w:cs="Arial"/>
-          <w:lang w:val="es-CO"/>
-        </w:rPr>
-        <w:t>excel</w:t>
-      </w:r>
-      <w:proofErr w:type="spellEnd"/>
-      <w:r>
-        <w:rPr>
-          <w:rFonts w:ascii="Arial" w:hAnsi="Arial" w:cs="Arial"/>
-          <w:lang w:val="es-CO"/>
-        </w:rPr>
-        <w:t>, para lo cual se ignoran las primeras 9 filas de la hoja</w:t>
+        <w:t>Se empieza por extraer solo la parte correspondiente a los datos del archivo excel, para lo cual se ignoran las primeras 9 filas de la hoja</w:t>
       </w:r>
       <w:r>
         <w:rPr>
@@ -2742,47 +2137,22 @@
           <w:rFonts w:ascii="Arial" w:hAnsi="Arial" w:cs="Arial"/>
           <w:lang w:val="es-CO"/>
         </w:rPr>
-        <w:t xml:space="preserve">Actualización de </w:t>
-      </w:r>
-      <w:proofErr w:type="spellStart"/>
-      <w:r>
-        <w:rPr>
-          <w:rFonts w:ascii="Arial" w:hAnsi="Arial" w:cs="Arial"/>
-          <w:lang w:val="es-CO"/>
-        </w:rPr>
-        <w:t>headers</w:t>
-      </w:r>
-      <w:proofErr w:type="spellEnd"/>
-    </w:p>
-    <w:p>
-      <w:pPr>
-        <w:rPr>
-          <w:rFonts w:ascii="Arial" w:hAnsi="Arial" w:cs="Arial"/>
-          <w:lang w:val="es-CO"/>
-        </w:rPr>
-      </w:pPr>
-      <w:r>
-        <w:rPr>
-          <w:rFonts w:ascii="Arial" w:hAnsi="Arial" w:cs="Arial"/>
-          <w:lang w:val="es-CO"/>
-        </w:rPr>
-        <w:t xml:space="preserve">Al extraer los datos desde el archivo .xlsx, se verifica el </w:t>
-      </w:r>
-      <w:proofErr w:type="spellStart"/>
-      <w:r>
-        <w:rPr>
-          <w:rFonts w:ascii="Arial" w:hAnsi="Arial" w:cs="Arial"/>
-          <w:lang w:val="es-CO"/>
-        </w:rPr>
-        <w:t>dataframe</w:t>
-      </w:r>
-      <w:proofErr w:type="spellEnd"/>
-      <w:r>
-        <w:rPr>
-          <w:rFonts w:ascii="Arial" w:hAnsi="Arial" w:cs="Arial"/>
-          <w:lang w:val="es-CO"/>
-        </w:rPr>
-        <w:t xml:space="preserve"> generado por Pandas, empezando por los nombres de las columnas y se observan las siguientes incidencias:</w:t>
+        <w:t>Actualización de headers</w:t>
+      </w:r>
+    </w:p>
+    <w:p>
+      <w:pPr>
+        <w:rPr>
+          <w:rFonts w:ascii="Arial" w:hAnsi="Arial" w:cs="Arial"/>
+          <w:lang w:val="es-CO"/>
+        </w:rPr>
+      </w:pPr>
+      <w:r>
+        <w:rPr>
+          <w:rFonts w:ascii="Arial" w:hAnsi="Arial" w:cs="Arial"/>
+          <w:lang w:val="es-CO"/>
+        </w:rPr>
+        <w:t>Al extraer los datos desde el archivo .xlsx, se verifica el dataframe generado por Pandas, empezando por los nombres de las columnas y se observan las siguientes incidencias:</w:t>
       </w:r>
     </w:p>
     <w:p>
@@ -2797,53 +2167,12 @@
           <w:lang w:val="es-CO"/>
         </w:rPr>
       </w:pPr>
-      <w:proofErr w:type="spellStart"/>
-      <w:r>
-        <w:rPr>
-          <w:rFonts w:ascii="Arial" w:hAnsi="Arial" w:cs="Arial"/>
-          <w:lang w:val="es-CO"/>
-        </w:rPr>
-        <w:t>Headers</w:t>
-      </w:r>
-      <w:proofErr w:type="spellEnd"/>
-      <w:r>
-        <w:rPr>
-          <w:rFonts w:ascii="Arial" w:hAnsi="Arial" w:cs="Arial"/>
-          <w:lang w:val="es-CO"/>
-        </w:rPr>
-        <w:t xml:space="preserve"> sin nombres descriptivos: </w:t>
-      </w:r>
-      <w:proofErr w:type="spellStart"/>
-      <w:r>
-        <w:rPr>
-          <w:rFonts w:ascii="Arial" w:hAnsi="Arial" w:cs="Arial"/>
-          <w:lang w:val="es-CO"/>
-        </w:rPr>
-        <w:t>headers</w:t>
-      </w:r>
-      <w:proofErr w:type="spellEnd"/>
-      <w:r>
-        <w:rPr>
-          <w:rFonts w:ascii="Arial" w:hAnsi="Arial" w:cs="Arial"/>
-          <w:lang w:val="es-CO"/>
-        </w:rPr>
-        <w:t xml:space="preserve"> con nombres por defecto de Pandas tipo ‘</w:t>
-      </w:r>
-      <w:proofErr w:type="spellStart"/>
-      <w:r>
-        <w:rPr>
-          <w:rFonts w:ascii="Arial" w:hAnsi="Arial" w:cs="Arial"/>
-          <w:lang w:val="es-CO"/>
-        </w:rPr>
-        <w:t>Unnamed</w:t>
-      </w:r>
-      <w:proofErr w:type="spellEnd"/>
-      <w:r>
-        <w:rPr>
-          <w:rFonts w:ascii="Arial" w:hAnsi="Arial" w:cs="Arial"/>
-          <w:lang w:val="es-CO"/>
-        </w:rPr>
-        <w:t>: X’.</w:t>
+      <w:r>
+        <w:rPr>
+          <w:rFonts w:ascii="Arial" w:hAnsi="Arial" w:cs="Arial"/>
+          <w:lang w:val="es-CO"/>
+        </w:rPr>
+        <w:t>Headers sin nombres descriptivos: headers con nombres por defecto de Pandas tipo ‘Unnamed: X’.</w:t>
       </w:r>
     </w:p>
     <w:p>
@@ -2858,85 +2187,28 @@
           <w:lang w:val="es-CO"/>
         </w:rPr>
       </w:pPr>
-      <w:proofErr w:type="spellStart"/>
       <w:r>
         <w:rPr>
           <w:rFonts w:ascii="Arial" w:hAnsi="Arial" w:cs="Arial"/>
           <w:lang w:val="es-CO"/>
         </w:rPr>
         <w:lastRenderedPageBreak/>
-        <w:t>Headers</w:t>
-      </w:r>
-      <w:proofErr w:type="spellEnd"/>
-      <w:r>
-        <w:rPr>
-          <w:rFonts w:ascii="Arial" w:hAnsi="Arial" w:cs="Arial"/>
-          <w:lang w:val="es-CO"/>
-        </w:rPr>
-        <w:t xml:space="preserve"> en jerarquías inferiores debido a la agrupación de datos: Todos los </w:t>
-      </w:r>
-      <w:proofErr w:type="spellStart"/>
-      <w:r>
-        <w:rPr>
-          <w:rFonts w:ascii="Arial" w:hAnsi="Arial" w:cs="Arial"/>
-          <w:lang w:val="es-CO"/>
-        </w:rPr>
-        <w:t>headers</w:t>
-      </w:r>
-      <w:proofErr w:type="spellEnd"/>
-      <w:r>
-        <w:rPr>
-          <w:rFonts w:ascii="Arial" w:hAnsi="Arial" w:cs="Arial"/>
-          <w:lang w:val="es-CO"/>
-        </w:rPr>
-        <w:t xml:space="preserve"> se encuentran en la primera fila de los datos debido al diseño del .xlsx donde se busca describir la agrupación por Relación o parentesco con el jefe(a) del hogar.</w:t>
-      </w:r>
-    </w:p>
-    <w:p>
-      <w:pPr>
-        <w:rPr>
-          <w:rFonts w:ascii="Arial" w:hAnsi="Arial" w:cs="Arial"/>
-          <w:lang w:val="es-CO"/>
-        </w:rPr>
-      </w:pPr>
-      <w:r>
-        <w:rPr>
-          <w:rFonts w:ascii="Arial" w:hAnsi="Arial" w:cs="Arial"/>
-          <w:lang w:val="es-CO"/>
-        </w:rPr>
-        <w:t xml:space="preserve">Para solucionar esto, se reemplazan los </w:t>
-      </w:r>
-      <w:proofErr w:type="spellStart"/>
-      <w:r>
-        <w:rPr>
-          <w:rFonts w:ascii="Arial" w:hAnsi="Arial" w:cs="Arial"/>
-          <w:lang w:val="es-CO"/>
-        </w:rPr>
-        <w:t>headers</w:t>
-      </w:r>
-      <w:proofErr w:type="spellEnd"/>
-      <w:r>
-        <w:rPr>
-          <w:rFonts w:ascii="Arial" w:hAnsi="Arial" w:cs="Arial"/>
-          <w:lang w:val="es-CO"/>
-        </w:rPr>
-        <w:t xml:space="preserve"> actuales desde ‘Relación o parentesco con el </w:t>
-      </w:r>
-      <w:proofErr w:type="spellStart"/>
-      <w:r>
-        <w:rPr>
-          <w:rFonts w:ascii="Arial" w:hAnsi="Arial" w:cs="Arial"/>
-          <w:lang w:val="es-CO"/>
-        </w:rPr>
-        <w:t>jef</w:t>
-      </w:r>
-      <w:proofErr w:type="spellEnd"/>
-      <w:r>
-        <w:rPr>
-          <w:rFonts w:ascii="Arial" w:hAnsi="Arial" w:cs="Arial"/>
-          <w:lang w:val="es-CO"/>
-        </w:rPr>
-        <w:t>(a) del hogar’ hasta el último, por los valores correspondientes en la primera fila de datos.</w:t>
+        <w:t>Headers en jerarquías inferiores debido a la agrupación de datos: Todos los headers se encuentran en la primera fila de los datos debido al diseño del .xlsx donde se busca describir la agrupación por Relación o parentesco con el jefe(a) del hogar.</w:t>
+      </w:r>
+    </w:p>
+    <w:p>
+      <w:pPr>
+        <w:rPr>
+          <w:rFonts w:ascii="Arial" w:hAnsi="Arial" w:cs="Arial"/>
+          <w:lang w:val="es-CO"/>
+        </w:rPr>
+      </w:pPr>
+      <w:r>
+        <w:rPr>
+          <w:rFonts w:ascii="Arial" w:hAnsi="Arial" w:cs="Arial"/>
+          <w:lang w:val="es-CO"/>
+        </w:rPr>
+        <w:t>Para solucionar esto, se reemplazan los headers actuales desde ‘Relación o parentesco con el jef(a) del hogar’ hasta el último, por los valores correspondientes en la primera fila de datos.</w:t>
       </w:r>
     </w:p>
     <w:p>
@@ -3086,21 +2358,12 @@
           <w:lang w:val="es-CO"/>
         </w:rPr>
       </w:pPr>
-      <w:proofErr w:type="spellStart"/>
-      <w:r>
-        <w:rPr>
-          <w:rFonts w:ascii="Arial" w:hAnsi="Arial" w:cs="Arial"/>
-          <w:lang w:val="es-CO"/>
-        </w:rPr>
-        <w:t>Unnamed</w:t>
-      </w:r>
-      <w:proofErr w:type="spellEnd"/>
-      <w:r>
-        <w:rPr>
-          <w:rFonts w:ascii="Arial" w:hAnsi="Arial" w:cs="Arial"/>
-          <w:lang w:val="es-CO"/>
-        </w:rPr>
-        <w:t>: 1: Municipio</w:t>
+      <w:r>
+        <w:rPr>
+          <w:rFonts w:ascii="Arial" w:hAnsi="Arial" w:cs="Arial"/>
+          <w:lang w:val="es-CO"/>
+        </w:rPr>
+        <w:t>Unnamed: 1: Municipio</w:t>
       </w:r>
     </w:p>
     <w:p>
@@ -3115,31 +2378,13 @@
           <w:lang w:val="es-CO"/>
         </w:rPr>
       </w:pPr>
-      <w:proofErr w:type="spellStart"/>
-      <w:r>
-        <w:rPr>
-          <w:rFonts w:ascii="Arial" w:hAnsi="Arial" w:cs="Arial"/>
-          <w:lang w:val="es-CO"/>
-        </w:rPr>
-        <w:t>Unnamed</w:t>
-      </w:r>
-      <w:proofErr w:type="spellEnd"/>
-      <w:r>
-        <w:rPr>
-          <w:rFonts w:ascii="Arial" w:hAnsi="Arial" w:cs="Arial"/>
-          <w:lang w:val="es-CO"/>
-        </w:rPr>
-        <w:t xml:space="preserve">: 2: </w:t>
-      </w:r>
-      <w:proofErr w:type="spellStart"/>
-      <w:r>
-        <w:rPr>
-          <w:rFonts w:ascii="Arial" w:hAnsi="Arial" w:cs="Arial"/>
-          <w:lang w:val="es-CO"/>
-        </w:rPr>
-        <w:t>Area</w:t>
-      </w:r>
-      <w:proofErr w:type="spellEnd"/>
+      <w:r>
+        <w:rPr>
+          <w:rFonts w:ascii="Arial" w:hAnsi="Arial" w:cs="Arial"/>
+          <w:lang w:val="es-CO"/>
+        </w:rPr>
+        <w:t>Unnamed: 2: Area</w:t>
+      </w:r>
     </w:p>
     <w:p>
       <w:pPr>
@@ -3153,21 +2398,12 @@
           <w:lang w:val="es-CO"/>
         </w:rPr>
       </w:pPr>
-      <w:proofErr w:type="spellStart"/>
-      <w:r>
-        <w:rPr>
-          <w:rFonts w:ascii="Arial" w:hAnsi="Arial" w:cs="Arial"/>
-          <w:lang w:val="es-CO"/>
-        </w:rPr>
-        <w:t>Unnamed</w:t>
-      </w:r>
-      <w:proofErr w:type="spellEnd"/>
-      <w:r>
-        <w:rPr>
-          <w:rFonts w:ascii="Arial" w:hAnsi="Arial" w:cs="Arial"/>
-          <w:lang w:val="es-CO"/>
-        </w:rPr>
-        <w:t>: 3: Sexo</w:t>
+      <w:r>
+        <w:rPr>
+          <w:rFonts w:ascii="Arial" w:hAnsi="Arial" w:cs="Arial"/>
+          <w:lang w:val="es-CO"/>
+        </w:rPr>
+        <w:t>Unnamed: 3: Sexo</w:t>
       </w:r>
     </w:p>
     <w:p>
@@ -3293,23 +2529,7 @@
           <w:rFonts w:ascii="Arial" w:hAnsi="Arial" w:cs="Arial"/>
           <w:lang w:val="es-CO"/>
         </w:rPr>
-        <w:t xml:space="preserve">Eliminación de columnas sin información relevante o con información redundante en el </w:t>
-      </w:r>
-      <w:proofErr w:type="spellStart"/>
-      <w:r>
-        <w:rPr>
-          <w:rFonts w:ascii="Arial" w:hAnsi="Arial" w:cs="Arial"/>
-          <w:lang w:val="es-CO"/>
-        </w:rPr>
-        <w:t>dataframe</w:t>
-      </w:r>
-      <w:proofErr w:type="spellEnd"/>
-      <w:r>
-        <w:rPr>
-          <w:rFonts w:ascii="Arial" w:hAnsi="Arial" w:cs="Arial"/>
-          <w:lang w:val="es-CO"/>
-        </w:rPr>
-        <w:t>.</w:t>
+        <w:t>Eliminación de columnas sin información relevante o con información redundante en el dataframe.</w:t>
       </w:r>
     </w:p>
     <w:p>
@@ -3510,39 +2730,7 @@
           <w:rFonts w:ascii="Arial" w:hAnsi="Arial" w:cs="Arial"/>
           <w:lang w:val="es-CO"/>
         </w:rPr>
-        <w:t>Se propaga el valor de la columna ‘</w:t>
-      </w:r>
-      <w:proofErr w:type="spellStart"/>
-      <w:r>
-        <w:rPr>
-          <w:rFonts w:ascii="Arial" w:hAnsi="Arial" w:cs="Arial"/>
-          <w:lang w:val="es-CO"/>
-        </w:rPr>
-        <w:t>Area</w:t>
-      </w:r>
-      <w:proofErr w:type="spellEnd"/>
-      <w:r>
-        <w:rPr>
-          <w:rFonts w:ascii="Arial" w:hAnsi="Arial" w:cs="Arial"/>
-          <w:lang w:val="es-CO"/>
-        </w:rPr>
-        <w:t xml:space="preserve">’ para reemplazar los valores </w:t>
-      </w:r>
-      <w:proofErr w:type="spellStart"/>
-      <w:r>
-        <w:rPr>
-          <w:rFonts w:ascii="Arial" w:hAnsi="Arial" w:cs="Arial"/>
-          <w:lang w:val="es-CO"/>
-        </w:rPr>
-        <w:t>NaN</w:t>
-      </w:r>
-      <w:proofErr w:type="spellEnd"/>
-      <w:r>
-        <w:rPr>
-          <w:rFonts w:ascii="Arial" w:hAnsi="Arial" w:cs="Arial"/>
-          <w:lang w:val="es-CO"/>
-        </w:rPr>
-        <w:t>.</w:t>
+        <w:t>Se propaga el valor de la columna ‘Area’ para reemplazar los valores NaN.</w:t>
       </w:r>
     </w:p>
     <w:p>
@@ -3728,23 +2916,7 @@
           <w:rFonts w:ascii="Arial" w:hAnsi="Arial" w:cs="Arial"/>
           <w:lang w:val="es-CO"/>
         </w:rPr>
-        <w:t xml:space="preserve">Se empieza por extraer solo la parte correspondiente a los datos del archivo </w:t>
-      </w:r>
-      <w:proofErr w:type="spellStart"/>
-      <w:r>
-        <w:rPr>
-          <w:rFonts w:ascii="Arial" w:hAnsi="Arial" w:cs="Arial"/>
-          <w:lang w:val="es-CO"/>
-        </w:rPr>
-        <w:t>excel</w:t>
-      </w:r>
-      <w:proofErr w:type="spellEnd"/>
-      <w:r>
-        <w:rPr>
-          <w:rFonts w:ascii="Arial" w:hAnsi="Arial" w:cs="Arial"/>
-          <w:lang w:val="es-CO"/>
-        </w:rPr>
-        <w:t>, para lo cual se ignoran las primeras 9 filas de la hoja.</w:t>
+        <w:t>Se empieza por extraer solo la parte correspondiente a los datos del archivo excel, para lo cual se ignoran las primeras 9 filas de la hoja.</w:t>
       </w:r>
     </w:p>
     <w:p>
@@ -3830,47 +3002,22 @@
           <w:rFonts w:ascii="Arial" w:hAnsi="Arial" w:cs="Arial"/>
           <w:lang w:val="es-CO"/>
         </w:rPr>
-        <w:t xml:space="preserve">Actualización de </w:t>
-      </w:r>
-      <w:proofErr w:type="spellStart"/>
-      <w:r>
-        <w:rPr>
-          <w:rFonts w:ascii="Arial" w:hAnsi="Arial" w:cs="Arial"/>
-          <w:lang w:val="es-CO"/>
-        </w:rPr>
-        <w:t>headers</w:t>
-      </w:r>
-      <w:proofErr w:type="spellEnd"/>
-    </w:p>
-    <w:p>
-      <w:pPr>
-        <w:rPr>
-          <w:rFonts w:ascii="Arial" w:hAnsi="Arial" w:cs="Arial"/>
-          <w:lang w:val="es-CO"/>
-        </w:rPr>
-      </w:pPr>
-      <w:r>
-        <w:rPr>
-          <w:rFonts w:ascii="Arial" w:hAnsi="Arial" w:cs="Arial"/>
-          <w:lang w:val="es-CO"/>
-        </w:rPr>
-        <w:t xml:space="preserve">Al extraer los datos desde el archivo .xlsx, se verifica el </w:t>
-      </w:r>
-      <w:proofErr w:type="spellStart"/>
-      <w:r>
-        <w:rPr>
-          <w:rFonts w:ascii="Arial" w:hAnsi="Arial" w:cs="Arial"/>
-          <w:lang w:val="es-CO"/>
-        </w:rPr>
-        <w:t>dataframe</w:t>
-      </w:r>
-      <w:proofErr w:type="spellEnd"/>
-      <w:r>
-        <w:rPr>
-          <w:rFonts w:ascii="Arial" w:hAnsi="Arial" w:cs="Arial"/>
-          <w:lang w:val="es-CO"/>
-        </w:rPr>
-        <w:t xml:space="preserve"> generado por Pandas, empezando por los nombres de las columnas y se observan las siguientes incidencias:</w:t>
+        <w:t>Actualización de headers</w:t>
+      </w:r>
+    </w:p>
+    <w:p>
+      <w:pPr>
+        <w:rPr>
+          <w:rFonts w:ascii="Arial" w:hAnsi="Arial" w:cs="Arial"/>
+          <w:lang w:val="es-CO"/>
+        </w:rPr>
+      </w:pPr>
+      <w:r>
+        <w:rPr>
+          <w:rFonts w:ascii="Arial" w:hAnsi="Arial" w:cs="Arial"/>
+          <w:lang w:val="es-CO"/>
+        </w:rPr>
+        <w:t>Al extraer los datos desde el archivo .xlsx, se verifica el dataframe generado por Pandas, empezando por los nombres de las columnas y se observan las siguientes incidencias:</w:t>
       </w:r>
     </w:p>
     <w:p>
@@ -3885,53 +3032,12 @@
           <w:lang w:val="es-CO"/>
         </w:rPr>
       </w:pPr>
-      <w:proofErr w:type="spellStart"/>
-      <w:r>
-        <w:rPr>
-          <w:rFonts w:ascii="Arial" w:hAnsi="Arial" w:cs="Arial"/>
-          <w:lang w:val="es-CO"/>
-        </w:rPr>
-        <w:t>Headers</w:t>
-      </w:r>
-      <w:proofErr w:type="spellEnd"/>
-      <w:r>
-        <w:rPr>
-          <w:rFonts w:ascii="Arial" w:hAnsi="Arial" w:cs="Arial"/>
-          <w:lang w:val="es-CO"/>
-        </w:rPr>
-        <w:t xml:space="preserve"> sin nombres descriptivos: </w:t>
-      </w:r>
-      <w:proofErr w:type="spellStart"/>
-      <w:r>
-        <w:rPr>
-          <w:rFonts w:ascii="Arial" w:hAnsi="Arial" w:cs="Arial"/>
-          <w:lang w:val="es-CO"/>
-        </w:rPr>
-        <w:t>headers</w:t>
-      </w:r>
-      <w:proofErr w:type="spellEnd"/>
-      <w:r>
-        <w:rPr>
-          <w:rFonts w:ascii="Arial" w:hAnsi="Arial" w:cs="Arial"/>
-          <w:lang w:val="es-CO"/>
-        </w:rPr>
-        <w:t xml:space="preserve"> con nombres por defecto de Pandas tipo ‘</w:t>
-      </w:r>
-      <w:proofErr w:type="spellStart"/>
-      <w:r>
-        <w:rPr>
-          <w:rFonts w:ascii="Arial" w:hAnsi="Arial" w:cs="Arial"/>
-          <w:lang w:val="es-CO"/>
-        </w:rPr>
-        <w:t>Unnamed</w:t>
-      </w:r>
-      <w:proofErr w:type="spellEnd"/>
-      <w:r>
-        <w:rPr>
-          <w:rFonts w:ascii="Arial" w:hAnsi="Arial" w:cs="Arial"/>
-          <w:lang w:val="es-CO"/>
-        </w:rPr>
-        <w:t>: X’.</w:t>
+      <w:r>
+        <w:rPr>
+          <w:rFonts w:ascii="Arial" w:hAnsi="Arial" w:cs="Arial"/>
+          <w:lang w:val="es-CO"/>
+        </w:rPr>
+        <w:t>Headers sin nombres descriptivos: headers con nombres por defecto de Pandas tipo ‘Unnamed: X’.</w:t>
       </w:r>
     </w:p>
     <w:p>
@@ -3946,84 +3052,27 @@
           <w:lang w:val="es-CO"/>
         </w:rPr>
       </w:pPr>
-      <w:proofErr w:type="spellStart"/>
-      <w:r>
-        <w:rPr>
-          <w:rFonts w:ascii="Arial" w:hAnsi="Arial" w:cs="Arial"/>
-          <w:lang w:val="es-CO"/>
-        </w:rPr>
-        <w:t>Headers</w:t>
-      </w:r>
-      <w:proofErr w:type="spellEnd"/>
-      <w:r>
-        <w:rPr>
-          <w:rFonts w:ascii="Arial" w:hAnsi="Arial" w:cs="Arial"/>
-          <w:lang w:val="es-CO"/>
-        </w:rPr>
-        <w:t xml:space="preserve"> en jerarquías inferiores debido a la agrupación de datos: Todos los </w:t>
-      </w:r>
-      <w:proofErr w:type="spellStart"/>
-      <w:r>
-        <w:rPr>
-          <w:rFonts w:ascii="Arial" w:hAnsi="Arial" w:cs="Arial"/>
-          <w:lang w:val="es-CO"/>
-        </w:rPr>
-        <w:t>headers</w:t>
-      </w:r>
-      <w:proofErr w:type="spellEnd"/>
-      <w:r>
-        <w:rPr>
-          <w:rFonts w:ascii="Arial" w:hAnsi="Arial" w:cs="Arial"/>
-          <w:lang w:val="es-CO"/>
-        </w:rPr>
-        <w:t xml:space="preserve"> se encuentran en la primera fila de los datos debido al diseño del .xlsx donde se busca describir la agrupación por Relación o parentesco con el jefe(a) del hogar.</w:t>
-      </w:r>
-    </w:p>
-    <w:p>
-      <w:pPr>
-        <w:rPr>
-          <w:rFonts w:ascii="Arial" w:hAnsi="Arial" w:cs="Arial"/>
-          <w:lang w:val="es-CO"/>
-        </w:rPr>
-      </w:pPr>
-      <w:r>
-        <w:rPr>
-          <w:rFonts w:ascii="Arial" w:hAnsi="Arial" w:cs="Arial"/>
-          <w:lang w:val="es-CO"/>
-        </w:rPr>
-        <w:t xml:space="preserve">Para solucionar esto, se reemplazan los </w:t>
-      </w:r>
-      <w:proofErr w:type="spellStart"/>
-      <w:r>
-        <w:rPr>
-          <w:rFonts w:ascii="Arial" w:hAnsi="Arial" w:cs="Arial"/>
-          <w:lang w:val="es-CO"/>
-        </w:rPr>
-        <w:t>headers</w:t>
-      </w:r>
-      <w:proofErr w:type="spellEnd"/>
-      <w:r>
-        <w:rPr>
-          <w:rFonts w:ascii="Arial" w:hAnsi="Arial" w:cs="Arial"/>
-          <w:lang w:val="es-CO"/>
-        </w:rPr>
-        <w:t xml:space="preserve"> actuales desde ‘Relación o parentesco con el </w:t>
-      </w:r>
-      <w:proofErr w:type="spellStart"/>
-      <w:r>
-        <w:rPr>
-          <w:rFonts w:ascii="Arial" w:hAnsi="Arial" w:cs="Arial"/>
-          <w:lang w:val="es-CO"/>
-        </w:rPr>
-        <w:t>jef</w:t>
-      </w:r>
-      <w:proofErr w:type="spellEnd"/>
-      <w:r>
-        <w:rPr>
-          <w:rFonts w:ascii="Arial" w:hAnsi="Arial" w:cs="Arial"/>
-          <w:lang w:val="es-CO"/>
-        </w:rPr>
-        <w:t>(a) del hogar’ hasta el último, por los valores correspondientes en la primera fila de datos.</w:t>
+      <w:r>
+        <w:rPr>
+          <w:rFonts w:ascii="Arial" w:hAnsi="Arial" w:cs="Arial"/>
+          <w:lang w:val="es-CO"/>
+        </w:rPr>
+        <w:t>Headers en jerarquías inferiores debido a la agrupación de datos: Todos los headers se encuentran en la primera fila de los datos debido al diseño del .xlsx donde se busca describir la agrupación por Relación o parentesco con el jefe(a) del hogar.</w:t>
+      </w:r>
+    </w:p>
+    <w:p>
+      <w:pPr>
+        <w:rPr>
+          <w:rFonts w:ascii="Arial" w:hAnsi="Arial" w:cs="Arial"/>
+          <w:lang w:val="es-CO"/>
+        </w:rPr>
+      </w:pPr>
+      <w:r>
+        <w:rPr>
+          <w:rFonts w:ascii="Arial" w:hAnsi="Arial" w:cs="Arial"/>
+          <w:lang w:val="es-CO"/>
+        </w:rPr>
+        <w:t>Para solucionar esto, se reemplazan los headers actuales desde ‘Relación o parentesco con el jef(a) del hogar’ hasta el último, por los valores correspondientes en la primera fila de datos.</w:t>
       </w:r>
     </w:p>
     <w:p>
@@ -4166,21 +3215,12 @@
           <w:lang w:val="es-CO"/>
         </w:rPr>
       </w:pPr>
-      <w:proofErr w:type="spellStart"/>
-      <w:r>
-        <w:rPr>
-          <w:rFonts w:ascii="Arial" w:hAnsi="Arial" w:cs="Arial"/>
-          <w:lang w:val="es-CO"/>
-        </w:rPr>
-        <w:t>Unnamed</w:t>
-      </w:r>
-      <w:proofErr w:type="spellEnd"/>
-      <w:r>
-        <w:rPr>
-          <w:rFonts w:ascii="Arial" w:hAnsi="Arial" w:cs="Arial"/>
-          <w:lang w:val="es-CO"/>
-        </w:rPr>
-        <w:t>: 1: Municipio</w:t>
+      <w:r>
+        <w:rPr>
+          <w:rFonts w:ascii="Arial" w:hAnsi="Arial" w:cs="Arial"/>
+          <w:lang w:val="es-CO"/>
+        </w:rPr>
+        <w:t>Unnamed: 1: Municipio</w:t>
       </w:r>
     </w:p>
     <w:p>
@@ -4195,31 +3235,13 @@
           <w:lang w:val="es-CO"/>
         </w:rPr>
       </w:pPr>
-      <w:proofErr w:type="spellStart"/>
-      <w:r>
-        <w:rPr>
-          <w:rFonts w:ascii="Arial" w:hAnsi="Arial" w:cs="Arial"/>
-          <w:lang w:val="es-CO"/>
-        </w:rPr>
-        <w:t>Unnamed</w:t>
-      </w:r>
-      <w:proofErr w:type="spellEnd"/>
-      <w:r>
-        <w:rPr>
-          <w:rFonts w:ascii="Arial" w:hAnsi="Arial" w:cs="Arial"/>
-          <w:lang w:val="es-CO"/>
-        </w:rPr>
-        <w:t xml:space="preserve">: 2: </w:t>
-      </w:r>
-      <w:proofErr w:type="spellStart"/>
-      <w:r>
-        <w:rPr>
-          <w:rFonts w:ascii="Arial" w:hAnsi="Arial" w:cs="Arial"/>
-          <w:lang w:val="es-CO"/>
-        </w:rPr>
-        <w:t>Area</w:t>
-      </w:r>
-      <w:proofErr w:type="spellEnd"/>
+      <w:r>
+        <w:rPr>
+          <w:rFonts w:ascii="Arial" w:hAnsi="Arial" w:cs="Arial"/>
+          <w:lang w:val="es-CO"/>
+        </w:rPr>
+        <w:t>Unnamed: 2: Area</w:t>
+      </w:r>
     </w:p>
     <w:p>
       <w:pPr>
@@ -4233,21 +3255,12 @@
           <w:lang w:val="es-CO"/>
         </w:rPr>
       </w:pPr>
-      <w:proofErr w:type="spellStart"/>
-      <w:r>
-        <w:rPr>
-          <w:rFonts w:ascii="Arial" w:hAnsi="Arial" w:cs="Arial"/>
-          <w:lang w:val="es-CO"/>
-        </w:rPr>
-        <w:t>Unnamed</w:t>
-      </w:r>
-      <w:proofErr w:type="spellEnd"/>
-      <w:r>
-        <w:rPr>
-          <w:rFonts w:ascii="Arial" w:hAnsi="Arial" w:cs="Arial"/>
-          <w:lang w:val="es-CO"/>
-        </w:rPr>
-        <w:t>: 3: Grupo de edad</w:t>
+      <w:r>
+        <w:rPr>
+          <w:rFonts w:ascii="Arial" w:hAnsi="Arial" w:cs="Arial"/>
+          <w:lang w:val="es-CO"/>
+        </w:rPr>
+        <w:t>Unnamed: 3: Grupo de edad</w:t>
       </w:r>
     </w:p>
     <w:p>
@@ -4364,23 +3377,7 @@
           <w:rFonts w:ascii="Arial" w:hAnsi="Arial" w:cs="Arial"/>
           <w:lang w:val="es-CO"/>
         </w:rPr>
-        <w:t xml:space="preserve">Eliminación de columnas sin información relevante o con información redundante en el </w:t>
-      </w:r>
-      <w:proofErr w:type="spellStart"/>
-      <w:r>
-        <w:rPr>
-          <w:rFonts w:ascii="Arial" w:hAnsi="Arial" w:cs="Arial"/>
-          <w:lang w:val="es-CO"/>
-        </w:rPr>
-        <w:t>dataframe</w:t>
-      </w:r>
-      <w:proofErr w:type="spellEnd"/>
-      <w:r>
-        <w:rPr>
-          <w:rFonts w:ascii="Arial" w:hAnsi="Arial" w:cs="Arial"/>
-          <w:lang w:val="es-CO"/>
-        </w:rPr>
-        <w:t>.</w:t>
+        <w:t>Eliminación de columnas sin información relevante o con información redundante en el dataframe.</w:t>
       </w:r>
     </w:p>
     <w:p>
@@ -4596,39 +3593,7 @@
           <w:rFonts w:ascii="Arial" w:hAnsi="Arial" w:cs="Arial"/>
           <w:lang w:val="es-CO"/>
         </w:rPr>
-        <w:t>Se propaga el valor de la columna ‘</w:t>
-      </w:r>
-      <w:proofErr w:type="spellStart"/>
-      <w:r>
-        <w:rPr>
-          <w:rFonts w:ascii="Arial" w:hAnsi="Arial" w:cs="Arial"/>
-          <w:lang w:val="es-CO"/>
-        </w:rPr>
-        <w:t>Area</w:t>
-      </w:r>
-      <w:proofErr w:type="spellEnd"/>
-      <w:r>
-        <w:rPr>
-          <w:rFonts w:ascii="Arial" w:hAnsi="Arial" w:cs="Arial"/>
-          <w:lang w:val="es-CO"/>
-        </w:rPr>
-        <w:t xml:space="preserve">’ para reemplazar los valores </w:t>
-      </w:r>
-      <w:proofErr w:type="spellStart"/>
-      <w:r>
-        <w:rPr>
-          <w:rFonts w:ascii="Arial" w:hAnsi="Arial" w:cs="Arial"/>
-          <w:lang w:val="es-CO"/>
-        </w:rPr>
-        <w:t>NaN</w:t>
-      </w:r>
-      <w:proofErr w:type="spellEnd"/>
-      <w:r>
-        <w:rPr>
-          <w:rFonts w:ascii="Arial" w:hAnsi="Arial" w:cs="Arial"/>
-          <w:lang w:val="es-CO"/>
-        </w:rPr>
-        <w:t>.</w:t>
+        <w:t>Se propaga el valor de la columna ‘Area’ para reemplazar los valores NaN.</w:t>
       </w:r>
     </w:p>
     <w:p>
@@ -4837,23 +3802,7 @@
           <w:rFonts w:ascii="Arial" w:hAnsi="Arial" w:cs="Arial"/>
           <w:lang w:val="es-CO"/>
         </w:rPr>
-        <w:t xml:space="preserve">Se empieza por extraer solo la parte correspondiente a los datos del archivo </w:t>
-      </w:r>
-      <w:proofErr w:type="spellStart"/>
-      <w:r>
-        <w:rPr>
-          <w:rFonts w:ascii="Arial" w:hAnsi="Arial" w:cs="Arial"/>
-          <w:lang w:val="es-CO"/>
-        </w:rPr>
-        <w:t>excel</w:t>
-      </w:r>
-      <w:proofErr w:type="spellEnd"/>
-      <w:r>
-        <w:rPr>
-          <w:rFonts w:ascii="Arial" w:hAnsi="Arial" w:cs="Arial"/>
-          <w:lang w:val="es-CO"/>
-        </w:rPr>
-        <w:t>, para lo cual se ignoran las primeras 9 filas de la hoja.</w:t>
+        <w:t>Se empieza por extraer solo la parte correspondiente a los datos del archivo excel, para lo cual se ignoran las primeras 9 filas de la hoja.</w:t>
       </w:r>
     </w:p>
     <w:p>
@@ -4938,17 +3887,8 @@
           <w:rFonts w:ascii="Arial" w:hAnsi="Arial" w:cs="Arial"/>
           <w:lang w:val="es-CO"/>
         </w:rPr>
-        <w:t xml:space="preserve">Actualización de </w:t>
-      </w:r>
-      <w:proofErr w:type="spellStart"/>
-      <w:r>
-        <w:rPr>
-          <w:rFonts w:ascii="Arial" w:hAnsi="Arial" w:cs="Arial"/>
-          <w:lang w:val="es-CO"/>
-        </w:rPr>
-        <w:t>headers</w:t>
-      </w:r>
-      <w:proofErr w:type="spellEnd"/>
+        <w:t>Actualización de headers</w:t>
+      </w:r>
     </w:p>
     <w:p>
       <w:pPr>
@@ -4963,23 +3903,7 @@
           <w:lang w:val="es-CO"/>
         </w:rPr>
         <w:lastRenderedPageBreak/>
-        <w:t xml:space="preserve">Al extraer los datos desde el archivo .xlsx, se verifica el </w:t>
-      </w:r>
-      <w:proofErr w:type="spellStart"/>
-      <w:r>
-        <w:rPr>
-          <w:rFonts w:ascii="Arial" w:hAnsi="Arial" w:cs="Arial"/>
-          <w:lang w:val="es-CO"/>
-        </w:rPr>
-        <w:t>dataframe</w:t>
-      </w:r>
-      <w:proofErr w:type="spellEnd"/>
-      <w:r>
-        <w:rPr>
-          <w:rFonts w:ascii="Arial" w:hAnsi="Arial" w:cs="Arial"/>
-          <w:lang w:val="es-CO"/>
-        </w:rPr>
-        <w:t xml:space="preserve"> generado por Pandas, empezando por los nombres de las columnas y se observan las siguientes incidencias:</w:t>
+        <w:t>Al extraer los datos desde el archivo .xlsx, se verifica el dataframe generado por Pandas, empezando por los nombres de las columnas y se observan las siguientes incidencias:</w:t>
       </w:r>
     </w:p>
     <w:p>
@@ -4994,53 +3918,12 @@
           <w:lang w:val="es-CO"/>
         </w:rPr>
       </w:pPr>
-      <w:proofErr w:type="spellStart"/>
-      <w:r>
-        <w:rPr>
-          <w:rFonts w:ascii="Arial" w:hAnsi="Arial" w:cs="Arial"/>
-          <w:lang w:val="es-CO"/>
-        </w:rPr>
-        <w:t>Headers</w:t>
-      </w:r>
-      <w:proofErr w:type="spellEnd"/>
-      <w:r>
-        <w:rPr>
-          <w:rFonts w:ascii="Arial" w:hAnsi="Arial" w:cs="Arial"/>
-          <w:lang w:val="es-CO"/>
-        </w:rPr>
-        <w:t xml:space="preserve"> sin nombres descriptivos: </w:t>
-      </w:r>
-      <w:proofErr w:type="spellStart"/>
-      <w:r>
-        <w:rPr>
-          <w:rFonts w:ascii="Arial" w:hAnsi="Arial" w:cs="Arial"/>
-          <w:lang w:val="es-CO"/>
-        </w:rPr>
-        <w:t>headers</w:t>
-      </w:r>
-      <w:proofErr w:type="spellEnd"/>
-      <w:r>
-        <w:rPr>
-          <w:rFonts w:ascii="Arial" w:hAnsi="Arial" w:cs="Arial"/>
-          <w:lang w:val="es-CO"/>
-        </w:rPr>
-        <w:t xml:space="preserve"> con nombres por defecto de Pandas tipo ‘</w:t>
-      </w:r>
-      <w:proofErr w:type="spellStart"/>
-      <w:r>
-        <w:rPr>
-          <w:rFonts w:ascii="Arial" w:hAnsi="Arial" w:cs="Arial"/>
-          <w:lang w:val="es-CO"/>
-        </w:rPr>
-        <w:t>Unnamed</w:t>
-      </w:r>
-      <w:proofErr w:type="spellEnd"/>
-      <w:r>
-        <w:rPr>
-          <w:rFonts w:ascii="Arial" w:hAnsi="Arial" w:cs="Arial"/>
-          <w:lang w:val="es-CO"/>
-        </w:rPr>
-        <w:t>: X’.</w:t>
+      <w:r>
+        <w:rPr>
+          <w:rFonts w:ascii="Arial" w:hAnsi="Arial" w:cs="Arial"/>
+          <w:lang w:val="es-CO"/>
+        </w:rPr>
+        <w:t>Headers sin nombres descriptivos: headers con nombres por defecto de Pandas tipo ‘Unnamed: X’.</w:t>
       </w:r>
     </w:p>
     <w:p>
@@ -5055,84 +3938,27 @@
           <w:lang w:val="es-CO"/>
         </w:rPr>
       </w:pPr>
-      <w:proofErr w:type="spellStart"/>
-      <w:r>
-        <w:rPr>
-          <w:rFonts w:ascii="Arial" w:hAnsi="Arial" w:cs="Arial"/>
-          <w:lang w:val="es-CO"/>
-        </w:rPr>
-        <w:t>Headers</w:t>
-      </w:r>
-      <w:proofErr w:type="spellEnd"/>
-      <w:r>
-        <w:rPr>
-          <w:rFonts w:ascii="Arial" w:hAnsi="Arial" w:cs="Arial"/>
-          <w:lang w:val="es-CO"/>
-        </w:rPr>
-        <w:t xml:space="preserve"> en jerarquías inferiores debido a la agrupación de datos: Todos los </w:t>
-      </w:r>
-      <w:proofErr w:type="spellStart"/>
-      <w:r>
-        <w:rPr>
-          <w:rFonts w:ascii="Arial" w:hAnsi="Arial" w:cs="Arial"/>
-          <w:lang w:val="es-CO"/>
-        </w:rPr>
-        <w:t>headers</w:t>
-      </w:r>
-      <w:proofErr w:type="spellEnd"/>
-      <w:r>
-        <w:rPr>
-          <w:rFonts w:ascii="Arial" w:hAnsi="Arial" w:cs="Arial"/>
-          <w:lang w:val="es-CO"/>
-        </w:rPr>
-        <w:t xml:space="preserve"> se encuentran en la primera fila de los datos debido al diseño del .xlsx donde se busca describir la agrupación por Relación o parentesco con el jefe(a) del hogar.</w:t>
-      </w:r>
-    </w:p>
-    <w:p>
-      <w:pPr>
-        <w:rPr>
-          <w:rFonts w:ascii="Arial" w:hAnsi="Arial" w:cs="Arial"/>
-          <w:lang w:val="es-CO"/>
-        </w:rPr>
-      </w:pPr>
-      <w:r>
-        <w:rPr>
-          <w:rFonts w:ascii="Arial" w:hAnsi="Arial" w:cs="Arial"/>
-          <w:lang w:val="es-CO"/>
-        </w:rPr>
-        <w:t xml:space="preserve">Para solucionar esto, se reemplazan los </w:t>
-      </w:r>
-      <w:proofErr w:type="spellStart"/>
-      <w:r>
-        <w:rPr>
-          <w:rFonts w:ascii="Arial" w:hAnsi="Arial" w:cs="Arial"/>
-          <w:lang w:val="es-CO"/>
-        </w:rPr>
-        <w:t>headers</w:t>
-      </w:r>
-      <w:proofErr w:type="spellEnd"/>
-      <w:r>
-        <w:rPr>
-          <w:rFonts w:ascii="Arial" w:hAnsi="Arial" w:cs="Arial"/>
-          <w:lang w:val="es-CO"/>
-        </w:rPr>
-        <w:t xml:space="preserve"> actuales desde ‘Relación o parentesco con el </w:t>
-      </w:r>
-      <w:proofErr w:type="spellStart"/>
-      <w:r>
-        <w:rPr>
-          <w:rFonts w:ascii="Arial" w:hAnsi="Arial" w:cs="Arial"/>
-          <w:lang w:val="es-CO"/>
-        </w:rPr>
-        <w:t>jef</w:t>
-      </w:r>
-      <w:proofErr w:type="spellEnd"/>
-      <w:r>
-        <w:rPr>
-          <w:rFonts w:ascii="Arial" w:hAnsi="Arial" w:cs="Arial"/>
-          <w:lang w:val="es-CO"/>
-        </w:rPr>
-        <w:t>(a) del hogar’ hasta el último, por los valores correspondientes en la primera fila de datos.</w:t>
+      <w:r>
+        <w:rPr>
+          <w:rFonts w:ascii="Arial" w:hAnsi="Arial" w:cs="Arial"/>
+          <w:lang w:val="es-CO"/>
+        </w:rPr>
+        <w:t>Headers en jerarquías inferiores debido a la agrupación de datos: Todos los headers se encuentran en la primera fila de los datos debido al diseño del .xlsx donde se busca describir la agrupación por Relación o parentesco con el jefe(a) del hogar.</w:t>
+      </w:r>
+    </w:p>
+    <w:p>
+      <w:pPr>
+        <w:rPr>
+          <w:rFonts w:ascii="Arial" w:hAnsi="Arial" w:cs="Arial"/>
+          <w:lang w:val="es-CO"/>
+        </w:rPr>
+      </w:pPr>
+      <w:r>
+        <w:rPr>
+          <w:rFonts w:ascii="Arial" w:hAnsi="Arial" w:cs="Arial"/>
+          <w:lang w:val="es-CO"/>
+        </w:rPr>
+        <w:t>Para solucionar esto, se reemplazan los headers actuales desde ‘Relación o parentesco con el jef(a) del hogar’ hasta el último, por los valores correspondientes en la primera fila de datos.</w:t>
       </w:r>
     </w:p>
     <w:p>
@@ -5292,21 +4118,12 @@
           <w:lang w:val="es-CO"/>
         </w:rPr>
       </w:pPr>
-      <w:proofErr w:type="spellStart"/>
-      <w:r>
-        <w:rPr>
-          <w:rFonts w:ascii="Arial" w:hAnsi="Arial" w:cs="Arial"/>
-          <w:lang w:val="es-CO"/>
-        </w:rPr>
-        <w:t>Unnamed</w:t>
-      </w:r>
-      <w:proofErr w:type="spellEnd"/>
-      <w:r>
-        <w:rPr>
-          <w:rFonts w:ascii="Arial" w:hAnsi="Arial" w:cs="Arial"/>
-          <w:lang w:val="es-CO"/>
-        </w:rPr>
-        <w:t>: 1: Municipio</w:t>
+      <w:r>
+        <w:rPr>
+          <w:rFonts w:ascii="Arial" w:hAnsi="Arial" w:cs="Arial"/>
+          <w:lang w:val="es-CO"/>
+        </w:rPr>
+        <w:t>Unnamed: 1: Municipio</w:t>
       </w:r>
     </w:p>
     <w:p>
@@ -5321,21 +4138,12 @@
           <w:lang w:val="es-CO"/>
         </w:rPr>
       </w:pPr>
-      <w:proofErr w:type="spellStart"/>
-      <w:r>
-        <w:rPr>
-          <w:rFonts w:ascii="Arial" w:hAnsi="Arial" w:cs="Arial"/>
-          <w:lang w:val="es-CO"/>
-        </w:rPr>
-        <w:t>Unnamed</w:t>
-      </w:r>
-      <w:proofErr w:type="spellEnd"/>
-      <w:r>
-        <w:rPr>
-          <w:rFonts w:ascii="Arial" w:hAnsi="Arial" w:cs="Arial"/>
-          <w:lang w:val="es-CO"/>
-        </w:rPr>
-        <w:t>: 2: Sexo</w:t>
+      <w:r>
+        <w:rPr>
+          <w:rFonts w:ascii="Arial" w:hAnsi="Arial" w:cs="Arial"/>
+          <w:lang w:val="es-CO"/>
+        </w:rPr>
+        <w:t>Unnamed: 2: Sexo</w:t>
       </w:r>
     </w:p>
     <w:p>
@@ -5350,31 +4158,13 @@
           <w:lang w:val="es-CO"/>
         </w:rPr>
       </w:pPr>
-      <w:proofErr w:type="spellStart"/>
-      <w:r>
-        <w:rPr>
-          <w:rFonts w:ascii="Arial" w:hAnsi="Arial" w:cs="Arial"/>
-          <w:lang w:val="es-CO"/>
-        </w:rPr>
-        <w:t>Unnamed</w:t>
-      </w:r>
-      <w:proofErr w:type="spellEnd"/>
-      <w:r>
-        <w:rPr>
-          <w:rFonts w:ascii="Arial" w:hAnsi="Arial" w:cs="Arial"/>
-          <w:lang w:val="es-CO"/>
-        </w:rPr>
-        <w:t xml:space="preserve">: 3: </w:t>
-      </w:r>
-      <w:proofErr w:type="spellStart"/>
-      <w:r>
-        <w:rPr>
-          <w:rFonts w:ascii="Arial" w:hAnsi="Arial" w:cs="Arial"/>
-          <w:lang w:val="es-CO"/>
-        </w:rPr>
-        <w:t>Area</w:t>
-      </w:r>
-      <w:proofErr w:type="spellEnd"/>
+      <w:r>
+        <w:rPr>
+          <w:rFonts w:ascii="Arial" w:hAnsi="Arial" w:cs="Arial"/>
+          <w:lang w:val="es-CO"/>
+        </w:rPr>
+        <w:t>Unnamed: 3: Area</w:t>
+      </w:r>
     </w:p>
     <w:p>
       <w:pPr>
@@ -5388,21 +4178,12 @@
           <w:lang w:val="es-CO"/>
         </w:rPr>
       </w:pPr>
-      <w:proofErr w:type="spellStart"/>
-      <w:r>
-        <w:rPr>
-          <w:rFonts w:ascii="Arial" w:hAnsi="Arial" w:cs="Arial"/>
-          <w:lang w:val="es-CO"/>
-        </w:rPr>
-        <w:t>Unnamed</w:t>
-      </w:r>
-      <w:proofErr w:type="spellEnd"/>
-      <w:r>
-        <w:rPr>
-          <w:rFonts w:ascii="Arial" w:hAnsi="Arial" w:cs="Arial"/>
-          <w:lang w:val="es-CO"/>
-        </w:rPr>
-        <w:t>: 4: Grupo de edad</w:t>
+      <w:r>
+        <w:rPr>
+          <w:rFonts w:ascii="Arial" w:hAnsi="Arial" w:cs="Arial"/>
+          <w:lang w:val="es-CO"/>
+        </w:rPr>
+        <w:t>Unnamed: 4: Grupo de edad</w:t>
       </w:r>
     </w:p>
     <w:p>
@@ -5520,23 +4301,7 @@
           <w:rFonts w:ascii="Arial" w:hAnsi="Arial" w:cs="Arial"/>
           <w:lang w:val="es-CO"/>
         </w:rPr>
-        <w:t xml:space="preserve">Eliminación de columnas sin información relevante o con información redundante en el </w:t>
-      </w:r>
-      <w:proofErr w:type="spellStart"/>
-      <w:r>
-        <w:rPr>
-          <w:rFonts w:ascii="Arial" w:hAnsi="Arial" w:cs="Arial"/>
-          <w:lang w:val="es-CO"/>
-        </w:rPr>
-        <w:t>dataframe</w:t>
-      </w:r>
-      <w:proofErr w:type="spellEnd"/>
-      <w:r>
-        <w:rPr>
-          <w:rFonts w:ascii="Arial" w:hAnsi="Arial" w:cs="Arial"/>
-          <w:lang w:val="es-CO"/>
-        </w:rPr>
-        <w:t>.</w:t>
+        <w:t>Eliminación de columnas sin información relevante o con información redundante en el dataframe.</w:t>
       </w:r>
     </w:p>
     <w:p>
@@ -5745,39 +4510,7 @@
           <w:rFonts w:ascii="Arial" w:hAnsi="Arial" w:cs="Arial"/>
           <w:lang w:val="es-CO"/>
         </w:rPr>
-        <w:t>Se propagan los valores de las columnas ‘Sexo’ y ‘</w:t>
-      </w:r>
-      <w:proofErr w:type="spellStart"/>
-      <w:r>
-        <w:rPr>
-          <w:rFonts w:ascii="Arial" w:hAnsi="Arial" w:cs="Arial"/>
-          <w:lang w:val="es-CO"/>
-        </w:rPr>
-        <w:t>Area</w:t>
-      </w:r>
-      <w:proofErr w:type="spellEnd"/>
-      <w:r>
-        <w:rPr>
-          <w:rFonts w:ascii="Arial" w:hAnsi="Arial" w:cs="Arial"/>
-          <w:lang w:val="es-CO"/>
-        </w:rPr>
-        <w:t xml:space="preserve">’ para reemplazar los valores </w:t>
-      </w:r>
-      <w:proofErr w:type="spellStart"/>
-      <w:r>
-        <w:rPr>
-          <w:rFonts w:ascii="Arial" w:hAnsi="Arial" w:cs="Arial"/>
-          <w:lang w:val="es-CO"/>
-        </w:rPr>
-        <w:t>NaN</w:t>
-      </w:r>
-      <w:proofErr w:type="spellEnd"/>
-      <w:r>
-        <w:rPr>
-          <w:rFonts w:ascii="Arial" w:hAnsi="Arial" w:cs="Arial"/>
-          <w:lang w:val="es-CO"/>
-        </w:rPr>
-        <w:t>.</w:t>
+        <w:t>Se propagan los valores de las columnas ‘Sexo’ y ‘Area’ para reemplazar los valores NaN.</w:t>
       </w:r>
     </w:p>
     <w:p>
@@ -5987,23 +4720,7 @@
           <w:rFonts w:ascii="Arial" w:hAnsi="Arial" w:cs="Arial"/>
           <w:lang w:val="es-CO"/>
         </w:rPr>
-        <w:t xml:space="preserve">Se empieza por extraer solo la parte correspondiente a los datos del archivo </w:t>
-      </w:r>
-      <w:proofErr w:type="spellStart"/>
-      <w:r>
-        <w:rPr>
-          <w:rFonts w:ascii="Arial" w:hAnsi="Arial" w:cs="Arial"/>
-          <w:lang w:val="es-CO"/>
-        </w:rPr>
-        <w:t>excel</w:t>
-      </w:r>
-      <w:proofErr w:type="spellEnd"/>
-      <w:r>
-        <w:rPr>
-          <w:rFonts w:ascii="Arial" w:hAnsi="Arial" w:cs="Arial"/>
-          <w:lang w:val="es-CO"/>
-        </w:rPr>
-        <w:t>, para lo cual se ignoran las primeras 9 filas de la hoja.</w:t>
+        <w:t>Se empieza por extraer solo la parte correspondiente a los datos del archivo excel, para lo cual se ignoran las primeras 9 filas de la hoja.</w:t>
       </w:r>
     </w:p>
     <w:p>
@@ -6178,47 +4895,22 @@
           <w:rFonts w:ascii="Arial" w:hAnsi="Arial" w:cs="Arial"/>
           <w:lang w:val="es-CO"/>
         </w:rPr>
-        <w:t xml:space="preserve">Actualización de </w:t>
-      </w:r>
-      <w:proofErr w:type="spellStart"/>
-      <w:r>
-        <w:rPr>
-          <w:rFonts w:ascii="Arial" w:hAnsi="Arial" w:cs="Arial"/>
-          <w:lang w:val="es-CO"/>
-        </w:rPr>
-        <w:t>headers</w:t>
-      </w:r>
-      <w:proofErr w:type="spellEnd"/>
-    </w:p>
-    <w:p>
-      <w:pPr>
-        <w:rPr>
-          <w:rFonts w:ascii="Arial" w:hAnsi="Arial" w:cs="Arial"/>
-          <w:lang w:val="es-CO"/>
-        </w:rPr>
-      </w:pPr>
-      <w:r>
-        <w:rPr>
-          <w:rFonts w:ascii="Arial" w:hAnsi="Arial" w:cs="Arial"/>
-          <w:lang w:val="es-CO"/>
-        </w:rPr>
-        <w:t xml:space="preserve">Al extraer los datos desde el archivo .xlsx, se verifica el </w:t>
-      </w:r>
-      <w:proofErr w:type="spellStart"/>
-      <w:r>
-        <w:rPr>
-          <w:rFonts w:ascii="Arial" w:hAnsi="Arial" w:cs="Arial"/>
-          <w:lang w:val="es-CO"/>
-        </w:rPr>
-        <w:t>dataframe</w:t>
-      </w:r>
-      <w:proofErr w:type="spellEnd"/>
-      <w:r>
-        <w:rPr>
-          <w:rFonts w:ascii="Arial" w:hAnsi="Arial" w:cs="Arial"/>
-          <w:lang w:val="es-CO"/>
-        </w:rPr>
-        <w:t xml:space="preserve"> generado por Pandas, empezando por los nombres de las columnas y se observan las siguientes incidencias:</w:t>
+        <w:t>Actualización de headers</w:t>
+      </w:r>
+    </w:p>
+    <w:p>
+      <w:pPr>
+        <w:rPr>
+          <w:rFonts w:ascii="Arial" w:hAnsi="Arial" w:cs="Arial"/>
+          <w:lang w:val="es-CO"/>
+        </w:rPr>
+      </w:pPr>
+      <w:r>
+        <w:rPr>
+          <w:rFonts w:ascii="Arial" w:hAnsi="Arial" w:cs="Arial"/>
+          <w:lang w:val="es-CO"/>
+        </w:rPr>
+        <w:t>Al extraer los datos desde el archivo .xlsx, se verifica el dataframe generado por Pandas, empezando por los nombres de las columnas y se observan las siguientes incidencias:</w:t>
       </w:r>
     </w:p>
     <w:p>
@@ -6233,53 +4925,12 @@
           <w:lang w:val="es-CO"/>
         </w:rPr>
       </w:pPr>
-      <w:proofErr w:type="spellStart"/>
-      <w:r>
-        <w:rPr>
-          <w:rFonts w:ascii="Arial" w:hAnsi="Arial" w:cs="Arial"/>
-          <w:lang w:val="es-CO"/>
-        </w:rPr>
-        <w:t>Headers</w:t>
-      </w:r>
-      <w:proofErr w:type="spellEnd"/>
-      <w:r>
-        <w:rPr>
-          <w:rFonts w:ascii="Arial" w:hAnsi="Arial" w:cs="Arial"/>
-          <w:lang w:val="es-CO"/>
-        </w:rPr>
-        <w:t xml:space="preserve"> sin nombres descriptivos: </w:t>
-      </w:r>
-      <w:proofErr w:type="spellStart"/>
-      <w:r>
-        <w:rPr>
-          <w:rFonts w:ascii="Arial" w:hAnsi="Arial" w:cs="Arial"/>
-          <w:lang w:val="es-CO"/>
-        </w:rPr>
-        <w:t>headers</w:t>
-      </w:r>
-      <w:proofErr w:type="spellEnd"/>
-      <w:r>
-        <w:rPr>
-          <w:rFonts w:ascii="Arial" w:hAnsi="Arial" w:cs="Arial"/>
-          <w:lang w:val="es-CO"/>
-        </w:rPr>
-        <w:t xml:space="preserve"> con nombres por defecto de Pandas tipo ‘</w:t>
-      </w:r>
-      <w:proofErr w:type="spellStart"/>
-      <w:r>
-        <w:rPr>
-          <w:rFonts w:ascii="Arial" w:hAnsi="Arial" w:cs="Arial"/>
-          <w:lang w:val="es-CO"/>
-        </w:rPr>
-        <w:t>Unnamed</w:t>
-      </w:r>
-      <w:proofErr w:type="spellEnd"/>
-      <w:r>
-        <w:rPr>
-          <w:rFonts w:ascii="Arial" w:hAnsi="Arial" w:cs="Arial"/>
-          <w:lang w:val="es-CO"/>
-        </w:rPr>
-        <w:t>: X’.</w:t>
+      <w:r>
+        <w:rPr>
+          <w:rFonts w:ascii="Arial" w:hAnsi="Arial" w:cs="Arial"/>
+          <w:lang w:val="es-CO"/>
+        </w:rPr>
+        <w:t>Headers sin nombres descriptivos: headers con nombres por defecto de Pandas tipo ‘Unnamed: X’.</w:t>
       </w:r>
     </w:p>
     <w:p>
@@ -6294,89 +4945,27 @@
           <w:lang w:val="es-CO"/>
         </w:rPr>
       </w:pPr>
-      <w:proofErr w:type="spellStart"/>
-      <w:r>
-        <w:rPr>
-          <w:rFonts w:ascii="Arial" w:hAnsi="Arial" w:cs="Arial"/>
-          <w:lang w:val="es-CO"/>
-        </w:rPr>
-        <w:t>Headers</w:t>
-      </w:r>
-      <w:proofErr w:type="spellEnd"/>
-      <w:r>
-        <w:rPr>
-          <w:rFonts w:ascii="Arial" w:hAnsi="Arial" w:cs="Arial"/>
-          <w:lang w:val="es-CO"/>
-        </w:rPr>
-        <w:t xml:space="preserve"> en jerarquías inferiores debido a la agrupación de datos: </w:t>
-      </w:r>
-      <w:r>
-        <w:rPr>
-          <w:rFonts w:ascii="Arial" w:hAnsi="Arial" w:cs="Arial"/>
-          <w:lang w:val="es-CO"/>
-        </w:rPr>
-        <w:t xml:space="preserve">Los </w:t>
-      </w:r>
-      <w:proofErr w:type="spellStart"/>
-      <w:r>
-        <w:rPr>
-          <w:rFonts w:ascii="Arial" w:hAnsi="Arial" w:cs="Arial"/>
-          <w:lang w:val="es-CO"/>
-        </w:rPr>
-        <w:t>headers</w:t>
-      </w:r>
-      <w:proofErr w:type="spellEnd"/>
-      <w:r>
-        <w:rPr>
-          <w:rFonts w:ascii="Arial" w:hAnsi="Arial" w:cs="Arial"/>
-          <w:lang w:val="es-CO"/>
-        </w:rPr>
-        <w:t xml:space="preserve"> se encuentran en la primera fila de datos debido al diseño del .xlsx donde se busca describir la agrupación por </w:t>
-      </w:r>
-      <w:r>
-        <w:rPr>
-          <w:rFonts w:ascii="Arial" w:hAnsi="Arial" w:cs="Arial"/>
-          <w:lang w:val="es-CO"/>
-        </w:rPr>
-        <w:t>Área en la que se tomaron los datos</w:t>
-      </w:r>
-      <w:r>
-        <w:rPr>
-          <w:rFonts w:ascii="Arial" w:hAnsi="Arial" w:cs="Arial"/>
-          <w:lang w:val="es-CO"/>
-        </w:rPr>
-        <w:t>.</w:t>
-      </w:r>
-    </w:p>
-    <w:p>
-      <w:pPr>
-        <w:rPr>
-          <w:rFonts w:ascii="Arial" w:hAnsi="Arial" w:cs="Arial"/>
-          <w:lang w:val="es-CO"/>
-        </w:rPr>
-      </w:pPr>
-      <w:r>
-        <w:rPr>
-          <w:rFonts w:ascii="Arial" w:hAnsi="Arial" w:cs="Arial"/>
-          <w:lang w:val="es-CO"/>
-        </w:rPr>
-        <w:t xml:space="preserve">Debido a la agrupación de datos en las columnas, se divide el </w:t>
-      </w:r>
-      <w:proofErr w:type="spellStart"/>
-      <w:r>
-        <w:rPr>
-          <w:rFonts w:ascii="Arial" w:hAnsi="Arial" w:cs="Arial"/>
-          <w:lang w:val="es-CO"/>
-        </w:rPr>
-        <w:t>dataframe</w:t>
-      </w:r>
-      <w:proofErr w:type="spellEnd"/>
-      <w:r>
-        <w:rPr>
-          <w:rFonts w:ascii="Arial" w:hAnsi="Arial" w:cs="Arial"/>
-          <w:lang w:val="es-CO"/>
-        </w:rPr>
-        <w:t xml:space="preserve"> en 3 partes, correspondientes a las áreas, ignorando el total para remover resúmenes </w:t>
+      <w:r>
+        <w:rPr>
+          <w:rFonts w:ascii="Arial" w:hAnsi="Arial" w:cs="Arial"/>
+          <w:lang w:val="es-CO"/>
+        </w:rPr>
+        <w:t>Headers en jerarquías inferiores debido a la agrupación de datos: Los headers se encuentran en la primera fila de datos debido al diseño del .xlsx donde se busca describir la agrupación por Área en la que se tomaron los datos.</w:t>
+      </w:r>
+    </w:p>
+    <w:p>
+      <w:pPr>
+        <w:rPr>
+          <w:rFonts w:ascii="Arial" w:hAnsi="Arial" w:cs="Arial"/>
+          <w:lang w:val="es-CO"/>
+        </w:rPr>
+      </w:pPr>
+      <w:r>
+        <w:rPr>
+          <w:rFonts w:ascii="Arial" w:hAnsi="Arial" w:cs="Arial"/>
+          <w:lang w:val="es-CO"/>
+        </w:rPr>
+        <w:t xml:space="preserve">Debido a la agrupación de datos en las columnas, se divide el dataframe en 3 partes, correspondientes a las áreas, ignorando el total para remover resúmenes </w:t>
       </w:r>
       <w:r>
         <w:rPr>
@@ -6384,46 +4973,14 @@
           <w:lang w:val="es-CO"/>
         </w:rPr>
         <w:lastRenderedPageBreak/>
-        <w:t xml:space="preserve">de datos en el </w:t>
-      </w:r>
-      <w:proofErr w:type="spellStart"/>
-      <w:r>
-        <w:rPr>
-          <w:rFonts w:ascii="Arial" w:hAnsi="Arial" w:cs="Arial"/>
-          <w:lang w:val="es-CO"/>
-        </w:rPr>
-        <w:t>dataset</w:t>
-      </w:r>
-      <w:proofErr w:type="spellEnd"/>
-      <w:r>
-        <w:rPr>
-          <w:rFonts w:ascii="Arial" w:hAnsi="Arial" w:cs="Arial"/>
-          <w:lang w:val="es-CO"/>
-        </w:rPr>
-        <w:t xml:space="preserve"> final. </w:t>
-      </w:r>
-      <w:r>
-        <w:rPr>
-          <w:rFonts w:ascii="Arial" w:hAnsi="Arial" w:cs="Arial"/>
-          <w:lang w:val="es-CO"/>
-        </w:rPr>
-        <w:t>Cada subconjunto se concatena con la columna de Grupo de edad, y se asigna una columna ‘</w:t>
-      </w:r>
-      <w:proofErr w:type="spellStart"/>
-      <w:r>
-        <w:rPr>
-          <w:rFonts w:ascii="Arial" w:hAnsi="Arial" w:cs="Arial"/>
-          <w:lang w:val="es-CO"/>
-        </w:rPr>
-        <w:t>Area</w:t>
-      </w:r>
-      <w:proofErr w:type="spellEnd"/>
-      <w:r>
-        <w:rPr>
-          <w:rFonts w:ascii="Arial" w:hAnsi="Arial" w:cs="Arial"/>
-          <w:lang w:val="es-CO"/>
-        </w:rPr>
-        <w:t xml:space="preserve">’ que contiene el área donde fueron tomados los datos. Luego se reemplazan los nombres de las columnas que todavía tienen un nombre por defecto por los siguientes nombres en su orden correspondiente: </w:t>
+        <w:t xml:space="preserve">de datos en el dataset final. </w:t>
+      </w:r>
+      <w:r>
+        <w:rPr>
+          <w:rFonts w:ascii="Arial" w:hAnsi="Arial" w:cs="Arial"/>
+          <w:lang w:val="es-CO"/>
+        </w:rPr>
+        <w:t xml:space="preserve">Cada subconjunto se concatena con la columna de Grupo de edad, y se asigna una columna ‘Area’ que contiene el área donde fueron tomados los datos. Luego se reemplazan los nombres de las columnas que todavía tienen un nombre por defecto por los siguientes nombres en su orden correspondiente: </w:t>
       </w:r>
     </w:p>
     <w:p>
@@ -6463,23 +5020,7 @@
           <w:rFonts w:ascii="Arial" w:hAnsi="Arial" w:cs="Arial"/>
           <w:lang w:val="es-CO"/>
         </w:rPr>
-        <w:t xml:space="preserve">'Gitano(a) o </w:t>
-      </w:r>
-      <w:proofErr w:type="spellStart"/>
-      <w:r>
-        <w:rPr>
-          <w:rFonts w:ascii="Arial" w:hAnsi="Arial" w:cs="Arial"/>
-          <w:lang w:val="es-CO"/>
-        </w:rPr>
-        <w:t>Rrom</w:t>
-      </w:r>
-      <w:proofErr w:type="spellEnd"/>
-      <w:r>
-        <w:rPr>
-          <w:rFonts w:ascii="Arial" w:hAnsi="Arial" w:cs="Arial"/>
-          <w:lang w:val="es-CO"/>
-        </w:rPr>
-        <w:t>',</w:t>
+        <w:t>'Gitano(a) o Rrom',</w:t>
       </w:r>
     </w:p>
     <w:p>
@@ -6499,23 +5040,7 @@
           <w:rFonts w:ascii="Arial" w:hAnsi="Arial" w:cs="Arial"/>
           <w:lang w:val="es-CO"/>
         </w:rPr>
-        <w:t xml:space="preserve">'Raizal del </w:t>
-      </w:r>
-      <w:proofErr w:type="spellStart"/>
-      <w:r>
-        <w:rPr>
-          <w:rFonts w:ascii="Arial" w:hAnsi="Arial" w:cs="Arial"/>
-          <w:lang w:val="es-CO"/>
-        </w:rPr>
-        <w:t>Archipielago</w:t>
-      </w:r>
-      <w:proofErr w:type="spellEnd"/>
-      <w:r>
-        <w:rPr>
-          <w:rFonts w:ascii="Arial" w:hAnsi="Arial" w:cs="Arial"/>
-          <w:lang w:val="es-CO"/>
-        </w:rPr>
-        <w:t xml:space="preserve"> de San Andrés, Providencia y Santa Catalina',</w:t>
+        <w:t>'Raizal del Archipielago de San Andrés, Providencia y Santa Catalina',</w:t>
       </w:r>
     </w:p>
     <w:p>
@@ -6610,39 +5135,7 @@
           <w:rFonts w:ascii="Arial" w:hAnsi="Arial" w:cs="Arial"/>
           <w:lang w:val="es-CO"/>
         </w:rPr>
-        <w:t xml:space="preserve">Después de las modificaciones en cada subconjunto, se consolidan los </w:t>
-      </w:r>
-      <w:proofErr w:type="spellStart"/>
-      <w:r>
-        <w:rPr>
-          <w:rFonts w:ascii="Arial" w:hAnsi="Arial" w:cs="Arial"/>
-          <w:lang w:val="es-CO"/>
-        </w:rPr>
-        <w:t>dataframes</w:t>
-      </w:r>
-      <w:proofErr w:type="spellEnd"/>
-      <w:r>
-        <w:rPr>
-          <w:rFonts w:ascii="Arial" w:hAnsi="Arial" w:cs="Arial"/>
-          <w:lang w:val="es-CO"/>
-        </w:rPr>
-        <w:t xml:space="preserve"> en un solo </w:t>
-      </w:r>
-      <w:proofErr w:type="spellStart"/>
-      <w:r>
-        <w:rPr>
-          <w:rFonts w:ascii="Arial" w:hAnsi="Arial" w:cs="Arial"/>
-          <w:lang w:val="es-CO"/>
-        </w:rPr>
-        <w:t>dataframe</w:t>
-      </w:r>
-      <w:proofErr w:type="spellEnd"/>
-      <w:r>
-        <w:rPr>
-          <w:rFonts w:ascii="Arial" w:hAnsi="Arial" w:cs="Arial"/>
-          <w:lang w:val="es-CO"/>
-        </w:rPr>
-        <w:t>.</w:t>
+        <w:t>Después de las modificaciones en cada subconjunto, se consolidan los dataframes en un solo dataframe.</w:t>
       </w:r>
     </w:p>
     <w:p>
@@ -6833,23 +5326,7 @@
           <w:rFonts w:ascii="Arial" w:hAnsi="Arial" w:cs="Arial"/>
           <w:lang w:val="es-CO"/>
         </w:rPr>
-        <w:t xml:space="preserve">Se renombran los </w:t>
-      </w:r>
-      <w:proofErr w:type="spellStart"/>
-      <w:r>
-        <w:rPr>
-          <w:rFonts w:ascii="Arial" w:hAnsi="Arial" w:cs="Arial"/>
-          <w:lang w:val="es-CO"/>
-        </w:rPr>
-        <w:t>headers</w:t>
-      </w:r>
-      <w:proofErr w:type="spellEnd"/>
-      <w:r>
-        <w:rPr>
-          <w:rFonts w:ascii="Arial" w:hAnsi="Arial" w:cs="Arial"/>
-          <w:lang w:val="es-CO"/>
-        </w:rPr>
-        <w:t xml:space="preserve"> que contienen tildes o ñ.</w:t>
+        <w:t>Se renombran los headers que contienen tildes o ñ.</w:t>
       </w:r>
     </w:p>
     <w:p>
@@ -6952,28 +5429,638 @@
           <w:rFonts w:ascii="Arial" w:hAnsi="Arial" w:cs="Arial"/>
           <w:lang w:val="es-CO"/>
         </w:rPr>
-        <w:t xml:space="preserve">Finalmente, se cambian las tildes </w:t>
-      </w:r>
-      <w:r>
-        <w:rPr>
-          <w:rFonts w:ascii="Arial" w:hAnsi="Arial" w:cs="Arial"/>
-          <w:lang w:val="es-CO"/>
-        </w:rPr>
-        <w:t xml:space="preserve">y las ñ dentro de los datos, </w:t>
-      </w:r>
-      <w:r>
-        <w:rPr>
-          <w:rFonts w:ascii="Arial" w:hAnsi="Arial" w:cs="Arial"/>
-          <w:lang w:val="es-CO"/>
-        </w:rPr>
-        <w:t>reemplazando vocales con tilde por vocales sin tilde</w:t>
-      </w:r>
-      <w:r>
-        <w:rPr>
-          <w:rFonts w:ascii="Arial" w:hAnsi="Arial" w:cs="Arial"/>
-          <w:lang w:val="es-CO"/>
-        </w:rPr>
-        <w:t xml:space="preserve"> y la letra ñ por la letra n</w:t>
+        <w:t>Finalmente, se cambian las tildes y las ñ dentro de los datos, reemplazando vocales con tilde por vocales sin tilde y la letra ñ por la letra n.</w:t>
+      </w:r>
+    </w:p>
+    <w:p>
+      <w:pPr>
+        <w:rPr>
+          <w:rFonts w:ascii="Arial" w:hAnsi="Arial" w:cs="Arial"/>
+          <w:lang w:val="es-CO"/>
+        </w:rPr>
+      </w:pPr>
+    </w:p>
+    <w:p>
+      <w:pPr>
+        <w:rPr>
+          <w:rFonts w:ascii="Arial" w:hAnsi="Arial" w:cs="Arial"/>
+          <w:lang w:val="es-CO"/>
+        </w:rPr>
+      </w:pPr>
+    </w:p>
+    <w:p>
+      <w:pPr>
+        <w:rPr>
+          <w:rFonts w:ascii="Arial" w:hAnsi="Arial" w:cs="Arial"/>
+          <w:b/>
+          <w:bCs/>
+          <w:lang w:val="es-CO"/>
+        </w:rPr>
+      </w:pPr>
+      <w:r>
+        <w:rPr>
+          <w:rFonts w:ascii="Arial" w:hAnsi="Arial" w:cs="Arial"/>
+          <w:b/>
+          <w:bCs/>
+          <w:lang w:val="es-CO"/>
+        </w:rPr>
+        <w:t>13PM</w:t>
+      </w:r>
+    </w:p>
+    <w:p>
+      <w:pPr>
+        <w:rPr>
+          <w:rFonts w:ascii="Arial" w:hAnsi="Arial" w:cs="Arial"/>
+          <w:lang w:val="es-CO"/>
+        </w:rPr>
+      </w:pPr>
+      <w:r>
+        <w:rPr>
+          <w:rFonts w:ascii="Arial" w:hAnsi="Arial" w:cs="Arial"/>
+          <w:lang w:val="es-CO"/>
+        </w:rPr>
+        <w:t>Se empieza por extraer solo la parte correspondiente a los datos del archivo excel, para lo cual se ignoran las primeras 9 filas de la hoja.</w:t>
+      </w:r>
+    </w:p>
+    <w:p>
+      <w:pPr>
+        <w:rPr>
+          <w:rFonts w:ascii="Arial" w:hAnsi="Arial" w:cs="Arial"/>
+          <w:lang w:val="es-CO"/>
+        </w:rPr>
+      </w:pPr>
+      <w:r>
+        <w:rPr>
+          <w:rFonts w:ascii="Arial" w:hAnsi="Arial" w:cs="Arial"/>
+          <w:noProof/>
+          <w:lang w:val="es-CO"/>
+        </w:rPr>
+        <w:drawing>
+          <wp:inline distT="0" distB="0" distL="0" distR="0" wp14:anchorId="734D8081" wp14:editId="12254AFA">
+            <wp:extent cx="5612130" cy="2185670"/>
+            <wp:effectExtent l="0" t="0" r="7620" b="5080"/>
+            <wp:docPr id="38" name="Imagen 38"/>
+            <wp:cNvGraphicFramePr>
+              <a:graphicFrameLocks xmlns:a="http://schemas.openxmlformats.org/drawingml/2006/main" noChangeAspect="1"/>
+            </wp:cNvGraphicFramePr>
+            <a:graphic xmlns:a="http://schemas.openxmlformats.org/drawingml/2006/main">
+              <a:graphicData uri="http://schemas.openxmlformats.org/drawingml/2006/picture">
+                <pic:pic xmlns:pic="http://schemas.openxmlformats.org/drawingml/2006/picture">
+                  <pic:nvPicPr>
+                    <pic:cNvPr id="38" name="Imagen 38"/>
+                    <pic:cNvPicPr/>
+                  </pic:nvPicPr>
+                  <pic:blipFill>
+                    <a:blip r:embed="rId49" cstate="print">
+                      <a:extLst>
+                        <a:ext uri="{28A0092B-C50C-407E-A947-70E740481C1C}">
+                          <a14:useLocalDpi xmlns:a14="http://schemas.microsoft.com/office/drawing/2010/main" val="0"/>
+                        </a:ext>
+                      </a:extLst>
+                    </a:blip>
+                    <a:stretch>
+                      <a:fillRect/>
+                    </a:stretch>
+                  </pic:blipFill>
+                  <pic:spPr>
+                    <a:xfrm>
+                      <a:off x="0" y="0"/>
+                      <a:ext cx="5612130" cy="2185670"/>
+                    </a:xfrm>
+                    <a:prstGeom prst="rect">
+                      <a:avLst/>
+                    </a:prstGeom>
+                  </pic:spPr>
+                </pic:pic>
+              </a:graphicData>
+            </a:graphic>
+          </wp:inline>
+        </w:drawing>
+      </w:r>
+    </w:p>
+    <w:p>
+      <w:pPr>
+        <w:rPr>
+          <w:rFonts w:ascii="Arial" w:hAnsi="Arial" w:cs="Arial"/>
+          <w:lang w:val="es-CO"/>
+        </w:rPr>
+      </w:pPr>
+    </w:p>
+    <w:p>
+      <w:pPr>
+        <w:rPr>
+          <w:rFonts w:ascii="Arial" w:hAnsi="Arial" w:cs="Arial"/>
+          <w:lang w:val="es-CO"/>
+        </w:rPr>
+      </w:pPr>
+      <w:r>
+        <w:rPr>
+          <w:rFonts w:ascii="Arial" w:hAnsi="Arial" w:cs="Arial"/>
+          <w:lang w:val="es-CO"/>
+        </w:rPr>
+        <w:t>Filtrado de datos que no son de Viterbo, Caldas</w:t>
+      </w:r>
+    </w:p>
+    <w:p>
+      <w:pPr>
+        <w:rPr>
+          <w:rFonts w:ascii="Arial" w:hAnsi="Arial" w:cs="Arial"/>
+          <w:lang w:val="es-CO"/>
+        </w:rPr>
+      </w:pPr>
+      <w:r>
+        <w:rPr>
+          <w:rFonts w:ascii="Arial" w:hAnsi="Arial" w:cs="Arial"/>
+          <w:lang w:val="es-CO"/>
+        </w:rPr>
+        <w:t>Para esta hoja se decide propagar el valor del identificador del municipio, ‘17877_Viterbo’, y seleccionar solo los registros que lo contengan.</w:t>
+      </w:r>
+    </w:p>
+    <w:p>
+      <w:pPr>
+        <w:rPr>
+          <w:rFonts w:ascii="Arial" w:hAnsi="Arial" w:cs="Arial"/>
+          <w:lang w:val="es-CO"/>
+        </w:rPr>
+      </w:pPr>
+      <w:r>
+        <w:rPr>
+          <w:rFonts w:ascii="Arial" w:hAnsi="Arial" w:cs="Arial"/>
+          <w:noProof/>
+          <w:lang w:val="es-CO"/>
+        </w:rPr>
+        <w:drawing>
+          <wp:inline distT="0" distB="0" distL="0" distR="0" wp14:anchorId="357CC730" wp14:editId="3DE1D877">
+            <wp:extent cx="5612130" cy="876300"/>
+            <wp:effectExtent l="0" t="0" r="7620" b="0"/>
+            <wp:docPr id="39" name="Imagen 39"/>
+            <wp:cNvGraphicFramePr>
+              <a:graphicFrameLocks xmlns:a="http://schemas.openxmlformats.org/drawingml/2006/main" noChangeAspect="1"/>
+            </wp:cNvGraphicFramePr>
+            <a:graphic xmlns:a="http://schemas.openxmlformats.org/drawingml/2006/main">
+              <a:graphicData uri="http://schemas.openxmlformats.org/drawingml/2006/picture">
+                <pic:pic xmlns:pic="http://schemas.openxmlformats.org/drawingml/2006/picture">
+                  <pic:nvPicPr>
+                    <pic:cNvPr id="39" name="Imagen 39"/>
+                    <pic:cNvPicPr/>
+                  </pic:nvPicPr>
+                  <pic:blipFill>
+                    <a:blip r:embed="rId50">
+                      <a:extLst>
+                        <a:ext uri="{28A0092B-C50C-407E-A947-70E740481C1C}">
+                          <a14:useLocalDpi xmlns:a14="http://schemas.microsoft.com/office/drawing/2010/main" val="0"/>
+                        </a:ext>
+                      </a:extLst>
+                    </a:blip>
+                    <a:stretch>
+                      <a:fillRect/>
+                    </a:stretch>
+                  </pic:blipFill>
+                  <pic:spPr>
+                    <a:xfrm>
+                      <a:off x="0" y="0"/>
+                      <a:ext cx="5612130" cy="876300"/>
+                    </a:xfrm>
+                    <a:prstGeom prst="rect">
+                      <a:avLst/>
+                    </a:prstGeom>
+                  </pic:spPr>
+                </pic:pic>
+              </a:graphicData>
+            </a:graphic>
+          </wp:inline>
+        </w:drawing>
+      </w:r>
+    </w:p>
+    <w:p>
+      <w:pPr>
+        <w:rPr>
+          <w:rFonts w:ascii="Arial" w:hAnsi="Arial" w:cs="Arial"/>
+          <w:lang w:val="es-CO"/>
+        </w:rPr>
+      </w:pPr>
+    </w:p>
+    <w:p>
+      <w:pPr>
+        <w:rPr>
+          <w:rFonts w:ascii="Arial" w:hAnsi="Arial" w:cs="Arial"/>
+          <w:lang w:val="es-CO"/>
+        </w:rPr>
+      </w:pPr>
+      <w:r>
+        <w:rPr>
+          <w:rFonts w:ascii="Arial" w:hAnsi="Arial" w:cs="Arial"/>
+          <w:lang w:val="es-CO"/>
+        </w:rPr>
+        <w:lastRenderedPageBreak/>
+        <w:t>Actualización de headers</w:t>
+      </w:r>
+    </w:p>
+    <w:p>
+      <w:pPr>
+        <w:rPr>
+          <w:rFonts w:ascii="Arial" w:hAnsi="Arial" w:cs="Arial"/>
+          <w:lang w:val="es-CO"/>
+        </w:rPr>
+      </w:pPr>
+      <w:r>
+        <w:rPr>
+          <w:rFonts w:ascii="Arial" w:hAnsi="Arial" w:cs="Arial"/>
+          <w:lang w:val="es-CO"/>
+        </w:rPr>
+        <w:t>Al extraer los datos desde el archivo .xlsx, se verifica el dataframe generado por Pandas, empezando por los nombres de las columnas y se observan las siguientes incidencias:</w:t>
+      </w:r>
+    </w:p>
+    <w:p>
+      <w:pPr>
+        <w:pStyle w:val="Prrafodelista"/>
+        <w:numPr>
+          <w:ilvl w:val="0"/>
+          <w:numId w:val="1"/>
+        </w:numPr>
+        <w:rPr>
+          <w:rFonts w:ascii="Arial" w:hAnsi="Arial" w:cs="Arial"/>
+          <w:lang w:val="es-CO"/>
+        </w:rPr>
+      </w:pPr>
+      <w:r>
+        <w:rPr>
+          <w:rFonts w:ascii="Arial" w:hAnsi="Arial" w:cs="Arial"/>
+          <w:lang w:val="es-CO"/>
+        </w:rPr>
+        <w:t>Headers sin nombres descriptivos: headers con nombres por defecto de Pandas tipo ‘Unnamed: X’.</w:t>
+      </w:r>
+    </w:p>
+    <w:p>
+      <w:pPr>
+        <w:pStyle w:val="Prrafodelista"/>
+        <w:numPr>
+          <w:ilvl w:val="0"/>
+          <w:numId w:val="1"/>
+        </w:numPr>
+        <w:rPr>
+          <w:rFonts w:ascii="Arial" w:hAnsi="Arial" w:cs="Arial"/>
+          <w:lang w:val="es-CO"/>
+        </w:rPr>
+      </w:pPr>
+      <w:r>
+        <w:rPr>
+          <w:rFonts w:ascii="Arial" w:hAnsi="Arial" w:cs="Arial"/>
+          <w:lang w:val="es-CO"/>
+        </w:rPr>
+        <w:t>Headers en jerarquías inferiores debido a la agrupación de datos: Los headers se encuentran en la primera fila de datos debido al diseño del .xlsx donde se busca describir la agrupación por Área en la que se tomaron los datos.</w:t>
+      </w:r>
+    </w:p>
+    <w:p>
+      <w:pPr>
+        <w:rPr>
+          <w:rFonts w:ascii="Arial" w:hAnsi="Arial" w:cs="Arial"/>
+          <w:lang w:val="es-CO"/>
+        </w:rPr>
+      </w:pPr>
+      <w:r>
+        <w:rPr>
+          <w:rFonts w:ascii="Arial" w:hAnsi="Arial" w:cs="Arial"/>
+          <w:lang w:val="es-CO"/>
+        </w:rPr>
+        <w:t xml:space="preserve">Debido a la agrupación de datos en las columnas, se divide el dataframe en 3 partes, correspondientes a las áreas, ignorando el total para remover resúmenes de datos en el dataset final. Cada subconjunto se concatena con la columna de Grupo de edad, y se asigna una columna ‘Area’ que contiene el área donde fueron tomados los datos. Luego se reemplazan los nombres de las columnas que todavía tienen un nombre por defecto por los siguientes nombres en su orden correspondiente: </w:t>
+      </w:r>
+    </w:p>
+    <w:p>
+      <w:pPr>
+        <w:pStyle w:val="Prrafodelista"/>
+        <w:numPr>
+          <w:ilvl w:val="0"/>
+          <w:numId w:val="7"/>
+        </w:numPr>
+        <w:rPr>
+          <w:rFonts w:ascii="Arial" w:hAnsi="Arial" w:cs="Arial"/>
+          <w:lang w:val="es-CO"/>
+        </w:rPr>
+      </w:pPr>
+      <w:r>
+        <w:rPr>
+          <w:rFonts w:ascii="Arial" w:hAnsi="Arial" w:cs="Arial"/>
+          <w:lang w:val="es-CO"/>
+        </w:rPr>
+        <w:t>'Indígena',</w:t>
+      </w:r>
+    </w:p>
+    <w:p>
+      <w:pPr>
+        <w:pStyle w:val="Prrafodelista"/>
+        <w:numPr>
+          <w:ilvl w:val="0"/>
+          <w:numId w:val="7"/>
+        </w:numPr>
+        <w:rPr>
+          <w:rFonts w:ascii="Arial" w:hAnsi="Arial" w:cs="Arial"/>
+          <w:lang w:val="es-CO"/>
+        </w:rPr>
+      </w:pPr>
+      <w:r>
+        <w:rPr>
+          <w:rFonts w:ascii="Arial" w:hAnsi="Arial" w:cs="Arial"/>
+          <w:lang w:val="es-CO"/>
+        </w:rPr>
+        <w:t>'Gitano(a) o Rrom',</w:t>
+      </w:r>
+    </w:p>
+    <w:p>
+      <w:pPr>
+        <w:pStyle w:val="Prrafodelista"/>
+        <w:numPr>
+          <w:ilvl w:val="0"/>
+          <w:numId w:val="7"/>
+        </w:numPr>
+        <w:rPr>
+          <w:rFonts w:ascii="Arial" w:hAnsi="Arial" w:cs="Arial"/>
+          <w:lang w:val="es-CO"/>
+        </w:rPr>
+      </w:pPr>
+      <w:r>
+        <w:rPr>
+          <w:rFonts w:ascii="Arial" w:hAnsi="Arial" w:cs="Arial"/>
+          <w:lang w:val="es-CO"/>
+        </w:rPr>
+        <w:t>'Raizal del Archipielago de San Andrés, Providencia y Santa Catalina',</w:t>
+      </w:r>
+    </w:p>
+    <w:p>
+      <w:pPr>
+        <w:pStyle w:val="Prrafodelista"/>
+        <w:numPr>
+          <w:ilvl w:val="0"/>
+          <w:numId w:val="7"/>
+        </w:numPr>
+        <w:rPr>
+          <w:rFonts w:ascii="Arial" w:hAnsi="Arial" w:cs="Arial"/>
+          <w:lang w:val="es-CO"/>
+        </w:rPr>
+      </w:pPr>
+      <w:r>
+        <w:rPr>
+          <w:rFonts w:ascii="Arial" w:hAnsi="Arial" w:cs="Arial"/>
+          <w:lang w:val="es-CO"/>
+        </w:rPr>
+        <w:t>'Palenquero(a) de San Basilio',</w:t>
+      </w:r>
+    </w:p>
+    <w:p>
+      <w:pPr>
+        <w:pStyle w:val="Prrafodelista"/>
+        <w:numPr>
+          <w:ilvl w:val="0"/>
+          <w:numId w:val="7"/>
+        </w:numPr>
+        <w:rPr>
+          <w:rFonts w:ascii="Arial" w:hAnsi="Arial" w:cs="Arial"/>
+          <w:lang w:val="es-CO"/>
+        </w:rPr>
+      </w:pPr>
+      <w:r>
+        <w:rPr>
+          <w:rFonts w:ascii="Arial" w:hAnsi="Arial" w:cs="Arial"/>
+          <w:lang w:val="es-CO"/>
+        </w:rPr>
+        <w:t>'Negro(a), Mulato(a), Afrodescendiente, Afrocolombiano(a)',</w:t>
+      </w:r>
+    </w:p>
+    <w:p>
+      <w:pPr>
+        <w:pStyle w:val="Prrafodelista"/>
+        <w:numPr>
+          <w:ilvl w:val="0"/>
+          <w:numId w:val="7"/>
+        </w:numPr>
+        <w:rPr>
+          <w:rFonts w:ascii="Arial" w:hAnsi="Arial" w:cs="Arial"/>
+          <w:lang w:val="es-CO"/>
+        </w:rPr>
+      </w:pPr>
+      <w:r>
+        <w:rPr>
+          <w:rFonts w:ascii="Arial" w:hAnsi="Arial" w:cs="Arial"/>
+          <w:lang w:val="es-CO"/>
+        </w:rPr>
+        <w:t>'Ningún grupo étnico',</w:t>
+      </w:r>
+    </w:p>
+    <w:p>
+      <w:pPr>
+        <w:pStyle w:val="Prrafodelista"/>
+        <w:numPr>
+          <w:ilvl w:val="0"/>
+          <w:numId w:val="7"/>
+        </w:numPr>
+        <w:rPr>
+          <w:rFonts w:ascii="Arial" w:hAnsi="Arial" w:cs="Arial"/>
+          <w:lang w:val="es-CO"/>
+        </w:rPr>
+      </w:pPr>
+      <w:r>
+        <w:rPr>
+          <w:rFonts w:ascii="Arial" w:hAnsi="Arial" w:cs="Arial"/>
+          <w:lang w:val="es-CO"/>
+        </w:rPr>
+        <w:t>'Sin información'</w:t>
+      </w:r>
+    </w:p>
+    <w:p>
+      <w:pPr>
+        <w:rPr>
+          <w:rFonts w:ascii="Arial" w:hAnsi="Arial" w:cs="Arial"/>
+          <w:lang w:val="es-CO"/>
+        </w:rPr>
+      </w:pPr>
+      <w:r>
+        <w:rPr>
+          <w:rFonts w:ascii="Arial" w:hAnsi="Arial" w:cs="Arial"/>
+          <w:lang w:val="es-CO"/>
+        </w:rPr>
+        <w:t>Después de las modificaciones en cada subconjunto, se consolidan los dataframes en un solo dataframe.</w:t>
+      </w:r>
+    </w:p>
+    <w:p>
+      <w:pPr>
+        <w:rPr>
+          <w:rFonts w:ascii="Arial" w:hAnsi="Arial" w:cs="Arial"/>
+          <w:lang w:val="es-CO"/>
+        </w:rPr>
+      </w:pPr>
+      <w:r>
+        <w:rPr>
+          <w:rFonts w:ascii="Arial" w:hAnsi="Arial" w:cs="Arial"/>
+          <w:noProof/>
+          <w:lang w:val="es-CO"/>
+        </w:rPr>
+        <w:drawing>
+          <wp:inline distT="0" distB="0" distL="0" distR="0" wp14:anchorId="6CF15E61" wp14:editId="19D9ABC3">
+            <wp:extent cx="5612130" cy="1776095"/>
+            <wp:effectExtent l="0" t="0" r="7620" b="0"/>
+            <wp:docPr id="40" name="Imagen 40"/>
+            <wp:cNvGraphicFramePr>
+              <a:graphicFrameLocks xmlns:a="http://schemas.openxmlformats.org/drawingml/2006/main" noChangeAspect="1"/>
+            </wp:cNvGraphicFramePr>
+            <a:graphic xmlns:a="http://schemas.openxmlformats.org/drawingml/2006/main">
+              <a:graphicData uri="http://schemas.openxmlformats.org/drawingml/2006/picture">
+                <pic:pic xmlns:pic="http://schemas.openxmlformats.org/drawingml/2006/picture">
+                  <pic:nvPicPr>
+                    <pic:cNvPr id="40" name="Imagen 40"/>
+                    <pic:cNvPicPr/>
+                  </pic:nvPicPr>
+                  <pic:blipFill>
+                    <a:blip r:embed="rId51">
+                      <a:extLst>
+                        <a:ext uri="{28A0092B-C50C-407E-A947-70E740481C1C}">
+                          <a14:useLocalDpi xmlns:a14="http://schemas.microsoft.com/office/drawing/2010/main" val="0"/>
+                        </a:ext>
+                      </a:extLst>
+                    </a:blip>
+                    <a:stretch>
+                      <a:fillRect/>
+                    </a:stretch>
+                  </pic:blipFill>
+                  <pic:spPr>
+                    <a:xfrm>
+                      <a:off x="0" y="0"/>
+                      <a:ext cx="5612130" cy="1776095"/>
+                    </a:xfrm>
+                    <a:prstGeom prst="rect">
+                      <a:avLst/>
+                    </a:prstGeom>
+                  </pic:spPr>
+                </pic:pic>
+              </a:graphicData>
+            </a:graphic>
+          </wp:inline>
+        </w:drawing>
+      </w:r>
+    </w:p>
+    <w:p>
+      <w:pPr>
+        <w:rPr>
+          <w:rFonts w:ascii="Arial" w:hAnsi="Arial" w:cs="Arial"/>
+          <w:lang w:val="es-CO"/>
+        </w:rPr>
+      </w:pPr>
+    </w:p>
+    <w:p>
+      <w:pPr>
+        <w:rPr>
+          <w:rFonts w:ascii="Arial" w:hAnsi="Arial" w:cs="Arial"/>
+          <w:lang w:val="es-CO"/>
+        </w:rPr>
+      </w:pPr>
+      <w:r>
+        <w:rPr>
+          <w:rFonts w:ascii="Arial" w:hAnsi="Arial" w:cs="Arial"/>
+          <w:lang w:val="es-CO"/>
+        </w:rPr>
+        <w:lastRenderedPageBreak/>
+        <w:t>Se renombran los headers que contienen tildes o ñ.</w:t>
+      </w:r>
+    </w:p>
+    <w:p>
+      <w:pPr>
+        <w:rPr>
+          <w:rFonts w:ascii="Arial" w:hAnsi="Arial" w:cs="Arial"/>
+          <w:lang w:val="es-CO"/>
+        </w:rPr>
+      </w:pPr>
+    </w:p>
+    <w:p>
+      <w:pPr>
+        <w:rPr>
+          <w:rFonts w:ascii="Arial" w:hAnsi="Arial" w:cs="Arial"/>
+          <w:lang w:val="es-CO"/>
+        </w:rPr>
+      </w:pPr>
+      <w:r>
+        <w:rPr>
+          <w:rFonts w:ascii="Arial" w:hAnsi="Arial" w:cs="Arial"/>
+          <w:lang w:val="es-CO"/>
+        </w:rPr>
+        <w:t>Se filtran las filas que contienen resúmenes de datos (Totales).</w:t>
+      </w:r>
+    </w:p>
+    <w:p>
+      <w:pPr>
+        <w:rPr>
+          <w:rFonts w:ascii="Arial" w:hAnsi="Arial" w:cs="Arial"/>
+          <w:lang w:val="es-CO"/>
+        </w:rPr>
+      </w:pPr>
+      <w:r>
+        <w:rPr>
+          <w:rFonts w:ascii="Arial" w:hAnsi="Arial" w:cs="Arial"/>
+          <w:noProof/>
+          <w:lang w:val="es-CO"/>
+        </w:rPr>
+        <w:drawing>
+          <wp:inline distT="0" distB="0" distL="0" distR="0" wp14:anchorId="4CBB5E04" wp14:editId="30DD6240">
+            <wp:extent cx="5612130" cy="1449705"/>
+            <wp:effectExtent l="0" t="0" r="7620" b="0"/>
+            <wp:docPr id="41" name="Imagen 41"/>
+            <wp:cNvGraphicFramePr>
+              <a:graphicFrameLocks xmlns:a="http://schemas.openxmlformats.org/drawingml/2006/main" noChangeAspect="1"/>
+            </wp:cNvGraphicFramePr>
+            <a:graphic xmlns:a="http://schemas.openxmlformats.org/drawingml/2006/main">
+              <a:graphicData uri="http://schemas.openxmlformats.org/drawingml/2006/picture">
+                <pic:pic xmlns:pic="http://schemas.openxmlformats.org/drawingml/2006/picture">
+                  <pic:nvPicPr>
+                    <pic:cNvPr id="41" name="Imagen 41"/>
+                    <pic:cNvPicPr/>
+                  </pic:nvPicPr>
+                  <pic:blipFill>
+                    <a:blip r:embed="rId52">
+                      <a:extLst>
+                        <a:ext uri="{28A0092B-C50C-407E-A947-70E740481C1C}">
+                          <a14:useLocalDpi xmlns:a14="http://schemas.microsoft.com/office/drawing/2010/main" val="0"/>
+                        </a:ext>
+                      </a:extLst>
+                    </a:blip>
+                    <a:stretch>
+                      <a:fillRect/>
+                    </a:stretch>
+                  </pic:blipFill>
+                  <pic:spPr>
+                    <a:xfrm>
+                      <a:off x="0" y="0"/>
+                      <a:ext cx="5612130" cy="1449705"/>
+                    </a:xfrm>
+                    <a:prstGeom prst="rect">
+                      <a:avLst/>
+                    </a:prstGeom>
+                  </pic:spPr>
+                </pic:pic>
+              </a:graphicData>
+            </a:graphic>
+          </wp:inline>
+        </w:drawing>
+      </w:r>
+    </w:p>
+    <w:p>
+      <w:pPr>
+        <w:rPr>
+          <w:rFonts w:ascii="Arial" w:hAnsi="Arial" w:cs="Arial"/>
+          <w:lang w:val="es-CO"/>
+        </w:rPr>
+      </w:pPr>
+    </w:p>
+    <w:p>
+      <w:pPr>
+        <w:rPr>
+          <w:rFonts w:ascii="Arial" w:hAnsi="Arial" w:cs="Arial"/>
+          <w:lang w:val="es-CO"/>
+        </w:rPr>
+      </w:pPr>
+      <w:r>
+        <w:rPr>
+          <w:rFonts w:ascii="Arial" w:hAnsi="Arial" w:cs="Arial"/>
+          <w:lang w:val="es-CO"/>
+        </w:rPr>
+        <w:t>Finalmente, se cambian las tildes de los datos, reemplazando vocales con tilde por vocales sin tilde</w:t>
       </w:r>
       <w:r>
         <w:rPr>
@@ -6982,6 +6069,22 @@
         </w:rPr>
         <w:t>.</w:t>
       </w:r>
+    </w:p>
+    <w:p>
+      <w:pPr>
+        <w:rPr>
+          <w:rFonts w:ascii="Arial" w:hAnsi="Arial" w:cs="Arial"/>
+          <w:lang w:val="es-CO"/>
+        </w:rPr>
+      </w:pPr>
+    </w:p>
+    <w:p>
+      <w:pPr>
+        <w:rPr>
+          <w:rFonts w:ascii="Arial" w:hAnsi="Arial" w:cs="Arial"/>
+          <w:lang w:val="es-CO"/>
+        </w:rPr>
+      </w:pPr>
     </w:p>
     <w:p>
       <w:pPr>

</xml_diff>

<commit_message>
Actualiza la documentacíon de procesamiento de hoja 1PM
</commit_message>
<xml_diff>
--- a/Documentacion/Procesamiento de Datos.docx
+++ b/Documentacion/Procesamiento de Datos.docx
@@ -100,14 +100,7 @@
           <w:rFonts w:ascii="Arial" w:hAnsi="Arial" w:cs="Arial"/>
           <w:lang w:val="es-CO"/>
         </w:rPr>
-        <w:t>2</w:t>
-      </w:r>
-      <w:r>
-        <w:rPr>
-          <w:rFonts w:ascii="Arial" w:hAnsi="Arial" w:cs="Arial"/>
-          <w:lang w:val="es-CO"/>
-        </w:rPr>
-        <w:t>2</w:t>
+        <w:t>27</w:t>
       </w:r>
       <w:r>
         <w:rPr>
@@ -121,7 +114,7 @@
           <w:rFonts w:ascii="Arial" w:hAnsi="Arial" w:cs="Arial"/>
           <w:lang w:val="es-CO"/>
         </w:rPr>
-        <w:t>abril</w:t>
+        <w:t>septiembre</w:t>
       </w:r>
       <w:r>
         <w:rPr>
@@ -1201,127 +1194,14 @@
           <w:lang w:val="es-CO"/>
         </w:rPr>
       </w:pPr>
-      <w:r>
-        <w:rPr>
-          <w:rFonts w:ascii="Arial" w:hAnsi="Arial" w:cs="Arial"/>
-          <w:lang w:val="es-CO"/>
-        </w:rPr>
-        <w:t>A continuación, se eliminan las columnas y filas que contienen resúmenes de datos.</w:t>
-      </w:r>
-    </w:p>
-    <w:p>
-      <w:pPr>
-        <w:rPr>
-          <w:rFonts w:ascii="Arial" w:hAnsi="Arial" w:cs="Arial"/>
-          <w:lang w:val="es-CO"/>
-        </w:rPr>
-      </w:pPr>
-      <w:r>
-        <w:rPr>
-          <w:rFonts w:ascii="Arial" w:hAnsi="Arial" w:cs="Arial"/>
-          <w:noProof/>
-          <w:lang w:val="es-CO"/>
-        </w:rPr>
-        <w:lastRenderedPageBreak/>
-        <w:drawing>
-          <wp:inline distT="0" distB="0" distL="0" distR="0" wp14:anchorId="3A6DAD28" wp14:editId="78AF24C6">
-            <wp:extent cx="5612130" cy="4692650"/>
-            <wp:effectExtent l="0" t="0" r="7620" b="0"/>
-            <wp:docPr id="1" name="Imagen 1"/>
-            <wp:cNvGraphicFramePr>
-              <a:graphicFrameLocks xmlns:a="http://schemas.openxmlformats.org/drawingml/2006/main" noChangeAspect="1"/>
-            </wp:cNvGraphicFramePr>
-            <a:graphic xmlns:a="http://schemas.openxmlformats.org/drawingml/2006/main">
-              <a:graphicData uri="http://schemas.openxmlformats.org/drawingml/2006/picture">
-                <pic:pic xmlns:pic="http://schemas.openxmlformats.org/drawingml/2006/picture">
-                  <pic:nvPicPr>
-                    <pic:cNvPr id="1" name="Imagen 1"/>
-                    <pic:cNvPicPr/>
-                  </pic:nvPicPr>
-                  <pic:blipFill>
-                    <a:blip r:embed="rId12">
-                      <a:extLst>
-                        <a:ext uri="{28A0092B-C50C-407E-A947-70E740481C1C}">
-                          <a14:useLocalDpi xmlns:a14="http://schemas.microsoft.com/office/drawing/2010/main" val="0"/>
-                        </a:ext>
-                      </a:extLst>
-                    </a:blip>
-                    <a:stretch>
-                      <a:fillRect/>
-                    </a:stretch>
-                  </pic:blipFill>
-                  <pic:spPr>
-                    <a:xfrm>
-                      <a:off x="0" y="0"/>
-                      <a:ext cx="5612130" cy="4692650"/>
-                    </a:xfrm>
-                    <a:prstGeom prst="rect">
-                      <a:avLst/>
-                    </a:prstGeom>
-                  </pic:spPr>
-                </pic:pic>
-              </a:graphicData>
-            </a:graphic>
-          </wp:inline>
-        </w:drawing>
-      </w:r>
-    </w:p>
-    <w:p>
-      <w:pPr>
-        <w:rPr>
-          <w:rFonts w:ascii="Arial" w:hAnsi="Arial" w:cs="Arial"/>
-          <w:lang w:val="es-CO"/>
-        </w:rPr>
-      </w:pPr>
-      <w:r>
-        <w:rPr>
-          <w:rFonts w:ascii="Arial" w:hAnsi="Arial" w:cs="Arial"/>
-          <w:noProof/>
-          <w:lang w:val="es-CO"/>
-        </w:rPr>
-        <w:lastRenderedPageBreak/>
-        <w:drawing>
-          <wp:inline distT="0" distB="0" distL="0" distR="0" wp14:anchorId="29CCBB8E" wp14:editId="20AB46BF">
-            <wp:extent cx="5612130" cy="4509135"/>
-            <wp:effectExtent l="0" t="0" r="7620" b="5715"/>
-            <wp:docPr id="2" name="Imagen 2"/>
-            <wp:cNvGraphicFramePr>
-              <a:graphicFrameLocks xmlns:a="http://schemas.openxmlformats.org/drawingml/2006/main" noChangeAspect="1"/>
-            </wp:cNvGraphicFramePr>
-            <a:graphic xmlns:a="http://schemas.openxmlformats.org/drawingml/2006/main">
-              <a:graphicData uri="http://schemas.openxmlformats.org/drawingml/2006/picture">
-                <pic:pic xmlns:pic="http://schemas.openxmlformats.org/drawingml/2006/picture">
-                  <pic:nvPicPr>
-                    <pic:cNvPr id="2" name="Imagen 2"/>
-                    <pic:cNvPicPr/>
-                  </pic:nvPicPr>
-                  <pic:blipFill>
-                    <a:blip r:embed="rId13">
-                      <a:extLst>
-                        <a:ext uri="{28A0092B-C50C-407E-A947-70E740481C1C}">
-                          <a14:useLocalDpi xmlns:a14="http://schemas.microsoft.com/office/drawing/2010/main" val="0"/>
-                        </a:ext>
-                      </a:extLst>
-                    </a:blip>
-                    <a:stretch>
-                      <a:fillRect/>
-                    </a:stretch>
-                  </pic:blipFill>
-                  <pic:spPr>
-                    <a:xfrm>
-                      <a:off x="0" y="0"/>
-                      <a:ext cx="5612130" cy="4509135"/>
-                    </a:xfrm>
-                    <a:prstGeom prst="rect">
-                      <a:avLst/>
-                    </a:prstGeom>
-                  </pic:spPr>
-                </pic:pic>
-              </a:graphicData>
-            </a:graphic>
-          </wp:inline>
-        </w:drawing>
-      </w:r>
+    </w:p>
+    <w:p>
+      <w:pPr>
+        <w:rPr>
+          <w:rFonts w:ascii="Arial" w:hAnsi="Arial" w:cs="Arial"/>
+          <w:lang w:val="es-CO"/>
+        </w:rPr>
+      </w:pPr>
     </w:p>
     <w:p>
       <w:pPr>
@@ -1390,6 +1270,7 @@
           <w:noProof/>
           <w:lang w:val="es-CO"/>
         </w:rPr>
+        <w:lastRenderedPageBreak/>
         <w:drawing>
           <wp:inline distT="0" distB="0" distL="0" distR="0" wp14:anchorId="0FDFEE8F" wp14:editId="5107BD3A">
             <wp:extent cx="5612130" cy="1850390"/>
@@ -1406,7 +1287,7 @@
                     <pic:cNvPicPr/>
                   </pic:nvPicPr>
                   <pic:blipFill>
-                    <a:blip r:embed="rId14" cstate="print">
+                    <a:blip r:embed="rId12" cstate="print">
                       <a:extLst>
                         <a:ext uri="{28A0092B-C50C-407E-A947-70E740481C1C}">
                           <a14:useLocalDpi xmlns:a14="http://schemas.microsoft.com/office/drawing/2010/main" val="0"/>
@@ -1455,7 +1336,6 @@
           <w:rFonts w:ascii="Arial" w:hAnsi="Arial" w:cs="Arial"/>
           <w:lang w:val="es-CO"/>
         </w:rPr>
-        <w:lastRenderedPageBreak/>
         <w:t>Filtrado de datos que no son de Viterbo, Caldas</w:t>
       </w:r>
     </w:p>
@@ -1503,7 +1383,7 @@
                     <pic:cNvPicPr/>
                   </pic:nvPicPr>
                   <pic:blipFill>
-                    <a:blip r:embed="rId15" cstate="print">
+                    <a:blip r:embed="rId13" cstate="print">
                       <a:extLst>
                         <a:ext uri="{28A0092B-C50C-407E-A947-70E740481C1C}">
                           <a14:useLocalDpi xmlns:a14="http://schemas.microsoft.com/office/drawing/2010/main" val="0"/>
@@ -1582,7 +1462,7 @@
                     <pic:cNvPicPr/>
                   </pic:nvPicPr>
                   <pic:blipFill>
-                    <a:blip r:embed="rId16" cstate="print">
+                    <a:blip r:embed="rId14" cstate="print">
                       <a:extLst>
                         <a:ext uri="{28A0092B-C50C-407E-A947-70E740481C1C}">
                           <a14:useLocalDpi xmlns:a14="http://schemas.microsoft.com/office/drawing/2010/main" val="0"/>
@@ -1684,6 +1564,7 @@
           <w:rFonts w:ascii="Arial" w:hAnsi="Arial" w:cs="Arial"/>
           <w:lang w:val="es-CO"/>
         </w:rPr>
+        <w:lastRenderedPageBreak/>
         <w:t>Headers en jerarquías inferiores debido a la agrupación de datos: ‘Hombre’ y ‘Mujer’ se encuentran en la primera fila de datos debido al diseño del .xlsx donde se busca describir la agrupación por Sexo de los datos.</w:t>
       </w:r>
     </w:p>
@@ -1779,7 +1660,6 @@
           <w:rFonts w:ascii="Arial" w:hAnsi="Arial" w:cs="Arial"/>
           <w:lang w:val="es-CO"/>
         </w:rPr>
-        <w:lastRenderedPageBreak/>
         <w:t>Unnamed: 11: Hombre</w:t>
       </w:r>
     </w:p>
@@ -1895,7 +1775,7 @@
                     <pic:cNvPicPr/>
                   </pic:nvPicPr>
                   <pic:blipFill>
-                    <a:blip r:embed="rId17">
+                    <a:blip r:embed="rId15">
                       <a:extLst>
                         <a:ext uri="{28A0092B-C50C-407E-A947-70E740481C1C}">
                           <a14:useLocalDpi xmlns:a14="http://schemas.microsoft.com/office/drawing/2010/main" val="0"/>
@@ -1977,7 +1857,7 @@
                     <pic:cNvPicPr/>
                   </pic:nvPicPr>
                   <pic:blipFill>
-                    <a:blip r:embed="rId18">
+                    <a:blip r:embed="rId16">
                       <a:extLst>
                         <a:ext uri="{28A0092B-C50C-407E-A947-70E740481C1C}">
                           <a14:useLocalDpi xmlns:a14="http://schemas.microsoft.com/office/drawing/2010/main" val="0"/>
@@ -2090,7 +1970,7 @@
                     <pic:cNvPicPr/>
                   </pic:nvPicPr>
                   <pic:blipFill>
-                    <a:blip r:embed="rId19" cstate="print">
+                    <a:blip r:embed="rId17" cstate="print">
                       <a:extLst>
                         <a:ext uri="{28A0092B-C50C-407E-A947-70E740481C1C}">
                           <a14:useLocalDpi xmlns:a14="http://schemas.microsoft.com/office/drawing/2010/main" val="0"/>
@@ -2240,7 +2120,7 @@
                     <pic:cNvPicPr/>
                   </pic:nvPicPr>
                   <pic:blipFill>
-                    <a:blip r:embed="rId20" cstate="print">
+                    <a:blip r:embed="rId18" cstate="print">
                       <a:extLst>
                         <a:ext uri="{28A0092B-C50C-407E-A947-70E740481C1C}">
                           <a14:useLocalDpi xmlns:a14="http://schemas.microsoft.com/office/drawing/2010/main" val="0"/>
@@ -2296,7 +2176,7 @@
                     <pic:cNvPicPr/>
                   </pic:nvPicPr>
                   <pic:blipFill>
-                    <a:blip r:embed="rId21" cstate="print">
+                    <a:blip r:embed="rId19" cstate="print">
                       <a:extLst>
                         <a:ext uri="{28A0092B-C50C-407E-A947-70E740481C1C}">
                           <a14:useLocalDpi xmlns:a14="http://schemas.microsoft.com/office/drawing/2010/main" val="0"/>
@@ -2482,7 +2362,7 @@
                     <pic:cNvPicPr/>
                   </pic:nvPicPr>
                   <pic:blipFill>
-                    <a:blip r:embed="rId22">
+                    <a:blip r:embed="rId20">
                       <a:extLst>
                         <a:ext uri="{28A0092B-C50C-407E-A947-70E740481C1C}">
                           <a14:useLocalDpi xmlns:a14="http://schemas.microsoft.com/office/drawing/2010/main" val="0"/>
@@ -2604,7 +2484,7 @@
                     <pic:cNvPicPr/>
                   </pic:nvPicPr>
                   <pic:blipFill>
-                    <a:blip r:embed="rId23" cstate="print">
+                    <a:blip r:embed="rId21" cstate="print">
                       <a:extLst>
                         <a:ext uri="{28A0092B-C50C-407E-A947-70E740481C1C}">
                           <a14:useLocalDpi xmlns:a14="http://schemas.microsoft.com/office/drawing/2010/main" val="0"/>
@@ -2683,7 +2563,7 @@
                     <pic:cNvPicPr/>
                   </pic:nvPicPr>
                   <pic:blipFill>
-                    <a:blip r:embed="rId24" cstate="print">
+                    <a:blip r:embed="rId22" cstate="print">
                       <a:extLst>
                         <a:ext uri="{28A0092B-C50C-407E-A947-70E740481C1C}">
                           <a14:useLocalDpi xmlns:a14="http://schemas.microsoft.com/office/drawing/2010/main" val="0"/>
@@ -2763,7 +2643,7 @@
                     <pic:cNvPicPr/>
                   </pic:nvPicPr>
                   <pic:blipFill>
-                    <a:blip r:embed="rId25">
+                    <a:blip r:embed="rId23">
                       <a:extLst>
                         <a:ext uri="{28A0092B-C50C-407E-A947-70E740481C1C}">
                           <a14:useLocalDpi xmlns:a14="http://schemas.microsoft.com/office/drawing/2010/main" val="0"/>
@@ -2842,7 +2722,7 @@
                     <pic:cNvPicPr/>
                   </pic:nvPicPr>
                   <pic:blipFill>
-                    <a:blip r:embed="rId26">
+                    <a:blip r:embed="rId24">
                       <a:extLst>
                         <a:ext uri="{28A0092B-C50C-407E-A947-70E740481C1C}">
                           <a14:useLocalDpi xmlns:a14="http://schemas.microsoft.com/office/drawing/2010/main" val="0"/>
@@ -2953,7 +2833,7 @@
                     <pic:cNvPicPr/>
                   </pic:nvPicPr>
                   <pic:blipFill>
-                    <a:blip r:embed="rId27" cstate="print">
+                    <a:blip r:embed="rId25" cstate="print">
                       <a:extLst>
                         <a:ext uri="{28A0092B-C50C-407E-A947-70E740481C1C}">
                           <a14:useLocalDpi xmlns:a14="http://schemas.microsoft.com/office/drawing/2010/main" val="0"/>
@@ -3104,7 +2984,7 @@
                     <pic:cNvPicPr/>
                   </pic:nvPicPr>
                   <pic:blipFill>
-                    <a:blip r:embed="rId28">
+                    <a:blip r:embed="rId26">
                       <a:extLst>
                         <a:ext uri="{28A0092B-C50C-407E-A947-70E740481C1C}">
                           <a14:useLocalDpi xmlns:a14="http://schemas.microsoft.com/office/drawing/2010/main" val="0"/>
@@ -3160,7 +3040,7 @@
                     <pic:cNvPicPr/>
                   </pic:nvPicPr>
                   <pic:blipFill>
-                    <a:blip r:embed="rId29">
+                    <a:blip r:embed="rId27">
                       <a:extLst>
                         <a:ext uri="{28A0092B-C50C-407E-A947-70E740481C1C}">
                           <a14:useLocalDpi xmlns:a14="http://schemas.microsoft.com/office/drawing/2010/main" val="0"/>
@@ -3330,7 +3210,7 @@
                     <pic:cNvPicPr/>
                   </pic:nvPicPr>
                   <pic:blipFill>
-                    <a:blip r:embed="rId30">
+                    <a:blip r:embed="rId28">
                       <a:extLst>
                         <a:ext uri="{28A0092B-C50C-407E-A947-70E740481C1C}">
                           <a14:useLocalDpi xmlns:a14="http://schemas.microsoft.com/office/drawing/2010/main" val="0"/>
@@ -3467,7 +3347,7 @@
                     <pic:cNvPicPr/>
                   </pic:nvPicPr>
                   <pic:blipFill>
-                    <a:blip r:embed="rId31" cstate="print">
+                    <a:blip r:embed="rId29" cstate="print">
                       <a:extLst>
                         <a:ext uri="{28A0092B-C50C-407E-A947-70E740481C1C}">
                           <a14:useLocalDpi xmlns:a14="http://schemas.microsoft.com/office/drawing/2010/main" val="0"/>
@@ -3546,7 +3426,7 @@
                     <pic:cNvPicPr/>
                   </pic:nvPicPr>
                   <pic:blipFill>
-                    <a:blip r:embed="rId32" cstate="print">
+                    <a:blip r:embed="rId30" cstate="print">
                       <a:extLst>
                         <a:ext uri="{28A0092B-C50C-407E-A947-70E740481C1C}">
                           <a14:useLocalDpi xmlns:a14="http://schemas.microsoft.com/office/drawing/2010/main" val="0"/>
@@ -3625,7 +3505,7 @@
                     <pic:cNvPicPr/>
                   </pic:nvPicPr>
                   <pic:blipFill>
-                    <a:blip r:embed="rId33">
+                    <a:blip r:embed="rId31">
                       <a:extLst>
                         <a:ext uri="{28A0092B-C50C-407E-A947-70E740481C1C}">
                           <a14:useLocalDpi xmlns:a14="http://schemas.microsoft.com/office/drawing/2010/main" val="0"/>
@@ -3705,7 +3585,7 @@
                     <pic:cNvPicPr/>
                   </pic:nvPicPr>
                   <pic:blipFill>
-                    <a:blip r:embed="rId34">
+                    <a:blip r:embed="rId32">
                       <a:extLst>
                         <a:ext uri="{28A0092B-C50C-407E-A947-70E740481C1C}">
                           <a14:useLocalDpi xmlns:a14="http://schemas.microsoft.com/office/drawing/2010/main" val="0"/>
@@ -3838,7 +3718,7 @@
                     <pic:cNvPicPr/>
                   </pic:nvPicPr>
                   <pic:blipFill>
-                    <a:blip r:embed="rId35" cstate="print">
+                    <a:blip r:embed="rId33" cstate="print">
                       <a:extLst>
                         <a:ext uri="{28A0092B-C50C-407E-A947-70E740481C1C}">
                           <a14:useLocalDpi xmlns:a14="http://schemas.microsoft.com/office/drawing/2010/main" val="0"/>
@@ -3994,7 +3874,7 @@
                     <pic:cNvPicPr/>
                   </pic:nvPicPr>
                   <pic:blipFill>
-                    <a:blip r:embed="rId36">
+                    <a:blip r:embed="rId34">
                       <a:extLst>
                         <a:ext uri="{28A0092B-C50C-407E-A947-70E740481C1C}">
                           <a14:useLocalDpi xmlns:a14="http://schemas.microsoft.com/office/drawing/2010/main" val="0"/>
@@ -4054,7 +3934,7 @@
                     <pic:cNvPicPr/>
                   </pic:nvPicPr>
                   <pic:blipFill>
-                    <a:blip r:embed="rId37">
+                    <a:blip r:embed="rId35">
                       <a:extLst>
                         <a:ext uri="{28A0092B-C50C-407E-A947-70E740481C1C}">
                           <a14:useLocalDpi xmlns:a14="http://schemas.microsoft.com/office/drawing/2010/main" val="0"/>
@@ -4254,7 +4134,7 @@
                     <pic:cNvPicPr/>
                   </pic:nvPicPr>
                   <pic:blipFill>
-                    <a:blip r:embed="rId38">
+                    <a:blip r:embed="rId36">
                       <a:extLst>
                         <a:ext uri="{28A0092B-C50C-407E-A947-70E740481C1C}">
                           <a14:useLocalDpi xmlns:a14="http://schemas.microsoft.com/office/drawing/2010/main" val="0"/>
@@ -4384,7 +4264,7 @@
                     <pic:cNvPicPr/>
                   </pic:nvPicPr>
                   <pic:blipFill>
-                    <a:blip r:embed="rId39">
+                    <a:blip r:embed="rId37">
                       <a:extLst>
                         <a:ext uri="{28A0092B-C50C-407E-A947-70E740481C1C}">
                           <a14:useLocalDpi xmlns:a14="http://schemas.microsoft.com/office/drawing/2010/main" val="0"/>
@@ -4463,7 +4343,7 @@
                     <pic:cNvPicPr/>
                   </pic:nvPicPr>
                   <pic:blipFill>
-                    <a:blip r:embed="rId40" cstate="print">
+                    <a:blip r:embed="rId38" cstate="print">
                       <a:extLst>
                         <a:ext uri="{28A0092B-C50C-407E-A947-70E740481C1C}">
                           <a14:useLocalDpi xmlns:a14="http://schemas.microsoft.com/office/drawing/2010/main" val="0"/>
@@ -4543,7 +4423,7 @@
                     <pic:cNvPicPr/>
                   </pic:nvPicPr>
                   <pic:blipFill>
-                    <a:blip r:embed="rId41">
+                    <a:blip r:embed="rId39">
                       <a:extLst>
                         <a:ext uri="{28A0092B-C50C-407E-A947-70E740481C1C}">
                           <a14:useLocalDpi xmlns:a14="http://schemas.microsoft.com/office/drawing/2010/main" val="0"/>
@@ -4623,7 +4503,7 @@
                     <pic:cNvPicPr/>
                   </pic:nvPicPr>
                   <pic:blipFill>
-                    <a:blip r:embed="rId42">
+                    <a:blip r:embed="rId40">
                       <a:extLst>
                         <a:ext uri="{28A0092B-C50C-407E-A947-70E740481C1C}">
                           <a14:useLocalDpi xmlns:a14="http://schemas.microsoft.com/office/drawing/2010/main" val="0"/>
@@ -4753,7 +4633,7 @@
                     <pic:cNvPicPr/>
                   </pic:nvPicPr>
                   <pic:blipFill>
-                    <a:blip r:embed="rId43">
+                    <a:blip r:embed="rId41">
                       <a:extLst>
                         <a:ext uri="{28A0092B-C50C-407E-A947-70E740481C1C}">
                           <a14:useLocalDpi xmlns:a14="http://schemas.microsoft.com/office/drawing/2010/main" val="0"/>
@@ -4848,7 +4728,7 @@
                     <pic:cNvPicPr/>
                   </pic:nvPicPr>
                   <pic:blipFill>
-                    <a:blip r:embed="rId44">
+                    <a:blip r:embed="rId42">
                       <a:extLst>
                         <a:ext uri="{28A0092B-C50C-407E-A947-70E740481C1C}">
                           <a14:useLocalDpi xmlns:a14="http://schemas.microsoft.com/office/drawing/2010/main" val="0"/>
@@ -5167,7 +5047,7 @@
                     <pic:cNvPicPr/>
                   </pic:nvPicPr>
                   <pic:blipFill>
-                    <a:blip r:embed="rId45">
+                    <a:blip r:embed="rId43">
                       <a:extLst>
                         <a:ext uri="{28A0092B-C50C-407E-A947-70E740481C1C}">
                           <a14:useLocalDpi xmlns:a14="http://schemas.microsoft.com/office/drawing/2010/main" val="0"/>
@@ -5223,7 +5103,7 @@
                     <pic:cNvPicPr/>
                   </pic:nvPicPr>
                   <pic:blipFill>
-                    <a:blip r:embed="rId46">
+                    <a:blip r:embed="rId44">
                       <a:extLst>
                         <a:ext uri="{28A0092B-C50C-407E-A947-70E740481C1C}">
                           <a14:useLocalDpi xmlns:a14="http://schemas.microsoft.com/office/drawing/2010/main" val="0"/>
@@ -5279,7 +5159,7 @@
                     <pic:cNvPicPr/>
                   </pic:nvPicPr>
                   <pic:blipFill>
-                    <a:blip r:embed="rId47">
+                    <a:blip r:embed="rId45">
                       <a:extLst>
                         <a:ext uri="{28A0092B-C50C-407E-A947-70E740481C1C}">
                           <a14:useLocalDpi xmlns:a14="http://schemas.microsoft.com/office/drawing/2010/main" val="0"/>
@@ -5382,7 +5262,7 @@
                     <pic:cNvPicPr/>
                   </pic:nvPicPr>
                   <pic:blipFill>
-                    <a:blip r:embed="rId48">
+                    <a:blip r:embed="rId46">
                       <a:extLst>
                         <a:ext uri="{28A0092B-C50C-407E-A947-70E740481C1C}">
                           <a14:useLocalDpi xmlns:a14="http://schemas.microsoft.com/office/drawing/2010/main" val="0"/>
@@ -5511,7 +5391,7 @@
                     <pic:cNvPicPr/>
                   </pic:nvPicPr>
                   <pic:blipFill>
-                    <a:blip r:embed="rId49" cstate="print">
+                    <a:blip r:embed="rId47" cstate="print">
                       <a:extLst>
                         <a:ext uri="{28A0092B-C50C-407E-A947-70E740481C1C}">
                           <a14:useLocalDpi xmlns:a14="http://schemas.microsoft.com/office/drawing/2010/main" val="0"/>
@@ -5605,7 +5485,7 @@
                     <pic:cNvPicPr/>
                   </pic:nvPicPr>
                   <pic:blipFill>
-                    <a:blip r:embed="rId50">
+                    <a:blip r:embed="rId48">
                       <a:extLst>
                         <a:ext uri="{28A0092B-C50C-407E-A947-70E740481C1C}">
                           <a14:useLocalDpi xmlns:a14="http://schemas.microsoft.com/office/drawing/2010/main" val="0"/>
@@ -5910,7 +5790,7 @@
                     <pic:cNvPicPr/>
                   </pic:nvPicPr>
                   <pic:blipFill>
-                    <a:blip r:embed="rId51">
+                    <a:blip r:embed="rId49">
                       <a:extLst>
                         <a:ext uri="{28A0092B-C50C-407E-A947-70E740481C1C}">
                           <a14:useLocalDpi xmlns:a14="http://schemas.microsoft.com/office/drawing/2010/main" val="0"/>
@@ -6013,7 +5893,7 @@
                     <pic:cNvPicPr/>
                   </pic:nvPicPr>
                   <pic:blipFill>
-                    <a:blip r:embed="rId52">
+                    <a:blip r:embed="rId50">
                       <a:extLst>
                         <a:ext uri="{28A0092B-C50C-407E-A947-70E740481C1C}">
                           <a14:useLocalDpi xmlns:a14="http://schemas.microsoft.com/office/drawing/2010/main" val="0"/>
@@ -6060,14 +5940,7 @@
           <w:rFonts w:ascii="Arial" w:hAnsi="Arial" w:cs="Arial"/>
           <w:lang w:val="es-CO"/>
         </w:rPr>
-        <w:t>Finalmente, se cambian las tildes de los datos, reemplazando vocales con tilde por vocales sin tilde</w:t>
-      </w:r>
-      <w:r>
-        <w:rPr>
-          <w:rFonts w:ascii="Arial" w:hAnsi="Arial" w:cs="Arial"/>
-          <w:lang w:val="es-CO"/>
-        </w:rPr>
-        <w:t>.</w:t>
+        <w:t>Finalmente, se cambian las tildes de los datos, reemplazando vocales con tilde por vocales sin tilde.</w:t>
       </w:r>
     </w:p>
     <w:p>

</xml_diff>

<commit_message>
Actualiza la documentacion de procesamiento de hoja 4PM
</commit_message>
<xml_diff>
--- a/Documentacion/Procesamiento de Datos.docx
+++ b/Documentacion/Procesamiento de Datos.docx
@@ -4,6 +4,7 @@
   <w:body>
     <w:p>
       <w:pPr>
+        <w:ind w:left="720" w:hanging="720"/>
         <w:rPr>
           <w:rFonts w:ascii="Arial" w:hAnsi="Arial" w:cs="Arial"/>
           <w:b/>
@@ -193,37 +194,126 @@
           <w:rFonts w:ascii="Arial" w:hAnsi="Arial" w:cs="Arial"/>
           <w:lang w:val="es-CO"/>
         </w:rPr>
-        <w:t>Almacenamiento de datos extraídos: .csv</w:t>
-      </w:r>
-    </w:p>
-    <w:p>
-      <w:pPr>
-        <w:rPr>
-          <w:rFonts w:ascii="Arial" w:hAnsi="Arial" w:cs="Arial"/>
-          <w:lang w:val="es-CO"/>
-        </w:rPr>
-      </w:pPr>
-      <w:r>
-        <w:rPr>
-          <w:rFonts w:ascii="Arial" w:hAnsi="Arial" w:cs="Arial"/>
-          <w:lang w:val="es-CO"/>
-        </w:rPr>
-        <w:t>Las fuentes de datos vienen en hojas de excel desde el origen, aunque el proyecto es muy específico sobre el municipio de Viterbo, Caldas y podrían extraerse manualmente a otra hoja de excel y trabajar sobre ellos, se puede construir un flujo de extracción de datos escalable utilizando Python, lo anterior para poder aplicarlo a todo el dataset en un futuro.</w:t>
-      </w:r>
-    </w:p>
-    <w:p>
-      <w:pPr>
-        <w:rPr>
-          <w:rFonts w:ascii="Arial" w:hAnsi="Arial" w:cs="Arial"/>
-          <w:lang w:val="es-CO"/>
-        </w:rPr>
-      </w:pPr>
-      <w:r>
-        <w:rPr>
-          <w:rFonts w:ascii="Arial" w:hAnsi="Arial" w:cs="Arial"/>
-          <w:lang w:val="es-CO"/>
-        </w:rPr>
-        <w:t>Los datos procesados se almacenarán en documentos .csv como datasets definitivos.</w:t>
+        <w:t>Almacenamiento de datos extraídos: .</w:t>
+      </w:r>
+      <w:proofErr w:type="spellStart"/>
+      <w:r>
+        <w:rPr>
+          <w:rFonts w:ascii="Arial" w:hAnsi="Arial" w:cs="Arial"/>
+          <w:lang w:val="es-CO"/>
+        </w:rPr>
+        <w:t>csv</w:t>
+      </w:r>
+      <w:proofErr w:type="spellEnd"/>
+    </w:p>
+    <w:p>
+      <w:pPr>
+        <w:rPr>
+          <w:rFonts w:ascii="Arial" w:hAnsi="Arial" w:cs="Arial"/>
+          <w:lang w:val="es-CO"/>
+        </w:rPr>
+      </w:pPr>
+      <w:r>
+        <w:rPr>
+          <w:rFonts w:ascii="Arial" w:hAnsi="Arial" w:cs="Arial"/>
+          <w:lang w:val="es-CO"/>
+        </w:rPr>
+        <w:t xml:space="preserve">Las fuentes de datos vienen en hojas de </w:t>
+      </w:r>
+      <w:proofErr w:type="spellStart"/>
+      <w:r>
+        <w:rPr>
+          <w:rFonts w:ascii="Arial" w:hAnsi="Arial" w:cs="Arial"/>
+          <w:lang w:val="es-CO"/>
+        </w:rPr>
+        <w:t>excel</w:t>
+      </w:r>
+      <w:proofErr w:type="spellEnd"/>
+      <w:r>
+        <w:rPr>
+          <w:rFonts w:ascii="Arial" w:hAnsi="Arial" w:cs="Arial"/>
+          <w:lang w:val="es-CO"/>
+        </w:rPr>
+        <w:t xml:space="preserve"> desde el origen, aunque el proyecto es muy específico sobre el municipio de Viterbo, Caldas y podrían extraerse manualmente a otra hoja de </w:t>
+      </w:r>
+      <w:proofErr w:type="spellStart"/>
+      <w:r>
+        <w:rPr>
+          <w:rFonts w:ascii="Arial" w:hAnsi="Arial" w:cs="Arial"/>
+          <w:lang w:val="es-CO"/>
+        </w:rPr>
+        <w:t>excel</w:t>
+      </w:r>
+      <w:proofErr w:type="spellEnd"/>
+      <w:r>
+        <w:rPr>
+          <w:rFonts w:ascii="Arial" w:hAnsi="Arial" w:cs="Arial"/>
+          <w:lang w:val="es-CO"/>
+        </w:rPr>
+        <w:t xml:space="preserve"> y trabajar sobre ellos, se puede construir un flujo de extracción de datos escalable utilizando Python, lo anterior para poder aplicarlo a todo el </w:t>
+      </w:r>
+      <w:proofErr w:type="spellStart"/>
+      <w:r>
+        <w:rPr>
+          <w:rFonts w:ascii="Arial" w:hAnsi="Arial" w:cs="Arial"/>
+          <w:lang w:val="es-CO"/>
+        </w:rPr>
+        <w:t>dataset</w:t>
+      </w:r>
+      <w:proofErr w:type="spellEnd"/>
+      <w:r>
+        <w:rPr>
+          <w:rFonts w:ascii="Arial" w:hAnsi="Arial" w:cs="Arial"/>
+          <w:lang w:val="es-CO"/>
+        </w:rPr>
+        <w:t xml:space="preserve"> en un futuro.</w:t>
+      </w:r>
+    </w:p>
+    <w:p>
+      <w:pPr>
+        <w:rPr>
+          <w:rFonts w:ascii="Arial" w:hAnsi="Arial" w:cs="Arial"/>
+          <w:lang w:val="es-CO"/>
+        </w:rPr>
+      </w:pPr>
+      <w:r>
+        <w:rPr>
+          <w:rFonts w:ascii="Arial" w:hAnsi="Arial" w:cs="Arial"/>
+          <w:lang w:val="es-CO"/>
+        </w:rPr>
+        <w:t>Los datos procesados se almacenarán en documentos .</w:t>
+      </w:r>
+      <w:proofErr w:type="spellStart"/>
+      <w:r>
+        <w:rPr>
+          <w:rFonts w:ascii="Arial" w:hAnsi="Arial" w:cs="Arial"/>
+          <w:lang w:val="es-CO"/>
+        </w:rPr>
+        <w:t>csv</w:t>
+      </w:r>
+      <w:proofErr w:type="spellEnd"/>
+      <w:r>
+        <w:rPr>
+          <w:rFonts w:ascii="Arial" w:hAnsi="Arial" w:cs="Arial"/>
+          <w:lang w:val="es-CO"/>
+        </w:rPr>
+        <w:t xml:space="preserve"> como </w:t>
+      </w:r>
+      <w:proofErr w:type="spellStart"/>
+      <w:r>
+        <w:rPr>
+          <w:rFonts w:ascii="Arial" w:hAnsi="Arial" w:cs="Arial"/>
+          <w:lang w:val="es-CO"/>
+        </w:rPr>
+        <w:t>datasets</w:t>
+      </w:r>
+      <w:proofErr w:type="spellEnd"/>
+      <w:r>
+        <w:rPr>
+          <w:rFonts w:ascii="Arial" w:hAnsi="Arial" w:cs="Arial"/>
+          <w:lang w:val="es-CO"/>
+        </w:rPr>
+        <w:t xml:space="preserve"> definitivos.</w:t>
       </w:r>
     </w:p>
     <w:p>
@@ -263,7 +353,7 @@
                     <pic:cNvPicPr/>
                   </pic:nvPicPr>
                   <pic:blipFill>
-                    <a:blip r:embed="rId5">
+                    <a:blip r:embed="rId6">
                       <a:extLst>
                         <a:ext uri="{28A0092B-C50C-407E-A947-70E740481C1C}">
                           <a14:useLocalDpi xmlns:a14="http://schemas.microsoft.com/office/drawing/2010/main" val="0"/>
@@ -389,7 +479,23 @@
           <w:rFonts w:ascii="Arial" w:hAnsi="Arial" w:cs="Arial"/>
           <w:lang w:val="es-CO"/>
         </w:rPr>
-        <w:t>Se empieza por extraer solo la parte correspondiente a los datos del archivo excel, para lo cual se ignoran las primeras 9 filas de la hoja</w:t>
+        <w:t xml:space="preserve">Se empieza por extraer solo la parte correspondiente a los datos del archivo </w:t>
+      </w:r>
+      <w:proofErr w:type="spellStart"/>
+      <w:r>
+        <w:rPr>
+          <w:rFonts w:ascii="Arial" w:hAnsi="Arial" w:cs="Arial"/>
+          <w:lang w:val="es-CO"/>
+        </w:rPr>
+        <w:t>excel</w:t>
+      </w:r>
+      <w:proofErr w:type="spellEnd"/>
+      <w:r>
+        <w:rPr>
+          <w:rFonts w:ascii="Arial" w:hAnsi="Arial" w:cs="Arial"/>
+          <w:lang w:val="es-CO"/>
+        </w:rPr>
+        <w:t>, para lo cual se ignoran las primeras 9 filas de la hoja</w:t>
       </w:r>
     </w:p>
     <w:p>
@@ -422,7 +528,7 @@
                     <pic:cNvPicPr/>
                   </pic:nvPicPr>
                   <pic:blipFill>
-                    <a:blip r:embed="rId6">
+                    <a:blip r:embed="rId7">
                       <a:extLst>
                         <a:ext uri="{28A0092B-C50C-407E-A947-70E740481C1C}">
                           <a14:useLocalDpi xmlns:a14="http://schemas.microsoft.com/office/drawing/2010/main" val="0"/>
@@ -469,22 +575,47 @@
           <w:rFonts w:ascii="Arial" w:hAnsi="Arial" w:cs="Arial"/>
           <w:lang w:val="es-CO"/>
         </w:rPr>
-        <w:t>Actualización de headers</w:t>
-      </w:r>
-    </w:p>
-    <w:p>
-      <w:pPr>
-        <w:rPr>
-          <w:rFonts w:ascii="Arial" w:hAnsi="Arial" w:cs="Arial"/>
-          <w:lang w:val="es-CO"/>
-        </w:rPr>
-      </w:pPr>
-      <w:r>
-        <w:rPr>
-          <w:rFonts w:ascii="Arial" w:hAnsi="Arial" w:cs="Arial"/>
-          <w:lang w:val="es-CO"/>
-        </w:rPr>
-        <w:t>Al extraer los datos desde el archivo .xlsx, se verifica el dataframe generado por Pandas, empezando por los nombres de las columnas y se observan las siguientes incidencias:</w:t>
+        <w:t xml:space="preserve">Actualización de </w:t>
+      </w:r>
+      <w:proofErr w:type="spellStart"/>
+      <w:r>
+        <w:rPr>
+          <w:rFonts w:ascii="Arial" w:hAnsi="Arial" w:cs="Arial"/>
+          <w:lang w:val="es-CO"/>
+        </w:rPr>
+        <w:t>headers</w:t>
+      </w:r>
+      <w:proofErr w:type="spellEnd"/>
+    </w:p>
+    <w:p>
+      <w:pPr>
+        <w:rPr>
+          <w:rFonts w:ascii="Arial" w:hAnsi="Arial" w:cs="Arial"/>
+          <w:lang w:val="es-CO"/>
+        </w:rPr>
+      </w:pPr>
+      <w:r>
+        <w:rPr>
+          <w:rFonts w:ascii="Arial" w:hAnsi="Arial" w:cs="Arial"/>
+          <w:lang w:val="es-CO"/>
+        </w:rPr>
+        <w:t xml:space="preserve">Al extraer los datos desde el archivo .xlsx, se verifica el </w:t>
+      </w:r>
+      <w:proofErr w:type="spellStart"/>
+      <w:r>
+        <w:rPr>
+          <w:rFonts w:ascii="Arial" w:hAnsi="Arial" w:cs="Arial"/>
+          <w:lang w:val="es-CO"/>
+        </w:rPr>
+        <w:t>dataframe</w:t>
+      </w:r>
+      <w:proofErr w:type="spellEnd"/>
+      <w:r>
+        <w:rPr>
+          <w:rFonts w:ascii="Arial" w:hAnsi="Arial" w:cs="Arial"/>
+          <w:lang w:val="es-CO"/>
+        </w:rPr>
+        <w:t xml:space="preserve"> generado por Pandas, empezando por los nombres de las columnas y se observan las siguientes incidencias:</w:t>
       </w:r>
     </w:p>
     <w:p>
@@ -499,12 +630,53 @@
           <w:lang w:val="es-CO"/>
         </w:rPr>
       </w:pPr>
-      <w:r>
-        <w:rPr>
-          <w:rFonts w:ascii="Arial" w:hAnsi="Arial" w:cs="Arial"/>
-          <w:lang w:val="es-CO"/>
-        </w:rPr>
-        <w:t>Headers sin nombres descriptivos: headers con nombres por defecto de Pandas tipo ‘Unnamed: X’.</w:t>
+      <w:proofErr w:type="spellStart"/>
+      <w:r>
+        <w:rPr>
+          <w:rFonts w:ascii="Arial" w:hAnsi="Arial" w:cs="Arial"/>
+          <w:lang w:val="es-CO"/>
+        </w:rPr>
+        <w:t>Headers</w:t>
+      </w:r>
+      <w:proofErr w:type="spellEnd"/>
+      <w:r>
+        <w:rPr>
+          <w:rFonts w:ascii="Arial" w:hAnsi="Arial" w:cs="Arial"/>
+          <w:lang w:val="es-CO"/>
+        </w:rPr>
+        <w:t xml:space="preserve"> sin nombres descriptivos: </w:t>
+      </w:r>
+      <w:proofErr w:type="spellStart"/>
+      <w:r>
+        <w:rPr>
+          <w:rFonts w:ascii="Arial" w:hAnsi="Arial" w:cs="Arial"/>
+          <w:lang w:val="es-CO"/>
+        </w:rPr>
+        <w:t>headers</w:t>
+      </w:r>
+      <w:proofErr w:type="spellEnd"/>
+      <w:r>
+        <w:rPr>
+          <w:rFonts w:ascii="Arial" w:hAnsi="Arial" w:cs="Arial"/>
+          <w:lang w:val="es-CO"/>
+        </w:rPr>
+        <w:t xml:space="preserve"> con nombres por defecto de Pandas tipo ‘</w:t>
+      </w:r>
+      <w:proofErr w:type="spellStart"/>
+      <w:r>
+        <w:rPr>
+          <w:rFonts w:ascii="Arial" w:hAnsi="Arial" w:cs="Arial"/>
+          <w:lang w:val="es-CO"/>
+        </w:rPr>
+        <w:t>Unnamed</w:t>
+      </w:r>
+      <w:proofErr w:type="spellEnd"/>
+      <w:r>
+        <w:rPr>
+          <w:rFonts w:ascii="Arial" w:hAnsi="Arial" w:cs="Arial"/>
+          <w:lang w:val="es-CO"/>
+        </w:rPr>
+        <w:t>: X’.</w:t>
       </w:r>
     </w:p>
     <w:p>
@@ -519,12 +691,21 @@
           <w:lang w:val="es-CO"/>
         </w:rPr>
       </w:pPr>
-      <w:r>
-        <w:rPr>
-          <w:rFonts w:ascii="Arial" w:hAnsi="Arial" w:cs="Arial"/>
-          <w:lang w:val="es-CO"/>
-        </w:rPr>
-        <w:t>Headers en jerarquías inferiores debido a la agrupación de datos: ‘Hombre’ y ‘Mujer’ se encuentran en la primera fila de datos debido al diseño del .xlsx donde se busca describir la agrupación por Sexo de los datos.</w:t>
+      <w:proofErr w:type="spellStart"/>
+      <w:r>
+        <w:rPr>
+          <w:rFonts w:ascii="Arial" w:hAnsi="Arial" w:cs="Arial"/>
+          <w:lang w:val="es-CO"/>
+        </w:rPr>
+        <w:t>Headers</w:t>
+      </w:r>
+      <w:proofErr w:type="spellEnd"/>
+      <w:r>
+        <w:rPr>
+          <w:rFonts w:ascii="Arial" w:hAnsi="Arial" w:cs="Arial"/>
+          <w:lang w:val="es-CO"/>
+        </w:rPr>
+        <w:t xml:space="preserve"> en jerarquías inferiores debido a la agrupación de datos: ‘Hombre’ y ‘Mujer’ se encuentran en la primera fila de datos debido al diseño del .xlsx donde se busca describir la agrupación por Sexo de los datos.</w:t>
       </w:r>
     </w:p>
     <w:p>
@@ -544,7 +725,39 @@
           <w:rFonts w:ascii="Arial" w:hAnsi="Arial" w:cs="Arial"/>
           <w:lang w:val="es-CO"/>
         </w:rPr>
-        <w:t>Tildes: Se tienen headers con tildes como ‘Índice de masculinidad’ e ‘Índice de feminidad’, las tildes es mejor evitarlas para evitar errores de charset de las herramientas utilizadas.</w:t>
+        <w:t xml:space="preserve">Tildes: Se tienen </w:t>
+      </w:r>
+      <w:proofErr w:type="spellStart"/>
+      <w:r>
+        <w:rPr>
+          <w:rFonts w:ascii="Arial" w:hAnsi="Arial" w:cs="Arial"/>
+          <w:lang w:val="es-CO"/>
+        </w:rPr>
+        <w:t>headers</w:t>
+      </w:r>
+      <w:proofErr w:type="spellEnd"/>
+      <w:r>
+        <w:rPr>
+          <w:rFonts w:ascii="Arial" w:hAnsi="Arial" w:cs="Arial"/>
+          <w:lang w:val="es-CO"/>
+        </w:rPr>
+        <w:t xml:space="preserve"> con tildes como ‘Índice de masculinidad’ e ‘Índice de feminidad’, las tildes es mejor evitarlas para evitar errores de </w:t>
+      </w:r>
+      <w:proofErr w:type="spellStart"/>
+      <w:r>
+        <w:rPr>
+          <w:rFonts w:ascii="Arial" w:hAnsi="Arial" w:cs="Arial"/>
+          <w:lang w:val="es-CO"/>
+        </w:rPr>
+        <w:t>charset</w:t>
+      </w:r>
+      <w:proofErr w:type="spellEnd"/>
+      <w:r>
+        <w:rPr>
+          <w:rFonts w:ascii="Arial" w:hAnsi="Arial" w:cs="Arial"/>
+          <w:lang w:val="es-CO"/>
+        </w:rPr>
+        <w:t xml:space="preserve"> de las herramientas utilizadas.</w:t>
       </w:r>
     </w:p>
     <w:p>
@@ -576,7 +789,7 @@
                     <pic:cNvPicPr/>
                   </pic:nvPicPr>
                   <pic:blipFill>
-                    <a:blip r:embed="rId7" cstate="print">
+                    <a:blip r:embed="rId8" cstate="print">
                       <a:extLst>
                         <a:ext uri="{28A0092B-C50C-407E-A947-70E740481C1C}">
                           <a14:useLocalDpi xmlns:a14="http://schemas.microsoft.com/office/drawing/2010/main" val="0"/>
@@ -638,14 +851,32 @@
           <w:lang w:val="es-CO"/>
         </w:rPr>
       </w:pPr>
+      <w:proofErr w:type="spellStart"/>
       <w:r>
         <w:rPr>
           <w:rFonts w:ascii="Arial" w:hAnsi="Arial" w:cs="Arial"/>
           <w:lang w:val="es-CO"/>
         </w:rPr>
         <w:lastRenderedPageBreak/>
-        <w:t>Unnamed: 2: Area</w:t>
-      </w:r>
+        <w:t>Unnamed</w:t>
+      </w:r>
+      <w:proofErr w:type="spellEnd"/>
+      <w:r>
+        <w:rPr>
+          <w:rFonts w:ascii="Arial" w:hAnsi="Arial" w:cs="Arial"/>
+          <w:lang w:val="es-CO"/>
+        </w:rPr>
+        <w:t xml:space="preserve">: 2: </w:t>
+      </w:r>
+      <w:proofErr w:type="spellStart"/>
+      <w:r>
+        <w:rPr>
+          <w:rFonts w:ascii="Arial" w:hAnsi="Arial" w:cs="Arial"/>
+          <w:lang w:val="es-CO"/>
+        </w:rPr>
+        <w:t>Area</w:t>
+      </w:r>
+      <w:proofErr w:type="spellEnd"/>
     </w:p>
     <w:p>
       <w:pPr>
@@ -659,12 +890,21 @@
           <w:lang w:val="es-CO"/>
         </w:rPr>
       </w:pPr>
-      <w:r>
-        <w:rPr>
-          <w:rFonts w:ascii="Arial" w:hAnsi="Arial" w:cs="Arial"/>
-          <w:lang w:val="es-CO"/>
-        </w:rPr>
-        <w:t>Unnamed: 3: Grupo de edad</w:t>
+      <w:proofErr w:type="spellStart"/>
+      <w:r>
+        <w:rPr>
+          <w:rFonts w:ascii="Arial" w:hAnsi="Arial" w:cs="Arial"/>
+          <w:lang w:val="es-CO"/>
+        </w:rPr>
+        <w:t>Unnamed</w:t>
+      </w:r>
+      <w:proofErr w:type="spellEnd"/>
+      <w:r>
+        <w:rPr>
+          <w:rFonts w:ascii="Arial" w:hAnsi="Arial" w:cs="Arial"/>
+          <w:lang w:val="es-CO"/>
+        </w:rPr>
+        <w:t>: 3: Grupo de edad</w:t>
       </w:r>
     </w:p>
     <w:p>
@@ -699,12 +939,21 @@
           <w:lang w:val="es-CO"/>
         </w:rPr>
       </w:pPr>
-      <w:r>
-        <w:rPr>
-          <w:rFonts w:ascii="Arial" w:hAnsi="Arial" w:cs="Arial"/>
-          <w:lang w:val="es-CO"/>
-        </w:rPr>
-        <w:t>Unnamed 6: Mujer</w:t>
+      <w:proofErr w:type="spellStart"/>
+      <w:r>
+        <w:rPr>
+          <w:rFonts w:ascii="Arial" w:hAnsi="Arial" w:cs="Arial"/>
+          <w:lang w:val="es-CO"/>
+        </w:rPr>
+        <w:t>Unnamed</w:t>
+      </w:r>
+      <w:proofErr w:type="spellEnd"/>
+      <w:r>
+        <w:rPr>
+          <w:rFonts w:ascii="Arial" w:hAnsi="Arial" w:cs="Arial"/>
+          <w:lang w:val="es-CO"/>
+        </w:rPr>
+        <w:t xml:space="preserve"> 6: Mujer</w:t>
       </w:r>
     </w:p>
     <w:p>
@@ -724,7 +973,23 @@
           <w:rFonts w:ascii="Arial" w:hAnsi="Arial" w:cs="Arial"/>
           <w:lang w:val="es-CO"/>
         </w:rPr>
-        <w:t>Índice de masculinidad: Indice de masculinidad</w:t>
+        <w:t xml:space="preserve">Índice de masculinidad: </w:t>
+      </w:r>
+      <w:proofErr w:type="spellStart"/>
+      <w:r>
+        <w:rPr>
+          <w:rFonts w:ascii="Arial" w:hAnsi="Arial" w:cs="Arial"/>
+          <w:lang w:val="es-CO"/>
+        </w:rPr>
+        <w:t>Indice</w:t>
+      </w:r>
+      <w:proofErr w:type="spellEnd"/>
+      <w:r>
+        <w:rPr>
+          <w:rFonts w:ascii="Arial" w:hAnsi="Arial" w:cs="Arial"/>
+          <w:lang w:val="es-CO"/>
+        </w:rPr>
+        <w:t xml:space="preserve"> de masculinidad</w:t>
       </w:r>
     </w:p>
     <w:p>
@@ -744,7 +1009,23 @@
           <w:rFonts w:ascii="Arial" w:hAnsi="Arial" w:cs="Arial"/>
           <w:lang w:val="es-CO"/>
         </w:rPr>
-        <w:t>Índice de feminidad: Indice de feminidad</w:t>
+        <w:t xml:space="preserve">Índice de feminidad: </w:t>
+      </w:r>
+      <w:proofErr w:type="spellStart"/>
+      <w:r>
+        <w:rPr>
+          <w:rFonts w:ascii="Arial" w:hAnsi="Arial" w:cs="Arial"/>
+          <w:lang w:val="es-CO"/>
+        </w:rPr>
+        <w:t>Indice</w:t>
+      </w:r>
+      <w:proofErr w:type="spellEnd"/>
+      <w:r>
+        <w:rPr>
+          <w:rFonts w:ascii="Arial" w:hAnsi="Arial" w:cs="Arial"/>
+          <w:lang w:val="es-CO"/>
+        </w:rPr>
+        <w:t xml:space="preserve"> de feminidad</w:t>
       </w:r>
     </w:p>
     <w:p>
@@ -776,7 +1057,7 @@
                     <pic:cNvPicPr/>
                   </pic:nvPicPr>
                   <pic:blipFill>
-                    <a:blip r:embed="rId8">
+                    <a:blip r:embed="rId9">
                       <a:extLst>
                         <a:ext uri="{28A0092B-C50C-407E-A947-70E740481C1C}">
                           <a14:useLocalDpi xmlns:a14="http://schemas.microsoft.com/office/drawing/2010/main" val="0"/>
@@ -845,7 +1126,23 @@
           <w:rFonts w:ascii="Arial" w:hAnsi="Arial" w:cs="Arial"/>
           <w:lang w:val="es-CO"/>
         </w:rPr>
-        <w:t>Se evidencian dos columnas sin datos o con datos irrelevantes para el dataset que pueden ser eliminadas:</w:t>
+        <w:t xml:space="preserve">Se evidencian dos columnas sin datos o con datos irrelevantes para el </w:t>
+      </w:r>
+      <w:proofErr w:type="spellStart"/>
+      <w:r>
+        <w:rPr>
+          <w:rFonts w:ascii="Arial" w:hAnsi="Arial" w:cs="Arial"/>
+          <w:lang w:val="es-CO"/>
+        </w:rPr>
+        <w:t>dataset</w:t>
+      </w:r>
+      <w:proofErr w:type="spellEnd"/>
+      <w:r>
+        <w:rPr>
+          <w:rFonts w:ascii="Arial" w:hAnsi="Arial" w:cs="Arial"/>
+          <w:lang w:val="es-CO"/>
+        </w:rPr>
+        <w:t xml:space="preserve"> que pueden ser eliminadas:</w:t>
       </w:r>
     </w:p>
     <w:p>
@@ -887,12 +1184,21 @@
           <w:lang w:val="es-CO"/>
         </w:rPr>
       </w:pPr>
-      <w:r>
-        <w:rPr>
-          <w:rFonts w:ascii="Arial" w:hAnsi="Arial" w:cs="Arial"/>
-          <w:lang w:val="es-CO"/>
-        </w:rPr>
-        <w:t>Unnamed: 1: Contiene el municipio, para este caso particular es irrelevante porque solo se tratarán datos del municipio de Viterbo, Caldas, pero se tendrá en cuenta para un futuro proyecto que involucre múltiples municipios al mismo tiempo.</w:t>
+      <w:proofErr w:type="spellStart"/>
+      <w:r>
+        <w:rPr>
+          <w:rFonts w:ascii="Arial" w:hAnsi="Arial" w:cs="Arial"/>
+          <w:lang w:val="es-CO"/>
+        </w:rPr>
+        <w:t>Unnamed</w:t>
+      </w:r>
+      <w:proofErr w:type="spellEnd"/>
+      <w:r>
+        <w:rPr>
+          <w:rFonts w:ascii="Arial" w:hAnsi="Arial" w:cs="Arial"/>
+          <w:lang w:val="es-CO"/>
+        </w:rPr>
+        <w:t>: 1: Contiene el municipio, para este caso particular es irrelevante porque solo se tratarán datos del municipio de Viterbo, Caldas, pero se tendrá en cuenta para un futuro proyecto que involucre múltiples municipios al mismo tiempo.</w:t>
       </w:r>
     </w:p>
     <w:p>
@@ -924,7 +1230,7 @@
                     <pic:cNvPicPr/>
                   </pic:nvPicPr>
                   <pic:blipFill>
-                    <a:blip r:embed="rId9">
+                    <a:blip r:embed="rId10">
                       <a:extLst>
                         <a:ext uri="{28A0092B-C50C-407E-A947-70E740481C1C}">
                           <a14:useLocalDpi xmlns:a14="http://schemas.microsoft.com/office/drawing/2010/main" val="0"/>
@@ -1026,22 +1332,95 @@
           <w:rFonts w:ascii="Arial" w:hAnsi="Arial" w:cs="Arial"/>
           <w:lang w:val="es-CO"/>
         </w:rPr>
-        <w:t>Tratamiento de valores Nulos, en blanco o NaN</w:t>
-      </w:r>
-    </w:p>
-    <w:p>
-      <w:pPr>
-        <w:rPr>
-          <w:rFonts w:ascii="Arial" w:hAnsi="Arial" w:cs="Arial"/>
-          <w:lang w:val="es-CO"/>
-        </w:rPr>
-      </w:pPr>
-      <w:r>
-        <w:rPr>
-          <w:rFonts w:ascii="Arial" w:hAnsi="Arial" w:cs="Arial"/>
-          <w:lang w:val="es-CO"/>
-        </w:rPr>
-        <w:t>La única columna con valores NaN es la columna ‘Area’, la cual indica el área de recolección de datos en el municipio, Totales, cabecera municipal, centros poblados, zonas rurales dispersas, la presencia de valores NaN se debe a la agrupación realizada en el diseño del .xlsx, el enfoque para resolver esta inconsistencia será propagar el primer valor válido hasta el siguiente valor válido y repetir hasta reemplazar todos los valores NaN.</w:t>
+        <w:t xml:space="preserve">Tratamiento de valores Nulos, en blanco o </w:t>
+      </w:r>
+      <w:proofErr w:type="spellStart"/>
+      <w:r>
+        <w:rPr>
+          <w:rFonts w:ascii="Arial" w:hAnsi="Arial" w:cs="Arial"/>
+          <w:lang w:val="es-CO"/>
+        </w:rPr>
+        <w:t>NaN</w:t>
+      </w:r>
+      <w:proofErr w:type="spellEnd"/>
+    </w:p>
+    <w:p>
+      <w:pPr>
+        <w:rPr>
+          <w:rFonts w:ascii="Arial" w:hAnsi="Arial" w:cs="Arial"/>
+          <w:lang w:val="es-CO"/>
+        </w:rPr>
+      </w:pPr>
+      <w:r>
+        <w:rPr>
+          <w:rFonts w:ascii="Arial" w:hAnsi="Arial" w:cs="Arial"/>
+          <w:lang w:val="es-CO"/>
+        </w:rPr>
+        <w:t xml:space="preserve">La única columna con valores </w:t>
+      </w:r>
+      <w:proofErr w:type="spellStart"/>
+      <w:r>
+        <w:rPr>
+          <w:rFonts w:ascii="Arial" w:hAnsi="Arial" w:cs="Arial"/>
+          <w:lang w:val="es-CO"/>
+        </w:rPr>
+        <w:t>NaN</w:t>
+      </w:r>
+      <w:proofErr w:type="spellEnd"/>
+      <w:r>
+        <w:rPr>
+          <w:rFonts w:ascii="Arial" w:hAnsi="Arial" w:cs="Arial"/>
+          <w:lang w:val="es-CO"/>
+        </w:rPr>
+        <w:t xml:space="preserve"> es la columna ‘</w:t>
+      </w:r>
+      <w:proofErr w:type="spellStart"/>
+      <w:r>
+        <w:rPr>
+          <w:rFonts w:ascii="Arial" w:hAnsi="Arial" w:cs="Arial"/>
+          <w:lang w:val="es-CO"/>
+        </w:rPr>
+        <w:t>Area</w:t>
+      </w:r>
+      <w:proofErr w:type="spellEnd"/>
+      <w:r>
+        <w:rPr>
+          <w:rFonts w:ascii="Arial" w:hAnsi="Arial" w:cs="Arial"/>
+          <w:lang w:val="es-CO"/>
+        </w:rPr>
+        <w:t xml:space="preserve">’, la cual indica el área de recolección de datos en el municipio, Totales, cabecera municipal, centros poblados, zonas rurales dispersas, la presencia de valores </w:t>
+      </w:r>
+      <w:proofErr w:type="spellStart"/>
+      <w:r>
+        <w:rPr>
+          <w:rFonts w:ascii="Arial" w:hAnsi="Arial" w:cs="Arial"/>
+          <w:lang w:val="es-CO"/>
+        </w:rPr>
+        <w:t>NaN</w:t>
+      </w:r>
+      <w:proofErr w:type="spellEnd"/>
+      <w:r>
+        <w:rPr>
+          <w:rFonts w:ascii="Arial" w:hAnsi="Arial" w:cs="Arial"/>
+          <w:lang w:val="es-CO"/>
+        </w:rPr>
+        <w:t xml:space="preserve"> se debe a la agrupación realizada en el diseño del .xlsx, el enfoque para resolver esta inconsistencia será propagar el primer valor válido hasta el siguiente valor válido y repetir hasta reemplazar todos los valores </w:t>
+      </w:r>
+      <w:proofErr w:type="spellStart"/>
+      <w:r>
+        <w:rPr>
+          <w:rFonts w:ascii="Arial" w:hAnsi="Arial" w:cs="Arial"/>
+          <w:lang w:val="es-CO"/>
+        </w:rPr>
+        <w:t>NaN</w:t>
+      </w:r>
+      <w:proofErr w:type="spellEnd"/>
+      <w:r>
+        <w:rPr>
+          <w:rFonts w:ascii="Arial" w:hAnsi="Arial" w:cs="Arial"/>
+          <w:lang w:val="es-CO"/>
+        </w:rPr>
+        <w:t>.</w:t>
       </w:r>
     </w:p>
     <w:p>
@@ -1073,7 +1452,7 @@
                     <pic:cNvPicPr/>
                   </pic:nvPicPr>
                   <pic:blipFill>
-                    <a:blip r:embed="rId10">
+                    <a:blip r:embed="rId11">
                       <a:extLst>
                         <a:ext uri="{28A0092B-C50C-407E-A947-70E740481C1C}">
                           <a14:useLocalDpi xmlns:a14="http://schemas.microsoft.com/office/drawing/2010/main" val="0"/>
@@ -1130,7 +1509,7 @@
                     <pic:cNvPicPr/>
                   </pic:nvPicPr>
                   <pic:blipFill>
-                    <a:blip r:embed="rId11">
+                    <a:blip r:embed="rId12">
                       <a:extLst>
                         <a:ext uri="{28A0092B-C50C-407E-A947-70E740481C1C}">
                           <a14:useLocalDpi xmlns:a14="http://schemas.microsoft.com/office/drawing/2010/main" val="0"/>
@@ -1250,7 +1629,23 @@
           <w:rFonts w:ascii="Arial" w:hAnsi="Arial" w:cs="Arial"/>
           <w:lang w:val="es-CO"/>
         </w:rPr>
-        <w:t>Se empieza por extraer solo la parte correspondiente a los datos del archivo excel, para lo cual se ignoran las primeras 9 filas de la hoja</w:t>
+        <w:t xml:space="preserve">Se empieza por extraer solo la parte correspondiente a los datos del archivo </w:t>
+      </w:r>
+      <w:proofErr w:type="spellStart"/>
+      <w:r>
+        <w:rPr>
+          <w:rFonts w:ascii="Arial" w:hAnsi="Arial" w:cs="Arial"/>
+          <w:lang w:val="es-CO"/>
+        </w:rPr>
+        <w:t>excel</w:t>
+      </w:r>
+      <w:proofErr w:type="spellEnd"/>
+      <w:r>
+        <w:rPr>
+          <w:rFonts w:ascii="Arial" w:hAnsi="Arial" w:cs="Arial"/>
+          <w:lang w:val="es-CO"/>
+        </w:rPr>
+        <w:t>, para lo cual se ignoran las primeras 9 filas de la hoja</w:t>
       </w:r>
     </w:p>
     <w:p>
@@ -1287,7 +1682,7 @@
                     <pic:cNvPicPr/>
                   </pic:nvPicPr>
                   <pic:blipFill>
-                    <a:blip r:embed="rId12" cstate="print">
+                    <a:blip r:embed="rId13" cstate="print">
                       <a:extLst>
                         <a:ext uri="{28A0092B-C50C-407E-A947-70E740481C1C}">
                           <a14:useLocalDpi xmlns:a14="http://schemas.microsoft.com/office/drawing/2010/main" val="0"/>
@@ -1383,7 +1778,7 @@
                     <pic:cNvPicPr/>
                   </pic:nvPicPr>
                   <pic:blipFill>
-                    <a:blip r:embed="rId13" cstate="print">
+                    <a:blip r:embed="rId14" cstate="print">
                       <a:extLst>
                         <a:ext uri="{28A0092B-C50C-407E-A947-70E740481C1C}">
                           <a14:useLocalDpi xmlns:a14="http://schemas.microsoft.com/office/drawing/2010/main" val="0"/>
@@ -1462,7 +1857,7 @@
                     <pic:cNvPicPr/>
                   </pic:nvPicPr>
                   <pic:blipFill>
-                    <a:blip r:embed="rId14" cstate="print">
+                    <a:blip r:embed="rId15" cstate="print">
                       <a:extLst>
                         <a:ext uri="{28A0092B-C50C-407E-A947-70E740481C1C}">
                           <a14:useLocalDpi xmlns:a14="http://schemas.microsoft.com/office/drawing/2010/main" val="0"/>
@@ -1509,22 +1904,47 @@
           <w:rFonts w:ascii="Arial" w:hAnsi="Arial" w:cs="Arial"/>
           <w:lang w:val="es-CO"/>
         </w:rPr>
-        <w:t>Actualización de headers</w:t>
-      </w:r>
-    </w:p>
-    <w:p>
-      <w:pPr>
-        <w:rPr>
-          <w:rFonts w:ascii="Arial" w:hAnsi="Arial" w:cs="Arial"/>
-          <w:lang w:val="es-CO"/>
-        </w:rPr>
-      </w:pPr>
-      <w:r>
-        <w:rPr>
-          <w:rFonts w:ascii="Arial" w:hAnsi="Arial" w:cs="Arial"/>
-          <w:lang w:val="es-CO"/>
-        </w:rPr>
-        <w:t>Al extraer los datos desde el archivo .xlsx, se verifica el dataframe generado por Pandas, empezando por los nombres de las columnas y se observan las siguientes incidencias:</w:t>
+        <w:t xml:space="preserve">Actualización de </w:t>
+      </w:r>
+      <w:proofErr w:type="spellStart"/>
+      <w:r>
+        <w:rPr>
+          <w:rFonts w:ascii="Arial" w:hAnsi="Arial" w:cs="Arial"/>
+          <w:lang w:val="es-CO"/>
+        </w:rPr>
+        <w:t>headers</w:t>
+      </w:r>
+      <w:proofErr w:type="spellEnd"/>
+    </w:p>
+    <w:p>
+      <w:pPr>
+        <w:rPr>
+          <w:rFonts w:ascii="Arial" w:hAnsi="Arial" w:cs="Arial"/>
+          <w:lang w:val="es-CO"/>
+        </w:rPr>
+      </w:pPr>
+      <w:r>
+        <w:rPr>
+          <w:rFonts w:ascii="Arial" w:hAnsi="Arial" w:cs="Arial"/>
+          <w:lang w:val="es-CO"/>
+        </w:rPr>
+        <w:t xml:space="preserve">Al extraer los datos desde el archivo .xlsx, se verifica el </w:t>
+      </w:r>
+      <w:proofErr w:type="spellStart"/>
+      <w:r>
+        <w:rPr>
+          <w:rFonts w:ascii="Arial" w:hAnsi="Arial" w:cs="Arial"/>
+          <w:lang w:val="es-CO"/>
+        </w:rPr>
+        <w:t>dataframe</w:t>
+      </w:r>
+      <w:proofErr w:type="spellEnd"/>
+      <w:r>
+        <w:rPr>
+          <w:rFonts w:ascii="Arial" w:hAnsi="Arial" w:cs="Arial"/>
+          <w:lang w:val="es-CO"/>
+        </w:rPr>
+        <w:t xml:space="preserve"> generado por Pandas, empezando por los nombres de las columnas y se observan las siguientes incidencias:</w:t>
       </w:r>
     </w:p>
     <w:p>
@@ -1539,12 +1959,53 @@
           <w:lang w:val="es-CO"/>
         </w:rPr>
       </w:pPr>
-      <w:r>
-        <w:rPr>
-          <w:rFonts w:ascii="Arial" w:hAnsi="Arial" w:cs="Arial"/>
-          <w:lang w:val="es-CO"/>
-        </w:rPr>
-        <w:t>Headers sin nombres descriptivos: headers con nombres por defecto de Pandas tipo ‘Unnamed: X’.</w:t>
+      <w:proofErr w:type="spellStart"/>
+      <w:r>
+        <w:rPr>
+          <w:rFonts w:ascii="Arial" w:hAnsi="Arial" w:cs="Arial"/>
+          <w:lang w:val="es-CO"/>
+        </w:rPr>
+        <w:t>Headers</w:t>
+      </w:r>
+      <w:proofErr w:type="spellEnd"/>
+      <w:r>
+        <w:rPr>
+          <w:rFonts w:ascii="Arial" w:hAnsi="Arial" w:cs="Arial"/>
+          <w:lang w:val="es-CO"/>
+        </w:rPr>
+        <w:t xml:space="preserve"> sin nombres descriptivos: </w:t>
+      </w:r>
+      <w:proofErr w:type="spellStart"/>
+      <w:r>
+        <w:rPr>
+          <w:rFonts w:ascii="Arial" w:hAnsi="Arial" w:cs="Arial"/>
+          <w:lang w:val="es-CO"/>
+        </w:rPr>
+        <w:t>headers</w:t>
+      </w:r>
+      <w:proofErr w:type="spellEnd"/>
+      <w:r>
+        <w:rPr>
+          <w:rFonts w:ascii="Arial" w:hAnsi="Arial" w:cs="Arial"/>
+          <w:lang w:val="es-CO"/>
+        </w:rPr>
+        <w:t xml:space="preserve"> con nombres por defecto de Pandas tipo ‘</w:t>
+      </w:r>
+      <w:proofErr w:type="spellStart"/>
+      <w:r>
+        <w:rPr>
+          <w:rFonts w:ascii="Arial" w:hAnsi="Arial" w:cs="Arial"/>
+          <w:lang w:val="es-CO"/>
+        </w:rPr>
+        <w:t>Unnamed</w:t>
+      </w:r>
+      <w:proofErr w:type="spellEnd"/>
+      <w:r>
+        <w:rPr>
+          <w:rFonts w:ascii="Arial" w:hAnsi="Arial" w:cs="Arial"/>
+          <w:lang w:val="es-CO"/>
+        </w:rPr>
+        <w:t>: X’.</w:t>
       </w:r>
     </w:p>
     <w:p>
@@ -1559,28 +2020,69 @@
           <w:lang w:val="es-CO"/>
         </w:rPr>
       </w:pPr>
+      <w:proofErr w:type="spellStart"/>
       <w:r>
         <w:rPr>
           <w:rFonts w:ascii="Arial" w:hAnsi="Arial" w:cs="Arial"/>
           <w:lang w:val="es-CO"/>
         </w:rPr>
         <w:lastRenderedPageBreak/>
-        <w:t>Headers en jerarquías inferiores debido a la agrupación de datos: ‘Hombre’ y ‘Mujer’ se encuentran en la primera fila de datos debido al diseño del .xlsx donde se busca describir la agrupación por Sexo de los datos.</w:t>
-      </w:r>
-    </w:p>
-    <w:p>
-      <w:pPr>
-        <w:rPr>
-          <w:rFonts w:ascii="Arial" w:hAnsi="Arial" w:cs="Arial"/>
-          <w:lang w:val="es-CO"/>
-        </w:rPr>
-      </w:pPr>
-      <w:r>
-        <w:rPr>
-          <w:rFonts w:ascii="Arial" w:hAnsi="Arial" w:cs="Arial"/>
-          <w:lang w:val="es-CO"/>
-        </w:rPr>
-        <w:t>Debido a la agrupación de datos en las columnas, se divide el dataframe en 3 partes, correspondientes a las áreas, ignorando el total para remover resúmenes de datos en el dataset final. Luego de dividirlos, se reemplazan los nombres de las columnas de la siguiente manera:</w:t>
+        <w:t>Headers</w:t>
+      </w:r>
+      <w:proofErr w:type="spellEnd"/>
+      <w:r>
+        <w:rPr>
+          <w:rFonts w:ascii="Arial" w:hAnsi="Arial" w:cs="Arial"/>
+          <w:lang w:val="es-CO"/>
+        </w:rPr>
+        <w:t xml:space="preserve"> en jerarquías inferiores debido a la agrupación de datos: ‘Hombre’ y ‘Mujer’ se encuentran en la primera fila de datos debido al diseño del .xlsx donde se busca describir la agrupación por Sexo de los datos.</w:t>
+      </w:r>
+    </w:p>
+    <w:p>
+      <w:pPr>
+        <w:rPr>
+          <w:rFonts w:ascii="Arial" w:hAnsi="Arial" w:cs="Arial"/>
+          <w:lang w:val="es-CO"/>
+        </w:rPr>
+      </w:pPr>
+      <w:r>
+        <w:rPr>
+          <w:rFonts w:ascii="Arial" w:hAnsi="Arial" w:cs="Arial"/>
+          <w:lang w:val="es-CO"/>
+        </w:rPr>
+        <w:t xml:space="preserve">Debido a la agrupación de datos en las columnas, se divide el </w:t>
+      </w:r>
+      <w:proofErr w:type="spellStart"/>
+      <w:r>
+        <w:rPr>
+          <w:rFonts w:ascii="Arial" w:hAnsi="Arial" w:cs="Arial"/>
+          <w:lang w:val="es-CO"/>
+        </w:rPr>
+        <w:t>dataframe</w:t>
+      </w:r>
+      <w:proofErr w:type="spellEnd"/>
+      <w:r>
+        <w:rPr>
+          <w:rFonts w:ascii="Arial" w:hAnsi="Arial" w:cs="Arial"/>
+          <w:lang w:val="es-CO"/>
+        </w:rPr>
+        <w:t xml:space="preserve"> en 3 partes, correspondientes a las áreas, ignorando el total para remover resúmenes de datos en el </w:t>
+      </w:r>
+      <w:proofErr w:type="spellStart"/>
+      <w:r>
+        <w:rPr>
+          <w:rFonts w:ascii="Arial" w:hAnsi="Arial" w:cs="Arial"/>
+          <w:lang w:val="es-CO"/>
+        </w:rPr>
+        <w:t>dataset</w:t>
+      </w:r>
+      <w:proofErr w:type="spellEnd"/>
+      <w:r>
+        <w:rPr>
+          <w:rFonts w:ascii="Arial" w:hAnsi="Arial" w:cs="Arial"/>
+          <w:lang w:val="es-CO"/>
+        </w:rPr>
+        <w:t xml:space="preserve"> final. Luego de dividirlos, se reemplazan los nombres de las columnas de la siguiente manera:</w:t>
       </w:r>
     </w:p>
     <w:p>
@@ -1595,12 +2097,21 @@
           <w:lang w:val="es-CO"/>
         </w:rPr>
       </w:pPr>
-      <w:r>
-        <w:rPr>
-          <w:rFonts w:ascii="Arial" w:hAnsi="Arial" w:cs="Arial"/>
-          <w:lang w:val="es-CO"/>
-        </w:rPr>
-        <w:t>Unnamed: 3: Edad</w:t>
+      <w:proofErr w:type="spellStart"/>
+      <w:r>
+        <w:rPr>
+          <w:rFonts w:ascii="Arial" w:hAnsi="Arial" w:cs="Arial"/>
+          <w:lang w:val="es-CO"/>
+        </w:rPr>
+        <w:t>Unnamed</w:t>
+      </w:r>
+      <w:proofErr w:type="spellEnd"/>
+      <w:r>
+        <w:rPr>
+          <w:rFonts w:ascii="Arial" w:hAnsi="Arial" w:cs="Arial"/>
+          <w:lang w:val="es-CO"/>
+        </w:rPr>
+        <w:t>: 3: Edad</w:t>
       </w:r>
     </w:p>
     <w:p>
@@ -1615,12 +2126,21 @@
           <w:lang w:val="es-CO"/>
         </w:rPr>
       </w:pPr>
-      <w:r>
-        <w:rPr>
-          <w:rFonts w:ascii="Arial" w:hAnsi="Arial" w:cs="Arial"/>
-          <w:lang w:val="es-CO"/>
-        </w:rPr>
-        <w:t>Unnamed: 8: Hombre</w:t>
+      <w:proofErr w:type="spellStart"/>
+      <w:r>
+        <w:rPr>
+          <w:rFonts w:ascii="Arial" w:hAnsi="Arial" w:cs="Arial"/>
+          <w:lang w:val="es-CO"/>
+        </w:rPr>
+        <w:t>Unnamed</w:t>
+      </w:r>
+      <w:proofErr w:type="spellEnd"/>
+      <w:r>
+        <w:rPr>
+          <w:rFonts w:ascii="Arial" w:hAnsi="Arial" w:cs="Arial"/>
+          <w:lang w:val="es-CO"/>
+        </w:rPr>
+        <w:t>: 8: Hombre</w:t>
       </w:r>
     </w:p>
     <w:p>
@@ -1635,12 +2155,21 @@
           <w:lang w:val="es-CO"/>
         </w:rPr>
       </w:pPr>
-      <w:r>
-        <w:rPr>
-          <w:rFonts w:ascii="Arial" w:hAnsi="Arial" w:cs="Arial"/>
-          <w:lang w:val="es-CO"/>
-        </w:rPr>
-        <w:t>Unnamed: 9: Mujer</w:t>
+      <w:proofErr w:type="spellStart"/>
+      <w:r>
+        <w:rPr>
+          <w:rFonts w:ascii="Arial" w:hAnsi="Arial" w:cs="Arial"/>
+          <w:lang w:val="es-CO"/>
+        </w:rPr>
+        <w:t>Unnamed</w:t>
+      </w:r>
+      <w:proofErr w:type="spellEnd"/>
+      <w:r>
+        <w:rPr>
+          <w:rFonts w:ascii="Arial" w:hAnsi="Arial" w:cs="Arial"/>
+          <w:lang w:val="es-CO"/>
+        </w:rPr>
+        <w:t>: 9: Mujer</w:t>
       </w:r>
     </w:p>
     <w:p>
@@ -1655,12 +2184,21 @@
           <w:lang w:val="es-CO"/>
         </w:rPr>
       </w:pPr>
-      <w:r>
-        <w:rPr>
-          <w:rFonts w:ascii="Arial" w:hAnsi="Arial" w:cs="Arial"/>
-          <w:lang w:val="es-CO"/>
-        </w:rPr>
-        <w:t>Unnamed: 11: Hombre</w:t>
+      <w:proofErr w:type="spellStart"/>
+      <w:r>
+        <w:rPr>
+          <w:rFonts w:ascii="Arial" w:hAnsi="Arial" w:cs="Arial"/>
+          <w:lang w:val="es-CO"/>
+        </w:rPr>
+        <w:t>Unnamed</w:t>
+      </w:r>
+      <w:proofErr w:type="spellEnd"/>
+      <w:r>
+        <w:rPr>
+          <w:rFonts w:ascii="Arial" w:hAnsi="Arial" w:cs="Arial"/>
+          <w:lang w:val="es-CO"/>
+        </w:rPr>
+        <w:t>: 11: Hombre</w:t>
       </w:r>
     </w:p>
     <w:p>
@@ -1675,12 +2213,21 @@
           <w:lang w:val="es-CO"/>
         </w:rPr>
       </w:pPr>
-      <w:r>
-        <w:rPr>
-          <w:rFonts w:ascii="Arial" w:hAnsi="Arial" w:cs="Arial"/>
-          <w:lang w:val="es-CO"/>
-        </w:rPr>
-        <w:t>Unnamed: 12: Mujer</w:t>
+      <w:proofErr w:type="spellStart"/>
+      <w:r>
+        <w:rPr>
+          <w:rFonts w:ascii="Arial" w:hAnsi="Arial" w:cs="Arial"/>
+          <w:lang w:val="es-CO"/>
+        </w:rPr>
+        <w:t>Unnamed</w:t>
+      </w:r>
+      <w:proofErr w:type="spellEnd"/>
+      <w:r>
+        <w:rPr>
+          <w:rFonts w:ascii="Arial" w:hAnsi="Arial" w:cs="Arial"/>
+          <w:lang w:val="es-CO"/>
+        </w:rPr>
+        <w:t>: 12: Mujer</w:t>
       </w:r>
     </w:p>
     <w:p>
@@ -1695,12 +2242,21 @@
           <w:lang w:val="es-CO"/>
         </w:rPr>
       </w:pPr>
-      <w:r>
-        <w:rPr>
-          <w:rFonts w:ascii="Arial" w:hAnsi="Arial" w:cs="Arial"/>
-          <w:lang w:val="es-CO"/>
-        </w:rPr>
-        <w:t>Unnamed: 14: Hombre</w:t>
+      <w:proofErr w:type="spellStart"/>
+      <w:r>
+        <w:rPr>
+          <w:rFonts w:ascii="Arial" w:hAnsi="Arial" w:cs="Arial"/>
+          <w:lang w:val="es-CO"/>
+        </w:rPr>
+        <w:t>Unnamed</w:t>
+      </w:r>
+      <w:proofErr w:type="spellEnd"/>
+      <w:r>
+        <w:rPr>
+          <w:rFonts w:ascii="Arial" w:hAnsi="Arial" w:cs="Arial"/>
+          <w:lang w:val="es-CO"/>
+        </w:rPr>
+        <w:t>: 14: Hombre</w:t>
       </w:r>
     </w:p>
     <w:p>
@@ -1715,28 +2271,62 @@
           <w:lang w:val="es-CO"/>
         </w:rPr>
       </w:pPr>
-      <w:r>
-        <w:rPr>
-          <w:rFonts w:ascii="Arial" w:hAnsi="Arial" w:cs="Arial"/>
-          <w:lang w:val="es-CO"/>
-        </w:rPr>
-        <w:t>Unnamed: 15: Mujer</w:t>
-      </w:r>
-    </w:p>
-    <w:p>
-      <w:pPr>
-        <w:rPr>
-          <w:rFonts w:ascii="Arial" w:hAnsi="Arial" w:cs="Arial"/>
-          <w:lang w:val="es-CO"/>
-        </w:rPr>
-      </w:pPr>
-      <w:r>
-        <w:rPr>
-          <w:rFonts w:ascii="Arial" w:hAnsi="Arial" w:cs="Arial"/>
-          <w:lang w:val="es-CO"/>
-        </w:rPr>
-        <w:t>Para identificar el área, se crea una nueva columna ‘Area’ indicando el área de análisis (cabecera, centro poblado, rural disperso), en cada subconjunto, y se unen los subconjuntos como un solo dataframe</w:t>
-      </w:r>
+      <w:proofErr w:type="spellStart"/>
+      <w:r>
+        <w:rPr>
+          <w:rFonts w:ascii="Arial" w:hAnsi="Arial" w:cs="Arial"/>
+          <w:lang w:val="es-CO"/>
+        </w:rPr>
+        <w:t>Unnamed</w:t>
+      </w:r>
+      <w:proofErr w:type="spellEnd"/>
+      <w:r>
+        <w:rPr>
+          <w:rFonts w:ascii="Arial" w:hAnsi="Arial" w:cs="Arial"/>
+          <w:lang w:val="es-CO"/>
+        </w:rPr>
+        <w:t>: 15: Mujer</w:t>
+      </w:r>
+    </w:p>
+    <w:p>
+      <w:pPr>
+        <w:rPr>
+          <w:rFonts w:ascii="Arial" w:hAnsi="Arial" w:cs="Arial"/>
+          <w:lang w:val="es-CO"/>
+        </w:rPr>
+      </w:pPr>
+      <w:r>
+        <w:rPr>
+          <w:rFonts w:ascii="Arial" w:hAnsi="Arial" w:cs="Arial"/>
+          <w:lang w:val="es-CO"/>
+        </w:rPr>
+        <w:t>Para identificar el área, se crea una nueva columna ‘</w:t>
+      </w:r>
+      <w:proofErr w:type="spellStart"/>
+      <w:r>
+        <w:rPr>
+          <w:rFonts w:ascii="Arial" w:hAnsi="Arial" w:cs="Arial"/>
+          <w:lang w:val="es-CO"/>
+        </w:rPr>
+        <w:t>Area</w:t>
+      </w:r>
+      <w:proofErr w:type="spellEnd"/>
+      <w:r>
+        <w:rPr>
+          <w:rFonts w:ascii="Arial" w:hAnsi="Arial" w:cs="Arial"/>
+          <w:lang w:val="es-CO"/>
+        </w:rPr>
+        <w:t xml:space="preserve">’ indicando el área de análisis (cabecera, centro poblado, rural disperso), en cada subconjunto, y se unen los subconjuntos como un solo </w:t>
+      </w:r>
+      <w:proofErr w:type="spellStart"/>
+      <w:r>
+        <w:rPr>
+          <w:rFonts w:ascii="Arial" w:hAnsi="Arial" w:cs="Arial"/>
+          <w:lang w:val="es-CO"/>
+        </w:rPr>
+        <w:t>dataframe</w:t>
+      </w:r>
+      <w:proofErr w:type="spellEnd"/>
       <w:r>
         <w:rPr>
           <w:rFonts w:ascii="Arial" w:hAnsi="Arial" w:cs="Arial"/>
@@ -1775,7 +2365,7 @@
                     <pic:cNvPicPr/>
                   </pic:nvPicPr>
                   <pic:blipFill>
-                    <a:blip r:embed="rId15">
+                    <a:blip r:embed="rId16">
                       <a:extLst>
                         <a:ext uri="{28A0092B-C50C-407E-A947-70E740481C1C}">
                           <a14:useLocalDpi xmlns:a14="http://schemas.microsoft.com/office/drawing/2010/main" val="0"/>
@@ -1857,7 +2447,7 @@
                     <pic:cNvPicPr/>
                   </pic:nvPicPr>
                   <pic:blipFill>
-                    <a:blip r:embed="rId16">
+                    <a:blip r:embed="rId17">
                       <a:extLst>
                         <a:ext uri="{28A0092B-C50C-407E-A947-70E740481C1C}">
                           <a14:useLocalDpi xmlns:a14="http://schemas.microsoft.com/office/drawing/2010/main" val="0"/>
@@ -1931,7 +2521,23 @@
           <w:rFonts w:ascii="Arial" w:hAnsi="Arial" w:cs="Arial"/>
           <w:lang w:val="es-CO"/>
         </w:rPr>
-        <w:t>Se empieza por extraer solo la parte correspondiente a los datos del archivo excel, para lo cual se ignoran las primeras 9 filas de la hoja</w:t>
+        <w:t xml:space="preserve">Se empieza por extraer solo la parte correspondiente a los datos del archivo </w:t>
+      </w:r>
+      <w:proofErr w:type="spellStart"/>
+      <w:r>
+        <w:rPr>
+          <w:rFonts w:ascii="Arial" w:hAnsi="Arial" w:cs="Arial"/>
+          <w:lang w:val="es-CO"/>
+        </w:rPr>
+        <w:t>excel</w:t>
+      </w:r>
+      <w:proofErr w:type="spellEnd"/>
+      <w:r>
+        <w:rPr>
+          <w:rFonts w:ascii="Arial" w:hAnsi="Arial" w:cs="Arial"/>
+          <w:lang w:val="es-CO"/>
+        </w:rPr>
+        <w:t>, para lo cual se ignoran las primeras 9 filas de la hoja</w:t>
       </w:r>
       <w:r>
         <w:rPr>
@@ -1970,7 +2576,7 @@
                     <pic:cNvPicPr/>
                   </pic:nvPicPr>
                   <pic:blipFill>
-                    <a:blip r:embed="rId17" cstate="print">
+                    <a:blip r:embed="rId18" cstate="print">
                       <a:extLst>
                         <a:ext uri="{28A0092B-C50C-407E-A947-70E740481C1C}">
                           <a14:useLocalDpi xmlns:a14="http://schemas.microsoft.com/office/drawing/2010/main" val="0"/>
@@ -2017,22 +2623,47 @@
           <w:rFonts w:ascii="Arial" w:hAnsi="Arial" w:cs="Arial"/>
           <w:lang w:val="es-CO"/>
         </w:rPr>
-        <w:t>Actualización de headers</w:t>
-      </w:r>
-    </w:p>
-    <w:p>
-      <w:pPr>
-        <w:rPr>
-          <w:rFonts w:ascii="Arial" w:hAnsi="Arial" w:cs="Arial"/>
-          <w:lang w:val="es-CO"/>
-        </w:rPr>
-      </w:pPr>
-      <w:r>
-        <w:rPr>
-          <w:rFonts w:ascii="Arial" w:hAnsi="Arial" w:cs="Arial"/>
-          <w:lang w:val="es-CO"/>
-        </w:rPr>
-        <w:t>Al extraer los datos desde el archivo .xlsx, se verifica el dataframe generado por Pandas, empezando por los nombres de las columnas y se observan las siguientes incidencias:</w:t>
+        <w:t xml:space="preserve">Actualización de </w:t>
+      </w:r>
+      <w:proofErr w:type="spellStart"/>
+      <w:r>
+        <w:rPr>
+          <w:rFonts w:ascii="Arial" w:hAnsi="Arial" w:cs="Arial"/>
+          <w:lang w:val="es-CO"/>
+        </w:rPr>
+        <w:t>headers</w:t>
+      </w:r>
+      <w:proofErr w:type="spellEnd"/>
+    </w:p>
+    <w:p>
+      <w:pPr>
+        <w:rPr>
+          <w:rFonts w:ascii="Arial" w:hAnsi="Arial" w:cs="Arial"/>
+          <w:lang w:val="es-CO"/>
+        </w:rPr>
+      </w:pPr>
+      <w:r>
+        <w:rPr>
+          <w:rFonts w:ascii="Arial" w:hAnsi="Arial" w:cs="Arial"/>
+          <w:lang w:val="es-CO"/>
+        </w:rPr>
+        <w:t xml:space="preserve">Al extraer los datos desde el archivo .xlsx, se verifica el </w:t>
+      </w:r>
+      <w:proofErr w:type="spellStart"/>
+      <w:r>
+        <w:rPr>
+          <w:rFonts w:ascii="Arial" w:hAnsi="Arial" w:cs="Arial"/>
+          <w:lang w:val="es-CO"/>
+        </w:rPr>
+        <w:t>dataframe</w:t>
+      </w:r>
+      <w:proofErr w:type="spellEnd"/>
+      <w:r>
+        <w:rPr>
+          <w:rFonts w:ascii="Arial" w:hAnsi="Arial" w:cs="Arial"/>
+          <w:lang w:val="es-CO"/>
+        </w:rPr>
+        <w:t xml:space="preserve"> generado por Pandas, empezando por los nombres de las columnas y se observan las siguientes incidencias:</w:t>
       </w:r>
     </w:p>
     <w:p>
@@ -2047,12 +2678,53 @@
           <w:lang w:val="es-CO"/>
         </w:rPr>
       </w:pPr>
-      <w:r>
-        <w:rPr>
-          <w:rFonts w:ascii="Arial" w:hAnsi="Arial" w:cs="Arial"/>
-          <w:lang w:val="es-CO"/>
-        </w:rPr>
-        <w:t>Headers sin nombres descriptivos: headers con nombres por defecto de Pandas tipo ‘Unnamed: X’.</w:t>
+      <w:proofErr w:type="spellStart"/>
+      <w:r>
+        <w:rPr>
+          <w:rFonts w:ascii="Arial" w:hAnsi="Arial" w:cs="Arial"/>
+          <w:lang w:val="es-CO"/>
+        </w:rPr>
+        <w:t>Headers</w:t>
+      </w:r>
+      <w:proofErr w:type="spellEnd"/>
+      <w:r>
+        <w:rPr>
+          <w:rFonts w:ascii="Arial" w:hAnsi="Arial" w:cs="Arial"/>
+          <w:lang w:val="es-CO"/>
+        </w:rPr>
+        <w:t xml:space="preserve"> sin nombres descriptivos: </w:t>
+      </w:r>
+      <w:proofErr w:type="spellStart"/>
+      <w:r>
+        <w:rPr>
+          <w:rFonts w:ascii="Arial" w:hAnsi="Arial" w:cs="Arial"/>
+          <w:lang w:val="es-CO"/>
+        </w:rPr>
+        <w:t>headers</w:t>
+      </w:r>
+      <w:proofErr w:type="spellEnd"/>
+      <w:r>
+        <w:rPr>
+          <w:rFonts w:ascii="Arial" w:hAnsi="Arial" w:cs="Arial"/>
+          <w:lang w:val="es-CO"/>
+        </w:rPr>
+        <w:t xml:space="preserve"> con nombres por defecto de Pandas tipo ‘</w:t>
+      </w:r>
+      <w:proofErr w:type="spellStart"/>
+      <w:r>
+        <w:rPr>
+          <w:rFonts w:ascii="Arial" w:hAnsi="Arial" w:cs="Arial"/>
+          <w:lang w:val="es-CO"/>
+        </w:rPr>
+        <w:t>Unnamed</w:t>
+      </w:r>
+      <w:proofErr w:type="spellEnd"/>
+      <w:r>
+        <w:rPr>
+          <w:rFonts w:ascii="Arial" w:hAnsi="Arial" w:cs="Arial"/>
+          <w:lang w:val="es-CO"/>
+        </w:rPr>
+        <w:t>: X’.</w:t>
       </w:r>
     </w:p>
     <w:p>
@@ -2067,28 +2739,85 @@
           <w:lang w:val="es-CO"/>
         </w:rPr>
       </w:pPr>
+      <w:proofErr w:type="spellStart"/>
       <w:r>
         <w:rPr>
           <w:rFonts w:ascii="Arial" w:hAnsi="Arial" w:cs="Arial"/>
           <w:lang w:val="es-CO"/>
         </w:rPr>
         <w:lastRenderedPageBreak/>
-        <w:t>Headers en jerarquías inferiores debido a la agrupación de datos: Todos los headers se encuentran en la primera fila de los datos debido al diseño del .xlsx donde se busca describir la agrupación por Relación o parentesco con el jefe(a) del hogar.</w:t>
-      </w:r>
-    </w:p>
-    <w:p>
-      <w:pPr>
-        <w:rPr>
-          <w:rFonts w:ascii="Arial" w:hAnsi="Arial" w:cs="Arial"/>
-          <w:lang w:val="es-CO"/>
-        </w:rPr>
-      </w:pPr>
-      <w:r>
-        <w:rPr>
-          <w:rFonts w:ascii="Arial" w:hAnsi="Arial" w:cs="Arial"/>
-          <w:lang w:val="es-CO"/>
-        </w:rPr>
-        <w:t>Para solucionar esto, se reemplazan los headers actuales desde ‘Relación o parentesco con el jef(a) del hogar’ hasta el último, por los valores correspondientes en la primera fila de datos.</w:t>
+        <w:t>Headers</w:t>
+      </w:r>
+      <w:proofErr w:type="spellEnd"/>
+      <w:r>
+        <w:rPr>
+          <w:rFonts w:ascii="Arial" w:hAnsi="Arial" w:cs="Arial"/>
+          <w:lang w:val="es-CO"/>
+        </w:rPr>
+        <w:t xml:space="preserve"> en jerarquías inferiores debido a la agrupación de datos: Todos los </w:t>
+      </w:r>
+      <w:proofErr w:type="spellStart"/>
+      <w:r>
+        <w:rPr>
+          <w:rFonts w:ascii="Arial" w:hAnsi="Arial" w:cs="Arial"/>
+          <w:lang w:val="es-CO"/>
+        </w:rPr>
+        <w:t>headers</w:t>
+      </w:r>
+      <w:proofErr w:type="spellEnd"/>
+      <w:r>
+        <w:rPr>
+          <w:rFonts w:ascii="Arial" w:hAnsi="Arial" w:cs="Arial"/>
+          <w:lang w:val="es-CO"/>
+        </w:rPr>
+        <w:t xml:space="preserve"> se encuentran en la primera fila de los datos debido al diseño del .xlsx donde se busca describir la agrupación por Relación o parentesco con el jefe(a) del hogar.</w:t>
+      </w:r>
+    </w:p>
+    <w:p>
+      <w:pPr>
+        <w:rPr>
+          <w:rFonts w:ascii="Arial" w:hAnsi="Arial" w:cs="Arial"/>
+          <w:lang w:val="es-CO"/>
+        </w:rPr>
+      </w:pPr>
+      <w:r>
+        <w:rPr>
+          <w:rFonts w:ascii="Arial" w:hAnsi="Arial" w:cs="Arial"/>
+          <w:lang w:val="es-CO"/>
+        </w:rPr>
+        <w:t xml:space="preserve">Para solucionar esto, se reemplazan los </w:t>
+      </w:r>
+      <w:proofErr w:type="spellStart"/>
+      <w:r>
+        <w:rPr>
+          <w:rFonts w:ascii="Arial" w:hAnsi="Arial" w:cs="Arial"/>
+          <w:lang w:val="es-CO"/>
+        </w:rPr>
+        <w:t>headers</w:t>
+      </w:r>
+      <w:proofErr w:type="spellEnd"/>
+      <w:r>
+        <w:rPr>
+          <w:rFonts w:ascii="Arial" w:hAnsi="Arial" w:cs="Arial"/>
+          <w:lang w:val="es-CO"/>
+        </w:rPr>
+        <w:t xml:space="preserve"> actuales desde ‘Relación o parentesco con el </w:t>
+      </w:r>
+      <w:proofErr w:type="spellStart"/>
+      <w:r>
+        <w:rPr>
+          <w:rFonts w:ascii="Arial" w:hAnsi="Arial" w:cs="Arial"/>
+          <w:lang w:val="es-CO"/>
+        </w:rPr>
+        <w:t>jef</w:t>
+      </w:r>
+      <w:proofErr w:type="spellEnd"/>
+      <w:r>
+        <w:rPr>
+          <w:rFonts w:ascii="Arial" w:hAnsi="Arial" w:cs="Arial"/>
+          <w:lang w:val="es-CO"/>
+        </w:rPr>
+        <w:t>(a) del hogar’ hasta el último, por los valores correspondientes en la primera fila de datos.</w:t>
       </w:r>
     </w:p>
     <w:p>
@@ -2120,7 +2849,7 @@
                     <pic:cNvPicPr/>
                   </pic:nvPicPr>
                   <pic:blipFill>
-                    <a:blip r:embed="rId18" cstate="print">
+                    <a:blip r:embed="rId19" cstate="print">
                       <a:extLst>
                         <a:ext uri="{28A0092B-C50C-407E-A947-70E740481C1C}">
                           <a14:useLocalDpi xmlns:a14="http://schemas.microsoft.com/office/drawing/2010/main" val="0"/>
@@ -2176,7 +2905,7 @@
                     <pic:cNvPicPr/>
                   </pic:nvPicPr>
                   <pic:blipFill>
-                    <a:blip r:embed="rId19" cstate="print">
+                    <a:blip r:embed="rId20" cstate="print">
                       <a:extLst>
                         <a:ext uri="{28A0092B-C50C-407E-A947-70E740481C1C}">
                           <a14:useLocalDpi xmlns:a14="http://schemas.microsoft.com/office/drawing/2010/main" val="0"/>
@@ -2238,12 +2967,21 @@
           <w:lang w:val="es-CO"/>
         </w:rPr>
       </w:pPr>
-      <w:r>
-        <w:rPr>
-          <w:rFonts w:ascii="Arial" w:hAnsi="Arial" w:cs="Arial"/>
-          <w:lang w:val="es-CO"/>
-        </w:rPr>
-        <w:t>Unnamed: 1: Municipio</w:t>
+      <w:proofErr w:type="spellStart"/>
+      <w:r>
+        <w:rPr>
+          <w:rFonts w:ascii="Arial" w:hAnsi="Arial" w:cs="Arial"/>
+          <w:lang w:val="es-CO"/>
+        </w:rPr>
+        <w:t>Unnamed</w:t>
+      </w:r>
+      <w:proofErr w:type="spellEnd"/>
+      <w:r>
+        <w:rPr>
+          <w:rFonts w:ascii="Arial" w:hAnsi="Arial" w:cs="Arial"/>
+          <w:lang w:val="es-CO"/>
+        </w:rPr>
+        <w:t>: 1: Municipio</w:t>
       </w:r>
     </w:p>
     <w:p>
@@ -2258,13 +2996,31 @@
           <w:lang w:val="es-CO"/>
         </w:rPr>
       </w:pPr>
-      <w:r>
-        <w:rPr>
-          <w:rFonts w:ascii="Arial" w:hAnsi="Arial" w:cs="Arial"/>
-          <w:lang w:val="es-CO"/>
-        </w:rPr>
-        <w:t>Unnamed: 2: Area</w:t>
-      </w:r>
+      <w:proofErr w:type="spellStart"/>
+      <w:r>
+        <w:rPr>
+          <w:rFonts w:ascii="Arial" w:hAnsi="Arial" w:cs="Arial"/>
+          <w:lang w:val="es-CO"/>
+        </w:rPr>
+        <w:t>Unnamed</w:t>
+      </w:r>
+      <w:proofErr w:type="spellEnd"/>
+      <w:r>
+        <w:rPr>
+          <w:rFonts w:ascii="Arial" w:hAnsi="Arial" w:cs="Arial"/>
+          <w:lang w:val="es-CO"/>
+        </w:rPr>
+        <w:t xml:space="preserve">: 2: </w:t>
+      </w:r>
+      <w:proofErr w:type="spellStart"/>
+      <w:r>
+        <w:rPr>
+          <w:rFonts w:ascii="Arial" w:hAnsi="Arial" w:cs="Arial"/>
+          <w:lang w:val="es-CO"/>
+        </w:rPr>
+        <w:t>Area</w:t>
+      </w:r>
+      <w:proofErr w:type="spellEnd"/>
     </w:p>
     <w:p>
       <w:pPr>
@@ -2278,12 +3034,21 @@
           <w:lang w:val="es-CO"/>
         </w:rPr>
       </w:pPr>
-      <w:r>
-        <w:rPr>
-          <w:rFonts w:ascii="Arial" w:hAnsi="Arial" w:cs="Arial"/>
-          <w:lang w:val="es-CO"/>
-        </w:rPr>
-        <w:t>Unnamed: 3: Sexo</w:t>
+      <w:proofErr w:type="spellStart"/>
+      <w:r>
+        <w:rPr>
+          <w:rFonts w:ascii="Arial" w:hAnsi="Arial" w:cs="Arial"/>
+          <w:lang w:val="es-CO"/>
+        </w:rPr>
+        <w:t>Unnamed</w:t>
+      </w:r>
+      <w:proofErr w:type="spellEnd"/>
+      <w:r>
+        <w:rPr>
+          <w:rFonts w:ascii="Arial" w:hAnsi="Arial" w:cs="Arial"/>
+          <w:lang w:val="es-CO"/>
+        </w:rPr>
+        <w:t>: 3: Sexo</w:t>
       </w:r>
     </w:p>
     <w:p>
@@ -2362,7 +3127,7 @@
                     <pic:cNvPicPr/>
                   </pic:nvPicPr>
                   <pic:blipFill>
-                    <a:blip r:embed="rId20">
+                    <a:blip r:embed="rId21">
                       <a:extLst>
                         <a:ext uri="{28A0092B-C50C-407E-A947-70E740481C1C}">
                           <a14:useLocalDpi xmlns:a14="http://schemas.microsoft.com/office/drawing/2010/main" val="0"/>
@@ -2409,7 +3174,23 @@
           <w:rFonts w:ascii="Arial" w:hAnsi="Arial" w:cs="Arial"/>
           <w:lang w:val="es-CO"/>
         </w:rPr>
-        <w:t>Eliminación de columnas sin información relevante o con información redundante en el dataframe.</w:t>
+        <w:t xml:space="preserve">Eliminación de columnas sin información relevante o con información redundante en el </w:t>
+      </w:r>
+      <w:proofErr w:type="spellStart"/>
+      <w:r>
+        <w:rPr>
+          <w:rFonts w:ascii="Arial" w:hAnsi="Arial" w:cs="Arial"/>
+          <w:lang w:val="es-CO"/>
+        </w:rPr>
+        <w:t>dataframe</w:t>
+      </w:r>
+      <w:proofErr w:type="spellEnd"/>
+      <w:r>
+        <w:rPr>
+          <w:rFonts w:ascii="Arial" w:hAnsi="Arial" w:cs="Arial"/>
+          <w:lang w:val="es-CO"/>
+        </w:rPr>
+        <w:t>.</w:t>
       </w:r>
     </w:p>
     <w:p>
@@ -2431,21 +3212,21 @@
           <w:rFonts w:ascii="Arial" w:hAnsi="Arial" w:cs="Arial"/>
           <w:lang w:val="es-CO"/>
         </w:rPr>
-        <w:t xml:space="preserve">Municipio, área (Total, Cabecera y Centros poblados y Rural disperso) y sexo', 'Municipio', </w:t>
-      </w:r>
-      <w:r>
-        <w:rPr>
-          <w:rFonts w:ascii="Arial" w:hAnsi="Arial" w:cs="Arial"/>
-          <w:lang w:val="es-CO"/>
-        </w:rPr>
-        <w:t xml:space="preserve">y </w:t>
-      </w:r>
-      <w:r>
-        <w:rPr>
-          <w:rFonts w:ascii="Arial" w:hAnsi="Arial" w:cs="Arial"/>
-          <w:lang w:val="es-CO"/>
-        </w:rPr>
-        <w:t>'Total'</w:t>
+        <w:t>Municipio, área (Total, Cabecera y Centros poblados y Rural disperso) y sexo'</w:t>
+      </w:r>
+      <w:r>
+        <w:rPr>
+          <w:rFonts w:ascii="Arial" w:hAnsi="Arial" w:cs="Arial"/>
+          <w:lang w:val="es-CO"/>
+        </w:rPr>
+        <w:t xml:space="preserve"> y</w:t>
+      </w:r>
+      <w:r>
+        <w:rPr>
+          <w:rFonts w:ascii="Arial" w:hAnsi="Arial" w:cs="Arial"/>
+          <w:lang w:val="es-CO"/>
+        </w:rPr>
+        <w:t xml:space="preserve"> 'Municipio'</w:t>
       </w:r>
       <w:r>
         <w:rPr>
@@ -2484,7 +3265,7 @@
                     <pic:cNvPicPr/>
                   </pic:nvPicPr>
                   <pic:blipFill>
-                    <a:blip r:embed="rId21" cstate="print">
+                    <a:blip r:embed="rId22" cstate="print">
                       <a:extLst>
                         <a:ext uri="{28A0092B-C50C-407E-A947-70E740481C1C}">
                           <a14:useLocalDpi xmlns:a14="http://schemas.microsoft.com/office/drawing/2010/main" val="0"/>
@@ -2563,7 +3344,7 @@
                     <pic:cNvPicPr/>
                   </pic:nvPicPr>
                   <pic:blipFill>
-                    <a:blip r:embed="rId22" cstate="print">
+                    <a:blip r:embed="rId23" cstate="print">
                       <a:extLst>
                         <a:ext uri="{28A0092B-C50C-407E-A947-70E740481C1C}">
                           <a14:useLocalDpi xmlns:a14="http://schemas.microsoft.com/office/drawing/2010/main" val="0"/>
@@ -2610,7 +3391,39 @@
           <w:rFonts w:ascii="Arial" w:hAnsi="Arial" w:cs="Arial"/>
           <w:lang w:val="es-CO"/>
         </w:rPr>
-        <w:t>Se propaga el valor de la columna ‘Area’ para reemplazar los valores NaN.</w:t>
+        <w:t>Se propaga el valor de la columna ‘</w:t>
+      </w:r>
+      <w:proofErr w:type="spellStart"/>
+      <w:r>
+        <w:rPr>
+          <w:rFonts w:ascii="Arial" w:hAnsi="Arial" w:cs="Arial"/>
+          <w:lang w:val="es-CO"/>
+        </w:rPr>
+        <w:t>Area</w:t>
+      </w:r>
+      <w:proofErr w:type="spellEnd"/>
+      <w:r>
+        <w:rPr>
+          <w:rFonts w:ascii="Arial" w:hAnsi="Arial" w:cs="Arial"/>
+          <w:lang w:val="es-CO"/>
+        </w:rPr>
+        <w:t xml:space="preserve">’ para reemplazar los valores </w:t>
+      </w:r>
+      <w:proofErr w:type="spellStart"/>
+      <w:r>
+        <w:rPr>
+          <w:rFonts w:ascii="Arial" w:hAnsi="Arial" w:cs="Arial"/>
+          <w:lang w:val="es-CO"/>
+        </w:rPr>
+        <w:t>NaN</w:t>
+      </w:r>
+      <w:proofErr w:type="spellEnd"/>
+      <w:r>
+        <w:rPr>
+          <w:rFonts w:ascii="Arial" w:hAnsi="Arial" w:cs="Arial"/>
+          <w:lang w:val="es-CO"/>
+        </w:rPr>
+        <w:t>.</w:t>
       </w:r>
     </w:p>
     <w:p>
@@ -2643,7 +3456,7 @@
                     <pic:cNvPicPr/>
                   </pic:nvPicPr>
                   <pic:blipFill>
-                    <a:blip r:embed="rId23">
+                    <a:blip r:embed="rId24">
                       <a:extLst>
                         <a:ext uri="{28A0092B-C50C-407E-A947-70E740481C1C}">
                           <a14:useLocalDpi xmlns:a14="http://schemas.microsoft.com/office/drawing/2010/main" val="0"/>
@@ -2685,77 +3498,6 @@
           <w:lang w:val="es-CO"/>
         </w:rPr>
       </w:pPr>
-      <w:r>
-        <w:rPr>
-          <w:rFonts w:ascii="Arial" w:hAnsi="Arial" w:cs="Arial"/>
-          <w:lang w:val="es-CO"/>
-        </w:rPr>
-        <w:t>Se filtran las filas que contienen resúmenes de datos (Totales)</w:t>
-      </w:r>
-    </w:p>
-    <w:p>
-      <w:pPr>
-        <w:rPr>
-          <w:rFonts w:ascii="Arial" w:hAnsi="Arial" w:cs="Arial"/>
-          <w:lang w:val="es-CO"/>
-        </w:rPr>
-      </w:pPr>
-      <w:r>
-        <w:rPr>
-          <w:rFonts w:ascii="Arial" w:hAnsi="Arial" w:cs="Arial"/>
-          <w:noProof/>
-          <w:lang w:val="es-CO"/>
-        </w:rPr>
-        <w:drawing>
-          <wp:inline distT="0" distB="0" distL="0" distR="0" wp14:anchorId="2D335463" wp14:editId="2E42D8B0">
-            <wp:extent cx="5612130" cy="1169670"/>
-            <wp:effectExtent l="0" t="0" r="7620" b="0"/>
-            <wp:docPr id="15" name="Imagen 15"/>
-            <wp:cNvGraphicFramePr>
-              <a:graphicFrameLocks xmlns:a="http://schemas.openxmlformats.org/drawingml/2006/main" noChangeAspect="1"/>
-            </wp:cNvGraphicFramePr>
-            <a:graphic xmlns:a="http://schemas.openxmlformats.org/drawingml/2006/main">
-              <a:graphicData uri="http://schemas.openxmlformats.org/drawingml/2006/picture">
-                <pic:pic xmlns:pic="http://schemas.openxmlformats.org/drawingml/2006/picture">
-                  <pic:nvPicPr>
-                    <pic:cNvPr id="15" name="Imagen 15"/>
-                    <pic:cNvPicPr/>
-                  </pic:nvPicPr>
-                  <pic:blipFill>
-                    <a:blip r:embed="rId24">
-                      <a:extLst>
-                        <a:ext uri="{28A0092B-C50C-407E-A947-70E740481C1C}">
-                          <a14:useLocalDpi xmlns:a14="http://schemas.microsoft.com/office/drawing/2010/main" val="0"/>
-                        </a:ext>
-                      </a:extLst>
-                    </a:blip>
-                    <a:stretch>
-                      <a:fillRect/>
-                    </a:stretch>
-                  </pic:blipFill>
-                  <pic:spPr>
-                    <a:xfrm>
-                      <a:off x="0" y="0"/>
-                      <a:ext cx="5612130" cy="1169670"/>
-                    </a:xfrm>
-                    <a:prstGeom prst="rect">
-                      <a:avLst/>
-                    </a:prstGeom>
-                  </pic:spPr>
-                </pic:pic>
-              </a:graphicData>
-            </a:graphic>
-          </wp:inline>
-        </w:drawing>
-      </w:r>
-    </w:p>
-    <w:p>
-      <w:pPr>
-        <w:rPr>
-          <w:rFonts w:ascii="Arial" w:hAnsi="Arial" w:cs="Arial"/>
-          <w:lang w:val="es-CO"/>
-        </w:rPr>
-      </w:pPr>
     </w:p>
     <w:p>
       <w:pPr>
@@ -2796,7 +3538,23 @@
           <w:rFonts w:ascii="Arial" w:hAnsi="Arial" w:cs="Arial"/>
           <w:lang w:val="es-CO"/>
         </w:rPr>
-        <w:t>Se empieza por extraer solo la parte correspondiente a los datos del archivo excel, para lo cual se ignoran las primeras 9 filas de la hoja.</w:t>
+        <w:t xml:space="preserve">Se empieza por extraer solo la parte correspondiente a los datos del archivo </w:t>
+      </w:r>
+      <w:proofErr w:type="spellStart"/>
+      <w:r>
+        <w:rPr>
+          <w:rFonts w:ascii="Arial" w:hAnsi="Arial" w:cs="Arial"/>
+          <w:lang w:val="es-CO"/>
+        </w:rPr>
+        <w:t>excel</w:t>
+      </w:r>
+      <w:proofErr w:type="spellEnd"/>
+      <w:r>
+        <w:rPr>
+          <w:rFonts w:ascii="Arial" w:hAnsi="Arial" w:cs="Arial"/>
+          <w:lang w:val="es-CO"/>
+        </w:rPr>
+        <w:t>, para lo cual se ignoran las primeras 9 filas de la hoja.</w:t>
       </w:r>
     </w:p>
     <w:p>
@@ -2816,7 +3574,6 @@
           <w:noProof/>
           <w:lang w:val="es-CO"/>
         </w:rPr>
-        <w:lastRenderedPageBreak/>
         <w:drawing>
           <wp:inline distT="0" distB="0" distL="0" distR="0" wp14:anchorId="7F75C8AE" wp14:editId="65F3E0FE">
             <wp:extent cx="5612130" cy="1868170"/>
@@ -2882,22 +3639,48 @@
           <w:rFonts w:ascii="Arial" w:hAnsi="Arial" w:cs="Arial"/>
           <w:lang w:val="es-CO"/>
         </w:rPr>
-        <w:t>Actualización de headers</w:t>
-      </w:r>
-    </w:p>
-    <w:p>
-      <w:pPr>
-        <w:rPr>
-          <w:rFonts w:ascii="Arial" w:hAnsi="Arial" w:cs="Arial"/>
-          <w:lang w:val="es-CO"/>
-        </w:rPr>
-      </w:pPr>
-      <w:r>
-        <w:rPr>
-          <w:rFonts w:ascii="Arial" w:hAnsi="Arial" w:cs="Arial"/>
-          <w:lang w:val="es-CO"/>
-        </w:rPr>
-        <w:t>Al extraer los datos desde el archivo .xlsx, se verifica el dataframe generado por Pandas, empezando por los nombres de las columnas y se observan las siguientes incidencias:</w:t>
+        <w:t xml:space="preserve">Actualización de </w:t>
+      </w:r>
+      <w:proofErr w:type="spellStart"/>
+      <w:r>
+        <w:rPr>
+          <w:rFonts w:ascii="Arial" w:hAnsi="Arial" w:cs="Arial"/>
+          <w:lang w:val="es-CO"/>
+        </w:rPr>
+        <w:t>headers</w:t>
+      </w:r>
+      <w:proofErr w:type="spellEnd"/>
+    </w:p>
+    <w:p>
+      <w:pPr>
+        <w:rPr>
+          <w:rFonts w:ascii="Arial" w:hAnsi="Arial" w:cs="Arial"/>
+          <w:lang w:val="es-CO"/>
+        </w:rPr>
+      </w:pPr>
+      <w:r>
+        <w:rPr>
+          <w:rFonts w:ascii="Arial" w:hAnsi="Arial" w:cs="Arial"/>
+          <w:lang w:val="es-CO"/>
+        </w:rPr>
+        <w:lastRenderedPageBreak/>
+        <w:t xml:space="preserve">Al extraer los datos desde el archivo .xlsx, se verifica el </w:t>
+      </w:r>
+      <w:proofErr w:type="spellStart"/>
+      <w:r>
+        <w:rPr>
+          <w:rFonts w:ascii="Arial" w:hAnsi="Arial" w:cs="Arial"/>
+          <w:lang w:val="es-CO"/>
+        </w:rPr>
+        <w:t>dataframe</w:t>
+      </w:r>
+      <w:proofErr w:type="spellEnd"/>
+      <w:r>
+        <w:rPr>
+          <w:rFonts w:ascii="Arial" w:hAnsi="Arial" w:cs="Arial"/>
+          <w:lang w:val="es-CO"/>
+        </w:rPr>
+        <w:t xml:space="preserve"> generado por Pandas, empezando por los nombres de las columnas y se observan las siguientes incidencias:</w:t>
       </w:r>
     </w:p>
     <w:p>
@@ -2912,12 +3695,53 @@
           <w:lang w:val="es-CO"/>
         </w:rPr>
       </w:pPr>
-      <w:r>
-        <w:rPr>
-          <w:rFonts w:ascii="Arial" w:hAnsi="Arial" w:cs="Arial"/>
-          <w:lang w:val="es-CO"/>
-        </w:rPr>
-        <w:t>Headers sin nombres descriptivos: headers con nombres por defecto de Pandas tipo ‘Unnamed: X’.</w:t>
+      <w:proofErr w:type="spellStart"/>
+      <w:r>
+        <w:rPr>
+          <w:rFonts w:ascii="Arial" w:hAnsi="Arial" w:cs="Arial"/>
+          <w:lang w:val="es-CO"/>
+        </w:rPr>
+        <w:t>Headers</w:t>
+      </w:r>
+      <w:proofErr w:type="spellEnd"/>
+      <w:r>
+        <w:rPr>
+          <w:rFonts w:ascii="Arial" w:hAnsi="Arial" w:cs="Arial"/>
+          <w:lang w:val="es-CO"/>
+        </w:rPr>
+        <w:t xml:space="preserve"> sin nombres descriptivos: </w:t>
+      </w:r>
+      <w:proofErr w:type="spellStart"/>
+      <w:r>
+        <w:rPr>
+          <w:rFonts w:ascii="Arial" w:hAnsi="Arial" w:cs="Arial"/>
+          <w:lang w:val="es-CO"/>
+        </w:rPr>
+        <w:t>headers</w:t>
+      </w:r>
+      <w:proofErr w:type="spellEnd"/>
+      <w:r>
+        <w:rPr>
+          <w:rFonts w:ascii="Arial" w:hAnsi="Arial" w:cs="Arial"/>
+          <w:lang w:val="es-CO"/>
+        </w:rPr>
+        <w:t xml:space="preserve"> con nombres por defecto de Pandas tipo ‘</w:t>
+      </w:r>
+      <w:proofErr w:type="spellStart"/>
+      <w:r>
+        <w:rPr>
+          <w:rFonts w:ascii="Arial" w:hAnsi="Arial" w:cs="Arial"/>
+          <w:lang w:val="es-CO"/>
+        </w:rPr>
+        <w:t>Unnamed</w:t>
+      </w:r>
+      <w:proofErr w:type="spellEnd"/>
+      <w:r>
+        <w:rPr>
+          <w:rFonts w:ascii="Arial" w:hAnsi="Arial" w:cs="Arial"/>
+          <w:lang w:val="es-CO"/>
+        </w:rPr>
+        <w:t>: X’.</w:t>
       </w:r>
     </w:p>
     <w:p>
@@ -2932,27 +3756,84 @@
           <w:lang w:val="es-CO"/>
         </w:rPr>
       </w:pPr>
-      <w:r>
-        <w:rPr>
-          <w:rFonts w:ascii="Arial" w:hAnsi="Arial" w:cs="Arial"/>
-          <w:lang w:val="es-CO"/>
-        </w:rPr>
-        <w:t>Headers en jerarquías inferiores debido a la agrupación de datos: Todos los headers se encuentran en la primera fila de los datos debido al diseño del .xlsx donde se busca describir la agrupación por Relación o parentesco con el jefe(a) del hogar.</w:t>
-      </w:r>
-    </w:p>
-    <w:p>
-      <w:pPr>
-        <w:rPr>
-          <w:rFonts w:ascii="Arial" w:hAnsi="Arial" w:cs="Arial"/>
-          <w:lang w:val="es-CO"/>
-        </w:rPr>
-      </w:pPr>
-      <w:r>
-        <w:rPr>
-          <w:rFonts w:ascii="Arial" w:hAnsi="Arial" w:cs="Arial"/>
-          <w:lang w:val="es-CO"/>
-        </w:rPr>
-        <w:t>Para solucionar esto, se reemplazan los headers actuales desde ‘Relación o parentesco con el jef(a) del hogar’ hasta el último, por los valores correspondientes en la primera fila de datos.</w:t>
+      <w:proofErr w:type="spellStart"/>
+      <w:r>
+        <w:rPr>
+          <w:rFonts w:ascii="Arial" w:hAnsi="Arial" w:cs="Arial"/>
+          <w:lang w:val="es-CO"/>
+        </w:rPr>
+        <w:t>Headers</w:t>
+      </w:r>
+      <w:proofErr w:type="spellEnd"/>
+      <w:r>
+        <w:rPr>
+          <w:rFonts w:ascii="Arial" w:hAnsi="Arial" w:cs="Arial"/>
+          <w:lang w:val="es-CO"/>
+        </w:rPr>
+        <w:t xml:space="preserve"> en jerarquías inferiores debido a la agrupación de datos: Todos los </w:t>
+      </w:r>
+      <w:proofErr w:type="spellStart"/>
+      <w:r>
+        <w:rPr>
+          <w:rFonts w:ascii="Arial" w:hAnsi="Arial" w:cs="Arial"/>
+          <w:lang w:val="es-CO"/>
+        </w:rPr>
+        <w:t>headers</w:t>
+      </w:r>
+      <w:proofErr w:type="spellEnd"/>
+      <w:r>
+        <w:rPr>
+          <w:rFonts w:ascii="Arial" w:hAnsi="Arial" w:cs="Arial"/>
+          <w:lang w:val="es-CO"/>
+        </w:rPr>
+        <w:t xml:space="preserve"> se encuentran en la primera fila de los datos debido al diseño del .xlsx donde se busca describir la agrupación por Relación o parentesco con el jefe(a) del hogar.</w:t>
+      </w:r>
+    </w:p>
+    <w:p>
+      <w:pPr>
+        <w:rPr>
+          <w:rFonts w:ascii="Arial" w:hAnsi="Arial" w:cs="Arial"/>
+          <w:lang w:val="es-CO"/>
+        </w:rPr>
+      </w:pPr>
+      <w:r>
+        <w:rPr>
+          <w:rFonts w:ascii="Arial" w:hAnsi="Arial" w:cs="Arial"/>
+          <w:lang w:val="es-CO"/>
+        </w:rPr>
+        <w:t xml:space="preserve">Para solucionar esto, se reemplazan los </w:t>
+      </w:r>
+      <w:proofErr w:type="spellStart"/>
+      <w:r>
+        <w:rPr>
+          <w:rFonts w:ascii="Arial" w:hAnsi="Arial" w:cs="Arial"/>
+          <w:lang w:val="es-CO"/>
+        </w:rPr>
+        <w:t>headers</w:t>
+      </w:r>
+      <w:proofErr w:type="spellEnd"/>
+      <w:r>
+        <w:rPr>
+          <w:rFonts w:ascii="Arial" w:hAnsi="Arial" w:cs="Arial"/>
+          <w:lang w:val="es-CO"/>
+        </w:rPr>
+        <w:t xml:space="preserve"> actuales desde ‘Relación o parentesco con el </w:t>
+      </w:r>
+      <w:proofErr w:type="spellStart"/>
+      <w:r>
+        <w:rPr>
+          <w:rFonts w:ascii="Arial" w:hAnsi="Arial" w:cs="Arial"/>
+          <w:lang w:val="es-CO"/>
+        </w:rPr>
+        <w:t>jef</w:t>
+      </w:r>
+      <w:proofErr w:type="spellEnd"/>
+      <w:r>
+        <w:rPr>
+          <w:rFonts w:ascii="Arial" w:hAnsi="Arial" w:cs="Arial"/>
+          <w:lang w:val="es-CO"/>
+        </w:rPr>
+        <w:t>(a) del hogar’ hasta el último, por los valores correspondientes en la primera fila de datos.</w:t>
       </w:r>
     </w:p>
     <w:p>
@@ -3079,7 +3960,6 @@
           <w:rFonts w:ascii="Arial" w:hAnsi="Arial" w:cs="Arial"/>
           <w:lang w:val="es-CO"/>
         </w:rPr>
-        <w:lastRenderedPageBreak/>
         <w:t>Se cambian las columnas restantes que no tienen nombres descriptivos de la siguiente manera:</w:t>
       </w:r>
     </w:p>
@@ -3095,12 +3975,21 @@
           <w:lang w:val="es-CO"/>
         </w:rPr>
       </w:pPr>
-      <w:r>
-        <w:rPr>
-          <w:rFonts w:ascii="Arial" w:hAnsi="Arial" w:cs="Arial"/>
-          <w:lang w:val="es-CO"/>
-        </w:rPr>
-        <w:t>Unnamed: 1: Municipio</w:t>
+      <w:proofErr w:type="spellStart"/>
+      <w:r>
+        <w:rPr>
+          <w:rFonts w:ascii="Arial" w:hAnsi="Arial" w:cs="Arial"/>
+          <w:lang w:val="es-CO"/>
+        </w:rPr>
+        <w:t>Unnamed</w:t>
+      </w:r>
+      <w:proofErr w:type="spellEnd"/>
+      <w:r>
+        <w:rPr>
+          <w:rFonts w:ascii="Arial" w:hAnsi="Arial" w:cs="Arial"/>
+          <w:lang w:val="es-CO"/>
+        </w:rPr>
+        <w:t>: 1: Municipio</w:t>
       </w:r>
     </w:p>
     <w:p>
@@ -3115,13 +4004,31 @@
           <w:lang w:val="es-CO"/>
         </w:rPr>
       </w:pPr>
-      <w:r>
-        <w:rPr>
-          <w:rFonts w:ascii="Arial" w:hAnsi="Arial" w:cs="Arial"/>
-          <w:lang w:val="es-CO"/>
-        </w:rPr>
-        <w:t>Unnamed: 2: Area</w:t>
-      </w:r>
+      <w:proofErr w:type="spellStart"/>
+      <w:r>
+        <w:rPr>
+          <w:rFonts w:ascii="Arial" w:hAnsi="Arial" w:cs="Arial"/>
+          <w:lang w:val="es-CO"/>
+        </w:rPr>
+        <w:t>Unnamed</w:t>
+      </w:r>
+      <w:proofErr w:type="spellEnd"/>
+      <w:r>
+        <w:rPr>
+          <w:rFonts w:ascii="Arial" w:hAnsi="Arial" w:cs="Arial"/>
+          <w:lang w:val="es-CO"/>
+        </w:rPr>
+        <w:t xml:space="preserve">: 2: </w:t>
+      </w:r>
+      <w:proofErr w:type="spellStart"/>
+      <w:r>
+        <w:rPr>
+          <w:rFonts w:ascii="Arial" w:hAnsi="Arial" w:cs="Arial"/>
+          <w:lang w:val="es-CO"/>
+        </w:rPr>
+        <w:t>Area</w:t>
+      </w:r>
+      <w:proofErr w:type="spellEnd"/>
     </w:p>
     <w:p>
       <w:pPr>
@@ -3135,12 +4042,21 @@
           <w:lang w:val="es-CO"/>
         </w:rPr>
       </w:pPr>
-      <w:r>
-        <w:rPr>
-          <w:rFonts w:ascii="Arial" w:hAnsi="Arial" w:cs="Arial"/>
-          <w:lang w:val="es-CO"/>
-        </w:rPr>
-        <w:t>Unnamed: 3: Grupo de edad</w:t>
+      <w:proofErr w:type="spellStart"/>
+      <w:r>
+        <w:rPr>
+          <w:rFonts w:ascii="Arial" w:hAnsi="Arial" w:cs="Arial"/>
+          <w:lang w:val="es-CO"/>
+        </w:rPr>
+        <w:t>Unnamed</w:t>
+      </w:r>
+      <w:proofErr w:type="spellEnd"/>
+      <w:r>
+        <w:rPr>
+          <w:rFonts w:ascii="Arial" w:hAnsi="Arial" w:cs="Arial"/>
+          <w:lang w:val="es-CO"/>
+        </w:rPr>
+        <w:t>: 3: Grupo de edad</w:t>
       </w:r>
     </w:p>
     <w:p>
@@ -3194,6 +4110,7 @@
           <w:noProof/>
           <w:lang w:val="es-CO"/>
         </w:rPr>
+        <w:lastRenderedPageBreak/>
         <w:drawing>
           <wp:inline distT="0" distB="0" distL="0" distR="0" wp14:anchorId="6EEA1988" wp14:editId="33666506">
             <wp:extent cx="5612130" cy="2984500"/>
@@ -3257,7 +4174,23 @@
           <w:rFonts w:ascii="Arial" w:hAnsi="Arial" w:cs="Arial"/>
           <w:lang w:val="es-CO"/>
         </w:rPr>
-        <w:t>Eliminación de columnas sin información relevante o con información redundante en el dataframe.</w:t>
+        <w:t xml:space="preserve">Eliminación de columnas sin información relevante o con información redundante en el </w:t>
+      </w:r>
+      <w:proofErr w:type="spellStart"/>
+      <w:r>
+        <w:rPr>
+          <w:rFonts w:ascii="Arial" w:hAnsi="Arial" w:cs="Arial"/>
+          <w:lang w:val="es-CO"/>
+        </w:rPr>
+        <w:t>dataframe</w:t>
+      </w:r>
+      <w:proofErr w:type="spellEnd"/>
+      <w:r>
+        <w:rPr>
+          <w:rFonts w:ascii="Arial" w:hAnsi="Arial" w:cs="Arial"/>
+          <w:lang w:val="es-CO"/>
+        </w:rPr>
+        <w:t>.</w:t>
       </w:r>
     </w:p>
     <w:p>
@@ -3330,7 +4263,6 @@
           <w:noProof/>
           <w:lang w:val="es-CO"/>
         </w:rPr>
-        <w:lastRenderedPageBreak/>
         <w:drawing>
           <wp:inline distT="0" distB="0" distL="0" distR="0" wp14:anchorId="5B83EF1C" wp14:editId="234C6A59">
             <wp:extent cx="5612130" cy="1975485"/>
@@ -3473,7 +4405,40 @@
           <w:rFonts w:ascii="Arial" w:hAnsi="Arial" w:cs="Arial"/>
           <w:lang w:val="es-CO"/>
         </w:rPr>
-        <w:t>Se propaga el valor de la columna ‘Area’ para reemplazar los valores NaN.</w:t>
+        <w:lastRenderedPageBreak/>
+        <w:t>Se propaga el valor de la columna ‘</w:t>
+      </w:r>
+      <w:proofErr w:type="spellStart"/>
+      <w:r>
+        <w:rPr>
+          <w:rFonts w:ascii="Arial" w:hAnsi="Arial" w:cs="Arial"/>
+          <w:lang w:val="es-CO"/>
+        </w:rPr>
+        <w:t>Area</w:t>
+      </w:r>
+      <w:proofErr w:type="spellEnd"/>
+      <w:r>
+        <w:rPr>
+          <w:rFonts w:ascii="Arial" w:hAnsi="Arial" w:cs="Arial"/>
+          <w:lang w:val="es-CO"/>
+        </w:rPr>
+        <w:t xml:space="preserve">’ para reemplazar los valores </w:t>
+      </w:r>
+      <w:proofErr w:type="spellStart"/>
+      <w:r>
+        <w:rPr>
+          <w:rFonts w:ascii="Arial" w:hAnsi="Arial" w:cs="Arial"/>
+          <w:lang w:val="es-CO"/>
+        </w:rPr>
+        <w:t>NaN</w:t>
+      </w:r>
+      <w:proofErr w:type="spellEnd"/>
+      <w:r>
+        <w:rPr>
+          <w:rFonts w:ascii="Arial" w:hAnsi="Arial" w:cs="Arial"/>
+          <w:lang w:val="es-CO"/>
+        </w:rPr>
+        <w:t>.</w:t>
       </w:r>
     </w:p>
     <w:p>
@@ -3568,7 +4533,6 @@
           <w:noProof/>
           <w:lang w:val="es-CO"/>
         </w:rPr>
-        <w:lastRenderedPageBreak/>
         <w:drawing>
           <wp:inline distT="0" distB="0" distL="0" distR="0" wp14:anchorId="59C0BB4E" wp14:editId="2D1680AB">
             <wp:extent cx="5612130" cy="2546985"/>
@@ -3682,7 +4646,23 @@
           <w:rFonts w:ascii="Arial" w:hAnsi="Arial" w:cs="Arial"/>
           <w:lang w:val="es-CO"/>
         </w:rPr>
-        <w:t>Se empieza por extraer solo la parte correspondiente a los datos del archivo excel, para lo cual se ignoran las primeras 9 filas de la hoja.</w:t>
+        <w:t xml:space="preserve">Se empieza por extraer solo la parte correspondiente a los datos del archivo </w:t>
+      </w:r>
+      <w:proofErr w:type="spellStart"/>
+      <w:r>
+        <w:rPr>
+          <w:rFonts w:ascii="Arial" w:hAnsi="Arial" w:cs="Arial"/>
+          <w:lang w:val="es-CO"/>
+        </w:rPr>
+        <w:t>excel</w:t>
+      </w:r>
+      <w:proofErr w:type="spellEnd"/>
+      <w:r>
+        <w:rPr>
+          <w:rFonts w:ascii="Arial" w:hAnsi="Arial" w:cs="Arial"/>
+          <w:lang w:val="es-CO"/>
+        </w:rPr>
+        <w:t>, para lo cual se ignoran las primeras 9 filas de la hoja.</w:t>
       </w:r>
     </w:p>
     <w:p>
@@ -3702,6 +4682,7 @@
           <w:noProof/>
           <w:lang w:val="es-CO"/>
         </w:rPr>
+        <w:lastRenderedPageBreak/>
         <w:drawing>
           <wp:inline distT="0" distB="0" distL="0" distR="0" wp14:anchorId="7A38612B" wp14:editId="731F9048">
             <wp:extent cx="5612130" cy="2453640"/>
@@ -3767,23 +4748,47 @@
           <w:rFonts w:ascii="Arial" w:hAnsi="Arial" w:cs="Arial"/>
           <w:lang w:val="es-CO"/>
         </w:rPr>
-        <w:t>Actualización de headers</w:t>
-      </w:r>
-    </w:p>
-    <w:p>
-      <w:pPr>
-        <w:rPr>
-          <w:rFonts w:ascii="Arial" w:hAnsi="Arial" w:cs="Arial"/>
-          <w:lang w:val="es-CO"/>
-        </w:rPr>
-      </w:pPr>
-      <w:r>
-        <w:rPr>
-          <w:rFonts w:ascii="Arial" w:hAnsi="Arial" w:cs="Arial"/>
-          <w:lang w:val="es-CO"/>
-        </w:rPr>
-        <w:lastRenderedPageBreak/>
-        <w:t>Al extraer los datos desde el archivo .xlsx, se verifica el dataframe generado por Pandas, empezando por los nombres de las columnas y se observan las siguientes incidencias:</w:t>
+        <w:t xml:space="preserve">Actualización de </w:t>
+      </w:r>
+      <w:proofErr w:type="spellStart"/>
+      <w:r>
+        <w:rPr>
+          <w:rFonts w:ascii="Arial" w:hAnsi="Arial" w:cs="Arial"/>
+          <w:lang w:val="es-CO"/>
+        </w:rPr>
+        <w:t>headers</w:t>
+      </w:r>
+      <w:proofErr w:type="spellEnd"/>
+    </w:p>
+    <w:p>
+      <w:pPr>
+        <w:rPr>
+          <w:rFonts w:ascii="Arial" w:hAnsi="Arial" w:cs="Arial"/>
+          <w:lang w:val="es-CO"/>
+        </w:rPr>
+      </w:pPr>
+      <w:r>
+        <w:rPr>
+          <w:rFonts w:ascii="Arial" w:hAnsi="Arial" w:cs="Arial"/>
+          <w:lang w:val="es-CO"/>
+        </w:rPr>
+        <w:t xml:space="preserve">Al extraer los datos desde el archivo .xlsx, se verifica el </w:t>
+      </w:r>
+      <w:proofErr w:type="spellStart"/>
+      <w:r>
+        <w:rPr>
+          <w:rFonts w:ascii="Arial" w:hAnsi="Arial" w:cs="Arial"/>
+          <w:lang w:val="es-CO"/>
+        </w:rPr>
+        <w:t>dataframe</w:t>
+      </w:r>
+      <w:proofErr w:type="spellEnd"/>
+      <w:r>
+        <w:rPr>
+          <w:rFonts w:ascii="Arial" w:hAnsi="Arial" w:cs="Arial"/>
+          <w:lang w:val="es-CO"/>
+        </w:rPr>
+        <w:t xml:space="preserve"> generado por Pandas, empezando por los nombres de las columnas y se observan las siguientes incidencias:</w:t>
       </w:r>
     </w:p>
     <w:p>
@@ -3798,12 +4803,53 @@
           <w:lang w:val="es-CO"/>
         </w:rPr>
       </w:pPr>
-      <w:r>
-        <w:rPr>
-          <w:rFonts w:ascii="Arial" w:hAnsi="Arial" w:cs="Arial"/>
-          <w:lang w:val="es-CO"/>
-        </w:rPr>
-        <w:t>Headers sin nombres descriptivos: headers con nombres por defecto de Pandas tipo ‘Unnamed: X’.</w:t>
+      <w:proofErr w:type="spellStart"/>
+      <w:r>
+        <w:rPr>
+          <w:rFonts w:ascii="Arial" w:hAnsi="Arial" w:cs="Arial"/>
+          <w:lang w:val="es-CO"/>
+        </w:rPr>
+        <w:t>Headers</w:t>
+      </w:r>
+      <w:proofErr w:type="spellEnd"/>
+      <w:r>
+        <w:rPr>
+          <w:rFonts w:ascii="Arial" w:hAnsi="Arial" w:cs="Arial"/>
+          <w:lang w:val="es-CO"/>
+        </w:rPr>
+        <w:t xml:space="preserve"> sin nombres descriptivos: </w:t>
+      </w:r>
+      <w:proofErr w:type="spellStart"/>
+      <w:r>
+        <w:rPr>
+          <w:rFonts w:ascii="Arial" w:hAnsi="Arial" w:cs="Arial"/>
+          <w:lang w:val="es-CO"/>
+        </w:rPr>
+        <w:t>headers</w:t>
+      </w:r>
+      <w:proofErr w:type="spellEnd"/>
+      <w:r>
+        <w:rPr>
+          <w:rFonts w:ascii="Arial" w:hAnsi="Arial" w:cs="Arial"/>
+          <w:lang w:val="es-CO"/>
+        </w:rPr>
+        <w:t xml:space="preserve"> con nombres por defecto de Pandas tipo ‘</w:t>
+      </w:r>
+      <w:proofErr w:type="spellStart"/>
+      <w:r>
+        <w:rPr>
+          <w:rFonts w:ascii="Arial" w:hAnsi="Arial" w:cs="Arial"/>
+          <w:lang w:val="es-CO"/>
+        </w:rPr>
+        <w:t>Unnamed</w:t>
+      </w:r>
+      <w:proofErr w:type="spellEnd"/>
+      <w:r>
+        <w:rPr>
+          <w:rFonts w:ascii="Arial" w:hAnsi="Arial" w:cs="Arial"/>
+          <w:lang w:val="es-CO"/>
+        </w:rPr>
+        <w:t>: X’.</w:t>
       </w:r>
     </w:p>
     <w:p>
@@ -3818,27 +4864,84 @@
           <w:lang w:val="es-CO"/>
         </w:rPr>
       </w:pPr>
-      <w:r>
-        <w:rPr>
-          <w:rFonts w:ascii="Arial" w:hAnsi="Arial" w:cs="Arial"/>
-          <w:lang w:val="es-CO"/>
-        </w:rPr>
-        <w:t>Headers en jerarquías inferiores debido a la agrupación de datos: Todos los headers se encuentran en la primera fila de los datos debido al diseño del .xlsx donde se busca describir la agrupación por Relación o parentesco con el jefe(a) del hogar.</w:t>
-      </w:r>
-    </w:p>
-    <w:p>
-      <w:pPr>
-        <w:rPr>
-          <w:rFonts w:ascii="Arial" w:hAnsi="Arial" w:cs="Arial"/>
-          <w:lang w:val="es-CO"/>
-        </w:rPr>
-      </w:pPr>
-      <w:r>
-        <w:rPr>
-          <w:rFonts w:ascii="Arial" w:hAnsi="Arial" w:cs="Arial"/>
-          <w:lang w:val="es-CO"/>
-        </w:rPr>
-        <w:t>Para solucionar esto, se reemplazan los headers actuales desde ‘Relación o parentesco con el jef(a) del hogar’ hasta el último, por los valores correspondientes en la primera fila de datos.</w:t>
+      <w:proofErr w:type="spellStart"/>
+      <w:r>
+        <w:rPr>
+          <w:rFonts w:ascii="Arial" w:hAnsi="Arial" w:cs="Arial"/>
+          <w:lang w:val="es-CO"/>
+        </w:rPr>
+        <w:t>Headers</w:t>
+      </w:r>
+      <w:proofErr w:type="spellEnd"/>
+      <w:r>
+        <w:rPr>
+          <w:rFonts w:ascii="Arial" w:hAnsi="Arial" w:cs="Arial"/>
+          <w:lang w:val="es-CO"/>
+        </w:rPr>
+        <w:t xml:space="preserve"> en jerarquías inferiores debido a la agrupación de datos: Todos los </w:t>
+      </w:r>
+      <w:proofErr w:type="spellStart"/>
+      <w:r>
+        <w:rPr>
+          <w:rFonts w:ascii="Arial" w:hAnsi="Arial" w:cs="Arial"/>
+          <w:lang w:val="es-CO"/>
+        </w:rPr>
+        <w:t>headers</w:t>
+      </w:r>
+      <w:proofErr w:type="spellEnd"/>
+      <w:r>
+        <w:rPr>
+          <w:rFonts w:ascii="Arial" w:hAnsi="Arial" w:cs="Arial"/>
+          <w:lang w:val="es-CO"/>
+        </w:rPr>
+        <w:t xml:space="preserve"> se encuentran en la primera fila de los datos debido al diseño del .xlsx donde se busca describir la agrupación por Relación o parentesco con el jefe(a) del hogar.</w:t>
+      </w:r>
+    </w:p>
+    <w:p>
+      <w:pPr>
+        <w:rPr>
+          <w:rFonts w:ascii="Arial" w:hAnsi="Arial" w:cs="Arial"/>
+          <w:lang w:val="es-CO"/>
+        </w:rPr>
+      </w:pPr>
+      <w:r>
+        <w:rPr>
+          <w:rFonts w:ascii="Arial" w:hAnsi="Arial" w:cs="Arial"/>
+          <w:lang w:val="es-CO"/>
+        </w:rPr>
+        <w:t xml:space="preserve">Para solucionar esto, se reemplazan los </w:t>
+      </w:r>
+      <w:proofErr w:type="spellStart"/>
+      <w:r>
+        <w:rPr>
+          <w:rFonts w:ascii="Arial" w:hAnsi="Arial" w:cs="Arial"/>
+          <w:lang w:val="es-CO"/>
+        </w:rPr>
+        <w:t>headers</w:t>
+      </w:r>
+      <w:proofErr w:type="spellEnd"/>
+      <w:r>
+        <w:rPr>
+          <w:rFonts w:ascii="Arial" w:hAnsi="Arial" w:cs="Arial"/>
+          <w:lang w:val="es-CO"/>
+        </w:rPr>
+        <w:t xml:space="preserve"> actuales desde ‘Relación o parentesco con el </w:t>
+      </w:r>
+      <w:proofErr w:type="spellStart"/>
+      <w:r>
+        <w:rPr>
+          <w:rFonts w:ascii="Arial" w:hAnsi="Arial" w:cs="Arial"/>
+          <w:lang w:val="es-CO"/>
+        </w:rPr>
+        <w:t>jef</w:t>
+      </w:r>
+      <w:proofErr w:type="spellEnd"/>
+      <w:r>
+        <w:rPr>
+          <w:rFonts w:ascii="Arial" w:hAnsi="Arial" w:cs="Arial"/>
+          <w:lang w:val="es-CO"/>
+        </w:rPr>
+        <w:t>(a) del hogar’ hasta el último, por los valores correspondientes en la primera fila de datos.</w:t>
       </w:r>
     </w:p>
     <w:p>
@@ -3918,6 +5021,7 @@
           <w:noProof/>
           <w:lang w:val="es-CO"/>
         </w:rPr>
+        <w:lastRenderedPageBreak/>
         <w:drawing>
           <wp:inline distT="0" distB="0" distL="0" distR="0" wp14:anchorId="4EE5F7D1" wp14:editId="0BDDB693">
             <wp:extent cx="5612130" cy="1156970"/>
@@ -3998,12 +5102,21 @@
           <w:lang w:val="es-CO"/>
         </w:rPr>
       </w:pPr>
-      <w:r>
-        <w:rPr>
-          <w:rFonts w:ascii="Arial" w:hAnsi="Arial" w:cs="Arial"/>
-          <w:lang w:val="es-CO"/>
-        </w:rPr>
-        <w:t>Unnamed: 1: Municipio</w:t>
+      <w:proofErr w:type="spellStart"/>
+      <w:r>
+        <w:rPr>
+          <w:rFonts w:ascii="Arial" w:hAnsi="Arial" w:cs="Arial"/>
+          <w:lang w:val="es-CO"/>
+        </w:rPr>
+        <w:t>Unnamed</w:t>
+      </w:r>
+      <w:proofErr w:type="spellEnd"/>
+      <w:r>
+        <w:rPr>
+          <w:rFonts w:ascii="Arial" w:hAnsi="Arial" w:cs="Arial"/>
+          <w:lang w:val="es-CO"/>
+        </w:rPr>
+        <w:t>: 1: Municipio</w:t>
       </w:r>
     </w:p>
     <w:p>
@@ -4018,12 +5131,21 @@
           <w:lang w:val="es-CO"/>
         </w:rPr>
       </w:pPr>
-      <w:r>
-        <w:rPr>
-          <w:rFonts w:ascii="Arial" w:hAnsi="Arial" w:cs="Arial"/>
-          <w:lang w:val="es-CO"/>
-        </w:rPr>
-        <w:t>Unnamed: 2: Sexo</w:t>
+      <w:proofErr w:type="spellStart"/>
+      <w:r>
+        <w:rPr>
+          <w:rFonts w:ascii="Arial" w:hAnsi="Arial" w:cs="Arial"/>
+          <w:lang w:val="es-CO"/>
+        </w:rPr>
+        <w:t>Unnamed</w:t>
+      </w:r>
+      <w:proofErr w:type="spellEnd"/>
+      <w:r>
+        <w:rPr>
+          <w:rFonts w:ascii="Arial" w:hAnsi="Arial" w:cs="Arial"/>
+          <w:lang w:val="es-CO"/>
+        </w:rPr>
+        <w:t>: 2: Sexo</w:t>
       </w:r>
     </w:p>
     <w:p>
@@ -4038,13 +5160,31 @@
           <w:lang w:val="es-CO"/>
         </w:rPr>
       </w:pPr>
-      <w:r>
-        <w:rPr>
-          <w:rFonts w:ascii="Arial" w:hAnsi="Arial" w:cs="Arial"/>
-          <w:lang w:val="es-CO"/>
-        </w:rPr>
-        <w:t>Unnamed: 3: Area</w:t>
-      </w:r>
+      <w:proofErr w:type="spellStart"/>
+      <w:r>
+        <w:rPr>
+          <w:rFonts w:ascii="Arial" w:hAnsi="Arial" w:cs="Arial"/>
+          <w:lang w:val="es-CO"/>
+        </w:rPr>
+        <w:t>Unnamed</w:t>
+      </w:r>
+      <w:proofErr w:type="spellEnd"/>
+      <w:r>
+        <w:rPr>
+          <w:rFonts w:ascii="Arial" w:hAnsi="Arial" w:cs="Arial"/>
+          <w:lang w:val="es-CO"/>
+        </w:rPr>
+        <w:t xml:space="preserve">: 3: </w:t>
+      </w:r>
+      <w:proofErr w:type="spellStart"/>
+      <w:r>
+        <w:rPr>
+          <w:rFonts w:ascii="Arial" w:hAnsi="Arial" w:cs="Arial"/>
+          <w:lang w:val="es-CO"/>
+        </w:rPr>
+        <w:t>Area</w:t>
+      </w:r>
+      <w:proofErr w:type="spellEnd"/>
     </w:p>
     <w:p>
       <w:pPr>
@@ -4058,66 +5198,75 @@
           <w:lang w:val="es-CO"/>
         </w:rPr>
       </w:pPr>
-      <w:r>
-        <w:rPr>
-          <w:rFonts w:ascii="Arial" w:hAnsi="Arial" w:cs="Arial"/>
-          <w:lang w:val="es-CO"/>
-        </w:rPr>
-        <w:t>Unnamed: 4: Grupo de edad</w:t>
-      </w:r>
-    </w:p>
-    <w:p>
-      <w:pPr>
-        <w:rPr>
-          <w:rFonts w:ascii="Arial" w:hAnsi="Arial" w:cs="Arial"/>
-          <w:lang w:val="es-CO"/>
-        </w:rPr>
-      </w:pPr>
-    </w:p>
-    <w:p>
-      <w:pPr>
-        <w:rPr>
-          <w:rFonts w:ascii="Arial" w:hAnsi="Arial" w:cs="Arial"/>
-          <w:lang w:val="es-CO"/>
-        </w:rPr>
-      </w:pPr>
-      <w:r>
-        <w:rPr>
-          <w:rFonts w:ascii="Arial" w:hAnsi="Arial" w:cs="Arial"/>
+      <w:proofErr w:type="spellStart"/>
+      <w:r>
+        <w:rPr>
+          <w:rFonts w:ascii="Arial" w:hAnsi="Arial" w:cs="Arial"/>
+          <w:lang w:val="es-CO"/>
+        </w:rPr>
+        <w:t>Unnamed</w:t>
+      </w:r>
+      <w:proofErr w:type="spellEnd"/>
+      <w:r>
+        <w:rPr>
+          <w:rFonts w:ascii="Arial" w:hAnsi="Arial" w:cs="Arial"/>
+          <w:lang w:val="es-CO"/>
+        </w:rPr>
+        <w:t>: 4: Grupo de edad</w:t>
+      </w:r>
+    </w:p>
+    <w:p>
+      <w:pPr>
+        <w:rPr>
+          <w:rFonts w:ascii="Arial" w:hAnsi="Arial" w:cs="Arial"/>
+          <w:lang w:val="es-CO"/>
+        </w:rPr>
+      </w:pPr>
+    </w:p>
+    <w:p>
+      <w:pPr>
+        <w:rPr>
+          <w:rFonts w:ascii="Arial" w:hAnsi="Arial" w:cs="Arial"/>
+          <w:lang w:val="es-CO"/>
+        </w:rPr>
+      </w:pPr>
+      <w:r>
+        <w:rPr>
+          <w:rFonts w:ascii="Arial" w:hAnsi="Arial" w:cs="Arial"/>
+          <w:lang w:val="es-CO"/>
+        </w:rPr>
+        <w:t>Filtrado de datos que no son de Viterbo, Caldas</w:t>
+      </w:r>
+    </w:p>
+    <w:p>
+      <w:pPr>
+        <w:rPr>
+          <w:rFonts w:ascii="Arial" w:hAnsi="Arial" w:cs="Arial"/>
+          <w:lang w:val="es-CO"/>
+        </w:rPr>
+      </w:pPr>
+      <w:r>
+        <w:rPr>
+          <w:rFonts w:ascii="Arial" w:hAnsi="Arial" w:cs="Arial"/>
+          <w:lang w:val="es-CO"/>
+        </w:rPr>
+        <w:t>Para esta hoja se decide propagar el valor del identificador del municipio, ‘17877_Viterbo’, y seleccionar solo los registros que lo contengan.</w:t>
+      </w:r>
+    </w:p>
+    <w:p>
+      <w:pPr>
+        <w:rPr>
+          <w:rFonts w:ascii="Arial" w:hAnsi="Arial" w:cs="Arial"/>
+          <w:lang w:val="es-CO"/>
+        </w:rPr>
+      </w:pPr>
+      <w:r>
+        <w:rPr>
+          <w:rFonts w:ascii="Arial" w:hAnsi="Arial" w:cs="Arial"/>
+          <w:noProof/>
           <w:lang w:val="es-CO"/>
         </w:rPr>
         <w:lastRenderedPageBreak/>
-        <w:t>Filtrado de datos que no son de Viterbo, Caldas</w:t>
-      </w:r>
-    </w:p>
-    <w:p>
-      <w:pPr>
-        <w:rPr>
-          <w:rFonts w:ascii="Arial" w:hAnsi="Arial" w:cs="Arial"/>
-          <w:lang w:val="es-CO"/>
-        </w:rPr>
-      </w:pPr>
-      <w:r>
-        <w:rPr>
-          <w:rFonts w:ascii="Arial" w:hAnsi="Arial" w:cs="Arial"/>
-          <w:lang w:val="es-CO"/>
-        </w:rPr>
-        <w:t>Para esta hoja se decide propagar el valor del identificador del municipio, ‘17877_Viterbo’, y seleccionar solo los registros que lo contengan.</w:t>
-      </w:r>
-    </w:p>
-    <w:p>
-      <w:pPr>
-        <w:rPr>
-          <w:rFonts w:ascii="Arial" w:hAnsi="Arial" w:cs="Arial"/>
-          <w:lang w:val="es-CO"/>
-        </w:rPr>
-      </w:pPr>
-      <w:r>
-        <w:rPr>
-          <w:rFonts w:ascii="Arial" w:hAnsi="Arial" w:cs="Arial"/>
-          <w:noProof/>
-          <w:lang w:val="es-CO"/>
-        </w:rPr>
         <w:drawing>
           <wp:inline distT="0" distB="0" distL="0" distR="0" wp14:anchorId="6006F13B" wp14:editId="4169FEAD">
             <wp:extent cx="5612130" cy="4157980"/>
@@ -4181,7 +5330,23 @@
           <w:rFonts w:ascii="Arial" w:hAnsi="Arial" w:cs="Arial"/>
           <w:lang w:val="es-CO"/>
         </w:rPr>
-        <w:t>Eliminación de columnas sin información relevante o con información redundante en el dataframe.</w:t>
+        <w:t xml:space="preserve">Eliminación de columnas sin información relevante o con información redundante en el </w:t>
+      </w:r>
+      <w:proofErr w:type="spellStart"/>
+      <w:r>
+        <w:rPr>
+          <w:rFonts w:ascii="Arial" w:hAnsi="Arial" w:cs="Arial"/>
+          <w:lang w:val="es-CO"/>
+        </w:rPr>
+        <w:t>dataframe</w:t>
+      </w:r>
+      <w:proofErr w:type="spellEnd"/>
+      <w:r>
+        <w:rPr>
+          <w:rFonts w:ascii="Arial" w:hAnsi="Arial" w:cs="Arial"/>
+          <w:lang w:val="es-CO"/>
+        </w:rPr>
+        <w:t>.</w:t>
       </w:r>
     </w:p>
     <w:p>
@@ -4390,7 +5555,39 @@
           <w:rFonts w:ascii="Arial" w:hAnsi="Arial" w:cs="Arial"/>
           <w:lang w:val="es-CO"/>
         </w:rPr>
-        <w:t>Se propagan los valores de las columnas ‘Sexo’ y ‘Area’ para reemplazar los valores NaN.</w:t>
+        <w:t>Se propagan los valores de las columnas ‘Sexo’ y ‘</w:t>
+      </w:r>
+      <w:proofErr w:type="spellStart"/>
+      <w:r>
+        <w:rPr>
+          <w:rFonts w:ascii="Arial" w:hAnsi="Arial" w:cs="Arial"/>
+          <w:lang w:val="es-CO"/>
+        </w:rPr>
+        <w:t>Area</w:t>
+      </w:r>
+      <w:proofErr w:type="spellEnd"/>
+      <w:r>
+        <w:rPr>
+          <w:rFonts w:ascii="Arial" w:hAnsi="Arial" w:cs="Arial"/>
+          <w:lang w:val="es-CO"/>
+        </w:rPr>
+        <w:t xml:space="preserve">’ para reemplazar los valores </w:t>
+      </w:r>
+      <w:proofErr w:type="spellStart"/>
+      <w:r>
+        <w:rPr>
+          <w:rFonts w:ascii="Arial" w:hAnsi="Arial" w:cs="Arial"/>
+          <w:lang w:val="es-CO"/>
+        </w:rPr>
+        <w:t>NaN</w:t>
+      </w:r>
+      <w:proofErr w:type="spellEnd"/>
+      <w:r>
+        <w:rPr>
+          <w:rFonts w:ascii="Arial" w:hAnsi="Arial" w:cs="Arial"/>
+          <w:lang w:val="es-CO"/>
+        </w:rPr>
+        <w:t>.</w:t>
       </w:r>
     </w:p>
     <w:p>
@@ -4600,7 +5797,23 @@
           <w:rFonts w:ascii="Arial" w:hAnsi="Arial" w:cs="Arial"/>
           <w:lang w:val="es-CO"/>
         </w:rPr>
-        <w:t>Se empieza por extraer solo la parte correspondiente a los datos del archivo excel, para lo cual se ignoran las primeras 9 filas de la hoja.</w:t>
+        <w:t xml:space="preserve">Se empieza por extraer solo la parte correspondiente a los datos del archivo </w:t>
+      </w:r>
+      <w:proofErr w:type="spellStart"/>
+      <w:r>
+        <w:rPr>
+          <w:rFonts w:ascii="Arial" w:hAnsi="Arial" w:cs="Arial"/>
+          <w:lang w:val="es-CO"/>
+        </w:rPr>
+        <w:t>excel</w:t>
+      </w:r>
+      <w:proofErr w:type="spellEnd"/>
+      <w:r>
+        <w:rPr>
+          <w:rFonts w:ascii="Arial" w:hAnsi="Arial" w:cs="Arial"/>
+          <w:lang w:val="es-CO"/>
+        </w:rPr>
+        <w:t>, para lo cual se ignoran las primeras 9 filas de la hoja.</w:t>
       </w:r>
     </w:p>
     <w:p>
@@ -4775,22 +5988,47 @@
           <w:rFonts w:ascii="Arial" w:hAnsi="Arial" w:cs="Arial"/>
           <w:lang w:val="es-CO"/>
         </w:rPr>
-        <w:t>Actualización de headers</w:t>
-      </w:r>
-    </w:p>
-    <w:p>
-      <w:pPr>
-        <w:rPr>
-          <w:rFonts w:ascii="Arial" w:hAnsi="Arial" w:cs="Arial"/>
-          <w:lang w:val="es-CO"/>
-        </w:rPr>
-      </w:pPr>
-      <w:r>
-        <w:rPr>
-          <w:rFonts w:ascii="Arial" w:hAnsi="Arial" w:cs="Arial"/>
-          <w:lang w:val="es-CO"/>
-        </w:rPr>
-        <w:t>Al extraer los datos desde el archivo .xlsx, se verifica el dataframe generado por Pandas, empezando por los nombres de las columnas y se observan las siguientes incidencias:</w:t>
+        <w:t xml:space="preserve">Actualización de </w:t>
+      </w:r>
+      <w:proofErr w:type="spellStart"/>
+      <w:r>
+        <w:rPr>
+          <w:rFonts w:ascii="Arial" w:hAnsi="Arial" w:cs="Arial"/>
+          <w:lang w:val="es-CO"/>
+        </w:rPr>
+        <w:t>headers</w:t>
+      </w:r>
+      <w:proofErr w:type="spellEnd"/>
+    </w:p>
+    <w:p>
+      <w:pPr>
+        <w:rPr>
+          <w:rFonts w:ascii="Arial" w:hAnsi="Arial" w:cs="Arial"/>
+          <w:lang w:val="es-CO"/>
+        </w:rPr>
+      </w:pPr>
+      <w:r>
+        <w:rPr>
+          <w:rFonts w:ascii="Arial" w:hAnsi="Arial" w:cs="Arial"/>
+          <w:lang w:val="es-CO"/>
+        </w:rPr>
+        <w:t xml:space="preserve">Al extraer los datos desde el archivo .xlsx, se verifica el </w:t>
+      </w:r>
+      <w:proofErr w:type="spellStart"/>
+      <w:r>
+        <w:rPr>
+          <w:rFonts w:ascii="Arial" w:hAnsi="Arial" w:cs="Arial"/>
+          <w:lang w:val="es-CO"/>
+        </w:rPr>
+        <w:t>dataframe</w:t>
+      </w:r>
+      <w:proofErr w:type="spellEnd"/>
+      <w:r>
+        <w:rPr>
+          <w:rFonts w:ascii="Arial" w:hAnsi="Arial" w:cs="Arial"/>
+          <w:lang w:val="es-CO"/>
+        </w:rPr>
+        <w:t xml:space="preserve"> generado por Pandas, empezando por los nombres de las columnas y se observan las siguientes incidencias:</w:t>
       </w:r>
     </w:p>
     <w:p>
@@ -4805,12 +6043,53 @@
           <w:lang w:val="es-CO"/>
         </w:rPr>
       </w:pPr>
-      <w:r>
-        <w:rPr>
-          <w:rFonts w:ascii="Arial" w:hAnsi="Arial" w:cs="Arial"/>
-          <w:lang w:val="es-CO"/>
-        </w:rPr>
-        <w:t>Headers sin nombres descriptivos: headers con nombres por defecto de Pandas tipo ‘Unnamed: X’.</w:t>
+      <w:proofErr w:type="spellStart"/>
+      <w:r>
+        <w:rPr>
+          <w:rFonts w:ascii="Arial" w:hAnsi="Arial" w:cs="Arial"/>
+          <w:lang w:val="es-CO"/>
+        </w:rPr>
+        <w:t>Headers</w:t>
+      </w:r>
+      <w:proofErr w:type="spellEnd"/>
+      <w:r>
+        <w:rPr>
+          <w:rFonts w:ascii="Arial" w:hAnsi="Arial" w:cs="Arial"/>
+          <w:lang w:val="es-CO"/>
+        </w:rPr>
+        <w:t xml:space="preserve"> sin nombres descriptivos: </w:t>
+      </w:r>
+      <w:proofErr w:type="spellStart"/>
+      <w:r>
+        <w:rPr>
+          <w:rFonts w:ascii="Arial" w:hAnsi="Arial" w:cs="Arial"/>
+          <w:lang w:val="es-CO"/>
+        </w:rPr>
+        <w:t>headers</w:t>
+      </w:r>
+      <w:proofErr w:type="spellEnd"/>
+      <w:r>
+        <w:rPr>
+          <w:rFonts w:ascii="Arial" w:hAnsi="Arial" w:cs="Arial"/>
+          <w:lang w:val="es-CO"/>
+        </w:rPr>
+        <w:t xml:space="preserve"> con nombres por defecto de Pandas tipo ‘</w:t>
+      </w:r>
+      <w:proofErr w:type="spellStart"/>
+      <w:r>
+        <w:rPr>
+          <w:rFonts w:ascii="Arial" w:hAnsi="Arial" w:cs="Arial"/>
+          <w:lang w:val="es-CO"/>
+        </w:rPr>
+        <w:t>Unnamed</w:t>
+      </w:r>
+      <w:proofErr w:type="spellEnd"/>
+      <w:r>
+        <w:rPr>
+          <w:rFonts w:ascii="Arial" w:hAnsi="Arial" w:cs="Arial"/>
+          <w:lang w:val="es-CO"/>
+        </w:rPr>
+        <w:t>: X’.</w:t>
       </w:r>
     </w:p>
     <w:p>
@@ -4825,27 +6104,68 @@
           <w:lang w:val="es-CO"/>
         </w:rPr>
       </w:pPr>
-      <w:r>
-        <w:rPr>
-          <w:rFonts w:ascii="Arial" w:hAnsi="Arial" w:cs="Arial"/>
-          <w:lang w:val="es-CO"/>
-        </w:rPr>
-        <w:t>Headers en jerarquías inferiores debido a la agrupación de datos: Los headers se encuentran en la primera fila de datos debido al diseño del .xlsx donde se busca describir la agrupación por Área en la que se tomaron los datos.</w:t>
-      </w:r>
-    </w:p>
-    <w:p>
-      <w:pPr>
-        <w:rPr>
-          <w:rFonts w:ascii="Arial" w:hAnsi="Arial" w:cs="Arial"/>
-          <w:lang w:val="es-CO"/>
-        </w:rPr>
-      </w:pPr>
-      <w:r>
-        <w:rPr>
-          <w:rFonts w:ascii="Arial" w:hAnsi="Arial" w:cs="Arial"/>
-          <w:lang w:val="es-CO"/>
-        </w:rPr>
-        <w:t xml:space="preserve">Debido a la agrupación de datos en las columnas, se divide el dataframe en 3 partes, correspondientes a las áreas, ignorando el total para remover resúmenes </w:t>
+      <w:proofErr w:type="spellStart"/>
+      <w:r>
+        <w:rPr>
+          <w:rFonts w:ascii="Arial" w:hAnsi="Arial" w:cs="Arial"/>
+          <w:lang w:val="es-CO"/>
+        </w:rPr>
+        <w:t>Headers</w:t>
+      </w:r>
+      <w:proofErr w:type="spellEnd"/>
+      <w:r>
+        <w:rPr>
+          <w:rFonts w:ascii="Arial" w:hAnsi="Arial" w:cs="Arial"/>
+          <w:lang w:val="es-CO"/>
+        </w:rPr>
+        <w:t xml:space="preserve"> en jerarquías inferiores debido a la agrupación de datos: Los </w:t>
+      </w:r>
+      <w:proofErr w:type="spellStart"/>
+      <w:r>
+        <w:rPr>
+          <w:rFonts w:ascii="Arial" w:hAnsi="Arial" w:cs="Arial"/>
+          <w:lang w:val="es-CO"/>
+        </w:rPr>
+        <w:t>headers</w:t>
+      </w:r>
+      <w:proofErr w:type="spellEnd"/>
+      <w:r>
+        <w:rPr>
+          <w:rFonts w:ascii="Arial" w:hAnsi="Arial" w:cs="Arial"/>
+          <w:lang w:val="es-CO"/>
+        </w:rPr>
+        <w:t xml:space="preserve"> se encuentran en la primera fila de datos debido al diseño del .xlsx donde se busca describir la agrupación por Área en la que se tomaron los datos.</w:t>
+      </w:r>
+    </w:p>
+    <w:p>
+      <w:pPr>
+        <w:rPr>
+          <w:rFonts w:ascii="Arial" w:hAnsi="Arial" w:cs="Arial"/>
+          <w:lang w:val="es-CO"/>
+        </w:rPr>
+      </w:pPr>
+      <w:r>
+        <w:rPr>
+          <w:rFonts w:ascii="Arial" w:hAnsi="Arial" w:cs="Arial"/>
+          <w:lang w:val="es-CO"/>
+        </w:rPr>
+        <w:t xml:space="preserve">Debido a la agrupación de datos en las columnas, se divide el </w:t>
+      </w:r>
+      <w:proofErr w:type="spellStart"/>
+      <w:r>
+        <w:rPr>
+          <w:rFonts w:ascii="Arial" w:hAnsi="Arial" w:cs="Arial"/>
+          <w:lang w:val="es-CO"/>
+        </w:rPr>
+        <w:t>dataframe</w:t>
+      </w:r>
+      <w:proofErr w:type="spellEnd"/>
+      <w:r>
+        <w:rPr>
+          <w:rFonts w:ascii="Arial" w:hAnsi="Arial" w:cs="Arial"/>
+          <w:lang w:val="es-CO"/>
+        </w:rPr>
+        <w:t xml:space="preserve"> en 3 partes, correspondientes a las áreas, ignorando el total para remover resúmenes </w:t>
       </w:r>
       <w:r>
         <w:rPr>
@@ -4853,14 +6173,46 @@
           <w:lang w:val="es-CO"/>
         </w:rPr>
         <w:lastRenderedPageBreak/>
-        <w:t xml:space="preserve">de datos en el dataset final. </w:t>
-      </w:r>
-      <w:r>
-        <w:rPr>
-          <w:rFonts w:ascii="Arial" w:hAnsi="Arial" w:cs="Arial"/>
-          <w:lang w:val="es-CO"/>
-        </w:rPr>
-        <w:t xml:space="preserve">Cada subconjunto se concatena con la columna de Grupo de edad, y se asigna una columna ‘Area’ que contiene el área donde fueron tomados los datos. Luego se reemplazan los nombres de las columnas que todavía tienen un nombre por defecto por los siguientes nombres en su orden correspondiente: </w:t>
+        <w:t xml:space="preserve">de datos en el </w:t>
+      </w:r>
+      <w:proofErr w:type="spellStart"/>
+      <w:r>
+        <w:rPr>
+          <w:rFonts w:ascii="Arial" w:hAnsi="Arial" w:cs="Arial"/>
+          <w:lang w:val="es-CO"/>
+        </w:rPr>
+        <w:t>dataset</w:t>
+      </w:r>
+      <w:proofErr w:type="spellEnd"/>
+      <w:r>
+        <w:rPr>
+          <w:rFonts w:ascii="Arial" w:hAnsi="Arial" w:cs="Arial"/>
+          <w:lang w:val="es-CO"/>
+        </w:rPr>
+        <w:t xml:space="preserve"> final. </w:t>
+      </w:r>
+      <w:r>
+        <w:rPr>
+          <w:rFonts w:ascii="Arial" w:hAnsi="Arial" w:cs="Arial"/>
+          <w:lang w:val="es-CO"/>
+        </w:rPr>
+        <w:t>Cada subconjunto se concatena con la columna de Grupo de edad, y se asigna una columna ‘</w:t>
+      </w:r>
+      <w:proofErr w:type="spellStart"/>
+      <w:r>
+        <w:rPr>
+          <w:rFonts w:ascii="Arial" w:hAnsi="Arial" w:cs="Arial"/>
+          <w:lang w:val="es-CO"/>
+        </w:rPr>
+        <w:t>Area</w:t>
+      </w:r>
+      <w:proofErr w:type="spellEnd"/>
+      <w:r>
+        <w:rPr>
+          <w:rFonts w:ascii="Arial" w:hAnsi="Arial" w:cs="Arial"/>
+          <w:lang w:val="es-CO"/>
+        </w:rPr>
+        <w:t xml:space="preserve">’ que contiene el área donde fueron tomados los datos. Luego se reemplazan los nombres de las columnas que todavía tienen un nombre por defecto por los siguientes nombres en su orden correspondiente: </w:t>
       </w:r>
     </w:p>
     <w:p>
@@ -4900,7 +6252,23 @@
           <w:rFonts w:ascii="Arial" w:hAnsi="Arial" w:cs="Arial"/>
           <w:lang w:val="es-CO"/>
         </w:rPr>
-        <w:t>'Gitano(a) o Rrom',</w:t>
+        <w:t xml:space="preserve">'Gitano(a) o </w:t>
+      </w:r>
+      <w:proofErr w:type="spellStart"/>
+      <w:r>
+        <w:rPr>
+          <w:rFonts w:ascii="Arial" w:hAnsi="Arial" w:cs="Arial"/>
+          <w:lang w:val="es-CO"/>
+        </w:rPr>
+        <w:t>Rrom</w:t>
+      </w:r>
+      <w:proofErr w:type="spellEnd"/>
+      <w:r>
+        <w:rPr>
+          <w:rFonts w:ascii="Arial" w:hAnsi="Arial" w:cs="Arial"/>
+          <w:lang w:val="es-CO"/>
+        </w:rPr>
+        <w:t>',</w:t>
       </w:r>
     </w:p>
     <w:p>
@@ -4920,7 +6288,23 @@
           <w:rFonts w:ascii="Arial" w:hAnsi="Arial" w:cs="Arial"/>
           <w:lang w:val="es-CO"/>
         </w:rPr>
-        <w:t>'Raizal del Archipielago de San Andrés, Providencia y Santa Catalina',</w:t>
+        <w:t xml:space="preserve">'Raizal del </w:t>
+      </w:r>
+      <w:proofErr w:type="spellStart"/>
+      <w:r>
+        <w:rPr>
+          <w:rFonts w:ascii="Arial" w:hAnsi="Arial" w:cs="Arial"/>
+          <w:lang w:val="es-CO"/>
+        </w:rPr>
+        <w:t>Archipielago</w:t>
+      </w:r>
+      <w:proofErr w:type="spellEnd"/>
+      <w:r>
+        <w:rPr>
+          <w:rFonts w:ascii="Arial" w:hAnsi="Arial" w:cs="Arial"/>
+          <w:lang w:val="es-CO"/>
+        </w:rPr>
+        <w:t xml:space="preserve"> de San Andrés, Providencia y Santa Catalina',</w:t>
       </w:r>
     </w:p>
     <w:p>
@@ -5015,7 +6399,39 @@
           <w:rFonts w:ascii="Arial" w:hAnsi="Arial" w:cs="Arial"/>
           <w:lang w:val="es-CO"/>
         </w:rPr>
-        <w:t>Después de las modificaciones en cada subconjunto, se consolidan los dataframes en un solo dataframe.</w:t>
+        <w:t xml:space="preserve">Después de las modificaciones en cada subconjunto, se consolidan los </w:t>
+      </w:r>
+      <w:proofErr w:type="spellStart"/>
+      <w:r>
+        <w:rPr>
+          <w:rFonts w:ascii="Arial" w:hAnsi="Arial" w:cs="Arial"/>
+          <w:lang w:val="es-CO"/>
+        </w:rPr>
+        <w:t>dataframes</w:t>
+      </w:r>
+      <w:proofErr w:type="spellEnd"/>
+      <w:r>
+        <w:rPr>
+          <w:rFonts w:ascii="Arial" w:hAnsi="Arial" w:cs="Arial"/>
+          <w:lang w:val="es-CO"/>
+        </w:rPr>
+        <w:t xml:space="preserve"> en un solo </w:t>
+      </w:r>
+      <w:proofErr w:type="spellStart"/>
+      <w:r>
+        <w:rPr>
+          <w:rFonts w:ascii="Arial" w:hAnsi="Arial" w:cs="Arial"/>
+          <w:lang w:val="es-CO"/>
+        </w:rPr>
+        <w:t>dataframe</w:t>
+      </w:r>
+      <w:proofErr w:type="spellEnd"/>
+      <w:r>
+        <w:rPr>
+          <w:rFonts w:ascii="Arial" w:hAnsi="Arial" w:cs="Arial"/>
+          <w:lang w:val="es-CO"/>
+        </w:rPr>
+        <w:t>.</w:t>
       </w:r>
     </w:p>
     <w:p>
@@ -5206,7 +6622,23 @@
           <w:rFonts w:ascii="Arial" w:hAnsi="Arial" w:cs="Arial"/>
           <w:lang w:val="es-CO"/>
         </w:rPr>
-        <w:t>Se renombran los headers que contienen tildes o ñ.</w:t>
+        <w:t xml:space="preserve">Se renombran los </w:t>
+      </w:r>
+      <w:proofErr w:type="spellStart"/>
+      <w:r>
+        <w:rPr>
+          <w:rFonts w:ascii="Arial" w:hAnsi="Arial" w:cs="Arial"/>
+          <w:lang w:val="es-CO"/>
+        </w:rPr>
+        <w:t>headers</w:t>
+      </w:r>
+      <w:proofErr w:type="spellEnd"/>
+      <w:r>
+        <w:rPr>
+          <w:rFonts w:ascii="Arial" w:hAnsi="Arial" w:cs="Arial"/>
+          <w:lang w:val="es-CO"/>
+        </w:rPr>
+        <w:t xml:space="preserve"> que contienen tildes o ñ.</w:t>
       </w:r>
     </w:p>
     <w:p>
@@ -5359,7 +6791,23 @@
           <w:rFonts w:ascii="Arial" w:hAnsi="Arial" w:cs="Arial"/>
           <w:lang w:val="es-CO"/>
         </w:rPr>
-        <w:t>Se empieza por extraer solo la parte correspondiente a los datos del archivo excel, para lo cual se ignoran las primeras 9 filas de la hoja.</w:t>
+        <w:t xml:space="preserve">Se empieza por extraer solo la parte correspondiente a los datos del archivo </w:t>
+      </w:r>
+      <w:proofErr w:type="spellStart"/>
+      <w:r>
+        <w:rPr>
+          <w:rFonts w:ascii="Arial" w:hAnsi="Arial" w:cs="Arial"/>
+          <w:lang w:val="es-CO"/>
+        </w:rPr>
+        <w:t>excel</w:t>
+      </w:r>
+      <w:proofErr w:type="spellEnd"/>
+      <w:r>
+        <w:rPr>
+          <w:rFonts w:ascii="Arial" w:hAnsi="Arial" w:cs="Arial"/>
+          <w:lang w:val="es-CO"/>
+        </w:rPr>
+        <w:t>, para lo cual se ignoran las primeras 9 filas de la hoja.</w:t>
       </w:r>
     </w:p>
     <w:p>
@@ -5533,22 +6981,47 @@
           <w:lang w:val="es-CO"/>
         </w:rPr>
         <w:lastRenderedPageBreak/>
-        <w:t>Actualización de headers</w:t>
-      </w:r>
-    </w:p>
-    <w:p>
-      <w:pPr>
-        <w:rPr>
-          <w:rFonts w:ascii="Arial" w:hAnsi="Arial" w:cs="Arial"/>
-          <w:lang w:val="es-CO"/>
-        </w:rPr>
-      </w:pPr>
-      <w:r>
-        <w:rPr>
-          <w:rFonts w:ascii="Arial" w:hAnsi="Arial" w:cs="Arial"/>
-          <w:lang w:val="es-CO"/>
-        </w:rPr>
-        <w:t>Al extraer los datos desde el archivo .xlsx, se verifica el dataframe generado por Pandas, empezando por los nombres de las columnas y se observan las siguientes incidencias:</w:t>
+        <w:t xml:space="preserve">Actualización de </w:t>
+      </w:r>
+      <w:proofErr w:type="spellStart"/>
+      <w:r>
+        <w:rPr>
+          <w:rFonts w:ascii="Arial" w:hAnsi="Arial" w:cs="Arial"/>
+          <w:lang w:val="es-CO"/>
+        </w:rPr>
+        <w:t>headers</w:t>
+      </w:r>
+      <w:proofErr w:type="spellEnd"/>
+    </w:p>
+    <w:p>
+      <w:pPr>
+        <w:rPr>
+          <w:rFonts w:ascii="Arial" w:hAnsi="Arial" w:cs="Arial"/>
+          <w:lang w:val="es-CO"/>
+        </w:rPr>
+      </w:pPr>
+      <w:r>
+        <w:rPr>
+          <w:rFonts w:ascii="Arial" w:hAnsi="Arial" w:cs="Arial"/>
+          <w:lang w:val="es-CO"/>
+        </w:rPr>
+        <w:t xml:space="preserve">Al extraer los datos desde el archivo .xlsx, se verifica el </w:t>
+      </w:r>
+      <w:proofErr w:type="spellStart"/>
+      <w:r>
+        <w:rPr>
+          <w:rFonts w:ascii="Arial" w:hAnsi="Arial" w:cs="Arial"/>
+          <w:lang w:val="es-CO"/>
+        </w:rPr>
+        <w:t>dataframe</w:t>
+      </w:r>
+      <w:proofErr w:type="spellEnd"/>
+      <w:r>
+        <w:rPr>
+          <w:rFonts w:ascii="Arial" w:hAnsi="Arial" w:cs="Arial"/>
+          <w:lang w:val="es-CO"/>
+        </w:rPr>
+        <w:t xml:space="preserve"> generado por Pandas, empezando por los nombres de las columnas y se observan las siguientes incidencias:</w:t>
       </w:r>
     </w:p>
     <w:p>
@@ -5563,12 +7036,53 @@
           <w:lang w:val="es-CO"/>
         </w:rPr>
       </w:pPr>
-      <w:r>
-        <w:rPr>
-          <w:rFonts w:ascii="Arial" w:hAnsi="Arial" w:cs="Arial"/>
-          <w:lang w:val="es-CO"/>
-        </w:rPr>
-        <w:t>Headers sin nombres descriptivos: headers con nombres por defecto de Pandas tipo ‘Unnamed: X’.</w:t>
+      <w:proofErr w:type="spellStart"/>
+      <w:r>
+        <w:rPr>
+          <w:rFonts w:ascii="Arial" w:hAnsi="Arial" w:cs="Arial"/>
+          <w:lang w:val="es-CO"/>
+        </w:rPr>
+        <w:t>Headers</w:t>
+      </w:r>
+      <w:proofErr w:type="spellEnd"/>
+      <w:r>
+        <w:rPr>
+          <w:rFonts w:ascii="Arial" w:hAnsi="Arial" w:cs="Arial"/>
+          <w:lang w:val="es-CO"/>
+        </w:rPr>
+        <w:t xml:space="preserve"> sin nombres descriptivos: </w:t>
+      </w:r>
+      <w:proofErr w:type="spellStart"/>
+      <w:r>
+        <w:rPr>
+          <w:rFonts w:ascii="Arial" w:hAnsi="Arial" w:cs="Arial"/>
+          <w:lang w:val="es-CO"/>
+        </w:rPr>
+        <w:t>headers</w:t>
+      </w:r>
+      <w:proofErr w:type="spellEnd"/>
+      <w:r>
+        <w:rPr>
+          <w:rFonts w:ascii="Arial" w:hAnsi="Arial" w:cs="Arial"/>
+          <w:lang w:val="es-CO"/>
+        </w:rPr>
+        <w:t xml:space="preserve"> con nombres por defecto de Pandas tipo ‘</w:t>
+      </w:r>
+      <w:proofErr w:type="spellStart"/>
+      <w:r>
+        <w:rPr>
+          <w:rFonts w:ascii="Arial" w:hAnsi="Arial" w:cs="Arial"/>
+          <w:lang w:val="es-CO"/>
+        </w:rPr>
+        <w:t>Unnamed</w:t>
+      </w:r>
+      <w:proofErr w:type="spellEnd"/>
+      <w:r>
+        <w:rPr>
+          <w:rFonts w:ascii="Arial" w:hAnsi="Arial" w:cs="Arial"/>
+          <w:lang w:val="es-CO"/>
+        </w:rPr>
+        <w:t>: X’.</w:t>
       </w:r>
     </w:p>
     <w:p>
@@ -5583,27 +7097,100 @@
           <w:lang w:val="es-CO"/>
         </w:rPr>
       </w:pPr>
-      <w:r>
-        <w:rPr>
-          <w:rFonts w:ascii="Arial" w:hAnsi="Arial" w:cs="Arial"/>
-          <w:lang w:val="es-CO"/>
-        </w:rPr>
-        <w:t>Headers en jerarquías inferiores debido a la agrupación de datos: Los headers se encuentran en la primera fila de datos debido al diseño del .xlsx donde se busca describir la agrupación por Área en la que se tomaron los datos.</w:t>
-      </w:r>
-    </w:p>
-    <w:p>
-      <w:pPr>
-        <w:rPr>
-          <w:rFonts w:ascii="Arial" w:hAnsi="Arial" w:cs="Arial"/>
-          <w:lang w:val="es-CO"/>
-        </w:rPr>
-      </w:pPr>
-      <w:r>
-        <w:rPr>
-          <w:rFonts w:ascii="Arial" w:hAnsi="Arial" w:cs="Arial"/>
-          <w:lang w:val="es-CO"/>
-        </w:rPr>
-        <w:t xml:space="preserve">Debido a la agrupación de datos en las columnas, se divide el dataframe en 3 partes, correspondientes a las áreas, ignorando el total para remover resúmenes de datos en el dataset final. Cada subconjunto se concatena con la columna de Grupo de edad, y se asigna una columna ‘Area’ que contiene el área donde fueron tomados los datos. Luego se reemplazan los nombres de las columnas que todavía tienen un nombre por defecto por los siguientes nombres en su orden correspondiente: </w:t>
+      <w:proofErr w:type="spellStart"/>
+      <w:r>
+        <w:rPr>
+          <w:rFonts w:ascii="Arial" w:hAnsi="Arial" w:cs="Arial"/>
+          <w:lang w:val="es-CO"/>
+        </w:rPr>
+        <w:t>Headers</w:t>
+      </w:r>
+      <w:proofErr w:type="spellEnd"/>
+      <w:r>
+        <w:rPr>
+          <w:rFonts w:ascii="Arial" w:hAnsi="Arial" w:cs="Arial"/>
+          <w:lang w:val="es-CO"/>
+        </w:rPr>
+        <w:t xml:space="preserve"> en jerarquías inferiores debido a la agrupación de datos: Los </w:t>
+      </w:r>
+      <w:proofErr w:type="spellStart"/>
+      <w:r>
+        <w:rPr>
+          <w:rFonts w:ascii="Arial" w:hAnsi="Arial" w:cs="Arial"/>
+          <w:lang w:val="es-CO"/>
+        </w:rPr>
+        <w:t>headers</w:t>
+      </w:r>
+      <w:proofErr w:type="spellEnd"/>
+      <w:r>
+        <w:rPr>
+          <w:rFonts w:ascii="Arial" w:hAnsi="Arial" w:cs="Arial"/>
+          <w:lang w:val="es-CO"/>
+        </w:rPr>
+        <w:t xml:space="preserve"> se encuentran en la primera fila de datos debido al diseño del .xlsx donde se busca describir la agrupación por Área en la que se tomaron los datos.</w:t>
+      </w:r>
+    </w:p>
+    <w:p>
+      <w:pPr>
+        <w:rPr>
+          <w:rFonts w:ascii="Arial" w:hAnsi="Arial" w:cs="Arial"/>
+          <w:lang w:val="es-CO"/>
+        </w:rPr>
+      </w:pPr>
+      <w:r>
+        <w:rPr>
+          <w:rFonts w:ascii="Arial" w:hAnsi="Arial" w:cs="Arial"/>
+          <w:lang w:val="es-CO"/>
+        </w:rPr>
+        <w:t xml:space="preserve">Debido a la agrupación de datos en las columnas, se divide el </w:t>
+      </w:r>
+      <w:proofErr w:type="spellStart"/>
+      <w:r>
+        <w:rPr>
+          <w:rFonts w:ascii="Arial" w:hAnsi="Arial" w:cs="Arial"/>
+          <w:lang w:val="es-CO"/>
+        </w:rPr>
+        <w:t>dataframe</w:t>
+      </w:r>
+      <w:proofErr w:type="spellEnd"/>
+      <w:r>
+        <w:rPr>
+          <w:rFonts w:ascii="Arial" w:hAnsi="Arial" w:cs="Arial"/>
+          <w:lang w:val="es-CO"/>
+        </w:rPr>
+        <w:t xml:space="preserve"> en 3 partes, correspondientes a las áreas, ignorando el total para remover resúmenes de datos en el </w:t>
+      </w:r>
+      <w:proofErr w:type="spellStart"/>
+      <w:r>
+        <w:rPr>
+          <w:rFonts w:ascii="Arial" w:hAnsi="Arial" w:cs="Arial"/>
+          <w:lang w:val="es-CO"/>
+        </w:rPr>
+        <w:t>dataset</w:t>
+      </w:r>
+      <w:proofErr w:type="spellEnd"/>
+      <w:r>
+        <w:rPr>
+          <w:rFonts w:ascii="Arial" w:hAnsi="Arial" w:cs="Arial"/>
+          <w:lang w:val="es-CO"/>
+        </w:rPr>
+        <w:t xml:space="preserve"> final. Cada subconjunto se concatena con la columna de Grupo de edad, y se asigna una columna ‘</w:t>
+      </w:r>
+      <w:proofErr w:type="spellStart"/>
+      <w:r>
+        <w:rPr>
+          <w:rFonts w:ascii="Arial" w:hAnsi="Arial" w:cs="Arial"/>
+          <w:lang w:val="es-CO"/>
+        </w:rPr>
+        <w:t>Area</w:t>
+      </w:r>
+      <w:proofErr w:type="spellEnd"/>
+      <w:r>
+        <w:rPr>
+          <w:rFonts w:ascii="Arial" w:hAnsi="Arial" w:cs="Arial"/>
+          <w:lang w:val="es-CO"/>
+        </w:rPr>
+        <w:t xml:space="preserve">’ que contiene el área donde fueron tomados los datos. Luego se reemplazan los nombres de las columnas que todavía tienen un nombre por defecto por los siguientes nombres en su orden correspondiente: </w:t>
       </w:r>
     </w:p>
     <w:p>
@@ -5643,7 +7230,23 @@
           <w:rFonts w:ascii="Arial" w:hAnsi="Arial" w:cs="Arial"/>
           <w:lang w:val="es-CO"/>
         </w:rPr>
-        <w:t>'Gitano(a) o Rrom',</w:t>
+        <w:t xml:space="preserve">'Gitano(a) o </w:t>
+      </w:r>
+      <w:proofErr w:type="spellStart"/>
+      <w:r>
+        <w:rPr>
+          <w:rFonts w:ascii="Arial" w:hAnsi="Arial" w:cs="Arial"/>
+          <w:lang w:val="es-CO"/>
+        </w:rPr>
+        <w:t>Rrom</w:t>
+      </w:r>
+      <w:proofErr w:type="spellEnd"/>
+      <w:r>
+        <w:rPr>
+          <w:rFonts w:ascii="Arial" w:hAnsi="Arial" w:cs="Arial"/>
+          <w:lang w:val="es-CO"/>
+        </w:rPr>
+        <w:t>',</w:t>
       </w:r>
     </w:p>
     <w:p>
@@ -5663,7 +7266,23 @@
           <w:rFonts w:ascii="Arial" w:hAnsi="Arial" w:cs="Arial"/>
           <w:lang w:val="es-CO"/>
         </w:rPr>
-        <w:t>'Raizal del Archipielago de San Andrés, Providencia y Santa Catalina',</w:t>
+        <w:t xml:space="preserve">'Raizal del </w:t>
+      </w:r>
+      <w:proofErr w:type="spellStart"/>
+      <w:r>
+        <w:rPr>
+          <w:rFonts w:ascii="Arial" w:hAnsi="Arial" w:cs="Arial"/>
+          <w:lang w:val="es-CO"/>
+        </w:rPr>
+        <w:t>Archipielago</w:t>
+      </w:r>
+      <w:proofErr w:type="spellEnd"/>
+      <w:r>
+        <w:rPr>
+          <w:rFonts w:ascii="Arial" w:hAnsi="Arial" w:cs="Arial"/>
+          <w:lang w:val="es-CO"/>
+        </w:rPr>
+        <w:t xml:space="preserve"> de San Andrés, Providencia y Santa Catalina',</w:t>
       </w:r>
     </w:p>
     <w:p>
@@ -5758,7 +7377,39 @@
           <w:rFonts w:ascii="Arial" w:hAnsi="Arial" w:cs="Arial"/>
           <w:lang w:val="es-CO"/>
         </w:rPr>
-        <w:t>Después de las modificaciones en cada subconjunto, se consolidan los dataframes en un solo dataframe.</w:t>
+        <w:t xml:space="preserve">Después de las modificaciones en cada subconjunto, se consolidan los </w:t>
+      </w:r>
+      <w:proofErr w:type="spellStart"/>
+      <w:r>
+        <w:rPr>
+          <w:rFonts w:ascii="Arial" w:hAnsi="Arial" w:cs="Arial"/>
+          <w:lang w:val="es-CO"/>
+        </w:rPr>
+        <w:t>dataframes</w:t>
+      </w:r>
+      <w:proofErr w:type="spellEnd"/>
+      <w:r>
+        <w:rPr>
+          <w:rFonts w:ascii="Arial" w:hAnsi="Arial" w:cs="Arial"/>
+          <w:lang w:val="es-CO"/>
+        </w:rPr>
+        <w:t xml:space="preserve"> en un solo </w:t>
+      </w:r>
+      <w:proofErr w:type="spellStart"/>
+      <w:r>
+        <w:rPr>
+          <w:rFonts w:ascii="Arial" w:hAnsi="Arial" w:cs="Arial"/>
+          <w:lang w:val="es-CO"/>
+        </w:rPr>
+        <w:t>dataframe</w:t>
+      </w:r>
+      <w:proofErr w:type="spellEnd"/>
+      <w:r>
+        <w:rPr>
+          <w:rFonts w:ascii="Arial" w:hAnsi="Arial" w:cs="Arial"/>
+          <w:lang w:val="es-CO"/>
+        </w:rPr>
+        <w:t>.</w:t>
       </w:r>
     </w:p>
     <w:p>
@@ -5838,7 +7489,23 @@
           <w:lang w:val="es-CO"/>
         </w:rPr>
         <w:lastRenderedPageBreak/>
-        <w:t>Se renombran los headers que contienen tildes o ñ.</w:t>
+        <w:t xml:space="preserve">Se renombran los </w:t>
+      </w:r>
+      <w:proofErr w:type="spellStart"/>
+      <w:r>
+        <w:rPr>
+          <w:rFonts w:ascii="Arial" w:hAnsi="Arial" w:cs="Arial"/>
+          <w:lang w:val="es-CO"/>
+        </w:rPr>
+        <w:t>headers</w:t>
+      </w:r>
+      <w:proofErr w:type="spellEnd"/>
+      <w:r>
+        <w:rPr>
+          <w:rFonts w:ascii="Arial" w:hAnsi="Arial" w:cs="Arial"/>
+          <w:lang w:val="es-CO"/>
+        </w:rPr>
+        <w:t xml:space="preserve"> que contienen tildes o ñ.</w:t>
       </w:r>
     </w:p>
     <w:p>
@@ -8007,4 +9674,16 @@
     </a:ext>
   </a:extLst>
 </a:theme>
+</file>
+
+<file path=customXml/item1.xml><?xml version="1.0" encoding="utf-8"?>
+<b:Sources xmlns:b="http://schemas.openxmlformats.org/officeDocument/2006/bibliography" xmlns="http://schemas.openxmlformats.org/officeDocument/2006/bibliography" SelectedStyle="\APASixthEditionOfficeOnline.xsl" StyleName="APA" Version="6"/>
+</file>
+
+<file path=customXml/itemProps1.xml><?xml version="1.0" encoding="utf-8"?>
+<ds:datastoreItem xmlns:ds="http://schemas.openxmlformats.org/officeDocument/2006/customXml" ds:itemID="{0C1BDCDB-147A-4479-97E6-4ECA4043CC53}">
+  <ds:schemaRefs>
+    <ds:schemaRef ds:uri="http://schemas.openxmlformats.org/officeDocument/2006/bibliography"/>
+  </ds:schemaRefs>
+</ds:datastoreItem>
 </file>
</xml_diff>

<commit_message>
Actualiza la documentacion de procesamiento de hoja 5.1PM
</commit_message>
<xml_diff>
--- a/Documentacion/Procesamiento de Datos.docx
+++ b/Documentacion/Procesamiento de Datos.docx
@@ -4226,21 +4226,21 @@
           <w:rFonts w:ascii="Arial" w:hAnsi="Arial" w:cs="Arial"/>
           <w:lang w:val="es-CO"/>
         </w:rPr>
-        <w:t xml:space="preserve">', 'Municipio', </w:t>
-      </w:r>
-      <w:r>
-        <w:rPr>
-          <w:rFonts w:ascii="Arial" w:hAnsi="Arial" w:cs="Arial"/>
-          <w:lang w:val="es-CO"/>
-        </w:rPr>
-        <w:t xml:space="preserve">y </w:t>
-      </w:r>
-      <w:r>
-        <w:rPr>
-          <w:rFonts w:ascii="Arial" w:hAnsi="Arial" w:cs="Arial"/>
-          <w:lang w:val="es-CO"/>
-        </w:rPr>
-        <w:t>'Total'</w:t>
+        <w:t>'</w:t>
+      </w:r>
+      <w:r>
+        <w:rPr>
+          <w:rFonts w:ascii="Arial" w:hAnsi="Arial" w:cs="Arial"/>
+          <w:lang w:val="es-CO"/>
+        </w:rPr>
+        <w:t xml:space="preserve"> y </w:t>
+      </w:r>
+      <w:r>
+        <w:rPr>
+          <w:rFonts w:ascii="Arial" w:hAnsi="Arial" w:cs="Arial"/>
+          <w:lang w:val="es-CO"/>
+        </w:rPr>
+        <w:t>'Municipio'</w:t>
       </w:r>
       <w:r>
         <w:rPr>
@@ -4517,85 +4517,6 @@
           <w:rFonts w:ascii="Arial" w:hAnsi="Arial" w:cs="Arial"/>
           <w:lang w:val="es-CO"/>
         </w:rPr>
-        <w:t>Se filtran las filas que contienen resúmenes de datos (Totales).</w:t>
-      </w:r>
-    </w:p>
-    <w:p>
-      <w:pPr>
-        <w:rPr>
-          <w:rFonts w:ascii="Arial" w:hAnsi="Arial" w:cs="Arial"/>
-          <w:lang w:val="es-CO"/>
-        </w:rPr>
-      </w:pPr>
-      <w:r>
-        <w:rPr>
-          <w:rFonts w:ascii="Arial" w:hAnsi="Arial" w:cs="Arial"/>
-          <w:noProof/>
-          <w:lang w:val="es-CO"/>
-        </w:rPr>
-        <w:drawing>
-          <wp:inline distT="0" distB="0" distL="0" distR="0" wp14:anchorId="59C0BB4E" wp14:editId="2D1680AB">
-            <wp:extent cx="5612130" cy="2546985"/>
-            <wp:effectExtent l="0" t="0" r="7620" b="5715"/>
-            <wp:docPr id="23" name="Imagen 23"/>
-            <wp:cNvGraphicFramePr>
-              <a:graphicFrameLocks xmlns:a="http://schemas.openxmlformats.org/drawingml/2006/main" noChangeAspect="1"/>
-            </wp:cNvGraphicFramePr>
-            <a:graphic xmlns:a="http://schemas.openxmlformats.org/drawingml/2006/main">
-              <a:graphicData uri="http://schemas.openxmlformats.org/drawingml/2006/picture">
-                <pic:pic xmlns:pic="http://schemas.openxmlformats.org/drawingml/2006/picture">
-                  <pic:nvPicPr>
-                    <pic:cNvPr id="23" name="Imagen 23"/>
-                    <pic:cNvPicPr/>
-                  </pic:nvPicPr>
-                  <pic:blipFill>
-                    <a:blip r:embed="rId32">
-                      <a:extLst>
-                        <a:ext uri="{28A0092B-C50C-407E-A947-70E740481C1C}">
-                          <a14:useLocalDpi xmlns:a14="http://schemas.microsoft.com/office/drawing/2010/main" val="0"/>
-                        </a:ext>
-                      </a:extLst>
-                    </a:blip>
-                    <a:stretch>
-                      <a:fillRect/>
-                    </a:stretch>
-                  </pic:blipFill>
-                  <pic:spPr>
-                    <a:xfrm>
-                      <a:off x="0" y="0"/>
-                      <a:ext cx="5612130" cy="2546985"/>
-                    </a:xfrm>
-                    <a:prstGeom prst="rect">
-                      <a:avLst/>
-                    </a:prstGeom>
-                  </pic:spPr>
-                </pic:pic>
-              </a:graphicData>
-            </a:graphic>
-          </wp:inline>
-        </w:drawing>
-      </w:r>
-    </w:p>
-    <w:p>
-      <w:pPr>
-        <w:rPr>
-          <w:rFonts w:ascii="Arial" w:hAnsi="Arial" w:cs="Arial"/>
-          <w:lang w:val="es-CO"/>
-        </w:rPr>
-      </w:pPr>
-    </w:p>
-    <w:p>
-      <w:pPr>
-        <w:rPr>
-          <w:rFonts w:ascii="Arial" w:hAnsi="Arial" w:cs="Arial"/>
-          <w:lang w:val="es-CO"/>
-        </w:rPr>
-      </w:pPr>
-      <w:r>
-        <w:rPr>
-          <w:rFonts w:ascii="Arial" w:hAnsi="Arial" w:cs="Arial"/>
-          <w:lang w:val="es-CO"/>
-        </w:rPr>
         <w:t>Finalmente, se cambian las tildes dentro de los datos, reemplazando vocales con tilde por vocales sin tilde.</w:t>
       </w:r>
     </w:p>
@@ -4682,7 +4603,6 @@
           <w:noProof/>
           <w:lang w:val="es-CO"/>
         </w:rPr>
-        <w:lastRenderedPageBreak/>
         <w:drawing>
           <wp:inline distT="0" distB="0" distL="0" distR="0" wp14:anchorId="7A38612B" wp14:editId="731F9048">
             <wp:extent cx="5612130" cy="2453640"/>
@@ -4699,7 +4619,7 @@
                     <pic:cNvPicPr/>
                   </pic:nvPicPr>
                   <pic:blipFill>
-                    <a:blip r:embed="rId33" cstate="print">
+                    <a:blip r:embed="rId32" cstate="print">
                       <a:extLst>
                         <a:ext uri="{28A0092B-C50C-407E-A947-70E740481C1C}">
                           <a14:useLocalDpi xmlns:a14="http://schemas.microsoft.com/office/drawing/2010/main" val="0"/>
@@ -4772,6 +4692,7 @@
           <w:rFonts w:ascii="Arial" w:hAnsi="Arial" w:cs="Arial"/>
           <w:lang w:val="es-CO"/>
         </w:rPr>
+        <w:lastRenderedPageBreak/>
         <w:t xml:space="preserve">Al extraer los datos desde el archivo .xlsx, se verifica el </w:t>
       </w:r>
       <w:proofErr w:type="spellStart"/>
@@ -4977,7 +4898,7 @@
                     <pic:cNvPicPr/>
                   </pic:nvPicPr>
                   <pic:blipFill>
-                    <a:blip r:embed="rId34">
+                    <a:blip r:embed="rId33">
                       <a:extLst>
                         <a:ext uri="{28A0092B-C50C-407E-A947-70E740481C1C}">
                           <a14:useLocalDpi xmlns:a14="http://schemas.microsoft.com/office/drawing/2010/main" val="0"/>
@@ -5021,7 +4942,6 @@
           <w:noProof/>
           <w:lang w:val="es-CO"/>
         </w:rPr>
-        <w:lastRenderedPageBreak/>
         <w:drawing>
           <wp:inline distT="0" distB="0" distL="0" distR="0" wp14:anchorId="4EE5F7D1" wp14:editId="0BDDB693">
             <wp:extent cx="5612130" cy="1156970"/>
@@ -5038,7 +4958,7 @@
                     <pic:cNvPicPr/>
                   </pic:nvPicPr>
                   <pic:blipFill>
-                    <a:blip r:embed="rId35">
+                    <a:blip r:embed="rId34">
                       <a:extLst>
                         <a:ext uri="{28A0092B-C50C-407E-A947-70E740481C1C}">
                           <a14:useLocalDpi xmlns:a14="http://schemas.microsoft.com/office/drawing/2010/main" val="0"/>
@@ -5235,6 +5155,7 @@
           <w:rFonts w:ascii="Arial" w:hAnsi="Arial" w:cs="Arial"/>
           <w:lang w:val="es-CO"/>
         </w:rPr>
+        <w:lastRenderedPageBreak/>
         <w:t>Filtrado de datos que no son de Viterbo, Caldas</w:t>
       </w:r>
     </w:p>
@@ -5266,7 +5187,6 @@
           <w:noProof/>
           <w:lang w:val="es-CO"/>
         </w:rPr>
-        <w:lastRenderedPageBreak/>
         <w:drawing>
           <wp:inline distT="0" distB="0" distL="0" distR="0" wp14:anchorId="6006F13B" wp14:editId="4169FEAD">
             <wp:extent cx="5612130" cy="4157980"/>
@@ -5283,7 +5203,7 @@
                     <pic:cNvPicPr/>
                   </pic:nvPicPr>
                   <pic:blipFill>
-                    <a:blip r:embed="rId36">
+                    <a:blip r:embed="rId35">
                       <a:extLst>
                         <a:ext uri="{28A0092B-C50C-407E-A947-70E740481C1C}">
                           <a14:useLocalDpi xmlns:a14="http://schemas.microsoft.com/office/drawing/2010/main" val="0"/>
@@ -5429,7 +5349,7 @@
                     <pic:cNvPicPr/>
                   </pic:nvPicPr>
                   <pic:blipFill>
-                    <a:blip r:embed="rId37">
+                    <a:blip r:embed="rId36">
                       <a:extLst>
                         <a:ext uri="{28A0092B-C50C-407E-A947-70E740481C1C}">
                           <a14:useLocalDpi xmlns:a14="http://schemas.microsoft.com/office/drawing/2010/main" val="0"/>
@@ -5508,7 +5428,7 @@
                     <pic:cNvPicPr/>
                   </pic:nvPicPr>
                   <pic:blipFill>
-                    <a:blip r:embed="rId38" cstate="print">
+                    <a:blip r:embed="rId37" cstate="print">
                       <a:extLst>
                         <a:ext uri="{28A0092B-C50C-407E-A947-70E740481C1C}">
                           <a14:useLocalDpi xmlns:a14="http://schemas.microsoft.com/office/drawing/2010/main" val="0"/>
@@ -5620,7 +5540,7 @@
                     <pic:cNvPicPr/>
                   </pic:nvPicPr>
                   <pic:blipFill>
-                    <a:blip r:embed="rId39">
+                    <a:blip r:embed="rId38">
                       <a:extLst>
                         <a:ext uri="{28A0092B-C50C-407E-A947-70E740481C1C}">
                           <a14:useLocalDpi xmlns:a14="http://schemas.microsoft.com/office/drawing/2010/main" val="0"/>
@@ -5700,7 +5620,7 @@
                     <pic:cNvPicPr/>
                   </pic:nvPicPr>
                   <pic:blipFill>
-                    <a:blip r:embed="rId40">
+                    <a:blip r:embed="rId39">
                       <a:extLst>
                         <a:ext uri="{28A0092B-C50C-407E-A947-70E740481C1C}">
                           <a14:useLocalDpi xmlns:a14="http://schemas.microsoft.com/office/drawing/2010/main" val="0"/>
@@ -5846,7 +5766,7 @@
                     <pic:cNvPicPr/>
                   </pic:nvPicPr>
                   <pic:blipFill>
-                    <a:blip r:embed="rId41">
+                    <a:blip r:embed="rId40">
                       <a:extLst>
                         <a:ext uri="{28A0092B-C50C-407E-A947-70E740481C1C}">
                           <a14:useLocalDpi xmlns:a14="http://schemas.microsoft.com/office/drawing/2010/main" val="0"/>
@@ -5941,7 +5861,7 @@
                     <pic:cNvPicPr/>
                   </pic:nvPicPr>
                   <pic:blipFill>
-                    <a:blip r:embed="rId42">
+                    <a:blip r:embed="rId41">
                       <a:extLst>
                         <a:ext uri="{28A0092B-C50C-407E-A947-70E740481C1C}">
                           <a14:useLocalDpi xmlns:a14="http://schemas.microsoft.com/office/drawing/2010/main" val="0"/>
@@ -6463,7 +6383,7 @@
                     <pic:cNvPicPr/>
                   </pic:nvPicPr>
                   <pic:blipFill>
-                    <a:blip r:embed="rId43">
+                    <a:blip r:embed="rId42">
                       <a:extLst>
                         <a:ext uri="{28A0092B-C50C-407E-A947-70E740481C1C}">
                           <a14:useLocalDpi xmlns:a14="http://schemas.microsoft.com/office/drawing/2010/main" val="0"/>
@@ -6519,7 +6439,7 @@
                     <pic:cNvPicPr/>
                   </pic:nvPicPr>
                   <pic:blipFill>
-                    <a:blip r:embed="rId44">
+                    <a:blip r:embed="rId43">
                       <a:extLst>
                         <a:ext uri="{28A0092B-C50C-407E-A947-70E740481C1C}">
                           <a14:useLocalDpi xmlns:a14="http://schemas.microsoft.com/office/drawing/2010/main" val="0"/>
@@ -6575,7 +6495,7 @@
                     <pic:cNvPicPr/>
                   </pic:nvPicPr>
                   <pic:blipFill>
-                    <a:blip r:embed="rId45">
+                    <a:blip r:embed="rId44">
                       <a:extLst>
                         <a:ext uri="{28A0092B-C50C-407E-A947-70E740481C1C}">
                           <a14:useLocalDpi xmlns:a14="http://schemas.microsoft.com/office/drawing/2010/main" val="0"/>
@@ -6694,7 +6614,7 @@
                     <pic:cNvPicPr/>
                   </pic:nvPicPr>
                   <pic:blipFill>
-                    <a:blip r:embed="rId46">
+                    <a:blip r:embed="rId45">
                       <a:extLst>
                         <a:ext uri="{28A0092B-C50C-407E-A947-70E740481C1C}">
                           <a14:useLocalDpi xmlns:a14="http://schemas.microsoft.com/office/drawing/2010/main" val="0"/>
@@ -6839,7 +6759,7 @@
                     <pic:cNvPicPr/>
                   </pic:nvPicPr>
                   <pic:blipFill>
-                    <a:blip r:embed="rId47" cstate="print">
+                    <a:blip r:embed="rId46" cstate="print">
                       <a:extLst>
                         <a:ext uri="{28A0092B-C50C-407E-A947-70E740481C1C}">
                           <a14:useLocalDpi xmlns:a14="http://schemas.microsoft.com/office/drawing/2010/main" val="0"/>
@@ -6933,7 +6853,7 @@
                     <pic:cNvPicPr/>
                   </pic:nvPicPr>
                   <pic:blipFill>
-                    <a:blip r:embed="rId48">
+                    <a:blip r:embed="rId47">
                       <a:extLst>
                         <a:ext uri="{28A0092B-C50C-407E-A947-70E740481C1C}">
                           <a14:useLocalDpi xmlns:a14="http://schemas.microsoft.com/office/drawing/2010/main" val="0"/>
@@ -7441,7 +7361,7 @@
                     <pic:cNvPicPr/>
                   </pic:nvPicPr>
                   <pic:blipFill>
-                    <a:blip r:embed="rId49">
+                    <a:blip r:embed="rId48">
                       <a:extLst>
                         <a:ext uri="{28A0092B-C50C-407E-A947-70E740481C1C}">
                           <a14:useLocalDpi xmlns:a14="http://schemas.microsoft.com/office/drawing/2010/main" val="0"/>
@@ -7560,7 +7480,7 @@
                     <pic:cNvPicPr/>
                   </pic:nvPicPr>
                   <pic:blipFill>
-                    <a:blip r:embed="rId50">
+                    <a:blip r:embed="rId49">
                       <a:extLst>
                         <a:ext uri="{28A0092B-C50C-407E-A947-70E740481C1C}">
                           <a14:useLocalDpi xmlns:a14="http://schemas.microsoft.com/office/drawing/2010/main" val="0"/>

</xml_diff>

<commit_message>
Actualiza la documentacion del procesamiento de hoja 5.2PM
</commit_message>
<xml_diff>
--- a/Documentacion/Procesamiento de Datos.docx
+++ b/Documentacion/Procesamiento de Datos.docx
@@ -5295,21 +5295,21 @@
           <w:rFonts w:ascii="Arial" w:hAnsi="Arial" w:cs="Arial"/>
           <w:lang w:val="es-CO"/>
         </w:rPr>
-        <w:t xml:space="preserve">', 'Municipio', </w:t>
-      </w:r>
-      <w:r>
-        <w:rPr>
-          <w:rFonts w:ascii="Arial" w:hAnsi="Arial" w:cs="Arial"/>
-          <w:lang w:val="es-CO"/>
-        </w:rPr>
-        <w:t xml:space="preserve">y </w:t>
-      </w:r>
-      <w:r>
-        <w:rPr>
-          <w:rFonts w:ascii="Arial" w:hAnsi="Arial" w:cs="Arial"/>
-          <w:lang w:val="es-CO"/>
-        </w:rPr>
-        <w:t>'Total'</w:t>
+        <w:t>'</w:t>
+      </w:r>
+      <w:r>
+        <w:rPr>
+          <w:rFonts w:ascii="Arial" w:hAnsi="Arial" w:cs="Arial"/>
+          <w:lang w:val="es-CO"/>
+        </w:rPr>
+        <w:t xml:space="preserve"> y</w:t>
+      </w:r>
+      <w:r>
+        <w:rPr>
+          <w:rFonts w:ascii="Arial" w:hAnsi="Arial" w:cs="Arial"/>
+          <w:lang w:val="es-CO"/>
+        </w:rPr>
+        <w:t xml:space="preserve"> 'Municipio'</w:t>
       </w:r>
       <w:r>
         <w:rPr>
@@ -5587,86 +5587,6 @@
           <w:rFonts w:ascii="Arial" w:hAnsi="Arial" w:cs="Arial"/>
           <w:lang w:val="es-CO"/>
         </w:rPr>
-        <w:t>Se filtran las filas que contienen resúmenes de datos (Totales).</w:t>
-      </w:r>
-    </w:p>
-    <w:p>
-      <w:pPr>
-        <w:rPr>
-          <w:rFonts w:ascii="Arial" w:hAnsi="Arial" w:cs="Arial"/>
-          <w:lang w:val="es-CO"/>
-        </w:rPr>
-      </w:pPr>
-      <w:r>
-        <w:rPr>
-          <w:rFonts w:ascii="Arial" w:hAnsi="Arial" w:cs="Arial"/>
-          <w:noProof/>
-          <w:lang w:val="es-CO"/>
-        </w:rPr>
-        <w:lastRenderedPageBreak/>
-        <w:drawing>
-          <wp:inline distT="0" distB="0" distL="0" distR="0" wp14:anchorId="7A07F4AC" wp14:editId="469578A5">
-            <wp:extent cx="5612130" cy="4157980"/>
-            <wp:effectExtent l="0" t="0" r="7620" b="0"/>
-            <wp:docPr id="31" name="Imagen 31"/>
-            <wp:cNvGraphicFramePr>
-              <a:graphicFrameLocks xmlns:a="http://schemas.openxmlformats.org/drawingml/2006/main" noChangeAspect="1"/>
-            </wp:cNvGraphicFramePr>
-            <a:graphic xmlns:a="http://schemas.openxmlformats.org/drawingml/2006/main">
-              <a:graphicData uri="http://schemas.openxmlformats.org/drawingml/2006/picture">
-                <pic:pic xmlns:pic="http://schemas.openxmlformats.org/drawingml/2006/picture">
-                  <pic:nvPicPr>
-                    <pic:cNvPr id="31" name="Imagen 31"/>
-                    <pic:cNvPicPr/>
-                  </pic:nvPicPr>
-                  <pic:blipFill>
-                    <a:blip r:embed="rId39">
-                      <a:extLst>
-                        <a:ext uri="{28A0092B-C50C-407E-A947-70E740481C1C}">
-                          <a14:useLocalDpi xmlns:a14="http://schemas.microsoft.com/office/drawing/2010/main" val="0"/>
-                        </a:ext>
-                      </a:extLst>
-                    </a:blip>
-                    <a:stretch>
-                      <a:fillRect/>
-                    </a:stretch>
-                  </pic:blipFill>
-                  <pic:spPr>
-                    <a:xfrm>
-                      <a:off x="0" y="0"/>
-                      <a:ext cx="5612130" cy="4157980"/>
-                    </a:xfrm>
-                    <a:prstGeom prst="rect">
-                      <a:avLst/>
-                    </a:prstGeom>
-                  </pic:spPr>
-                </pic:pic>
-              </a:graphicData>
-            </a:graphic>
-          </wp:inline>
-        </w:drawing>
-      </w:r>
-    </w:p>
-    <w:p>
-      <w:pPr>
-        <w:rPr>
-          <w:rFonts w:ascii="Arial" w:hAnsi="Arial" w:cs="Arial"/>
-          <w:lang w:val="es-CO"/>
-        </w:rPr>
-      </w:pPr>
-    </w:p>
-    <w:p>
-      <w:pPr>
-        <w:rPr>
-          <w:rFonts w:ascii="Arial" w:hAnsi="Arial" w:cs="Arial"/>
-          <w:lang w:val="es-CO"/>
-        </w:rPr>
-      </w:pPr>
-      <w:r>
-        <w:rPr>
-          <w:rFonts w:ascii="Arial" w:hAnsi="Arial" w:cs="Arial"/>
-          <w:lang w:val="es-CO"/>
-        </w:rPr>
         <w:t>Finalmente, se cambian las tildes dentro de los datos, reemplazando vocales con tilde por vocales sin tilde.</w:t>
       </w:r>
     </w:p>
@@ -5766,7 +5686,7 @@
                     <pic:cNvPicPr/>
                   </pic:nvPicPr>
                   <pic:blipFill>
-                    <a:blip r:embed="rId40">
+                    <a:blip r:embed="rId39">
                       <a:extLst>
                         <a:ext uri="{28A0092B-C50C-407E-A947-70E740481C1C}">
                           <a14:useLocalDpi xmlns:a14="http://schemas.microsoft.com/office/drawing/2010/main" val="0"/>
@@ -5861,7 +5781,7 @@
                     <pic:cNvPicPr/>
                   </pic:nvPicPr>
                   <pic:blipFill>
-                    <a:blip r:embed="rId41">
+                    <a:blip r:embed="rId40">
                       <a:extLst>
                         <a:ext uri="{28A0092B-C50C-407E-A947-70E740481C1C}">
                           <a14:useLocalDpi xmlns:a14="http://schemas.microsoft.com/office/drawing/2010/main" val="0"/>
@@ -6383,7 +6303,7 @@
                     <pic:cNvPicPr/>
                   </pic:nvPicPr>
                   <pic:blipFill>
-                    <a:blip r:embed="rId42">
+                    <a:blip r:embed="rId41">
                       <a:extLst>
                         <a:ext uri="{28A0092B-C50C-407E-A947-70E740481C1C}">
                           <a14:useLocalDpi xmlns:a14="http://schemas.microsoft.com/office/drawing/2010/main" val="0"/>
@@ -6439,7 +6359,7 @@
                     <pic:cNvPicPr/>
                   </pic:nvPicPr>
                   <pic:blipFill>
-                    <a:blip r:embed="rId43">
+                    <a:blip r:embed="rId42">
                       <a:extLst>
                         <a:ext uri="{28A0092B-C50C-407E-A947-70E740481C1C}">
                           <a14:useLocalDpi xmlns:a14="http://schemas.microsoft.com/office/drawing/2010/main" val="0"/>
@@ -6495,7 +6415,7 @@
                     <pic:cNvPicPr/>
                   </pic:nvPicPr>
                   <pic:blipFill>
-                    <a:blip r:embed="rId44">
+                    <a:blip r:embed="rId43">
                       <a:extLst>
                         <a:ext uri="{28A0092B-C50C-407E-A947-70E740481C1C}">
                           <a14:useLocalDpi xmlns:a14="http://schemas.microsoft.com/office/drawing/2010/main" val="0"/>
@@ -6614,7 +6534,7 @@
                     <pic:cNvPicPr/>
                   </pic:nvPicPr>
                   <pic:blipFill>
-                    <a:blip r:embed="rId45">
+                    <a:blip r:embed="rId44">
                       <a:extLst>
                         <a:ext uri="{28A0092B-C50C-407E-A947-70E740481C1C}">
                           <a14:useLocalDpi xmlns:a14="http://schemas.microsoft.com/office/drawing/2010/main" val="0"/>
@@ -6759,7 +6679,7 @@
                     <pic:cNvPicPr/>
                   </pic:nvPicPr>
                   <pic:blipFill>
-                    <a:blip r:embed="rId46" cstate="print">
+                    <a:blip r:embed="rId45" cstate="print">
                       <a:extLst>
                         <a:ext uri="{28A0092B-C50C-407E-A947-70E740481C1C}">
                           <a14:useLocalDpi xmlns:a14="http://schemas.microsoft.com/office/drawing/2010/main" val="0"/>
@@ -6853,7 +6773,7 @@
                     <pic:cNvPicPr/>
                   </pic:nvPicPr>
                   <pic:blipFill>
-                    <a:blip r:embed="rId47">
+                    <a:blip r:embed="rId46">
                       <a:extLst>
                         <a:ext uri="{28A0092B-C50C-407E-A947-70E740481C1C}">
                           <a14:useLocalDpi xmlns:a14="http://schemas.microsoft.com/office/drawing/2010/main" val="0"/>
@@ -7361,7 +7281,7 @@
                     <pic:cNvPicPr/>
                   </pic:nvPicPr>
                   <pic:blipFill>
-                    <a:blip r:embed="rId48">
+                    <a:blip r:embed="rId47">
                       <a:extLst>
                         <a:ext uri="{28A0092B-C50C-407E-A947-70E740481C1C}">
                           <a14:useLocalDpi xmlns:a14="http://schemas.microsoft.com/office/drawing/2010/main" val="0"/>
@@ -7480,7 +7400,7 @@
                     <pic:cNvPicPr/>
                   </pic:nvPicPr>
                   <pic:blipFill>
-                    <a:blip r:embed="rId49">
+                    <a:blip r:embed="rId48">
                       <a:extLst>
                         <a:ext uri="{28A0092B-C50C-407E-A947-70E740481C1C}">
                           <a14:useLocalDpi xmlns:a14="http://schemas.microsoft.com/office/drawing/2010/main" val="0"/>

</xml_diff>

<commit_message>
Agrega documentación de procesamiento de hoja 14PM
</commit_message>
<xml_diff>
--- a/Documentacion/Procesamiento de Datos.docx
+++ b/Documentacion/Procesamiento de Datos.docx
@@ -6998,23 +6998,21 @@
           <w:rFonts w:ascii="Arial" w:hAnsi="Arial" w:cs="Arial"/>
           <w:lang w:val="es-CO"/>
         </w:rPr>
-        <w:t xml:space="preserve"> en 3 partes, correspondientes a las áreas, ignorando el total para remover resúmenes de datos en el </w:t>
-      </w:r>
-      <w:proofErr w:type="spellStart"/>
-      <w:r>
-        <w:rPr>
-          <w:rFonts w:ascii="Arial" w:hAnsi="Arial" w:cs="Arial"/>
-          <w:lang w:val="es-CO"/>
-        </w:rPr>
-        <w:t>dataset</w:t>
-      </w:r>
-      <w:proofErr w:type="spellEnd"/>
-      <w:r>
-        <w:rPr>
-          <w:rFonts w:ascii="Arial" w:hAnsi="Arial" w:cs="Arial"/>
-          <w:lang w:val="es-CO"/>
-        </w:rPr>
-        <w:t xml:space="preserve"> final. Cada subconjunto se concatena con la columna de Grupo de edad, y se asigna una columna ‘</w:t>
+        <w:t xml:space="preserve"> en </w:t>
+      </w:r>
+      <w:r>
+        <w:rPr>
+          <w:rFonts w:ascii="Arial" w:hAnsi="Arial" w:cs="Arial"/>
+          <w:lang w:val="es-CO"/>
+        </w:rPr>
+        <w:t>4</w:t>
+      </w:r>
+      <w:r>
+        <w:rPr>
+          <w:rFonts w:ascii="Arial" w:hAnsi="Arial" w:cs="Arial"/>
+          <w:lang w:val="es-CO"/>
+        </w:rPr>
+        <w:t xml:space="preserve"> partes, correspondientes a las áreas. Cada subconjunto se concatena con la columna de Grupo de edad, y se asigna una columna ‘</w:t>
       </w:r>
       <w:proofErr w:type="spellStart"/>
       <w:r>
@@ -7328,7 +7326,6 @@
           <w:rFonts w:ascii="Arial" w:hAnsi="Arial" w:cs="Arial"/>
           <w:lang w:val="es-CO"/>
         </w:rPr>
-        <w:lastRenderedPageBreak/>
         <w:t xml:space="preserve">Se renombran los </w:t>
       </w:r>
       <w:proofErr w:type="spellStart"/>
@@ -7470,6 +7467,1137 @@
       <w:pPr>
         <w:rPr>
           <w:rFonts w:ascii="Arial" w:hAnsi="Arial" w:cs="Arial"/>
+          <w:b/>
+          <w:bCs/>
+          <w:lang w:val="es-CO"/>
+        </w:rPr>
+      </w:pPr>
+      <w:r>
+        <w:rPr>
+          <w:rFonts w:ascii="Arial" w:hAnsi="Arial" w:cs="Arial"/>
+          <w:b/>
+          <w:bCs/>
+          <w:lang w:val="es-CO"/>
+        </w:rPr>
+        <w:t>14PM</w:t>
+      </w:r>
+    </w:p>
+    <w:p>
+      <w:pPr>
+        <w:rPr>
+          <w:rFonts w:ascii="Arial" w:hAnsi="Arial" w:cs="Arial"/>
+          <w:lang w:val="es-CO"/>
+        </w:rPr>
+      </w:pPr>
+      <w:r>
+        <w:rPr>
+          <w:rFonts w:ascii="Arial" w:hAnsi="Arial" w:cs="Arial"/>
+          <w:lang w:val="es-CO"/>
+        </w:rPr>
+        <w:t xml:space="preserve">Se empieza por extraer solo la parte correspondiente a los datos del archivo </w:t>
+      </w:r>
+      <w:proofErr w:type="spellStart"/>
+      <w:r>
+        <w:rPr>
+          <w:rFonts w:ascii="Arial" w:hAnsi="Arial" w:cs="Arial"/>
+          <w:lang w:val="es-CO"/>
+        </w:rPr>
+        <w:t>excel</w:t>
+      </w:r>
+      <w:proofErr w:type="spellEnd"/>
+      <w:r>
+        <w:rPr>
+          <w:rFonts w:ascii="Arial" w:hAnsi="Arial" w:cs="Arial"/>
+          <w:lang w:val="es-CO"/>
+        </w:rPr>
+        <w:t xml:space="preserve">, para lo cual se ignoran las primeras </w:t>
+      </w:r>
+      <w:r>
+        <w:rPr>
+          <w:rFonts w:ascii="Arial" w:hAnsi="Arial" w:cs="Arial"/>
+          <w:lang w:val="es-CO"/>
+        </w:rPr>
+        <w:t>8</w:t>
+      </w:r>
+      <w:r>
+        <w:rPr>
+          <w:rFonts w:ascii="Arial" w:hAnsi="Arial" w:cs="Arial"/>
+          <w:lang w:val="es-CO"/>
+        </w:rPr>
+        <w:t xml:space="preserve"> filas de la hoja.</w:t>
+      </w:r>
+    </w:p>
+    <w:p>
+      <w:pPr>
+        <w:rPr>
+          <w:rFonts w:ascii="Arial" w:hAnsi="Arial" w:cs="Arial"/>
+          <w:lang w:val="es-CO"/>
+        </w:rPr>
+      </w:pPr>
+      <w:r>
+        <w:rPr>
+          <w:rFonts w:ascii="Arial" w:hAnsi="Arial" w:cs="Arial"/>
+          <w:noProof/>
+          <w:lang w:val="es-CO"/>
+        </w:rPr>
+        <w:drawing>
+          <wp:inline distT="0" distB="0" distL="0" distR="0" wp14:anchorId="6B8529A4" wp14:editId="75C29959">
+            <wp:extent cx="5612130" cy="3488690"/>
+            <wp:effectExtent l="0" t="0" r="7620" b="0"/>
+            <wp:docPr id="1" name="Imagen 1"/>
+            <wp:cNvGraphicFramePr>
+              <a:graphicFrameLocks xmlns:a="http://schemas.openxmlformats.org/drawingml/2006/main" noChangeAspect="1"/>
+            </wp:cNvGraphicFramePr>
+            <a:graphic xmlns:a="http://schemas.openxmlformats.org/drawingml/2006/main">
+              <a:graphicData uri="http://schemas.openxmlformats.org/drawingml/2006/picture">
+                <pic:pic xmlns:pic="http://schemas.openxmlformats.org/drawingml/2006/picture">
+                  <pic:nvPicPr>
+                    <pic:cNvPr id="1" name="Imagen 1"/>
+                    <pic:cNvPicPr/>
+                  </pic:nvPicPr>
+                  <pic:blipFill>
+                    <a:blip r:embed="rId49">
+                      <a:extLst>
+                        <a:ext uri="{28A0092B-C50C-407E-A947-70E740481C1C}">
+                          <a14:useLocalDpi xmlns:a14="http://schemas.microsoft.com/office/drawing/2010/main" val="0"/>
+                        </a:ext>
+                      </a:extLst>
+                    </a:blip>
+                    <a:stretch>
+                      <a:fillRect/>
+                    </a:stretch>
+                  </pic:blipFill>
+                  <pic:spPr>
+                    <a:xfrm>
+                      <a:off x="0" y="0"/>
+                      <a:ext cx="5612130" cy="3488690"/>
+                    </a:xfrm>
+                    <a:prstGeom prst="rect">
+                      <a:avLst/>
+                    </a:prstGeom>
+                  </pic:spPr>
+                </pic:pic>
+              </a:graphicData>
+            </a:graphic>
+          </wp:inline>
+        </w:drawing>
+      </w:r>
+    </w:p>
+    <w:p>
+      <w:pPr>
+        <w:rPr>
+          <w:rFonts w:ascii="Arial" w:hAnsi="Arial" w:cs="Arial"/>
+          <w:lang w:val="es-CO"/>
+        </w:rPr>
+      </w:pPr>
+      <w:r>
+        <w:rPr>
+          <w:rFonts w:ascii="Arial" w:hAnsi="Arial" w:cs="Arial"/>
+          <w:lang w:val="es-CO"/>
+        </w:rPr>
+        <w:lastRenderedPageBreak/>
+        <w:t xml:space="preserve">Se extraen los </w:t>
+      </w:r>
+      <w:proofErr w:type="spellStart"/>
+      <w:r>
+        <w:rPr>
+          <w:rFonts w:ascii="Arial" w:hAnsi="Arial" w:cs="Arial"/>
+          <w:lang w:val="es-CO"/>
+        </w:rPr>
+        <w:t>headers</w:t>
+      </w:r>
+      <w:proofErr w:type="spellEnd"/>
+      <w:r>
+        <w:rPr>
+          <w:rFonts w:ascii="Arial" w:hAnsi="Arial" w:cs="Arial"/>
+          <w:lang w:val="es-CO"/>
+        </w:rPr>
+        <w:t xml:space="preserve"> originales para renombrar las columnas cuando se filtren los datos por municipio.</w:t>
+      </w:r>
+    </w:p>
+    <w:p>
+      <w:pPr>
+        <w:rPr>
+          <w:rFonts w:ascii="Arial" w:hAnsi="Arial" w:cs="Arial"/>
+          <w:lang w:val="es-CO"/>
+        </w:rPr>
+      </w:pPr>
+      <w:r>
+        <w:rPr>
+          <w:rFonts w:ascii="Arial" w:hAnsi="Arial" w:cs="Arial"/>
+          <w:noProof/>
+          <w:lang w:val="es-CO"/>
+        </w:rPr>
+        <w:drawing>
+          <wp:inline distT="0" distB="0" distL="0" distR="0" wp14:anchorId="52EBCB97" wp14:editId="656EA7AB">
+            <wp:extent cx="5563376" cy="2448267"/>
+            <wp:effectExtent l="0" t="0" r="0" b="9525"/>
+            <wp:docPr id="2" name="Imagen 2"/>
+            <wp:cNvGraphicFramePr>
+              <a:graphicFrameLocks xmlns:a="http://schemas.openxmlformats.org/drawingml/2006/main" noChangeAspect="1"/>
+            </wp:cNvGraphicFramePr>
+            <a:graphic xmlns:a="http://schemas.openxmlformats.org/drawingml/2006/main">
+              <a:graphicData uri="http://schemas.openxmlformats.org/drawingml/2006/picture">
+                <pic:pic xmlns:pic="http://schemas.openxmlformats.org/drawingml/2006/picture">
+                  <pic:nvPicPr>
+                    <pic:cNvPr id="2" name="Imagen 2"/>
+                    <pic:cNvPicPr/>
+                  </pic:nvPicPr>
+                  <pic:blipFill>
+                    <a:blip r:embed="rId50">
+                      <a:extLst>
+                        <a:ext uri="{28A0092B-C50C-407E-A947-70E740481C1C}">
+                          <a14:useLocalDpi xmlns:a14="http://schemas.microsoft.com/office/drawing/2010/main" val="0"/>
+                        </a:ext>
+                      </a:extLst>
+                    </a:blip>
+                    <a:stretch>
+                      <a:fillRect/>
+                    </a:stretch>
+                  </pic:blipFill>
+                  <pic:spPr>
+                    <a:xfrm>
+                      <a:off x="0" y="0"/>
+                      <a:ext cx="5563376" cy="2448267"/>
+                    </a:xfrm>
+                    <a:prstGeom prst="rect">
+                      <a:avLst/>
+                    </a:prstGeom>
+                  </pic:spPr>
+                </pic:pic>
+              </a:graphicData>
+            </a:graphic>
+          </wp:inline>
+        </w:drawing>
+      </w:r>
+    </w:p>
+    <w:p>
+      <w:pPr>
+        <w:rPr>
+          <w:rFonts w:ascii="Arial" w:hAnsi="Arial" w:cs="Arial"/>
+          <w:lang w:val="es-CO"/>
+        </w:rPr>
+      </w:pPr>
+    </w:p>
+    <w:p>
+      <w:pPr>
+        <w:rPr>
+          <w:rFonts w:ascii="Arial" w:hAnsi="Arial" w:cs="Arial"/>
+          <w:lang w:val="es-CO"/>
+        </w:rPr>
+      </w:pPr>
+      <w:r>
+        <w:rPr>
+          <w:rFonts w:ascii="Arial" w:hAnsi="Arial" w:cs="Arial"/>
+          <w:lang w:val="es-CO"/>
+        </w:rPr>
+        <w:t>Filtrado de datos que no son de Viterbo, Caldas</w:t>
+      </w:r>
+      <w:r>
+        <w:rPr>
+          <w:rFonts w:ascii="Arial" w:hAnsi="Arial" w:cs="Arial"/>
+          <w:lang w:val="es-CO"/>
+        </w:rPr>
+        <w:t>.</w:t>
+      </w:r>
+    </w:p>
+    <w:p>
+      <w:pPr>
+        <w:rPr>
+          <w:rFonts w:ascii="Arial" w:hAnsi="Arial" w:cs="Arial"/>
+          <w:lang w:val="es-CO"/>
+        </w:rPr>
+      </w:pPr>
+      <w:r>
+        <w:rPr>
+          <w:rFonts w:ascii="Arial" w:hAnsi="Arial" w:cs="Arial"/>
+          <w:lang w:val="es-CO"/>
+        </w:rPr>
+        <w:t>Para esta hoja se decide propagar el valor del identificador del municipio, ‘17877_Viterbo’, y seleccionar solo los registros que lo contengan.</w:t>
+      </w:r>
+    </w:p>
+    <w:p>
+      <w:pPr>
+        <w:rPr>
+          <w:rFonts w:ascii="Arial" w:hAnsi="Arial" w:cs="Arial"/>
+          <w:lang w:val="es-CO"/>
+        </w:rPr>
+      </w:pPr>
+      <w:r>
+        <w:rPr>
+          <w:rFonts w:ascii="Arial" w:hAnsi="Arial" w:cs="Arial"/>
+          <w:noProof/>
+          <w:lang w:val="es-CO"/>
+        </w:rPr>
+        <w:drawing>
+          <wp:inline distT="0" distB="0" distL="0" distR="0" wp14:anchorId="00684C02" wp14:editId="71CC58A6">
+            <wp:extent cx="5612130" cy="3326765"/>
+            <wp:effectExtent l="0" t="0" r="7620" b="6985"/>
+            <wp:docPr id="15" name="Imagen 15"/>
+            <wp:cNvGraphicFramePr>
+              <a:graphicFrameLocks xmlns:a="http://schemas.openxmlformats.org/drawingml/2006/main" noChangeAspect="1"/>
+            </wp:cNvGraphicFramePr>
+            <a:graphic xmlns:a="http://schemas.openxmlformats.org/drawingml/2006/main">
+              <a:graphicData uri="http://schemas.openxmlformats.org/drawingml/2006/picture">
+                <pic:pic xmlns:pic="http://schemas.openxmlformats.org/drawingml/2006/picture">
+                  <pic:nvPicPr>
+                    <pic:cNvPr id="15" name="Imagen 15"/>
+                    <pic:cNvPicPr/>
+                  </pic:nvPicPr>
+                  <pic:blipFill>
+                    <a:blip r:embed="rId51">
+                      <a:extLst>
+                        <a:ext uri="{28A0092B-C50C-407E-A947-70E740481C1C}">
+                          <a14:useLocalDpi xmlns:a14="http://schemas.microsoft.com/office/drawing/2010/main" val="0"/>
+                        </a:ext>
+                      </a:extLst>
+                    </a:blip>
+                    <a:stretch>
+                      <a:fillRect/>
+                    </a:stretch>
+                  </pic:blipFill>
+                  <pic:spPr>
+                    <a:xfrm>
+                      <a:off x="0" y="0"/>
+                      <a:ext cx="5612130" cy="3326765"/>
+                    </a:xfrm>
+                    <a:prstGeom prst="rect">
+                      <a:avLst/>
+                    </a:prstGeom>
+                  </pic:spPr>
+                </pic:pic>
+              </a:graphicData>
+            </a:graphic>
+          </wp:inline>
+        </w:drawing>
+      </w:r>
+    </w:p>
+    <w:p>
+      <w:pPr>
+        <w:rPr>
+          <w:rFonts w:ascii="Arial" w:hAnsi="Arial" w:cs="Arial"/>
+          <w:lang w:val="es-CO"/>
+        </w:rPr>
+      </w:pPr>
+    </w:p>
+    <w:p>
+      <w:pPr>
+        <w:rPr>
+          <w:rFonts w:ascii="Arial" w:hAnsi="Arial" w:cs="Arial"/>
+          <w:lang w:val="es-CO"/>
+        </w:rPr>
+      </w:pPr>
+    </w:p>
+    <w:p>
+      <w:pPr>
+        <w:rPr>
+          <w:rFonts w:ascii="Arial" w:hAnsi="Arial" w:cs="Arial"/>
+          <w:lang w:val="es-CO"/>
+        </w:rPr>
+      </w:pPr>
+      <w:r>
+        <w:rPr>
+          <w:rFonts w:ascii="Arial" w:hAnsi="Arial" w:cs="Arial"/>
+          <w:lang w:val="es-CO"/>
+        </w:rPr>
+        <w:lastRenderedPageBreak/>
+        <w:t xml:space="preserve">Actualización de </w:t>
+      </w:r>
+      <w:proofErr w:type="spellStart"/>
+      <w:r>
+        <w:rPr>
+          <w:rFonts w:ascii="Arial" w:hAnsi="Arial" w:cs="Arial"/>
+          <w:lang w:val="es-CO"/>
+        </w:rPr>
+        <w:t>headers</w:t>
+      </w:r>
+      <w:proofErr w:type="spellEnd"/>
+    </w:p>
+    <w:p>
+      <w:pPr>
+        <w:rPr>
+          <w:rFonts w:ascii="Arial" w:hAnsi="Arial" w:cs="Arial"/>
+          <w:lang w:val="es-CO"/>
+        </w:rPr>
+      </w:pPr>
+      <w:r>
+        <w:rPr>
+          <w:rFonts w:ascii="Arial" w:hAnsi="Arial" w:cs="Arial"/>
+          <w:lang w:val="es-CO"/>
+        </w:rPr>
+        <w:t xml:space="preserve">Al extraer los datos desde el archivo .xlsx, se verifica el </w:t>
+      </w:r>
+      <w:proofErr w:type="spellStart"/>
+      <w:r>
+        <w:rPr>
+          <w:rFonts w:ascii="Arial" w:hAnsi="Arial" w:cs="Arial"/>
+          <w:lang w:val="es-CO"/>
+        </w:rPr>
+        <w:t>dataframe</w:t>
+      </w:r>
+      <w:proofErr w:type="spellEnd"/>
+      <w:r>
+        <w:rPr>
+          <w:rFonts w:ascii="Arial" w:hAnsi="Arial" w:cs="Arial"/>
+          <w:lang w:val="es-CO"/>
+        </w:rPr>
+        <w:t xml:space="preserve"> generado por Pandas, empezando por los nombres de las columnas y se observan las siguientes incidencias:</w:t>
+      </w:r>
+    </w:p>
+    <w:p>
+      <w:pPr>
+        <w:pStyle w:val="Prrafodelista"/>
+        <w:numPr>
+          <w:ilvl w:val="0"/>
+          <w:numId w:val="1"/>
+        </w:numPr>
+        <w:rPr>
+          <w:rFonts w:ascii="Arial" w:hAnsi="Arial" w:cs="Arial"/>
+          <w:lang w:val="es-CO"/>
+        </w:rPr>
+      </w:pPr>
+      <w:proofErr w:type="spellStart"/>
+      <w:r>
+        <w:rPr>
+          <w:rFonts w:ascii="Arial" w:hAnsi="Arial" w:cs="Arial"/>
+          <w:lang w:val="es-CO"/>
+        </w:rPr>
+        <w:t>Headers</w:t>
+      </w:r>
+      <w:proofErr w:type="spellEnd"/>
+      <w:r>
+        <w:rPr>
+          <w:rFonts w:ascii="Arial" w:hAnsi="Arial" w:cs="Arial"/>
+          <w:lang w:val="es-CO"/>
+        </w:rPr>
+        <w:t xml:space="preserve"> sin nombres descriptivos: </w:t>
+      </w:r>
+      <w:proofErr w:type="spellStart"/>
+      <w:r>
+        <w:rPr>
+          <w:rFonts w:ascii="Arial" w:hAnsi="Arial" w:cs="Arial"/>
+          <w:lang w:val="es-CO"/>
+        </w:rPr>
+        <w:t>headers</w:t>
+      </w:r>
+      <w:proofErr w:type="spellEnd"/>
+      <w:r>
+        <w:rPr>
+          <w:rFonts w:ascii="Arial" w:hAnsi="Arial" w:cs="Arial"/>
+          <w:lang w:val="es-CO"/>
+        </w:rPr>
+        <w:t xml:space="preserve"> con nombres por defecto de Pandas tipo ‘</w:t>
+      </w:r>
+      <w:proofErr w:type="spellStart"/>
+      <w:r>
+        <w:rPr>
+          <w:rFonts w:ascii="Arial" w:hAnsi="Arial" w:cs="Arial"/>
+          <w:lang w:val="es-CO"/>
+        </w:rPr>
+        <w:t>Unnamed</w:t>
+      </w:r>
+      <w:proofErr w:type="spellEnd"/>
+      <w:r>
+        <w:rPr>
+          <w:rFonts w:ascii="Arial" w:hAnsi="Arial" w:cs="Arial"/>
+          <w:lang w:val="es-CO"/>
+        </w:rPr>
+        <w:t>: X’.</w:t>
+      </w:r>
+    </w:p>
+    <w:p>
+      <w:pPr>
+        <w:pStyle w:val="Prrafodelista"/>
+        <w:numPr>
+          <w:ilvl w:val="0"/>
+          <w:numId w:val="1"/>
+        </w:numPr>
+        <w:rPr>
+          <w:rFonts w:ascii="Arial" w:hAnsi="Arial" w:cs="Arial"/>
+          <w:lang w:val="es-CO"/>
+        </w:rPr>
+      </w:pPr>
+      <w:proofErr w:type="spellStart"/>
+      <w:r>
+        <w:rPr>
+          <w:rFonts w:ascii="Arial" w:hAnsi="Arial" w:cs="Arial"/>
+          <w:lang w:val="es-CO"/>
+        </w:rPr>
+        <w:t>Headers</w:t>
+      </w:r>
+      <w:proofErr w:type="spellEnd"/>
+      <w:r>
+        <w:rPr>
+          <w:rFonts w:ascii="Arial" w:hAnsi="Arial" w:cs="Arial"/>
+          <w:lang w:val="es-CO"/>
+        </w:rPr>
+        <w:t xml:space="preserve"> en jerarquías inferiores debido a la agrupación de datos: Los </w:t>
+      </w:r>
+      <w:proofErr w:type="spellStart"/>
+      <w:r>
+        <w:rPr>
+          <w:rFonts w:ascii="Arial" w:hAnsi="Arial" w:cs="Arial"/>
+          <w:lang w:val="es-CO"/>
+        </w:rPr>
+        <w:t>headers</w:t>
+      </w:r>
+      <w:proofErr w:type="spellEnd"/>
+      <w:r>
+        <w:rPr>
+          <w:rFonts w:ascii="Arial" w:hAnsi="Arial" w:cs="Arial"/>
+          <w:lang w:val="es-CO"/>
+        </w:rPr>
+        <w:t xml:space="preserve"> se encuentran en la </w:t>
+      </w:r>
+      <w:r>
+        <w:rPr>
+          <w:rFonts w:ascii="Arial" w:hAnsi="Arial" w:cs="Arial"/>
+          <w:lang w:val="es-CO"/>
+        </w:rPr>
+        <w:t>segunda</w:t>
+      </w:r>
+      <w:r>
+        <w:rPr>
+          <w:rFonts w:ascii="Arial" w:hAnsi="Arial" w:cs="Arial"/>
+          <w:lang w:val="es-CO"/>
+        </w:rPr>
+        <w:t xml:space="preserve"> fila de datos debido al diseño del .xlsx donde se busca describir la agrupación por Área en la que se tomaron los datos</w:t>
+      </w:r>
+      <w:r>
+        <w:rPr>
+          <w:rFonts w:ascii="Arial" w:hAnsi="Arial" w:cs="Arial"/>
+          <w:lang w:val="es-CO"/>
+        </w:rPr>
+        <w:t>, y esta a su vez, tiene otro tipo de agrupación en la primera fila donde se separan los datos en si el censado tuvo alguna enfermedad los últimos 30 días, y a qué servicio de salud acudieron</w:t>
+      </w:r>
+      <w:r>
+        <w:rPr>
+          <w:rFonts w:ascii="Arial" w:hAnsi="Arial" w:cs="Arial"/>
+          <w:lang w:val="es-CO"/>
+        </w:rPr>
+        <w:t>.</w:t>
+      </w:r>
+    </w:p>
+    <w:p>
+      <w:pPr>
+        <w:rPr>
+          <w:rFonts w:ascii="Arial" w:hAnsi="Arial" w:cs="Arial"/>
+          <w:lang w:val="es-CO"/>
+        </w:rPr>
+      </w:pPr>
+    </w:p>
+    <w:p>
+      <w:pPr>
+        <w:rPr>
+          <w:rFonts w:ascii="Arial" w:hAnsi="Arial" w:cs="Arial"/>
+          <w:lang w:val="es-CO"/>
+        </w:rPr>
+      </w:pPr>
+      <w:r>
+        <w:rPr>
+          <w:rFonts w:ascii="Arial" w:hAnsi="Arial" w:cs="Arial"/>
+          <w:lang w:val="es-CO"/>
+        </w:rPr>
+        <w:t xml:space="preserve">Debido a la agrupación de datos en las columnas, se divide el </w:t>
+      </w:r>
+      <w:proofErr w:type="spellStart"/>
+      <w:r>
+        <w:rPr>
+          <w:rFonts w:ascii="Arial" w:hAnsi="Arial" w:cs="Arial"/>
+          <w:lang w:val="es-CO"/>
+        </w:rPr>
+        <w:t>dataframe</w:t>
+      </w:r>
+      <w:proofErr w:type="spellEnd"/>
+      <w:r>
+        <w:rPr>
+          <w:rFonts w:ascii="Arial" w:hAnsi="Arial" w:cs="Arial"/>
+          <w:lang w:val="es-CO"/>
+        </w:rPr>
+        <w:t xml:space="preserve"> en 4 partes, correspondientes a las áreas. Cada subconjunto se concatena con la</w:t>
+      </w:r>
+      <w:r>
+        <w:rPr>
+          <w:rFonts w:ascii="Arial" w:hAnsi="Arial" w:cs="Arial"/>
+          <w:lang w:val="es-CO"/>
+        </w:rPr>
+        <w:t>s</w:t>
+      </w:r>
+      <w:r>
+        <w:rPr>
+          <w:rFonts w:ascii="Arial" w:hAnsi="Arial" w:cs="Arial"/>
+          <w:lang w:val="es-CO"/>
+        </w:rPr>
+        <w:t xml:space="preserve"> columna</w:t>
+      </w:r>
+      <w:r>
+        <w:rPr>
+          <w:rFonts w:ascii="Arial" w:hAnsi="Arial" w:cs="Arial"/>
+          <w:lang w:val="es-CO"/>
+        </w:rPr>
+        <w:t>s de ‘Sexo’ y ‘Grupo de edad’</w:t>
+      </w:r>
+      <w:r>
+        <w:rPr>
+          <w:rFonts w:ascii="Arial" w:hAnsi="Arial" w:cs="Arial"/>
+          <w:lang w:val="es-CO"/>
+        </w:rPr>
+        <w:t>, y se asigna una columna ‘</w:t>
+      </w:r>
+      <w:proofErr w:type="spellStart"/>
+      <w:r>
+        <w:rPr>
+          <w:rFonts w:ascii="Arial" w:hAnsi="Arial" w:cs="Arial"/>
+          <w:lang w:val="es-CO"/>
+        </w:rPr>
+        <w:t>Area</w:t>
+      </w:r>
+      <w:proofErr w:type="spellEnd"/>
+      <w:r>
+        <w:rPr>
+          <w:rFonts w:ascii="Arial" w:hAnsi="Arial" w:cs="Arial"/>
+          <w:lang w:val="es-CO"/>
+        </w:rPr>
+        <w:t xml:space="preserve">’ que contiene el área donde fueron tomados los datos. Luego se reemplazan los nombres de las columnas que todavía tienen un nombre por defecto por los siguientes nombres en su orden correspondiente: </w:t>
+      </w:r>
+    </w:p>
+    <w:p>
+      <w:pPr>
+        <w:pStyle w:val="Prrafodelista"/>
+        <w:numPr>
+          <w:ilvl w:val="0"/>
+          <w:numId w:val="8"/>
+        </w:numPr>
+        <w:rPr>
+          <w:rFonts w:ascii="Arial" w:hAnsi="Arial" w:cs="Arial"/>
+          <w:lang w:val="es-CO"/>
+        </w:rPr>
+      </w:pPr>
+      <w:r>
+        <w:rPr>
+          <w:rFonts w:ascii="Arial" w:hAnsi="Arial" w:cs="Arial"/>
+          <w:lang w:val="es-CO"/>
+        </w:rPr>
+        <w:t>'Sí'</w:t>
+      </w:r>
+    </w:p>
+    <w:p>
+      <w:pPr>
+        <w:pStyle w:val="Prrafodelista"/>
+        <w:numPr>
+          <w:ilvl w:val="0"/>
+          <w:numId w:val="8"/>
+        </w:numPr>
+        <w:rPr>
+          <w:rFonts w:ascii="Arial" w:hAnsi="Arial" w:cs="Arial"/>
+          <w:lang w:val="es-CO"/>
+        </w:rPr>
+      </w:pPr>
+      <w:r>
+        <w:rPr>
+          <w:rFonts w:ascii="Arial" w:hAnsi="Arial" w:cs="Arial"/>
+          <w:lang w:val="es-CO"/>
+        </w:rPr>
+        <w:t>'No'</w:t>
+      </w:r>
+    </w:p>
+    <w:p>
+      <w:pPr>
+        <w:pStyle w:val="Prrafodelista"/>
+        <w:numPr>
+          <w:ilvl w:val="0"/>
+          <w:numId w:val="8"/>
+        </w:numPr>
+        <w:rPr>
+          <w:rFonts w:ascii="Arial" w:hAnsi="Arial" w:cs="Arial"/>
+          <w:lang w:val="es-CO"/>
+        </w:rPr>
+      </w:pPr>
+      <w:r>
+        <w:rPr>
+          <w:rFonts w:ascii="Arial" w:hAnsi="Arial" w:cs="Arial"/>
+          <w:lang w:val="es-CO"/>
+        </w:rPr>
+        <w:t xml:space="preserve">'Sin </w:t>
+      </w:r>
+      <w:proofErr w:type="spellStart"/>
+      <w:r>
+        <w:rPr>
+          <w:rFonts w:ascii="Arial" w:hAnsi="Arial" w:cs="Arial"/>
+          <w:lang w:val="es-CO"/>
+        </w:rPr>
+        <w:t>informacion</w:t>
+      </w:r>
+      <w:proofErr w:type="spellEnd"/>
+      <w:r>
+        <w:rPr>
+          <w:rFonts w:ascii="Arial" w:hAnsi="Arial" w:cs="Arial"/>
+          <w:lang w:val="es-CO"/>
+        </w:rPr>
+        <w:t xml:space="preserve"> enfermedad </w:t>
+      </w:r>
+      <w:proofErr w:type="spellStart"/>
+      <w:r>
+        <w:rPr>
+          <w:rFonts w:ascii="Arial" w:hAnsi="Arial" w:cs="Arial"/>
+          <w:lang w:val="es-CO"/>
+        </w:rPr>
+        <w:t>ultimos</w:t>
+      </w:r>
+      <w:proofErr w:type="spellEnd"/>
+      <w:r>
+        <w:rPr>
+          <w:rFonts w:ascii="Arial" w:hAnsi="Arial" w:cs="Arial"/>
+          <w:lang w:val="es-CO"/>
+        </w:rPr>
+        <w:t xml:space="preserve"> 30 </w:t>
+      </w:r>
+      <w:proofErr w:type="spellStart"/>
+      <w:r>
+        <w:rPr>
+          <w:rFonts w:ascii="Arial" w:hAnsi="Arial" w:cs="Arial"/>
+          <w:lang w:val="es-CO"/>
+        </w:rPr>
+        <w:t>dias</w:t>
+      </w:r>
+      <w:proofErr w:type="spellEnd"/>
+      <w:r>
+        <w:rPr>
+          <w:rFonts w:ascii="Arial" w:hAnsi="Arial" w:cs="Arial"/>
+          <w:lang w:val="es-CO"/>
+        </w:rPr>
+        <w:t>'</w:t>
+      </w:r>
+    </w:p>
+    <w:p>
+      <w:pPr>
+        <w:pStyle w:val="Prrafodelista"/>
+        <w:numPr>
+          <w:ilvl w:val="0"/>
+          <w:numId w:val="8"/>
+        </w:numPr>
+        <w:rPr>
+          <w:rFonts w:ascii="Arial" w:hAnsi="Arial" w:cs="Arial"/>
+          <w:lang w:val="es-CO"/>
+        </w:rPr>
+      </w:pPr>
+      <w:r>
+        <w:rPr>
+          <w:rFonts w:ascii="Arial" w:hAnsi="Arial" w:cs="Arial"/>
+          <w:lang w:val="es-CO"/>
+        </w:rPr>
+        <w:t>'Total personas que tuvieron alguna enfermedad'</w:t>
+      </w:r>
+    </w:p>
+    <w:p>
+      <w:pPr>
+        <w:pStyle w:val="Prrafodelista"/>
+        <w:numPr>
+          <w:ilvl w:val="0"/>
+          <w:numId w:val="8"/>
+        </w:numPr>
+        <w:rPr>
+          <w:rFonts w:ascii="Arial" w:hAnsi="Arial" w:cs="Arial"/>
+          <w:lang w:val="es-CO"/>
+        </w:rPr>
+      </w:pPr>
+      <w:r>
+        <w:rPr>
+          <w:rFonts w:ascii="Arial" w:hAnsi="Arial" w:cs="Arial"/>
+          <w:lang w:val="es-CO"/>
+        </w:rPr>
+        <w:t xml:space="preserve">'Sin </w:t>
+      </w:r>
+      <w:proofErr w:type="spellStart"/>
+      <w:r>
+        <w:rPr>
+          <w:rFonts w:ascii="Arial" w:hAnsi="Arial" w:cs="Arial"/>
+          <w:lang w:val="es-CO"/>
+        </w:rPr>
+        <w:t>informacion</w:t>
+      </w:r>
+      <w:proofErr w:type="spellEnd"/>
+      <w:r>
+        <w:rPr>
+          <w:rFonts w:ascii="Arial" w:hAnsi="Arial" w:cs="Arial"/>
+          <w:lang w:val="es-CO"/>
+        </w:rPr>
+        <w:t xml:space="preserve"> servicio de salud donde acudieron'</w:t>
+      </w:r>
+    </w:p>
+    <w:p>
+      <w:pPr>
+        <w:pStyle w:val="Prrafodelista"/>
+        <w:numPr>
+          <w:ilvl w:val="0"/>
+          <w:numId w:val="8"/>
+        </w:numPr>
+        <w:rPr>
+          <w:rFonts w:ascii="Arial" w:hAnsi="Arial" w:cs="Arial"/>
+          <w:lang w:val="es-CO"/>
+        </w:rPr>
+      </w:pPr>
+      <w:r>
+        <w:rPr>
+          <w:rFonts w:ascii="Arial" w:hAnsi="Arial" w:cs="Arial"/>
+          <w:lang w:val="es-CO"/>
+        </w:rPr>
+        <w:t xml:space="preserve">'A la entidad de seguridad social en salud a la cual está </w:t>
+      </w:r>
+      <w:proofErr w:type="spellStart"/>
+      <w:r>
+        <w:rPr>
+          <w:rFonts w:ascii="Arial" w:hAnsi="Arial" w:cs="Arial"/>
+          <w:lang w:val="es-CO"/>
+        </w:rPr>
+        <w:t>afliado</w:t>
+      </w:r>
+      <w:proofErr w:type="spellEnd"/>
+      <w:r>
+        <w:rPr>
+          <w:rFonts w:ascii="Arial" w:hAnsi="Arial" w:cs="Arial"/>
+          <w:lang w:val="es-CO"/>
+        </w:rPr>
+        <w:t>(a)'</w:t>
+      </w:r>
+    </w:p>
+    <w:p>
+      <w:pPr>
+        <w:pStyle w:val="Prrafodelista"/>
+        <w:numPr>
+          <w:ilvl w:val="0"/>
+          <w:numId w:val="8"/>
+        </w:numPr>
+        <w:rPr>
+          <w:rFonts w:ascii="Arial" w:hAnsi="Arial" w:cs="Arial"/>
+          <w:lang w:val="es-CO"/>
+        </w:rPr>
+      </w:pPr>
+      <w:r>
+        <w:rPr>
+          <w:rFonts w:ascii="Arial" w:hAnsi="Arial" w:cs="Arial"/>
+          <w:lang w:val="es-CO"/>
+        </w:rPr>
+        <w:t>'A un médico particular'</w:t>
+      </w:r>
+    </w:p>
+    <w:p>
+      <w:pPr>
+        <w:pStyle w:val="Prrafodelista"/>
+        <w:numPr>
+          <w:ilvl w:val="0"/>
+          <w:numId w:val="8"/>
+        </w:numPr>
+        <w:rPr>
+          <w:rFonts w:ascii="Arial" w:hAnsi="Arial" w:cs="Arial"/>
+          <w:lang w:val="es-CO"/>
+        </w:rPr>
+      </w:pPr>
+      <w:r>
+        <w:rPr>
+          <w:rFonts w:ascii="Arial" w:hAnsi="Arial" w:cs="Arial"/>
+          <w:lang w:val="es-CO"/>
+        </w:rPr>
+        <w:t xml:space="preserve">'A un </w:t>
+      </w:r>
+      <w:proofErr w:type="spellStart"/>
+      <w:proofErr w:type="gramStart"/>
+      <w:r>
+        <w:rPr>
+          <w:rFonts w:ascii="Arial" w:hAnsi="Arial" w:cs="Arial"/>
+          <w:lang w:val="es-CO"/>
+        </w:rPr>
+        <w:t>boticario,farmacéuta</w:t>
+      </w:r>
+      <w:proofErr w:type="spellEnd"/>
+      <w:proofErr w:type="gramEnd"/>
+      <w:r>
+        <w:rPr>
+          <w:rFonts w:ascii="Arial" w:hAnsi="Arial" w:cs="Arial"/>
+          <w:lang w:val="es-CO"/>
+        </w:rPr>
+        <w:t>, droguista'</w:t>
+      </w:r>
+    </w:p>
+    <w:p>
+      <w:pPr>
+        <w:pStyle w:val="Prrafodelista"/>
+        <w:numPr>
+          <w:ilvl w:val="0"/>
+          <w:numId w:val="8"/>
+        </w:numPr>
+        <w:rPr>
+          <w:rFonts w:ascii="Arial" w:hAnsi="Arial" w:cs="Arial"/>
+          <w:lang w:val="es-CO"/>
+        </w:rPr>
+      </w:pPr>
+      <w:r>
+        <w:rPr>
+          <w:rFonts w:ascii="Arial" w:hAnsi="Arial" w:cs="Arial"/>
+          <w:lang w:val="es-CO"/>
+        </w:rPr>
+        <w:t>'A terapias alternativas'</w:t>
+      </w:r>
+    </w:p>
+    <w:p>
+      <w:pPr>
+        <w:pStyle w:val="Prrafodelista"/>
+        <w:numPr>
+          <w:ilvl w:val="0"/>
+          <w:numId w:val="8"/>
+        </w:numPr>
+        <w:rPr>
+          <w:rFonts w:ascii="Arial" w:hAnsi="Arial" w:cs="Arial"/>
+          <w:lang w:val="es-CO"/>
+        </w:rPr>
+      </w:pPr>
+      <w:r>
+        <w:rPr>
+          <w:rFonts w:ascii="Arial" w:hAnsi="Arial" w:cs="Arial"/>
+          <w:lang w:val="es-CO"/>
+        </w:rPr>
+        <w:t>'Acudió a una autoridad indígena espiritual'</w:t>
+      </w:r>
+    </w:p>
+    <w:p>
+      <w:pPr>
+        <w:pStyle w:val="Prrafodelista"/>
+        <w:numPr>
+          <w:ilvl w:val="0"/>
+          <w:numId w:val="8"/>
+        </w:numPr>
+        <w:rPr>
+          <w:rFonts w:ascii="Arial" w:hAnsi="Arial" w:cs="Arial"/>
+          <w:lang w:val="es-CO"/>
+        </w:rPr>
+      </w:pPr>
+      <w:r>
+        <w:rPr>
+          <w:rFonts w:ascii="Arial" w:hAnsi="Arial" w:cs="Arial"/>
+          <w:lang w:val="es-CO"/>
+        </w:rPr>
+        <w:t>'Otro médico de un grupo étnico'</w:t>
+      </w:r>
+    </w:p>
+    <w:p>
+      <w:pPr>
+        <w:pStyle w:val="Prrafodelista"/>
+        <w:numPr>
+          <w:ilvl w:val="0"/>
+          <w:numId w:val="8"/>
+        </w:numPr>
+        <w:rPr>
+          <w:rFonts w:ascii="Arial" w:hAnsi="Arial" w:cs="Arial"/>
+          <w:lang w:val="es-CO"/>
+        </w:rPr>
+      </w:pPr>
+      <w:r>
+        <w:rPr>
+          <w:rFonts w:ascii="Arial" w:hAnsi="Arial" w:cs="Arial"/>
+          <w:lang w:val="es-CO"/>
+        </w:rPr>
+        <w:t>'Usó remedios caseros'</w:t>
+      </w:r>
+    </w:p>
+    <w:p>
+      <w:pPr>
+        <w:pStyle w:val="Prrafodelista"/>
+        <w:numPr>
+          <w:ilvl w:val="0"/>
+          <w:numId w:val="8"/>
+        </w:numPr>
+        <w:rPr>
+          <w:rFonts w:ascii="Arial" w:hAnsi="Arial" w:cs="Arial"/>
+          <w:lang w:val="es-CO"/>
+        </w:rPr>
+      </w:pPr>
+      <w:r>
+        <w:rPr>
+          <w:rFonts w:ascii="Arial" w:hAnsi="Arial" w:cs="Arial"/>
+          <w:lang w:val="es-CO"/>
+        </w:rPr>
+        <w:t xml:space="preserve">'Se </w:t>
+      </w:r>
+      <w:proofErr w:type="spellStart"/>
+      <w:r>
+        <w:rPr>
+          <w:rFonts w:ascii="Arial" w:hAnsi="Arial" w:cs="Arial"/>
+          <w:lang w:val="es-CO"/>
+        </w:rPr>
+        <w:t>autorrecetó</w:t>
+      </w:r>
+      <w:proofErr w:type="spellEnd"/>
+      <w:r>
+        <w:rPr>
+          <w:rFonts w:ascii="Arial" w:hAnsi="Arial" w:cs="Arial"/>
+          <w:lang w:val="es-CO"/>
+        </w:rPr>
+        <w:t>'</w:t>
+      </w:r>
+    </w:p>
+    <w:p>
+      <w:pPr>
+        <w:rPr>
+          <w:rFonts w:ascii="Arial" w:hAnsi="Arial" w:cs="Arial"/>
+          <w:lang w:val="es-CO"/>
+        </w:rPr>
+      </w:pPr>
+      <w:r>
+        <w:rPr>
+          <w:rFonts w:ascii="Arial" w:hAnsi="Arial" w:cs="Arial"/>
+          <w:lang w:val="es-CO"/>
+        </w:rPr>
+        <w:t xml:space="preserve">Después de las modificaciones en cada subconjunto, se consolidan los </w:t>
+      </w:r>
+      <w:proofErr w:type="spellStart"/>
+      <w:r>
+        <w:rPr>
+          <w:rFonts w:ascii="Arial" w:hAnsi="Arial" w:cs="Arial"/>
+          <w:lang w:val="es-CO"/>
+        </w:rPr>
+        <w:t>dataframes</w:t>
+      </w:r>
+      <w:proofErr w:type="spellEnd"/>
+      <w:r>
+        <w:rPr>
+          <w:rFonts w:ascii="Arial" w:hAnsi="Arial" w:cs="Arial"/>
+          <w:lang w:val="es-CO"/>
+        </w:rPr>
+        <w:t xml:space="preserve"> en un solo </w:t>
+      </w:r>
+      <w:proofErr w:type="spellStart"/>
+      <w:r>
+        <w:rPr>
+          <w:rFonts w:ascii="Arial" w:hAnsi="Arial" w:cs="Arial"/>
+          <w:lang w:val="es-CO"/>
+        </w:rPr>
+        <w:t>dataframe</w:t>
+      </w:r>
+      <w:proofErr w:type="spellEnd"/>
+      <w:r>
+        <w:rPr>
+          <w:rFonts w:ascii="Arial" w:hAnsi="Arial" w:cs="Arial"/>
+          <w:lang w:val="es-CO"/>
+        </w:rPr>
+        <w:t>.</w:t>
+      </w:r>
+    </w:p>
+    <w:p>
+      <w:pPr>
+        <w:rPr>
+          <w:rFonts w:ascii="Arial" w:hAnsi="Arial" w:cs="Arial"/>
+          <w:lang w:val="es-CO"/>
+        </w:rPr>
+      </w:pPr>
+    </w:p>
+    <w:p>
+      <w:pPr>
+        <w:rPr>
+          <w:rFonts w:ascii="Arial" w:hAnsi="Arial" w:cs="Arial"/>
+          <w:lang w:val="es-CO"/>
+        </w:rPr>
+      </w:pPr>
+      <w:r>
+        <w:rPr>
+          <w:rFonts w:ascii="Arial" w:hAnsi="Arial" w:cs="Arial"/>
+          <w:lang w:val="es-CO"/>
+        </w:rPr>
+        <w:lastRenderedPageBreak/>
+        <w:drawing>
+          <wp:inline distT="0" distB="0" distL="0" distR="0" wp14:anchorId="044433B9" wp14:editId="4EC96353">
+            <wp:extent cx="5612130" cy="2834005"/>
+            <wp:effectExtent l="0" t="0" r="7620" b="4445"/>
+            <wp:docPr id="23" name="Imagen 23"/>
+            <wp:cNvGraphicFramePr>
+              <a:graphicFrameLocks xmlns:a="http://schemas.openxmlformats.org/drawingml/2006/main" noChangeAspect="1"/>
+            </wp:cNvGraphicFramePr>
+            <a:graphic xmlns:a="http://schemas.openxmlformats.org/drawingml/2006/main">
+              <a:graphicData uri="http://schemas.openxmlformats.org/drawingml/2006/picture">
+                <pic:pic xmlns:pic="http://schemas.openxmlformats.org/drawingml/2006/picture">
+                  <pic:nvPicPr>
+                    <pic:cNvPr id="1" name=""/>
+                    <pic:cNvPicPr/>
+                  </pic:nvPicPr>
+                  <pic:blipFill>
+                    <a:blip r:embed="rId52"/>
+                    <a:stretch>
+                      <a:fillRect/>
+                    </a:stretch>
+                  </pic:blipFill>
+                  <pic:spPr>
+                    <a:xfrm>
+                      <a:off x="0" y="0"/>
+                      <a:ext cx="5612130" cy="2834005"/>
+                    </a:xfrm>
+                    <a:prstGeom prst="rect">
+                      <a:avLst/>
+                    </a:prstGeom>
+                  </pic:spPr>
+                </pic:pic>
+              </a:graphicData>
+            </a:graphic>
+          </wp:inline>
+        </w:drawing>
+      </w:r>
+    </w:p>
+    <w:p>
+      <w:pPr>
+        <w:rPr>
+          <w:rFonts w:ascii="Arial" w:hAnsi="Arial" w:cs="Arial"/>
+          <w:lang w:val="es-CO"/>
+        </w:rPr>
+      </w:pPr>
+    </w:p>
+    <w:p>
+      <w:pPr>
+        <w:rPr>
+          <w:rFonts w:ascii="Arial" w:hAnsi="Arial" w:cs="Arial"/>
+          <w:lang w:val="es-CO"/>
+        </w:rPr>
+      </w:pPr>
+      <w:r>
+        <w:rPr>
+          <w:rFonts w:ascii="Arial" w:hAnsi="Arial" w:cs="Arial"/>
+          <w:lang w:val="es-CO"/>
+        </w:rPr>
+        <w:t xml:space="preserve">Se renombran los </w:t>
+      </w:r>
+      <w:proofErr w:type="spellStart"/>
+      <w:r>
+        <w:rPr>
+          <w:rFonts w:ascii="Arial" w:hAnsi="Arial" w:cs="Arial"/>
+          <w:lang w:val="es-CO"/>
+        </w:rPr>
+        <w:t>headers</w:t>
+      </w:r>
+      <w:proofErr w:type="spellEnd"/>
+      <w:r>
+        <w:rPr>
+          <w:rFonts w:ascii="Arial" w:hAnsi="Arial" w:cs="Arial"/>
+          <w:lang w:val="es-CO"/>
+        </w:rPr>
+        <w:t xml:space="preserve"> que contienen tildes o ñ.</w:t>
+      </w:r>
+    </w:p>
+    <w:p>
+      <w:pPr>
+        <w:rPr>
+          <w:rFonts w:ascii="Arial" w:hAnsi="Arial" w:cs="Arial"/>
+          <w:lang w:val="es-CO"/>
+        </w:rPr>
+      </w:pPr>
+      <w:r>
+        <w:rPr>
+          <w:rFonts w:ascii="Arial" w:hAnsi="Arial" w:cs="Arial"/>
+          <w:lang w:val="es-CO"/>
+        </w:rPr>
+        <w:t>Finalmente, se cambian las tildes de los datos, reemplazando vocales con tilde por vocales sin tilde.</w:t>
+      </w:r>
+    </w:p>
+    <w:p>
+      <w:pPr>
+        <w:rPr>
+          <w:rFonts w:ascii="Arial" w:hAnsi="Arial" w:cs="Arial"/>
           <w:lang w:val="es-CO"/>
         </w:rPr>
       </w:pPr>
@@ -7600,6 +8728,119 @@
     </w:lvl>
   </w:abstractNum>
   <w:abstractNum w:abstractNumId="1" w15:restartNumberingAfterBreak="0">
+    <w:nsid w:val="0E8A6C71"/>
+    <w:multiLevelType w:val="hybridMultilevel"/>
+    <w:tmpl w:val="01B26B3C"/>
+    <w:lvl w:ilvl="0" w:tplc="240A0001">
+      <w:start w:val="1"/>
+      <w:numFmt w:val="bullet"/>
+      <w:lvlText w:val=""/>
+      <w:lvlJc w:val="left"/>
+      <w:pPr>
+        <w:ind w:left="720" w:hanging="360"/>
+      </w:pPr>
+      <w:rPr>
+        <w:rFonts w:ascii="Symbol" w:hAnsi="Symbol" w:hint="default"/>
+      </w:rPr>
+    </w:lvl>
+    <w:lvl w:ilvl="1" w:tplc="240A0003" w:tentative="1">
+      <w:start w:val="1"/>
+      <w:numFmt w:val="bullet"/>
+      <w:lvlText w:val="o"/>
+      <w:lvlJc w:val="left"/>
+      <w:pPr>
+        <w:ind w:left="1440" w:hanging="360"/>
+      </w:pPr>
+      <w:rPr>
+        <w:rFonts w:ascii="Courier New" w:hAnsi="Courier New" w:cs="Courier New" w:hint="default"/>
+      </w:rPr>
+    </w:lvl>
+    <w:lvl w:ilvl="2" w:tplc="240A0005" w:tentative="1">
+      <w:start w:val="1"/>
+      <w:numFmt w:val="bullet"/>
+      <w:lvlText w:val=""/>
+      <w:lvlJc w:val="left"/>
+      <w:pPr>
+        <w:ind w:left="2160" w:hanging="360"/>
+      </w:pPr>
+      <w:rPr>
+        <w:rFonts w:ascii="Wingdings" w:hAnsi="Wingdings" w:hint="default"/>
+      </w:rPr>
+    </w:lvl>
+    <w:lvl w:ilvl="3" w:tplc="240A0001" w:tentative="1">
+      <w:start w:val="1"/>
+      <w:numFmt w:val="bullet"/>
+      <w:lvlText w:val=""/>
+      <w:lvlJc w:val="left"/>
+      <w:pPr>
+        <w:ind w:left="2880" w:hanging="360"/>
+      </w:pPr>
+      <w:rPr>
+        <w:rFonts w:ascii="Symbol" w:hAnsi="Symbol" w:hint="default"/>
+      </w:rPr>
+    </w:lvl>
+    <w:lvl w:ilvl="4" w:tplc="240A0003" w:tentative="1">
+      <w:start w:val="1"/>
+      <w:numFmt w:val="bullet"/>
+      <w:lvlText w:val="o"/>
+      <w:lvlJc w:val="left"/>
+      <w:pPr>
+        <w:ind w:left="3600" w:hanging="360"/>
+      </w:pPr>
+      <w:rPr>
+        <w:rFonts w:ascii="Courier New" w:hAnsi="Courier New" w:cs="Courier New" w:hint="default"/>
+      </w:rPr>
+    </w:lvl>
+    <w:lvl w:ilvl="5" w:tplc="240A0005" w:tentative="1">
+      <w:start w:val="1"/>
+      <w:numFmt w:val="bullet"/>
+      <w:lvlText w:val=""/>
+      <w:lvlJc w:val="left"/>
+      <w:pPr>
+        <w:ind w:left="4320" w:hanging="360"/>
+      </w:pPr>
+      <w:rPr>
+        <w:rFonts w:ascii="Wingdings" w:hAnsi="Wingdings" w:hint="default"/>
+      </w:rPr>
+    </w:lvl>
+    <w:lvl w:ilvl="6" w:tplc="240A0001" w:tentative="1">
+      <w:start w:val="1"/>
+      <w:numFmt w:val="bullet"/>
+      <w:lvlText w:val=""/>
+      <w:lvlJc w:val="left"/>
+      <w:pPr>
+        <w:ind w:left="5040" w:hanging="360"/>
+      </w:pPr>
+      <w:rPr>
+        <w:rFonts w:ascii="Symbol" w:hAnsi="Symbol" w:hint="default"/>
+      </w:rPr>
+    </w:lvl>
+    <w:lvl w:ilvl="7" w:tplc="240A0003" w:tentative="1">
+      <w:start w:val="1"/>
+      <w:numFmt w:val="bullet"/>
+      <w:lvlText w:val="o"/>
+      <w:lvlJc w:val="left"/>
+      <w:pPr>
+        <w:ind w:left="5760" w:hanging="360"/>
+      </w:pPr>
+      <w:rPr>
+        <w:rFonts w:ascii="Courier New" w:hAnsi="Courier New" w:cs="Courier New" w:hint="default"/>
+      </w:rPr>
+    </w:lvl>
+    <w:lvl w:ilvl="8" w:tplc="240A0005" w:tentative="1">
+      <w:start w:val="1"/>
+      <w:numFmt w:val="bullet"/>
+      <w:lvlText w:val=""/>
+      <w:lvlJc w:val="left"/>
+      <w:pPr>
+        <w:ind w:left="6480" w:hanging="360"/>
+      </w:pPr>
+      <w:rPr>
+        <w:rFonts w:ascii="Wingdings" w:hAnsi="Wingdings" w:hint="default"/>
+      </w:rPr>
+    </w:lvl>
+  </w:abstractNum>
+  <w:abstractNum w:abstractNumId="2" w15:restartNumberingAfterBreak="0">
     <w:nsid w:val="1BC752DC"/>
     <w:multiLevelType w:val="hybridMultilevel"/>
     <w:tmpl w:val="1A1CF23E"/>
@@ -7712,7 +8953,7 @@
       </w:rPr>
     </w:lvl>
   </w:abstractNum>
-  <w:abstractNum w:abstractNumId="2" w15:restartNumberingAfterBreak="0">
+  <w:abstractNum w:abstractNumId="3" w15:restartNumberingAfterBreak="0">
     <w:nsid w:val="1C1A5140"/>
     <w:multiLevelType w:val="hybridMultilevel"/>
     <w:tmpl w:val="A0D21C22"/>
@@ -7825,7 +9066,7 @@
       </w:rPr>
     </w:lvl>
   </w:abstractNum>
-  <w:abstractNum w:abstractNumId="3" w15:restartNumberingAfterBreak="0">
+  <w:abstractNum w:abstractNumId="4" w15:restartNumberingAfterBreak="0">
     <w:nsid w:val="351A5970"/>
     <w:multiLevelType w:val="hybridMultilevel"/>
     <w:tmpl w:val="D1901D24"/>
@@ -7938,7 +9179,7 @@
       </w:rPr>
     </w:lvl>
   </w:abstractNum>
-  <w:abstractNum w:abstractNumId="4" w15:restartNumberingAfterBreak="0">
+  <w:abstractNum w:abstractNumId="5" w15:restartNumberingAfterBreak="0">
     <w:nsid w:val="48F2220C"/>
     <w:multiLevelType w:val="hybridMultilevel"/>
     <w:tmpl w:val="C6A41878"/>
@@ -8051,7 +9292,7 @@
       </w:rPr>
     </w:lvl>
   </w:abstractNum>
-  <w:abstractNum w:abstractNumId="5" w15:restartNumberingAfterBreak="0">
+  <w:abstractNum w:abstractNumId="6" w15:restartNumberingAfterBreak="0">
     <w:nsid w:val="496738FF"/>
     <w:multiLevelType w:val="hybridMultilevel"/>
     <w:tmpl w:val="BCB87994"/>
@@ -8164,7 +9405,7 @@
       </w:rPr>
     </w:lvl>
   </w:abstractNum>
-  <w:abstractNum w:abstractNumId="6" w15:restartNumberingAfterBreak="0">
+  <w:abstractNum w:abstractNumId="7" w15:restartNumberingAfterBreak="0">
     <w:nsid w:val="74275815"/>
     <w:multiLevelType w:val="hybridMultilevel"/>
     <w:tmpl w:val="CB169C92"/>
@@ -8278,25 +9519,28 @@
     </w:lvl>
   </w:abstractNum>
   <w:num w:numId="1">
-    <w:abstractNumId w:val="1"/>
+    <w:abstractNumId w:val="2"/>
   </w:num>
   <w:num w:numId="2">
-    <w:abstractNumId w:val="4"/>
+    <w:abstractNumId w:val="5"/>
   </w:num>
   <w:num w:numId="3">
-    <w:abstractNumId w:val="2"/>
+    <w:abstractNumId w:val="3"/>
   </w:num>
   <w:num w:numId="4">
-    <w:abstractNumId w:val="5"/>
+    <w:abstractNumId w:val="6"/>
   </w:num>
   <w:num w:numId="5">
     <w:abstractNumId w:val="0"/>
   </w:num>
   <w:num w:numId="6">
-    <w:abstractNumId w:val="3"/>
+    <w:abstractNumId w:val="4"/>
   </w:num>
   <w:num w:numId="7">
-    <w:abstractNumId w:val="6"/>
+    <w:abstractNumId w:val="7"/>
+  </w:num>
+  <w:num w:numId="8">
+    <w:abstractNumId w:val="1"/>
   </w:num>
 </w:numbering>
 </file>

</xml_diff>

<commit_message>
Agrega la documentacion del procesamiento de la hoja 15PM
</commit_message>
<xml_diff>
--- a/Documentacion/Procesamiento de Datos.docx
+++ b/Documentacion/Procesamiento de Datos.docx
@@ -7510,21 +7510,7 @@
           <w:rFonts w:ascii="Arial" w:hAnsi="Arial" w:cs="Arial"/>
           <w:lang w:val="es-CO"/>
         </w:rPr>
-        <w:t xml:space="preserve">, para lo cual se ignoran las primeras </w:t>
-      </w:r>
-      <w:r>
-        <w:rPr>
-          <w:rFonts w:ascii="Arial" w:hAnsi="Arial" w:cs="Arial"/>
-          <w:lang w:val="es-CO"/>
-        </w:rPr>
-        <w:t>8</w:t>
-      </w:r>
-      <w:r>
-        <w:rPr>
-          <w:rFonts w:ascii="Arial" w:hAnsi="Arial" w:cs="Arial"/>
-          <w:lang w:val="es-CO"/>
-        </w:rPr>
-        <w:t xml:space="preserve"> filas de la hoja.</w:t>
+        <w:t>, para lo cual se ignoran las primeras 8 filas de la hoja.</w:t>
       </w:r>
     </w:p>
     <w:p>
@@ -7947,35 +7933,7 @@
           <w:rFonts w:ascii="Arial" w:hAnsi="Arial" w:cs="Arial"/>
           <w:lang w:val="es-CO"/>
         </w:rPr>
-        <w:t xml:space="preserve"> se encuentran en la </w:t>
-      </w:r>
-      <w:r>
-        <w:rPr>
-          <w:rFonts w:ascii="Arial" w:hAnsi="Arial" w:cs="Arial"/>
-          <w:lang w:val="es-CO"/>
-        </w:rPr>
-        <w:t>segunda</w:t>
-      </w:r>
-      <w:r>
-        <w:rPr>
-          <w:rFonts w:ascii="Arial" w:hAnsi="Arial" w:cs="Arial"/>
-          <w:lang w:val="es-CO"/>
-        </w:rPr>
-        <w:t xml:space="preserve"> fila de datos debido al diseño del .xlsx donde se busca describir la agrupación por Área en la que se tomaron los datos</w:t>
-      </w:r>
-      <w:r>
-        <w:rPr>
-          <w:rFonts w:ascii="Arial" w:hAnsi="Arial" w:cs="Arial"/>
-          <w:lang w:val="es-CO"/>
-        </w:rPr>
-        <w:t>, y esta a su vez, tiene otro tipo de agrupación en la primera fila donde se separan los datos en si el censado tuvo alguna enfermedad los últimos 30 días, y a qué servicio de salud acudieron</w:t>
-      </w:r>
-      <w:r>
-        <w:rPr>
-          <w:rFonts w:ascii="Arial" w:hAnsi="Arial" w:cs="Arial"/>
-          <w:lang w:val="es-CO"/>
-        </w:rPr>
-        <w:t>.</w:t>
+        <w:t xml:space="preserve"> se encuentran en la segunda fila de datos debido al diseño del .xlsx donde se busca describir la agrupación por Área en la que se tomaron los datos, y esta a su vez, tiene otro tipo de agrupación en la primera fila donde se separan los datos en si el censado tuvo alguna enfermedad los últimos 30 días, y a qué servicio de salud acudieron.</w:t>
       </w:r>
     </w:p>
     <w:p>
@@ -8014,35 +7972,7 @@
           <w:rFonts w:ascii="Arial" w:hAnsi="Arial" w:cs="Arial"/>
           <w:lang w:val="es-CO"/>
         </w:rPr>
-        <w:t xml:space="preserve"> en 4 partes, correspondientes a las áreas. Cada subconjunto se concatena con la</w:t>
-      </w:r>
-      <w:r>
-        <w:rPr>
-          <w:rFonts w:ascii="Arial" w:hAnsi="Arial" w:cs="Arial"/>
-          <w:lang w:val="es-CO"/>
-        </w:rPr>
-        <w:t>s</w:t>
-      </w:r>
-      <w:r>
-        <w:rPr>
-          <w:rFonts w:ascii="Arial" w:hAnsi="Arial" w:cs="Arial"/>
-          <w:lang w:val="es-CO"/>
-        </w:rPr>
-        <w:t xml:space="preserve"> columna</w:t>
-      </w:r>
-      <w:r>
-        <w:rPr>
-          <w:rFonts w:ascii="Arial" w:hAnsi="Arial" w:cs="Arial"/>
-          <w:lang w:val="es-CO"/>
-        </w:rPr>
-        <w:t>s de ‘Sexo’ y ‘Grupo de edad’</w:t>
-      </w:r>
-      <w:r>
-        <w:rPr>
-          <w:rFonts w:ascii="Arial" w:hAnsi="Arial" w:cs="Arial"/>
-          <w:lang w:val="es-CO"/>
-        </w:rPr>
-        <w:t>, y se asigna una columna ‘</w:t>
+        <w:t xml:space="preserve"> en 4 partes, correspondientes a las áreas. Cada subconjunto se concatena con las columnas de ‘Sexo’ y ‘Grupo de edad’, y se asigna una columna ‘</w:t>
       </w:r>
       <w:proofErr w:type="spellStart"/>
       <w:r>
@@ -8500,6 +8430,7 @@
       <w:r>
         <w:rPr>
           <w:rFonts w:ascii="Arial" w:hAnsi="Arial" w:cs="Arial"/>
+          <w:noProof/>
           <w:lang w:val="es-CO"/>
         </w:rPr>
         <w:lastRenderedPageBreak/>
@@ -8592,6 +8523,649 @@
           <w:lang w:val="es-CO"/>
         </w:rPr>
         <w:t>Finalmente, se cambian las tildes de los datos, reemplazando vocales con tilde por vocales sin tilde.</w:t>
+      </w:r>
+    </w:p>
+    <w:p>
+      <w:pPr>
+        <w:rPr>
+          <w:rFonts w:ascii="Arial" w:hAnsi="Arial" w:cs="Arial"/>
+          <w:lang w:val="es-CO"/>
+        </w:rPr>
+      </w:pPr>
+    </w:p>
+    <w:p>
+      <w:pPr>
+        <w:rPr>
+          <w:rFonts w:ascii="Arial" w:hAnsi="Arial" w:cs="Arial"/>
+          <w:lang w:val="es-CO"/>
+        </w:rPr>
+      </w:pPr>
+    </w:p>
+    <w:p>
+      <w:pPr>
+        <w:rPr>
+          <w:rFonts w:ascii="Arial" w:hAnsi="Arial" w:cs="Arial"/>
+          <w:b/>
+          <w:bCs/>
+          <w:lang w:val="es-CO"/>
+        </w:rPr>
+      </w:pPr>
+      <w:r>
+        <w:rPr>
+          <w:rFonts w:ascii="Arial" w:hAnsi="Arial" w:cs="Arial"/>
+          <w:b/>
+          <w:bCs/>
+          <w:lang w:val="es-CO"/>
+        </w:rPr>
+        <w:t>15PM</w:t>
+      </w:r>
+    </w:p>
+    <w:p>
+      <w:pPr>
+        <w:rPr>
+          <w:rFonts w:ascii="Arial" w:hAnsi="Arial" w:cs="Arial"/>
+          <w:lang w:val="es-CO"/>
+        </w:rPr>
+      </w:pPr>
+      <w:r>
+        <w:rPr>
+          <w:rFonts w:ascii="Arial" w:hAnsi="Arial" w:cs="Arial"/>
+          <w:lang w:val="es-CO"/>
+        </w:rPr>
+        <w:t xml:space="preserve">Se empieza por extraer solo la parte correspondiente a los datos del archivo </w:t>
+      </w:r>
+      <w:proofErr w:type="spellStart"/>
+      <w:r>
+        <w:rPr>
+          <w:rFonts w:ascii="Arial" w:hAnsi="Arial" w:cs="Arial"/>
+          <w:lang w:val="es-CO"/>
+        </w:rPr>
+        <w:t>excel</w:t>
+      </w:r>
+      <w:proofErr w:type="spellEnd"/>
+      <w:r>
+        <w:rPr>
+          <w:rFonts w:ascii="Arial" w:hAnsi="Arial" w:cs="Arial"/>
+          <w:lang w:val="es-CO"/>
+        </w:rPr>
+        <w:t xml:space="preserve">, para lo cual se ignoran las primeras </w:t>
+      </w:r>
+      <w:r>
+        <w:rPr>
+          <w:rFonts w:ascii="Arial" w:hAnsi="Arial" w:cs="Arial"/>
+          <w:lang w:val="es-CO"/>
+        </w:rPr>
+        <w:t>9</w:t>
+      </w:r>
+      <w:r>
+        <w:rPr>
+          <w:rFonts w:ascii="Arial" w:hAnsi="Arial" w:cs="Arial"/>
+          <w:lang w:val="es-CO"/>
+        </w:rPr>
+        <w:t xml:space="preserve"> filas de la hoja.</w:t>
+      </w:r>
+    </w:p>
+    <w:p>
+      <w:pPr>
+        <w:rPr>
+          <w:rFonts w:ascii="Arial" w:hAnsi="Arial" w:cs="Arial"/>
+          <w:lang w:val="es-CO"/>
+        </w:rPr>
+      </w:pPr>
+      <w:r>
+        <w:rPr>
+          <w:rFonts w:ascii="Arial" w:hAnsi="Arial" w:cs="Arial"/>
+          <w:noProof/>
+          <w:lang w:val="es-CO"/>
+        </w:rPr>
+        <w:drawing>
+          <wp:inline distT="0" distB="0" distL="0" distR="0" wp14:anchorId="4EF17A15" wp14:editId="0060FB85">
+            <wp:extent cx="5612130" cy="2696845"/>
+            <wp:effectExtent l="0" t="0" r="7620" b="8255"/>
+            <wp:docPr id="31" name="Imagen 31"/>
+            <wp:cNvGraphicFramePr>
+              <a:graphicFrameLocks xmlns:a="http://schemas.openxmlformats.org/drawingml/2006/main" noChangeAspect="1"/>
+            </wp:cNvGraphicFramePr>
+            <a:graphic xmlns:a="http://schemas.openxmlformats.org/drawingml/2006/main">
+              <a:graphicData uri="http://schemas.openxmlformats.org/drawingml/2006/picture">
+                <pic:pic xmlns:pic="http://schemas.openxmlformats.org/drawingml/2006/picture">
+                  <pic:nvPicPr>
+                    <pic:cNvPr id="31" name="Imagen 31"/>
+                    <pic:cNvPicPr/>
+                  </pic:nvPicPr>
+                  <pic:blipFill>
+                    <a:blip r:embed="rId53" cstate="print">
+                      <a:extLst>
+                        <a:ext uri="{28A0092B-C50C-407E-A947-70E740481C1C}">
+                          <a14:useLocalDpi xmlns:a14="http://schemas.microsoft.com/office/drawing/2010/main" val="0"/>
+                        </a:ext>
+                      </a:extLst>
+                    </a:blip>
+                    <a:stretch>
+                      <a:fillRect/>
+                    </a:stretch>
+                  </pic:blipFill>
+                  <pic:spPr>
+                    <a:xfrm>
+                      <a:off x="0" y="0"/>
+                      <a:ext cx="5612130" cy="2696845"/>
+                    </a:xfrm>
+                    <a:prstGeom prst="rect">
+                      <a:avLst/>
+                    </a:prstGeom>
+                  </pic:spPr>
+                </pic:pic>
+              </a:graphicData>
+            </a:graphic>
+          </wp:inline>
+        </w:drawing>
+      </w:r>
+    </w:p>
+    <w:p>
+      <w:pPr>
+        <w:rPr>
+          <w:rFonts w:ascii="Arial" w:hAnsi="Arial" w:cs="Arial"/>
+          <w:lang w:val="es-CO"/>
+        </w:rPr>
+      </w:pPr>
+      <w:r>
+        <w:rPr>
+          <w:rFonts w:ascii="Arial" w:hAnsi="Arial" w:cs="Arial"/>
+          <w:lang w:val="es-CO"/>
+        </w:rPr>
+        <w:lastRenderedPageBreak/>
+        <w:t xml:space="preserve">Se extraen los </w:t>
+      </w:r>
+      <w:proofErr w:type="spellStart"/>
+      <w:r>
+        <w:rPr>
+          <w:rFonts w:ascii="Arial" w:hAnsi="Arial" w:cs="Arial"/>
+          <w:lang w:val="es-CO"/>
+        </w:rPr>
+        <w:t>headers</w:t>
+      </w:r>
+      <w:proofErr w:type="spellEnd"/>
+      <w:r>
+        <w:rPr>
+          <w:rFonts w:ascii="Arial" w:hAnsi="Arial" w:cs="Arial"/>
+          <w:lang w:val="es-CO"/>
+        </w:rPr>
+        <w:t xml:space="preserve"> originales para renombrar las columnas cuando se filtren los datos por municipio.</w:t>
+      </w:r>
+    </w:p>
+    <w:p>
+      <w:pPr>
+        <w:rPr>
+          <w:rFonts w:ascii="Arial" w:hAnsi="Arial" w:cs="Arial"/>
+          <w:lang w:val="es-CO"/>
+        </w:rPr>
+      </w:pPr>
+      <w:r>
+        <w:rPr>
+          <w:rFonts w:ascii="Arial" w:hAnsi="Arial" w:cs="Arial"/>
+          <w:lang w:val="es-CO"/>
+        </w:rPr>
+        <w:drawing>
+          <wp:inline distT="0" distB="0" distL="0" distR="0" wp14:anchorId="1CE6EB9D" wp14:editId="4E0AF87C">
+            <wp:extent cx="5612130" cy="1755775"/>
+            <wp:effectExtent l="0" t="0" r="7620" b="0"/>
+            <wp:docPr id="42" name="Imagen 42"/>
+            <wp:cNvGraphicFramePr>
+              <a:graphicFrameLocks xmlns:a="http://schemas.openxmlformats.org/drawingml/2006/main" noChangeAspect="1"/>
+            </wp:cNvGraphicFramePr>
+            <a:graphic xmlns:a="http://schemas.openxmlformats.org/drawingml/2006/main">
+              <a:graphicData uri="http://schemas.openxmlformats.org/drawingml/2006/picture">
+                <pic:pic xmlns:pic="http://schemas.openxmlformats.org/drawingml/2006/picture">
+                  <pic:nvPicPr>
+                    <pic:cNvPr id="1" name=""/>
+                    <pic:cNvPicPr/>
+                  </pic:nvPicPr>
+                  <pic:blipFill>
+                    <a:blip r:embed="rId54"/>
+                    <a:stretch>
+                      <a:fillRect/>
+                    </a:stretch>
+                  </pic:blipFill>
+                  <pic:spPr>
+                    <a:xfrm>
+                      <a:off x="0" y="0"/>
+                      <a:ext cx="5612130" cy="1755775"/>
+                    </a:xfrm>
+                    <a:prstGeom prst="rect">
+                      <a:avLst/>
+                    </a:prstGeom>
+                  </pic:spPr>
+                </pic:pic>
+              </a:graphicData>
+            </a:graphic>
+          </wp:inline>
+        </w:drawing>
+      </w:r>
+    </w:p>
+    <w:p>
+      <w:pPr>
+        <w:rPr>
+          <w:rFonts w:ascii="Arial" w:hAnsi="Arial" w:cs="Arial"/>
+          <w:lang w:val="es-CO"/>
+        </w:rPr>
+      </w:pPr>
+    </w:p>
+    <w:p>
+      <w:pPr>
+        <w:rPr>
+          <w:rFonts w:ascii="Arial" w:hAnsi="Arial" w:cs="Arial"/>
+          <w:lang w:val="es-CO"/>
+        </w:rPr>
+      </w:pPr>
+      <w:r>
+        <w:rPr>
+          <w:rFonts w:ascii="Arial" w:hAnsi="Arial" w:cs="Arial"/>
+          <w:lang w:val="es-CO"/>
+        </w:rPr>
+        <w:t>Filtrado de datos que no son de Viterbo, Caldas.</w:t>
+      </w:r>
+    </w:p>
+    <w:p>
+      <w:pPr>
+        <w:rPr>
+          <w:rFonts w:ascii="Arial" w:hAnsi="Arial" w:cs="Arial"/>
+          <w:lang w:val="es-CO"/>
+        </w:rPr>
+      </w:pPr>
+      <w:r>
+        <w:rPr>
+          <w:rFonts w:ascii="Arial" w:hAnsi="Arial" w:cs="Arial"/>
+          <w:lang w:val="es-CO"/>
+        </w:rPr>
+        <w:t>Para esta hoja se decide propagar el valor del identificador del municipio, ‘17877_Viterbo’, y seleccionar solo los registros que lo contengan.</w:t>
+      </w:r>
+    </w:p>
+    <w:p>
+      <w:pPr>
+        <w:rPr>
+          <w:rFonts w:ascii="Arial" w:hAnsi="Arial" w:cs="Arial"/>
+          <w:lang w:val="es-CO"/>
+        </w:rPr>
+      </w:pPr>
+      <w:r>
+        <w:rPr>
+          <w:rFonts w:ascii="Arial" w:hAnsi="Arial" w:cs="Arial"/>
+          <w:noProof/>
+          <w:lang w:val="es-CO"/>
+        </w:rPr>
+        <w:drawing>
+          <wp:inline distT="0" distB="0" distL="0" distR="0" wp14:anchorId="23F9200D" wp14:editId="71A33445">
+            <wp:extent cx="5612130" cy="2810510"/>
+            <wp:effectExtent l="0" t="0" r="7620" b="8890"/>
+            <wp:docPr id="44" name="Imagen 44"/>
+            <wp:cNvGraphicFramePr>
+              <a:graphicFrameLocks xmlns:a="http://schemas.openxmlformats.org/drawingml/2006/main" noChangeAspect="1"/>
+            </wp:cNvGraphicFramePr>
+            <a:graphic xmlns:a="http://schemas.openxmlformats.org/drawingml/2006/main">
+              <a:graphicData uri="http://schemas.openxmlformats.org/drawingml/2006/picture">
+                <pic:pic xmlns:pic="http://schemas.openxmlformats.org/drawingml/2006/picture">
+                  <pic:nvPicPr>
+                    <pic:cNvPr id="44" name="Imagen 44"/>
+                    <pic:cNvPicPr/>
+                  </pic:nvPicPr>
+                  <pic:blipFill>
+                    <a:blip r:embed="rId55">
+                      <a:extLst>
+                        <a:ext uri="{28A0092B-C50C-407E-A947-70E740481C1C}">
+                          <a14:useLocalDpi xmlns:a14="http://schemas.microsoft.com/office/drawing/2010/main" val="0"/>
+                        </a:ext>
+                      </a:extLst>
+                    </a:blip>
+                    <a:stretch>
+                      <a:fillRect/>
+                    </a:stretch>
+                  </pic:blipFill>
+                  <pic:spPr>
+                    <a:xfrm>
+                      <a:off x="0" y="0"/>
+                      <a:ext cx="5612130" cy="2810510"/>
+                    </a:xfrm>
+                    <a:prstGeom prst="rect">
+                      <a:avLst/>
+                    </a:prstGeom>
+                  </pic:spPr>
+                </pic:pic>
+              </a:graphicData>
+            </a:graphic>
+          </wp:inline>
+        </w:drawing>
+      </w:r>
+    </w:p>
+    <w:p>
+      <w:pPr>
+        <w:rPr>
+          <w:rFonts w:ascii="Arial" w:hAnsi="Arial" w:cs="Arial"/>
+          <w:lang w:val="es-CO"/>
+        </w:rPr>
+      </w:pPr>
+    </w:p>
+    <w:p>
+      <w:pPr>
+        <w:rPr>
+          <w:rFonts w:ascii="Arial" w:hAnsi="Arial" w:cs="Arial"/>
+          <w:lang w:val="es-CO"/>
+        </w:rPr>
+      </w:pPr>
+      <w:r>
+        <w:rPr>
+          <w:rFonts w:ascii="Arial" w:hAnsi="Arial" w:cs="Arial"/>
+          <w:lang w:val="es-CO"/>
+        </w:rPr>
+        <w:t xml:space="preserve">Actualización de </w:t>
+      </w:r>
+      <w:proofErr w:type="spellStart"/>
+      <w:r>
+        <w:rPr>
+          <w:rFonts w:ascii="Arial" w:hAnsi="Arial" w:cs="Arial"/>
+          <w:lang w:val="es-CO"/>
+        </w:rPr>
+        <w:t>headers</w:t>
+      </w:r>
+      <w:proofErr w:type="spellEnd"/>
+    </w:p>
+    <w:p>
+      <w:pPr>
+        <w:rPr>
+          <w:rFonts w:ascii="Arial" w:hAnsi="Arial" w:cs="Arial"/>
+          <w:lang w:val="es-CO"/>
+        </w:rPr>
+      </w:pPr>
+      <w:r>
+        <w:rPr>
+          <w:rFonts w:ascii="Arial" w:hAnsi="Arial" w:cs="Arial"/>
+          <w:lang w:val="es-CO"/>
+        </w:rPr>
+        <w:t xml:space="preserve">Al extraer los datos desde el archivo .xlsx, se verifica el </w:t>
+      </w:r>
+      <w:proofErr w:type="spellStart"/>
+      <w:r>
+        <w:rPr>
+          <w:rFonts w:ascii="Arial" w:hAnsi="Arial" w:cs="Arial"/>
+          <w:lang w:val="es-CO"/>
+        </w:rPr>
+        <w:t>dataframe</w:t>
+      </w:r>
+      <w:proofErr w:type="spellEnd"/>
+      <w:r>
+        <w:rPr>
+          <w:rFonts w:ascii="Arial" w:hAnsi="Arial" w:cs="Arial"/>
+          <w:lang w:val="es-CO"/>
+        </w:rPr>
+        <w:t xml:space="preserve"> generado por Pandas, empezando por los nombres de las columnas y se observan las siguientes incidencias:</w:t>
+      </w:r>
+    </w:p>
+    <w:p>
+      <w:pPr>
+        <w:pStyle w:val="Prrafodelista"/>
+        <w:numPr>
+          <w:ilvl w:val="0"/>
+          <w:numId w:val="1"/>
+        </w:numPr>
+        <w:rPr>
+          <w:rFonts w:ascii="Arial" w:hAnsi="Arial" w:cs="Arial"/>
+          <w:lang w:val="es-CO"/>
+        </w:rPr>
+      </w:pPr>
+      <w:proofErr w:type="spellStart"/>
+      <w:r>
+        <w:rPr>
+          <w:rFonts w:ascii="Arial" w:hAnsi="Arial" w:cs="Arial"/>
+          <w:lang w:val="es-CO"/>
+        </w:rPr>
+        <w:t>Headers</w:t>
+      </w:r>
+      <w:proofErr w:type="spellEnd"/>
+      <w:r>
+        <w:rPr>
+          <w:rFonts w:ascii="Arial" w:hAnsi="Arial" w:cs="Arial"/>
+          <w:lang w:val="es-CO"/>
+        </w:rPr>
+        <w:t xml:space="preserve"> sin nombres descriptivos: </w:t>
+      </w:r>
+      <w:proofErr w:type="spellStart"/>
+      <w:r>
+        <w:rPr>
+          <w:rFonts w:ascii="Arial" w:hAnsi="Arial" w:cs="Arial"/>
+          <w:lang w:val="es-CO"/>
+        </w:rPr>
+        <w:t>headers</w:t>
+      </w:r>
+      <w:proofErr w:type="spellEnd"/>
+      <w:r>
+        <w:rPr>
+          <w:rFonts w:ascii="Arial" w:hAnsi="Arial" w:cs="Arial"/>
+          <w:lang w:val="es-CO"/>
+        </w:rPr>
+        <w:t xml:space="preserve"> con nombres por defecto de Pandas tipo ‘</w:t>
+      </w:r>
+      <w:proofErr w:type="spellStart"/>
+      <w:r>
+        <w:rPr>
+          <w:rFonts w:ascii="Arial" w:hAnsi="Arial" w:cs="Arial"/>
+          <w:lang w:val="es-CO"/>
+        </w:rPr>
+        <w:t>Unnamed</w:t>
+      </w:r>
+      <w:proofErr w:type="spellEnd"/>
+      <w:r>
+        <w:rPr>
+          <w:rFonts w:ascii="Arial" w:hAnsi="Arial" w:cs="Arial"/>
+          <w:lang w:val="es-CO"/>
+        </w:rPr>
+        <w:t>: X’.</w:t>
+      </w:r>
+    </w:p>
+    <w:p>
+      <w:pPr>
+        <w:rPr>
+          <w:rFonts w:ascii="Arial" w:hAnsi="Arial" w:cs="Arial"/>
+          <w:lang w:val="es-CO"/>
+        </w:rPr>
+      </w:pPr>
+      <w:r>
+        <w:rPr>
+          <w:rFonts w:ascii="Arial" w:hAnsi="Arial" w:cs="Arial"/>
+          <w:lang w:val="es-CO"/>
+        </w:rPr>
+        <w:lastRenderedPageBreak/>
+        <w:t xml:space="preserve">Se asignan los </w:t>
+      </w:r>
+      <w:proofErr w:type="spellStart"/>
+      <w:r>
+        <w:rPr>
+          <w:rFonts w:ascii="Arial" w:hAnsi="Arial" w:cs="Arial"/>
+          <w:lang w:val="es-CO"/>
+        </w:rPr>
+        <w:t>headers</w:t>
+      </w:r>
+      <w:proofErr w:type="spellEnd"/>
+      <w:r>
+        <w:rPr>
+          <w:rFonts w:ascii="Arial" w:hAnsi="Arial" w:cs="Arial"/>
+          <w:lang w:val="es-CO"/>
+        </w:rPr>
+        <w:t xml:space="preserve"> originales</w:t>
+      </w:r>
+    </w:p>
+    <w:p>
+      <w:pPr>
+        <w:rPr>
+          <w:rFonts w:ascii="Arial" w:hAnsi="Arial" w:cs="Arial"/>
+          <w:lang w:val="es-CO"/>
+        </w:rPr>
+      </w:pPr>
+      <w:r>
+        <w:rPr>
+          <w:rFonts w:ascii="Arial" w:hAnsi="Arial" w:cs="Arial"/>
+          <w:lang w:val="es-CO"/>
+        </w:rPr>
+        <w:drawing>
+          <wp:inline distT="0" distB="0" distL="0" distR="0" wp14:anchorId="4C4C3F02" wp14:editId="132C9311">
+            <wp:extent cx="5612130" cy="1958340"/>
+            <wp:effectExtent l="0" t="0" r="7620" b="3810"/>
+            <wp:docPr id="45" name="Imagen 45"/>
+            <wp:cNvGraphicFramePr>
+              <a:graphicFrameLocks xmlns:a="http://schemas.openxmlformats.org/drawingml/2006/main" noChangeAspect="1"/>
+            </wp:cNvGraphicFramePr>
+            <a:graphic xmlns:a="http://schemas.openxmlformats.org/drawingml/2006/main">
+              <a:graphicData uri="http://schemas.openxmlformats.org/drawingml/2006/picture">
+                <pic:pic xmlns:pic="http://schemas.openxmlformats.org/drawingml/2006/picture">
+                  <pic:nvPicPr>
+                    <pic:cNvPr id="1" name=""/>
+                    <pic:cNvPicPr/>
+                  </pic:nvPicPr>
+                  <pic:blipFill>
+                    <a:blip r:embed="rId56"/>
+                    <a:stretch>
+                      <a:fillRect/>
+                    </a:stretch>
+                  </pic:blipFill>
+                  <pic:spPr>
+                    <a:xfrm>
+                      <a:off x="0" y="0"/>
+                      <a:ext cx="5612130" cy="1958340"/>
+                    </a:xfrm>
+                    <a:prstGeom prst="rect">
+                      <a:avLst/>
+                    </a:prstGeom>
+                  </pic:spPr>
+                </pic:pic>
+              </a:graphicData>
+            </a:graphic>
+          </wp:inline>
+        </w:drawing>
+      </w:r>
+    </w:p>
+    <w:p>
+      <w:pPr>
+        <w:rPr>
+          <w:rFonts w:ascii="Arial" w:hAnsi="Arial" w:cs="Arial"/>
+          <w:lang w:val="es-CO"/>
+        </w:rPr>
+      </w:pPr>
+    </w:p>
+    <w:p>
+      <w:pPr>
+        <w:rPr>
+          <w:rFonts w:ascii="Arial" w:hAnsi="Arial" w:cs="Arial"/>
+          <w:lang w:val="es-CO"/>
+        </w:rPr>
+      </w:pPr>
+      <w:r>
+        <w:rPr>
+          <w:rFonts w:ascii="Arial" w:hAnsi="Arial" w:cs="Arial"/>
+          <w:lang w:val="es-CO"/>
+        </w:rPr>
+        <w:t>Se propagan las columnas de ‘</w:t>
+      </w:r>
+      <w:proofErr w:type="spellStart"/>
+      <w:r>
+        <w:rPr>
+          <w:rFonts w:ascii="Arial" w:hAnsi="Arial" w:cs="Arial"/>
+          <w:lang w:val="es-CO"/>
+        </w:rPr>
+        <w:t>Area</w:t>
+      </w:r>
+      <w:proofErr w:type="spellEnd"/>
+      <w:r>
+        <w:rPr>
+          <w:rFonts w:ascii="Arial" w:hAnsi="Arial" w:cs="Arial"/>
+          <w:lang w:val="es-CO"/>
+        </w:rPr>
+        <w:t>’ y ‘Sexo’</w:t>
+      </w:r>
+    </w:p>
+    <w:p>
+      <w:pPr>
+        <w:rPr>
+          <w:rFonts w:ascii="Arial" w:hAnsi="Arial" w:cs="Arial"/>
+          <w:lang w:val="es-CO"/>
+        </w:rPr>
+      </w:pPr>
+      <w:r>
+        <w:rPr>
+          <w:rFonts w:ascii="Arial" w:hAnsi="Arial" w:cs="Arial"/>
+          <w:lang w:val="es-CO"/>
+        </w:rPr>
+        <w:drawing>
+          <wp:inline distT="0" distB="0" distL="0" distR="0" wp14:anchorId="75F73C02" wp14:editId="2BC88520">
+            <wp:extent cx="5612130" cy="2226945"/>
+            <wp:effectExtent l="0" t="0" r="7620" b="1905"/>
+            <wp:docPr id="46" name="Imagen 46"/>
+            <wp:cNvGraphicFramePr>
+              <a:graphicFrameLocks xmlns:a="http://schemas.openxmlformats.org/drawingml/2006/main" noChangeAspect="1"/>
+            </wp:cNvGraphicFramePr>
+            <a:graphic xmlns:a="http://schemas.openxmlformats.org/drawingml/2006/main">
+              <a:graphicData uri="http://schemas.openxmlformats.org/drawingml/2006/picture">
+                <pic:pic xmlns:pic="http://schemas.openxmlformats.org/drawingml/2006/picture">
+                  <pic:nvPicPr>
+                    <pic:cNvPr id="1" name=""/>
+                    <pic:cNvPicPr/>
+                  </pic:nvPicPr>
+                  <pic:blipFill>
+                    <a:blip r:embed="rId57"/>
+                    <a:stretch>
+                      <a:fillRect/>
+                    </a:stretch>
+                  </pic:blipFill>
+                  <pic:spPr>
+                    <a:xfrm>
+                      <a:off x="0" y="0"/>
+                      <a:ext cx="5612130" cy="2226945"/>
+                    </a:xfrm>
+                    <a:prstGeom prst="rect">
+                      <a:avLst/>
+                    </a:prstGeom>
+                  </pic:spPr>
+                </pic:pic>
+              </a:graphicData>
+            </a:graphic>
+          </wp:inline>
+        </w:drawing>
+      </w:r>
+    </w:p>
+    <w:p>
+      <w:pPr>
+        <w:rPr>
+          <w:rFonts w:ascii="Arial" w:hAnsi="Arial" w:cs="Arial"/>
+          <w:lang w:val="es-CO"/>
+        </w:rPr>
+      </w:pPr>
+    </w:p>
+    <w:p>
+      <w:pPr>
+        <w:rPr>
+          <w:rFonts w:ascii="Arial" w:hAnsi="Arial" w:cs="Arial"/>
+          <w:lang w:val="es-CO"/>
+        </w:rPr>
+      </w:pPr>
+      <w:r>
+        <w:rPr>
+          <w:rFonts w:ascii="Arial" w:hAnsi="Arial" w:cs="Arial"/>
+          <w:lang w:val="es-CO"/>
+        </w:rPr>
+        <w:t xml:space="preserve">Se renombran los </w:t>
+      </w:r>
+      <w:proofErr w:type="spellStart"/>
+      <w:r>
+        <w:rPr>
+          <w:rFonts w:ascii="Arial" w:hAnsi="Arial" w:cs="Arial"/>
+          <w:lang w:val="es-CO"/>
+        </w:rPr>
+        <w:t>headers</w:t>
+      </w:r>
+      <w:proofErr w:type="spellEnd"/>
+      <w:r>
+        <w:rPr>
+          <w:rFonts w:ascii="Arial" w:hAnsi="Arial" w:cs="Arial"/>
+          <w:lang w:val="es-CO"/>
+        </w:rPr>
+        <w:t xml:space="preserve"> que contienen tildes o ñ.</w:t>
       </w:r>
     </w:p>
     <w:p>

</xml_diff>

<commit_message>
Agrega la documentacion del procesamiento de la hoja 17PM
</commit_message>
<xml_diff>
--- a/Documentacion/Procesamiento de Datos.docx
+++ b/Documentacion/Procesamiento de Datos.docx
@@ -194,37 +194,126 @@
           <w:rFonts w:ascii="Arial" w:hAnsi="Arial" w:cs="Arial"/>
           <w:lang w:val="es-CO"/>
         </w:rPr>
-        <w:t>Almacenamiento de datos extraídos: .csv</w:t>
-      </w:r>
-    </w:p>
-    <w:p>
-      <w:pPr>
-        <w:rPr>
-          <w:rFonts w:ascii="Arial" w:hAnsi="Arial" w:cs="Arial"/>
-          <w:lang w:val="es-CO"/>
-        </w:rPr>
-      </w:pPr>
-      <w:r>
-        <w:rPr>
-          <w:rFonts w:ascii="Arial" w:hAnsi="Arial" w:cs="Arial"/>
-          <w:lang w:val="es-CO"/>
-        </w:rPr>
-        <w:t>Las fuentes de datos vienen en hojas de excel desde el origen, aunque el proyecto es muy específico sobre el municipio de Viterbo, Caldas y podrían extraerse manualmente a otra hoja de excel y trabajar sobre ellos, se puede construir un flujo de extracción de datos escalable utilizando Python, lo anterior para poder aplicarlo a todo el dataset en un futuro.</w:t>
-      </w:r>
-    </w:p>
-    <w:p>
-      <w:pPr>
-        <w:rPr>
-          <w:rFonts w:ascii="Arial" w:hAnsi="Arial" w:cs="Arial"/>
-          <w:lang w:val="es-CO"/>
-        </w:rPr>
-      </w:pPr>
-      <w:r>
-        <w:rPr>
-          <w:rFonts w:ascii="Arial" w:hAnsi="Arial" w:cs="Arial"/>
-          <w:lang w:val="es-CO"/>
-        </w:rPr>
-        <w:t>Los datos procesados se almacenarán en documentos .csv como datasets definitivos.</w:t>
+        <w:t>Almacenamiento de datos extraídos: .</w:t>
+      </w:r>
+      <w:proofErr w:type="spellStart"/>
+      <w:r>
+        <w:rPr>
+          <w:rFonts w:ascii="Arial" w:hAnsi="Arial" w:cs="Arial"/>
+          <w:lang w:val="es-CO"/>
+        </w:rPr>
+        <w:t>csv</w:t>
+      </w:r>
+      <w:proofErr w:type="spellEnd"/>
+    </w:p>
+    <w:p>
+      <w:pPr>
+        <w:rPr>
+          <w:rFonts w:ascii="Arial" w:hAnsi="Arial" w:cs="Arial"/>
+          <w:lang w:val="es-CO"/>
+        </w:rPr>
+      </w:pPr>
+      <w:r>
+        <w:rPr>
+          <w:rFonts w:ascii="Arial" w:hAnsi="Arial" w:cs="Arial"/>
+          <w:lang w:val="es-CO"/>
+        </w:rPr>
+        <w:t xml:space="preserve">Las fuentes de datos vienen en hojas de </w:t>
+      </w:r>
+      <w:proofErr w:type="spellStart"/>
+      <w:r>
+        <w:rPr>
+          <w:rFonts w:ascii="Arial" w:hAnsi="Arial" w:cs="Arial"/>
+          <w:lang w:val="es-CO"/>
+        </w:rPr>
+        <w:t>excel</w:t>
+      </w:r>
+      <w:proofErr w:type="spellEnd"/>
+      <w:r>
+        <w:rPr>
+          <w:rFonts w:ascii="Arial" w:hAnsi="Arial" w:cs="Arial"/>
+          <w:lang w:val="es-CO"/>
+        </w:rPr>
+        <w:t xml:space="preserve"> desde el origen, aunque el proyecto es muy específico sobre el municipio de Viterbo, Caldas y podrían extraerse manualmente a otra hoja de </w:t>
+      </w:r>
+      <w:proofErr w:type="spellStart"/>
+      <w:r>
+        <w:rPr>
+          <w:rFonts w:ascii="Arial" w:hAnsi="Arial" w:cs="Arial"/>
+          <w:lang w:val="es-CO"/>
+        </w:rPr>
+        <w:t>excel</w:t>
+      </w:r>
+      <w:proofErr w:type="spellEnd"/>
+      <w:r>
+        <w:rPr>
+          <w:rFonts w:ascii="Arial" w:hAnsi="Arial" w:cs="Arial"/>
+          <w:lang w:val="es-CO"/>
+        </w:rPr>
+        <w:t xml:space="preserve"> y trabajar sobre ellos, se puede construir un flujo de extracción de datos escalable utilizando Python, lo anterior para poder aplicarlo a todo el </w:t>
+      </w:r>
+      <w:proofErr w:type="spellStart"/>
+      <w:r>
+        <w:rPr>
+          <w:rFonts w:ascii="Arial" w:hAnsi="Arial" w:cs="Arial"/>
+          <w:lang w:val="es-CO"/>
+        </w:rPr>
+        <w:t>dataset</w:t>
+      </w:r>
+      <w:proofErr w:type="spellEnd"/>
+      <w:r>
+        <w:rPr>
+          <w:rFonts w:ascii="Arial" w:hAnsi="Arial" w:cs="Arial"/>
+          <w:lang w:val="es-CO"/>
+        </w:rPr>
+        <w:t xml:space="preserve"> en un futuro.</w:t>
+      </w:r>
+    </w:p>
+    <w:p>
+      <w:pPr>
+        <w:rPr>
+          <w:rFonts w:ascii="Arial" w:hAnsi="Arial" w:cs="Arial"/>
+          <w:lang w:val="es-CO"/>
+        </w:rPr>
+      </w:pPr>
+      <w:r>
+        <w:rPr>
+          <w:rFonts w:ascii="Arial" w:hAnsi="Arial" w:cs="Arial"/>
+          <w:lang w:val="es-CO"/>
+        </w:rPr>
+        <w:t>Los datos procesados se almacenarán en documentos .</w:t>
+      </w:r>
+      <w:proofErr w:type="spellStart"/>
+      <w:r>
+        <w:rPr>
+          <w:rFonts w:ascii="Arial" w:hAnsi="Arial" w:cs="Arial"/>
+          <w:lang w:val="es-CO"/>
+        </w:rPr>
+        <w:t>csv</w:t>
+      </w:r>
+      <w:proofErr w:type="spellEnd"/>
+      <w:r>
+        <w:rPr>
+          <w:rFonts w:ascii="Arial" w:hAnsi="Arial" w:cs="Arial"/>
+          <w:lang w:val="es-CO"/>
+        </w:rPr>
+        <w:t xml:space="preserve"> como </w:t>
+      </w:r>
+      <w:proofErr w:type="spellStart"/>
+      <w:r>
+        <w:rPr>
+          <w:rFonts w:ascii="Arial" w:hAnsi="Arial" w:cs="Arial"/>
+          <w:lang w:val="es-CO"/>
+        </w:rPr>
+        <w:t>datasets</w:t>
+      </w:r>
+      <w:proofErr w:type="spellEnd"/>
+      <w:r>
+        <w:rPr>
+          <w:rFonts w:ascii="Arial" w:hAnsi="Arial" w:cs="Arial"/>
+          <w:lang w:val="es-CO"/>
+        </w:rPr>
+        <w:t xml:space="preserve"> definitivos.</w:t>
       </w:r>
     </w:p>
     <w:p>
@@ -390,7 +479,23 @@
           <w:rFonts w:ascii="Arial" w:hAnsi="Arial" w:cs="Arial"/>
           <w:lang w:val="es-CO"/>
         </w:rPr>
-        <w:t>Se empieza por extraer solo la parte correspondiente a los datos del archivo excel, para lo cual se ignoran las primeras 9 filas de la hoja</w:t>
+        <w:t xml:space="preserve">Se empieza por extraer solo la parte correspondiente a los datos del archivo </w:t>
+      </w:r>
+      <w:proofErr w:type="spellStart"/>
+      <w:r>
+        <w:rPr>
+          <w:rFonts w:ascii="Arial" w:hAnsi="Arial" w:cs="Arial"/>
+          <w:lang w:val="es-CO"/>
+        </w:rPr>
+        <w:t>excel</w:t>
+      </w:r>
+      <w:proofErr w:type="spellEnd"/>
+      <w:r>
+        <w:rPr>
+          <w:rFonts w:ascii="Arial" w:hAnsi="Arial" w:cs="Arial"/>
+          <w:lang w:val="es-CO"/>
+        </w:rPr>
+        <w:t>, para lo cual se ignoran las primeras 9 filas de la hoja</w:t>
       </w:r>
     </w:p>
     <w:p>
@@ -470,22 +575,47 @@
           <w:rFonts w:ascii="Arial" w:hAnsi="Arial" w:cs="Arial"/>
           <w:lang w:val="es-CO"/>
         </w:rPr>
-        <w:t>Actualización de headers</w:t>
-      </w:r>
-    </w:p>
-    <w:p>
-      <w:pPr>
-        <w:rPr>
-          <w:rFonts w:ascii="Arial" w:hAnsi="Arial" w:cs="Arial"/>
-          <w:lang w:val="es-CO"/>
-        </w:rPr>
-      </w:pPr>
-      <w:r>
-        <w:rPr>
-          <w:rFonts w:ascii="Arial" w:hAnsi="Arial" w:cs="Arial"/>
-          <w:lang w:val="es-CO"/>
-        </w:rPr>
-        <w:t>Al extraer los datos desde el archivo .xlsx, se verifica el dataframe generado por Pandas, empezando por los nombres de las columnas y se observan las siguientes incidencias:</w:t>
+        <w:t xml:space="preserve">Actualización de </w:t>
+      </w:r>
+      <w:proofErr w:type="spellStart"/>
+      <w:r>
+        <w:rPr>
+          <w:rFonts w:ascii="Arial" w:hAnsi="Arial" w:cs="Arial"/>
+          <w:lang w:val="es-CO"/>
+        </w:rPr>
+        <w:t>headers</w:t>
+      </w:r>
+      <w:proofErr w:type="spellEnd"/>
+    </w:p>
+    <w:p>
+      <w:pPr>
+        <w:rPr>
+          <w:rFonts w:ascii="Arial" w:hAnsi="Arial" w:cs="Arial"/>
+          <w:lang w:val="es-CO"/>
+        </w:rPr>
+      </w:pPr>
+      <w:r>
+        <w:rPr>
+          <w:rFonts w:ascii="Arial" w:hAnsi="Arial" w:cs="Arial"/>
+          <w:lang w:val="es-CO"/>
+        </w:rPr>
+        <w:t xml:space="preserve">Al extraer los datos desde el archivo .xlsx, se verifica el </w:t>
+      </w:r>
+      <w:proofErr w:type="spellStart"/>
+      <w:r>
+        <w:rPr>
+          <w:rFonts w:ascii="Arial" w:hAnsi="Arial" w:cs="Arial"/>
+          <w:lang w:val="es-CO"/>
+        </w:rPr>
+        <w:t>dataframe</w:t>
+      </w:r>
+      <w:proofErr w:type="spellEnd"/>
+      <w:r>
+        <w:rPr>
+          <w:rFonts w:ascii="Arial" w:hAnsi="Arial" w:cs="Arial"/>
+          <w:lang w:val="es-CO"/>
+        </w:rPr>
+        <w:t xml:space="preserve"> generado por Pandas, empezando por los nombres de las columnas y se observan las siguientes incidencias:</w:t>
       </w:r>
     </w:p>
     <w:p>
@@ -500,12 +630,53 @@
           <w:lang w:val="es-CO"/>
         </w:rPr>
       </w:pPr>
-      <w:r>
-        <w:rPr>
-          <w:rFonts w:ascii="Arial" w:hAnsi="Arial" w:cs="Arial"/>
-          <w:lang w:val="es-CO"/>
-        </w:rPr>
-        <w:t>Headers sin nombres descriptivos: headers con nombres por defecto de Pandas tipo ‘Unnamed: X’.</w:t>
+      <w:proofErr w:type="spellStart"/>
+      <w:r>
+        <w:rPr>
+          <w:rFonts w:ascii="Arial" w:hAnsi="Arial" w:cs="Arial"/>
+          <w:lang w:val="es-CO"/>
+        </w:rPr>
+        <w:t>Headers</w:t>
+      </w:r>
+      <w:proofErr w:type="spellEnd"/>
+      <w:r>
+        <w:rPr>
+          <w:rFonts w:ascii="Arial" w:hAnsi="Arial" w:cs="Arial"/>
+          <w:lang w:val="es-CO"/>
+        </w:rPr>
+        <w:t xml:space="preserve"> sin nombres descriptivos: </w:t>
+      </w:r>
+      <w:proofErr w:type="spellStart"/>
+      <w:r>
+        <w:rPr>
+          <w:rFonts w:ascii="Arial" w:hAnsi="Arial" w:cs="Arial"/>
+          <w:lang w:val="es-CO"/>
+        </w:rPr>
+        <w:t>headers</w:t>
+      </w:r>
+      <w:proofErr w:type="spellEnd"/>
+      <w:r>
+        <w:rPr>
+          <w:rFonts w:ascii="Arial" w:hAnsi="Arial" w:cs="Arial"/>
+          <w:lang w:val="es-CO"/>
+        </w:rPr>
+        <w:t xml:space="preserve"> con nombres por defecto de Pandas tipo ‘</w:t>
+      </w:r>
+      <w:proofErr w:type="spellStart"/>
+      <w:r>
+        <w:rPr>
+          <w:rFonts w:ascii="Arial" w:hAnsi="Arial" w:cs="Arial"/>
+          <w:lang w:val="es-CO"/>
+        </w:rPr>
+        <w:t>Unnamed</w:t>
+      </w:r>
+      <w:proofErr w:type="spellEnd"/>
+      <w:r>
+        <w:rPr>
+          <w:rFonts w:ascii="Arial" w:hAnsi="Arial" w:cs="Arial"/>
+          <w:lang w:val="es-CO"/>
+        </w:rPr>
+        <w:t>: X’.</w:t>
       </w:r>
     </w:p>
     <w:p>
@@ -520,12 +691,21 @@
           <w:lang w:val="es-CO"/>
         </w:rPr>
       </w:pPr>
-      <w:r>
-        <w:rPr>
-          <w:rFonts w:ascii="Arial" w:hAnsi="Arial" w:cs="Arial"/>
-          <w:lang w:val="es-CO"/>
-        </w:rPr>
-        <w:t>Headers en jerarquías inferiores debido a la agrupación de datos: ‘Hombre’ y ‘Mujer’ se encuentran en la primera fila de datos debido al diseño del .xlsx donde se busca describir la agrupación por Sexo de los datos.</w:t>
+      <w:proofErr w:type="spellStart"/>
+      <w:r>
+        <w:rPr>
+          <w:rFonts w:ascii="Arial" w:hAnsi="Arial" w:cs="Arial"/>
+          <w:lang w:val="es-CO"/>
+        </w:rPr>
+        <w:t>Headers</w:t>
+      </w:r>
+      <w:proofErr w:type="spellEnd"/>
+      <w:r>
+        <w:rPr>
+          <w:rFonts w:ascii="Arial" w:hAnsi="Arial" w:cs="Arial"/>
+          <w:lang w:val="es-CO"/>
+        </w:rPr>
+        <w:t xml:space="preserve"> en jerarquías inferiores debido a la agrupación de datos: ‘Hombre’ y ‘Mujer’ se encuentran en la primera fila de datos debido al diseño del .xlsx donde se busca describir la agrupación por Sexo de los datos.</w:t>
       </w:r>
     </w:p>
     <w:p>
@@ -545,7 +725,39 @@
           <w:rFonts w:ascii="Arial" w:hAnsi="Arial" w:cs="Arial"/>
           <w:lang w:val="es-CO"/>
         </w:rPr>
-        <w:t>Tildes: Se tienen headers con tildes como ‘Índice de masculinidad’ e ‘Índice de feminidad’, las tildes es mejor evitarlas para evitar errores de charset de las herramientas utilizadas.</w:t>
+        <w:t xml:space="preserve">Tildes: Se tienen </w:t>
+      </w:r>
+      <w:proofErr w:type="spellStart"/>
+      <w:r>
+        <w:rPr>
+          <w:rFonts w:ascii="Arial" w:hAnsi="Arial" w:cs="Arial"/>
+          <w:lang w:val="es-CO"/>
+        </w:rPr>
+        <w:t>headers</w:t>
+      </w:r>
+      <w:proofErr w:type="spellEnd"/>
+      <w:r>
+        <w:rPr>
+          <w:rFonts w:ascii="Arial" w:hAnsi="Arial" w:cs="Arial"/>
+          <w:lang w:val="es-CO"/>
+        </w:rPr>
+        <w:t xml:space="preserve"> con tildes como ‘Índice de masculinidad’ e ‘Índice de feminidad’, las tildes es mejor evitarlas para evitar errores de </w:t>
+      </w:r>
+      <w:proofErr w:type="spellStart"/>
+      <w:r>
+        <w:rPr>
+          <w:rFonts w:ascii="Arial" w:hAnsi="Arial" w:cs="Arial"/>
+          <w:lang w:val="es-CO"/>
+        </w:rPr>
+        <w:t>charset</w:t>
+      </w:r>
+      <w:proofErr w:type="spellEnd"/>
+      <w:r>
+        <w:rPr>
+          <w:rFonts w:ascii="Arial" w:hAnsi="Arial" w:cs="Arial"/>
+          <w:lang w:val="es-CO"/>
+        </w:rPr>
+        <w:t xml:space="preserve"> de las herramientas utilizadas.</w:t>
       </w:r>
     </w:p>
     <w:p>
@@ -639,14 +851,32 @@
           <w:lang w:val="es-CO"/>
         </w:rPr>
       </w:pPr>
+      <w:proofErr w:type="spellStart"/>
       <w:r>
         <w:rPr>
           <w:rFonts w:ascii="Arial" w:hAnsi="Arial" w:cs="Arial"/>
           <w:lang w:val="es-CO"/>
         </w:rPr>
         <w:lastRenderedPageBreak/>
-        <w:t>Unnamed: 2: Area</w:t>
-      </w:r>
+        <w:t>Unnamed</w:t>
+      </w:r>
+      <w:proofErr w:type="spellEnd"/>
+      <w:r>
+        <w:rPr>
+          <w:rFonts w:ascii="Arial" w:hAnsi="Arial" w:cs="Arial"/>
+          <w:lang w:val="es-CO"/>
+        </w:rPr>
+        <w:t xml:space="preserve">: 2: </w:t>
+      </w:r>
+      <w:proofErr w:type="spellStart"/>
+      <w:r>
+        <w:rPr>
+          <w:rFonts w:ascii="Arial" w:hAnsi="Arial" w:cs="Arial"/>
+          <w:lang w:val="es-CO"/>
+        </w:rPr>
+        <w:t>Area</w:t>
+      </w:r>
+      <w:proofErr w:type="spellEnd"/>
     </w:p>
     <w:p>
       <w:pPr>
@@ -660,12 +890,21 @@
           <w:lang w:val="es-CO"/>
         </w:rPr>
       </w:pPr>
-      <w:r>
-        <w:rPr>
-          <w:rFonts w:ascii="Arial" w:hAnsi="Arial" w:cs="Arial"/>
-          <w:lang w:val="es-CO"/>
-        </w:rPr>
-        <w:t>Unnamed: 3: Grupo de edad</w:t>
+      <w:proofErr w:type="spellStart"/>
+      <w:r>
+        <w:rPr>
+          <w:rFonts w:ascii="Arial" w:hAnsi="Arial" w:cs="Arial"/>
+          <w:lang w:val="es-CO"/>
+        </w:rPr>
+        <w:t>Unnamed</w:t>
+      </w:r>
+      <w:proofErr w:type="spellEnd"/>
+      <w:r>
+        <w:rPr>
+          <w:rFonts w:ascii="Arial" w:hAnsi="Arial" w:cs="Arial"/>
+          <w:lang w:val="es-CO"/>
+        </w:rPr>
+        <w:t>: 3: Grupo de edad</w:t>
       </w:r>
     </w:p>
     <w:p>
@@ -700,12 +939,21 @@
           <w:lang w:val="es-CO"/>
         </w:rPr>
       </w:pPr>
-      <w:r>
-        <w:rPr>
-          <w:rFonts w:ascii="Arial" w:hAnsi="Arial" w:cs="Arial"/>
-          <w:lang w:val="es-CO"/>
-        </w:rPr>
-        <w:t>Unnamed 6: Mujer</w:t>
+      <w:proofErr w:type="spellStart"/>
+      <w:r>
+        <w:rPr>
+          <w:rFonts w:ascii="Arial" w:hAnsi="Arial" w:cs="Arial"/>
+          <w:lang w:val="es-CO"/>
+        </w:rPr>
+        <w:t>Unnamed</w:t>
+      </w:r>
+      <w:proofErr w:type="spellEnd"/>
+      <w:r>
+        <w:rPr>
+          <w:rFonts w:ascii="Arial" w:hAnsi="Arial" w:cs="Arial"/>
+          <w:lang w:val="es-CO"/>
+        </w:rPr>
+        <w:t xml:space="preserve"> 6: Mujer</w:t>
       </w:r>
     </w:p>
     <w:p>
@@ -725,7 +973,23 @@
           <w:rFonts w:ascii="Arial" w:hAnsi="Arial" w:cs="Arial"/>
           <w:lang w:val="es-CO"/>
         </w:rPr>
-        <w:t>Índice de masculinidad: Indice de masculinidad</w:t>
+        <w:t xml:space="preserve">Índice de masculinidad: </w:t>
+      </w:r>
+      <w:proofErr w:type="spellStart"/>
+      <w:r>
+        <w:rPr>
+          <w:rFonts w:ascii="Arial" w:hAnsi="Arial" w:cs="Arial"/>
+          <w:lang w:val="es-CO"/>
+        </w:rPr>
+        <w:t>Indice</w:t>
+      </w:r>
+      <w:proofErr w:type="spellEnd"/>
+      <w:r>
+        <w:rPr>
+          <w:rFonts w:ascii="Arial" w:hAnsi="Arial" w:cs="Arial"/>
+          <w:lang w:val="es-CO"/>
+        </w:rPr>
+        <w:t xml:space="preserve"> de masculinidad</w:t>
       </w:r>
     </w:p>
     <w:p>
@@ -745,7 +1009,23 @@
           <w:rFonts w:ascii="Arial" w:hAnsi="Arial" w:cs="Arial"/>
           <w:lang w:val="es-CO"/>
         </w:rPr>
-        <w:t>Índice de feminidad: Indice de feminidad</w:t>
+        <w:t xml:space="preserve">Índice de feminidad: </w:t>
+      </w:r>
+      <w:proofErr w:type="spellStart"/>
+      <w:r>
+        <w:rPr>
+          <w:rFonts w:ascii="Arial" w:hAnsi="Arial" w:cs="Arial"/>
+          <w:lang w:val="es-CO"/>
+        </w:rPr>
+        <w:t>Indice</w:t>
+      </w:r>
+      <w:proofErr w:type="spellEnd"/>
+      <w:r>
+        <w:rPr>
+          <w:rFonts w:ascii="Arial" w:hAnsi="Arial" w:cs="Arial"/>
+          <w:lang w:val="es-CO"/>
+        </w:rPr>
+        <w:t xml:space="preserve"> de feminidad</w:t>
       </w:r>
     </w:p>
     <w:p>
@@ -846,7 +1126,23 @@
           <w:rFonts w:ascii="Arial" w:hAnsi="Arial" w:cs="Arial"/>
           <w:lang w:val="es-CO"/>
         </w:rPr>
-        <w:t>Se evidencian dos columnas sin datos o con datos irrelevantes para el dataset que pueden ser eliminadas:</w:t>
+        <w:t xml:space="preserve">Se evidencian dos columnas sin datos o con datos irrelevantes para el </w:t>
+      </w:r>
+      <w:proofErr w:type="spellStart"/>
+      <w:r>
+        <w:rPr>
+          <w:rFonts w:ascii="Arial" w:hAnsi="Arial" w:cs="Arial"/>
+          <w:lang w:val="es-CO"/>
+        </w:rPr>
+        <w:t>dataset</w:t>
+      </w:r>
+      <w:proofErr w:type="spellEnd"/>
+      <w:r>
+        <w:rPr>
+          <w:rFonts w:ascii="Arial" w:hAnsi="Arial" w:cs="Arial"/>
+          <w:lang w:val="es-CO"/>
+        </w:rPr>
+        <w:t xml:space="preserve"> que pueden ser eliminadas:</w:t>
       </w:r>
     </w:p>
     <w:p>
@@ -888,12 +1184,21 @@
           <w:lang w:val="es-CO"/>
         </w:rPr>
       </w:pPr>
-      <w:r>
-        <w:rPr>
-          <w:rFonts w:ascii="Arial" w:hAnsi="Arial" w:cs="Arial"/>
-          <w:lang w:val="es-CO"/>
-        </w:rPr>
-        <w:t>Unnamed: 1: Contiene el municipio, para este caso particular es irrelevante porque solo se tratarán datos del municipio de Viterbo, Caldas, pero se tendrá en cuenta para un futuro proyecto que involucre múltiples municipios al mismo tiempo.</w:t>
+      <w:proofErr w:type="spellStart"/>
+      <w:r>
+        <w:rPr>
+          <w:rFonts w:ascii="Arial" w:hAnsi="Arial" w:cs="Arial"/>
+          <w:lang w:val="es-CO"/>
+        </w:rPr>
+        <w:t>Unnamed</w:t>
+      </w:r>
+      <w:proofErr w:type="spellEnd"/>
+      <w:r>
+        <w:rPr>
+          <w:rFonts w:ascii="Arial" w:hAnsi="Arial" w:cs="Arial"/>
+          <w:lang w:val="es-CO"/>
+        </w:rPr>
+        <w:t>: 1: Contiene el municipio, para este caso particular es irrelevante porque solo se tratarán datos del municipio de Viterbo, Caldas, pero se tendrá en cuenta para un futuro proyecto que involucre múltiples municipios al mismo tiempo.</w:t>
       </w:r>
     </w:p>
     <w:p>
@@ -1027,22 +1332,95 @@
           <w:rFonts w:ascii="Arial" w:hAnsi="Arial" w:cs="Arial"/>
           <w:lang w:val="es-CO"/>
         </w:rPr>
-        <w:t>Tratamiento de valores Nulos, en blanco o NaN</w:t>
-      </w:r>
-    </w:p>
-    <w:p>
-      <w:pPr>
-        <w:rPr>
-          <w:rFonts w:ascii="Arial" w:hAnsi="Arial" w:cs="Arial"/>
-          <w:lang w:val="es-CO"/>
-        </w:rPr>
-      </w:pPr>
-      <w:r>
-        <w:rPr>
-          <w:rFonts w:ascii="Arial" w:hAnsi="Arial" w:cs="Arial"/>
-          <w:lang w:val="es-CO"/>
-        </w:rPr>
-        <w:t>La única columna con valores NaN es la columna ‘Area’, la cual indica el área de recolección de datos en el municipio, Totales, cabecera municipal, centros poblados, zonas rurales dispersas, la presencia de valores NaN se debe a la agrupación realizada en el diseño del .xlsx, el enfoque para resolver esta inconsistencia será propagar el primer valor válido hasta el siguiente valor válido y repetir hasta reemplazar todos los valores NaN.</w:t>
+        <w:t xml:space="preserve">Tratamiento de valores Nulos, en blanco o </w:t>
+      </w:r>
+      <w:proofErr w:type="spellStart"/>
+      <w:r>
+        <w:rPr>
+          <w:rFonts w:ascii="Arial" w:hAnsi="Arial" w:cs="Arial"/>
+          <w:lang w:val="es-CO"/>
+        </w:rPr>
+        <w:t>NaN</w:t>
+      </w:r>
+      <w:proofErr w:type="spellEnd"/>
+    </w:p>
+    <w:p>
+      <w:pPr>
+        <w:rPr>
+          <w:rFonts w:ascii="Arial" w:hAnsi="Arial" w:cs="Arial"/>
+          <w:lang w:val="es-CO"/>
+        </w:rPr>
+      </w:pPr>
+      <w:r>
+        <w:rPr>
+          <w:rFonts w:ascii="Arial" w:hAnsi="Arial" w:cs="Arial"/>
+          <w:lang w:val="es-CO"/>
+        </w:rPr>
+        <w:t xml:space="preserve">La única columna con valores </w:t>
+      </w:r>
+      <w:proofErr w:type="spellStart"/>
+      <w:r>
+        <w:rPr>
+          <w:rFonts w:ascii="Arial" w:hAnsi="Arial" w:cs="Arial"/>
+          <w:lang w:val="es-CO"/>
+        </w:rPr>
+        <w:t>NaN</w:t>
+      </w:r>
+      <w:proofErr w:type="spellEnd"/>
+      <w:r>
+        <w:rPr>
+          <w:rFonts w:ascii="Arial" w:hAnsi="Arial" w:cs="Arial"/>
+          <w:lang w:val="es-CO"/>
+        </w:rPr>
+        <w:t xml:space="preserve"> es la columna ‘</w:t>
+      </w:r>
+      <w:proofErr w:type="spellStart"/>
+      <w:r>
+        <w:rPr>
+          <w:rFonts w:ascii="Arial" w:hAnsi="Arial" w:cs="Arial"/>
+          <w:lang w:val="es-CO"/>
+        </w:rPr>
+        <w:t>Area</w:t>
+      </w:r>
+      <w:proofErr w:type="spellEnd"/>
+      <w:r>
+        <w:rPr>
+          <w:rFonts w:ascii="Arial" w:hAnsi="Arial" w:cs="Arial"/>
+          <w:lang w:val="es-CO"/>
+        </w:rPr>
+        <w:t xml:space="preserve">’, la cual indica el área de recolección de datos en el municipio, Totales, cabecera municipal, centros poblados, zonas rurales dispersas, la presencia de valores </w:t>
+      </w:r>
+      <w:proofErr w:type="spellStart"/>
+      <w:r>
+        <w:rPr>
+          <w:rFonts w:ascii="Arial" w:hAnsi="Arial" w:cs="Arial"/>
+          <w:lang w:val="es-CO"/>
+        </w:rPr>
+        <w:t>NaN</w:t>
+      </w:r>
+      <w:proofErr w:type="spellEnd"/>
+      <w:r>
+        <w:rPr>
+          <w:rFonts w:ascii="Arial" w:hAnsi="Arial" w:cs="Arial"/>
+          <w:lang w:val="es-CO"/>
+        </w:rPr>
+        <w:t xml:space="preserve"> se debe a la agrupación realizada en el diseño del .xlsx, el enfoque para resolver esta inconsistencia será propagar el primer valor válido hasta el siguiente valor válido y repetir hasta reemplazar todos los valores </w:t>
+      </w:r>
+      <w:proofErr w:type="spellStart"/>
+      <w:r>
+        <w:rPr>
+          <w:rFonts w:ascii="Arial" w:hAnsi="Arial" w:cs="Arial"/>
+          <w:lang w:val="es-CO"/>
+        </w:rPr>
+        <w:t>NaN</w:t>
+      </w:r>
+      <w:proofErr w:type="spellEnd"/>
+      <w:r>
+        <w:rPr>
+          <w:rFonts w:ascii="Arial" w:hAnsi="Arial" w:cs="Arial"/>
+          <w:lang w:val="es-CO"/>
+        </w:rPr>
+        <w:t>.</w:t>
       </w:r>
     </w:p>
     <w:p>
@@ -1251,7 +1629,23 @@
           <w:rFonts w:ascii="Arial" w:hAnsi="Arial" w:cs="Arial"/>
           <w:lang w:val="es-CO"/>
         </w:rPr>
-        <w:t>Se empieza por extraer solo la parte correspondiente a los datos del archivo excel, para lo cual se ignoran las primeras 9 filas de la hoja</w:t>
+        <w:t xml:space="preserve">Se empieza por extraer solo la parte correspondiente a los datos del archivo </w:t>
+      </w:r>
+      <w:proofErr w:type="spellStart"/>
+      <w:r>
+        <w:rPr>
+          <w:rFonts w:ascii="Arial" w:hAnsi="Arial" w:cs="Arial"/>
+          <w:lang w:val="es-CO"/>
+        </w:rPr>
+        <w:t>excel</w:t>
+      </w:r>
+      <w:proofErr w:type="spellEnd"/>
+      <w:r>
+        <w:rPr>
+          <w:rFonts w:ascii="Arial" w:hAnsi="Arial" w:cs="Arial"/>
+          <w:lang w:val="es-CO"/>
+        </w:rPr>
+        <w:t>, para lo cual se ignoran las primeras 9 filas de la hoja</w:t>
       </w:r>
     </w:p>
     <w:p>
@@ -1510,22 +1904,47 @@
           <w:rFonts w:ascii="Arial" w:hAnsi="Arial" w:cs="Arial"/>
           <w:lang w:val="es-CO"/>
         </w:rPr>
-        <w:t>Actualización de headers</w:t>
-      </w:r>
-    </w:p>
-    <w:p>
-      <w:pPr>
-        <w:rPr>
-          <w:rFonts w:ascii="Arial" w:hAnsi="Arial" w:cs="Arial"/>
-          <w:lang w:val="es-CO"/>
-        </w:rPr>
-      </w:pPr>
-      <w:r>
-        <w:rPr>
-          <w:rFonts w:ascii="Arial" w:hAnsi="Arial" w:cs="Arial"/>
-          <w:lang w:val="es-CO"/>
-        </w:rPr>
-        <w:t>Al extraer los datos desde el archivo .xlsx, se verifica el dataframe generado por Pandas, empezando por los nombres de las columnas y se observan las siguientes incidencias:</w:t>
+        <w:t xml:space="preserve">Actualización de </w:t>
+      </w:r>
+      <w:proofErr w:type="spellStart"/>
+      <w:r>
+        <w:rPr>
+          <w:rFonts w:ascii="Arial" w:hAnsi="Arial" w:cs="Arial"/>
+          <w:lang w:val="es-CO"/>
+        </w:rPr>
+        <w:t>headers</w:t>
+      </w:r>
+      <w:proofErr w:type="spellEnd"/>
+    </w:p>
+    <w:p>
+      <w:pPr>
+        <w:rPr>
+          <w:rFonts w:ascii="Arial" w:hAnsi="Arial" w:cs="Arial"/>
+          <w:lang w:val="es-CO"/>
+        </w:rPr>
+      </w:pPr>
+      <w:r>
+        <w:rPr>
+          <w:rFonts w:ascii="Arial" w:hAnsi="Arial" w:cs="Arial"/>
+          <w:lang w:val="es-CO"/>
+        </w:rPr>
+        <w:t xml:space="preserve">Al extraer los datos desde el archivo .xlsx, se verifica el </w:t>
+      </w:r>
+      <w:proofErr w:type="spellStart"/>
+      <w:r>
+        <w:rPr>
+          <w:rFonts w:ascii="Arial" w:hAnsi="Arial" w:cs="Arial"/>
+          <w:lang w:val="es-CO"/>
+        </w:rPr>
+        <w:t>dataframe</w:t>
+      </w:r>
+      <w:proofErr w:type="spellEnd"/>
+      <w:r>
+        <w:rPr>
+          <w:rFonts w:ascii="Arial" w:hAnsi="Arial" w:cs="Arial"/>
+          <w:lang w:val="es-CO"/>
+        </w:rPr>
+        <w:t xml:space="preserve"> generado por Pandas, empezando por los nombres de las columnas y se observan las siguientes incidencias:</w:t>
       </w:r>
     </w:p>
     <w:p>
@@ -1540,12 +1959,53 @@
           <w:lang w:val="es-CO"/>
         </w:rPr>
       </w:pPr>
-      <w:r>
-        <w:rPr>
-          <w:rFonts w:ascii="Arial" w:hAnsi="Arial" w:cs="Arial"/>
-          <w:lang w:val="es-CO"/>
-        </w:rPr>
-        <w:t>Headers sin nombres descriptivos: headers con nombres por defecto de Pandas tipo ‘Unnamed: X’.</w:t>
+      <w:proofErr w:type="spellStart"/>
+      <w:r>
+        <w:rPr>
+          <w:rFonts w:ascii="Arial" w:hAnsi="Arial" w:cs="Arial"/>
+          <w:lang w:val="es-CO"/>
+        </w:rPr>
+        <w:t>Headers</w:t>
+      </w:r>
+      <w:proofErr w:type="spellEnd"/>
+      <w:r>
+        <w:rPr>
+          <w:rFonts w:ascii="Arial" w:hAnsi="Arial" w:cs="Arial"/>
+          <w:lang w:val="es-CO"/>
+        </w:rPr>
+        <w:t xml:space="preserve"> sin nombres descriptivos: </w:t>
+      </w:r>
+      <w:proofErr w:type="spellStart"/>
+      <w:r>
+        <w:rPr>
+          <w:rFonts w:ascii="Arial" w:hAnsi="Arial" w:cs="Arial"/>
+          <w:lang w:val="es-CO"/>
+        </w:rPr>
+        <w:t>headers</w:t>
+      </w:r>
+      <w:proofErr w:type="spellEnd"/>
+      <w:r>
+        <w:rPr>
+          <w:rFonts w:ascii="Arial" w:hAnsi="Arial" w:cs="Arial"/>
+          <w:lang w:val="es-CO"/>
+        </w:rPr>
+        <w:t xml:space="preserve"> con nombres por defecto de Pandas tipo ‘</w:t>
+      </w:r>
+      <w:proofErr w:type="spellStart"/>
+      <w:r>
+        <w:rPr>
+          <w:rFonts w:ascii="Arial" w:hAnsi="Arial" w:cs="Arial"/>
+          <w:lang w:val="es-CO"/>
+        </w:rPr>
+        <w:t>Unnamed</w:t>
+      </w:r>
+      <w:proofErr w:type="spellEnd"/>
+      <w:r>
+        <w:rPr>
+          <w:rFonts w:ascii="Arial" w:hAnsi="Arial" w:cs="Arial"/>
+          <w:lang w:val="es-CO"/>
+        </w:rPr>
+        <w:t>: X’.</w:t>
       </w:r>
     </w:p>
     <w:p>
@@ -1560,28 +2020,69 @@
           <w:lang w:val="es-CO"/>
         </w:rPr>
       </w:pPr>
+      <w:proofErr w:type="spellStart"/>
       <w:r>
         <w:rPr>
           <w:rFonts w:ascii="Arial" w:hAnsi="Arial" w:cs="Arial"/>
           <w:lang w:val="es-CO"/>
         </w:rPr>
         <w:lastRenderedPageBreak/>
-        <w:t>Headers en jerarquías inferiores debido a la agrupación de datos: ‘Hombre’ y ‘Mujer’ se encuentran en la primera fila de datos debido al diseño del .xlsx donde se busca describir la agrupación por Sexo de los datos.</w:t>
-      </w:r>
-    </w:p>
-    <w:p>
-      <w:pPr>
-        <w:rPr>
-          <w:rFonts w:ascii="Arial" w:hAnsi="Arial" w:cs="Arial"/>
-          <w:lang w:val="es-CO"/>
-        </w:rPr>
-      </w:pPr>
-      <w:r>
-        <w:rPr>
-          <w:rFonts w:ascii="Arial" w:hAnsi="Arial" w:cs="Arial"/>
-          <w:lang w:val="es-CO"/>
-        </w:rPr>
-        <w:t>Debido a la agrupación de datos en las columnas, se divide el dataframe en 3 partes, correspondientes a las áreas, ignorando el total para remover resúmenes de datos en el dataset final. Luego de dividirlos, se reemplazan los nombres de las columnas de la siguiente manera:</w:t>
+        <w:t>Headers</w:t>
+      </w:r>
+      <w:proofErr w:type="spellEnd"/>
+      <w:r>
+        <w:rPr>
+          <w:rFonts w:ascii="Arial" w:hAnsi="Arial" w:cs="Arial"/>
+          <w:lang w:val="es-CO"/>
+        </w:rPr>
+        <w:t xml:space="preserve"> en jerarquías inferiores debido a la agrupación de datos: ‘Hombre’ y ‘Mujer’ se encuentran en la primera fila de datos debido al diseño del .xlsx donde se busca describir la agrupación por Sexo de los datos.</w:t>
+      </w:r>
+    </w:p>
+    <w:p>
+      <w:pPr>
+        <w:rPr>
+          <w:rFonts w:ascii="Arial" w:hAnsi="Arial" w:cs="Arial"/>
+          <w:lang w:val="es-CO"/>
+        </w:rPr>
+      </w:pPr>
+      <w:r>
+        <w:rPr>
+          <w:rFonts w:ascii="Arial" w:hAnsi="Arial" w:cs="Arial"/>
+          <w:lang w:val="es-CO"/>
+        </w:rPr>
+        <w:t xml:space="preserve">Debido a la agrupación de datos en las columnas, se divide el </w:t>
+      </w:r>
+      <w:proofErr w:type="spellStart"/>
+      <w:r>
+        <w:rPr>
+          <w:rFonts w:ascii="Arial" w:hAnsi="Arial" w:cs="Arial"/>
+          <w:lang w:val="es-CO"/>
+        </w:rPr>
+        <w:t>dataframe</w:t>
+      </w:r>
+      <w:proofErr w:type="spellEnd"/>
+      <w:r>
+        <w:rPr>
+          <w:rFonts w:ascii="Arial" w:hAnsi="Arial" w:cs="Arial"/>
+          <w:lang w:val="es-CO"/>
+        </w:rPr>
+        <w:t xml:space="preserve"> en 3 partes, correspondientes a las áreas, ignorando el total para remover resúmenes de datos en el </w:t>
+      </w:r>
+      <w:proofErr w:type="spellStart"/>
+      <w:r>
+        <w:rPr>
+          <w:rFonts w:ascii="Arial" w:hAnsi="Arial" w:cs="Arial"/>
+          <w:lang w:val="es-CO"/>
+        </w:rPr>
+        <w:t>dataset</w:t>
+      </w:r>
+      <w:proofErr w:type="spellEnd"/>
+      <w:r>
+        <w:rPr>
+          <w:rFonts w:ascii="Arial" w:hAnsi="Arial" w:cs="Arial"/>
+          <w:lang w:val="es-CO"/>
+        </w:rPr>
+        <w:t xml:space="preserve"> final. Luego de dividirlos, se reemplazan los nombres de las columnas de la siguiente manera:</w:t>
       </w:r>
     </w:p>
     <w:p>
@@ -1596,12 +2097,21 @@
           <w:lang w:val="es-CO"/>
         </w:rPr>
       </w:pPr>
-      <w:r>
-        <w:rPr>
-          <w:rFonts w:ascii="Arial" w:hAnsi="Arial" w:cs="Arial"/>
-          <w:lang w:val="es-CO"/>
-        </w:rPr>
-        <w:t>Unnamed: 3: Edad</w:t>
+      <w:proofErr w:type="spellStart"/>
+      <w:r>
+        <w:rPr>
+          <w:rFonts w:ascii="Arial" w:hAnsi="Arial" w:cs="Arial"/>
+          <w:lang w:val="es-CO"/>
+        </w:rPr>
+        <w:t>Unnamed</w:t>
+      </w:r>
+      <w:proofErr w:type="spellEnd"/>
+      <w:r>
+        <w:rPr>
+          <w:rFonts w:ascii="Arial" w:hAnsi="Arial" w:cs="Arial"/>
+          <w:lang w:val="es-CO"/>
+        </w:rPr>
+        <w:t>: 3: Edad</w:t>
       </w:r>
     </w:p>
     <w:p>
@@ -1616,12 +2126,21 @@
           <w:lang w:val="es-CO"/>
         </w:rPr>
       </w:pPr>
-      <w:r>
-        <w:rPr>
-          <w:rFonts w:ascii="Arial" w:hAnsi="Arial" w:cs="Arial"/>
-          <w:lang w:val="es-CO"/>
-        </w:rPr>
-        <w:t>Unnamed: 8: Hombre</w:t>
+      <w:proofErr w:type="spellStart"/>
+      <w:r>
+        <w:rPr>
+          <w:rFonts w:ascii="Arial" w:hAnsi="Arial" w:cs="Arial"/>
+          <w:lang w:val="es-CO"/>
+        </w:rPr>
+        <w:t>Unnamed</w:t>
+      </w:r>
+      <w:proofErr w:type="spellEnd"/>
+      <w:r>
+        <w:rPr>
+          <w:rFonts w:ascii="Arial" w:hAnsi="Arial" w:cs="Arial"/>
+          <w:lang w:val="es-CO"/>
+        </w:rPr>
+        <w:t>: 8: Hombre</w:t>
       </w:r>
     </w:p>
     <w:p>
@@ -1636,12 +2155,21 @@
           <w:lang w:val="es-CO"/>
         </w:rPr>
       </w:pPr>
-      <w:r>
-        <w:rPr>
-          <w:rFonts w:ascii="Arial" w:hAnsi="Arial" w:cs="Arial"/>
-          <w:lang w:val="es-CO"/>
-        </w:rPr>
-        <w:t>Unnamed: 9: Mujer</w:t>
+      <w:proofErr w:type="spellStart"/>
+      <w:r>
+        <w:rPr>
+          <w:rFonts w:ascii="Arial" w:hAnsi="Arial" w:cs="Arial"/>
+          <w:lang w:val="es-CO"/>
+        </w:rPr>
+        <w:t>Unnamed</w:t>
+      </w:r>
+      <w:proofErr w:type="spellEnd"/>
+      <w:r>
+        <w:rPr>
+          <w:rFonts w:ascii="Arial" w:hAnsi="Arial" w:cs="Arial"/>
+          <w:lang w:val="es-CO"/>
+        </w:rPr>
+        <w:t>: 9: Mujer</w:t>
       </w:r>
     </w:p>
     <w:p>
@@ -1656,12 +2184,21 @@
           <w:lang w:val="es-CO"/>
         </w:rPr>
       </w:pPr>
-      <w:r>
-        <w:rPr>
-          <w:rFonts w:ascii="Arial" w:hAnsi="Arial" w:cs="Arial"/>
-          <w:lang w:val="es-CO"/>
-        </w:rPr>
-        <w:t>Unnamed: 11: Hombre</w:t>
+      <w:proofErr w:type="spellStart"/>
+      <w:r>
+        <w:rPr>
+          <w:rFonts w:ascii="Arial" w:hAnsi="Arial" w:cs="Arial"/>
+          <w:lang w:val="es-CO"/>
+        </w:rPr>
+        <w:t>Unnamed</w:t>
+      </w:r>
+      <w:proofErr w:type="spellEnd"/>
+      <w:r>
+        <w:rPr>
+          <w:rFonts w:ascii="Arial" w:hAnsi="Arial" w:cs="Arial"/>
+          <w:lang w:val="es-CO"/>
+        </w:rPr>
+        <w:t>: 11: Hombre</w:t>
       </w:r>
     </w:p>
     <w:p>
@@ -1676,12 +2213,21 @@
           <w:lang w:val="es-CO"/>
         </w:rPr>
       </w:pPr>
-      <w:r>
-        <w:rPr>
-          <w:rFonts w:ascii="Arial" w:hAnsi="Arial" w:cs="Arial"/>
-          <w:lang w:val="es-CO"/>
-        </w:rPr>
-        <w:t>Unnamed: 12: Mujer</w:t>
+      <w:proofErr w:type="spellStart"/>
+      <w:r>
+        <w:rPr>
+          <w:rFonts w:ascii="Arial" w:hAnsi="Arial" w:cs="Arial"/>
+          <w:lang w:val="es-CO"/>
+        </w:rPr>
+        <w:t>Unnamed</w:t>
+      </w:r>
+      <w:proofErr w:type="spellEnd"/>
+      <w:r>
+        <w:rPr>
+          <w:rFonts w:ascii="Arial" w:hAnsi="Arial" w:cs="Arial"/>
+          <w:lang w:val="es-CO"/>
+        </w:rPr>
+        <w:t>: 12: Mujer</w:t>
       </w:r>
     </w:p>
     <w:p>
@@ -1696,12 +2242,21 @@
           <w:lang w:val="es-CO"/>
         </w:rPr>
       </w:pPr>
-      <w:r>
-        <w:rPr>
-          <w:rFonts w:ascii="Arial" w:hAnsi="Arial" w:cs="Arial"/>
-          <w:lang w:val="es-CO"/>
-        </w:rPr>
-        <w:t>Unnamed: 14: Hombre</w:t>
+      <w:proofErr w:type="spellStart"/>
+      <w:r>
+        <w:rPr>
+          <w:rFonts w:ascii="Arial" w:hAnsi="Arial" w:cs="Arial"/>
+          <w:lang w:val="es-CO"/>
+        </w:rPr>
+        <w:t>Unnamed</w:t>
+      </w:r>
+      <w:proofErr w:type="spellEnd"/>
+      <w:r>
+        <w:rPr>
+          <w:rFonts w:ascii="Arial" w:hAnsi="Arial" w:cs="Arial"/>
+          <w:lang w:val="es-CO"/>
+        </w:rPr>
+        <w:t>: 14: Hombre</w:t>
       </w:r>
     </w:p>
     <w:p>
@@ -1716,28 +2271,62 @@
           <w:lang w:val="es-CO"/>
         </w:rPr>
       </w:pPr>
-      <w:r>
-        <w:rPr>
-          <w:rFonts w:ascii="Arial" w:hAnsi="Arial" w:cs="Arial"/>
-          <w:lang w:val="es-CO"/>
-        </w:rPr>
-        <w:t>Unnamed: 15: Mujer</w:t>
-      </w:r>
-    </w:p>
-    <w:p>
-      <w:pPr>
-        <w:rPr>
-          <w:rFonts w:ascii="Arial" w:hAnsi="Arial" w:cs="Arial"/>
-          <w:lang w:val="es-CO"/>
-        </w:rPr>
-      </w:pPr>
-      <w:r>
-        <w:rPr>
-          <w:rFonts w:ascii="Arial" w:hAnsi="Arial" w:cs="Arial"/>
-          <w:lang w:val="es-CO"/>
-        </w:rPr>
-        <w:t>Para identificar el área, se crea una nueva columna ‘Area’ indicando el área de análisis (cabecera, centro poblado, rural disperso), en cada subconjunto, y se unen los subconjuntos como un solo dataframe</w:t>
-      </w:r>
+      <w:proofErr w:type="spellStart"/>
+      <w:r>
+        <w:rPr>
+          <w:rFonts w:ascii="Arial" w:hAnsi="Arial" w:cs="Arial"/>
+          <w:lang w:val="es-CO"/>
+        </w:rPr>
+        <w:t>Unnamed</w:t>
+      </w:r>
+      <w:proofErr w:type="spellEnd"/>
+      <w:r>
+        <w:rPr>
+          <w:rFonts w:ascii="Arial" w:hAnsi="Arial" w:cs="Arial"/>
+          <w:lang w:val="es-CO"/>
+        </w:rPr>
+        <w:t>: 15: Mujer</w:t>
+      </w:r>
+    </w:p>
+    <w:p>
+      <w:pPr>
+        <w:rPr>
+          <w:rFonts w:ascii="Arial" w:hAnsi="Arial" w:cs="Arial"/>
+          <w:lang w:val="es-CO"/>
+        </w:rPr>
+      </w:pPr>
+      <w:r>
+        <w:rPr>
+          <w:rFonts w:ascii="Arial" w:hAnsi="Arial" w:cs="Arial"/>
+          <w:lang w:val="es-CO"/>
+        </w:rPr>
+        <w:t>Para identificar el área, se crea una nueva columna ‘</w:t>
+      </w:r>
+      <w:proofErr w:type="spellStart"/>
+      <w:r>
+        <w:rPr>
+          <w:rFonts w:ascii="Arial" w:hAnsi="Arial" w:cs="Arial"/>
+          <w:lang w:val="es-CO"/>
+        </w:rPr>
+        <w:t>Area</w:t>
+      </w:r>
+      <w:proofErr w:type="spellEnd"/>
+      <w:r>
+        <w:rPr>
+          <w:rFonts w:ascii="Arial" w:hAnsi="Arial" w:cs="Arial"/>
+          <w:lang w:val="es-CO"/>
+        </w:rPr>
+        <w:t xml:space="preserve">’ indicando el área de análisis (cabecera, centro poblado, rural disperso), en cada subconjunto, y se unen los subconjuntos como un solo </w:t>
+      </w:r>
+      <w:proofErr w:type="spellStart"/>
+      <w:r>
+        <w:rPr>
+          <w:rFonts w:ascii="Arial" w:hAnsi="Arial" w:cs="Arial"/>
+          <w:lang w:val="es-CO"/>
+        </w:rPr>
+        <w:t>dataframe</w:t>
+      </w:r>
+      <w:proofErr w:type="spellEnd"/>
       <w:r>
         <w:rPr>
           <w:rFonts w:ascii="Arial" w:hAnsi="Arial" w:cs="Arial"/>
@@ -1932,7 +2521,23 @@
           <w:rFonts w:ascii="Arial" w:hAnsi="Arial" w:cs="Arial"/>
           <w:lang w:val="es-CO"/>
         </w:rPr>
-        <w:t>Se empieza por extraer solo la parte correspondiente a los datos del archivo excel, para lo cual se ignoran las primeras 9 filas de la hoja</w:t>
+        <w:t xml:space="preserve">Se empieza por extraer solo la parte correspondiente a los datos del archivo </w:t>
+      </w:r>
+      <w:proofErr w:type="spellStart"/>
+      <w:r>
+        <w:rPr>
+          <w:rFonts w:ascii="Arial" w:hAnsi="Arial" w:cs="Arial"/>
+          <w:lang w:val="es-CO"/>
+        </w:rPr>
+        <w:t>excel</w:t>
+      </w:r>
+      <w:proofErr w:type="spellEnd"/>
+      <w:r>
+        <w:rPr>
+          <w:rFonts w:ascii="Arial" w:hAnsi="Arial" w:cs="Arial"/>
+          <w:lang w:val="es-CO"/>
+        </w:rPr>
+        <w:t>, para lo cual se ignoran las primeras 9 filas de la hoja</w:t>
       </w:r>
       <w:r>
         <w:rPr>
@@ -2018,22 +2623,47 @@
           <w:rFonts w:ascii="Arial" w:hAnsi="Arial" w:cs="Arial"/>
           <w:lang w:val="es-CO"/>
         </w:rPr>
-        <w:t>Actualización de headers</w:t>
-      </w:r>
-    </w:p>
-    <w:p>
-      <w:pPr>
-        <w:rPr>
-          <w:rFonts w:ascii="Arial" w:hAnsi="Arial" w:cs="Arial"/>
-          <w:lang w:val="es-CO"/>
-        </w:rPr>
-      </w:pPr>
-      <w:r>
-        <w:rPr>
-          <w:rFonts w:ascii="Arial" w:hAnsi="Arial" w:cs="Arial"/>
-          <w:lang w:val="es-CO"/>
-        </w:rPr>
-        <w:t>Al extraer los datos desde el archivo .xlsx, se verifica el dataframe generado por Pandas, empezando por los nombres de las columnas y se observan las siguientes incidencias:</w:t>
+        <w:t xml:space="preserve">Actualización de </w:t>
+      </w:r>
+      <w:proofErr w:type="spellStart"/>
+      <w:r>
+        <w:rPr>
+          <w:rFonts w:ascii="Arial" w:hAnsi="Arial" w:cs="Arial"/>
+          <w:lang w:val="es-CO"/>
+        </w:rPr>
+        <w:t>headers</w:t>
+      </w:r>
+      <w:proofErr w:type="spellEnd"/>
+    </w:p>
+    <w:p>
+      <w:pPr>
+        <w:rPr>
+          <w:rFonts w:ascii="Arial" w:hAnsi="Arial" w:cs="Arial"/>
+          <w:lang w:val="es-CO"/>
+        </w:rPr>
+      </w:pPr>
+      <w:r>
+        <w:rPr>
+          <w:rFonts w:ascii="Arial" w:hAnsi="Arial" w:cs="Arial"/>
+          <w:lang w:val="es-CO"/>
+        </w:rPr>
+        <w:t xml:space="preserve">Al extraer los datos desde el archivo .xlsx, se verifica el </w:t>
+      </w:r>
+      <w:proofErr w:type="spellStart"/>
+      <w:r>
+        <w:rPr>
+          <w:rFonts w:ascii="Arial" w:hAnsi="Arial" w:cs="Arial"/>
+          <w:lang w:val="es-CO"/>
+        </w:rPr>
+        <w:t>dataframe</w:t>
+      </w:r>
+      <w:proofErr w:type="spellEnd"/>
+      <w:r>
+        <w:rPr>
+          <w:rFonts w:ascii="Arial" w:hAnsi="Arial" w:cs="Arial"/>
+          <w:lang w:val="es-CO"/>
+        </w:rPr>
+        <w:t xml:space="preserve"> generado por Pandas, empezando por los nombres de las columnas y se observan las siguientes incidencias:</w:t>
       </w:r>
     </w:p>
     <w:p>
@@ -2048,12 +2678,53 @@
           <w:lang w:val="es-CO"/>
         </w:rPr>
       </w:pPr>
-      <w:r>
-        <w:rPr>
-          <w:rFonts w:ascii="Arial" w:hAnsi="Arial" w:cs="Arial"/>
-          <w:lang w:val="es-CO"/>
-        </w:rPr>
-        <w:t>Headers sin nombres descriptivos: headers con nombres por defecto de Pandas tipo ‘Unnamed: X’.</w:t>
+      <w:proofErr w:type="spellStart"/>
+      <w:r>
+        <w:rPr>
+          <w:rFonts w:ascii="Arial" w:hAnsi="Arial" w:cs="Arial"/>
+          <w:lang w:val="es-CO"/>
+        </w:rPr>
+        <w:t>Headers</w:t>
+      </w:r>
+      <w:proofErr w:type="spellEnd"/>
+      <w:r>
+        <w:rPr>
+          <w:rFonts w:ascii="Arial" w:hAnsi="Arial" w:cs="Arial"/>
+          <w:lang w:val="es-CO"/>
+        </w:rPr>
+        <w:t xml:space="preserve"> sin nombres descriptivos: </w:t>
+      </w:r>
+      <w:proofErr w:type="spellStart"/>
+      <w:r>
+        <w:rPr>
+          <w:rFonts w:ascii="Arial" w:hAnsi="Arial" w:cs="Arial"/>
+          <w:lang w:val="es-CO"/>
+        </w:rPr>
+        <w:t>headers</w:t>
+      </w:r>
+      <w:proofErr w:type="spellEnd"/>
+      <w:r>
+        <w:rPr>
+          <w:rFonts w:ascii="Arial" w:hAnsi="Arial" w:cs="Arial"/>
+          <w:lang w:val="es-CO"/>
+        </w:rPr>
+        <w:t xml:space="preserve"> con nombres por defecto de Pandas tipo ‘</w:t>
+      </w:r>
+      <w:proofErr w:type="spellStart"/>
+      <w:r>
+        <w:rPr>
+          <w:rFonts w:ascii="Arial" w:hAnsi="Arial" w:cs="Arial"/>
+          <w:lang w:val="es-CO"/>
+        </w:rPr>
+        <w:t>Unnamed</w:t>
+      </w:r>
+      <w:proofErr w:type="spellEnd"/>
+      <w:r>
+        <w:rPr>
+          <w:rFonts w:ascii="Arial" w:hAnsi="Arial" w:cs="Arial"/>
+          <w:lang w:val="es-CO"/>
+        </w:rPr>
+        <w:t>: X’.</w:t>
       </w:r>
     </w:p>
     <w:p>
@@ -2068,28 +2739,85 @@
           <w:lang w:val="es-CO"/>
         </w:rPr>
       </w:pPr>
+      <w:proofErr w:type="spellStart"/>
       <w:r>
         <w:rPr>
           <w:rFonts w:ascii="Arial" w:hAnsi="Arial" w:cs="Arial"/>
           <w:lang w:val="es-CO"/>
         </w:rPr>
         <w:lastRenderedPageBreak/>
-        <w:t>Headers en jerarquías inferiores debido a la agrupación de datos: Todos los headers se encuentran en la primera fila de los datos debido al diseño del .xlsx donde se busca describir la agrupación por Relación o parentesco con el jefe(a) del hogar.</w:t>
-      </w:r>
-    </w:p>
-    <w:p>
-      <w:pPr>
-        <w:rPr>
-          <w:rFonts w:ascii="Arial" w:hAnsi="Arial" w:cs="Arial"/>
-          <w:lang w:val="es-CO"/>
-        </w:rPr>
-      </w:pPr>
-      <w:r>
-        <w:rPr>
-          <w:rFonts w:ascii="Arial" w:hAnsi="Arial" w:cs="Arial"/>
-          <w:lang w:val="es-CO"/>
-        </w:rPr>
-        <w:t>Para solucionar esto, se reemplazan los headers actuales desde ‘Relación o parentesco con el jef(a) del hogar’ hasta el último, por los valores correspondientes en la primera fila de datos.</w:t>
+        <w:t>Headers</w:t>
+      </w:r>
+      <w:proofErr w:type="spellEnd"/>
+      <w:r>
+        <w:rPr>
+          <w:rFonts w:ascii="Arial" w:hAnsi="Arial" w:cs="Arial"/>
+          <w:lang w:val="es-CO"/>
+        </w:rPr>
+        <w:t xml:space="preserve"> en jerarquías inferiores debido a la agrupación de datos: Todos los </w:t>
+      </w:r>
+      <w:proofErr w:type="spellStart"/>
+      <w:r>
+        <w:rPr>
+          <w:rFonts w:ascii="Arial" w:hAnsi="Arial" w:cs="Arial"/>
+          <w:lang w:val="es-CO"/>
+        </w:rPr>
+        <w:t>headers</w:t>
+      </w:r>
+      <w:proofErr w:type="spellEnd"/>
+      <w:r>
+        <w:rPr>
+          <w:rFonts w:ascii="Arial" w:hAnsi="Arial" w:cs="Arial"/>
+          <w:lang w:val="es-CO"/>
+        </w:rPr>
+        <w:t xml:space="preserve"> se encuentran en la primera fila de los datos debido al diseño del .xlsx donde se busca describir la agrupación por Relación o parentesco con el jefe(a) del hogar.</w:t>
+      </w:r>
+    </w:p>
+    <w:p>
+      <w:pPr>
+        <w:rPr>
+          <w:rFonts w:ascii="Arial" w:hAnsi="Arial" w:cs="Arial"/>
+          <w:lang w:val="es-CO"/>
+        </w:rPr>
+      </w:pPr>
+      <w:r>
+        <w:rPr>
+          <w:rFonts w:ascii="Arial" w:hAnsi="Arial" w:cs="Arial"/>
+          <w:lang w:val="es-CO"/>
+        </w:rPr>
+        <w:t xml:space="preserve">Para solucionar esto, se reemplazan los </w:t>
+      </w:r>
+      <w:proofErr w:type="spellStart"/>
+      <w:r>
+        <w:rPr>
+          <w:rFonts w:ascii="Arial" w:hAnsi="Arial" w:cs="Arial"/>
+          <w:lang w:val="es-CO"/>
+        </w:rPr>
+        <w:t>headers</w:t>
+      </w:r>
+      <w:proofErr w:type="spellEnd"/>
+      <w:r>
+        <w:rPr>
+          <w:rFonts w:ascii="Arial" w:hAnsi="Arial" w:cs="Arial"/>
+          <w:lang w:val="es-CO"/>
+        </w:rPr>
+        <w:t xml:space="preserve"> actuales desde ‘Relación o parentesco con el </w:t>
+      </w:r>
+      <w:proofErr w:type="spellStart"/>
+      <w:r>
+        <w:rPr>
+          <w:rFonts w:ascii="Arial" w:hAnsi="Arial" w:cs="Arial"/>
+          <w:lang w:val="es-CO"/>
+        </w:rPr>
+        <w:t>jef</w:t>
+      </w:r>
+      <w:proofErr w:type="spellEnd"/>
+      <w:r>
+        <w:rPr>
+          <w:rFonts w:ascii="Arial" w:hAnsi="Arial" w:cs="Arial"/>
+          <w:lang w:val="es-CO"/>
+        </w:rPr>
+        <w:t>(a) del hogar’ hasta el último, por los valores correspondientes en la primera fila de datos.</w:t>
       </w:r>
     </w:p>
     <w:p>
@@ -2239,12 +2967,21 @@
           <w:lang w:val="es-CO"/>
         </w:rPr>
       </w:pPr>
-      <w:r>
-        <w:rPr>
-          <w:rFonts w:ascii="Arial" w:hAnsi="Arial" w:cs="Arial"/>
-          <w:lang w:val="es-CO"/>
-        </w:rPr>
-        <w:t>Unnamed: 1: Municipio</w:t>
+      <w:proofErr w:type="spellStart"/>
+      <w:r>
+        <w:rPr>
+          <w:rFonts w:ascii="Arial" w:hAnsi="Arial" w:cs="Arial"/>
+          <w:lang w:val="es-CO"/>
+        </w:rPr>
+        <w:t>Unnamed</w:t>
+      </w:r>
+      <w:proofErr w:type="spellEnd"/>
+      <w:r>
+        <w:rPr>
+          <w:rFonts w:ascii="Arial" w:hAnsi="Arial" w:cs="Arial"/>
+          <w:lang w:val="es-CO"/>
+        </w:rPr>
+        <w:t>: 1: Municipio</w:t>
       </w:r>
     </w:p>
     <w:p>
@@ -2259,13 +2996,31 @@
           <w:lang w:val="es-CO"/>
         </w:rPr>
       </w:pPr>
-      <w:r>
-        <w:rPr>
-          <w:rFonts w:ascii="Arial" w:hAnsi="Arial" w:cs="Arial"/>
-          <w:lang w:val="es-CO"/>
-        </w:rPr>
-        <w:t>Unnamed: 2: Area</w:t>
-      </w:r>
+      <w:proofErr w:type="spellStart"/>
+      <w:r>
+        <w:rPr>
+          <w:rFonts w:ascii="Arial" w:hAnsi="Arial" w:cs="Arial"/>
+          <w:lang w:val="es-CO"/>
+        </w:rPr>
+        <w:t>Unnamed</w:t>
+      </w:r>
+      <w:proofErr w:type="spellEnd"/>
+      <w:r>
+        <w:rPr>
+          <w:rFonts w:ascii="Arial" w:hAnsi="Arial" w:cs="Arial"/>
+          <w:lang w:val="es-CO"/>
+        </w:rPr>
+        <w:t xml:space="preserve">: 2: </w:t>
+      </w:r>
+      <w:proofErr w:type="spellStart"/>
+      <w:r>
+        <w:rPr>
+          <w:rFonts w:ascii="Arial" w:hAnsi="Arial" w:cs="Arial"/>
+          <w:lang w:val="es-CO"/>
+        </w:rPr>
+        <w:t>Area</w:t>
+      </w:r>
+      <w:proofErr w:type="spellEnd"/>
     </w:p>
     <w:p>
       <w:pPr>
@@ -2279,12 +3034,21 @@
           <w:lang w:val="es-CO"/>
         </w:rPr>
       </w:pPr>
-      <w:r>
-        <w:rPr>
-          <w:rFonts w:ascii="Arial" w:hAnsi="Arial" w:cs="Arial"/>
-          <w:lang w:val="es-CO"/>
-        </w:rPr>
-        <w:t>Unnamed: 3: Sexo</w:t>
+      <w:proofErr w:type="spellStart"/>
+      <w:r>
+        <w:rPr>
+          <w:rFonts w:ascii="Arial" w:hAnsi="Arial" w:cs="Arial"/>
+          <w:lang w:val="es-CO"/>
+        </w:rPr>
+        <w:t>Unnamed</w:t>
+      </w:r>
+      <w:proofErr w:type="spellEnd"/>
+      <w:r>
+        <w:rPr>
+          <w:rFonts w:ascii="Arial" w:hAnsi="Arial" w:cs="Arial"/>
+          <w:lang w:val="es-CO"/>
+        </w:rPr>
+        <w:t>: 3: Sexo</w:t>
       </w:r>
     </w:p>
     <w:p>
@@ -2410,7 +3174,23 @@
           <w:rFonts w:ascii="Arial" w:hAnsi="Arial" w:cs="Arial"/>
           <w:lang w:val="es-CO"/>
         </w:rPr>
-        <w:t>Eliminación de columnas sin información relevante o con información redundante en el dataframe.</w:t>
+        <w:t xml:space="preserve">Eliminación de columnas sin información relevante o con información redundante en el </w:t>
+      </w:r>
+      <w:proofErr w:type="spellStart"/>
+      <w:r>
+        <w:rPr>
+          <w:rFonts w:ascii="Arial" w:hAnsi="Arial" w:cs="Arial"/>
+          <w:lang w:val="es-CO"/>
+        </w:rPr>
+        <w:t>dataframe</w:t>
+      </w:r>
+      <w:proofErr w:type="spellEnd"/>
+      <w:r>
+        <w:rPr>
+          <w:rFonts w:ascii="Arial" w:hAnsi="Arial" w:cs="Arial"/>
+          <w:lang w:val="es-CO"/>
+        </w:rPr>
+        <w:t>.</w:t>
       </w:r>
     </w:p>
     <w:p>
@@ -2611,7 +3391,39 @@
           <w:rFonts w:ascii="Arial" w:hAnsi="Arial" w:cs="Arial"/>
           <w:lang w:val="es-CO"/>
         </w:rPr>
-        <w:t>Se propaga el valor de la columna ‘Area’ para reemplazar los valores NaN.</w:t>
+        <w:t>Se propaga el valor de la columna ‘</w:t>
+      </w:r>
+      <w:proofErr w:type="spellStart"/>
+      <w:r>
+        <w:rPr>
+          <w:rFonts w:ascii="Arial" w:hAnsi="Arial" w:cs="Arial"/>
+          <w:lang w:val="es-CO"/>
+        </w:rPr>
+        <w:t>Area</w:t>
+      </w:r>
+      <w:proofErr w:type="spellEnd"/>
+      <w:r>
+        <w:rPr>
+          <w:rFonts w:ascii="Arial" w:hAnsi="Arial" w:cs="Arial"/>
+          <w:lang w:val="es-CO"/>
+        </w:rPr>
+        <w:t xml:space="preserve">’ para reemplazar los valores </w:t>
+      </w:r>
+      <w:proofErr w:type="spellStart"/>
+      <w:r>
+        <w:rPr>
+          <w:rFonts w:ascii="Arial" w:hAnsi="Arial" w:cs="Arial"/>
+          <w:lang w:val="es-CO"/>
+        </w:rPr>
+        <w:t>NaN</w:t>
+      </w:r>
+      <w:proofErr w:type="spellEnd"/>
+      <w:r>
+        <w:rPr>
+          <w:rFonts w:ascii="Arial" w:hAnsi="Arial" w:cs="Arial"/>
+          <w:lang w:val="es-CO"/>
+        </w:rPr>
+        <w:t>.</w:t>
       </w:r>
     </w:p>
     <w:p>
@@ -2726,7 +3538,23 @@
           <w:rFonts w:ascii="Arial" w:hAnsi="Arial" w:cs="Arial"/>
           <w:lang w:val="es-CO"/>
         </w:rPr>
-        <w:t>Se empieza por extraer solo la parte correspondiente a los datos del archivo excel, para lo cual se ignoran las primeras 9 filas de la hoja.</w:t>
+        <w:t xml:space="preserve">Se empieza por extraer solo la parte correspondiente a los datos del archivo </w:t>
+      </w:r>
+      <w:proofErr w:type="spellStart"/>
+      <w:r>
+        <w:rPr>
+          <w:rFonts w:ascii="Arial" w:hAnsi="Arial" w:cs="Arial"/>
+          <w:lang w:val="es-CO"/>
+        </w:rPr>
+        <w:t>excel</w:t>
+      </w:r>
+      <w:proofErr w:type="spellEnd"/>
+      <w:r>
+        <w:rPr>
+          <w:rFonts w:ascii="Arial" w:hAnsi="Arial" w:cs="Arial"/>
+          <w:lang w:val="es-CO"/>
+        </w:rPr>
+        <w:t>, para lo cual se ignoran las primeras 9 filas de la hoja.</w:t>
       </w:r>
     </w:p>
     <w:p>
@@ -2811,8 +3639,17 @@
           <w:rFonts w:ascii="Arial" w:hAnsi="Arial" w:cs="Arial"/>
           <w:lang w:val="es-CO"/>
         </w:rPr>
-        <w:t>Actualización de headers</w:t>
-      </w:r>
+        <w:t xml:space="preserve">Actualización de </w:t>
+      </w:r>
+      <w:proofErr w:type="spellStart"/>
+      <w:r>
+        <w:rPr>
+          <w:rFonts w:ascii="Arial" w:hAnsi="Arial" w:cs="Arial"/>
+          <w:lang w:val="es-CO"/>
+        </w:rPr>
+        <w:t>headers</w:t>
+      </w:r>
+      <w:proofErr w:type="spellEnd"/>
     </w:p>
     <w:p>
       <w:pPr>
@@ -2827,7 +3664,23 @@
           <w:lang w:val="es-CO"/>
         </w:rPr>
         <w:lastRenderedPageBreak/>
-        <w:t>Al extraer los datos desde el archivo .xlsx, se verifica el dataframe generado por Pandas, empezando por los nombres de las columnas y se observan las siguientes incidencias:</w:t>
+        <w:t xml:space="preserve">Al extraer los datos desde el archivo .xlsx, se verifica el </w:t>
+      </w:r>
+      <w:proofErr w:type="spellStart"/>
+      <w:r>
+        <w:rPr>
+          <w:rFonts w:ascii="Arial" w:hAnsi="Arial" w:cs="Arial"/>
+          <w:lang w:val="es-CO"/>
+        </w:rPr>
+        <w:t>dataframe</w:t>
+      </w:r>
+      <w:proofErr w:type="spellEnd"/>
+      <w:r>
+        <w:rPr>
+          <w:rFonts w:ascii="Arial" w:hAnsi="Arial" w:cs="Arial"/>
+          <w:lang w:val="es-CO"/>
+        </w:rPr>
+        <w:t xml:space="preserve"> generado por Pandas, empezando por los nombres de las columnas y se observan las siguientes incidencias:</w:t>
       </w:r>
     </w:p>
     <w:p>
@@ -2842,12 +3695,53 @@
           <w:lang w:val="es-CO"/>
         </w:rPr>
       </w:pPr>
-      <w:r>
-        <w:rPr>
-          <w:rFonts w:ascii="Arial" w:hAnsi="Arial" w:cs="Arial"/>
-          <w:lang w:val="es-CO"/>
-        </w:rPr>
-        <w:t>Headers sin nombres descriptivos: headers con nombres por defecto de Pandas tipo ‘Unnamed: X’.</w:t>
+      <w:proofErr w:type="spellStart"/>
+      <w:r>
+        <w:rPr>
+          <w:rFonts w:ascii="Arial" w:hAnsi="Arial" w:cs="Arial"/>
+          <w:lang w:val="es-CO"/>
+        </w:rPr>
+        <w:t>Headers</w:t>
+      </w:r>
+      <w:proofErr w:type="spellEnd"/>
+      <w:r>
+        <w:rPr>
+          <w:rFonts w:ascii="Arial" w:hAnsi="Arial" w:cs="Arial"/>
+          <w:lang w:val="es-CO"/>
+        </w:rPr>
+        <w:t xml:space="preserve"> sin nombres descriptivos: </w:t>
+      </w:r>
+      <w:proofErr w:type="spellStart"/>
+      <w:r>
+        <w:rPr>
+          <w:rFonts w:ascii="Arial" w:hAnsi="Arial" w:cs="Arial"/>
+          <w:lang w:val="es-CO"/>
+        </w:rPr>
+        <w:t>headers</w:t>
+      </w:r>
+      <w:proofErr w:type="spellEnd"/>
+      <w:r>
+        <w:rPr>
+          <w:rFonts w:ascii="Arial" w:hAnsi="Arial" w:cs="Arial"/>
+          <w:lang w:val="es-CO"/>
+        </w:rPr>
+        <w:t xml:space="preserve"> con nombres por defecto de Pandas tipo ‘</w:t>
+      </w:r>
+      <w:proofErr w:type="spellStart"/>
+      <w:r>
+        <w:rPr>
+          <w:rFonts w:ascii="Arial" w:hAnsi="Arial" w:cs="Arial"/>
+          <w:lang w:val="es-CO"/>
+        </w:rPr>
+        <w:t>Unnamed</w:t>
+      </w:r>
+      <w:proofErr w:type="spellEnd"/>
+      <w:r>
+        <w:rPr>
+          <w:rFonts w:ascii="Arial" w:hAnsi="Arial" w:cs="Arial"/>
+          <w:lang w:val="es-CO"/>
+        </w:rPr>
+        <w:t>: X’.</w:t>
       </w:r>
     </w:p>
     <w:p>
@@ -2862,27 +3756,84 @@
           <w:lang w:val="es-CO"/>
         </w:rPr>
       </w:pPr>
-      <w:r>
-        <w:rPr>
-          <w:rFonts w:ascii="Arial" w:hAnsi="Arial" w:cs="Arial"/>
-          <w:lang w:val="es-CO"/>
-        </w:rPr>
-        <w:t>Headers en jerarquías inferiores debido a la agrupación de datos: Todos los headers se encuentran en la primera fila de los datos debido al diseño del .xlsx donde se busca describir la agrupación por Relación o parentesco con el jefe(a) del hogar.</w:t>
-      </w:r>
-    </w:p>
-    <w:p>
-      <w:pPr>
-        <w:rPr>
-          <w:rFonts w:ascii="Arial" w:hAnsi="Arial" w:cs="Arial"/>
-          <w:lang w:val="es-CO"/>
-        </w:rPr>
-      </w:pPr>
-      <w:r>
-        <w:rPr>
-          <w:rFonts w:ascii="Arial" w:hAnsi="Arial" w:cs="Arial"/>
-          <w:lang w:val="es-CO"/>
-        </w:rPr>
-        <w:t>Para solucionar esto, se reemplazan los headers actuales desde ‘Relación o parentesco con el jef(a) del hogar’ hasta el último, por los valores correspondientes en la primera fila de datos.</w:t>
+      <w:proofErr w:type="spellStart"/>
+      <w:r>
+        <w:rPr>
+          <w:rFonts w:ascii="Arial" w:hAnsi="Arial" w:cs="Arial"/>
+          <w:lang w:val="es-CO"/>
+        </w:rPr>
+        <w:t>Headers</w:t>
+      </w:r>
+      <w:proofErr w:type="spellEnd"/>
+      <w:r>
+        <w:rPr>
+          <w:rFonts w:ascii="Arial" w:hAnsi="Arial" w:cs="Arial"/>
+          <w:lang w:val="es-CO"/>
+        </w:rPr>
+        <w:t xml:space="preserve"> en jerarquías inferiores debido a la agrupación de datos: Todos los </w:t>
+      </w:r>
+      <w:proofErr w:type="spellStart"/>
+      <w:r>
+        <w:rPr>
+          <w:rFonts w:ascii="Arial" w:hAnsi="Arial" w:cs="Arial"/>
+          <w:lang w:val="es-CO"/>
+        </w:rPr>
+        <w:t>headers</w:t>
+      </w:r>
+      <w:proofErr w:type="spellEnd"/>
+      <w:r>
+        <w:rPr>
+          <w:rFonts w:ascii="Arial" w:hAnsi="Arial" w:cs="Arial"/>
+          <w:lang w:val="es-CO"/>
+        </w:rPr>
+        <w:t xml:space="preserve"> se encuentran en la primera fila de los datos debido al diseño del .xlsx donde se busca describir la agrupación por Relación o parentesco con el jefe(a) del hogar.</w:t>
+      </w:r>
+    </w:p>
+    <w:p>
+      <w:pPr>
+        <w:rPr>
+          <w:rFonts w:ascii="Arial" w:hAnsi="Arial" w:cs="Arial"/>
+          <w:lang w:val="es-CO"/>
+        </w:rPr>
+      </w:pPr>
+      <w:r>
+        <w:rPr>
+          <w:rFonts w:ascii="Arial" w:hAnsi="Arial" w:cs="Arial"/>
+          <w:lang w:val="es-CO"/>
+        </w:rPr>
+        <w:t xml:space="preserve">Para solucionar esto, se reemplazan los </w:t>
+      </w:r>
+      <w:proofErr w:type="spellStart"/>
+      <w:r>
+        <w:rPr>
+          <w:rFonts w:ascii="Arial" w:hAnsi="Arial" w:cs="Arial"/>
+          <w:lang w:val="es-CO"/>
+        </w:rPr>
+        <w:t>headers</w:t>
+      </w:r>
+      <w:proofErr w:type="spellEnd"/>
+      <w:r>
+        <w:rPr>
+          <w:rFonts w:ascii="Arial" w:hAnsi="Arial" w:cs="Arial"/>
+          <w:lang w:val="es-CO"/>
+        </w:rPr>
+        <w:t xml:space="preserve"> actuales desde ‘Relación o parentesco con el </w:t>
+      </w:r>
+      <w:proofErr w:type="spellStart"/>
+      <w:r>
+        <w:rPr>
+          <w:rFonts w:ascii="Arial" w:hAnsi="Arial" w:cs="Arial"/>
+          <w:lang w:val="es-CO"/>
+        </w:rPr>
+        <w:t>jef</w:t>
+      </w:r>
+      <w:proofErr w:type="spellEnd"/>
+      <w:r>
+        <w:rPr>
+          <w:rFonts w:ascii="Arial" w:hAnsi="Arial" w:cs="Arial"/>
+          <w:lang w:val="es-CO"/>
+        </w:rPr>
+        <w:t>(a) del hogar’ hasta el último, por los valores correspondientes en la primera fila de datos.</w:t>
       </w:r>
     </w:p>
     <w:p>
@@ -3024,12 +3975,21 @@
           <w:lang w:val="es-CO"/>
         </w:rPr>
       </w:pPr>
-      <w:r>
-        <w:rPr>
-          <w:rFonts w:ascii="Arial" w:hAnsi="Arial" w:cs="Arial"/>
-          <w:lang w:val="es-CO"/>
-        </w:rPr>
-        <w:t>Unnamed: 1: Municipio</w:t>
+      <w:proofErr w:type="spellStart"/>
+      <w:r>
+        <w:rPr>
+          <w:rFonts w:ascii="Arial" w:hAnsi="Arial" w:cs="Arial"/>
+          <w:lang w:val="es-CO"/>
+        </w:rPr>
+        <w:t>Unnamed</w:t>
+      </w:r>
+      <w:proofErr w:type="spellEnd"/>
+      <w:r>
+        <w:rPr>
+          <w:rFonts w:ascii="Arial" w:hAnsi="Arial" w:cs="Arial"/>
+          <w:lang w:val="es-CO"/>
+        </w:rPr>
+        <w:t>: 1: Municipio</w:t>
       </w:r>
     </w:p>
     <w:p>
@@ -3044,13 +4004,31 @@
           <w:lang w:val="es-CO"/>
         </w:rPr>
       </w:pPr>
-      <w:r>
-        <w:rPr>
-          <w:rFonts w:ascii="Arial" w:hAnsi="Arial" w:cs="Arial"/>
-          <w:lang w:val="es-CO"/>
-        </w:rPr>
-        <w:t>Unnamed: 2: Area</w:t>
-      </w:r>
+      <w:proofErr w:type="spellStart"/>
+      <w:r>
+        <w:rPr>
+          <w:rFonts w:ascii="Arial" w:hAnsi="Arial" w:cs="Arial"/>
+          <w:lang w:val="es-CO"/>
+        </w:rPr>
+        <w:t>Unnamed</w:t>
+      </w:r>
+      <w:proofErr w:type="spellEnd"/>
+      <w:r>
+        <w:rPr>
+          <w:rFonts w:ascii="Arial" w:hAnsi="Arial" w:cs="Arial"/>
+          <w:lang w:val="es-CO"/>
+        </w:rPr>
+        <w:t xml:space="preserve">: 2: </w:t>
+      </w:r>
+      <w:proofErr w:type="spellStart"/>
+      <w:r>
+        <w:rPr>
+          <w:rFonts w:ascii="Arial" w:hAnsi="Arial" w:cs="Arial"/>
+          <w:lang w:val="es-CO"/>
+        </w:rPr>
+        <w:t>Area</w:t>
+      </w:r>
+      <w:proofErr w:type="spellEnd"/>
     </w:p>
     <w:p>
       <w:pPr>
@@ -3064,12 +4042,21 @@
           <w:lang w:val="es-CO"/>
         </w:rPr>
       </w:pPr>
-      <w:r>
-        <w:rPr>
-          <w:rFonts w:ascii="Arial" w:hAnsi="Arial" w:cs="Arial"/>
-          <w:lang w:val="es-CO"/>
-        </w:rPr>
-        <w:t>Unnamed: 3: Grupo de edad</w:t>
+      <w:proofErr w:type="spellStart"/>
+      <w:r>
+        <w:rPr>
+          <w:rFonts w:ascii="Arial" w:hAnsi="Arial" w:cs="Arial"/>
+          <w:lang w:val="es-CO"/>
+        </w:rPr>
+        <w:t>Unnamed</w:t>
+      </w:r>
+      <w:proofErr w:type="spellEnd"/>
+      <w:r>
+        <w:rPr>
+          <w:rFonts w:ascii="Arial" w:hAnsi="Arial" w:cs="Arial"/>
+          <w:lang w:val="es-CO"/>
+        </w:rPr>
+        <w:t>: 3: Grupo de edad</w:t>
       </w:r>
     </w:p>
     <w:p>
@@ -3187,7 +4174,23 @@
           <w:rFonts w:ascii="Arial" w:hAnsi="Arial" w:cs="Arial"/>
           <w:lang w:val="es-CO"/>
         </w:rPr>
-        <w:t>Eliminación de columnas sin información relevante o con información redundante en el dataframe.</w:t>
+        <w:t xml:space="preserve">Eliminación de columnas sin información relevante o con información redundante en el </w:t>
+      </w:r>
+      <w:proofErr w:type="spellStart"/>
+      <w:r>
+        <w:rPr>
+          <w:rFonts w:ascii="Arial" w:hAnsi="Arial" w:cs="Arial"/>
+          <w:lang w:val="es-CO"/>
+        </w:rPr>
+        <w:t>dataframe</w:t>
+      </w:r>
+      <w:proofErr w:type="spellEnd"/>
+      <w:r>
+        <w:rPr>
+          <w:rFonts w:ascii="Arial" w:hAnsi="Arial" w:cs="Arial"/>
+          <w:lang w:val="es-CO"/>
+        </w:rPr>
+        <w:t>.</w:t>
       </w:r>
     </w:p>
     <w:p>
@@ -3403,7 +4406,39 @@
           <w:lang w:val="es-CO"/>
         </w:rPr>
         <w:lastRenderedPageBreak/>
-        <w:t>Se propaga el valor de la columna ‘Area’ para reemplazar los valores NaN.</w:t>
+        <w:t>Se propaga el valor de la columna ‘</w:t>
+      </w:r>
+      <w:proofErr w:type="spellStart"/>
+      <w:r>
+        <w:rPr>
+          <w:rFonts w:ascii="Arial" w:hAnsi="Arial" w:cs="Arial"/>
+          <w:lang w:val="es-CO"/>
+        </w:rPr>
+        <w:t>Area</w:t>
+      </w:r>
+      <w:proofErr w:type="spellEnd"/>
+      <w:r>
+        <w:rPr>
+          <w:rFonts w:ascii="Arial" w:hAnsi="Arial" w:cs="Arial"/>
+          <w:lang w:val="es-CO"/>
+        </w:rPr>
+        <w:t xml:space="preserve">’ para reemplazar los valores </w:t>
+      </w:r>
+      <w:proofErr w:type="spellStart"/>
+      <w:r>
+        <w:rPr>
+          <w:rFonts w:ascii="Arial" w:hAnsi="Arial" w:cs="Arial"/>
+          <w:lang w:val="es-CO"/>
+        </w:rPr>
+        <w:t>NaN</w:t>
+      </w:r>
+      <w:proofErr w:type="spellEnd"/>
+      <w:r>
+        <w:rPr>
+          <w:rFonts w:ascii="Arial" w:hAnsi="Arial" w:cs="Arial"/>
+          <w:lang w:val="es-CO"/>
+        </w:rPr>
+        <w:t>.</w:t>
       </w:r>
     </w:p>
     <w:p>
@@ -3532,7 +4567,23 @@
           <w:rFonts w:ascii="Arial" w:hAnsi="Arial" w:cs="Arial"/>
           <w:lang w:val="es-CO"/>
         </w:rPr>
-        <w:t>Se empieza por extraer solo la parte correspondiente a los datos del archivo excel, para lo cual se ignoran las primeras 9 filas de la hoja.</w:t>
+        <w:t xml:space="preserve">Se empieza por extraer solo la parte correspondiente a los datos del archivo </w:t>
+      </w:r>
+      <w:proofErr w:type="spellStart"/>
+      <w:r>
+        <w:rPr>
+          <w:rFonts w:ascii="Arial" w:hAnsi="Arial" w:cs="Arial"/>
+          <w:lang w:val="es-CO"/>
+        </w:rPr>
+        <w:t>excel</w:t>
+      </w:r>
+      <w:proofErr w:type="spellEnd"/>
+      <w:r>
+        <w:rPr>
+          <w:rFonts w:ascii="Arial" w:hAnsi="Arial" w:cs="Arial"/>
+          <w:lang w:val="es-CO"/>
+        </w:rPr>
+        <w:t>, para lo cual se ignoran las primeras 9 filas de la hoja.</w:t>
       </w:r>
     </w:p>
     <w:p>
@@ -3617,8 +4668,17 @@
           <w:rFonts w:ascii="Arial" w:hAnsi="Arial" w:cs="Arial"/>
           <w:lang w:val="es-CO"/>
         </w:rPr>
-        <w:t>Actualización de headers</w:t>
-      </w:r>
+        <w:t xml:space="preserve">Actualización de </w:t>
+      </w:r>
+      <w:proofErr w:type="spellStart"/>
+      <w:r>
+        <w:rPr>
+          <w:rFonts w:ascii="Arial" w:hAnsi="Arial" w:cs="Arial"/>
+          <w:lang w:val="es-CO"/>
+        </w:rPr>
+        <w:t>headers</w:t>
+      </w:r>
+      <w:proofErr w:type="spellEnd"/>
     </w:p>
     <w:p>
       <w:pPr>
@@ -3633,7 +4693,23 @@
           <w:lang w:val="es-CO"/>
         </w:rPr>
         <w:lastRenderedPageBreak/>
-        <w:t>Al extraer los datos desde el archivo .xlsx, se verifica el dataframe generado por Pandas, empezando por los nombres de las columnas y se observan las siguientes incidencias:</w:t>
+        <w:t xml:space="preserve">Al extraer los datos desde el archivo .xlsx, se verifica el </w:t>
+      </w:r>
+      <w:proofErr w:type="spellStart"/>
+      <w:r>
+        <w:rPr>
+          <w:rFonts w:ascii="Arial" w:hAnsi="Arial" w:cs="Arial"/>
+          <w:lang w:val="es-CO"/>
+        </w:rPr>
+        <w:t>dataframe</w:t>
+      </w:r>
+      <w:proofErr w:type="spellEnd"/>
+      <w:r>
+        <w:rPr>
+          <w:rFonts w:ascii="Arial" w:hAnsi="Arial" w:cs="Arial"/>
+          <w:lang w:val="es-CO"/>
+        </w:rPr>
+        <w:t xml:space="preserve"> generado por Pandas, empezando por los nombres de las columnas y se observan las siguientes incidencias:</w:t>
       </w:r>
     </w:p>
     <w:p>
@@ -3648,12 +4724,53 @@
           <w:lang w:val="es-CO"/>
         </w:rPr>
       </w:pPr>
-      <w:r>
-        <w:rPr>
-          <w:rFonts w:ascii="Arial" w:hAnsi="Arial" w:cs="Arial"/>
-          <w:lang w:val="es-CO"/>
-        </w:rPr>
-        <w:t>Headers sin nombres descriptivos: headers con nombres por defecto de Pandas tipo ‘Unnamed: X’.</w:t>
+      <w:proofErr w:type="spellStart"/>
+      <w:r>
+        <w:rPr>
+          <w:rFonts w:ascii="Arial" w:hAnsi="Arial" w:cs="Arial"/>
+          <w:lang w:val="es-CO"/>
+        </w:rPr>
+        <w:t>Headers</w:t>
+      </w:r>
+      <w:proofErr w:type="spellEnd"/>
+      <w:r>
+        <w:rPr>
+          <w:rFonts w:ascii="Arial" w:hAnsi="Arial" w:cs="Arial"/>
+          <w:lang w:val="es-CO"/>
+        </w:rPr>
+        <w:t xml:space="preserve"> sin nombres descriptivos: </w:t>
+      </w:r>
+      <w:proofErr w:type="spellStart"/>
+      <w:r>
+        <w:rPr>
+          <w:rFonts w:ascii="Arial" w:hAnsi="Arial" w:cs="Arial"/>
+          <w:lang w:val="es-CO"/>
+        </w:rPr>
+        <w:t>headers</w:t>
+      </w:r>
+      <w:proofErr w:type="spellEnd"/>
+      <w:r>
+        <w:rPr>
+          <w:rFonts w:ascii="Arial" w:hAnsi="Arial" w:cs="Arial"/>
+          <w:lang w:val="es-CO"/>
+        </w:rPr>
+        <w:t xml:space="preserve"> con nombres por defecto de Pandas tipo ‘</w:t>
+      </w:r>
+      <w:proofErr w:type="spellStart"/>
+      <w:r>
+        <w:rPr>
+          <w:rFonts w:ascii="Arial" w:hAnsi="Arial" w:cs="Arial"/>
+          <w:lang w:val="es-CO"/>
+        </w:rPr>
+        <w:t>Unnamed</w:t>
+      </w:r>
+      <w:proofErr w:type="spellEnd"/>
+      <w:r>
+        <w:rPr>
+          <w:rFonts w:ascii="Arial" w:hAnsi="Arial" w:cs="Arial"/>
+          <w:lang w:val="es-CO"/>
+        </w:rPr>
+        <w:t>: X’.</w:t>
       </w:r>
     </w:p>
     <w:p>
@@ -3668,27 +4785,84 @@
           <w:lang w:val="es-CO"/>
         </w:rPr>
       </w:pPr>
-      <w:r>
-        <w:rPr>
-          <w:rFonts w:ascii="Arial" w:hAnsi="Arial" w:cs="Arial"/>
-          <w:lang w:val="es-CO"/>
-        </w:rPr>
-        <w:t>Headers en jerarquías inferiores debido a la agrupación de datos: Todos los headers se encuentran en la primera fila de los datos debido al diseño del .xlsx donde se busca describir la agrupación por Relación o parentesco con el jefe(a) del hogar.</w:t>
-      </w:r>
-    </w:p>
-    <w:p>
-      <w:pPr>
-        <w:rPr>
-          <w:rFonts w:ascii="Arial" w:hAnsi="Arial" w:cs="Arial"/>
-          <w:lang w:val="es-CO"/>
-        </w:rPr>
-      </w:pPr>
-      <w:r>
-        <w:rPr>
-          <w:rFonts w:ascii="Arial" w:hAnsi="Arial" w:cs="Arial"/>
-          <w:lang w:val="es-CO"/>
-        </w:rPr>
-        <w:t>Para solucionar esto, se reemplazan los headers actuales desde ‘Relación o parentesco con el jef(a) del hogar’ hasta el último, por los valores correspondientes en la primera fila de datos.</w:t>
+      <w:proofErr w:type="spellStart"/>
+      <w:r>
+        <w:rPr>
+          <w:rFonts w:ascii="Arial" w:hAnsi="Arial" w:cs="Arial"/>
+          <w:lang w:val="es-CO"/>
+        </w:rPr>
+        <w:t>Headers</w:t>
+      </w:r>
+      <w:proofErr w:type="spellEnd"/>
+      <w:r>
+        <w:rPr>
+          <w:rFonts w:ascii="Arial" w:hAnsi="Arial" w:cs="Arial"/>
+          <w:lang w:val="es-CO"/>
+        </w:rPr>
+        <w:t xml:space="preserve"> en jerarquías inferiores debido a la agrupación de datos: Todos los </w:t>
+      </w:r>
+      <w:proofErr w:type="spellStart"/>
+      <w:r>
+        <w:rPr>
+          <w:rFonts w:ascii="Arial" w:hAnsi="Arial" w:cs="Arial"/>
+          <w:lang w:val="es-CO"/>
+        </w:rPr>
+        <w:t>headers</w:t>
+      </w:r>
+      <w:proofErr w:type="spellEnd"/>
+      <w:r>
+        <w:rPr>
+          <w:rFonts w:ascii="Arial" w:hAnsi="Arial" w:cs="Arial"/>
+          <w:lang w:val="es-CO"/>
+        </w:rPr>
+        <w:t xml:space="preserve"> se encuentran en la primera fila de los datos debido al diseño del .xlsx donde se busca describir la agrupación por Relación o parentesco con el jefe(a) del hogar.</w:t>
+      </w:r>
+    </w:p>
+    <w:p>
+      <w:pPr>
+        <w:rPr>
+          <w:rFonts w:ascii="Arial" w:hAnsi="Arial" w:cs="Arial"/>
+          <w:lang w:val="es-CO"/>
+        </w:rPr>
+      </w:pPr>
+      <w:r>
+        <w:rPr>
+          <w:rFonts w:ascii="Arial" w:hAnsi="Arial" w:cs="Arial"/>
+          <w:lang w:val="es-CO"/>
+        </w:rPr>
+        <w:t xml:space="preserve">Para solucionar esto, se reemplazan los </w:t>
+      </w:r>
+      <w:proofErr w:type="spellStart"/>
+      <w:r>
+        <w:rPr>
+          <w:rFonts w:ascii="Arial" w:hAnsi="Arial" w:cs="Arial"/>
+          <w:lang w:val="es-CO"/>
+        </w:rPr>
+        <w:t>headers</w:t>
+      </w:r>
+      <w:proofErr w:type="spellEnd"/>
+      <w:r>
+        <w:rPr>
+          <w:rFonts w:ascii="Arial" w:hAnsi="Arial" w:cs="Arial"/>
+          <w:lang w:val="es-CO"/>
+        </w:rPr>
+        <w:t xml:space="preserve"> actuales desde ‘Relación o parentesco con el </w:t>
+      </w:r>
+      <w:proofErr w:type="spellStart"/>
+      <w:r>
+        <w:rPr>
+          <w:rFonts w:ascii="Arial" w:hAnsi="Arial" w:cs="Arial"/>
+          <w:lang w:val="es-CO"/>
+        </w:rPr>
+        <w:t>jef</w:t>
+      </w:r>
+      <w:proofErr w:type="spellEnd"/>
+      <w:r>
+        <w:rPr>
+          <w:rFonts w:ascii="Arial" w:hAnsi="Arial" w:cs="Arial"/>
+          <w:lang w:val="es-CO"/>
+        </w:rPr>
+        <w:t>(a) del hogar’ hasta el último, por los valores correspondientes en la primera fila de datos.</w:t>
       </w:r>
     </w:p>
     <w:p>
@@ -3848,12 +5022,21 @@
           <w:lang w:val="es-CO"/>
         </w:rPr>
       </w:pPr>
-      <w:r>
-        <w:rPr>
-          <w:rFonts w:ascii="Arial" w:hAnsi="Arial" w:cs="Arial"/>
-          <w:lang w:val="es-CO"/>
-        </w:rPr>
-        <w:t>Unnamed: 1: Municipio</w:t>
+      <w:proofErr w:type="spellStart"/>
+      <w:r>
+        <w:rPr>
+          <w:rFonts w:ascii="Arial" w:hAnsi="Arial" w:cs="Arial"/>
+          <w:lang w:val="es-CO"/>
+        </w:rPr>
+        <w:t>Unnamed</w:t>
+      </w:r>
+      <w:proofErr w:type="spellEnd"/>
+      <w:r>
+        <w:rPr>
+          <w:rFonts w:ascii="Arial" w:hAnsi="Arial" w:cs="Arial"/>
+          <w:lang w:val="es-CO"/>
+        </w:rPr>
+        <w:t>: 1: Municipio</w:t>
       </w:r>
     </w:p>
     <w:p>
@@ -3868,12 +5051,21 @@
           <w:lang w:val="es-CO"/>
         </w:rPr>
       </w:pPr>
-      <w:r>
-        <w:rPr>
-          <w:rFonts w:ascii="Arial" w:hAnsi="Arial" w:cs="Arial"/>
-          <w:lang w:val="es-CO"/>
-        </w:rPr>
-        <w:t>Unnamed: 2: Sexo</w:t>
+      <w:proofErr w:type="spellStart"/>
+      <w:r>
+        <w:rPr>
+          <w:rFonts w:ascii="Arial" w:hAnsi="Arial" w:cs="Arial"/>
+          <w:lang w:val="es-CO"/>
+        </w:rPr>
+        <w:t>Unnamed</w:t>
+      </w:r>
+      <w:proofErr w:type="spellEnd"/>
+      <w:r>
+        <w:rPr>
+          <w:rFonts w:ascii="Arial" w:hAnsi="Arial" w:cs="Arial"/>
+          <w:lang w:val="es-CO"/>
+        </w:rPr>
+        <w:t>: 2: Sexo</w:t>
       </w:r>
     </w:p>
     <w:p>
@@ -3888,13 +5080,31 @@
           <w:lang w:val="es-CO"/>
         </w:rPr>
       </w:pPr>
-      <w:r>
-        <w:rPr>
-          <w:rFonts w:ascii="Arial" w:hAnsi="Arial" w:cs="Arial"/>
-          <w:lang w:val="es-CO"/>
-        </w:rPr>
-        <w:t>Unnamed: 3: Area</w:t>
-      </w:r>
+      <w:proofErr w:type="spellStart"/>
+      <w:r>
+        <w:rPr>
+          <w:rFonts w:ascii="Arial" w:hAnsi="Arial" w:cs="Arial"/>
+          <w:lang w:val="es-CO"/>
+        </w:rPr>
+        <w:t>Unnamed</w:t>
+      </w:r>
+      <w:proofErr w:type="spellEnd"/>
+      <w:r>
+        <w:rPr>
+          <w:rFonts w:ascii="Arial" w:hAnsi="Arial" w:cs="Arial"/>
+          <w:lang w:val="es-CO"/>
+        </w:rPr>
+        <w:t xml:space="preserve">: 3: </w:t>
+      </w:r>
+      <w:proofErr w:type="spellStart"/>
+      <w:r>
+        <w:rPr>
+          <w:rFonts w:ascii="Arial" w:hAnsi="Arial" w:cs="Arial"/>
+          <w:lang w:val="es-CO"/>
+        </w:rPr>
+        <w:t>Area</w:t>
+      </w:r>
+      <w:proofErr w:type="spellEnd"/>
     </w:p>
     <w:p>
       <w:pPr>
@@ -3908,12 +5118,21 @@
           <w:lang w:val="es-CO"/>
         </w:rPr>
       </w:pPr>
-      <w:r>
-        <w:rPr>
-          <w:rFonts w:ascii="Arial" w:hAnsi="Arial" w:cs="Arial"/>
-          <w:lang w:val="es-CO"/>
-        </w:rPr>
-        <w:t>Unnamed: 4: Grupo de edad</w:t>
+      <w:proofErr w:type="spellStart"/>
+      <w:r>
+        <w:rPr>
+          <w:rFonts w:ascii="Arial" w:hAnsi="Arial" w:cs="Arial"/>
+          <w:lang w:val="es-CO"/>
+        </w:rPr>
+        <w:t>Unnamed</w:t>
+      </w:r>
+      <w:proofErr w:type="spellEnd"/>
+      <w:r>
+        <w:rPr>
+          <w:rFonts w:ascii="Arial" w:hAnsi="Arial" w:cs="Arial"/>
+          <w:lang w:val="es-CO"/>
+        </w:rPr>
+        <w:t>: 4: Grupo de edad</w:t>
       </w:r>
     </w:p>
     <w:p>
@@ -4031,7 +5250,23 @@
           <w:rFonts w:ascii="Arial" w:hAnsi="Arial" w:cs="Arial"/>
           <w:lang w:val="es-CO"/>
         </w:rPr>
-        <w:t>Eliminación de columnas sin información relevante o con información redundante en el dataframe.</w:t>
+        <w:t xml:space="preserve">Eliminación de columnas sin información relevante o con información redundante en el </w:t>
+      </w:r>
+      <w:proofErr w:type="spellStart"/>
+      <w:r>
+        <w:rPr>
+          <w:rFonts w:ascii="Arial" w:hAnsi="Arial" w:cs="Arial"/>
+          <w:lang w:val="es-CO"/>
+        </w:rPr>
+        <w:t>dataframe</w:t>
+      </w:r>
+      <w:proofErr w:type="spellEnd"/>
+      <w:r>
+        <w:rPr>
+          <w:rFonts w:ascii="Arial" w:hAnsi="Arial" w:cs="Arial"/>
+          <w:lang w:val="es-CO"/>
+        </w:rPr>
+        <w:t>.</w:t>
       </w:r>
     </w:p>
     <w:p>
@@ -4240,7 +5475,39 @@
           <w:rFonts w:ascii="Arial" w:hAnsi="Arial" w:cs="Arial"/>
           <w:lang w:val="es-CO"/>
         </w:rPr>
-        <w:t>Se propagan los valores de las columnas ‘Sexo’ y ‘Area’ para reemplazar los valores NaN.</w:t>
+        <w:t>Se propagan los valores de las columnas ‘Sexo’ y ‘</w:t>
+      </w:r>
+      <w:proofErr w:type="spellStart"/>
+      <w:r>
+        <w:rPr>
+          <w:rFonts w:ascii="Arial" w:hAnsi="Arial" w:cs="Arial"/>
+          <w:lang w:val="es-CO"/>
+        </w:rPr>
+        <w:t>Area</w:t>
+      </w:r>
+      <w:proofErr w:type="spellEnd"/>
+      <w:r>
+        <w:rPr>
+          <w:rFonts w:ascii="Arial" w:hAnsi="Arial" w:cs="Arial"/>
+          <w:lang w:val="es-CO"/>
+        </w:rPr>
+        <w:t xml:space="preserve">’ para reemplazar los valores </w:t>
+      </w:r>
+      <w:proofErr w:type="spellStart"/>
+      <w:r>
+        <w:rPr>
+          <w:rFonts w:ascii="Arial" w:hAnsi="Arial" w:cs="Arial"/>
+          <w:lang w:val="es-CO"/>
+        </w:rPr>
+        <w:t>NaN</w:t>
+      </w:r>
+      <w:proofErr w:type="spellEnd"/>
+      <w:r>
+        <w:rPr>
+          <w:rFonts w:ascii="Arial" w:hAnsi="Arial" w:cs="Arial"/>
+          <w:lang w:val="es-CO"/>
+        </w:rPr>
+        <w:t>.</w:t>
       </w:r>
     </w:p>
     <w:p>
@@ -4370,7 +5637,23 @@
           <w:rFonts w:ascii="Arial" w:hAnsi="Arial" w:cs="Arial"/>
           <w:lang w:val="es-CO"/>
         </w:rPr>
-        <w:t>Se empieza por extraer solo la parte correspondiente a los datos del archivo excel, para lo cual se ignoran las primeras 9 filas de la hoja.</w:t>
+        <w:t xml:space="preserve">Se empieza por extraer solo la parte correspondiente a los datos del archivo </w:t>
+      </w:r>
+      <w:proofErr w:type="spellStart"/>
+      <w:r>
+        <w:rPr>
+          <w:rFonts w:ascii="Arial" w:hAnsi="Arial" w:cs="Arial"/>
+          <w:lang w:val="es-CO"/>
+        </w:rPr>
+        <w:t>excel</w:t>
+      </w:r>
+      <w:proofErr w:type="spellEnd"/>
+      <w:r>
+        <w:rPr>
+          <w:rFonts w:ascii="Arial" w:hAnsi="Arial" w:cs="Arial"/>
+          <w:lang w:val="es-CO"/>
+        </w:rPr>
+        <w:t>, para lo cual se ignoran las primeras 9 filas de la hoja.</w:t>
       </w:r>
     </w:p>
     <w:p>
@@ -4545,22 +5828,47 @@
           <w:rFonts w:ascii="Arial" w:hAnsi="Arial" w:cs="Arial"/>
           <w:lang w:val="es-CO"/>
         </w:rPr>
-        <w:t>Actualización de headers</w:t>
-      </w:r>
-    </w:p>
-    <w:p>
-      <w:pPr>
-        <w:rPr>
-          <w:rFonts w:ascii="Arial" w:hAnsi="Arial" w:cs="Arial"/>
-          <w:lang w:val="es-CO"/>
-        </w:rPr>
-      </w:pPr>
-      <w:r>
-        <w:rPr>
-          <w:rFonts w:ascii="Arial" w:hAnsi="Arial" w:cs="Arial"/>
-          <w:lang w:val="es-CO"/>
-        </w:rPr>
-        <w:t>Al extraer los datos desde el archivo .xlsx, se verifica el dataframe generado por Pandas, empezando por los nombres de las columnas y se observan las siguientes incidencias:</w:t>
+        <w:t xml:space="preserve">Actualización de </w:t>
+      </w:r>
+      <w:proofErr w:type="spellStart"/>
+      <w:r>
+        <w:rPr>
+          <w:rFonts w:ascii="Arial" w:hAnsi="Arial" w:cs="Arial"/>
+          <w:lang w:val="es-CO"/>
+        </w:rPr>
+        <w:t>headers</w:t>
+      </w:r>
+      <w:proofErr w:type="spellEnd"/>
+    </w:p>
+    <w:p>
+      <w:pPr>
+        <w:rPr>
+          <w:rFonts w:ascii="Arial" w:hAnsi="Arial" w:cs="Arial"/>
+          <w:lang w:val="es-CO"/>
+        </w:rPr>
+      </w:pPr>
+      <w:r>
+        <w:rPr>
+          <w:rFonts w:ascii="Arial" w:hAnsi="Arial" w:cs="Arial"/>
+          <w:lang w:val="es-CO"/>
+        </w:rPr>
+        <w:t xml:space="preserve">Al extraer los datos desde el archivo .xlsx, se verifica el </w:t>
+      </w:r>
+      <w:proofErr w:type="spellStart"/>
+      <w:r>
+        <w:rPr>
+          <w:rFonts w:ascii="Arial" w:hAnsi="Arial" w:cs="Arial"/>
+          <w:lang w:val="es-CO"/>
+        </w:rPr>
+        <w:t>dataframe</w:t>
+      </w:r>
+      <w:proofErr w:type="spellEnd"/>
+      <w:r>
+        <w:rPr>
+          <w:rFonts w:ascii="Arial" w:hAnsi="Arial" w:cs="Arial"/>
+          <w:lang w:val="es-CO"/>
+        </w:rPr>
+        <w:t xml:space="preserve"> generado por Pandas, empezando por los nombres de las columnas y se observan las siguientes incidencias:</w:t>
       </w:r>
     </w:p>
     <w:p>
@@ -4575,12 +5883,53 @@
           <w:lang w:val="es-CO"/>
         </w:rPr>
       </w:pPr>
-      <w:r>
-        <w:rPr>
-          <w:rFonts w:ascii="Arial" w:hAnsi="Arial" w:cs="Arial"/>
-          <w:lang w:val="es-CO"/>
-        </w:rPr>
-        <w:t>Headers sin nombres descriptivos: headers con nombres por defecto de Pandas tipo ‘Unnamed: X’.</w:t>
+      <w:proofErr w:type="spellStart"/>
+      <w:r>
+        <w:rPr>
+          <w:rFonts w:ascii="Arial" w:hAnsi="Arial" w:cs="Arial"/>
+          <w:lang w:val="es-CO"/>
+        </w:rPr>
+        <w:t>Headers</w:t>
+      </w:r>
+      <w:proofErr w:type="spellEnd"/>
+      <w:r>
+        <w:rPr>
+          <w:rFonts w:ascii="Arial" w:hAnsi="Arial" w:cs="Arial"/>
+          <w:lang w:val="es-CO"/>
+        </w:rPr>
+        <w:t xml:space="preserve"> sin nombres descriptivos: </w:t>
+      </w:r>
+      <w:proofErr w:type="spellStart"/>
+      <w:r>
+        <w:rPr>
+          <w:rFonts w:ascii="Arial" w:hAnsi="Arial" w:cs="Arial"/>
+          <w:lang w:val="es-CO"/>
+        </w:rPr>
+        <w:t>headers</w:t>
+      </w:r>
+      <w:proofErr w:type="spellEnd"/>
+      <w:r>
+        <w:rPr>
+          <w:rFonts w:ascii="Arial" w:hAnsi="Arial" w:cs="Arial"/>
+          <w:lang w:val="es-CO"/>
+        </w:rPr>
+        <w:t xml:space="preserve"> con nombres por defecto de Pandas tipo ‘</w:t>
+      </w:r>
+      <w:proofErr w:type="spellStart"/>
+      <w:r>
+        <w:rPr>
+          <w:rFonts w:ascii="Arial" w:hAnsi="Arial" w:cs="Arial"/>
+          <w:lang w:val="es-CO"/>
+        </w:rPr>
+        <w:t>Unnamed</w:t>
+      </w:r>
+      <w:proofErr w:type="spellEnd"/>
+      <w:r>
+        <w:rPr>
+          <w:rFonts w:ascii="Arial" w:hAnsi="Arial" w:cs="Arial"/>
+          <w:lang w:val="es-CO"/>
+        </w:rPr>
+        <w:t>: X’.</w:t>
       </w:r>
     </w:p>
     <w:p>
@@ -4595,27 +5944,68 @@
           <w:lang w:val="es-CO"/>
         </w:rPr>
       </w:pPr>
-      <w:r>
-        <w:rPr>
-          <w:rFonts w:ascii="Arial" w:hAnsi="Arial" w:cs="Arial"/>
-          <w:lang w:val="es-CO"/>
-        </w:rPr>
-        <w:t>Headers en jerarquías inferiores debido a la agrupación de datos: Los headers se encuentran en la primera fila de datos debido al diseño del .xlsx donde se busca describir la agrupación por Área en la que se tomaron los datos.</w:t>
-      </w:r>
-    </w:p>
-    <w:p>
-      <w:pPr>
-        <w:rPr>
-          <w:rFonts w:ascii="Arial" w:hAnsi="Arial" w:cs="Arial"/>
-          <w:lang w:val="es-CO"/>
-        </w:rPr>
-      </w:pPr>
-      <w:r>
-        <w:rPr>
-          <w:rFonts w:ascii="Arial" w:hAnsi="Arial" w:cs="Arial"/>
-          <w:lang w:val="es-CO"/>
-        </w:rPr>
-        <w:t xml:space="preserve">Debido a la agrupación de datos en las columnas, se divide el dataframe en 3 partes, correspondientes a las áreas, ignorando el total para remover resúmenes </w:t>
+      <w:proofErr w:type="spellStart"/>
+      <w:r>
+        <w:rPr>
+          <w:rFonts w:ascii="Arial" w:hAnsi="Arial" w:cs="Arial"/>
+          <w:lang w:val="es-CO"/>
+        </w:rPr>
+        <w:t>Headers</w:t>
+      </w:r>
+      <w:proofErr w:type="spellEnd"/>
+      <w:r>
+        <w:rPr>
+          <w:rFonts w:ascii="Arial" w:hAnsi="Arial" w:cs="Arial"/>
+          <w:lang w:val="es-CO"/>
+        </w:rPr>
+        <w:t xml:space="preserve"> en jerarquías inferiores debido a la agrupación de datos: Los </w:t>
+      </w:r>
+      <w:proofErr w:type="spellStart"/>
+      <w:r>
+        <w:rPr>
+          <w:rFonts w:ascii="Arial" w:hAnsi="Arial" w:cs="Arial"/>
+          <w:lang w:val="es-CO"/>
+        </w:rPr>
+        <w:t>headers</w:t>
+      </w:r>
+      <w:proofErr w:type="spellEnd"/>
+      <w:r>
+        <w:rPr>
+          <w:rFonts w:ascii="Arial" w:hAnsi="Arial" w:cs="Arial"/>
+          <w:lang w:val="es-CO"/>
+        </w:rPr>
+        <w:t xml:space="preserve"> se encuentran en la primera fila de datos debido al diseño del .xlsx donde se busca describir la agrupación por Área en la que se tomaron los datos.</w:t>
+      </w:r>
+    </w:p>
+    <w:p>
+      <w:pPr>
+        <w:rPr>
+          <w:rFonts w:ascii="Arial" w:hAnsi="Arial" w:cs="Arial"/>
+          <w:lang w:val="es-CO"/>
+        </w:rPr>
+      </w:pPr>
+      <w:r>
+        <w:rPr>
+          <w:rFonts w:ascii="Arial" w:hAnsi="Arial" w:cs="Arial"/>
+          <w:lang w:val="es-CO"/>
+        </w:rPr>
+        <w:t xml:space="preserve">Debido a la agrupación de datos en las columnas, se divide el </w:t>
+      </w:r>
+      <w:proofErr w:type="spellStart"/>
+      <w:r>
+        <w:rPr>
+          <w:rFonts w:ascii="Arial" w:hAnsi="Arial" w:cs="Arial"/>
+          <w:lang w:val="es-CO"/>
+        </w:rPr>
+        <w:t>dataframe</w:t>
+      </w:r>
+      <w:proofErr w:type="spellEnd"/>
+      <w:r>
+        <w:rPr>
+          <w:rFonts w:ascii="Arial" w:hAnsi="Arial" w:cs="Arial"/>
+          <w:lang w:val="es-CO"/>
+        </w:rPr>
+        <w:t xml:space="preserve"> en 3 partes, correspondientes a las áreas, ignorando el total para remover resúmenes </w:t>
       </w:r>
       <w:r>
         <w:rPr>
@@ -4623,14 +6013,46 @@
           <w:lang w:val="es-CO"/>
         </w:rPr>
         <w:lastRenderedPageBreak/>
-        <w:t xml:space="preserve">de datos en el dataset final. </w:t>
-      </w:r>
-      <w:r>
-        <w:rPr>
-          <w:rFonts w:ascii="Arial" w:hAnsi="Arial" w:cs="Arial"/>
-          <w:lang w:val="es-CO"/>
-        </w:rPr>
-        <w:t xml:space="preserve">Cada subconjunto se concatena con la columna de Grupo de edad, y se asigna una columna ‘Area’ que contiene el área donde fueron tomados los datos. Luego se reemplazan los nombres de las columnas que todavía tienen un nombre por defecto por los siguientes nombres en su orden correspondiente: </w:t>
+        <w:t xml:space="preserve">de datos en el </w:t>
+      </w:r>
+      <w:proofErr w:type="spellStart"/>
+      <w:r>
+        <w:rPr>
+          <w:rFonts w:ascii="Arial" w:hAnsi="Arial" w:cs="Arial"/>
+          <w:lang w:val="es-CO"/>
+        </w:rPr>
+        <w:t>dataset</w:t>
+      </w:r>
+      <w:proofErr w:type="spellEnd"/>
+      <w:r>
+        <w:rPr>
+          <w:rFonts w:ascii="Arial" w:hAnsi="Arial" w:cs="Arial"/>
+          <w:lang w:val="es-CO"/>
+        </w:rPr>
+        <w:t xml:space="preserve"> final. </w:t>
+      </w:r>
+      <w:r>
+        <w:rPr>
+          <w:rFonts w:ascii="Arial" w:hAnsi="Arial" w:cs="Arial"/>
+          <w:lang w:val="es-CO"/>
+        </w:rPr>
+        <w:t>Cada subconjunto se concatena con la columna de Grupo de edad, y se asigna una columna ‘</w:t>
+      </w:r>
+      <w:proofErr w:type="spellStart"/>
+      <w:r>
+        <w:rPr>
+          <w:rFonts w:ascii="Arial" w:hAnsi="Arial" w:cs="Arial"/>
+          <w:lang w:val="es-CO"/>
+        </w:rPr>
+        <w:t>Area</w:t>
+      </w:r>
+      <w:proofErr w:type="spellEnd"/>
+      <w:r>
+        <w:rPr>
+          <w:rFonts w:ascii="Arial" w:hAnsi="Arial" w:cs="Arial"/>
+          <w:lang w:val="es-CO"/>
+        </w:rPr>
+        <w:t xml:space="preserve">’ que contiene el área donde fueron tomados los datos. Luego se reemplazan los nombres de las columnas que todavía tienen un nombre por defecto por los siguientes nombres en su orden correspondiente: </w:t>
       </w:r>
     </w:p>
     <w:p>
@@ -4670,7 +6092,23 @@
           <w:rFonts w:ascii="Arial" w:hAnsi="Arial" w:cs="Arial"/>
           <w:lang w:val="es-CO"/>
         </w:rPr>
-        <w:t>'Gitano(a) o Rrom',</w:t>
+        <w:t xml:space="preserve">'Gitano(a) o </w:t>
+      </w:r>
+      <w:proofErr w:type="spellStart"/>
+      <w:r>
+        <w:rPr>
+          <w:rFonts w:ascii="Arial" w:hAnsi="Arial" w:cs="Arial"/>
+          <w:lang w:val="es-CO"/>
+        </w:rPr>
+        <w:t>Rrom</w:t>
+      </w:r>
+      <w:proofErr w:type="spellEnd"/>
+      <w:r>
+        <w:rPr>
+          <w:rFonts w:ascii="Arial" w:hAnsi="Arial" w:cs="Arial"/>
+          <w:lang w:val="es-CO"/>
+        </w:rPr>
+        <w:t>',</w:t>
       </w:r>
     </w:p>
     <w:p>
@@ -4690,7 +6128,23 @@
           <w:rFonts w:ascii="Arial" w:hAnsi="Arial" w:cs="Arial"/>
           <w:lang w:val="es-CO"/>
         </w:rPr>
-        <w:t>'Raizal del Archipielago de San Andrés, Providencia y Santa Catalina',</w:t>
+        <w:t xml:space="preserve">'Raizal del </w:t>
+      </w:r>
+      <w:proofErr w:type="spellStart"/>
+      <w:r>
+        <w:rPr>
+          <w:rFonts w:ascii="Arial" w:hAnsi="Arial" w:cs="Arial"/>
+          <w:lang w:val="es-CO"/>
+        </w:rPr>
+        <w:t>Archipielago</w:t>
+      </w:r>
+      <w:proofErr w:type="spellEnd"/>
+      <w:r>
+        <w:rPr>
+          <w:rFonts w:ascii="Arial" w:hAnsi="Arial" w:cs="Arial"/>
+          <w:lang w:val="es-CO"/>
+        </w:rPr>
+        <w:t xml:space="preserve"> de San Andrés, Providencia y Santa Catalina',</w:t>
       </w:r>
     </w:p>
     <w:p>
@@ -4785,7 +6239,39 @@
           <w:rFonts w:ascii="Arial" w:hAnsi="Arial" w:cs="Arial"/>
           <w:lang w:val="es-CO"/>
         </w:rPr>
-        <w:t>Después de las modificaciones en cada subconjunto, se consolidan los dataframes en un solo dataframe.</w:t>
+        <w:t xml:space="preserve">Después de las modificaciones en cada subconjunto, se consolidan los </w:t>
+      </w:r>
+      <w:proofErr w:type="spellStart"/>
+      <w:r>
+        <w:rPr>
+          <w:rFonts w:ascii="Arial" w:hAnsi="Arial" w:cs="Arial"/>
+          <w:lang w:val="es-CO"/>
+        </w:rPr>
+        <w:t>dataframes</w:t>
+      </w:r>
+      <w:proofErr w:type="spellEnd"/>
+      <w:r>
+        <w:rPr>
+          <w:rFonts w:ascii="Arial" w:hAnsi="Arial" w:cs="Arial"/>
+          <w:lang w:val="es-CO"/>
+        </w:rPr>
+        <w:t xml:space="preserve"> en un solo </w:t>
+      </w:r>
+      <w:proofErr w:type="spellStart"/>
+      <w:r>
+        <w:rPr>
+          <w:rFonts w:ascii="Arial" w:hAnsi="Arial" w:cs="Arial"/>
+          <w:lang w:val="es-CO"/>
+        </w:rPr>
+        <w:t>dataframe</w:t>
+      </w:r>
+      <w:proofErr w:type="spellEnd"/>
+      <w:r>
+        <w:rPr>
+          <w:rFonts w:ascii="Arial" w:hAnsi="Arial" w:cs="Arial"/>
+          <w:lang w:val="es-CO"/>
+        </w:rPr>
+        <w:t>.</w:t>
       </w:r>
     </w:p>
     <w:p>
@@ -4976,7 +6462,23 @@
           <w:rFonts w:ascii="Arial" w:hAnsi="Arial" w:cs="Arial"/>
           <w:lang w:val="es-CO"/>
         </w:rPr>
-        <w:t>Se renombran los headers que contienen tildes o ñ.</w:t>
+        <w:t xml:space="preserve">Se renombran los </w:t>
+      </w:r>
+      <w:proofErr w:type="spellStart"/>
+      <w:r>
+        <w:rPr>
+          <w:rFonts w:ascii="Arial" w:hAnsi="Arial" w:cs="Arial"/>
+          <w:lang w:val="es-CO"/>
+        </w:rPr>
+        <w:t>headers</w:t>
+      </w:r>
+      <w:proofErr w:type="spellEnd"/>
+      <w:r>
+        <w:rPr>
+          <w:rFonts w:ascii="Arial" w:hAnsi="Arial" w:cs="Arial"/>
+          <w:lang w:val="es-CO"/>
+        </w:rPr>
+        <w:t xml:space="preserve"> que contienen tildes o ñ.</w:t>
       </w:r>
     </w:p>
     <w:p>
@@ -5129,7 +6631,23 @@
           <w:rFonts w:ascii="Arial" w:hAnsi="Arial" w:cs="Arial"/>
           <w:lang w:val="es-CO"/>
         </w:rPr>
-        <w:t>Se empieza por extraer solo la parte correspondiente a los datos del archivo excel, para lo cual se ignoran las primeras 9 filas de la hoja.</w:t>
+        <w:t xml:space="preserve">Se empieza por extraer solo la parte correspondiente a los datos del archivo </w:t>
+      </w:r>
+      <w:proofErr w:type="spellStart"/>
+      <w:r>
+        <w:rPr>
+          <w:rFonts w:ascii="Arial" w:hAnsi="Arial" w:cs="Arial"/>
+          <w:lang w:val="es-CO"/>
+        </w:rPr>
+        <w:t>excel</w:t>
+      </w:r>
+      <w:proofErr w:type="spellEnd"/>
+      <w:r>
+        <w:rPr>
+          <w:rFonts w:ascii="Arial" w:hAnsi="Arial" w:cs="Arial"/>
+          <w:lang w:val="es-CO"/>
+        </w:rPr>
+        <w:t>, para lo cual se ignoran las primeras 9 filas de la hoja.</w:t>
       </w:r>
     </w:p>
     <w:p>
@@ -5303,22 +6821,47 @@
           <w:lang w:val="es-CO"/>
         </w:rPr>
         <w:lastRenderedPageBreak/>
-        <w:t>Actualización de headers</w:t>
-      </w:r>
-    </w:p>
-    <w:p>
-      <w:pPr>
-        <w:rPr>
-          <w:rFonts w:ascii="Arial" w:hAnsi="Arial" w:cs="Arial"/>
-          <w:lang w:val="es-CO"/>
-        </w:rPr>
-      </w:pPr>
-      <w:r>
-        <w:rPr>
-          <w:rFonts w:ascii="Arial" w:hAnsi="Arial" w:cs="Arial"/>
-          <w:lang w:val="es-CO"/>
-        </w:rPr>
-        <w:t>Al extraer los datos desde el archivo .xlsx, se verifica el dataframe generado por Pandas, empezando por los nombres de las columnas y se observan las siguientes incidencias:</w:t>
+        <w:t xml:space="preserve">Actualización de </w:t>
+      </w:r>
+      <w:proofErr w:type="spellStart"/>
+      <w:r>
+        <w:rPr>
+          <w:rFonts w:ascii="Arial" w:hAnsi="Arial" w:cs="Arial"/>
+          <w:lang w:val="es-CO"/>
+        </w:rPr>
+        <w:t>headers</w:t>
+      </w:r>
+      <w:proofErr w:type="spellEnd"/>
+    </w:p>
+    <w:p>
+      <w:pPr>
+        <w:rPr>
+          <w:rFonts w:ascii="Arial" w:hAnsi="Arial" w:cs="Arial"/>
+          <w:lang w:val="es-CO"/>
+        </w:rPr>
+      </w:pPr>
+      <w:r>
+        <w:rPr>
+          <w:rFonts w:ascii="Arial" w:hAnsi="Arial" w:cs="Arial"/>
+          <w:lang w:val="es-CO"/>
+        </w:rPr>
+        <w:t xml:space="preserve">Al extraer los datos desde el archivo .xlsx, se verifica el </w:t>
+      </w:r>
+      <w:proofErr w:type="spellStart"/>
+      <w:r>
+        <w:rPr>
+          <w:rFonts w:ascii="Arial" w:hAnsi="Arial" w:cs="Arial"/>
+          <w:lang w:val="es-CO"/>
+        </w:rPr>
+        <w:t>dataframe</w:t>
+      </w:r>
+      <w:proofErr w:type="spellEnd"/>
+      <w:r>
+        <w:rPr>
+          <w:rFonts w:ascii="Arial" w:hAnsi="Arial" w:cs="Arial"/>
+          <w:lang w:val="es-CO"/>
+        </w:rPr>
+        <w:t xml:space="preserve"> generado por Pandas, empezando por los nombres de las columnas y se observan las siguientes incidencias:</w:t>
       </w:r>
     </w:p>
     <w:p>
@@ -5333,12 +6876,53 @@
           <w:lang w:val="es-CO"/>
         </w:rPr>
       </w:pPr>
-      <w:r>
-        <w:rPr>
-          <w:rFonts w:ascii="Arial" w:hAnsi="Arial" w:cs="Arial"/>
-          <w:lang w:val="es-CO"/>
-        </w:rPr>
-        <w:t>Headers sin nombres descriptivos: headers con nombres por defecto de Pandas tipo ‘Unnamed: X’.</w:t>
+      <w:proofErr w:type="spellStart"/>
+      <w:r>
+        <w:rPr>
+          <w:rFonts w:ascii="Arial" w:hAnsi="Arial" w:cs="Arial"/>
+          <w:lang w:val="es-CO"/>
+        </w:rPr>
+        <w:t>Headers</w:t>
+      </w:r>
+      <w:proofErr w:type="spellEnd"/>
+      <w:r>
+        <w:rPr>
+          <w:rFonts w:ascii="Arial" w:hAnsi="Arial" w:cs="Arial"/>
+          <w:lang w:val="es-CO"/>
+        </w:rPr>
+        <w:t xml:space="preserve"> sin nombres descriptivos: </w:t>
+      </w:r>
+      <w:proofErr w:type="spellStart"/>
+      <w:r>
+        <w:rPr>
+          <w:rFonts w:ascii="Arial" w:hAnsi="Arial" w:cs="Arial"/>
+          <w:lang w:val="es-CO"/>
+        </w:rPr>
+        <w:t>headers</w:t>
+      </w:r>
+      <w:proofErr w:type="spellEnd"/>
+      <w:r>
+        <w:rPr>
+          <w:rFonts w:ascii="Arial" w:hAnsi="Arial" w:cs="Arial"/>
+          <w:lang w:val="es-CO"/>
+        </w:rPr>
+        <w:t xml:space="preserve"> con nombres por defecto de Pandas tipo ‘</w:t>
+      </w:r>
+      <w:proofErr w:type="spellStart"/>
+      <w:r>
+        <w:rPr>
+          <w:rFonts w:ascii="Arial" w:hAnsi="Arial" w:cs="Arial"/>
+          <w:lang w:val="es-CO"/>
+        </w:rPr>
+        <w:t>Unnamed</w:t>
+      </w:r>
+      <w:proofErr w:type="spellEnd"/>
+      <w:r>
+        <w:rPr>
+          <w:rFonts w:ascii="Arial" w:hAnsi="Arial" w:cs="Arial"/>
+          <w:lang w:val="es-CO"/>
+        </w:rPr>
+        <w:t>: X’.</w:t>
       </w:r>
     </w:p>
     <w:p>
@@ -5353,27 +6937,68 @@
           <w:lang w:val="es-CO"/>
         </w:rPr>
       </w:pPr>
-      <w:r>
-        <w:rPr>
-          <w:rFonts w:ascii="Arial" w:hAnsi="Arial" w:cs="Arial"/>
-          <w:lang w:val="es-CO"/>
-        </w:rPr>
-        <w:t>Headers en jerarquías inferiores debido a la agrupación de datos: Los headers se encuentran en la primera fila de datos debido al diseño del .xlsx donde se busca describir la agrupación por Área en la que se tomaron los datos.</w:t>
-      </w:r>
-    </w:p>
-    <w:p>
-      <w:pPr>
-        <w:rPr>
-          <w:rFonts w:ascii="Arial" w:hAnsi="Arial" w:cs="Arial"/>
-          <w:lang w:val="es-CO"/>
-        </w:rPr>
-      </w:pPr>
-      <w:r>
-        <w:rPr>
-          <w:rFonts w:ascii="Arial" w:hAnsi="Arial" w:cs="Arial"/>
-          <w:lang w:val="es-CO"/>
-        </w:rPr>
-        <w:t xml:space="preserve">Debido a la agrupación de datos en las columnas, se divide el dataframe en </w:t>
+      <w:proofErr w:type="spellStart"/>
+      <w:r>
+        <w:rPr>
+          <w:rFonts w:ascii="Arial" w:hAnsi="Arial" w:cs="Arial"/>
+          <w:lang w:val="es-CO"/>
+        </w:rPr>
+        <w:t>Headers</w:t>
+      </w:r>
+      <w:proofErr w:type="spellEnd"/>
+      <w:r>
+        <w:rPr>
+          <w:rFonts w:ascii="Arial" w:hAnsi="Arial" w:cs="Arial"/>
+          <w:lang w:val="es-CO"/>
+        </w:rPr>
+        <w:t xml:space="preserve"> en jerarquías inferiores debido a la agrupación de datos: Los </w:t>
+      </w:r>
+      <w:proofErr w:type="spellStart"/>
+      <w:r>
+        <w:rPr>
+          <w:rFonts w:ascii="Arial" w:hAnsi="Arial" w:cs="Arial"/>
+          <w:lang w:val="es-CO"/>
+        </w:rPr>
+        <w:t>headers</w:t>
+      </w:r>
+      <w:proofErr w:type="spellEnd"/>
+      <w:r>
+        <w:rPr>
+          <w:rFonts w:ascii="Arial" w:hAnsi="Arial" w:cs="Arial"/>
+          <w:lang w:val="es-CO"/>
+        </w:rPr>
+        <w:t xml:space="preserve"> se encuentran en la primera fila de datos debido al diseño del .xlsx donde se busca describir la agrupación por Área en la que se tomaron los datos.</w:t>
+      </w:r>
+    </w:p>
+    <w:p>
+      <w:pPr>
+        <w:rPr>
+          <w:rFonts w:ascii="Arial" w:hAnsi="Arial" w:cs="Arial"/>
+          <w:lang w:val="es-CO"/>
+        </w:rPr>
+      </w:pPr>
+      <w:r>
+        <w:rPr>
+          <w:rFonts w:ascii="Arial" w:hAnsi="Arial" w:cs="Arial"/>
+          <w:lang w:val="es-CO"/>
+        </w:rPr>
+        <w:t xml:space="preserve">Debido a la agrupación de datos en las columnas, se divide el </w:t>
+      </w:r>
+      <w:proofErr w:type="spellStart"/>
+      <w:r>
+        <w:rPr>
+          <w:rFonts w:ascii="Arial" w:hAnsi="Arial" w:cs="Arial"/>
+          <w:lang w:val="es-CO"/>
+        </w:rPr>
+        <w:t>dataframe</w:t>
+      </w:r>
+      <w:proofErr w:type="spellEnd"/>
+      <w:r>
+        <w:rPr>
+          <w:rFonts w:ascii="Arial" w:hAnsi="Arial" w:cs="Arial"/>
+          <w:lang w:val="es-CO"/>
+        </w:rPr>
+        <w:t xml:space="preserve"> en </w:t>
       </w:r>
       <w:r>
         <w:rPr>
@@ -5387,7 +7012,23 @@
           <w:rFonts w:ascii="Arial" w:hAnsi="Arial" w:cs="Arial"/>
           <w:lang w:val="es-CO"/>
         </w:rPr>
-        <w:t xml:space="preserve"> partes, correspondientes a las áreas. Cada subconjunto se concatena con la columna de Grupo de edad, y se asigna una columna ‘Area’ que contiene el área donde fueron tomados los datos. Luego se reemplazan los nombres de las columnas que todavía tienen un nombre por defecto por los siguientes nombres en su orden correspondiente: </w:t>
+        <w:t xml:space="preserve"> partes, correspondientes a las áreas. Cada subconjunto se concatena con la columna de Grupo de edad, y se asigna una columna ‘</w:t>
+      </w:r>
+      <w:proofErr w:type="spellStart"/>
+      <w:r>
+        <w:rPr>
+          <w:rFonts w:ascii="Arial" w:hAnsi="Arial" w:cs="Arial"/>
+          <w:lang w:val="es-CO"/>
+        </w:rPr>
+        <w:t>Area</w:t>
+      </w:r>
+      <w:proofErr w:type="spellEnd"/>
+      <w:r>
+        <w:rPr>
+          <w:rFonts w:ascii="Arial" w:hAnsi="Arial" w:cs="Arial"/>
+          <w:lang w:val="es-CO"/>
+        </w:rPr>
+        <w:t xml:space="preserve">’ que contiene el área donde fueron tomados los datos. Luego se reemplazan los nombres de las columnas que todavía tienen un nombre por defecto por los siguientes nombres en su orden correspondiente: </w:t>
       </w:r>
     </w:p>
     <w:p>
@@ -5427,7 +7068,23 @@
           <w:rFonts w:ascii="Arial" w:hAnsi="Arial" w:cs="Arial"/>
           <w:lang w:val="es-CO"/>
         </w:rPr>
-        <w:t>'Gitano(a) o Rrom',</w:t>
+        <w:t xml:space="preserve">'Gitano(a) o </w:t>
+      </w:r>
+      <w:proofErr w:type="spellStart"/>
+      <w:r>
+        <w:rPr>
+          <w:rFonts w:ascii="Arial" w:hAnsi="Arial" w:cs="Arial"/>
+          <w:lang w:val="es-CO"/>
+        </w:rPr>
+        <w:t>Rrom</w:t>
+      </w:r>
+      <w:proofErr w:type="spellEnd"/>
+      <w:r>
+        <w:rPr>
+          <w:rFonts w:ascii="Arial" w:hAnsi="Arial" w:cs="Arial"/>
+          <w:lang w:val="es-CO"/>
+        </w:rPr>
+        <w:t>',</w:t>
       </w:r>
     </w:p>
     <w:p>
@@ -5447,7 +7104,23 @@
           <w:rFonts w:ascii="Arial" w:hAnsi="Arial" w:cs="Arial"/>
           <w:lang w:val="es-CO"/>
         </w:rPr>
-        <w:t>'Raizal del Archipielago de San Andrés, Providencia y Santa Catalina',</w:t>
+        <w:t xml:space="preserve">'Raizal del </w:t>
+      </w:r>
+      <w:proofErr w:type="spellStart"/>
+      <w:r>
+        <w:rPr>
+          <w:rFonts w:ascii="Arial" w:hAnsi="Arial" w:cs="Arial"/>
+          <w:lang w:val="es-CO"/>
+        </w:rPr>
+        <w:t>Archipielago</w:t>
+      </w:r>
+      <w:proofErr w:type="spellEnd"/>
+      <w:r>
+        <w:rPr>
+          <w:rFonts w:ascii="Arial" w:hAnsi="Arial" w:cs="Arial"/>
+          <w:lang w:val="es-CO"/>
+        </w:rPr>
+        <w:t xml:space="preserve"> de San Andrés, Providencia y Santa Catalina',</w:t>
       </w:r>
     </w:p>
     <w:p>
@@ -5542,7 +7215,39 @@
           <w:rFonts w:ascii="Arial" w:hAnsi="Arial" w:cs="Arial"/>
           <w:lang w:val="es-CO"/>
         </w:rPr>
-        <w:t>Después de las modificaciones en cada subconjunto, se consolidan los dataframes en un solo dataframe.</w:t>
+        <w:t xml:space="preserve">Después de las modificaciones en cada subconjunto, se consolidan los </w:t>
+      </w:r>
+      <w:proofErr w:type="spellStart"/>
+      <w:r>
+        <w:rPr>
+          <w:rFonts w:ascii="Arial" w:hAnsi="Arial" w:cs="Arial"/>
+          <w:lang w:val="es-CO"/>
+        </w:rPr>
+        <w:t>dataframes</w:t>
+      </w:r>
+      <w:proofErr w:type="spellEnd"/>
+      <w:r>
+        <w:rPr>
+          <w:rFonts w:ascii="Arial" w:hAnsi="Arial" w:cs="Arial"/>
+          <w:lang w:val="es-CO"/>
+        </w:rPr>
+        <w:t xml:space="preserve"> en un solo </w:t>
+      </w:r>
+      <w:proofErr w:type="spellStart"/>
+      <w:r>
+        <w:rPr>
+          <w:rFonts w:ascii="Arial" w:hAnsi="Arial" w:cs="Arial"/>
+          <w:lang w:val="es-CO"/>
+        </w:rPr>
+        <w:t>dataframe</w:t>
+      </w:r>
+      <w:proofErr w:type="spellEnd"/>
+      <w:r>
+        <w:rPr>
+          <w:rFonts w:ascii="Arial" w:hAnsi="Arial" w:cs="Arial"/>
+          <w:lang w:val="es-CO"/>
+        </w:rPr>
+        <w:t>.</w:t>
       </w:r>
     </w:p>
     <w:p>
@@ -5621,7 +7326,23 @@
           <w:rFonts w:ascii="Arial" w:hAnsi="Arial" w:cs="Arial"/>
           <w:lang w:val="es-CO"/>
         </w:rPr>
-        <w:t>Se renombran los headers que contienen tildes o ñ.</w:t>
+        <w:t xml:space="preserve">Se renombran los </w:t>
+      </w:r>
+      <w:proofErr w:type="spellStart"/>
+      <w:r>
+        <w:rPr>
+          <w:rFonts w:ascii="Arial" w:hAnsi="Arial" w:cs="Arial"/>
+          <w:lang w:val="es-CO"/>
+        </w:rPr>
+        <w:t>headers</w:t>
+      </w:r>
+      <w:proofErr w:type="spellEnd"/>
+      <w:r>
+        <w:rPr>
+          <w:rFonts w:ascii="Arial" w:hAnsi="Arial" w:cs="Arial"/>
+          <w:lang w:val="es-CO"/>
+        </w:rPr>
+        <w:t xml:space="preserve"> que contienen tildes o ñ.</w:t>
       </w:r>
     </w:p>
     <w:p>
@@ -5773,7 +7494,23 @@
           <w:rFonts w:ascii="Arial" w:hAnsi="Arial" w:cs="Arial"/>
           <w:lang w:val="es-CO"/>
         </w:rPr>
-        <w:t>Se empieza por extraer solo la parte correspondiente a los datos del archivo excel, para lo cual se ignoran las primeras 8 filas de la hoja.</w:t>
+        <w:t xml:space="preserve">Se empieza por extraer solo la parte correspondiente a los datos del archivo </w:t>
+      </w:r>
+      <w:proofErr w:type="spellStart"/>
+      <w:r>
+        <w:rPr>
+          <w:rFonts w:ascii="Arial" w:hAnsi="Arial" w:cs="Arial"/>
+          <w:lang w:val="es-CO"/>
+        </w:rPr>
+        <w:t>excel</w:t>
+      </w:r>
+      <w:proofErr w:type="spellEnd"/>
+      <w:r>
+        <w:rPr>
+          <w:rFonts w:ascii="Arial" w:hAnsi="Arial" w:cs="Arial"/>
+          <w:lang w:val="es-CO"/>
+        </w:rPr>
+        <w:t>, para lo cual se ignoran las primeras 8 filas de la hoja.</w:t>
       </w:r>
     </w:p>
     <w:p>
@@ -5845,7 +7582,23 @@
           <w:lang w:val="es-CO"/>
         </w:rPr>
         <w:lastRenderedPageBreak/>
-        <w:t>Se extraen los headers originales para renombrar las columnas cuando se filtren los datos por municipio.</w:t>
+        <w:t xml:space="preserve">Se extraen los </w:t>
+      </w:r>
+      <w:proofErr w:type="spellStart"/>
+      <w:r>
+        <w:rPr>
+          <w:rFonts w:ascii="Arial" w:hAnsi="Arial" w:cs="Arial"/>
+          <w:lang w:val="es-CO"/>
+        </w:rPr>
+        <w:t>headers</w:t>
+      </w:r>
+      <w:proofErr w:type="spellEnd"/>
+      <w:r>
+        <w:rPr>
+          <w:rFonts w:ascii="Arial" w:hAnsi="Arial" w:cs="Arial"/>
+          <w:lang w:val="es-CO"/>
+        </w:rPr>
+        <w:t xml:space="preserve"> originales para renombrar las columnas cuando se filtren los datos por municipio.</w:t>
       </w:r>
     </w:p>
     <w:p>
@@ -6034,22 +7787,47 @@
           <w:lang w:val="es-CO"/>
         </w:rPr>
         <w:lastRenderedPageBreak/>
-        <w:t>Actualización de headers</w:t>
-      </w:r>
-    </w:p>
-    <w:p>
-      <w:pPr>
-        <w:rPr>
-          <w:rFonts w:ascii="Arial" w:hAnsi="Arial" w:cs="Arial"/>
-          <w:lang w:val="es-CO"/>
-        </w:rPr>
-      </w:pPr>
-      <w:r>
-        <w:rPr>
-          <w:rFonts w:ascii="Arial" w:hAnsi="Arial" w:cs="Arial"/>
-          <w:lang w:val="es-CO"/>
-        </w:rPr>
-        <w:t>Al extraer los datos desde el archivo .xlsx, se verifica el dataframe generado por Pandas, empezando por los nombres de las columnas y se observan las siguientes incidencias:</w:t>
+        <w:t xml:space="preserve">Actualización de </w:t>
+      </w:r>
+      <w:proofErr w:type="spellStart"/>
+      <w:r>
+        <w:rPr>
+          <w:rFonts w:ascii="Arial" w:hAnsi="Arial" w:cs="Arial"/>
+          <w:lang w:val="es-CO"/>
+        </w:rPr>
+        <w:t>headers</w:t>
+      </w:r>
+      <w:proofErr w:type="spellEnd"/>
+    </w:p>
+    <w:p>
+      <w:pPr>
+        <w:rPr>
+          <w:rFonts w:ascii="Arial" w:hAnsi="Arial" w:cs="Arial"/>
+          <w:lang w:val="es-CO"/>
+        </w:rPr>
+      </w:pPr>
+      <w:r>
+        <w:rPr>
+          <w:rFonts w:ascii="Arial" w:hAnsi="Arial" w:cs="Arial"/>
+          <w:lang w:val="es-CO"/>
+        </w:rPr>
+        <w:t xml:space="preserve">Al extraer los datos desde el archivo .xlsx, se verifica el </w:t>
+      </w:r>
+      <w:proofErr w:type="spellStart"/>
+      <w:r>
+        <w:rPr>
+          <w:rFonts w:ascii="Arial" w:hAnsi="Arial" w:cs="Arial"/>
+          <w:lang w:val="es-CO"/>
+        </w:rPr>
+        <w:t>dataframe</w:t>
+      </w:r>
+      <w:proofErr w:type="spellEnd"/>
+      <w:r>
+        <w:rPr>
+          <w:rFonts w:ascii="Arial" w:hAnsi="Arial" w:cs="Arial"/>
+          <w:lang w:val="es-CO"/>
+        </w:rPr>
+        <w:t xml:space="preserve"> generado por Pandas, empezando por los nombres de las columnas y se observan las siguientes incidencias:</w:t>
       </w:r>
     </w:p>
     <w:p>
@@ -6064,12 +7842,53 @@
           <w:lang w:val="es-CO"/>
         </w:rPr>
       </w:pPr>
-      <w:r>
-        <w:rPr>
-          <w:rFonts w:ascii="Arial" w:hAnsi="Arial" w:cs="Arial"/>
-          <w:lang w:val="es-CO"/>
-        </w:rPr>
-        <w:t>Headers sin nombres descriptivos: headers con nombres por defecto de Pandas tipo ‘Unnamed: X’.</w:t>
+      <w:proofErr w:type="spellStart"/>
+      <w:r>
+        <w:rPr>
+          <w:rFonts w:ascii="Arial" w:hAnsi="Arial" w:cs="Arial"/>
+          <w:lang w:val="es-CO"/>
+        </w:rPr>
+        <w:t>Headers</w:t>
+      </w:r>
+      <w:proofErr w:type="spellEnd"/>
+      <w:r>
+        <w:rPr>
+          <w:rFonts w:ascii="Arial" w:hAnsi="Arial" w:cs="Arial"/>
+          <w:lang w:val="es-CO"/>
+        </w:rPr>
+        <w:t xml:space="preserve"> sin nombres descriptivos: </w:t>
+      </w:r>
+      <w:proofErr w:type="spellStart"/>
+      <w:r>
+        <w:rPr>
+          <w:rFonts w:ascii="Arial" w:hAnsi="Arial" w:cs="Arial"/>
+          <w:lang w:val="es-CO"/>
+        </w:rPr>
+        <w:t>headers</w:t>
+      </w:r>
+      <w:proofErr w:type="spellEnd"/>
+      <w:r>
+        <w:rPr>
+          <w:rFonts w:ascii="Arial" w:hAnsi="Arial" w:cs="Arial"/>
+          <w:lang w:val="es-CO"/>
+        </w:rPr>
+        <w:t xml:space="preserve"> con nombres por defecto de Pandas tipo ‘</w:t>
+      </w:r>
+      <w:proofErr w:type="spellStart"/>
+      <w:r>
+        <w:rPr>
+          <w:rFonts w:ascii="Arial" w:hAnsi="Arial" w:cs="Arial"/>
+          <w:lang w:val="es-CO"/>
+        </w:rPr>
+        <w:t>Unnamed</w:t>
+      </w:r>
+      <w:proofErr w:type="spellEnd"/>
+      <w:r>
+        <w:rPr>
+          <w:rFonts w:ascii="Arial" w:hAnsi="Arial" w:cs="Arial"/>
+          <w:lang w:val="es-CO"/>
+        </w:rPr>
+        <w:t>: X’.</w:t>
       </w:r>
     </w:p>
     <w:p>
@@ -6084,35 +7903,92 @@
           <w:lang w:val="es-CO"/>
         </w:rPr>
       </w:pPr>
-      <w:r>
-        <w:rPr>
-          <w:rFonts w:ascii="Arial" w:hAnsi="Arial" w:cs="Arial"/>
-          <w:lang w:val="es-CO"/>
-        </w:rPr>
-        <w:t>Headers en jerarquías inferiores debido a la agrupación de datos: Los headers se encuentran en la segunda fila de datos debido al diseño del .xlsx donde se busca describir la agrupación por Área en la que se tomaron los datos, y esta a su vez, tiene otro tipo de agrupación en la primera fila donde se separan los datos en si el censado tuvo alguna enfermedad los últimos 30 días, y a qué servicio de salud acudieron.</w:t>
-      </w:r>
-    </w:p>
-    <w:p>
-      <w:pPr>
-        <w:rPr>
-          <w:rFonts w:ascii="Arial" w:hAnsi="Arial" w:cs="Arial"/>
-          <w:lang w:val="es-CO"/>
-        </w:rPr>
-      </w:pPr>
-    </w:p>
-    <w:p>
-      <w:pPr>
-        <w:rPr>
-          <w:rFonts w:ascii="Arial" w:hAnsi="Arial" w:cs="Arial"/>
-          <w:lang w:val="es-CO"/>
-        </w:rPr>
-      </w:pPr>
-      <w:r>
-        <w:rPr>
-          <w:rFonts w:ascii="Arial" w:hAnsi="Arial" w:cs="Arial"/>
-          <w:lang w:val="es-CO"/>
-        </w:rPr>
-        <w:t xml:space="preserve">Debido a la agrupación de datos en las columnas, se divide el dataframe en 4 partes, correspondientes a las áreas. Cada subconjunto se concatena con las columnas de ‘Sexo’ y ‘Grupo de edad’, y se asigna una columna ‘Area’ que contiene el área donde fueron tomados los datos. Luego se reemplazan los nombres de las columnas que todavía tienen un nombre por defecto por los siguientes nombres en su orden correspondiente: </w:t>
+      <w:proofErr w:type="spellStart"/>
+      <w:r>
+        <w:rPr>
+          <w:rFonts w:ascii="Arial" w:hAnsi="Arial" w:cs="Arial"/>
+          <w:lang w:val="es-CO"/>
+        </w:rPr>
+        <w:t>Headers</w:t>
+      </w:r>
+      <w:proofErr w:type="spellEnd"/>
+      <w:r>
+        <w:rPr>
+          <w:rFonts w:ascii="Arial" w:hAnsi="Arial" w:cs="Arial"/>
+          <w:lang w:val="es-CO"/>
+        </w:rPr>
+        <w:t xml:space="preserve"> en jerarquías inferiores debido a la agrupación de datos: Los </w:t>
+      </w:r>
+      <w:proofErr w:type="spellStart"/>
+      <w:r>
+        <w:rPr>
+          <w:rFonts w:ascii="Arial" w:hAnsi="Arial" w:cs="Arial"/>
+          <w:lang w:val="es-CO"/>
+        </w:rPr>
+        <w:t>headers</w:t>
+      </w:r>
+      <w:proofErr w:type="spellEnd"/>
+      <w:r>
+        <w:rPr>
+          <w:rFonts w:ascii="Arial" w:hAnsi="Arial" w:cs="Arial"/>
+          <w:lang w:val="es-CO"/>
+        </w:rPr>
+        <w:t xml:space="preserve"> se encuentran en la segunda fila de datos debido al diseño del .xlsx donde se busca describir la agrupación por Área en la que se tomaron los datos, y esta a su vez, tiene otro tipo de agrupación en la primera fila donde se separan los datos en si el censado tuvo alguna enfermedad los últimos 30 días, y a qué servicio de salud acudieron.</w:t>
+      </w:r>
+    </w:p>
+    <w:p>
+      <w:pPr>
+        <w:rPr>
+          <w:rFonts w:ascii="Arial" w:hAnsi="Arial" w:cs="Arial"/>
+          <w:lang w:val="es-CO"/>
+        </w:rPr>
+      </w:pPr>
+    </w:p>
+    <w:p>
+      <w:pPr>
+        <w:rPr>
+          <w:rFonts w:ascii="Arial" w:hAnsi="Arial" w:cs="Arial"/>
+          <w:lang w:val="es-CO"/>
+        </w:rPr>
+      </w:pPr>
+      <w:r>
+        <w:rPr>
+          <w:rFonts w:ascii="Arial" w:hAnsi="Arial" w:cs="Arial"/>
+          <w:lang w:val="es-CO"/>
+        </w:rPr>
+        <w:t xml:space="preserve">Debido a la agrupación de datos en las columnas, se divide el </w:t>
+      </w:r>
+      <w:proofErr w:type="spellStart"/>
+      <w:r>
+        <w:rPr>
+          <w:rFonts w:ascii="Arial" w:hAnsi="Arial" w:cs="Arial"/>
+          <w:lang w:val="es-CO"/>
+        </w:rPr>
+        <w:t>dataframe</w:t>
+      </w:r>
+      <w:proofErr w:type="spellEnd"/>
+      <w:r>
+        <w:rPr>
+          <w:rFonts w:ascii="Arial" w:hAnsi="Arial" w:cs="Arial"/>
+          <w:lang w:val="es-CO"/>
+        </w:rPr>
+        <w:t xml:space="preserve"> en 4 partes, correspondientes a las áreas. Cada subconjunto se concatena con las columnas de ‘Sexo’ y ‘Grupo de edad’, y se asigna una columna ‘</w:t>
+      </w:r>
+      <w:proofErr w:type="spellStart"/>
+      <w:r>
+        <w:rPr>
+          <w:rFonts w:ascii="Arial" w:hAnsi="Arial" w:cs="Arial"/>
+          <w:lang w:val="es-CO"/>
+        </w:rPr>
+        <w:t>Area</w:t>
+      </w:r>
+      <w:proofErr w:type="spellEnd"/>
+      <w:r>
+        <w:rPr>
+          <w:rFonts w:ascii="Arial" w:hAnsi="Arial" w:cs="Arial"/>
+          <w:lang w:val="es-CO"/>
+        </w:rPr>
+        <w:t xml:space="preserve">’ que contiene el área donde fueron tomados los datos. Luego se reemplazan los nombres de las columnas que todavía tienen un nombre por defecto por los siguientes nombres en su orden correspondiente: </w:t>
       </w:r>
     </w:p>
     <w:p>
@@ -6172,7 +8048,55 @@
           <w:rFonts w:ascii="Arial" w:hAnsi="Arial" w:cs="Arial"/>
           <w:lang w:val="es-CO"/>
         </w:rPr>
-        <w:t>'Sin informacion enfermedad ultimos 30 dias'</w:t>
+        <w:t xml:space="preserve">'Sin </w:t>
+      </w:r>
+      <w:proofErr w:type="spellStart"/>
+      <w:r>
+        <w:rPr>
+          <w:rFonts w:ascii="Arial" w:hAnsi="Arial" w:cs="Arial"/>
+          <w:lang w:val="es-CO"/>
+        </w:rPr>
+        <w:t>informacion</w:t>
+      </w:r>
+      <w:proofErr w:type="spellEnd"/>
+      <w:r>
+        <w:rPr>
+          <w:rFonts w:ascii="Arial" w:hAnsi="Arial" w:cs="Arial"/>
+          <w:lang w:val="es-CO"/>
+        </w:rPr>
+        <w:t xml:space="preserve"> enfermedad </w:t>
+      </w:r>
+      <w:proofErr w:type="spellStart"/>
+      <w:r>
+        <w:rPr>
+          <w:rFonts w:ascii="Arial" w:hAnsi="Arial" w:cs="Arial"/>
+          <w:lang w:val="es-CO"/>
+        </w:rPr>
+        <w:t>ultimos</w:t>
+      </w:r>
+      <w:proofErr w:type="spellEnd"/>
+      <w:r>
+        <w:rPr>
+          <w:rFonts w:ascii="Arial" w:hAnsi="Arial" w:cs="Arial"/>
+          <w:lang w:val="es-CO"/>
+        </w:rPr>
+        <w:t xml:space="preserve"> 30 </w:t>
+      </w:r>
+      <w:proofErr w:type="spellStart"/>
+      <w:r>
+        <w:rPr>
+          <w:rFonts w:ascii="Arial" w:hAnsi="Arial" w:cs="Arial"/>
+          <w:lang w:val="es-CO"/>
+        </w:rPr>
+        <w:t>dias</w:t>
+      </w:r>
+      <w:proofErr w:type="spellEnd"/>
+      <w:r>
+        <w:rPr>
+          <w:rFonts w:ascii="Arial" w:hAnsi="Arial" w:cs="Arial"/>
+          <w:lang w:val="es-CO"/>
+        </w:rPr>
+        <w:t>'</w:t>
       </w:r>
     </w:p>
     <w:p>
@@ -6212,7 +8136,23 @@
           <w:rFonts w:ascii="Arial" w:hAnsi="Arial" w:cs="Arial"/>
           <w:lang w:val="es-CO"/>
         </w:rPr>
-        <w:t>'Sin informacion servicio de salud donde acudieron'</w:t>
+        <w:t xml:space="preserve">'Sin </w:t>
+      </w:r>
+      <w:proofErr w:type="spellStart"/>
+      <w:r>
+        <w:rPr>
+          <w:rFonts w:ascii="Arial" w:hAnsi="Arial" w:cs="Arial"/>
+          <w:lang w:val="es-CO"/>
+        </w:rPr>
+        <w:t>informacion</w:t>
+      </w:r>
+      <w:proofErr w:type="spellEnd"/>
+      <w:r>
+        <w:rPr>
+          <w:rFonts w:ascii="Arial" w:hAnsi="Arial" w:cs="Arial"/>
+          <w:lang w:val="es-CO"/>
+        </w:rPr>
+        <w:t xml:space="preserve"> servicio de salud donde acudieron'</w:t>
       </w:r>
     </w:p>
     <w:p>
@@ -6232,7 +8172,23 @@
           <w:rFonts w:ascii="Arial" w:hAnsi="Arial" w:cs="Arial"/>
           <w:lang w:val="es-CO"/>
         </w:rPr>
-        <w:t>'A la entidad de seguridad social en salud a la cual está afliado(a)'</w:t>
+        <w:t xml:space="preserve">'A la entidad de seguridad social en salud a la cual está </w:t>
+      </w:r>
+      <w:proofErr w:type="spellStart"/>
+      <w:r>
+        <w:rPr>
+          <w:rFonts w:ascii="Arial" w:hAnsi="Arial" w:cs="Arial"/>
+          <w:lang w:val="es-CO"/>
+        </w:rPr>
+        <w:t>afliado</w:t>
+      </w:r>
+      <w:proofErr w:type="spellEnd"/>
+      <w:r>
+        <w:rPr>
+          <w:rFonts w:ascii="Arial" w:hAnsi="Arial" w:cs="Arial"/>
+          <w:lang w:val="es-CO"/>
+        </w:rPr>
+        <w:t>(a)'</w:t>
       </w:r>
     </w:p>
     <w:p>
@@ -6272,7 +8228,25 @@
           <w:rFonts w:ascii="Arial" w:hAnsi="Arial" w:cs="Arial"/>
           <w:lang w:val="es-CO"/>
         </w:rPr>
-        <w:t>'A un boticario,farmacéuta, droguista'</w:t>
+        <w:t xml:space="preserve">'A un </w:t>
+      </w:r>
+      <w:proofErr w:type="spellStart"/>
+      <w:proofErr w:type="gramStart"/>
+      <w:r>
+        <w:rPr>
+          <w:rFonts w:ascii="Arial" w:hAnsi="Arial" w:cs="Arial"/>
+          <w:lang w:val="es-CO"/>
+        </w:rPr>
+        <w:t>boticario,farmacéuta</w:t>
+      </w:r>
+      <w:proofErr w:type="spellEnd"/>
+      <w:proofErr w:type="gramEnd"/>
+      <w:r>
+        <w:rPr>
+          <w:rFonts w:ascii="Arial" w:hAnsi="Arial" w:cs="Arial"/>
+          <w:lang w:val="es-CO"/>
+        </w:rPr>
+        <w:t>, droguista'</w:t>
       </w:r>
     </w:p>
     <w:p>
@@ -6372,22 +8346,70 @@
           <w:rFonts w:ascii="Arial" w:hAnsi="Arial" w:cs="Arial"/>
           <w:lang w:val="es-CO"/>
         </w:rPr>
-        <w:t>'Se autorrecetó'</w:t>
-      </w:r>
-    </w:p>
-    <w:p>
-      <w:pPr>
-        <w:rPr>
-          <w:rFonts w:ascii="Arial" w:hAnsi="Arial" w:cs="Arial"/>
-          <w:lang w:val="es-CO"/>
-        </w:rPr>
-      </w:pPr>
-      <w:r>
-        <w:rPr>
-          <w:rFonts w:ascii="Arial" w:hAnsi="Arial" w:cs="Arial"/>
-          <w:lang w:val="es-CO"/>
-        </w:rPr>
-        <w:t>Después de las modificaciones en cada subconjunto, se consolidan los dataframes en un solo dataframe.</w:t>
+        <w:t xml:space="preserve">'Se </w:t>
+      </w:r>
+      <w:proofErr w:type="spellStart"/>
+      <w:r>
+        <w:rPr>
+          <w:rFonts w:ascii="Arial" w:hAnsi="Arial" w:cs="Arial"/>
+          <w:lang w:val="es-CO"/>
+        </w:rPr>
+        <w:t>autorrecetó</w:t>
+      </w:r>
+      <w:proofErr w:type="spellEnd"/>
+      <w:r>
+        <w:rPr>
+          <w:rFonts w:ascii="Arial" w:hAnsi="Arial" w:cs="Arial"/>
+          <w:lang w:val="es-CO"/>
+        </w:rPr>
+        <w:t>'</w:t>
+      </w:r>
+    </w:p>
+    <w:p>
+      <w:pPr>
+        <w:rPr>
+          <w:rFonts w:ascii="Arial" w:hAnsi="Arial" w:cs="Arial"/>
+          <w:lang w:val="es-CO"/>
+        </w:rPr>
+      </w:pPr>
+      <w:r>
+        <w:rPr>
+          <w:rFonts w:ascii="Arial" w:hAnsi="Arial" w:cs="Arial"/>
+          <w:lang w:val="es-CO"/>
+        </w:rPr>
+        <w:t xml:space="preserve">Después de las modificaciones en cada subconjunto, se consolidan los </w:t>
+      </w:r>
+      <w:proofErr w:type="spellStart"/>
+      <w:r>
+        <w:rPr>
+          <w:rFonts w:ascii="Arial" w:hAnsi="Arial" w:cs="Arial"/>
+          <w:lang w:val="es-CO"/>
+        </w:rPr>
+        <w:t>dataframes</w:t>
+      </w:r>
+      <w:proofErr w:type="spellEnd"/>
+      <w:r>
+        <w:rPr>
+          <w:rFonts w:ascii="Arial" w:hAnsi="Arial" w:cs="Arial"/>
+          <w:lang w:val="es-CO"/>
+        </w:rPr>
+        <w:t xml:space="preserve"> en un solo </w:t>
+      </w:r>
+      <w:proofErr w:type="spellStart"/>
+      <w:r>
+        <w:rPr>
+          <w:rFonts w:ascii="Arial" w:hAnsi="Arial" w:cs="Arial"/>
+          <w:lang w:val="es-CO"/>
+        </w:rPr>
+        <w:t>dataframe</w:t>
+      </w:r>
+      <w:proofErr w:type="spellEnd"/>
+      <w:r>
+        <w:rPr>
+          <w:rFonts w:ascii="Arial" w:hAnsi="Arial" w:cs="Arial"/>
+          <w:lang w:val="es-CO"/>
+        </w:rPr>
+        <w:t>.</w:t>
       </w:r>
     </w:p>
     <w:p>
@@ -6469,7 +8491,23 @@
           <w:rFonts w:ascii="Arial" w:hAnsi="Arial" w:cs="Arial"/>
           <w:lang w:val="es-CO"/>
         </w:rPr>
-        <w:t>Se renombran los headers que contienen tildes o ñ.</w:t>
+        <w:t xml:space="preserve">Se renombran los </w:t>
+      </w:r>
+      <w:proofErr w:type="spellStart"/>
+      <w:r>
+        <w:rPr>
+          <w:rFonts w:ascii="Arial" w:hAnsi="Arial" w:cs="Arial"/>
+          <w:lang w:val="es-CO"/>
+        </w:rPr>
+        <w:t>headers</w:t>
+      </w:r>
+      <w:proofErr w:type="spellEnd"/>
+      <w:r>
+        <w:rPr>
+          <w:rFonts w:ascii="Arial" w:hAnsi="Arial" w:cs="Arial"/>
+          <w:lang w:val="es-CO"/>
+        </w:rPr>
+        <w:t xml:space="preserve"> que contienen tildes o ñ.</w:t>
       </w:r>
     </w:p>
     <w:p>
@@ -6534,7 +8572,23 @@
           <w:rFonts w:ascii="Arial" w:hAnsi="Arial" w:cs="Arial"/>
           <w:lang w:val="es-CO"/>
         </w:rPr>
-        <w:t>Se empieza por extraer solo la parte correspondiente a los datos del archivo excel, para lo cual se ignoran las primeras 9 filas de la hoja.</w:t>
+        <w:t xml:space="preserve">Se empieza por extraer solo la parte correspondiente a los datos del archivo </w:t>
+      </w:r>
+      <w:proofErr w:type="spellStart"/>
+      <w:r>
+        <w:rPr>
+          <w:rFonts w:ascii="Arial" w:hAnsi="Arial" w:cs="Arial"/>
+          <w:lang w:val="es-CO"/>
+        </w:rPr>
+        <w:t>excel</w:t>
+      </w:r>
+      <w:proofErr w:type="spellEnd"/>
+      <w:r>
+        <w:rPr>
+          <w:rFonts w:ascii="Arial" w:hAnsi="Arial" w:cs="Arial"/>
+          <w:lang w:val="es-CO"/>
+        </w:rPr>
+        <w:t>, para lo cual se ignoran las primeras 9 filas de la hoja.</w:t>
       </w:r>
     </w:p>
     <w:p>
@@ -6606,7 +8660,23 @@
           <w:lang w:val="es-CO"/>
         </w:rPr>
         <w:lastRenderedPageBreak/>
-        <w:t>Se extraen los headers originales para renombrar las columnas cuando se filtren los datos por municipio.</w:t>
+        <w:t xml:space="preserve">Se extraen los </w:t>
+      </w:r>
+      <w:proofErr w:type="spellStart"/>
+      <w:r>
+        <w:rPr>
+          <w:rFonts w:ascii="Arial" w:hAnsi="Arial" w:cs="Arial"/>
+          <w:lang w:val="es-CO"/>
+        </w:rPr>
+        <w:t>headers</w:t>
+      </w:r>
+      <w:proofErr w:type="spellEnd"/>
+      <w:r>
+        <w:rPr>
+          <w:rFonts w:ascii="Arial" w:hAnsi="Arial" w:cs="Arial"/>
+          <w:lang w:val="es-CO"/>
+        </w:rPr>
+        <w:t xml:space="preserve"> originales para renombrar las columnas cuando se filtren los datos por municipio.</w:t>
       </w:r>
     </w:p>
     <w:p>
@@ -6773,22 +8843,47 @@
           <w:rFonts w:ascii="Arial" w:hAnsi="Arial" w:cs="Arial"/>
           <w:lang w:val="es-CO"/>
         </w:rPr>
-        <w:t>Actualización de headers</w:t>
-      </w:r>
-    </w:p>
-    <w:p>
-      <w:pPr>
-        <w:rPr>
-          <w:rFonts w:ascii="Arial" w:hAnsi="Arial" w:cs="Arial"/>
-          <w:lang w:val="es-CO"/>
-        </w:rPr>
-      </w:pPr>
-      <w:r>
-        <w:rPr>
-          <w:rFonts w:ascii="Arial" w:hAnsi="Arial" w:cs="Arial"/>
-          <w:lang w:val="es-CO"/>
-        </w:rPr>
-        <w:t>Al extraer los datos desde el archivo .xlsx, se verifica el dataframe generado por Pandas, empezando por los nombres de las columnas y se observan las siguientes incidencias:</w:t>
+        <w:t xml:space="preserve">Actualización de </w:t>
+      </w:r>
+      <w:proofErr w:type="spellStart"/>
+      <w:r>
+        <w:rPr>
+          <w:rFonts w:ascii="Arial" w:hAnsi="Arial" w:cs="Arial"/>
+          <w:lang w:val="es-CO"/>
+        </w:rPr>
+        <w:t>headers</w:t>
+      </w:r>
+      <w:proofErr w:type="spellEnd"/>
+    </w:p>
+    <w:p>
+      <w:pPr>
+        <w:rPr>
+          <w:rFonts w:ascii="Arial" w:hAnsi="Arial" w:cs="Arial"/>
+          <w:lang w:val="es-CO"/>
+        </w:rPr>
+      </w:pPr>
+      <w:r>
+        <w:rPr>
+          <w:rFonts w:ascii="Arial" w:hAnsi="Arial" w:cs="Arial"/>
+          <w:lang w:val="es-CO"/>
+        </w:rPr>
+        <w:t xml:space="preserve">Al extraer los datos desde el archivo .xlsx, se verifica el </w:t>
+      </w:r>
+      <w:proofErr w:type="spellStart"/>
+      <w:r>
+        <w:rPr>
+          <w:rFonts w:ascii="Arial" w:hAnsi="Arial" w:cs="Arial"/>
+          <w:lang w:val="es-CO"/>
+        </w:rPr>
+        <w:t>dataframe</w:t>
+      </w:r>
+      <w:proofErr w:type="spellEnd"/>
+      <w:r>
+        <w:rPr>
+          <w:rFonts w:ascii="Arial" w:hAnsi="Arial" w:cs="Arial"/>
+          <w:lang w:val="es-CO"/>
+        </w:rPr>
+        <w:t xml:space="preserve"> generado por Pandas, empezando por los nombres de las columnas y se observan las siguientes incidencias:</w:t>
       </w:r>
     </w:p>
     <w:p>
@@ -6803,12 +8898,53 @@
           <w:lang w:val="es-CO"/>
         </w:rPr>
       </w:pPr>
-      <w:r>
-        <w:rPr>
-          <w:rFonts w:ascii="Arial" w:hAnsi="Arial" w:cs="Arial"/>
-          <w:lang w:val="es-CO"/>
-        </w:rPr>
-        <w:t>Headers sin nombres descriptivos: headers con nombres por defecto de Pandas tipo ‘Unnamed: X’.</w:t>
+      <w:proofErr w:type="spellStart"/>
+      <w:r>
+        <w:rPr>
+          <w:rFonts w:ascii="Arial" w:hAnsi="Arial" w:cs="Arial"/>
+          <w:lang w:val="es-CO"/>
+        </w:rPr>
+        <w:t>Headers</w:t>
+      </w:r>
+      <w:proofErr w:type="spellEnd"/>
+      <w:r>
+        <w:rPr>
+          <w:rFonts w:ascii="Arial" w:hAnsi="Arial" w:cs="Arial"/>
+          <w:lang w:val="es-CO"/>
+        </w:rPr>
+        <w:t xml:space="preserve"> sin nombres descriptivos: </w:t>
+      </w:r>
+      <w:proofErr w:type="spellStart"/>
+      <w:r>
+        <w:rPr>
+          <w:rFonts w:ascii="Arial" w:hAnsi="Arial" w:cs="Arial"/>
+          <w:lang w:val="es-CO"/>
+        </w:rPr>
+        <w:t>headers</w:t>
+      </w:r>
+      <w:proofErr w:type="spellEnd"/>
+      <w:r>
+        <w:rPr>
+          <w:rFonts w:ascii="Arial" w:hAnsi="Arial" w:cs="Arial"/>
+          <w:lang w:val="es-CO"/>
+        </w:rPr>
+        <w:t xml:space="preserve"> con nombres por defecto de Pandas tipo ‘</w:t>
+      </w:r>
+      <w:proofErr w:type="spellStart"/>
+      <w:r>
+        <w:rPr>
+          <w:rFonts w:ascii="Arial" w:hAnsi="Arial" w:cs="Arial"/>
+          <w:lang w:val="es-CO"/>
+        </w:rPr>
+        <w:t>Unnamed</w:t>
+      </w:r>
+      <w:proofErr w:type="spellEnd"/>
+      <w:r>
+        <w:rPr>
+          <w:rFonts w:ascii="Arial" w:hAnsi="Arial" w:cs="Arial"/>
+          <w:lang w:val="es-CO"/>
+        </w:rPr>
+        <w:t>: X’.</w:t>
       </w:r>
     </w:p>
     <w:p>
@@ -6824,7 +8960,23 @@
           <w:lang w:val="es-CO"/>
         </w:rPr>
         <w:lastRenderedPageBreak/>
-        <w:t>Se asignan los headers originales</w:t>
+        <w:t xml:space="preserve">Se asignan los </w:t>
+      </w:r>
+      <w:proofErr w:type="spellStart"/>
+      <w:r>
+        <w:rPr>
+          <w:rFonts w:ascii="Arial" w:hAnsi="Arial" w:cs="Arial"/>
+          <w:lang w:val="es-CO"/>
+        </w:rPr>
+        <w:t>headers</w:t>
+      </w:r>
+      <w:proofErr w:type="spellEnd"/>
+      <w:r>
+        <w:rPr>
+          <w:rFonts w:ascii="Arial" w:hAnsi="Arial" w:cs="Arial"/>
+          <w:lang w:val="es-CO"/>
+        </w:rPr>
+        <w:t xml:space="preserve"> originales</w:t>
       </w:r>
     </w:p>
     <w:p>
@@ -6897,7 +9049,23 @@
           <w:rFonts w:ascii="Arial" w:hAnsi="Arial" w:cs="Arial"/>
           <w:lang w:val="es-CO"/>
         </w:rPr>
-        <w:t>Se propagan las columnas de ‘Area’ y ‘Sexo’</w:t>
+        <w:t>Se propagan las columnas de ‘</w:t>
+      </w:r>
+      <w:proofErr w:type="spellStart"/>
+      <w:r>
+        <w:rPr>
+          <w:rFonts w:ascii="Arial" w:hAnsi="Arial" w:cs="Arial"/>
+          <w:lang w:val="es-CO"/>
+        </w:rPr>
+        <w:t>Area</w:t>
+      </w:r>
+      <w:proofErr w:type="spellEnd"/>
+      <w:r>
+        <w:rPr>
+          <w:rFonts w:ascii="Arial" w:hAnsi="Arial" w:cs="Arial"/>
+          <w:lang w:val="es-CO"/>
+        </w:rPr>
+        <w:t>’ y ‘Sexo’</w:t>
       </w:r>
     </w:p>
     <w:p>
@@ -6970,7 +9138,23 @@
           <w:rFonts w:ascii="Arial" w:hAnsi="Arial" w:cs="Arial"/>
           <w:lang w:val="es-CO"/>
         </w:rPr>
-        <w:t>Se renombran los headers que contienen tildes o ñ.</w:t>
+        <w:t xml:space="preserve">Se renombran los </w:t>
+      </w:r>
+      <w:proofErr w:type="spellStart"/>
+      <w:r>
+        <w:rPr>
+          <w:rFonts w:ascii="Arial" w:hAnsi="Arial" w:cs="Arial"/>
+          <w:lang w:val="es-CO"/>
+        </w:rPr>
+        <w:t>headers</w:t>
+      </w:r>
+      <w:proofErr w:type="spellEnd"/>
+      <w:r>
+        <w:rPr>
+          <w:rFonts w:ascii="Arial" w:hAnsi="Arial" w:cs="Arial"/>
+          <w:lang w:val="es-CO"/>
+        </w:rPr>
+        <w:t xml:space="preserve"> que contienen tildes o ñ.</w:t>
       </w:r>
     </w:p>
     <w:p>
@@ -7038,19 +9222,36 @@
           <w:rFonts w:ascii="Arial" w:hAnsi="Arial" w:cs="Arial"/>
           <w:lang w:val="es-CO"/>
         </w:rPr>
-        <w:t>Se empieza por extraer solo la parte correspondiente a los datos del archivo excel, para lo cual se ignoran las primeras 9 filas de la hoja.</w:t>
-      </w:r>
-    </w:p>
-    <w:p>
-      <w:pPr>
-        <w:rPr>
-          <w:rFonts w:ascii="Arial" w:hAnsi="Arial" w:cs="Arial"/>
-          <w:lang w:val="es-CO"/>
-        </w:rPr>
-      </w:pPr>
-      <w:r>
-        <w:rPr>
-          <w:rFonts w:ascii="Arial" w:hAnsi="Arial" w:cs="Arial"/>
+        <w:t xml:space="preserve">Se empieza por extraer solo la parte correspondiente a los datos del archivo </w:t>
+      </w:r>
+      <w:proofErr w:type="spellStart"/>
+      <w:r>
+        <w:rPr>
+          <w:rFonts w:ascii="Arial" w:hAnsi="Arial" w:cs="Arial"/>
+          <w:lang w:val="es-CO"/>
+        </w:rPr>
+        <w:t>excel</w:t>
+      </w:r>
+      <w:proofErr w:type="spellEnd"/>
+      <w:r>
+        <w:rPr>
+          <w:rFonts w:ascii="Arial" w:hAnsi="Arial" w:cs="Arial"/>
+          <w:lang w:val="es-CO"/>
+        </w:rPr>
+        <w:t>, para lo cual se ignoran las primeras 9 filas de la hoja.</w:t>
+      </w:r>
+    </w:p>
+    <w:p>
+      <w:pPr>
+        <w:rPr>
+          <w:rFonts w:ascii="Arial" w:hAnsi="Arial" w:cs="Arial"/>
+          <w:lang w:val="es-CO"/>
+        </w:rPr>
+      </w:pPr>
+      <w:r>
+        <w:rPr>
+          <w:rFonts w:ascii="Arial" w:hAnsi="Arial" w:cs="Arial"/>
+          <w:noProof/>
           <w:lang w:val="es-CO"/>
         </w:rPr>
         <w:lastRenderedPageBreak/>
@@ -7111,19 +9312,36 @@
           <w:rFonts w:ascii="Arial" w:hAnsi="Arial" w:cs="Arial"/>
           <w:lang w:val="es-CO"/>
         </w:rPr>
-        <w:t>Se extraen los headers originales para renombrar las columnas cuando se filtren los datos por municipio.</w:t>
-      </w:r>
-    </w:p>
-    <w:p>
-      <w:pPr>
-        <w:rPr>
-          <w:rFonts w:ascii="Arial" w:hAnsi="Arial" w:cs="Arial"/>
-          <w:lang w:val="es-CO"/>
-        </w:rPr>
-      </w:pPr>
-      <w:r>
-        <w:rPr>
-          <w:rFonts w:ascii="Arial" w:hAnsi="Arial" w:cs="Arial"/>
+        <w:t xml:space="preserve">Se extraen los </w:t>
+      </w:r>
+      <w:proofErr w:type="spellStart"/>
+      <w:r>
+        <w:rPr>
+          <w:rFonts w:ascii="Arial" w:hAnsi="Arial" w:cs="Arial"/>
+          <w:lang w:val="es-CO"/>
+        </w:rPr>
+        <w:t>headers</w:t>
+      </w:r>
+      <w:proofErr w:type="spellEnd"/>
+      <w:r>
+        <w:rPr>
+          <w:rFonts w:ascii="Arial" w:hAnsi="Arial" w:cs="Arial"/>
+          <w:lang w:val="es-CO"/>
+        </w:rPr>
+        <w:t xml:space="preserve"> originales para renombrar las columnas cuando se filtren los datos por municipio.</w:t>
+      </w:r>
+    </w:p>
+    <w:p>
+      <w:pPr>
+        <w:rPr>
+          <w:rFonts w:ascii="Arial" w:hAnsi="Arial" w:cs="Arial"/>
+          <w:lang w:val="es-CO"/>
+        </w:rPr>
+      </w:pPr>
+      <w:r>
+        <w:rPr>
+          <w:rFonts w:ascii="Arial" w:hAnsi="Arial" w:cs="Arial"/>
+          <w:noProof/>
           <w:lang w:val="es-CO"/>
         </w:rPr>
         <w:drawing>
@@ -7278,22 +9496,47 @@
           <w:rFonts w:ascii="Arial" w:hAnsi="Arial" w:cs="Arial"/>
           <w:lang w:val="es-CO"/>
         </w:rPr>
-        <w:t>Actualización de headers</w:t>
-      </w:r>
-    </w:p>
-    <w:p>
-      <w:pPr>
-        <w:rPr>
-          <w:rFonts w:ascii="Arial" w:hAnsi="Arial" w:cs="Arial"/>
-          <w:lang w:val="es-CO"/>
-        </w:rPr>
-      </w:pPr>
-      <w:r>
-        <w:rPr>
-          <w:rFonts w:ascii="Arial" w:hAnsi="Arial" w:cs="Arial"/>
-          <w:lang w:val="es-CO"/>
-        </w:rPr>
-        <w:t>Al extraer los datos desde el archivo .xlsx, se verifica el dataframe generado por Pandas, empezando por los nombres de las columnas y se observan las siguientes incidencias:</w:t>
+        <w:t xml:space="preserve">Actualización de </w:t>
+      </w:r>
+      <w:proofErr w:type="spellStart"/>
+      <w:r>
+        <w:rPr>
+          <w:rFonts w:ascii="Arial" w:hAnsi="Arial" w:cs="Arial"/>
+          <w:lang w:val="es-CO"/>
+        </w:rPr>
+        <w:t>headers</w:t>
+      </w:r>
+      <w:proofErr w:type="spellEnd"/>
+    </w:p>
+    <w:p>
+      <w:pPr>
+        <w:rPr>
+          <w:rFonts w:ascii="Arial" w:hAnsi="Arial" w:cs="Arial"/>
+          <w:lang w:val="es-CO"/>
+        </w:rPr>
+      </w:pPr>
+      <w:r>
+        <w:rPr>
+          <w:rFonts w:ascii="Arial" w:hAnsi="Arial" w:cs="Arial"/>
+          <w:lang w:val="es-CO"/>
+        </w:rPr>
+        <w:t xml:space="preserve">Al extraer los datos desde el archivo .xlsx, se verifica el </w:t>
+      </w:r>
+      <w:proofErr w:type="spellStart"/>
+      <w:r>
+        <w:rPr>
+          <w:rFonts w:ascii="Arial" w:hAnsi="Arial" w:cs="Arial"/>
+          <w:lang w:val="es-CO"/>
+        </w:rPr>
+        <w:t>dataframe</w:t>
+      </w:r>
+      <w:proofErr w:type="spellEnd"/>
+      <w:r>
+        <w:rPr>
+          <w:rFonts w:ascii="Arial" w:hAnsi="Arial" w:cs="Arial"/>
+          <w:lang w:val="es-CO"/>
+        </w:rPr>
+        <w:t xml:space="preserve"> generado por Pandas, empezando por los nombres de las columnas y se observan las siguientes incidencias:</w:t>
       </w:r>
     </w:p>
     <w:p>
@@ -7308,12 +9551,53 @@
           <w:lang w:val="es-CO"/>
         </w:rPr>
       </w:pPr>
-      <w:r>
-        <w:rPr>
-          <w:rFonts w:ascii="Arial" w:hAnsi="Arial" w:cs="Arial"/>
-          <w:lang w:val="es-CO"/>
-        </w:rPr>
-        <w:t>Headers sin nombres descriptivos: headers con nombres por defecto de Pandas tipo ‘Unnamed: X’.</w:t>
+      <w:proofErr w:type="spellStart"/>
+      <w:r>
+        <w:rPr>
+          <w:rFonts w:ascii="Arial" w:hAnsi="Arial" w:cs="Arial"/>
+          <w:lang w:val="es-CO"/>
+        </w:rPr>
+        <w:t>Headers</w:t>
+      </w:r>
+      <w:proofErr w:type="spellEnd"/>
+      <w:r>
+        <w:rPr>
+          <w:rFonts w:ascii="Arial" w:hAnsi="Arial" w:cs="Arial"/>
+          <w:lang w:val="es-CO"/>
+        </w:rPr>
+        <w:t xml:space="preserve"> sin nombres descriptivos: </w:t>
+      </w:r>
+      <w:proofErr w:type="spellStart"/>
+      <w:r>
+        <w:rPr>
+          <w:rFonts w:ascii="Arial" w:hAnsi="Arial" w:cs="Arial"/>
+          <w:lang w:val="es-CO"/>
+        </w:rPr>
+        <w:t>headers</w:t>
+      </w:r>
+      <w:proofErr w:type="spellEnd"/>
+      <w:r>
+        <w:rPr>
+          <w:rFonts w:ascii="Arial" w:hAnsi="Arial" w:cs="Arial"/>
+          <w:lang w:val="es-CO"/>
+        </w:rPr>
+        <w:t xml:space="preserve"> con nombres por defecto de Pandas tipo ‘</w:t>
+      </w:r>
+      <w:proofErr w:type="spellStart"/>
+      <w:r>
+        <w:rPr>
+          <w:rFonts w:ascii="Arial" w:hAnsi="Arial" w:cs="Arial"/>
+          <w:lang w:val="es-CO"/>
+        </w:rPr>
+        <w:t>Unnamed</w:t>
+      </w:r>
+      <w:proofErr w:type="spellEnd"/>
+      <w:r>
+        <w:rPr>
+          <w:rFonts w:ascii="Arial" w:hAnsi="Arial" w:cs="Arial"/>
+          <w:lang w:val="es-CO"/>
+        </w:rPr>
+        <w:t>: X’.</w:t>
       </w:r>
     </w:p>
     <w:p>
@@ -7328,12 +9612,37 @@
           <w:lang w:val="es-CO"/>
         </w:rPr>
       </w:pPr>
-      <w:r>
-        <w:rPr>
-          <w:rFonts w:ascii="Arial" w:hAnsi="Arial" w:cs="Arial"/>
-          <w:lang w:val="es-CO"/>
-        </w:rPr>
-        <w:t xml:space="preserve">Headers en jerarquías inferiores debido a la agrupación de datos: Los headers se encuentran en la segunda fila de datos debido al diseño del .xlsx donde se busca describir la agrupación por </w:t>
+      <w:proofErr w:type="spellStart"/>
+      <w:r>
+        <w:rPr>
+          <w:rFonts w:ascii="Arial" w:hAnsi="Arial" w:cs="Arial"/>
+          <w:lang w:val="es-CO"/>
+        </w:rPr>
+        <w:t>Headers</w:t>
+      </w:r>
+      <w:proofErr w:type="spellEnd"/>
+      <w:r>
+        <w:rPr>
+          <w:rFonts w:ascii="Arial" w:hAnsi="Arial" w:cs="Arial"/>
+          <w:lang w:val="es-CO"/>
+        </w:rPr>
+        <w:t xml:space="preserve"> en jerarquías inferiores debido a la agrupación de datos: Los </w:t>
+      </w:r>
+      <w:proofErr w:type="spellStart"/>
+      <w:r>
+        <w:rPr>
+          <w:rFonts w:ascii="Arial" w:hAnsi="Arial" w:cs="Arial"/>
+          <w:lang w:val="es-CO"/>
+        </w:rPr>
+        <w:t>headers</w:t>
+      </w:r>
+      <w:proofErr w:type="spellEnd"/>
+      <w:r>
+        <w:rPr>
+          <w:rFonts w:ascii="Arial" w:hAnsi="Arial" w:cs="Arial"/>
+          <w:lang w:val="es-CO"/>
+        </w:rPr>
+        <w:t xml:space="preserve"> se encuentran en la segunda fila de datos debido al diseño del .xlsx donde se busca describir la agrupación por </w:t>
       </w:r>
       <w:r>
         <w:rPr>
@@ -7377,8 +9686,25 @@
           <w:rFonts w:ascii="Arial" w:hAnsi="Arial" w:cs="Arial"/>
           <w:lang w:val="es-CO"/>
         </w:rPr>
-        <w:t>Debido a la agrupación de datos en las columnas, se divide el dataframe en 4 partes, correspondientes a las áreas. Cada subconjunto se concatena con las columnas de ‘</w:t>
-      </w:r>
+        <w:t xml:space="preserve">Debido a la agrupación de datos en las columnas, se divide el </w:t>
+      </w:r>
+      <w:proofErr w:type="spellStart"/>
+      <w:r>
+        <w:rPr>
+          <w:rFonts w:ascii="Arial" w:hAnsi="Arial" w:cs="Arial"/>
+          <w:lang w:val="es-CO"/>
+        </w:rPr>
+        <w:t>dataframe</w:t>
+      </w:r>
+      <w:proofErr w:type="spellEnd"/>
+      <w:r>
+        <w:rPr>
+          <w:rFonts w:ascii="Arial" w:hAnsi="Arial" w:cs="Arial"/>
+          <w:lang w:val="es-CO"/>
+        </w:rPr>
+        <w:t xml:space="preserve"> en 4 partes, correspondientes a las áreas. Cada subconjunto se concatena con las columnas de ‘</w:t>
+      </w:r>
+      <w:proofErr w:type="spellStart"/>
       <w:r>
         <w:rPr>
           <w:rFonts w:ascii="Arial" w:hAnsi="Arial" w:cs="Arial"/>
@@ -7386,6 +9712,7 @@
         </w:rPr>
         <w:t>Area</w:t>
       </w:r>
+      <w:proofErr w:type="spellEnd"/>
       <w:r>
         <w:rPr>
           <w:rFonts w:ascii="Arial" w:hAnsi="Arial" w:cs="Arial"/>
@@ -7393,6 +9720,7 @@
         </w:rPr>
         <w:t>’ y ‘Grupo de edad’, y se asigna una columna ‘</w:t>
       </w:r>
+      <w:proofErr w:type="spellStart"/>
       <w:r>
         <w:rPr>
           <w:rFonts w:ascii="Arial" w:hAnsi="Arial" w:cs="Arial"/>
@@ -7400,26 +9728,13 @@
         </w:rPr>
         <w:t>Sabe_leer_y_escribir</w:t>
       </w:r>
-      <w:r>
-        <w:rPr>
-          <w:rFonts w:ascii="Arial" w:hAnsi="Arial" w:cs="Arial"/>
-          <w:lang w:val="es-CO"/>
-        </w:rPr>
-        <w:t xml:space="preserve">’ que contiene </w:t>
-      </w:r>
-      <w:r>
-        <w:rPr>
-          <w:rFonts w:ascii="Arial" w:hAnsi="Arial" w:cs="Arial"/>
-          <w:lang w:val="es-CO"/>
-        </w:rPr>
-        <w:t>los datos de alfabetización de los censados</w:t>
-      </w:r>
-      <w:r>
-        <w:rPr>
-          <w:rFonts w:ascii="Arial" w:hAnsi="Arial" w:cs="Arial"/>
-          <w:lang w:val="es-CO"/>
-        </w:rPr>
-        <w:t xml:space="preserve">. Luego se reemplazan los nombres de las columnas que todavía tienen un nombre por defecto por los siguientes nombres en su orden correspondiente: </w:t>
+      <w:proofErr w:type="spellEnd"/>
+      <w:r>
+        <w:rPr>
+          <w:rFonts w:ascii="Arial" w:hAnsi="Arial" w:cs="Arial"/>
+          <w:lang w:val="es-CO"/>
+        </w:rPr>
+        <w:t xml:space="preserve">’ que contiene los datos de alfabetización de los censados. Luego se reemplazan los nombres de las columnas que todavía tienen un nombre por defecto por los siguientes nombres en su orden correspondiente: </w:t>
       </w:r>
     </w:p>
     <w:p>
@@ -7675,7 +9990,39 @@
           <w:rFonts w:ascii="Arial" w:hAnsi="Arial" w:cs="Arial"/>
           <w:lang w:val="es-CO"/>
         </w:rPr>
-        <w:t>Después de las modificaciones en cada subconjunto, se consolidan los dataframes en un solo dataframe.</w:t>
+        <w:t xml:space="preserve">Después de las modificaciones en cada subconjunto, se consolidan los </w:t>
+      </w:r>
+      <w:proofErr w:type="spellStart"/>
+      <w:r>
+        <w:rPr>
+          <w:rFonts w:ascii="Arial" w:hAnsi="Arial" w:cs="Arial"/>
+          <w:lang w:val="es-CO"/>
+        </w:rPr>
+        <w:t>dataframes</w:t>
+      </w:r>
+      <w:proofErr w:type="spellEnd"/>
+      <w:r>
+        <w:rPr>
+          <w:rFonts w:ascii="Arial" w:hAnsi="Arial" w:cs="Arial"/>
+          <w:lang w:val="es-CO"/>
+        </w:rPr>
+        <w:t xml:space="preserve"> en un solo </w:t>
+      </w:r>
+      <w:proofErr w:type="spellStart"/>
+      <w:r>
+        <w:rPr>
+          <w:rFonts w:ascii="Arial" w:hAnsi="Arial" w:cs="Arial"/>
+          <w:lang w:val="es-CO"/>
+        </w:rPr>
+        <w:t>dataframe</w:t>
+      </w:r>
+      <w:proofErr w:type="spellEnd"/>
+      <w:r>
+        <w:rPr>
+          <w:rFonts w:ascii="Arial" w:hAnsi="Arial" w:cs="Arial"/>
+          <w:lang w:val="es-CO"/>
+        </w:rPr>
+        <w:t>.</w:t>
       </w:r>
     </w:p>
     <w:p>
@@ -7754,7 +10101,23 @@
           <w:rFonts w:ascii="Arial" w:hAnsi="Arial" w:cs="Arial"/>
           <w:lang w:val="es-CO"/>
         </w:rPr>
-        <w:t>Se propagan los datos de la columna ‘Area’</w:t>
+        <w:t>Se propagan los datos de la columna ‘</w:t>
+      </w:r>
+      <w:proofErr w:type="spellStart"/>
+      <w:r>
+        <w:rPr>
+          <w:rFonts w:ascii="Arial" w:hAnsi="Arial" w:cs="Arial"/>
+          <w:lang w:val="es-CO"/>
+        </w:rPr>
+        <w:t>Area</w:t>
+      </w:r>
+      <w:proofErr w:type="spellEnd"/>
+      <w:r>
+        <w:rPr>
+          <w:rFonts w:ascii="Arial" w:hAnsi="Arial" w:cs="Arial"/>
+          <w:lang w:val="es-CO"/>
+        </w:rPr>
+        <w:t>’</w:t>
       </w:r>
     </w:p>
     <w:p>
@@ -7834,14 +10197,468 @@
           <w:rFonts w:ascii="Arial" w:hAnsi="Arial" w:cs="Arial"/>
           <w:lang w:val="es-CO"/>
         </w:rPr>
-        <w:t>Finalmente, se cambian las tildes de los datos, reemplazando vocales con tilde por vocales sin tilde</w:t>
-      </w:r>
-      <w:r>
-        <w:rPr>
-          <w:rFonts w:ascii="Arial" w:hAnsi="Arial" w:cs="Arial"/>
-          <w:lang w:val="es-CO"/>
-        </w:rPr>
-        <w:t>, y los datos con ñ por ni.</w:t>
+        <w:t>Finalmente, se cambian las tildes de los datos, reemplazando vocales con tilde por vocales sin tilde, y los datos con ñ por ni.</w:t>
+      </w:r>
+    </w:p>
+    <w:p>
+      <w:pPr>
+        <w:rPr>
+          <w:rFonts w:ascii="Arial" w:hAnsi="Arial" w:cs="Arial"/>
+          <w:lang w:val="es-CO"/>
+        </w:rPr>
+      </w:pPr>
+    </w:p>
+    <w:p>
+      <w:pPr>
+        <w:rPr>
+          <w:rFonts w:ascii="Arial" w:hAnsi="Arial" w:cs="Arial"/>
+          <w:lang w:val="es-CO"/>
+        </w:rPr>
+      </w:pPr>
+    </w:p>
+    <w:p>
+      <w:pPr>
+        <w:rPr>
+          <w:rFonts w:ascii="Arial" w:hAnsi="Arial" w:cs="Arial"/>
+          <w:b/>
+          <w:bCs/>
+          <w:lang w:val="es-CO"/>
+        </w:rPr>
+      </w:pPr>
+      <w:r>
+        <w:rPr>
+          <w:rFonts w:ascii="Arial" w:hAnsi="Arial" w:cs="Arial"/>
+          <w:b/>
+          <w:bCs/>
+          <w:lang w:val="es-CO"/>
+        </w:rPr>
+        <w:t>17PM</w:t>
+      </w:r>
+    </w:p>
+    <w:p>
+      <w:pPr>
+        <w:rPr>
+          <w:rFonts w:ascii="Arial" w:hAnsi="Arial" w:cs="Arial"/>
+          <w:lang w:val="es-CO"/>
+        </w:rPr>
+      </w:pPr>
+      <w:r>
+        <w:rPr>
+          <w:rFonts w:ascii="Arial" w:hAnsi="Arial" w:cs="Arial"/>
+          <w:lang w:val="es-CO"/>
+        </w:rPr>
+        <w:t xml:space="preserve">Se empieza por extraer solo la parte correspondiente a los datos del archivo </w:t>
+      </w:r>
+      <w:proofErr w:type="spellStart"/>
+      <w:r>
+        <w:rPr>
+          <w:rFonts w:ascii="Arial" w:hAnsi="Arial" w:cs="Arial"/>
+          <w:lang w:val="es-CO"/>
+        </w:rPr>
+        <w:t>excel</w:t>
+      </w:r>
+      <w:proofErr w:type="spellEnd"/>
+      <w:r>
+        <w:rPr>
+          <w:rFonts w:ascii="Arial" w:hAnsi="Arial" w:cs="Arial"/>
+          <w:lang w:val="es-CO"/>
+        </w:rPr>
+        <w:t xml:space="preserve">, para lo cual se ignoran las primeras </w:t>
+      </w:r>
+      <w:r>
+        <w:rPr>
+          <w:rFonts w:ascii="Arial" w:hAnsi="Arial" w:cs="Arial"/>
+          <w:lang w:val="es-CO"/>
+        </w:rPr>
+        <w:t>10</w:t>
+      </w:r>
+      <w:r>
+        <w:rPr>
+          <w:rFonts w:ascii="Arial" w:hAnsi="Arial" w:cs="Arial"/>
+          <w:lang w:val="es-CO"/>
+        </w:rPr>
+        <w:t xml:space="preserve"> filas de la hoja.</w:t>
+      </w:r>
+    </w:p>
+    <w:p>
+      <w:pPr>
+        <w:rPr>
+          <w:rFonts w:ascii="Arial" w:hAnsi="Arial" w:cs="Arial"/>
+          <w:lang w:val="es-CO"/>
+        </w:rPr>
+      </w:pPr>
+      <w:r>
+        <w:rPr>
+          <w:rFonts w:ascii="Arial" w:hAnsi="Arial" w:cs="Arial"/>
+          <w:noProof/>
+          <w:lang w:val="es-CO"/>
+        </w:rPr>
+        <w:lastRenderedPageBreak/>
+        <w:drawing>
+          <wp:inline distT="0" distB="0" distL="0" distR="0" wp14:anchorId="2669BB3D" wp14:editId="1B071470">
+            <wp:extent cx="5612130" cy="2477770"/>
+            <wp:effectExtent l="0" t="0" r="7620" b="0"/>
+            <wp:docPr id="51" name="Imagen 51"/>
+            <wp:cNvGraphicFramePr>
+              <a:graphicFrameLocks xmlns:a="http://schemas.openxmlformats.org/drawingml/2006/main" noChangeAspect="1"/>
+            </wp:cNvGraphicFramePr>
+            <a:graphic xmlns:a="http://schemas.openxmlformats.org/drawingml/2006/main">
+              <a:graphicData uri="http://schemas.openxmlformats.org/drawingml/2006/picture">
+                <pic:pic xmlns:pic="http://schemas.openxmlformats.org/drawingml/2006/picture">
+                  <pic:nvPicPr>
+                    <pic:cNvPr id="51" name="Imagen 51"/>
+                    <pic:cNvPicPr/>
+                  </pic:nvPicPr>
+                  <pic:blipFill>
+                    <a:blip r:embed="rId63">
+                      <a:extLst>
+                        <a:ext uri="{28A0092B-C50C-407E-A947-70E740481C1C}">
+                          <a14:useLocalDpi xmlns:a14="http://schemas.microsoft.com/office/drawing/2010/main" val="0"/>
+                        </a:ext>
+                      </a:extLst>
+                    </a:blip>
+                    <a:stretch>
+                      <a:fillRect/>
+                    </a:stretch>
+                  </pic:blipFill>
+                  <pic:spPr>
+                    <a:xfrm>
+                      <a:off x="0" y="0"/>
+                      <a:ext cx="5612130" cy="2477770"/>
+                    </a:xfrm>
+                    <a:prstGeom prst="rect">
+                      <a:avLst/>
+                    </a:prstGeom>
+                  </pic:spPr>
+                </pic:pic>
+              </a:graphicData>
+            </a:graphic>
+          </wp:inline>
+        </w:drawing>
+      </w:r>
+    </w:p>
+    <w:p>
+      <w:pPr>
+        <w:rPr>
+          <w:rFonts w:ascii="Arial" w:hAnsi="Arial" w:cs="Arial"/>
+          <w:lang w:val="es-CO"/>
+        </w:rPr>
+      </w:pPr>
+    </w:p>
+    <w:p>
+      <w:pPr>
+        <w:rPr>
+          <w:rFonts w:ascii="Arial" w:hAnsi="Arial" w:cs="Arial"/>
+          <w:lang w:val="es-CO"/>
+        </w:rPr>
+      </w:pPr>
+      <w:r>
+        <w:rPr>
+          <w:rFonts w:ascii="Arial" w:hAnsi="Arial" w:cs="Arial"/>
+          <w:lang w:val="es-CO"/>
+        </w:rPr>
+        <w:t>Filtrado de datos que no son de Viterbo, Caldas.</w:t>
+      </w:r>
+    </w:p>
+    <w:p>
+      <w:pPr>
+        <w:rPr>
+          <w:rFonts w:ascii="Arial" w:hAnsi="Arial" w:cs="Arial"/>
+          <w:lang w:val="es-CO"/>
+        </w:rPr>
+      </w:pPr>
+      <w:r>
+        <w:rPr>
+          <w:rFonts w:ascii="Arial" w:hAnsi="Arial" w:cs="Arial"/>
+          <w:lang w:val="es-CO"/>
+        </w:rPr>
+        <w:t>Para esta hoja se decide propagar el valor del identificador del municipio, ‘17877_Viterbo’, y seleccionar solo los registros que lo contengan.</w:t>
+      </w:r>
+    </w:p>
+    <w:p>
+      <w:pPr>
+        <w:rPr>
+          <w:rFonts w:ascii="Arial" w:hAnsi="Arial" w:cs="Arial"/>
+          <w:lang w:val="es-CO"/>
+        </w:rPr>
+      </w:pPr>
+      <w:r>
+        <w:rPr>
+          <w:rFonts w:ascii="Arial" w:hAnsi="Arial" w:cs="Arial"/>
+          <w:noProof/>
+          <w:lang w:val="es-CO"/>
+        </w:rPr>
+        <w:drawing>
+          <wp:inline distT="0" distB="0" distL="0" distR="0" wp14:anchorId="435D0D67" wp14:editId="67AD34F9">
+            <wp:extent cx="5612130" cy="1926590"/>
+            <wp:effectExtent l="0" t="0" r="7620" b="0"/>
+            <wp:docPr id="52" name="Imagen 52"/>
+            <wp:cNvGraphicFramePr>
+              <a:graphicFrameLocks xmlns:a="http://schemas.openxmlformats.org/drawingml/2006/main" noChangeAspect="1"/>
+            </wp:cNvGraphicFramePr>
+            <a:graphic xmlns:a="http://schemas.openxmlformats.org/drawingml/2006/main">
+              <a:graphicData uri="http://schemas.openxmlformats.org/drawingml/2006/picture">
+                <pic:pic xmlns:pic="http://schemas.openxmlformats.org/drawingml/2006/picture">
+                  <pic:nvPicPr>
+                    <pic:cNvPr id="52" name="Imagen 52"/>
+                    <pic:cNvPicPr/>
+                  </pic:nvPicPr>
+                  <pic:blipFill>
+                    <a:blip r:embed="rId64">
+                      <a:extLst>
+                        <a:ext uri="{28A0092B-C50C-407E-A947-70E740481C1C}">
+                          <a14:useLocalDpi xmlns:a14="http://schemas.microsoft.com/office/drawing/2010/main" val="0"/>
+                        </a:ext>
+                      </a:extLst>
+                    </a:blip>
+                    <a:stretch>
+                      <a:fillRect/>
+                    </a:stretch>
+                  </pic:blipFill>
+                  <pic:spPr>
+                    <a:xfrm>
+                      <a:off x="0" y="0"/>
+                      <a:ext cx="5612130" cy="1926590"/>
+                    </a:xfrm>
+                    <a:prstGeom prst="rect">
+                      <a:avLst/>
+                    </a:prstGeom>
+                  </pic:spPr>
+                </pic:pic>
+              </a:graphicData>
+            </a:graphic>
+          </wp:inline>
+        </w:drawing>
+      </w:r>
+    </w:p>
+    <w:p>
+      <w:pPr>
+        <w:rPr>
+          <w:rFonts w:ascii="Arial" w:hAnsi="Arial" w:cs="Arial"/>
+          <w:lang w:val="es-CO"/>
+        </w:rPr>
+      </w:pPr>
+    </w:p>
+    <w:p>
+      <w:pPr>
+        <w:rPr>
+          <w:rFonts w:ascii="Arial" w:hAnsi="Arial" w:cs="Arial"/>
+          <w:lang w:val="es-CO"/>
+        </w:rPr>
+      </w:pPr>
+      <w:r>
+        <w:rPr>
+          <w:rFonts w:ascii="Arial" w:hAnsi="Arial" w:cs="Arial"/>
+          <w:lang w:val="es-CO"/>
+        </w:rPr>
+        <w:t xml:space="preserve">Se renombran </w:t>
+      </w:r>
+      <w:proofErr w:type="spellStart"/>
+      <w:r>
+        <w:rPr>
+          <w:rFonts w:ascii="Arial" w:hAnsi="Arial" w:cs="Arial"/>
+          <w:lang w:val="es-CO"/>
+        </w:rPr>
+        <w:t>headers</w:t>
+      </w:r>
+      <w:proofErr w:type="spellEnd"/>
+      <w:r>
+        <w:rPr>
+          <w:rFonts w:ascii="Arial" w:hAnsi="Arial" w:cs="Arial"/>
+          <w:lang w:val="es-CO"/>
+        </w:rPr>
+        <w:t xml:space="preserve"> sin nombre</w:t>
+      </w:r>
+    </w:p>
+    <w:p>
+      <w:pPr>
+        <w:rPr>
+          <w:rFonts w:ascii="Arial" w:hAnsi="Arial" w:cs="Arial"/>
+          <w:lang w:val="es-CO"/>
+        </w:rPr>
+      </w:pPr>
+      <w:r>
+        <w:rPr>
+          <w:rFonts w:ascii="Arial" w:hAnsi="Arial" w:cs="Arial"/>
+          <w:noProof/>
+          <w:lang w:val="es-CO"/>
+        </w:rPr>
+        <w:lastRenderedPageBreak/>
+        <w:drawing>
+          <wp:inline distT="0" distB="0" distL="0" distR="0" wp14:anchorId="7D5F257C" wp14:editId="0A61FA2A">
+            <wp:extent cx="5612130" cy="2237740"/>
+            <wp:effectExtent l="0" t="0" r="7620" b="0"/>
+            <wp:docPr id="53" name="Imagen 53"/>
+            <wp:cNvGraphicFramePr>
+              <a:graphicFrameLocks xmlns:a="http://schemas.openxmlformats.org/drawingml/2006/main" noChangeAspect="1"/>
+            </wp:cNvGraphicFramePr>
+            <a:graphic xmlns:a="http://schemas.openxmlformats.org/drawingml/2006/main">
+              <a:graphicData uri="http://schemas.openxmlformats.org/drawingml/2006/picture">
+                <pic:pic xmlns:pic="http://schemas.openxmlformats.org/drawingml/2006/picture">
+                  <pic:nvPicPr>
+                    <pic:cNvPr id="53" name="Imagen 53"/>
+                    <pic:cNvPicPr/>
+                  </pic:nvPicPr>
+                  <pic:blipFill>
+                    <a:blip r:embed="rId65">
+                      <a:extLst>
+                        <a:ext uri="{28A0092B-C50C-407E-A947-70E740481C1C}">
+                          <a14:useLocalDpi xmlns:a14="http://schemas.microsoft.com/office/drawing/2010/main" val="0"/>
+                        </a:ext>
+                      </a:extLst>
+                    </a:blip>
+                    <a:stretch>
+                      <a:fillRect/>
+                    </a:stretch>
+                  </pic:blipFill>
+                  <pic:spPr>
+                    <a:xfrm>
+                      <a:off x="0" y="0"/>
+                      <a:ext cx="5612130" cy="2237740"/>
+                    </a:xfrm>
+                    <a:prstGeom prst="rect">
+                      <a:avLst/>
+                    </a:prstGeom>
+                  </pic:spPr>
+                </pic:pic>
+              </a:graphicData>
+            </a:graphic>
+          </wp:inline>
+        </w:drawing>
+      </w:r>
+    </w:p>
+    <w:p>
+      <w:pPr>
+        <w:rPr>
+          <w:rFonts w:ascii="Arial" w:hAnsi="Arial" w:cs="Arial"/>
+          <w:lang w:val="es-CO"/>
+        </w:rPr>
+      </w:pPr>
+    </w:p>
+    <w:p>
+      <w:pPr>
+        <w:rPr>
+          <w:rFonts w:ascii="Arial" w:hAnsi="Arial" w:cs="Arial"/>
+          <w:lang w:val="es-CO"/>
+        </w:rPr>
+      </w:pPr>
+      <w:r>
+        <w:rPr>
+          <w:rFonts w:ascii="Arial" w:hAnsi="Arial" w:cs="Arial"/>
+          <w:lang w:val="es-CO"/>
+        </w:rPr>
+        <w:t>Se propagan los datos de la columna ‘</w:t>
+      </w:r>
+      <w:proofErr w:type="spellStart"/>
+      <w:r>
+        <w:rPr>
+          <w:rFonts w:ascii="Arial" w:hAnsi="Arial" w:cs="Arial"/>
+          <w:lang w:val="es-CO"/>
+        </w:rPr>
+        <w:t>Area</w:t>
+      </w:r>
+      <w:proofErr w:type="spellEnd"/>
+      <w:r>
+        <w:rPr>
+          <w:rFonts w:ascii="Arial" w:hAnsi="Arial" w:cs="Arial"/>
+          <w:lang w:val="es-CO"/>
+        </w:rPr>
+        <w:t>’</w:t>
+      </w:r>
+    </w:p>
+    <w:p>
+      <w:pPr>
+        <w:rPr>
+          <w:rFonts w:ascii="Arial" w:hAnsi="Arial" w:cs="Arial"/>
+          <w:lang w:val="es-CO"/>
+        </w:rPr>
+      </w:pPr>
+      <w:r>
+        <w:rPr>
+          <w:rFonts w:ascii="Arial" w:hAnsi="Arial" w:cs="Arial"/>
+          <w:noProof/>
+          <w:lang w:val="es-CO"/>
+        </w:rPr>
+        <w:drawing>
+          <wp:inline distT="0" distB="0" distL="0" distR="0" wp14:anchorId="7C6D440F" wp14:editId="6BF0C2D1">
+            <wp:extent cx="5612130" cy="3054985"/>
+            <wp:effectExtent l="0" t="0" r="7620" b="0"/>
+            <wp:docPr id="54" name="Imagen 54"/>
+            <wp:cNvGraphicFramePr>
+              <a:graphicFrameLocks xmlns:a="http://schemas.openxmlformats.org/drawingml/2006/main" noChangeAspect="1"/>
+            </wp:cNvGraphicFramePr>
+            <a:graphic xmlns:a="http://schemas.openxmlformats.org/drawingml/2006/main">
+              <a:graphicData uri="http://schemas.openxmlformats.org/drawingml/2006/picture">
+                <pic:pic xmlns:pic="http://schemas.openxmlformats.org/drawingml/2006/picture">
+                  <pic:nvPicPr>
+                    <pic:cNvPr id="54" name="Imagen 54"/>
+                    <pic:cNvPicPr/>
+                  </pic:nvPicPr>
+                  <pic:blipFill>
+                    <a:blip r:embed="rId66">
+                      <a:extLst>
+                        <a:ext uri="{28A0092B-C50C-407E-A947-70E740481C1C}">
+                          <a14:useLocalDpi xmlns:a14="http://schemas.microsoft.com/office/drawing/2010/main" val="0"/>
+                        </a:ext>
+                      </a:extLst>
+                    </a:blip>
+                    <a:stretch>
+                      <a:fillRect/>
+                    </a:stretch>
+                  </pic:blipFill>
+                  <pic:spPr>
+                    <a:xfrm>
+                      <a:off x="0" y="0"/>
+                      <a:ext cx="5612130" cy="3054985"/>
+                    </a:xfrm>
+                    <a:prstGeom prst="rect">
+                      <a:avLst/>
+                    </a:prstGeom>
+                  </pic:spPr>
+                </pic:pic>
+              </a:graphicData>
+            </a:graphic>
+          </wp:inline>
+        </w:drawing>
+      </w:r>
+    </w:p>
+    <w:p>
+      <w:pPr>
+        <w:rPr>
+          <w:rFonts w:ascii="Arial" w:hAnsi="Arial" w:cs="Arial"/>
+          <w:lang w:val="es-CO"/>
+        </w:rPr>
+      </w:pPr>
+    </w:p>
+    <w:p>
+      <w:pPr>
+        <w:rPr>
+          <w:rFonts w:ascii="Arial" w:hAnsi="Arial" w:cs="Arial"/>
+          <w:lang w:val="es-CO"/>
+        </w:rPr>
+      </w:pPr>
+      <w:r>
+        <w:rPr>
+          <w:rFonts w:ascii="Arial" w:hAnsi="Arial" w:cs="Arial"/>
+          <w:lang w:val="es-CO"/>
+        </w:rPr>
+        <w:t xml:space="preserve">Se renombran los </w:t>
+      </w:r>
+      <w:proofErr w:type="spellStart"/>
+      <w:r>
+        <w:rPr>
+          <w:rFonts w:ascii="Arial" w:hAnsi="Arial" w:cs="Arial"/>
+          <w:lang w:val="es-CO"/>
+        </w:rPr>
+        <w:t>headers</w:t>
+      </w:r>
+      <w:proofErr w:type="spellEnd"/>
+      <w:r>
+        <w:rPr>
+          <w:rFonts w:ascii="Arial" w:hAnsi="Arial" w:cs="Arial"/>
+          <w:lang w:val="es-CO"/>
+        </w:rPr>
+        <w:t xml:space="preserve"> que contienen tildes o ñ.</w:t>
       </w:r>
     </w:p>
     <w:p>

</xml_diff>

<commit_message>
Agrega la documentacion del procesamiento de la hoja 18PM
</commit_message>
<xml_diff>
--- a/Documentacion/Procesamiento de Datos.docx
+++ b/Documentacion/Procesamiento de Datos.docx
@@ -9702,7 +9702,21 @@
           <w:rFonts w:ascii="Arial" w:hAnsi="Arial" w:cs="Arial"/>
           <w:lang w:val="es-CO"/>
         </w:rPr>
-        <w:t xml:space="preserve"> en 4 partes, correspondientes a las áreas. Cada subconjunto se concatena con las columnas de ‘</w:t>
+        <w:t xml:space="preserve"> en 4 partes, correspondientes a </w:t>
+      </w:r>
+      <w:r>
+        <w:rPr>
+          <w:rFonts w:ascii="Arial" w:hAnsi="Arial" w:cs="Arial"/>
+          <w:lang w:val="es-CO"/>
+        </w:rPr>
+        <w:t>la alfabetización de los censados</w:t>
+      </w:r>
+      <w:r>
+        <w:rPr>
+          <w:rFonts w:ascii="Arial" w:hAnsi="Arial" w:cs="Arial"/>
+          <w:lang w:val="es-CO"/>
+        </w:rPr>
+        <w:t>. Cada subconjunto se concatena con las columnas de ‘</w:t>
       </w:r>
       <w:proofErr w:type="spellStart"/>
       <w:r>
@@ -10263,21 +10277,7 @@
           <w:rFonts w:ascii="Arial" w:hAnsi="Arial" w:cs="Arial"/>
           <w:lang w:val="es-CO"/>
         </w:rPr>
-        <w:t xml:space="preserve">, para lo cual se ignoran las primeras </w:t>
-      </w:r>
-      <w:r>
-        <w:rPr>
-          <w:rFonts w:ascii="Arial" w:hAnsi="Arial" w:cs="Arial"/>
-          <w:lang w:val="es-CO"/>
-        </w:rPr>
-        <w:t>10</w:t>
-      </w:r>
-      <w:r>
-        <w:rPr>
-          <w:rFonts w:ascii="Arial" w:hAnsi="Arial" w:cs="Arial"/>
-          <w:lang w:val="es-CO"/>
-        </w:rPr>
-        <w:t xml:space="preserve"> filas de la hoja.</w:t>
+        <w:t>, para lo cual se ignoran las primeras 10 filas de la hoja.</w:t>
       </w:r>
     </w:p>
     <w:p>
@@ -10659,6 +10659,1070 @@
           <w:lang w:val="es-CO"/>
         </w:rPr>
         <w:t xml:space="preserve"> que contienen tildes o ñ.</w:t>
+      </w:r>
+    </w:p>
+    <w:p>
+      <w:pPr>
+        <w:rPr>
+          <w:rFonts w:ascii="Arial" w:hAnsi="Arial" w:cs="Arial"/>
+          <w:lang w:val="es-CO"/>
+        </w:rPr>
+      </w:pPr>
+    </w:p>
+    <w:p>
+      <w:pPr>
+        <w:rPr>
+          <w:rFonts w:ascii="Arial" w:hAnsi="Arial" w:cs="Arial"/>
+          <w:lang w:val="es-CO"/>
+        </w:rPr>
+      </w:pPr>
+    </w:p>
+    <w:p>
+      <w:pPr>
+        <w:rPr>
+          <w:rFonts w:ascii="Arial" w:hAnsi="Arial" w:cs="Arial"/>
+          <w:b/>
+          <w:bCs/>
+          <w:lang w:val="es-CO"/>
+        </w:rPr>
+      </w:pPr>
+      <w:r>
+        <w:rPr>
+          <w:rFonts w:ascii="Arial" w:hAnsi="Arial" w:cs="Arial"/>
+          <w:b/>
+          <w:bCs/>
+          <w:lang w:val="es-CO"/>
+        </w:rPr>
+        <w:t>18PM</w:t>
+      </w:r>
+    </w:p>
+    <w:p>
+      <w:pPr>
+        <w:rPr>
+          <w:rFonts w:ascii="Arial" w:hAnsi="Arial" w:cs="Arial"/>
+          <w:lang w:val="es-CO"/>
+        </w:rPr>
+      </w:pPr>
+      <w:r>
+        <w:rPr>
+          <w:rFonts w:ascii="Arial" w:hAnsi="Arial" w:cs="Arial"/>
+          <w:lang w:val="es-CO"/>
+        </w:rPr>
+        <w:t xml:space="preserve">Se empieza por extraer solo la parte correspondiente a los datos del archivo </w:t>
+      </w:r>
+      <w:proofErr w:type="spellStart"/>
+      <w:r>
+        <w:rPr>
+          <w:rFonts w:ascii="Arial" w:hAnsi="Arial" w:cs="Arial"/>
+          <w:lang w:val="es-CO"/>
+        </w:rPr>
+        <w:t>excel</w:t>
+      </w:r>
+      <w:proofErr w:type="spellEnd"/>
+      <w:r>
+        <w:rPr>
+          <w:rFonts w:ascii="Arial" w:hAnsi="Arial" w:cs="Arial"/>
+          <w:lang w:val="es-CO"/>
+        </w:rPr>
+        <w:t xml:space="preserve">, para lo cual se ignoran las primeras </w:t>
+      </w:r>
+      <w:r>
+        <w:rPr>
+          <w:rFonts w:ascii="Arial" w:hAnsi="Arial" w:cs="Arial"/>
+          <w:lang w:val="es-CO"/>
+        </w:rPr>
+        <w:t>9</w:t>
+      </w:r>
+      <w:r>
+        <w:rPr>
+          <w:rFonts w:ascii="Arial" w:hAnsi="Arial" w:cs="Arial"/>
+          <w:lang w:val="es-CO"/>
+        </w:rPr>
+        <w:t xml:space="preserve"> filas de la hoja.</w:t>
+      </w:r>
+    </w:p>
+    <w:p>
+      <w:pPr>
+        <w:rPr>
+          <w:rFonts w:ascii="Arial" w:hAnsi="Arial" w:cs="Arial"/>
+          <w:lang w:val="es-CO"/>
+        </w:rPr>
+      </w:pPr>
+      <w:r>
+        <w:rPr>
+          <w:rFonts w:ascii="Arial" w:hAnsi="Arial" w:cs="Arial"/>
+          <w:noProof/>
+          <w:lang w:val="es-CO"/>
+        </w:rPr>
+        <w:lastRenderedPageBreak/>
+        <w:drawing>
+          <wp:inline distT="0" distB="0" distL="0" distR="0" wp14:anchorId="4CDF6855" wp14:editId="4FCBACAD">
+            <wp:extent cx="5612130" cy="2788285"/>
+            <wp:effectExtent l="0" t="0" r="7620" b="0"/>
+            <wp:docPr id="55" name="Imagen 55"/>
+            <wp:cNvGraphicFramePr>
+              <a:graphicFrameLocks xmlns:a="http://schemas.openxmlformats.org/drawingml/2006/main" noChangeAspect="1"/>
+            </wp:cNvGraphicFramePr>
+            <a:graphic xmlns:a="http://schemas.openxmlformats.org/drawingml/2006/main">
+              <a:graphicData uri="http://schemas.openxmlformats.org/drawingml/2006/picture">
+                <pic:pic xmlns:pic="http://schemas.openxmlformats.org/drawingml/2006/picture">
+                  <pic:nvPicPr>
+                    <pic:cNvPr id="55" name="Imagen 55"/>
+                    <pic:cNvPicPr/>
+                  </pic:nvPicPr>
+                  <pic:blipFill>
+                    <a:blip r:embed="rId67">
+                      <a:extLst>
+                        <a:ext uri="{28A0092B-C50C-407E-A947-70E740481C1C}">
+                          <a14:useLocalDpi xmlns:a14="http://schemas.microsoft.com/office/drawing/2010/main" val="0"/>
+                        </a:ext>
+                      </a:extLst>
+                    </a:blip>
+                    <a:stretch>
+                      <a:fillRect/>
+                    </a:stretch>
+                  </pic:blipFill>
+                  <pic:spPr>
+                    <a:xfrm>
+                      <a:off x="0" y="0"/>
+                      <a:ext cx="5612130" cy="2788285"/>
+                    </a:xfrm>
+                    <a:prstGeom prst="rect">
+                      <a:avLst/>
+                    </a:prstGeom>
+                  </pic:spPr>
+                </pic:pic>
+              </a:graphicData>
+            </a:graphic>
+          </wp:inline>
+        </w:drawing>
+      </w:r>
+    </w:p>
+    <w:p>
+      <w:pPr>
+        <w:rPr>
+          <w:rFonts w:ascii="Arial" w:hAnsi="Arial" w:cs="Arial"/>
+          <w:lang w:val="es-CO"/>
+        </w:rPr>
+      </w:pPr>
+    </w:p>
+    <w:p>
+      <w:pPr>
+        <w:rPr>
+          <w:rFonts w:ascii="Arial" w:hAnsi="Arial" w:cs="Arial"/>
+          <w:lang w:val="es-CO"/>
+        </w:rPr>
+      </w:pPr>
+      <w:r>
+        <w:rPr>
+          <w:rFonts w:ascii="Arial" w:hAnsi="Arial" w:cs="Arial"/>
+          <w:lang w:val="es-CO"/>
+        </w:rPr>
+        <w:t xml:space="preserve">Se extraen los </w:t>
+      </w:r>
+      <w:proofErr w:type="spellStart"/>
+      <w:r>
+        <w:rPr>
+          <w:rFonts w:ascii="Arial" w:hAnsi="Arial" w:cs="Arial"/>
+          <w:lang w:val="es-CO"/>
+        </w:rPr>
+        <w:t>headers</w:t>
+      </w:r>
+      <w:proofErr w:type="spellEnd"/>
+      <w:r>
+        <w:rPr>
+          <w:rFonts w:ascii="Arial" w:hAnsi="Arial" w:cs="Arial"/>
+          <w:lang w:val="es-CO"/>
+        </w:rPr>
+        <w:t xml:space="preserve"> originales para renombrar las columnas cuando se filtren los datos por municipio.</w:t>
+      </w:r>
+    </w:p>
+    <w:p>
+      <w:pPr>
+        <w:rPr>
+          <w:rFonts w:ascii="Arial" w:hAnsi="Arial" w:cs="Arial"/>
+          <w:lang w:val="es-CO"/>
+        </w:rPr>
+      </w:pPr>
+      <w:r>
+        <w:rPr>
+          <w:rFonts w:ascii="Arial" w:hAnsi="Arial" w:cs="Arial"/>
+          <w:lang w:val="es-CO"/>
+        </w:rPr>
+        <w:drawing>
+          <wp:inline distT="0" distB="0" distL="0" distR="0" wp14:anchorId="1F040B94" wp14:editId="793CF704">
+            <wp:extent cx="857370" cy="2219635"/>
+            <wp:effectExtent l="0" t="0" r="0" b="0"/>
+            <wp:docPr id="56" name="Imagen 56"/>
+            <wp:cNvGraphicFramePr>
+              <a:graphicFrameLocks xmlns:a="http://schemas.openxmlformats.org/drawingml/2006/main" noChangeAspect="1"/>
+            </wp:cNvGraphicFramePr>
+            <a:graphic xmlns:a="http://schemas.openxmlformats.org/drawingml/2006/main">
+              <a:graphicData uri="http://schemas.openxmlformats.org/drawingml/2006/picture">
+                <pic:pic xmlns:pic="http://schemas.openxmlformats.org/drawingml/2006/picture">
+                  <pic:nvPicPr>
+                    <pic:cNvPr id="1" name=""/>
+                    <pic:cNvPicPr/>
+                  </pic:nvPicPr>
+                  <pic:blipFill>
+                    <a:blip r:embed="rId68"/>
+                    <a:stretch>
+                      <a:fillRect/>
+                    </a:stretch>
+                  </pic:blipFill>
+                  <pic:spPr>
+                    <a:xfrm>
+                      <a:off x="0" y="0"/>
+                      <a:ext cx="857370" cy="2219635"/>
+                    </a:xfrm>
+                    <a:prstGeom prst="rect">
+                      <a:avLst/>
+                    </a:prstGeom>
+                  </pic:spPr>
+                </pic:pic>
+              </a:graphicData>
+            </a:graphic>
+          </wp:inline>
+        </w:drawing>
+      </w:r>
+    </w:p>
+    <w:p>
+      <w:pPr>
+        <w:rPr>
+          <w:rFonts w:ascii="Arial" w:hAnsi="Arial" w:cs="Arial"/>
+          <w:lang w:val="es-CO"/>
+        </w:rPr>
+      </w:pPr>
+    </w:p>
+    <w:p>
+      <w:pPr>
+        <w:rPr>
+          <w:rFonts w:ascii="Arial" w:hAnsi="Arial" w:cs="Arial"/>
+          <w:lang w:val="es-CO"/>
+        </w:rPr>
+      </w:pPr>
+      <w:r>
+        <w:rPr>
+          <w:rFonts w:ascii="Arial" w:hAnsi="Arial" w:cs="Arial"/>
+          <w:lang w:val="es-CO"/>
+        </w:rPr>
+        <w:t>Filtrado de datos que no son de Viterbo, Caldas.</w:t>
+      </w:r>
+    </w:p>
+    <w:p>
+      <w:pPr>
+        <w:rPr>
+          <w:rFonts w:ascii="Arial" w:hAnsi="Arial" w:cs="Arial"/>
+          <w:lang w:val="es-CO"/>
+        </w:rPr>
+      </w:pPr>
+      <w:r>
+        <w:rPr>
+          <w:rFonts w:ascii="Arial" w:hAnsi="Arial" w:cs="Arial"/>
+          <w:lang w:val="es-CO"/>
+        </w:rPr>
+        <w:t>Para esta hoja se decide propagar el valor del identificador del municipio, ‘17877_Viterbo’, y seleccionar solo los registros que lo contengan.</w:t>
+      </w:r>
+    </w:p>
+    <w:p>
+      <w:pPr>
+        <w:rPr>
+          <w:rFonts w:ascii="Arial" w:hAnsi="Arial" w:cs="Arial"/>
+          <w:lang w:val="es-CO"/>
+        </w:rPr>
+      </w:pPr>
+      <w:r>
+        <w:rPr>
+          <w:rFonts w:ascii="Arial" w:hAnsi="Arial" w:cs="Arial"/>
+          <w:noProof/>
+          <w:lang w:val="es-CO"/>
+        </w:rPr>
+        <w:lastRenderedPageBreak/>
+        <w:drawing>
+          <wp:inline distT="0" distB="0" distL="0" distR="0" wp14:anchorId="3FDB64F1" wp14:editId="40BED7CC">
+            <wp:extent cx="5612130" cy="2920365"/>
+            <wp:effectExtent l="0" t="0" r="7620" b="0"/>
+            <wp:docPr id="57" name="Imagen 57"/>
+            <wp:cNvGraphicFramePr>
+              <a:graphicFrameLocks xmlns:a="http://schemas.openxmlformats.org/drawingml/2006/main" noChangeAspect="1"/>
+            </wp:cNvGraphicFramePr>
+            <a:graphic xmlns:a="http://schemas.openxmlformats.org/drawingml/2006/main">
+              <a:graphicData uri="http://schemas.openxmlformats.org/drawingml/2006/picture">
+                <pic:pic xmlns:pic="http://schemas.openxmlformats.org/drawingml/2006/picture">
+                  <pic:nvPicPr>
+                    <pic:cNvPr id="57" name="Imagen 57"/>
+                    <pic:cNvPicPr/>
+                  </pic:nvPicPr>
+                  <pic:blipFill>
+                    <a:blip r:embed="rId69">
+                      <a:extLst>
+                        <a:ext uri="{28A0092B-C50C-407E-A947-70E740481C1C}">
+                          <a14:useLocalDpi xmlns:a14="http://schemas.microsoft.com/office/drawing/2010/main" val="0"/>
+                        </a:ext>
+                      </a:extLst>
+                    </a:blip>
+                    <a:stretch>
+                      <a:fillRect/>
+                    </a:stretch>
+                  </pic:blipFill>
+                  <pic:spPr>
+                    <a:xfrm>
+                      <a:off x="0" y="0"/>
+                      <a:ext cx="5612130" cy="2920365"/>
+                    </a:xfrm>
+                    <a:prstGeom prst="rect">
+                      <a:avLst/>
+                    </a:prstGeom>
+                  </pic:spPr>
+                </pic:pic>
+              </a:graphicData>
+            </a:graphic>
+          </wp:inline>
+        </w:drawing>
+      </w:r>
+    </w:p>
+    <w:p>
+      <w:pPr>
+        <w:rPr>
+          <w:rFonts w:ascii="Arial" w:hAnsi="Arial" w:cs="Arial"/>
+          <w:lang w:val="es-CO"/>
+        </w:rPr>
+      </w:pPr>
+    </w:p>
+    <w:p>
+      <w:pPr>
+        <w:rPr>
+          <w:rFonts w:ascii="Arial" w:hAnsi="Arial" w:cs="Arial"/>
+          <w:lang w:val="es-CO"/>
+        </w:rPr>
+      </w:pPr>
+      <w:r>
+        <w:rPr>
+          <w:rFonts w:ascii="Arial" w:hAnsi="Arial" w:cs="Arial"/>
+          <w:lang w:val="es-CO"/>
+        </w:rPr>
+        <w:t xml:space="preserve">Actualización de </w:t>
+      </w:r>
+      <w:proofErr w:type="spellStart"/>
+      <w:r>
+        <w:rPr>
+          <w:rFonts w:ascii="Arial" w:hAnsi="Arial" w:cs="Arial"/>
+          <w:lang w:val="es-CO"/>
+        </w:rPr>
+        <w:t>headers</w:t>
+      </w:r>
+      <w:proofErr w:type="spellEnd"/>
+    </w:p>
+    <w:p>
+      <w:pPr>
+        <w:rPr>
+          <w:rFonts w:ascii="Arial" w:hAnsi="Arial" w:cs="Arial"/>
+          <w:lang w:val="es-CO"/>
+        </w:rPr>
+      </w:pPr>
+      <w:r>
+        <w:rPr>
+          <w:rFonts w:ascii="Arial" w:hAnsi="Arial" w:cs="Arial"/>
+          <w:lang w:val="es-CO"/>
+        </w:rPr>
+        <w:t xml:space="preserve">Al extraer los datos desde el archivo .xlsx, se verifica el </w:t>
+      </w:r>
+      <w:proofErr w:type="spellStart"/>
+      <w:r>
+        <w:rPr>
+          <w:rFonts w:ascii="Arial" w:hAnsi="Arial" w:cs="Arial"/>
+          <w:lang w:val="es-CO"/>
+        </w:rPr>
+        <w:t>dataframe</w:t>
+      </w:r>
+      <w:proofErr w:type="spellEnd"/>
+      <w:r>
+        <w:rPr>
+          <w:rFonts w:ascii="Arial" w:hAnsi="Arial" w:cs="Arial"/>
+          <w:lang w:val="es-CO"/>
+        </w:rPr>
+        <w:t xml:space="preserve"> generado por Pandas, empezando por los nombres de las columnas y se observan las siguientes incidencias:</w:t>
+      </w:r>
+    </w:p>
+    <w:p>
+      <w:pPr>
+        <w:pStyle w:val="Prrafodelista"/>
+        <w:numPr>
+          <w:ilvl w:val="0"/>
+          <w:numId w:val="1"/>
+        </w:numPr>
+        <w:rPr>
+          <w:rFonts w:ascii="Arial" w:hAnsi="Arial" w:cs="Arial"/>
+          <w:lang w:val="es-CO"/>
+        </w:rPr>
+      </w:pPr>
+      <w:proofErr w:type="spellStart"/>
+      <w:r>
+        <w:rPr>
+          <w:rFonts w:ascii="Arial" w:hAnsi="Arial" w:cs="Arial"/>
+          <w:lang w:val="es-CO"/>
+        </w:rPr>
+        <w:t>Headers</w:t>
+      </w:r>
+      <w:proofErr w:type="spellEnd"/>
+      <w:r>
+        <w:rPr>
+          <w:rFonts w:ascii="Arial" w:hAnsi="Arial" w:cs="Arial"/>
+          <w:lang w:val="es-CO"/>
+        </w:rPr>
+        <w:t xml:space="preserve"> sin nombres descriptivos: </w:t>
+      </w:r>
+      <w:proofErr w:type="spellStart"/>
+      <w:r>
+        <w:rPr>
+          <w:rFonts w:ascii="Arial" w:hAnsi="Arial" w:cs="Arial"/>
+          <w:lang w:val="es-CO"/>
+        </w:rPr>
+        <w:t>headers</w:t>
+      </w:r>
+      <w:proofErr w:type="spellEnd"/>
+      <w:r>
+        <w:rPr>
+          <w:rFonts w:ascii="Arial" w:hAnsi="Arial" w:cs="Arial"/>
+          <w:lang w:val="es-CO"/>
+        </w:rPr>
+        <w:t xml:space="preserve"> con nombres por defecto de Pandas tipo ‘</w:t>
+      </w:r>
+      <w:proofErr w:type="spellStart"/>
+      <w:r>
+        <w:rPr>
+          <w:rFonts w:ascii="Arial" w:hAnsi="Arial" w:cs="Arial"/>
+          <w:lang w:val="es-CO"/>
+        </w:rPr>
+        <w:t>Unnamed</w:t>
+      </w:r>
+      <w:proofErr w:type="spellEnd"/>
+      <w:r>
+        <w:rPr>
+          <w:rFonts w:ascii="Arial" w:hAnsi="Arial" w:cs="Arial"/>
+          <w:lang w:val="es-CO"/>
+        </w:rPr>
+        <w:t>: X’.</w:t>
+      </w:r>
+    </w:p>
+    <w:p>
+      <w:pPr>
+        <w:pStyle w:val="Prrafodelista"/>
+        <w:numPr>
+          <w:ilvl w:val="0"/>
+          <w:numId w:val="1"/>
+        </w:numPr>
+        <w:rPr>
+          <w:rFonts w:ascii="Arial" w:hAnsi="Arial" w:cs="Arial"/>
+          <w:lang w:val="es-CO"/>
+        </w:rPr>
+      </w:pPr>
+      <w:proofErr w:type="spellStart"/>
+      <w:r>
+        <w:rPr>
+          <w:rFonts w:ascii="Arial" w:hAnsi="Arial" w:cs="Arial"/>
+          <w:lang w:val="es-CO"/>
+        </w:rPr>
+        <w:t>Headers</w:t>
+      </w:r>
+      <w:proofErr w:type="spellEnd"/>
+      <w:r>
+        <w:rPr>
+          <w:rFonts w:ascii="Arial" w:hAnsi="Arial" w:cs="Arial"/>
+          <w:lang w:val="es-CO"/>
+        </w:rPr>
+        <w:t xml:space="preserve"> en jerarquías inferiores debido a la agrupación de datos: Los </w:t>
+      </w:r>
+      <w:proofErr w:type="spellStart"/>
+      <w:r>
+        <w:rPr>
+          <w:rFonts w:ascii="Arial" w:hAnsi="Arial" w:cs="Arial"/>
+          <w:lang w:val="es-CO"/>
+        </w:rPr>
+        <w:t>headers</w:t>
+      </w:r>
+      <w:proofErr w:type="spellEnd"/>
+      <w:r>
+        <w:rPr>
+          <w:rFonts w:ascii="Arial" w:hAnsi="Arial" w:cs="Arial"/>
+          <w:lang w:val="es-CO"/>
+        </w:rPr>
+        <w:t xml:space="preserve"> se encuentran en la segunda fila de datos debido al diseño del .xlsx donde se busca describir la agrupación por </w:t>
+      </w:r>
+      <w:r>
+        <w:rPr>
+          <w:rFonts w:ascii="Arial" w:hAnsi="Arial" w:cs="Arial"/>
+          <w:lang w:val="es-CO"/>
+        </w:rPr>
+        <w:t>Asistencia</w:t>
+      </w:r>
+      <w:r>
+        <w:rPr>
+          <w:rFonts w:ascii="Arial" w:hAnsi="Arial" w:cs="Arial"/>
+          <w:lang w:val="es-CO"/>
+        </w:rPr>
+        <w:t xml:space="preserve"> a instituciones educativas</w:t>
+      </w:r>
+      <w:r>
+        <w:rPr>
+          <w:rFonts w:ascii="Arial" w:hAnsi="Arial" w:cs="Arial"/>
+          <w:lang w:val="es-CO"/>
+        </w:rPr>
+        <w:t>.</w:t>
+      </w:r>
+    </w:p>
+    <w:p>
+      <w:pPr>
+        <w:rPr>
+          <w:rFonts w:ascii="Arial" w:hAnsi="Arial" w:cs="Arial"/>
+          <w:lang w:val="es-CO"/>
+        </w:rPr>
+      </w:pPr>
+      <w:r>
+        <w:rPr>
+          <w:rFonts w:ascii="Arial" w:hAnsi="Arial" w:cs="Arial"/>
+          <w:lang w:val="es-CO"/>
+        </w:rPr>
+        <w:t xml:space="preserve">Debido a la agrupación de datos en las columnas, se divide el </w:t>
+      </w:r>
+      <w:proofErr w:type="spellStart"/>
+      <w:r>
+        <w:rPr>
+          <w:rFonts w:ascii="Arial" w:hAnsi="Arial" w:cs="Arial"/>
+          <w:lang w:val="es-CO"/>
+        </w:rPr>
+        <w:t>dataframe</w:t>
+      </w:r>
+      <w:proofErr w:type="spellEnd"/>
+      <w:r>
+        <w:rPr>
+          <w:rFonts w:ascii="Arial" w:hAnsi="Arial" w:cs="Arial"/>
+          <w:lang w:val="es-CO"/>
+        </w:rPr>
+        <w:t xml:space="preserve"> en 4 partes, correspondientes a </w:t>
+      </w:r>
+      <w:r>
+        <w:rPr>
+          <w:rFonts w:ascii="Arial" w:hAnsi="Arial" w:cs="Arial"/>
+          <w:lang w:val="es-CO"/>
+        </w:rPr>
+        <w:t>la asistencia a alguna institución educativa</w:t>
+      </w:r>
+      <w:r>
+        <w:rPr>
+          <w:rFonts w:ascii="Arial" w:hAnsi="Arial" w:cs="Arial"/>
+          <w:lang w:val="es-CO"/>
+        </w:rPr>
+        <w:t>. Cada subconjunto se concatena con las columnas de ‘</w:t>
+      </w:r>
+      <w:proofErr w:type="spellStart"/>
+      <w:r>
+        <w:rPr>
+          <w:rFonts w:ascii="Arial" w:hAnsi="Arial" w:cs="Arial"/>
+          <w:lang w:val="es-CO"/>
+        </w:rPr>
+        <w:t>Area</w:t>
+      </w:r>
+      <w:proofErr w:type="spellEnd"/>
+      <w:r>
+        <w:rPr>
+          <w:rFonts w:ascii="Arial" w:hAnsi="Arial" w:cs="Arial"/>
+          <w:lang w:val="es-CO"/>
+        </w:rPr>
+        <w:t>’ y ‘Grupo de edad’, y se asigna una columna ‘</w:t>
+      </w:r>
+      <w:proofErr w:type="spellStart"/>
+      <w:r>
+        <w:rPr>
+          <w:rFonts w:ascii="Arial" w:hAnsi="Arial" w:cs="Arial"/>
+          <w:lang w:val="es-CO"/>
+        </w:rPr>
+        <w:t>Asiste_a_alguna_institucion_educativa</w:t>
+      </w:r>
+      <w:proofErr w:type="spellEnd"/>
+      <w:r>
+        <w:rPr>
+          <w:rFonts w:ascii="Arial" w:hAnsi="Arial" w:cs="Arial"/>
+          <w:lang w:val="es-CO"/>
+        </w:rPr>
+        <w:t xml:space="preserve">’ que contiene los datos de </w:t>
+      </w:r>
+      <w:r>
+        <w:rPr>
+          <w:rFonts w:ascii="Arial" w:hAnsi="Arial" w:cs="Arial"/>
+          <w:lang w:val="es-CO"/>
+        </w:rPr>
+        <w:t>asistencia a alguna institución educativa</w:t>
+      </w:r>
+      <w:r>
+        <w:rPr>
+          <w:rFonts w:ascii="Arial" w:hAnsi="Arial" w:cs="Arial"/>
+          <w:lang w:val="es-CO"/>
+        </w:rPr>
+        <w:t xml:space="preserve"> de los censados. Luego se reemplazan los nombres de las columnas que todavía tienen un nombre por defecto por los siguientes nombres en su orden correspondiente: </w:t>
+      </w:r>
+    </w:p>
+    <w:p>
+      <w:pPr>
+        <w:pStyle w:val="Prrafodelista"/>
+        <w:numPr>
+          <w:ilvl w:val="0"/>
+          <w:numId w:val="9"/>
+        </w:numPr>
+        <w:rPr>
+          <w:rFonts w:ascii="Arial" w:hAnsi="Arial" w:cs="Arial"/>
+          <w:lang w:val="es-CO"/>
+        </w:rPr>
+      </w:pPr>
+      <w:r>
+        <w:rPr>
+          <w:rFonts w:ascii="Arial" w:hAnsi="Arial" w:cs="Arial"/>
+          <w:lang w:val="es-CO"/>
+        </w:rPr>
+        <w:t>'Total'</w:t>
+      </w:r>
+    </w:p>
+    <w:p>
+      <w:pPr>
+        <w:pStyle w:val="Prrafodelista"/>
+        <w:numPr>
+          <w:ilvl w:val="0"/>
+          <w:numId w:val="9"/>
+        </w:numPr>
+        <w:rPr>
+          <w:rFonts w:ascii="Arial" w:hAnsi="Arial" w:cs="Arial"/>
+          <w:lang w:val="es-CO"/>
+        </w:rPr>
+      </w:pPr>
+      <w:r>
+        <w:rPr>
+          <w:rFonts w:ascii="Arial" w:hAnsi="Arial" w:cs="Arial"/>
+          <w:lang w:val="es-CO"/>
+        </w:rPr>
+        <w:t>'Hombre'</w:t>
+      </w:r>
+    </w:p>
+    <w:p>
+      <w:pPr>
+        <w:pStyle w:val="Prrafodelista"/>
+        <w:numPr>
+          <w:ilvl w:val="0"/>
+          <w:numId w:val="9"/>
+        </w:numPr>
+        <w:rPr>
+          <w:rFonts w:ascii="Arial" w:hAnsi="Arial" w:cs="Arial"/>
+          <w:lang w:val="es-CO"/>
+        </w:rPr>
+      </w:pPr>
+      <w:r>
+        <w:rPr>
+          <w:rFonts w:ascii="Arial" w:hAnsi="Arial" w:cs="Arial"/>
+          <w:lang w:val="es-CO"/>
+        </w:rPr>
+        <w:t>'Mujer'</w:t>
+      </w:r>
+    </w:p>
+    <w:p>
+      <w:pPr>
+        <w:pStyle w:val="Prrafodelista"/>
+        <w:numPr>
+          <w:ilvl w:val="0"/>
+          <w:numId w:val="9"/>
+        </w:numPr>
+        <w:rPr>
+          <w:rFonts w:ascii="Arial" w:hAnsi="Arial" w:cs="Arial"/>
+          <w:lang w:val="es-CO"/>
+        </w:rPr>
+      </w:pPr>
+      <w:r>
+        <w:rPr>
+          <w:rFonts w:ascii="Arial" w:hAnsi="Arial" w:cs="Arial"/>
+          <w:lang w:val="es-CO"/>
+        </w:rPr>
+        <w:t>'Total'</w:t>
+      </w:r>
+    </w:p>
+    <w:p>
+      <w:pPr>
+        <w:pStyle w:val="Prrafodelista"/>
+        <w:numPr>
+          <w:ilvl w:val="0"/>
+          <w:numId w:val="9"/>
+        </w:numPr>
+        <w:rPr>
+          <w:rFonts w:ascii="Arial" w:hAnsi="Arial" w:cs="Arial"/>
+          <w:lang w:val="es-CO"/>
+        </w:rPr>
+      </w:pPr>
+      <w:r>
+        <w:rPr>
+          <w:rFonts w:ascii="Arial" w:hAnsi="Arial" w:cs="Arial"/>
+          <w:lang w:val="es-CO"/>
+        </w:rPr>
+        <w:lastRenderedPageBreak/>
+        <w:t>'Hombre'</w:t>
+      </w:r>
+    </w:p>
+    <w:p>
+      <w:pPr>
+        <w:pStyle w:val="Prrafodelista"/>
+        <w:numPr>
+          <w:ilvl w:val="0"/>
+          <w:numId w:val="9"/>
+        </w:numPr>
+        <w:rPr>
+          <w:rFonts w:ascii="Arial" w:hAnsi="Arial" w:cs="Arial"/>
+          <w:lang w:val="es-CO"/>
+        </w:rPr>
+      </w:pPr>
+      <w:r>
+        <w:rPr>
+          <w:rFonts w:ascii="Arial" w:hAnsi="Arial" w:cs="Arial"/>
+          <w:lang w:val="es-CO"/>
+        </w:rPr>
+        <w:t>'Mujer'</w:t>
+      </w:r>
+    </w:p>
+    <w:p>
+      <w:pPr>
+        <w:pStyle w:val="Prrafodelista"/>
+        <w:numPr>
+          <w:ilvl w:val="0"/>
+          <w:numId w:val="9"/>
+        </w:numPr>
+        <w:rPr>
+          <w:rFonts w:ascii="Arial" w:hAnsi="Arial" w:cs="Arial"/>
+          <w:lang w:val="es-CO"/>
+        </w:rPr>
+      </w:pPr>
+      <w:r>
+        <w:rPr>
+          <w:rFonts w:ascii="Arial" w:hAnsi="Arial" w:cs="Arial"/>
+          <w:lang w:val="es-CO"/>
+        </w:rPr>
+        <w:t>'Total'</w:t>
+      </w:r>
+    </w:p>
+    <w:p>
+      <w:pPr>
+        <w:pStyle w:val="Prrafodelista"/>
+        <w:numPr>
+          <w:ilvl w:val="0"/>
+          <w:numId w:val="9"/>
+        </w:numPr>
+        <w:rPr>
+          <w:rFonts w:ascii="Arial" w:hAnsi="Arial" w:cs="Arial"/>
+          <w:lang w:val="es-CO"/>
+        </w:rPr>
+      </w:pPr>
+      <w:r>
+        <w:rPr>
+          <w:rFonts w:ascii="Arial" w:hAnsi="Arial" w:cs="Arial"/>
+          <w:lang w:val="es-CO"/>
+        </w:rPr>
+        <w:t>'Hombre'</w:t>
+      </w:r>
+    </w:p>
+    <w:p>
+      <w:pPr>
+        <w:pStyle w:val="Prrafodelista"/>
+        <w:numPr>
+          <w:ilvl w:val="0"/>
+          <w:numId w:val="9"/>
+        </w:numPr>
+        <w:rPr>
+          <w:rFonts w:ascii="Arial" w:hAnsi="Arial" w:cs="Arial"/>
+          <w:lang w:val="es-CO"/>
+        </w:rPr>
+      </w:pPr>
+      <w:r>
+        <w:rPr>
+          <w:rFonts w:ascii="Arial" w:hAnsi="Arial" w:cs="Arial"/>
+          <w:lang w:val="es-CO"/>
+        </w:rPr>
+        <w:t>'Mujer'</w:t>
+      </w:r>
+    </w:p>
+    <w:p>
+      <w:pPr>
+        <w:pStyle w:val="Prrafodelista"/>
+        <w:numPr>
+          <w:ilvl w:val="0"/>
+          <w:numId w:val="9"/>
+        </w:numPr>
+        <w:rPr>
+          <w:rFonts w:ascii="Arial" w:hAnsi="Arial" w:cs="Arial"/>
+          <w:lang w:val="es-CO"/>
+        </w:rPr>
+      </w:pPr>
+      <w:r>
+        <w:rPr>
+          <w:rFonts w:ascii="Arial" w:hAnsi="Arial" w:cs="Arial"/>
+          <w:lang w:val="es-CO"/>
+        </w:rPr>
+        <w:t>'Total'</w:t>
+      </w:r>
+    </w:p>
+    <w:p>
+      <w:pPr>
+        <w:pStyle w:val="Prrafodelista"/>
+        <w:numPr>
+          <w:ilvl w:val="0"/>
+          <w:numId w:val="9"/>
+        </w:numPr>
+        <w:rPr>
+          <w:rFonts w:ascii="Arial" w:hAnsi="Arial" w:cs="Arial"/>
+          <w:lang w:val="es-CO"/>
+        </w:rPr>
+      </w:pPr>
+      <w:r>
+        <w:rPr>
+          <w:rFonts w:ascii="Arial" w:hAnsi="Arial" w:cs="Arial"/>
+          <w:lang w:val="es-CO"/>
+        </w:rPr>
+        <w:t>'Hombre'</w:t>
+      </w:r>
+    </w:p>
+    <w:p>
+      <w:pPr>
+        <w:pStyle w:val="Prrafodelista"/>
+        <w:numPr>
+          <w:ilvl w:val="0"/>
+          <w:numId w:val="9"/>
+        </w:numPr>
+        <w:rPr>
+          <w:rFonts w:ascii="Arial" w:hAnsi="Arial" w:cs="Arial"/>
+          <w:lang w:val="es-CO"/>
+        </w:rPr>
+      </w:pPr>
+      <w:r>
+        <w:rPr>
+          <w:rFonts w:ascii="Arial" w:hAnsi="Arial" w:cs="Arial"/>
+          <w:lang w:val="es-CO"/>
+        </w:rPr>
+        <w:t>'Mujer'</w:t>
+      </w:r>
+    </w:p>
+    <w:p>
+      <w:pPr>
+        <w:rPr>
+          <w:rFonts w:ascii="Arial" w:hAnsi="Arial" w:cs="Arial"/>
+          <w:lang w:val="es-CO"/>
+        </w:rPr>
+      </w:pPr>
+      <w:r>
+        <w:rPr>
+          <w:rFonts w:ascii="Arial" w:hAnsi="Arial" w:cs="Arial"/>
+          <w:lang w:val="es-CO"/>
+        </w:rPr>
+        <w:t xml:space="preserve">Después de las modificaciones en cada subconjunto, se consolidan los </w:t>
+      </w:r>
+      <w:proofErr w:type="spellStart"/>
+      <w:r>
+        <w:rPr>
+          <w:rFonts w:ascii="Arial" w:hAnsi="Arial" w:cs="Arial"/>
+          <w:lang w:val="es-CO"/>
+        </w:rPr>
+        <w:t>dataframes</w:t>
+      </w:r>
+      <w:proofErr w:type="spellEnd"/>
+      <w:r>
+        <w:rPr>
+          <w:rFonts w:ascii="Arial" w:hAnsi="Arial" w:cs="Arial"/>
+          <w:lang w:val="es-CO"/>
+        </w:rPr>
+        <w:t xml:space="preserve"> en un solo </w:t>
+      </w:r>
+      <w:proofErr w:type="spellStart"/>
+      <w:r>
+        <w:rPr>
+          <w:rFonts w:ascii="Arial" w:hAnsi="Arial" w:cs="Arial"/>
+          <w:lang w:val="es-CO"/>
+        </w:rPr>
+        <w:t>dataframe</w:t>
+      </w:r>
+      <w:proofErr w:type="spellEnd"/>
+      <w:r>
+        <w:rPr>
+          <w:rFonts w:ascii="Arial" w:hAnsi="Arial" w:cs="Arial"/>
+          <w:lang w:val="es-CO"/>
+        </w:rPr>
+        <w:t>.</w:t>
+      </w:r>
+    </w:p>
+    <w:p>
+      <w:pPr>
+        <w:rPr>
+          <w:rFonts w:ascii="Arial" w:hAnsi="Arial" w:cs="Arial"/>
+          <w:lang w:val="es-CO"/>
+        </w:rPr>
+      </w:pPr>
+      <w:r>
+        <w:rPr>
+          <w:rFonts w:ascii="Arial" w:hAnsi="Arial" w:cs="Arial"/>
+          <w:noProof/>
+          <w:lang w:val="es-CO"/>
+        </w:rPr>
+        <w:drawing>
+          <wp:inline distT="0" distB="0" distL="0" distR="0" wp14:anchorId="6BCA36A5" wp14:editId="7235DCE2">
+            <wp:extent cx="5612130" cy="2713355"/>
+            <wp:effectExtent l="0" t="0" r="7620" b="0"/>
+            <wp:docPr id="58" name="Imagen 58"/>
+            <wp:cNvGraphicFramePr>
+              <a:graphicFrameLocks xmlns:a="http://schemas.openxmlformats.org/drawingml/2006/main" noChangeAspect="1"/>
+            </wp:cNvGraphicFramePr>
+            <a:graphic xmlns:a="http://schemas.openxmlformats.org/drawingml/2006/main">
+              <a:graphicData uri="http://schemas.openxmlformats.org/drawingml/2006/picture">
+                <pic:pic xmlns:pic="http://schemas.openxmlformats.org/drawingml/2006/picture">
+                  <pic:nvPicPr>
+                    <pic:cNvPr id="58" name="Imagen 58"/>
+                    <pic:cNvPicPr/>
+                  </pic:nvPicPr>
+                  <pic:blipFill>
+                    <a:blip r:embed="rId70">
+                      <a:extLst>
+                        <a:ext uri="{28A0092B-C50C-407E-A947-70E740481C1C}">
+                          <a14:useLocalDpi xmlns:a14="http://schemas.microsoft.com/office/drawing/2010/main" val="0"/>
+                        </a:ext>
+                      </a:extLst>
+                    </a:blip>
+                    <a:stretch>
+                      <a:fillRect/>
+                    </a:stretch>
+                  </pic:blipFill>
+                  <pic:spPr>
+                    <a:xfrm>
+                      <a:off x="0" y="0"/>
+                      <a:ext cx="5612130" cy="2713355"/>
+                    </a:xfrm>
+                    <a:prstGeom prst="rect">
+                      <a:avLst/>
+                    </a:prstGeom>
+                  </pic:spPr>
+                </pic:pic>
+              </a:graphicData>
+            </a:graphic>
+          </wp:inline>
+        </w:drawing>
+      </w:r>
+    </w:p>
+    <w:p>
+      <w:pPr>
+        <w:rPr>
+          <w:rFonts w:ascii="Arial" w:hAnsi="Arial" w:cs="Arial"/>
+          <w:lang w:val="es-CO"/>
+        </w:rPr>
+      </w:pPr>
+    </w:p>
+    <w:p>
+      <w:pPr>
+        <w:rPr>
+          <w:rFonts w:ascii="Arial" w:hAnsi="Arial" w:cs="Arial"/>
+          <w:lang w:val="es-CO"/>
+        </w:rPr>
+      </w:pPr>
+      <w:r>
+        <w:rPr>
+          <w:rFonts w:ascii="Arial" w:hAnsi="Arial" w:cs="Arial"/>
+          <w:lang w:val="es-CO"/>
+        </w:rPr>
+        <w:t>Se propaga la columna ‘</w:t>
+      </w:r>
+      <w:proofErr w:type="spellStart"/>
+      <w:r>
+        <w:rPr>
+          <w:rFonts w:ascii="Arial" w:hAnsi="Arial" w:cs="Arial"/>
+          <w:lang w:val="es-CO"/>
+        </w:rPr>
+        <w:t>Area</w:t>
+      </w:r>
+      <w:proofErr w:type="spellEnd"/>
+      <w:r>
+        <w:rPr>
+          <w:rFonts w:ascii="Arial" w:hAnsi="Arial" w:cs="Arial"/>
+          <w:lang w:val="es-CO"/>
+        </w:rPr>
+        <w:t>’</w:t>
+      </w:r>
+    </w:p>
+    <w:p>
+      <w:pPr>
+        <w:rPr>
+          <w:rFonts w:ascii="Arial" w:hAnsi="Arial" w:cs="Arial"/>
+          <w:lang w:val="es-CO"/>
+        </w:rPr>
+      </w:pPr>
+      <w:r>
+        <w:rPr>
+          <w:rFonts w:ascii="Arial" w:hAnsi="Arial" w:cs="Arial"/>
+          <w:noProof/>
+          <w:lang w:val="es-CO"/>
+        </w:rPr>
+        <w:lastRenderedPageBreak/>
+        <w:drawing>
+          <wp:inline distT="0" distB="0" distL="0" distR="0" wp14:anchorId="17BA8E9D" wp14:editId="3D5F967E">
+            <wp:extent cx="5612130" cy="2515870"/>
+            <wp:effectExtent l="0" t="0" r="7620" b="0"/>
+            <wp:docPr id="59" name="Imagen 59"/>
+            <wp:cNvGraphicFramePr>
+              <a:graphicFrameLocks xmlns:a="http://schemas.openxmlformats.org/drawingml/2006/main" noChangeAspect="1"/>
+            </wp:cNvGraphicFramePr>
+            <a:graphic xmlns:a="http://schemas.openxmlformats.org/drawingml/2006/main">
+              <a:graphicData uri="http://schemas.openxmlformats.org/drawingml/2006/picture">
+                <pic:pic xmlns:pic="http://schemas.openxmlformats.org/drawingml/2006/picture">
+                  <pic:nvPicPr>
+                    <pic:cNvPr id="59" name="Imagen 59"/>
+                    <pic:cNvPicPr/>
+                  </pic:nvPicPr>
+                  <pic:blipFill>
+                    <a:blip r:embed="rId71">
+                      <a:extLst>
+                        <a:ext uri="{28A0092B-C50C-407E-A947-70E740481C1C}">
+                          <a14:useLocalDpi xmlns:a14="http://schemas.microsoft.com/office/drawing/2010/main" val="0"/>
+                        </a:ext>
+                      </a:extLst>
+                    </a:blip>
+                    <a:stretch>
+                      <a:fillRect/>
+                    </a:stretch>
+                  </pic:blipFill>
+                  <pic:spPr>
+                    <a:xfrm>
+                      <a:off x="0" y="0"/>
+                      <a:ext cx="5612130" cy="2515870"/>
+                    </a:xfrm>
+                    <a:prstGeom prst="rect">
+                      <a:avLst/>
+                    </a:prstGeom>
+                  </pic:spPr>
+                </pic:pic>
+              </a:graphicData>
+            </a:graphic>
+          </wp:inline>
+        </w:drawing>
+      </w:r>
+    </w:p>
+    <w:p>
+      <w:pPr>
+        <w:rPr>
+          <w:rFonts w:ascii="Arial" w:hAnsi="Arial" w:cs="Arial"/>
+          <w:lang w:val="es-CO"/>
+        </w:rPr>
+      </w:pPr>
+    </w:p>
+    <w:p>
+      <w:pPr>
+        <w:rPr>
+          <w:rFonts w:ascii="Arial" w:hAnsi="Arial" w:cs="Arial"/>
+          <w:lang w:val="es-CO"/>
+        </w:rPr>
+      </w:pPr>
+      <w:r>
+        <w:rPr>
+          <w:rFonts w:ascii="Arial" w:hAnsi="Arial" w:cs="Arial"/>
+          <w:lang w:val="es-CO"/>
+        </w:rPr>
+        <w:t>Finalmente, se cambian las tildes de los datos, reemplazando vocales con tilde por vocales sin tilde, y los datos con ñ por ni.</w:t>
       </w:r>
     </w:p>
     <w:p>

</xml_diff>

<commit_message>
Agrega la documentacion del procesamiento de la hoja 19PM
</commit_message>
<xml_diff>
--- a/Documentacion/Procesamiento de Datos.docx
+++ b/Documentacion/Procesamiento de Datos.docx
@@ -8231,7 +8231,6 @@
         <w:t xml:space="preserve">'A un </w:t>
       </w:r>
       <w:proofErr w:type="spellStart"/>
-      <w:proofErr w:type="gramStart"/>
       <w:r>
         <w:rPr>
           <w:rFonts w:ascii="Arial" w:hAnsi="Arial" w:cs="Arial"/>
@@ -8240,7 +8239,6 @@
         <w:t>boticario,farmacéuta</w:t>
       </w:r>
       <w:proofErr w:type="spellEnd"/>
-      <w:proofErr w:type="gramEnd"/>
       <w:r>
         <w:rPr>
           <w:rFonts w:ascii="Arial" w:hAnsi="Arial" w:cs="Arial"/>
@@ -10724,21 +10722,7 @@
           <w:rFonts w:ascii="Arial" w:hAnsi="Arial" w:cs="Arial"/>
           <w:lang w:val="es-CO"/>
         </w:rPr>
-        <w:t xml:space="preserve">, para lo cual se ignoran las primeras </w:t>
-      </w:r>
-      <w:r>
-        <w:rPr>
-          <w:rFonts w:ascii="Arial" w:hAnsi="Arial" w:cs="Arial"/>
-          <w:lang w:val="es-CO"/>
-        </w:rPr>
-        <w:t>9</w:t>
-      </w:r>
-      <w:r>
-        <w:rPr>
-          <w:rFonts w:ascii="Arial" w:hAnsi="Arial" w:cs="Arial"/>
-          <w:lang w:val="es-CO"/>
-        </w:rPr>
-        <w:t xml:space="preserve"> filas de la hoja.</w:t>
+        <w:t>, para lo cual se ignoran las primeras 9 filas de la hoja.</w:t>
       </w:r>
     </w:p>
     <w:p>
@@ -10847,6 +10831,7 @@
       <w:r>
         <w:rPr>
           <w:rFonts w:ascii="Arial" w:hAnsi="Arial" w:cs="Arial"/>
+          <w:noProof/>
           <w:lang w:val="es-CO"/>
         </w:rPr>
         <w:drawing>
@@ -11147,14 +11132,7 @@
           <w:rFonts w:ascii="Arial" w:hAnsi="Arial" w:cs="Arial"/>
           <w:lang w:val="es-CO"/>
         </w:rPr>
-        <w:t xml:space="preserve"> se encuentran en la segunda fila de datos debido al diseño del .xlsx donde se busca describir la agrupación por </w:t>
-      </w:r>
-      <w:r>
-        <w:rPr>
-          <w:rFonts w:ascii="Arial" w:hAnsi="Arial" w:cs="Arial"/>
-          <w:lang w:val="es-CO"/>
-        </w:rPr>
-        <w:t>Asistencia</w:t>
+        <w:t xml:space="preserve"> se encuentran en la segunda fila de datos debido al diseño del .xlsx donde se busca describir la agrupación por Asistencia</w:t>
       </w:r>
       <w:r>
         <w:rPr>
@@ -11199,21 +11177,7 @@
           <w:rFonts w:ascii="Arial" w:hAnsi="Arial" w:cs="Arial"/>
           <w:lang w:val="es-CO"/>
         </w:rPr>
-        <w:t xml:space="preserve"> en 4 partes, correspondientes a </w:t>
-      </w:r>
-      <w:r>
-        <w:rPr>
-          <w:rFonts w:ascii="Arial" w:hAnsi="Arial" w:cs="Arial"/>
-          <w:lang w:val="es-CO"/>
-        </w:rPr>
-        <w:t>la asistencia a alguna institución educativa</w:t>
-      </w:r>
-      <w:r>
-        <w:rPr>
-          <w:rFonts w:ascii="Arial" w:hAnsi="Arial" w:cs="Arial"/>
-          <w:lang w:val="es-CO"/>
-        </w:rPr>
-        <w:t>. Cada subconjunto se concatena con las columnas de ‘</w:t>
+        <w:t xml:space="preserve"> en 4 partes, correspondientes a la asistencia a alguna institución educativa. Cada subconjunto se concatena con las columnas de ‘</w:t>
       </w:r>
       <w:proofErr w:type="spellStart"/>
       <w:r>
@@ -11245,21 +11209,7 @@
           <w:rFonts w:ascii="Arial" w:hAnsi="Arial" w:cs="Arial"/>
           <w:lang w:val="es-CO"/>
         </w:rPr>
-        <w:t xml:space="preserve">’ que contiene los datos de </w:t>
-      </w:r>
-      <w:r>
-        <w:rPr>
-          <w:rFonts w:ascii="Arial" w:hAnsi="Arial" w:cs="Arial"/>
-          <w:lang w:val="es-CO"/>
-        </w:rPr>
-        <w:t>asistencia a alguna institución educativa</w:t>
-      </w:r>
-      <w:r>
-        <w:rPr>
-          <w:rFonts w:ascii="Arial" w:hAnsi="Arial" w:cs="Arial"/>
-          <w:lang w:val="es-CO"/>
-        </w:rPr>
-        <w:t xml:space="preserve"> de los censados. Luego se reemplazan los nombres de las columnas que todavía tienen un nombre por defecto por los siguientes nombres en su orden correspondiente: </w:t>
+        <w:t xml:space="preserve">’ que contiene los datos de asistencia a alguna institución educativa de los censados. Luego se reemplazan los nombres de las columnas que todavía tienen un nombre por defecto por los siguientes nombres en su orden correspondiente: </w:t>
       </w:r>
     </w:p>
     <w:p>
@@ -11724,6 +11674,562 @@
         </w:rPr>
         <w:t>Finalmente, se cambian las tildes de los datos, reemplazando vocales con tilde por vocales sin tilde, y los datos con ñ por ni.</w:t>
       </w:r>
+    </w:p>
+    <w:p>
+      <w:pPr>
+        <w:rPr>
+          <w:rFonts w:ascii="Arial" w:hAnsi="Arial" w:cs="Arial"/>
+          <w:lang w:val="es-CO"/>
+        </w:rPr>
+      </w:pPr>
+    </w:p>
+    <w:p>
+      <w:pPr>
+        <w:rPr>
+          <w:rFonts w:ascii="Arial" w:hAnsi="Arial" w:cs="Arial"/>
+          <w:lang w:val="es-CO"/>
+        </w:rPr>
+      </w:pPr>
+    </w:p>
+    <w:p>
+      <w:pPr>
+        <w:rPr>
+          <w:rFonts w:ascii="Arial" w:hAnsi="Arial" w:cs="Arial"/>
+          <w:b/>
+          <w:bCs/>
+          <w:lang w:val="es-CO"/>
+        </w:rPr>
+      </w:pPr>
+      <w:r>
+        <w:rPr>
+          <w:rFonts w:ascii="Arial" w:hAnsi="Arial" w:cs="Arial"/>
+          <w:b/>
+          <w:bCs/>
+          <w:lang w:val="es-CO"/>
+        </w:rPr>
+        <w:t>19PM</w:t>
+      </w:r>
+    </w:p>
+    <w:p>
+      <w:pPr>
+        <w:rPr>
+          <w:rFonts w:ascii="Arial" w:hAnsi="Arial" w:cs="Arial"/>
+          <w:lang w:val="es-CO"/>
+        </w:rPr>
+      </w:pPr>
+      <w:r>
+        <w:rPr>
+          <w:rFonts w:ascii="Arial" w:hAnsi="Arial" w:cs="Arial"/>
+          <w:lang w:val="es-CO"/>
+        </w:rPr>
+        <w:t xml:space="preserve">Se empieza por extraer solo la parte correspondiente a los datos del archivo </w:t>
+      </w:r>
+      <w:proofErr w:type="spellStart"/>
+      <w:r>
+        <w:rPr>
+          <w:rFonts w:ascii="Arial" w:hAnsi="Arial" w:cs="Arial"/>
+          <w:lang w:val="es-CO"/>
+        </w:rPr>
+        <w:t>excel</w:t>
+      </w:r>
+      <w:proofErr w:type="spellEnd"/>
+      <w:r>
+        <w:rPr>
+          <w:rFonts w:ascii="Arial" w:hAnsi="Arial" w:cs="Arial"/>
+          <w:lang w:val="es-CO"/>
+        </w:rPr>
+        <w:t xml:space="preserve">, para lo cual se ignoran las primeras </w:t>
+      </w:r>
+      <w:r>
+        <w:rPr>
+          <w:rFonts w:ascii="Arial" w:hAnsi="Arial" w:cs="Arial"/>
+          <w:lang w:val="es-CO"/>
+        </w:rPr>
+        <w:t>10</w:t>
+      </w:r>
+      <w:r>
+        <w:rPr>
+          <w:rFonts w:ascii="Arial" w:hAnsi="Arial" w:cs="Arial"/>
+          <w:lang w:val="es-CO"/>
+        </w:rPr>
+        <w:t xml:space="preserve"> filas de la hoja.</w:t>
+      </w:r>
+    </w:p>
+    <w:p>
+      <w:pPr>
+        <w:rPr>
+          <w:rFonts w:ascii="Arial" w:hAnsi="Arial" w:cs="Arial"/>
+          <w:lang w:val="es-CO"/>
+        </w:rPr>
+      </w:pPr>
+      <w:r>
+        <w:rPr>
+          <w:rFonts w:ascii="Arial" w:hAnsi="Arial" w:cs="Arial"/>
+          <w:noProof/>
+          <w:lang w:val="es-CO"/>
+        </w:rPr>
+        <w:drawing>
+          <wp:inline distT="0" distB="0" distL="0" distR="0" wp14:anchorId="17311DF5" wp14:editId="00A577EC">
+            <wp:extent cx="5612130" cy="2159000"/>
+            <wp:effectExtent l="0" t="0" r="7620" b="0"/>
+            <wp:docPr id="60" name="Imagen 60"/>
+            <wp:cNvGraphicFramePr>
+              <a:graphicFrameLocks xmlns:a="http://schemas.openxmlformats.org/drawingml/2006/main" noChangeAspect="1"/>
+            </wp:cNvGraphicFramePr>
+            <a:graphic xmlns:a="http://schemas.openxmlformats.org/drawingml/2006/main">
+              <a:graphicData uri="http://schemas.openxmlformats.org/drawingml/2006/picture">
+                <pic:pic xmlns:pic="http://schemas.openxmlformats.org/drawingml/2006/picture">
+                  <pic:nvPicPr>
+                    <pic:cNvPr id="60" name="Imagen 60"/>
+                    <pic:cNvPicPr/>
+                  </pic:nvPicPr>
+                  <pic:blipFill>
+                    <a:blip r:embed="rId72">
+                      <a:extLst>
+                        <a:ext uri="{28A0092B-C50C-407E-A947-70E740481C1C}">
+                          <a14:useLocalDpi xmlns:a14="http://schemas.microsoft.com/office/drawing/2010/main" val="0"/>
+                        </a:ext>
+                      </a:extLst>
+                    </a:blip>
+                    <a:stretch>
+                      <a:fillRect/>
+                    </a:stretch>
+                  </pic:blipFill>
+                  <pic:spPr>
+                    <a:xfrm>
+                      <a:off x="0" y="0"/>
+                      <a:ext cx="5612130" cy="2159000"/>
+                    </a:xfrm>
+                    <a:prstGeom prst="rect">
+                      <a:avLst/>
+                    </a:prstGeom>
+                  </pic:spPr>
+                </pic:pic>
+              </a:graphicData>
+            </a:graphic>
+          </wp:inline>
+        </w:drawing>
+      </w:r>
+    </w:p>
+    <w:p>
+      <w:pPr>
+        <w:rPr>
+          <w:rFonts w:ascii="Arial" w:hAnsi="Arial" w:cs="Arial"/>
+          <w:lang w:val="es-CO"/>
+        </w:rPr>
+      </w:pPr>
+    </w:p>
+    <w:p>
+      <w:pPr>
+        <w:rPr>
+          <w:rFonts w:ascii="Arial" w:hAnsi="Arial" w:cs="Arial"/>
+          <w:lang w:val="es-CO"/>
+        </w:rPr>
+      </w:pPr>
+      <w:r>
+        <w:rPr>
+          <w:rFonts w:ascii="Arial" w:hAnsi="Arial" w:cs="Arial"/>
+          <w:lang w:val="es-CO"/>
+        </w:rPr>
+        <w:t>Filtrado de datos que no son de Viterbo, Caldas.</w:t>
+      </w:r>
+    </w:p>
+    <w:p>
+      <w:pPr>
+        <w:rPr>
+          <w:rFonts w:ascii="Arial" w:hAnsi="Arial" w:cs="Arial"/>
+          <w:lang w:val="es-CO"/>
+        </w:rPr>
+      </w:pPr>
+      <w:r>
+        <w:rPr>
+          <w:rFonts w:ascii="Arial" w:hAnsi="Arial" w:cs="Arial"/>
+          <w:lang w:val="es-CO"/>
+        </w:rPr>
+        <w:t>Para esta hoja se decide propagar el valor del identificador del municipio, ‘17877_Viterbo’, y seleccionar solo los registros que lo contengan.</w:t>
+      </w:r>
+    </w:p>
+    <w:p>
+      <w:pPr>
+        <w:rPr>
+          <w:rFonts w:ascii="Arial" w:hAnsi="Arial" w:cs="Arial"/>
+          <w:lang w:val="es-CO"/>
+        </w:rPr>
+      </w:pPr>
+      <w:r>
+        <w:rPr>
+          <w:rFonts w:ascii="Arial" w:hAnsi="Arial" w:cs="Arial"/>
+          <w:noProof/>
+          <w:lang w:val="es-CO"/>
+        </w:rPr>
+        <w:lastRenderedPageBreak/>
+        <w:drawing>
+          <wp:inline distT="0" distB="0" distL="0" distR="0" wp14:anchorId="710AAC9F" wp14:editId="09D1E79B">
+            <wp:extent cx="5612130" cy="2557780"/>
+            <wp:effectExtent l="0" t="0" r="7620" b="0"/>
+            <wp:docPr id="61" name="Imagen 61"/>
+            <wp:cNvGraphicFramePr>
+              <a:graphicFrameLocks xmlns:a="http://schemas.openxmlformats.org/drawingml/2006/main" noChangeAspect="1"/>
+            </wp:cNvGraphicFramePr>
+            <a:graphic xmlns:a="http://schemas.openxmlformats.org/drawingml/2006/main">
+              <a:graphicData uri="http://schemas.openxmlformats.org/drawingml/2006/picture">
+                <pic:pic xmlns:pic="http://schemas.openxmlformats.org/drawingml/2006/picture">
+                  <pic:nvPicPr>
+                    <pic:cNvPr id="61" name="Imagen 61"/>
+                    <pic:cNvPicPr/>
+                  </pic:nvPicPr>
+                  <pic:blipFill>
+                    <a:blip r:embed="rId73">
+                      <a:extLst>
+                        <a:ext uri="{28A0092B-C50C-407E-A947-70E740481C1C}">
+                          <a14:useLocalDpi xmlns:a14="http://schemas.microsoft.com/office/drawing/2010/main" val="0"/>
+                        </a:ext>
+                      </a:extLst>
+                    </a:blip>
+                    <a:stretch>
+                      <a:fillRect/>
+                    </a:stretch>
+                  </pic:blipFill>
+                  <pic:spPr>
+                    <a:xfrm>
+                      <a:off x="0" y="0"/>
+                      <a:ext cx="5612130" cy="2557780"/>
+                    </a:xfrm>
+                    <a:prstGeom prst="rect">
+                      <a:avLst/>
+                    </a:prstGeom>
+                  </pic:spPr>
+                </pic:pic>
+              </a:graphicData>
+            </a:graphic>
+          </wp:inline>
+        </w:drawing>
+      </w:r>
+    </w:p>
+    <w:p>
+      <w:pPr>
+        <w:rPr>
+          <w:rFonts w:ascii="Arial" w:hAnsi="Arial" w:cs="Arial"/>
+          <w:lang w:val="es-CO"/>
+        </w:rPr>
+      </w:pPr>
+    </w:p>
+    <w:p>
+      <w:pPr>
+        <w:rPr>
+          <w:rFonts w:ascii="Arial" w:hAnsi="Arial" w:cs="Arial"/>
+          <w:lang w:val="es-CO"/>
+        </w:rPr>
+      </w:pPr>
+      <w:r>
+        <w:rPr>
+          <w:rFonts w:ascii="Arial" w:hAnsi="Arial" w:cs="Arial"/>
+          <w:lang w:val="es-CO"/>
+        </w:rPr>
+        <w:t xml:space="preserve">Se renombran </w:t>
+      </w:r>
+      <w:proofErr w:type="spellStart"/>
+      <w:r>
+        <w:rPr>
+          <w:rFonts w:ascii="Arial" w:hAnsi="Arial" w:cs="Arial"/>
+          <w:lang w:val="es-CO"/>
+        </w:rPr>
+        <w:t>headers</w:t>
+      </w:r>
+      <w:proofErr w:type="spellEnd"/>
+      <w:r>
+        <w:rPr>
+          <w:rFonts w:ascii="Arial" w:hAnsi="Arial" w:cs="Arial"/>
+          <w:lang w:val="es-CO"/>
+        </w:rPr>
+        <w:t xml:space="preserve"> que contienen nombres por defecto</w:t>
+      </w:r>
+    </w:p>
+    <w:p>
+      <w:pPr>
+        <w:rPr>
+          <w:rFonts w:ascii="Arial" w:hAnsi="Arial" w:cs="Arial"/>
+          <w:lang w:val="es-CO"/>
+        </w:rPr>
+      </w:pPr>
+      <w:r>
+        <w:rPr>
+          <w:rFonts w:ascii="Arial" w:hAnsi="Arial" w:cs="Arial"/>
+          <w:noProof/>
+          <w:lang w:val="es-CO"/>
+        </w:rPr>
+        <w:drawing>
+          <wp:inline distT="0" distB="0" distL="0" distR="0" wp14:anchorId="06972E92" wp14:editId="0A298A78">
+            <wp:extent cx="5612130" cy="2790190"/>
+            <wp:effectExtent l="0" t="0" r="7620" b="0"/>
+            <wp:docPr id="62" name="Imagen 62"/>
+            <wp:cNvGraphicFramePr>
+              <a:graphicFrameLocks xmlns:a="http://schemas.openxmlformats.org/drawingml/2006/main" noChangeAspect="1"/>
+            </wp:cNvGraphicFramePr>
+            <a:graphic xmlns:a="http://schemas.openxmlformats.org/drawingml/2006/main">
+              <a:graphicData uri="http://schemas.openxmlformats.org/drawingml/2006/picture">
+                <pic:pic xmlns:pic="http://schemas.openxmlformats.org/drawingml/2006/picture">
+                  <pic:nvPicPr>
+                    <pic:cNvPr id="62" name="Imagen 62"/>
+                    <pic:cNvPicPr/>
+                  </pic:nvPicPr>
+                  <pic:blipFill>
+                    <a:blip r:embed="rId74">
+                      <a:extLst>
+                        <a:ext uri="{28A0092B-C50C-407E-A947-70E740481C1C}">
+                          <a14:useLocalDpi xmlns:a14="http://schemas.microsoft.com/office/drawing/2010/main" val="0"/>
+                        </a:ext>
+                      </a:extLst>
+                    </a:blip>
+                    <a:stretch>
+                      <a:fillRect/>
+                    </a:stretch>
+                  </pic:blipFill>
+                  <pic:spPr>
+                    <a:xfrm>
+                      <a:off x="0" y="0"/>
+                      <a:ext cx="5612130" cy="2790190"/>
+                    </a:xfrm>
+                    <a:prstGeom prst="rect">
+                      <a:avLst/>
+                    </a:prstGeom>
+                  </pic:spPr>
+                </pic:pic>
+              </a:graphicData>
+            </a:graphic>
+          </wp:inline>
+        </w:drawing>
+      </w:r>
+    </w:p>
+    <w:p>
+      <w:pPr>
+        <w:rPr>
+          <w:rFonts w:ascii="Arial" w:hAnsi="Arial" w:cs="Arial"/>
+          <w:lang w:val="es-CO"/>
+        </w:rPr>
+      </w:pPr>
+    </w:p>
+    <w:p>
+      <w:pPr>
+        <w:rPr>
+          <w:rFonts w:ascii="Arial" w:hAnsi="Arial" w:cs="Arial"/>
+          <w:lang w:val="es-CO"/>
+        </w:rPr>
+      </w:pPr>
+      <w:r>
+        <w:rPr>
+          <w:rFonts w:ascii="Arial" w:hAnsi="Arial" w:cs="Arial"/>
+          <w:lang w:val="es-CO"/>
+        </w:rPr>
+        <w:t>Se propagan los valores de las columnas ‘</w:t>
+      </w:r>
+      <w:proofErr w:type="spellStart"/>
+      <w:r>
+        <w:rPr>
+          <w:rFonts w:ascii="Arial" w:hAnsi="Arial" w:cs="Arial"/>
+          <w:lang w:val="es-CO"/>
+        </w:rPr>
+        <w:t>Area</w:t>
+      </w:r>
+      <w:proofErr w:type="spellEnd"/>
+      <w:r>
+        <w:rPr>
+          <w:rFonts w:ascii="Arial" w:hAnsi="Arial" w:cs="Arial"/>
+          <w:lang w:val="es-CO"/>
+        </w:rPr>
+        <w:t>’ y ‘Sexo’</w:t>
+      </w:r>
+    </w:p>
+    <w:p>
+      <w:pPr>
+        <w:rPr>
+          <w:rFonts w:ascii="Arial" w:hAnsi="Arial" w:cs="Arial"/>
+          <w:lang w:val="es-CO"/>
+        </w:rPr>
+      </w:pPr>
+      <w:r>
+        <w:rPr>
+          <w:rFonts w:ascii="Arial" w:hAnsi="Arial" w:cs="Arial"/>
+          <w:noProof/>
+          <w:lang w:val="es-CO"/>
+        </w:rPr>
+        <w:lastRenderedPageBreak/>
+        <w:drawing>
+          <wp:inline distT="0" distB="0" distL="0" distR="0" wp14:anchorId="6CCEAC8F" wp14:editId="586224A1">
+            <wp:extent cx="5612130" cy="2949575"/>
+            <wp:effectExtent l="0" t="0" r="7620" b="3175"/>
+            <wp:docPr id="63" name="Imagen 63"/>
+            <wp:cNvGraphicFramePr>
+              <a:graphicFrameLocks xmlns:a="http://schemas.openxmlformats.org/drawingml/2006/main" noChangeAspect="1"/>
+            </wp:cNvGraphicFramePr>
+            <a:graphic xmlns:a="http://schemas.openxmlformats.org/drawingml/2006/main">
+              <a:graphicData uri="http://schemas.openxmlformats.org/drawingml/2006/picture">
+                <pic:pic xmlns:pic="http://schemas.openxmlformats.org/drawingml/2006/picture">
+                  <pic:nvPicPr>
+                    <pic:cNvPr id="63" name="Imagen 63"/>
+                    <pic:cNvPicPr/>
+                  </pic:nvPicPr>
+                  <pic:blipFill>
+                    <a:blip r:embed="rId75">
+                      <a:extLst>
+                        <a:ext uri="{28A0092B-C50C-407E-A947-70E740481C1C}">
+                          <a14:useLocalDpi xmlns:a14="http://schemas.microsoft.com/office/drawing/2010/main" val="0"/>
+                        </a:ext>
+                      </a:extLst>
+                    </a:blip>
+                    <a:stretch>
+                      <a:fillRect/>
+                    </a:stretch>
+                  </pic:blipFill>
+                  <pic:spPr>
+                    <a:xfrm>
+                      <a:off x="0" y="0"/>
+                      <a:ext cx="5612130" cy="2949575"/>
+                    </a:xfrm>
+                    <a:prstGeom prst="rect">
+                      <a:avLst/>
+                    </a:prstGeom>
+                  </pic:spPr>
+                </pic:pic>
+              </a:graphicData>
+            </a:graphic>
+          </wp:inline>
+        </w:drawing>
+      </w:r>
+    </w:p>
+    <w:p>
+      <w:pPr>
+        <w:rPr>
+          <w:rFonts w:ascii="Arial" w:hAnsi="Arial" w:cs="Arial"/>
+          <w:lang w:val="es-CO"/>
+        </w:rPr>
+      </w:pPr>
+    </w:p>
+    <w:p>
+      <w:pPr>
+        <w:rPr>
+          <w:rFonts w:ascii="Arial" w:hAnsi="Arial" w:cs="Arial"/>
+          <w:lang w:val="es-CO"/>
+        </w:rPr>
+      </w:pPr>
+      <w:r>
+        <w:rPr>
+          <w:rFonts w:ascii="Arial" w:hAnsi="Arial" w:cs="Arial"/>
+          <w:lang w:val="es-CO"/>
+        </w:rPr>
+        <w:t xml:space="preserve">Se renombran los </w:t>
+      </w:r>
+      <w:proofErr w:type="spellStart"/>
+      <w:r>
+        <w:rPr>
+          <w:rFonts w:ascii="Arial" w:hAnsi="Arial" w:cs="Arial"/>
+          <w:lang w:val="es-CO"/>
+        </w:rPr>
+        <w:t>headers</w:t>
+      </w:r>
+      <w:proofErr w:type="spellEnd"/>
+      <w:r>
+        <w:rPr>
+          <w:rFonts w:ascii="Arial" w:hAnsi="Arial" w:cs="Arial"/>
+          <w:lang w:val="es-CO"/>
+        </w:rPr>
+        <w:t xml:space="preserve"> que contienen tildes</w:t>
+      </w:r>
+      <w:r>
+        <w:rPr>
+          <w:rFonts w:ascii="Arial" w:hAnsi="Arial" w:cs="Arial"/>
+          <w:lang w:val="es-CO"/>
+        </w:rPr>
+        <w:t>.</w:t>
+      </w:r>
+    </w:p>
+    <w:p>
+      <w:pPr>
+        <w:rPr>
+          <w:rFonts w:ascii="Arial" w:hAnsi="Arial" w:cs="Arial"/>
+          <w:lang w:val="es-CO"/>
+        </w:rPr>
+      </w:pPr>
+      <w:r>
+        <w:rPr>
+          <w:rFonts w:ascii="Arial" w:hAnsi="Arial" w:cs="Arial"/>
+          <w:noProof/>
+          <w:lang w:val="es-CO"/>
+        </w:rPr>
+        <w:drawing>
+          <wp:inline distT="0" distB="0" distL="0" distR="0" wp14:anchorId="21BE872D" wp14:editId="68B60D55">
+            <wp:extent cx="2105319" cy="3972479"/>
+            <wp:effectExtent l="0" t="0" r="9525" b="0"/>
+            <wp:docPr id="1002359232" name="Imagen 1002359232"/>
+            <wp:cNvGraphicFramePr>
+              <a:graphicFrameLocks xmlns:a="http://schemas.openxmlformats.org/drawingml/2006/main" noChangeAspect="1"/>
+            </wp:cNvGraphicFramePr>
+            <a:graphic xmlns:a="http://schemas.openxmlformats.org/drawingml/2006/main">
+              <a:graphicData uri="http://schemas.openxmlformats.org/drawingml/2006/picture">
+                <pic:pic xmlns:pic="http://schemas.openxmlformats.org/drawingml/2006/picture">
+                  <pic:nvPicPr>
+                    <pic:cNvPr id="1002359232" name="Imagen 1002359232"/>
+                    <pic:cNvPicPr/>
+                  </pic:nvPicPr>
+                  <pic:blipFill>
+                    <a:blip r:embed="rId76">
+                      <a:extLst>
+                        <a:ext uri="{28A0092B-C50C-407E-A947-70E740481C1C}">
+                          <a14:useLocalDpi xmlns:a14="http://schemas.microsoft.com/office/drawing/2010/main" val="0"/>
+                        </a:ext>
+                      </a:extLst>
+                    </a:blip>
+                    <a:stretch>
+                      <a:fillRect/>
+                    </a:stretch>
+                  </pic:blipFill>
+                  <pic:spPr>
+                    <a:xfrm>
+                      <a:off x="0" y="0"/>
+                      <a:ext cx="2105319" cy="3972479"/>
+                    </a:xfrm>
+                    <a:prstGeom prst="rect">
+                      <a:avLst/>
+                    </a:prstGeom>
+                  </pic:spPr>
+                </pic:pic>
+              </a:graphicData>
+            </a:graphic>
+          </wp:inline>
+        </w:drawing>
+      </w:r>
+    </w:p>
+    <w:p>
+      <w:pPr>
+        <w:rPr>
+          <w:rFonts w:ascii="Arial" w:hAnsi="Arial" w:cs="Arial"/>
+          <w:lang w:val="es-CO"/>
+        </w:rPr>
+      </w:pPr>
+    </w:p>
+    <w:p>
+      <w:pPr>
+        <w:rPr>
+          <w:rFonts w:ascii="Arial" w:hAnsi="Arial" w:cs="Arial"/>
+          <w:lang w:val="es-CO"/>
+        </w:rPr>
+      </w:pPr>
+      <w:r>
+        <w:rPr>
+          <w:rFonts w:ascii="Arial" w:hAnsi="Arial" w:cs="Arial"/>
+          <w:lang w:val="es-CO"/>
+        </w:rPr>
+        <w:lastRenderedPageBreak/>
+        <w:t>Finalmente, se cambian las tildes de los datos, reemplazando vocales con tilde por vocales sin tilde, y los datos con ñ por ni.</w:t>
+      </w:r>
+    </w:p>
+    <w:p>
+      <w:pPr>
+        <w:rPr>
+          <w:rFonts w:ascii="Arial" w:hAnsi="Arial" w:cs="Arial"/>
+          <w:lang w:val="es-CO"/>
+        </w:rPr>
+      </w:pPr>
     </w:p>
     <w:p>
       <w:pPr>

</xml_diff>

<commit_message>
Corrige documento de procesamiento de datos
</commit_message>
<xml_diff>
--- a/Documentacion/Procesamiento de Datos.docx
+++ b/Documentacion/Procesamiento de Datos.docx
@@ -101,7 +101,7 @@
           <w:rFonts w:ascii="Arial" w:hAnsi="Arial" w:cs="Arial"/>
           <w:lang w:val="es-CO"/>
         </w:rPr>
-        <w:t>2</w:t>
+        <w:t>22</w:t>
       </w:r>
       <w:r>
         <w:rPr>
@@ -179,7 +179,21 @@
           <w:rFonts w:ascii="Arial" w:hAnsi="Arial" w:cs="Arial"/>
           <w:lang w:val="es-CO"/>
         </w:rPr>
-        <w:t>Extracción de datos: Python.</w:t>
+        <w:t xml:space="preserve">Extracción </w:t>
+      </w:r>
+      <w:r>
+        <w:rPr>
+          <w:rFonts w:ascii="Arial" w:hAnsi="Arial" w:cs="Arial"/>
+          <w:lang w:val="es-CO"/>
+        </w:rPr>
+        <w:t xml:space="preserve">y procesamiento </w:t>
+      </w:r>
+      <w:r>
+        <w:rPr>
+          <w:rFonts w:ascii="Arial" w:hAnsi="Arial" w:cs="Arial"/>
+          <w:lang w:val="es-CO"/>
+        </w:rPr>
+        <w:t>de datos: Python.</w:t>
       </w:r>
     </w:p>
     <w:p>

</xml_diff>